<commit_message>
feat: implement 3-Layer Architecture and Hybrid Pandoc + Python-docx OMML math generator
</commit_message>
<xml_diff>
--- a/01_Naskah_Utama/Proposal_Arthur_PokemonTCG.docx
+++ b/01_Naskah_Utama/Proposal_Arthur_PokemonTCG.docx
@@ -16207,15 +16207,37 @@
         <w:spacing w:before="120" w:after="120" w:line="360" w:lineRule="auto"/>
         <w:jc w:val="center"/>
       </w:pPr>
-      <w:r>
-        <w:rPr>
-          <w:rFonts w:ascii="Cambria Math" w:hAnsi="Cambria Math"/>
-          <w:i/>
-          <w:sz w:val="22"/>
-          <w:color w:val="000000"/>
-        </w:rPr>
-        <w:t>N \ge 50 + 8k</w:t>
-      </w:r>
+      <m:oMathPara>
+        <m:oMathParaPr>
+          <m:jc m:val="center"/>
+        </m:oMathParaPr>
+        <m:oMath>
+          <m:r>
+            <m:t>N</m:t>
+          </m:r>
+          <m:r>
+            <m:rPr>
+              <m:sty m:val="p"/>
+            </m:rPr>
+            <m:t>≥</m:t>
+          </m:r>
+          <m:r>
+            <m:t>50</m:t>
+          </m:r>
+          <m:r>
+            <m:rPr>
+              <m:sty m:val="p"/>
+            </m:rPr>
+            <m:t>+</m:t>
+          </m:r>
+          <m:r>
+            <m:t>8</m:t>
+          </m:r>
+          <m:r>
+            <m:t>k</m:t>
+          </m:r>
+        </m:oMath>
+      </m:oMathPara>
     </w:p>
     <w:p>
       <w:pPr>
@@ -16459,15 +16481,83 @@
         <w:spacing w:before="120" w:after="120" w:line="360" w:lineRule="auto"/>
         <w:jc w:val="center"/>
       </w:pPr>
-      <w:r>
-        <w:rPr>
-          <w:rFonts w:ascii="Cambria Math" w:hAnsi="Cambria Math"/>
-          <w:i/>
-          <w:sz w:val="22"/>
-          <w:color w:val="000000"/>
-        </w:rPr>
-        <w:t>N \ge 50 + 8(7) = 50 + 56 = 106\text responden</w:t>
-      </w:r>
+      <m:oMathPara>
+        <m:oMathParaPr>
+          <m:jc m:val="center"/>
+        </m:oMathParaPr>
+        <m:oMath>
+          <m:r>
+            <m:t>N</m:t>
+          </m:r>
+          <m:r>
+            <m:rPr>
+              <m:sty m:val="p"/>
+            </m:rPr>
+            <m:t>≥</m:t>
+          </m:r>
+          <m:r>
+            <m:t>50</m:t>
+          </m:r>
+          <m:r>
+            <m:rPr>
+              <m:sty m:val="p"/>
+            </m:rPr>
+            <m:t>+</m:t>
+          </m:r>
+          <m:r>
+            <m:t>8</m:t>
+          </m:r>
+          <m:r>
+            <m:rPr>
+              <m:sty m:val="p"/>
+            </m:rPr>
+            <m:t>(</m:t>
+          </m:r>
+          <m:r>
+            <m:t>7</m:t>
+          </m:r>
+          <m:r>
+            <m:rPr>
+              <m:sty m:val="p"/>
+            </m:rPr>
+            <m:t>)</m:t>
+          </m:r>
+          <m:r>
+            <m:rPr>
+              <m:sty m:val="p"/>
+            </m:rPr>
+            <m:t>=</m:t>
+          </m:r>
+          <m:r>
+            <m:t>50</m:t>
+          </m:r>
+          <m:r>
+            <m:rPr>
+              <m:sty m:val="p"/>
+            </m:rPr>
+            <m:t>+</m:t>
+          </m:r>
+          <m:r>
+            <m:t>56</m:t>
+          </m:r>
+          <m:r>
+            <m:rPr>
+              <m:sty m:val="p"/>
+            </m:rPr>
+            <m:t>=</m:t>
+          </m:r>
+          <m:r>
+            <m:t>106</m:t>
+          </m:r>
+          <m:r>
+            <m:rPr>
+              <m:nor/>
+              <m:sty m:val="p"/>
+            </m:rPr>
+            <m:t> responden</m:t>
+          </m:r>
+        </m:oMath>
+      </m:oMathPara>
     </w:p>
     <w:p>
       <w:pPr>
@@ -16519,30 +16609,84 @@
         <w:spacing w:before="120" w:after="120" w:line="360" w:lineRule="auto"/>
         <w:jc w:val="center"/>
       </w:pPr>
-      <w:r>
-        <w:rPr>
-          <w:rFonts w:ascii="Cambria Math" w:hAnsi="Cambria Math"/>
-          <w:i/>
-          <w:sz w:val="22"/>
-          <w:color w:val="000000"/>
-        </w:rPr>
-        <w:t>N \ge 104 + k</w:t>
-      </w:r>
+      <m:oMathPara>
+        <m:oMathParaPr>
+          <m:jc m:val="center"/>
+        </m:oMathParaPr>
+        <m:oMath>
+          <m:r>
+            <m:t>N</m:t>
+          </m:r>
+          <m:r>
+            <m:rPr>
+              <m:sty m:val="p"/>
+            </m:rPr>
+            <m:t>≥</m:t>
+          </m:r>
+          <m:r>
+            <m:t>104</m:t>
+          </m:r>
+          <m:r>
+            <m:rPr>
+              <m:sty m:val="p"/>
+            </m:rPr>
+            <m:t>+</m:t>
+          </m:r>
+          <m:r>
+            <m:t>k</m:t>
+          </m:r>
+        </m:oMath>
+      </m:oMathPara>
     </w:p>
     <w:p>
       <w:pPr>
         <w:spacing w:before="120" w:after="120" w:line="360" w:lineRule="auto"/>
         <w:jc w:val="center"/>
       </w:pPr>
-      <w:r>
-        <w:rPr>
-          <w:rFonts w:ascii="Cambria Math" w:hAnsi="Cambria Math"/>
-          <w:i/>
-          <w:sz w:val="22"/>
-          <w:color w:val="000000"/>
-        </w:rPr>
-        <w:t>N \ge 104 + 7 = 111\text responden</w:t>
-      </w:r>
+      <m:oMathPara>
+        <m:oMathParaPr>
+          <m:jc m:val="center"/>
+        </m:oMathParaPr>
+        <m:oMath>
+          <m:r>
+            <m:t>N</m:t>
+          </m:r>
+          <m:r>
+            <m:rPr>
+              <m:sty m:val="p"/>
+            </m:rPr>
+            <m:t>≥</m:t>
+          </m:r>
+          <m:r>
+            <m:t>104</m:t>
+          </m:r>
+          <m:r>
+            <m:rPr>
+              <m:sty m:val="p"/>
+            </m:rPr>
+            <m:t>+</m:t>
+          </m:r>
+          <m:r>
+            <m:t>7</m:t>
+          </m:r>
+          <m:r>
+            <m:rPr>
+              <m:sty m:val="p"/>
+            </m:rPr>
+            <m:t>=</m:t>
+          </m:r>
+          <m:r>
+            <m:t>111</m:t>
+          </m:r>
+          <m:r>
+            <m:rPr>
+              <m:nor/>
+              <m:sty m:val="p"/>
+            </m:rPr>
+            <m:t> responden</m:t>
+          </m:r>
+        </m:oMath>
+      </m:oMathPara>
     </w:p>
     <w:p>
       <w:pPr>
@@ -17054,15 +17198,124 @@
         <w:spacing w:before="120" w:after="120" w:line="360" w:lineRule="auto"/>
         <w:jc w:val="center"/>
       </w:pPr>
-      <w:r>
-        <w:rPr>
-          <w:rFonts w:ascii="Cambria Math" w:hAnsi="Cambria Math"/>
-          <w:i/>
-          <w:sz w:val="22"/>
-          <w:color w:val="000000"/>
-        </w:rPr>
-        <w:t>Y = α + β1 X1 + β2 X2 + β3 X3 + e</w:t>
-      </w:r>
+      <m:oMathPara>
+        <m:oMathParaPr>
+          <m:jc m:val="center"/>
+        </m:oMathParaPr>
+        <m:oMath>
+          <m:r>
+            <m:t>Y</m:t>
+          </m:r>
+          <m:r>
+            <m:rPr>
+              <m:sty m:val="p"/>
+            </m:rPr>
+            <m:t>=</m:t>
+          </m:r>
+          <m:r>
+            <m:t>α</m:t>
+          </m:r>
+          <m:r>
+            <m:rPr>
+              <m:sty m:val="p"/>
+            </m:rPr>
+            <m:t>+</m:t>
+          </m:r>
+          <m:sSub>
+            <m:e>
+              <m:r>
+                <m:t>β</m:t>
+              </m:r>
+            </m:e>
+            <m:sub>
+              <m:r>
+                <m:t>1</m:t>
+              </m:r>
+            </m:sub>
+          </m:sSub>
+          <m:sSub>
+            <m:e>
+              <m:r>
+                <m:t>X</m:t>
+              </m:r>
+            </m:e>
+            <m:sub>
+              <m:r>
+                <m:t>1</m:t>
+              </m:r>
+            </m:sub>
+          </m:sSub>
+          <m:r>
+            <m:rPr>
+              <m:sty m:val="p"/>
+            </m:rPr>
+            <m:t>+</m:t>
+          </m:r>
+          <m:sSub>
+            <m:e>
+              <m:r>
+                <m:t>β</m:t>
+              </m:r>
+            </m:e>
+            <m:sub>
+              <m:r>
+                <m:t>2</m:t>
+              </m:r>
+            </m:sub>
+          </m:sSub>
+          <m:sSub>
+            <m:e>
+              <m:r>
+                <m:t>X</m:t>
+              </m:r>
+            </m:e>
+            <m:sub>
+              <m:r>
+                <m:t>2</m:t>
+              </m:r>
+            </m:sub>
+          </m:sSub>
+          <m:r>
+            <m:rPr>
+              <m:sty m:val="p"/>
+            </m:rPr>
+            <m:t>+</m:t>
+          </m:r>
+          <m:sSub>
+            <m:e>
+              <m:r>
+                <m:t>β</m:t>
+              </m:r>
+            </m:e>
+            <m:sub>
+              <m:r>
+                <m:t>3</m:t>
+              </m:r>
+            </m:sub>
+          </m:sSub>
+          <m:sSub>
+            <m:e>
+              <m:r>
+                <m:t>X</m:t>
+              </m:r>
+            </m:e>
+            <m:sub>
+              <m:r>
+                <m:t>3</m:t>
+              </m:r>
+            </m:sub>
+          </m:sSub>
+          <m:r>
+            <m:rPr>
+              <m:sty m:val="p"/>
+            </m:rPr>
+            <m:t>+</m:t>
+          </m:r>
+          <m:r>
+            <m:t>e</m:t>
+          </m:r>
+        </m:oMath>
+      </m:oMathPara>
     </w:p>
     <w:p>
       <w:pPr>
@@ -17106,15 +17359,298 @@
         <w:spacing w:before="120" w:after="120" w:line="360" w:lineRule="auto"/>
         <w:jc w:val="center"/>
       </w:pPr>
-      <w:r>
-        <w:rPr>
-          <w:rFonts w:ascii="Cambria Math" w:hAnsi="Cambria Math"/>
-          <w:i/>
-          <w:sz w:val="22"/>
-          <w:color w:val="000000"/>
-        </w:rPr>
-        <w:t>Y = α + β1 X1 + β2 X2 + β3 X3 + β4 M + β5 (X1  ·  M) + β6 (X2  ·  M) + β7 (X3  ·  M) + e</w:t>
-      </w:r>
+      <m:oMathPara>
+        <m:oMathParaPr>
+          <m:jc m:val="center"/>
+        </m:oMathParaPr>
+        <m:oMath>
+          <m:r>
+            <m:t>Y</m:t>
+          </m:r>
+          <m:r>
+            <m:rPr>
+              <m:sty m:val="p"/>
+            </m:rPr>
+            <m:t>=</m:t>
+          </m:r>
+          <m:r>
+            <m:t>α</m:t>
+          </m:r>
+          <m:r>
+            <m:rPr>
+              <m:sty m:val="p"/>
+            </m:rPr>
+            <m:t>+</m:t>
+          </m:r>
+          <m:sSub>
+            <m:e>
+              <m:r>
+                <m:t>β</m:t>
+              </m:r>
+            </m:e>
+            <m:sub>
+              <m:r>
+                <m:t>1</m:t>
+              </m:r>
+            </m:sub>
+          </m:sSub>
+          <m:sSub>
+            <m:e>
+              <m:r>
+                <m:t>X</m:t>
+              </m:r>
+            </m:e>
+            <m:sub>
+              <m:r>
+                <m:t>1</m:t>
+              </m:r>
+            </m:sub>
+          </m:sSub>
+          <m:r>
+            <m:rPr>
+              <m:sty m:val="p"/>
+            </m:rPr>
+            <m:t>+</m:t>
+          </m:r>
+          <m:sSub>
+            <m:e>
+              <m:r>
+                <m:t>β</m:t>
+              </m:r>
+            </m:e>
+            <m:sub>
+              <m:r>
+                <m:t>2</m:t>
+              </m:r>
+            </m:sub>
+          </m:sSub>
+          <m:sSub>
+            <m:e>
+              <m:r>
+                <m:t>X</m:t>
+              </m:r>
+            </m:e>
+            <m:sub>
+              <m:r>
+                <m:t>2</m:t>
+              </m:r>
+            </m:sub>
+          </m:sSub>
+          <m:r>
+            <m:rPr>
+              <m:sty m:val="p"/>
+            </m:rPr>
+            <m:t>+</m:t>
+          </m:r>
+          <m:sSub>
+            <m:e>
+              <m:r>
+                <m:t>β</m:t>
+              </m:r>
+            </m:e>
+            <m:sub>
+              <m:r>
+                <m:t>3</m:t>
+              </m:r>
+            </m:sub>
+          </m:sSub>
+          <m:sSub>
+            <m:e>
+              <m:r>
+                <m:t>X</m:t>
+              </m:r>
+            </m:e>
+            <m:sub>
+              <m:r>
+                <m:t>3</m:t>
+              </m:r>
+            </m:sub>
+          </m:sSub>
+          <m:r>
+            <m:rPr>
+              <m:sty m:val="p"/>
+            </m:rPr>
+            <m:t>+</m:t>
+          </m:r>
+          <m:sSub>
+            <m:e>
+              <m:r>
+                <m:t>β</m:t>
+              </m:r>
+            </m:e>
+            <m:sub>
+              <m:r>
+                <m:t>4</m:t>
+              </m:r>
+            </m:sub>
+          </m:sSub>
+          <m:r>
+            <m:t>M</m:t>
+          </m:r>
+          <m:r>
+            <m:rPr>
+              <m:sty m:val="p"/>
+            </m:rPr>
+            <m:t>+</m:t>
+          </m:r>
+          <m:sSub>
+            <m:e>
+              <m:r>
+                <m:t>β</m:t>
+              </m:r>
+            </m:e>
+            <m:sub>
+              <m:r>
+                <m:t>5</m:t>
+              </m:r>
+            </m:sub>
+          </m:sSub>
+          <m:r>
+            <m:rPr>
+              <m:sty m:val="p"/>
+            </m:rPr>
+            <m:t>(</m:t>
+          </m:r>
+          <m:sSub>
+            <m:e>
+              <m:r>
+                <m:t>X</m:t>
+              </m:r>
+            </m:e>
+            <m:sub>
+              <m:r>
+                <m:t>1</m:t>
+              </m:r>
+            </m:sub>
+          </m:sSub>
+          <m:r>
+            <m:rPr>
+              <m:sty m:val="p"/>
+            </m:rPr>
+            <m:t>⋅</m:t>
+          </m:r>
+          <m:r>
+            <m:t>M</m:t>
+          </m:r>
+          <m:r>
+            <m:rPr>
+              <m:sty m:val="p"/>
+            </m:rPr>
+            <m:t>)</m:t>
+          </m:r>
+          <m:r>
+            <m:rPr>
+              <m:sty m:val="p"/>
+            </m:rPr>
+            <m:t>+</m:t>
+          </m:r>
+          <m:sSub>
+            <m:e>
+              <m:r>
+                <m:t>β</m:t>
+              </m:r>
+            </m:e>
+            <m:sub>
+              <m:r>
+                <m:t>6</m:t>
+              </m:r>
+            </m:sub>
+          </m:sSub>
+          <m:r>
+            <m:rPr>
+              <m:sty m:val="p"/>
+            </m:rPr>
+            <m:t>(</m:t>
+          </m:r>
+          <m:sSub>
+            <m:e>
+              <m:r>
+                <m:t>X</m:t>
+              </m:r>
+            </m:e>
+            <m:sub>
+              <m:r>
+                <m:t>2</m:t>
+              </m:r>
+            </m:sub>
+          </m:sSub>
+          <m:r>
+            <m:rPr>
+              <m:sty m:val="p"/>
+            </m:rPr>
+            <m:t>⋅</m:t>
+          </m:r>
+          <m:r>
+            <m:t>M</m:t>
+          </m:r>
+          <m:r>
+            <m:rPr>
+              <m:sty m:val="p"/>
+            </m:rPr>
+            <m:t>)</m:t>
+          </m:r>
+          <m:r>
+            <m:rPr>
+              <m:sty m:val="p"/>
+            </m:rPr>
+            <m:t>+</m:t>
+          </m:r>
+          <m:sSub>
+            <m:e>
+              <m:r>
+                <m:t>β</m:t>
+              </m:r>
+            </m:e>
+            <m:sub>
+              <m:r>
+                <m:t>7</m:t>
+              </m:r>
+            </m:sub>
+          </m:sSub>
+          <m:r>
+            <m:rPr>
+              <m:sty m:val="p"/>
+            </m:rPr>
+            <m:t>(</m:t>
+          </m:r>
+          <m:sSub>
+            <m:e>
+              <m:r>
+                <m:t>X</m:t>
+              </m:r>
+            </m:e>
+            <m:sub>
+              <m:r>
+                <m:t>3</m:t>
+              </m:r>
+            </m:sub>
+          </m:sSub>
+          <m:r>
+            <m:rPr>
+              <m:sty m:val="p"/>
+            </m:rPr>
+            <m:t>⋅</m:t>
+          </m:r>
+          <m:r>
+            <m:t>M</m:t>
+          </m:r>
+          <m:r>
+            <m:rPr>
+              <m:sty m:val="p"/>
+            </m:rPr>
+            <m:t>)</m:t>
+          </m:r>
+          <m:r>
+            <m:rPr>
+              <m:sty m:val="p"/>
+            </m:rPr>
+            <m:t>+</m:t>
+          </m:r>
+          <m:r>
+            <m:t>e</m:t>
+          </m:r>
+        </m:oMath>
+      </m:oMathPara>
     </w:p>
     <w:p>
       <w:pPr>

</xml_diff>

<commit_message>
feat(sync): remediasi humanisasi Bab II+III live, gate parity 7/7, graphify 1851/1980/166
</commit_message>
<xml_diff>
--- a/01_Naskah_Utama/Proposal_Arthur_PokemonTCG.docx
+++ b/01_Naskah_Utama/Proposal_Arthur_PokemonTCG.docx
@@ -12,7 +12,7 @@
           <w:noProof/>
         </w:rPr>
         <w:drawing>
-          <wp:inline distT="0" distB="0" distL="0" distR="0" wp14:anchorId="779EE46F" wp14:editId="25AE6EA9">
+          <wp:inline distT="0" distB="0" distL="0" distR="0" wp14:anchorId="423D9D44" wp14:editId="50C70D19">
             <wp:extent cx="1152000" cy="1152000"/>
             <wp:effectExtent l="0" t="0" r="0" b="0"/>
             <wp:docPr id="1" name="Picture 1"/>
@@ -274,7 +274,7 @@
         <w:spacing w:after="360"/>
         <w:outlineLvl w:val="0"/>
       </w:pPr>
-      <w:bookmarkStart w:id="0" w:name="_Toc240613673"/>
+      <w:bookmarkStart w:id="0" w:name="_Toc240641326"/>
       <w:r>
         <w:rPr>
           <w:rFonts w:ascii="Times New Roman" w:hAnsi="Times New Roman"/>
@@ -784,7 +784,7 @@
         <w:spacing w:after="360"/>
         <w:outlineLvl w:val="0"/>
       </w:pPr>
-      <w:bookmarkStart w:id="1" w:name="_Toc240613674"/>
+      <w:bookmarkStart w:id="1" w:name="_Toc240641327"/>
       <w:r>
         <w:rPr>
           <w:rFonts w:ascii="Times New Roman" w:hAnsi="Times New Roman"/>
@@ -1225,7 +1225,7 @@
         <w:spacing w:after="360"/>
         <w:outlineLvl w:val="0"/>
       </w:pPr>
-      <w:bookmarkStart w:id="2" w:name="_Toc240613675"/>
+      <w:bookmarkStart w:id="2" w:name="_Toc240641328"/>
       <w:r>
         <w:rPr>
           <w:rFonts w:ascii="Times New Roman" w:hAnsi="Times New Roman"/>
@@ -1488,7 +1488,7 @@
         <w:spacing w:after="360"/>
         <w:outlineLvl w:val="0"/>
       </w:pPr>
-      <w:bookmarkStart w:id="3" w:name="_Toc240613676"/>
+      <w:bookmarkStart w:id="3" w:name="_Toc240641329"/>
       <w:r>
         <w:rPr>
           <w:rFonts w:ascii="Times New Roman" w:hAnsi="Times New Roman"/>
@@ -1781,7 +1781,7 @@
         <w:spacing w:after="360"/>
         <w:outlineLvl w:val="0"/>
       </w:pPr>
-      <w:bookmarkStart w:id="4" w:name="_Toc240613677"/>
+      <w:bookmarkStart w:id="4" w:name="_Toc240641330"/>
       <w:r>
         <w:rPr>
           <w:rFonts w:ascii="Times New Roman" w:hAnsi="Times New Roman"/>
@@ -1943,7 +1943,7 @@
         <w:spacing w:after="360"/>
         <w:outlineLvl w:val="0"/>
       </w:pPr>
-      <w:bookmarkStart w:id="5" w:name="_Toc240613678"/>
+      <w:bookmarkStart w:id="5" w:name="_Toc240641331"/>
       <w:r>
         <w:rPr>
           <w:rFonts w:ascii="Times New Roman" w:hAnsi="Times New Roman"/>
@@ -2142,7 +2142,7 @@
       <w:r>
         <w:fldChar w:fldCharType="separate"/>
       </w:r>
-      <w:hyperlink w:anchor="_Toc240613673" w:history="1">
+      <w:hyperlink w:anchor="_Toc240641326" w:history="1">
         <w:r>
           <w:rPr>
             <w:rStyle w:val="Hyperlink"/>
@@ -2169,7 +2169,7 @@
             <w:noProof/>
             <w:webHidden/>
           </w:rPr>
-          <w:instrText xml:space="preserve"> PAGEREF _Toc240613673 \h </w:instrText>
+          <w:instrText xml:space="preserve"> PAGEREF _Toc240641326 \h </w:instrText>
         </w:r>
         <w:r>
           <w:rPr>
@@ -2217,7 +2217,7 @@
           <w14:ligatures w14:val="standardContextual"/>
         </w:rPr>
       </w:pPr>
-      <w:hyperlink w:anchor="_Toc240613674" w:history="1">
+      <w:hyperlink w:anchor="_Toc240641327" w:history="1">
         <w:r>
           <w:rPr>
             <w:rStyle w:val="Hyperlink"/>
@@ -2244,7 +2244,7 @@
             <w:noProof/>
             <w:webHidden/>
           </w:rPr>
-          <w:instrText xml:space="preserve"> PAGEREF _Toc240613674 \h </w:instrText>
+          <w:instrText xml:space="preserve"> PAGEREF _Toc240641327 \h </w:instrText>
         </w:r>
         <w:r>
           <w:rPr>
@@ -2292,7 +2292,7 @@
           <w14:ligatures w14:val="standardContextual"/>
         </w:rPr>
       </w:pPr>
-      <w:hyperlink w:anchor="_Toc240613675" w:history="1">
+      <w:hyperlink w:anchor="_Toc240641328" w:history="1">
         <w:r>
           <w:rPr>
             <w:rStyle w:val="Hyperlink"/>
@@ -2319,7 +2319,7 @@
             <w:noProof/>
             <w:webHidden/>
           </w:rPr>
-          <w:instrText xml:space="preserve"> PAGEREF _Toc240613675 \h </w:instrText>
+          <w:instrText xml:space="preserve"> PAGEREF _Toc240641328 \h </w:instrText>
         </w:r>
         <w:r>
           <w:rPr>
@@ -2367,7 +2367,7 @@
           <w14:ligatures w14:val="standardContextual"/>
         </w:rPr>
       </w:pPr>
-      <w:hyperlink w:anchor="_Toc240613676" w:history="1">
+      <w:hyperlink w:anchor="_Toc240641329" w:history="1">
         <w:r>
           <w:rPr>
             <w:rStyle w:val="Hyperlink"/>
@@ -2394,7 +2394,7 @@
             <w:noProof/>
             <w:webHidden/>
           </w:rPr>
-          <w:instrText xml:space="preserve"> PAGEREF _Toc240613676 \h </w:instrText>
+          <w:instrText xml:space="preserve"> PAGEREF _Toc240641329 \h </w:instrText>
         </w:r>
         <w:r>
           <w:rPr>
@@ -2442,7 +2442,7 @@
           <w14:ligatures w14:val="standardContextual"/>
         </w:rPr>
       </w:pPr>
-      <w:hyperlink w:anchor="_Toc240613677" w:history="1">
+      <w:hyperlink w:anchor="_Toc240641330" w:history="1">
         <w:r>
           <w:rPr>
             <w:rStyle w:val="Hyperlink"/>
@@ -2469,7 +2469,7 @@
             <w:noProof/>
             <w:webHidden/>
           </w:rPr>
-          <w:instrText xml:space="preserve"> PAGEREF _Toc240613677 \h </w:instrText>
+          <w:instrText xml:space="preserve"> PAGEREF _Toc240641330 \h </w:instrText>
         </w:r>
         <w:r>
           <w:rPr>
@@ -2517,7 +2517,7 @@
           <w14:ligatures w14:val="standardContextual"/>
         </w:rPr>
       </w:pPr>
-      <w:hyperlink w:anchor="_Toc240613678" w:history="1">
+      <w:hyperlink w:anchor="_Toc240641331" w:history="1">
         <w:r>
           <w:rPr>
             <w:rStyle w:val="Hyperlink"/>
@@ -2544,7 +2544,7 @@
             <w:noProof/>
             <w:webHidden/>
           </w:rPr>
-          <w:instrText xml:space="preserve"> PAGEREF _Toc240613678 \h </w:instrText>
+          <w:instrText xml:space="preserve"> PAGEREF _Toc240641331 \h </w:instrText>
         </w:r>
         <w:r>
           <w:rPr>
@@ -2592,7 +2592,7 @@
           <w14:ligatures w14:val="standardContextual"/>
         </w:rPr>
       </w:pPr>
-      <w:hyperlink w:anchor="_Toc240613679" w:history="1">
+      <w:hyperlink w:anchor="_Toc240641332" w:history="1">
         <w:r>
           <w:rPr>
             <w:rStyle w:val="Hyperlink"/>
@@ -2619,7 +2619,7 @@
             <w:noProof/>
             <w:webHidden/>
           </w:rPr>
-          <w:instrText xml:space="preserve"> PAGEREF _Toc240613679 \h </w:instrText>
+          <w:instrText xml:space="preserve"> PAGEREF _Toc240641332 \h </w:instrText>
         </w:r>
         <w:r>
           <w:rPr>
@@ -2667,7 +2667,7 @@
           <w14:ligatures w14:val="standardContextual"/>
         </w:rPr>
       </w:pPr>
-      <w:hyperlink w:anchor="_Toc240613680" w:history="1">
+      <w:hyperlink w:anchor="_Toc240641333" w:history="1">
         <w:r>
           <w:rPr>
             <w:rStyle w:val="Hyperlink"/>
@@ -2694,7 +2694,7 @@
             <w:noProof/>
             <w:webHidden/>
           </w:rPr>
-          <w:instrText xml:space="preserve"> PAGEREF _Toc240613680 \h </w:instrText>
+          <w:instrText xml:space="preserve"> PAGEREF _Toc240641333 \h </w:instrText>
         </w:r>
         <w:r>
           <w:rPr>
@@ -2742,7 +2742,7 @@
           <w14:ligatures w14:val="standardContextual"/>
         </w:rPr>
       </w:pPr>
-      <w:hyperlink w:anchor="_Toc240613681" w:history="1">
+      <w:hyperlink w:anchor="_Toc240641334" w:history="1">
         <w:r>
           <w:rPr>
             <w:rStyle w:val="Hyperlink"/>
@@ -2769,7 +2769,7 @@
             <w:noProof/>
             <w:webHidden/>
           </w:rPr>
-          <w:instrText xml:space="preserve"> PAGEREF _Toc240613681 \h </w:instrText>
+          <w:instrText xml:space="preserve"> PAGEREF _Toc240641334 \h </w:instrText>
         </w:r>
         <w:r>
           <w:rPr>
@@ -2816,7 +2816,7 @@
           <w14:ligatures w14:val="standardContextual"/>
         </w:rPr>
       </w:pPr>
-      <w:hyperlink w:anchor="_Toc240613682" w:history="1">
+      <w:hyperlink w:anchor="_Toc240641335" w:history="1">
         <w:r>
           <w:rPr>
             <w:rStyle w:val="Hyperlink"/>
@@ -2843,7 +2843,7 @@
             <w:noProof/>
             <w:webHidden/>
           </w:rPr>
-          <w:instrText xml:space="preserve"> PAGEREF _Toc240613682 \h </w:instrText>
+          <w:instrText xml:space="preserve"> PAGEREF _Toc240641335 \h </w:instrText>
         </w:r>
         <w:r>
           <w:rPr>
@@ -2890,7 +2890,7 @@
           <w14:ligatures w14:val="standardContextual"/>
         </w:rPr>
       </w:pPr>
-      <w:hyperlink w:anchor="_Toc240613683" w:history="1">
+      <w:hyperlink w:anchor="_Toc240641336" w:history="1">
         <w:r>
           <w:rPr>
             <w:rStyle w:val="Hyperlink"/>
@@ -2917,7 +2917,7 @@
             <w:noProof/>
             <w:webHidden/>
           </w:rPr>
-          <w:instrText xml:space="preserve"> PAGEREF _Toc240613683 \h </w:instrText>
+          <w:instrText xml:space="preserve"> PAGEREF _Toc240641336 \h </w:instrText>
         </w:r>
         <w:r>
           <w:rPr>
@@ -2964,7 +2964,7 @@
           <w14:ligatures w14:val="standardContextual"/>
         </w:rPr>
       </w:pPr>
-      <w:hyperlink w:anchor="_Toc240613684" w:history="1">
+      <w:hyperlink w:anchor="_Toc240641337" w:history="1">
         <w:r>
           <w:rPr>
             <w:rStyle w:val="Hyperlink"/>
@@ -2991,7 +2991,7 @@
             <w:noProof/>
             <w:webHidden/>
           </w:rPr>
-          <w:instrText xml:space="preserve"> PAGEREF _Toc240613684 \h </w:instrText>
+          <w:instrText xml:space="preserve"> PAGEREF _Toc240641337 \h </w:instrText>
         </w:r>
         <w:r>
           <w:rPr>
@@ -3038,7 +3038,7 @@
           <w14:ligatures w14:val="standardContextual"/>
         </w:rPr>
       </w:pPr>
-      <w:hyperlink w:anchor="_Toc240613685" w:history="1">
+      <w:hyperlink w:anchor="_Toc240641338" w:history="1">
         <w:r>
           <w:rPr>
             <w:rStyle w:val="Hyperlink"/>
@@ -3065,7 +3065,7 @@
             <w:noProof/>
             <w:webHidden/>
           </w:rPr>
-          <w:instrText xml:space="preserve"> PAGEREF _Toc240613685 \h </w:instrText>
+          <w:instrText xml:space="preserve"> PAGEREF _Toc240641338 \h </w:instrText>
         </w:r>
         <w:r>
           <w:rPr>
@@ -3113,7 +3113,7 @@
           <w14:ligatures w14:val="standardContextual"/>
         </w:rPr>
       </w:pPr>
-      <w:hyperlink w:anchor="_Toc240613686" w:history="1">
+      <w:hyperlink w:anchor="_Toc240641339" w:history="1">
         <w:r>
           <w:rPr>
             <w:rStyle w:val="Hyperlink"/>
@@ -3140,7 +3140,7 @@
             <w:noProof/>
             <w:webHidden/>
           </w:rPr>
-          <w:instrText xml:space="preserve"> PAGEREF _Toc240613686 \h </w:instrText>
+          <w:instrText xml:space="preserve"> PAGEREF _Toc240641339 \h </w:instrText>
         </w:r>
         <w:r>
           <w:rPr>
@@ -3188,7 +3188,7 @@
           <w14:ligatures w14:val="standardContextual"/>
         </w:rPr>
       </w:pPr>
-      <w:hyperlink w:anchor="_Toc240613687" w:history="1">
+      <w:hyperlink w:anchor="_Toc240641340" w:history="1">
         <w:r>
           <w:rPr>
             <w:rStyle w:val="Hyperlink"/>
@@ -3215,7 +3215,7 @@
             <w:noProof/>
             <w:webHidden/>
           </w:rPr>
-          <w:instrText xml:space="preserve"> PAGEREF _Toc240613687 \h </w:instrText>
+          <w:instrText xml:space="preserve"> PAGEREF _Toc240641340 \h </w:instrText>
         </w:r>
         <w:r>
           <w:rPr>
@@ -3263,7 +3263,7 @@
           <w14:ligatures w14:val="standardContextual"/>
         </w:rPr>
       </w:pPr>
-      <w:hyperlink w:anchor="_Toc240613688" w:history="1">
+      <w:hyperlink w:anchor="_Toc240641341" w:history="1">
         <w:r>
           <w:rPr>
             <w:rStyle w:val="Hyperlink"/>
@@ -3290,7 +3290,7 @@
             <w:noProof/>
             <w:webHidden/>
           </w:rPr>
-          <w:instrText xml:space="preserve"> PAGEREF _Toc240613688 \h </w:instrText>
+          <w:instrText xml:space="preserve"> PAGEREF _Toc240641341 \h </w:instrText>
         </w:r>
         <w:r>
           <w:rPr>
@@ -3337,7 +3337,7 @@
           <w14:ligatures w14:val="standardContextual"/>
         </w:rPr>
       </w:pPr>
-      <w:hyperlink w:anchor="_Toc240613689" w:history="1">
+      <w:hyperlink w:anchor="_Toc240641342" w:history="1">
         <w:r>
           <w:rPr>
             <w:rStyle w:val="Hyperlink"/>
@@ -3364,7 +3364,7 @@
             <w:noProof/>
             <w:webHidden/>
           </w:rPr>
-          <w:instrText xml:space="preserve"> PAGEREF _Toc240613689 \h </w:instrText>
+          <w:instrText xml:space="preserve"> PAGEREF _Toc240641342 \h </w:instrText>
         </w:r>
         <w:r>
           <w:rPr>
@@ -3412,7 +3412,7 @@
           <w14:ligatures w14:val="standardContextual"/>
         </w:rPr>
       </w:pPr>
-      <w:hyperlink w:anchor="_Toc240613690" w:history="1">
+      <w:hyperlink w:anchor="_Toc240641343" w:history="1">
         <w:r>
           <w:rPr>
             <w:rStyle w:val="Hyperlink"/>
@@ -3454,7 +3454,7 @@
             <w:noProof/>
             <w:webHidden/>
           </w:rPr>
-          <w:instrText xml:space="preserve"> PAGEREF _Toc240613690 \h </w:instrText>
+          <w:instrText xml:space="preserve"> PAGEREF _Toc240641343 \h </w:instrText>
         </w:r>
         <w:r>
           <w:rPr>
@@ -3502,7 +3502,7 @@
           <w14:ligatures w14:val="standardContextual"/>
         </w:rPr>
       </w:pPr>
-      <w:hyperlink w:anchor="_Toc240613691" w:history="1">
+      <w:hyperlink w:anchor="_Toc240641344" w:history="1">
         <w:r>
           <w:rPr>
             <w:rStyle w:val="Hyperlink"/>
@@ -3544,7 +3544,7 @@
             <w:noProof/>
             <w:webHidden/>
           </w:rPr>
-          <w:instrText xml:space="preserve"> PAGEREF _Toc240613691 \h </w:instrText>
+          <w:instrText xml:space="preserve"> PAGEREF _Toc240641344 \h </w:instrText>
         </w:r>
         <w:r>
           <w:rPr>
@@ -3592,7 +3592,7 @@
           <w14:ligatures w14:val="standardContextual"/>
         </w:rPr>
       </w:pPr>
-      <w:hyperlink w:anchor="_Toc240613692" w:history="1">
+      <w:hyperlink w:anchor="_Toc240641345" w:history="1">
         <w:r>
           <w:rPr>
             <w:rStyle w:val="Hyperlink"/>
@@ -3627,7 +3627,7 @@
             <w:noProof/>
             <w:webHidden/>
           </w:rPr>
-          <w:instrText xml:space="preserve"> PAGEREF _Toc240613692 \h </w:instrText>
+          <w:instrText xml:space="preserve"> PAGEREF _Toc240641345 \h </w:instrText>
         </w:r>
         <w:r>
           <w:rPr>
@@ -3675,7 +3675,7 @@
           <w14:ligatures w14:val="standardContextual"/>
         </w:rPr>
       </w:pPr>
-      <w:hyperlink w:anchor="_Toc240613693" w:history="1">
+      <w:hyperlink w:anchor="_Toc240641346" w:history="1">
         <w:r>
           <w:rPr>
             <w:rStyle w:val="Hyperlink"/>
@@ -3717,7 +3717,7 @@
             <w:noProof/>
             <w:webHidden/>
           </w:rPr>
-          <w:instrText xml:space="preserve"> PAGEREF _Toc240613693 \h </w:instrText>
+          <w:instrText xml:space="preserve"> PAGEREF _Toc240641346 \h </w:instrText>
         </w:r>
         <w:r>
           <w:rPr>
@@ -3764,7 +3764,7 @@
           <w14:ligatures w14:val="standardContextual"/>
         </w:rPr>
       </w:pPr>
-      <w:hyperlink w:anchor="_Toc240613694" w:history="1">
+      <w:hyperlink w:anchor="_Toc240641347" w:history="1">
         <w:r>
           <w:rPr>
             <w:rStyle w:val="Hyperlink"/>
@@ -3791,7 +3791,7 @@
             <w:noProof/>
             <w:webHidden/>
           </w:rPr>
-          <w:instrText xml:space="preserve"> PAGEREF _Toc240613694 \h </w:instrText>
+          <w:instrText xml:space="preserve"> PAGEREF _Toc240641347 \h </w:instrText>
         </w:r>
         <w:r>
           <w:rPr>
@@ -3839,7 +3839,7 @@
           <w14:ligatures w14:val="standardContextual"/>
         </w:rPr>
       </w:pPr>
-      <w:hyperlink w:anchor="_Toc240613695" w:history="1">
+      <w:hyperlink w:anchor="_Toc240641348" w:history="1">
         <w:r>
           <w:rPr>
             <w:rStyle w:val="Hyperlink"/>
@@ -3896,7 +3896,7 @@
             <w:noProof/>
             <w:webHidden/>
           </w:rPr>
-          <w:instrText xml:space="preserve"> PAGEREF _Toc240613695 \h </w:instrText>
+          <w:instrText xml:space="preserve"> PAGEREF _Toc240641348 \h </w:instrText>
         </w:r>
         <w:r>
           <w:rPr>
@@ -3944,7 +3944,7 @@
           <w14:ligatures w14:val="standardContextual"/>
         </w:rPr>
       </w:pPr>
-      <w:hyperlink w:anchor="_Toc240613696" w:history="1">
+      <w:hyperlink w:anchor="_Toc240641349" w:history="1">
         <w:r>
           <w:rPr>
             <w:rStyle w:val="Hyperlink"/>
@@ -4001,7 +4001,7 @@
             <w:noProof/>
             <w:webHidden/>
           </w:rPr>
-          <w:instrText xml:space="preserve"> PAGEREF _Toc240613696 \h </w:instrText>
+          <w:instrText xml:space="preserve"> PAGEREF _Toc240641349 \h </w:instrText>
         </w:r>
         <w:r>
           <w:rPr>
@@ -4049,7 +4049,7 @@
           <w14:ligatures w14:val="standardContextual"/>
         </w:rPr>
       </w:pPr>
-      <w:hyperlink w:anchor="_Toc240613697" w:history="1">
+      <w:hyperlink w:anchor="_Toc240641350" w:history="1">
         <w:r>
           <w:rPr>
             <w:rStyle w:val="Hyperlink"/>
@@ -4106,7 +4106,7 @@
             <w:noProof/>
             <w:webHidden/>
           </w:rPr>
-          <w:instrText xml:space="preserve"> PAGEREF _Toc240613697 \h </w:instrText>
+          <w:instrText xml:space="preserve"> PAGEREF _Toc240641350 \h </w:instrText>
         </w:r>
         <w:r>
           <w:rPr>
@@ -4154,7 +4154,7 @@
           <w14:ligatures w14:val="standardContextual"/>
         </w:rPr>
       </w:pPr>
-      <w:hyperlink w:anchor="_Toc240613698" w:history="1">
+      <w:hyperlink w:anchor="_Toc240641351" w:history="1">
         <w:r>
           <w:rPr>
             <w:rStyle w:val="Hyperlink"/>
@@ -4211,7 +4211,7 @@
             <w:noProof/>
             <w:webHidden/>
           </w:rPr>
-          <w:instrText xml:space="preserve"> PAGEREF _Toc240613698 \h </w:instrText>
+          <w:instrText xml:space="preserve"> PAGEREF _Toc240641351 \h </w:instrText>
         </w:r>
         <w:r>
           <w:rPr>
@@ -4259,7 +4259,7 @@
           <w14:ligatures w14:val="standardContextual"/>
         </w:rPr>
       </w:pPr>
-      <w:hyperlink w:anchor="_Toc240613699" w:history="1">
+      <w:hyperlink w:anchor="_Toc240641352" w:history="1">
         <w:r>
           <w:rPr>
             <w:rStyle w:val="Hyperlink"/>
@@ -4316,7 +4316,7 @@
             <w:noProof/>
             <w:webHidden/>
           </w:rPr>
-          <w:instrText xml:space="preserve"> PAGEREF _Toc240613699 \h </w:instrText>
+          <w:instrText xml:space="preserve"> PAGEREF _Toc240641352 \h </w:instrText>
         </w:r>
         <w:r>
           <w:rPr>
@@ -4363,7 +4363,7 @@
           <w14:ligatures w14:val="standardContextual"/>
         </w:rPr>
       </w:pPr>
-      <w:hyperlink w:anchor="_Toc240613700" w:history="1">
+      <w:hyperlink w:anchor="_Toc240641353" w:history="1">
         <w:r>
           <w:rPr>
             <w:rStyle w:val="Hyperlink"/>
@@ -4390,7 +4390,7 @@
             <w:noProof/>
             <w:webHidden/>
           </w:rPr>
-          <w:instrText xml:space="preserve"> PAGEREF _Toc240613700 \h </w:instrText>
+          <w:instrText xml:space="preserve"> PAGEREF _Toc240641353 \h </w:instrText>
         </w:r>
         <w:r>
           <w:rPr>
@@ -4437,7 +4437,7 @@
           <w14:ligatures w14:val="standardContextual"/>
         </w:rPr>
       </w:pPr>
-      <w:hyperlink w:anchor="_Toc240613701" w:history="1">
+      <w:hyperlink w:anchor="_Toc240641354" w:history="1">
         <w:r>
           <w:rPr>
             <w:rStyle w:val="Hyperlink"/>
@@ -4464,7 +4464,7 @@
             <w:noProof/>
             <w:webHidden/>
           </w:rPr>
-          <w:instrText xml:space="preserve"> PAGEREF _Toc240613701 \h </w:instrText>
+          <w:instrText xml:space="preserve"> PAGEREF _Toc240641354 \h </w:instrText>
         </w:r>
         <w:r>
           <w:rPr>
@@ -4512,7 +4512,7 @@
           <w14:ligatures w14:val="standardContextual"/>
         </w:rPr>
       </w:pPr>
-      <w:hyperlink w:anchor="_Toc240613702" w:history="1">
+      <w:hyperlink w:anchor="_Toc240641355" w:history="1">
         <w:r>
           <w:rPr>
             <w:rStyle w:val="Hyperlink"/>
@@ -4562,7 +4562,7 @@
             <w:noProof/>
             <w:webHidden/>
           </w:rPr>
-          <w:instrText xml:space="preserve"> PAGEREF _Toc240613702 \h </w:instrText>
+          <w:instrText xml:space="preserve"> PAGEREF _Toc240641355 \h </w:instrText>
         </w:r>
         <w:r>
           <w:rPr>
@@ -4610,7 +4610,7 @@
           <w14:ligatures w14:val="standardContextual"/>
         </w:rPr>
       </w:pPr>
-      <w:hyperlink w:anchor="_Toc240613703" w:history="1">
+      <w:hyperlink w:anchor="_Toc240641356" w:history="1">
         <w:r>
           <w:rPr>
             <w:rStyle w:val="Hyperlink"/>
@@ -4660,7 +4660,7 @@
             <w:noProof/>
             <w:webHidden/>
           </w:rPr>
-          <w:instrText xml:space="preserve"> PAGEREF _Toc240613703 \h </w:instrText>
+          <w:instrText xml:space="preserve"> PAGEREF _Toc240641356 \h </w:instrText>
         </w:r>
         <w:r>
           <w:rPr>
@@ -4708,7 +4708,7 @@
           <w14:ligatures w14:val="standardContextual"/>
         </w:rPr>
       </w:pPr>
-      <w:hyperlink w:anchor="_Toc240613704" w:history="1">
+      <w:hyperlink w:anchor="_Toc240641357" w:history="1">
         <w:r>
           <w:rPr>
             <w:rStyle w:val="Hyperlink"/>
@@ -4758,7 +4758,7 @@
             <w:noProof/>
             <w:webHidden/>
           </w:rPr>
-          <w:instrText xml:space="preserve"> PAGEREF _Toc240613704 \h </w:instrText>
+          <w:instrText xml:space="preserve"> PAGEREF _Toc240641357 \h </w:instrText>
         </w:r>
         <w:r>
           <w:rPr>
@@ -4806,7 +4806,7 @@
           <w14:ligatures w14:val="standardContextual"/>
         </w:rPr>
       </w:pPr>
-      <w:hyperlink w:anchor="_Toc240613705" w:history="1">
+      <w:hyperlink w:anchor="_Toc240641358" w:history="1">
         <w:r>
           <w:rPr>
             <w:rStyle w:val="Hyperlink"/>
@@ -4871,7 +4871,7 @@
             <w:noProof/>
             <w:webHidden/>
           </w:rPr>
-          <w:instrText xml:space="preserve"> PAGEREF _Toc240613705 \h </w:instrText>
+          <w:instrText xml:space="preserve"> PAGEREF _Toc240641358 \h </w:instrText>
         </w:r>
         <w:r>
           <w:rPr>
@@ -4919,7 +4919,7 @@
           <w14:ligatures w14:val="standardContextual"/>
         </w:rPr>
       </w:pPr>
-      <w:hyperlink w:anchor="_Toc240613706" w:history="1">
+      <w:hyperlink w:anchor="_Toc240641359" w:history="1">
         <w:r>
           <w:rPr>
             <w:rStyle w:val="Hyperlink"/>
@@ -4984,7 +4984,7 @@
             <w:noProof/>
             <w:webHidden/>
           </w:rPr>
-          <w:instrText xml:space="preserve"> PAGEREF _Toc240613706 \h </w:instrText>
+          <w:instrText xml:space="preserve"> PAGEREF _Toc240641359 \h </w:instrText>
         </w:r>
         <w:r>
           <w:rPr>
@@ -5032,7 +5032,7 @@
           <w14:ligatures w14:val="standardContextual"/>
         </w:rPr>
       </w:pPr>
-      <w:hyperlink w:anchor="_Toc240613707" w:history="1">
+      <w:hyperlink w:anchor="_Toc240641360" w:history="1">
         <w:r>
           <w:rPr>
             <w:rStyle w:val="Hyperlink"/>
@@ -5097,7 +5097,7 @@
             <w:noProof/>
             <w:webHidden/>
           </w:rPr>
-          <w:instrText xml:space="preserve"> PAGEREF _Toc240613707 \h </w:instrText>
+          <w:instrText xml:space="preserve"> PAGEREF _Toc240641360 \h </w:instrText>
         </w:r>
         <w:r>
           <w:rPr>
@@ -5144,7 +5144,7 @@
           <w14:ligatures w14:val="standardContextual"/>
         </w:rPr>
       </w:pPr>
-      <w:hyperlink w:anchor="_Toc240613708" w:history="1">
+      <w:hyperlink w:anchor="_Toc240641361" w:history="1">
         <w:r>
           <w:rPr>
             <w:rStyle w:val="Hyperlink"/>
@@ -5171,7 +5171,7 @@
             <w:noProof/>
             <w:webHidden/>
           </w:rPr>
-          <w:instrText xml:space="preserve"> PAGEREF _Toc240613708 \h </w:instrText>
+          <w:instrText xml:space="preserve"> PAGEREF _Toc240641361 \h </w:instrText>
         </w:r>
         <w:r>
           <w:rPr>
@@ -5219,7 +5219,7 @@
           <w14:ligatures w14:val="standardContextual"/>
         </w:rPr>
       </w:pPr>
-      <w:hyperlink w:anchor="_Toc240613709" w:history="1">
+      <w:hyperlink w:anchor="_Toc240641362" w:history="1">
         <w:r>
           <w:rPr>
             <w:rStyle w:val="Hyperlink"/>
@@ -5246,7 +5246,7 @@
             <w:noProof/>
             <w:webHidden/>
           </w:rPr>
-          <w:instrText xml:space="preserve"> PAGEREF _Toc240613709 \h </w:instrText>
+          <w:instrText xml:space="preserve"> PAGEREF _Toc240641362 \h </w:instrText>
         </w:r>
         <w:r>
           <w:rPr>
@@ -5293,7 +5293,7 @@
           <w14:ligatures w14:val="standardContextual"/>
         </w:rPr>
       </w:pPr>
-      <w:hyperlink w:anchor="_Toc240613710" w:history="1">
+      <w:hyperlink w:anchor="_Toc240641363" w:history="1">
         <w:r>
           <w:rPr>
             <w:rStyle w:val="Hyperlink"/>
@@ -5320,7 +5320,7 @@
             <w:noProof/>
             <w:webHidden/>
           </w:rPr>
-          <w:instrText xml:space="preserve"> PAGEREF _Toc240613710 \h </w:instrText>
+          <w:instrText xml:space="preserve"> PAGEREF _Toc240641363 \h </w:instrText>
         </w:r>
         <w:r>
           <w:rPr>
@@ -5368,7 +5368,7 @@
           <w14:ligatures w14:val="standardContextual"/>
         </w:rPr>
       </w:pPr>
-      <w:hyperlink w:anchor="_Toc240613711" w:history="1">
+      <w:hyperlink w:anchor="_Toc240641364" w:history="1">
         <w:r>
           <w:rPr>
             <w:rStyle w:val="Hyperlink"/>
@@ -5395,7 +5395,7 @@
             <w:noProof/>
             <w:webHidden/>
           </w:rPr>
-          <w:instrText xml:space="preserve"> PAGEREF _Toc240613711 \h </w:instrText>
+          <w:instrText xml:space="preserve"> PAGEREF _Toc240641364 \h </w:instrText>
         </w:r>
         <w:r>
           <w:rPr>
@@ -5442,7 +5442,7 @@
           <w14:ligatures w14:val="standardContextual"/>
         </w:rPr>
       </w:pPr>
-      <w:hyperlink w:anchor="_Toc240613712" w:history="1">
+      <w:hyperlink w:anchor="_Toc240641365" w:history="1">
         <w:r>
           <w:rPr>
             <w:rStyle w:val="Hyperlink"/>
@@ -5469,7 +5469,7 @@
             <w:noProof/>
             <w:webHidden/>
           </w:rPr>
-          <w:instrText xml:space="preserve"> PAGEREF _Toc240613712 \h </w:instrText>
+          <w:instrText xml:space="preserve"> PAGEREF _Toc240641365 \h </w:instrText>
         </w:r>
         <w:r>
           <w:rPr>
@@ -5517,7 +5517,7 @@
           <w14:ligatures w14:val="standardContextual"/>
         </w:rPr>
       </w:pPr>
-      <w:hyperlink w:anchor="_Toc240613713" w:history="1">
+      <w:hyperlink w:anchor="_Toc240641366" w:history="1">
         <w:r>
           <w:rPr>
             <w:rStyle w:val="Hyperlink"/>
@@ -5544,7 +5544,7 @@
             <w:noProof/>
             <w:webHidden/>
           </w:rPr>
-          <w:instrText xml:space="preserve"> PAGEREF _Toc240613713 \h </w:instrText>
+          <w:instrText xml:space="preserve"> PAGEREF _Toc240641366 \h </w:instrText>
         </w:r>
         <w:r>
           <w:rPr>
@@ -5592,7 +5592,7 @@
           <w14:ligatures w14:val="standardContextual"/>
         </w:rPr>
       </w:pPr>
-      <w:hyperlink w:anchor="_Toc240613714" w:history="1">
+      <w:hyperlink w:anchor="_Toc240641367" w:history="1">
         <w:r>
           <w:rPr>
             <w:rStyle w:val="Hyperlink"/>
@@ -5619,7 +5619,7 @@
             <w:noProof/>
             <w:webHidden/>
           </w:rPr>
-          <w:instrText xml:space="preserve"> PAGEREF _Toc240613714 \h </w:instrText>
+          <w:instrText xml:space="preserve"> PAGEREF _Toc240641367 \h </w:instrText>
         </w:r>
         <w:r>
           <w:rPr>
@@ -5667,7 +5667,7 @@
           <w14:ligatures w14:val="standardContextual"/>
         </w:rPr>
       </w:pPr>
-      <w:hyperlink w:anchor="_Toc240613715" w:history="1">
+      <w:hyperlink w:anchor="_Toc240641368" w:history="1">
         <w:r>
           <w:rPr>
             <w:rStyle w:val="Hyperlink"/>
@@ -5694,7 +5694,7 @@
             <w:noProof/>
             <w:webHidden/>
           </w:rPr>
-          <w:instrText xml:space="preserve"> PAGEREF _Toc240613715 \h </w:instrText>
+          <w:instrText xml:space="preserve"> PAGEREF _Toc240641368 \h </w:instrText>
         </w:r>
         <w:r>
           <w:rPr>
@@ -5742,7 +5742,7 @@
           <w14:ligatures w14:val="standardContextual"/>
         </w:rPr>
       </w:pPr>
-      <w:hyperlink w:anchor="_Toc240613716" w:history="1">
+      <w:hyperlink w:anchor="_Toc240641369" w:history="1">
         <w:r>
           <w:rPr>
             <w:rStyle w:val="Hyperlink"/>
@@ -5769,7 +5769,7 @@
             <w:noProof/>
             <w:webHidden/>
           </w:rPr>
-          <w:instrText xml:space="preserve"> PAGEREF _Toc240613716 \h </w:instrText>
+          <w:instrText xml:space="preserve"> PAGEREF _Toc240641369 \h </w:instrText>
         </w:r>
         <w:r>
           <w:rPr>
@@ -5816,7 +5816,7 @@
           <w14:ligatures w14:val="standardContextual"/>
         </w:rPr>
       </w:pPr>
-      <w:hyperlink w:anchor="_Toc240613717" w:history="1">
+      <w:hyperlink w:anchor="_Toc240641370" w:history="1">
         <w:r>
           <w:rPr>
             <w:rStyle w:val="Hyperlink"/>
@@ -5843,7 +5843,7 @@
             <w:noProof/>
             <w:webHidden/>
           </w:rPr>
-          <w:instrText xml:space="preserve"> PAGEREF _Toc240613717 \h </w:instrText>
+          <w:instrText xml:space="preserve"> PAGEREF _Toc240641370 \h </w:instrText>
         </w:r>
         <w:r>
           <w:rPr>
@@ -5863,7 +5863,7 @@
             <w:noProof/>
             <w:webHidden/>
           </w:rPr>
-          <w:t>39</w:t>
+          <w:t>38</w:t>
         </w:r>
         <w:r>
           <w:rPr>
@@ -5890,7 +5890,7 @@
           <w14:ligatures w14:val="standardContextual"/>
         </w:rPr>
       </w:pPr>
-      <w:hyperlink w:anchor="_Toc240613718" w:history="1">
+      <w:hyperlink w:anchor="_Toc240641371" w:history="1">
         <w:r>
           <w:rPr>
             <w:rStyle w:val="Hyperlink"/>
@@ -5917,7 +5917,7 @@
             <w:noProof/>
             <w:webHidden/>
           </w:rPr>
-          <w:instrText xml:space="preserve"> PAGEREF _Toc240613718 \h </w:instrText>
+          <w:instrText xml:space="preserve"> PAGEREF _Toc240641371 \h </w:instrText>
         </w:r>
         <w:r>
           <w:rPr>
@@ -5964,7 +5964,7 @@
           <w14:ligatures w14:val="standardContextual"/>
         </w:rPr>
       </w:pPr>
-      <w:hyperlink w:anchor="_Toc240613719" w:history="1">
+      <w:hyperlink w:anchor="_Toc240641372" w:history="1">
         <w:r>
           <w:rPr>
             <w:rStyle w:val="Hyperlink"/>
@@ -5991,7 +5991,7 @@
             <w:noProof/>
             <w:webHidden/>
           </w:rPr>
-          <w:instrText xml:space="preserve"> PAGEREF _Toc240613719 \h </w:instrText>
+          <w:instrText xml:space="preserve"> PAGEREF _Toc240641372 \h </w:instrText>
         </w:r>
         <w:r>
           <w:rPr>
@@ -6039,7 +6039,7 @@
           <w14:ligatures w14:val="standardContextual"/>
         </w:rPr>
       </w:pPr>
-      <w:hyperlink w:anchor="_Toc240613720" w:history="1">
+      <w:hyperlink w:anchor="_Toc240641373" w:history="1">
         <w:r>
           <w:rPr>
             <w:rStyle w:val="Hyperlink"/>
@@ -6066,7 +6066,7 @@
             <w:noProof/>
             <w:webHidden/>
           </w:rPr>
-          <w:instrText xml:space="preserve"> PAGEREF _Toc240613720 \h </w:instrText>
+          <w:instrText xml:space="preserve"> PAGEREF _Toc240641373 \h </w:instrText>
         </w:r>
         <w:r>
           <w:rPr>
@@ -6114,7 +6114,7 @@
           <w14:ligatures w14:val="standardContextual"/>
         </w:rPr>
       </w:pPr>
-      <w:hyperlink w:anchor="_Toc240613721" w:history="1">
+      <w:hyperlink w:anchor="_Toc240641374" w:history="1">
         <w:r>
           <w:rPr>
             <w:rStyle w:val="Hyperlink"/>
@@ -6141,7 +6141,7 @@
             <w:noProof/>
             <w:webHidden/>
           </w:rPr>
-          <w:instrText xml:space="preserve"> PAGEREF _Toc240613721 \h </w:instrText>
+          <w:instrText xml:space="preserve"> PAGEREF _Toc240641374 \h </w:instrText>
         </w:r>
         <w:r>
           <w:rPr>
@@ -6189,7 +6189,7 @@
           <w14:ligatures w14:val="standardContextual"/>
         </w:rPr>
       </w:pPr>
-      <w:hyperlink w:anchor="_Toc240613722" w:history="1">
+      <w:hyperlink w:anchor="_Toc240641375" w:history="1">
         <w:r>
           <w:rPr>
             <w:rStyle w:val="Hyperlink"/>
@@ -6216,7 +6216,7 @@
             <w:noProof/>
             <w:webHidden/>
           </w:rPr>
-          <w:instrText xml:space="preserve"> PAGEREF _Toc240613722 \h </w:instrText>
+          <w:instrText xml:space="preserve"> PAGEREF _Toc240641375 \h </w:instrText>
         </w:r>
         <w:r>
           <w:rPr>
@@ -6264,7 +6264,7 @@
           <w14:ligatures w14:val="standardContextual"/>
         </w:rPr>
       </w:pPr>
-      <w:hyperlink w:anchor="_Toc240613723" w:history="1">
+      <w:hyperlink w:anchor="_Toc240641376" w:history="1">
         <w:r>
           <w:rPr>
             <w:rStyle w:val="Hyperlink"/>
@@ -6291,7 +6291,7 @@
             <w:noProof/>
             <w:webHidden/>
           </w:rPr>
-          <w:instrText xml:space="preserve"> PAGEREF _Toc240613723 \h </w:instrText>
+          <w:instrText xml:space="preserve"> PAGEREF _Toc240641376 \h </w:instrText>
         </w:r>
         <w:r>
           <w:rPr>
@@ -6339,7 +6339,7 @@
           <w14:ligatures w14:val="standardContextual"/>
         </w:rPr>
       </w:pPr>
-      <w:hyperlink w:anchor="_Toc240613724" w:history="1">
+      <w:hyperlink w:anchor="_Toc240641377" w:history="1">
         <w:r>
           <w:rPr>
             <w:rStyle w:val="Hyperlink"/>
@@ -6381,7 +6381,7 @@
             <w:noProof/>
             <w:webHidden/>
           </w:rPr>
-          <w:instrText xml:space="preserve"> PAGEREF _Toc240613724 \h </w:instrText>
+          <w:instrText xml:space="preserve"> PAGEREF _Toc240641377 \h </w:instrText>
         </w:r>
         <w:r>
           <w:rPr>
@@ -6429,7 +6429,7 @@
           <w14:ligatures w14:val="standardContextual"/>
         </w:rPr>
       </w:pPr>
-      <w:hyperlink w:anchor="_Toc240613725" w:history="1">
+      <w:hyperlink w:anchor="_Toc240641378" w:history="1">
         <w:r>
           <w:rPr>
             <w:rStyle w:val="Hyperlink"/>
@@ -6471,7 +6471,7 @@
             <w:noProof/>
             <w:webHidden/>
           </w:rPr>
-          <w:instrText xml:space="preserve"> PAGEREF _Toc240613725 \h </w:instrText>
+          <w:instrText xml:space="preserve"> PAGEREF _Toc240641378 \h </w:instrText>
         </w:r>
         <w:r>
           <w:rPr>
@@ -6491,7 +6491,7 @@
             <w:noProof/>
             <w:webHidden/>
           </w:rPr>
-          <w:t>48</w:t>
+          <w:t>47</w:t>
         </w:r>
         <w:r>
           <w:rPr>
@@ -6518,7 +6518,7 @@
           <w14:ligatures w14:val="standardContextual"/>
         </w:rPr>
       </w:pPr>
-      <w:hyperlink w:anchor="_Toc240613726" w:history="1">
+      <w:hyperlink w:anchor="_Toc240641379" w:history="1">
         <w:r>
           <w:rPr>
             <w:rStyle w:val="Hyperlink"/>
@@ -6545,7 +6545,7 @@
             <w:noProof/>
             <w:webHidden/>
           </w:rPr>
-          <w:instrText xml:space="preserve"> PAGEREF _Toc240613726 \h </w:instrText>
+          <w:instrText xml:space="preserve"> PAGEREF _Toc240641379 \h </w:instrText>
         </w:r>
         <w:r>
           <w:rPr>
@@ -6592,7 +6592,7 @@
           <w14:ligatures w14:val="standardContextual"/>
         </w:rPr>
       </w:pPr>
-      <w:hyperlink w:anchor="_Toc240613727" w:history="1">
+      <w:hyperlink w:anchor="_Toc240641380" w:history="1">
         <w:r>
           <w:rPr>
             <w:rStyle w:val="Hyperlink"/>
@@ -6619,7 +6619,7 @@
             <w:noProof/>
             <w:webHidden/>
           </w:rPr>
-          <w:instrText xml:space="preserve"> PAGEREF _Toc240613727 \h </w:instrText>
+          <w:instrText xml:space="preserve"> PAGEREF _Toc240641380 \h </w:instrText>
         </w:r>
         <w:r>
           <w:rPr>
@@ -6667,7 +6667,7 @@
           <w14:ligatures w14:val="standardContextual"/>
         </w:rPr>
       </w:pPr>
-      <w:hyperlink w:anchor="_Toc240613728" w:history="1">
+      <w:hyperlink w:anchor="_Toc240641381" w:history="1">
         <w:r>
           <w:rPr>
             <w:rStyle w:val="Hyperlink"/>
@@ -6694,7 +6694,7 @@
             <w:noProof/>
             <w:webHidden/>
           </w:rPr>
-          <w:instrText xml:space="preserve"> PAGEREF _Toc240613728 \h </w:instrText>
+          <w:instrText xml:space="preserve"> PAGEREF _Toc240641381 \h </w:instrText>
         </w:r>
         <w:r>
           <w:rPr>
@@ -6714,7 +6714,7 @@
             <w:noProof/>
             <w:webHidden/>
           </w:rPr>
-          <w:t>51</w:t>
+          <w:t>50</w:t>
         </w:r>
         <w:r>
           <w:rPr>
@@ -6740,7 +6740,7 @@
         </w:rPr>
         <w:fldChar w:fldCharType="end"/>
       </w:r>
-      <w:bookmarkStart w:id="6" w:name="_Toc240613679"/>
+      <w:bookmarkStart w:id="6" w:name="_Toc240641332"/>
       <w:r>
         <w:rPr>
           <w:rFonts w:ascii="Times New Roman" w:hAnsi="Times New Roman"/>
@@ -6966,7 +6966,7 @@
         <w:spacing w:after="360"/>
         <w:outlineLvl w:val="0"/>
       </w:pPr>
-      <w:bookmarkStart w:id="7" w:name="_Toc240613680"/>
+      <w:bookmarkStart w:id="7" w:name="_Toc240641333"/>
       <w:r>
         <w:rPr>
           <w:rFonts w:ascii="Times New Roman" w:hAnsi="Times New Roman"/>
@@ -7143,7 +7143,7 @@
         <w:pStyle w:val="Heading1"/>
         <w:outlineLvl w:val="0"/>
       </w:pPr>
-      <w:bookmarkStart w:id="8" w:name="_Toc240613681"/>
+      <w:bookmarkStart w:id="8" w:name="_Toc240641334"/>
       <w:r>
         <w:rPr>
           <w:rFonts w:ascii="Times New Roman" w:hAnsi="Times New Roman"/>
@@ -7161,7 +7161,7 @@
         <w:pStyle w:val="Heading2"/>
         <w:outlineLvl w:val="1"/>
       </w:pPr>
-      <w:bookmarkStart w:id="9" w:name="_Toc240613682"/>
+      <w:bookmarkStart w:id="9" w:name="_Toc240641335"/>
       <w:r>
         <w:rPr>
           <w:rFonts w:ascii="Times New Roman" w:hAnsi="Times New Roman"/>
@@ -7577,7 +7577,7 @@
           <w:noProof/>
         </w:rPr>
         <w:drawing>
-          <wp:inline distT="0" distB="0" distL="0" distR="0" wp14:anchorId="2FD81872" wp14:editId="102E9918">
+          <wp:inline distT="0" distB="0" distL="0" distR="0" wp14:anchorId="7F4E5849" wp14:editId="7B9DF169">
             <wp:extent cx="4860000" cy="2980356"/>
             <wp:effectExtent l="0" t="0" r="0" b="0"/>
             <wp:docPr id="2" name="Picture 2"/>
@@ -7790,7 +7790,7 @@
           <w:noProof/>
         </w:rPr>
         <w:drawing>
-          <wp:inline distT="0" distB="0" distL="0" distR="0" wp14:anchorId="66B3F2BA" wp14:editId="2073AE93">
+          <wp:inline distT="0" distB="0" distL="0" distR="0" wp14:anchorId="754343F3" wp14:editId="3092B664">
             <wp:extent cx="4860000" cy="2719286"/>
             <wp:effectExtent l="0" t="0" r="0" b="0"/>
             <wp:docPr id="3" name="Picture 3"/>
@@ -8368,7 +8368,7 @@
           <w:noProof/>
         </w:rPr>
         <w:drawing>
-          <wp:inline distT="0" distB="0" distL="0" distR="0" wp14:anchorId="10FD118D" wp14:editId="57970106">
+          <wp:inline distT="0" distB="0" distL="0" distR="0" wp14:anchorId="076BF093" wp14:editId="52F8ED80">
             <wp:extent cx="4860000" cy="2818800"/>
             <wp:effectExtent l="0" t="0" r="0" b="0"/>
             <wp:docPr id="4" name="Picture 4"/>
@@ -14710,7 +14710,7 @@
         <w:pStyle w:val="Heading2"/>
         <w:outlineLvl w:val="1"/>
       </w:pPr>
-      <w:bookmarkStart w:id="14" w:name="_Toc240613683"/>
+      <w:bookmarkStart w:id="14" w:name="_Toc240641336"/>
       <w:r>
         <w:rPr>
           <w:rFonts w:ascii="Times New Roman" w:hAnsi="Times New Roman"/>
@@ -15133,7 +15133,7 @@
         <w:pStyle w:val="Heading2"/>
         <w:outlineLvl w:val="1"/>
       </w:pPr>
-      <w:bookmarkStart w:id="15" w:name="_Toc240613684"/>
+      <w:bookmarkStart w:id="15" w:name="_Toc240641337"/>
       <w:r>
         <w:rPr>
           <w:rFonts w:ascii="Times New Roman" w:hAnsi="Times New Roman"/>
@@ -15557,7 +15557,7 @@
         <w:pStyle w:val="Heading2"/>
         <w:outlineLvl w:val="1"/>
       </w:pPr>
-      <w:bookmarkStart w:id="16" w:name="_Toc240613685"/>
+      <w:bookmarkStart w:id="16" w:name="_Toc240641338"/>
       <w:r>
         <w:rPr>
           <w:rFonts w:ascii="Times New Roman" w:hAnsi="Times New Roman"/>
@@ -15587,7 +15587,7 @@
         <w:pStyle w:val="Heading3"/>
         <w:outlineLvl w:val="2"/>
       </w:pPr>
-      <w:bookmarkStart w:id="17" w:name="_Toc240613686"/>
+      <w:bookmarkStart w:id="17" w:name="_Toc240641339"/>
       <w:r>
         <w:rPr>
           <w:rFonts w:ascii="Times New Roman" w:hAnsi="Times New Roman"/>
@@ -15818,7 +15818,7 @@
         <w:pStyle w:val="Heading3"/>
         <w:outlineLvl w:val="2"/>
       </w:pPr>
-      <w:bookmarkStart w:id="18" w:name="_Toc240613687"/>
+      <w:bookmarkStart w:id="18" w:name="_Toc240641340"/>
       <w:r>
         <w:rPr>
           <w:rFonts w:ascii="Times New Roman" w:hAnsi="Times New Roman"/>
@@ -15963,7 +15963,7 @@
         <w:pStyle w:val="Heading1"/>
         <w:outlineLvl w:val="0"/>
       </w:pPr>
-      <w:bookmarkStart w:id="19" w:name="_Toc240613688"/>
+      <w:bookmarkStart w:id="19" w:name="_Toc240641341"/>
       <w:r>
         <w:rPr>
           <w:rFonts w:ascii="Times New Roman" w:hAnsi="Times New Roman"/>
@@ -15981,7 +15981,7 @@
         <w:pStyle w:val="Heading2"/>
         <w:outlineLvl w:val="1"/>
       </w:pPr>
-      <w:bookmarkStart w:id="20" w:name="_Toc240613689"/>
+      <w:bookmarkStart w:id="20" w:name="_Toc240641342"/>
       <w:r>
         <w:rPr>
           <w:rFonts w:ascii="Times New Roman" w:hAnsi="Times New Roman"/>
@@ -15998,7 +15998,7 @@
         <w:pStyle w:val="Heading3"/>
         <w:outlineLvl w:val="2"/>
       </w:pPr>
-      <w:bookmarkStart w:id="21" w:name="_Toc240613690"/>
+      <w:bookmarkStart w:id="21" w:name="_Toc240641343"/>
       <w:r>
         <w:rPr>
           <w:rFonts w:ascii="Times New Roman" w:hAnsi="Times New Roman"/>
@@ -16039,7 +16039,7 @@
         <w:rPr>
           <w:rFonts w:cs="Times New Roman"/>
         </w:rPr>
-        <w:t>Penelitian ini berakar pada teori utama (</w:t>
+        <w:t>Teori utama (</w:t>
       </w:r>
       <w:r>
         <w:rPr>
@@ -16052,7 +16052,7 @@
         <w:rPr>
           <w:rFonts w:cs="Times New Roman"/>
         </w:rPr>
-        <w:t xml:space="preserve">) </w:t>
+        <w:t xml:space="preserve">) yang dipakai adalah </w:t>
       </w:r>
       <w:r>
         <w:rPr>
@@ -16385,7 +16385,7 @@
         <w:pStyle w:val="Heading3"/>
         <w:outlineLvl w:val="2"/>
       </w:pPr>
-      <w:bookmarkStart w:id="22" w:name="_Toc240613691"/>
+      <w:bookmarkStart w:id="22" w:name="_Toc240641344"/>
       <w:r>
         <w:rPr>
           <w:rFonts w:ascii="Times New Roman" w:hAnsi="Times New Roman"/>
@@ -16427,7 +16427,7 @@
         <w:rPr>
           <w:rFonts w:cs="Times New Roman"/>
         </w:rPr>
-        <w:t xml:space="preserve">Penelitian ini didukung oleh model </w:t>
+        <w:t xml:space="preserve">Model </w:t>
       </w:r>
       <w:r>
         <w:rPr>
@@ -16440,7 +16440,7 @@
         <w:rPr>
           <w:rFonts w:cs="Times New Roman"/>
         </w:rPr>
-        <w:t xml:space="preserve"> (S-O-R) yang dikembangkan oleh </w:t>
+        <w:t xml:space="preserve"> (S-O-R) dari </w:t>
       </w:r>
       <w:hyperlink w:anchor="Ref_mehrabian1974approach" w:history="1">
         <w:r>
@@ -16451,7 +16451,7 @@
         <w:rPr>
           <w:rFonts w:cs="Times New Roman"/>
         </w:rPr>
-        <w:t>. Model ini menjelaskan bahwa pemicu lingkungan eksternal (</w:t>
+        <w:t xml:space="preserve"> menjadi kerangka pendukung. Model ini menjelaskan bahwa pemicu lingkungan eksternal (</w:t>
       </w:r>
       <w:r>
         <w:rPr>
@@ -16735,7 +16735,7 @@
         <w:pStyle w:val="Heading3"/>
         <w:outlineLvl w:val="2"/>
       </w:pPr>
-      <w:bookmarkStart w:id="23" w:name="_Toc240613692"/>
+      <w:bookmarkStart w:id="23" w:name="_Toc240641345"/>
       <w:r>
         <w:rPr>
           <w:rFonts w:ascii="Times New Roman" w:hAnsi="Times New Roman"/>
@@ -16925,7 +16925,7 @@
         <w:pStyle w:val="Heading3"/>
         <w:outlineLvl w:val="2"/>
       </w:pPr>
-      <w:bookmarkStart w:id="24" w:name="_Toc240613693"/>
+      <w:bookmarkStart w:id="24" w:name="_Toc240641346"/>
       <w:r>
         <w:rPr>
           <w:rFonts w:ascii="Times New Roman" w:hAnsi="Times New Roman"/>
@@ -17047,7 +17047,7 @@
         <w:pStyle w:val="Heading2"/>
         <w:outlineLvl w:val="1"/>
       </w:pPr>
-      <w:bookmarkStart w:id="25" w:name="_Toc240613694"/>
+      <w:bookmarkStart w:id="25" w:name="_Toc240641347"/>
       <w:r>
         <w:rPr>
           <w:rFonts w:ascii="Times New Roman" w:hAnsi="Times New Roman"/>
@@ -17064,7 +17064,7 @@
         <w:pStyle w:val="Heading3"/>
         <w:outlineLvl w:val="2"/>
       </w:pPr>
-      <w:bookmarkStart w:id="26" w:name="_Toc240613695"/>
+      <w:bookmarkStart w:id="26" w:name="_Toc240641348"/>
       <w:r>
         <w:rPr>
           <w:rFonts w:ascii="Times New Roman" w:hAnsi="Times New Roman"/>
@@ -17200,7 +17200,7 @@
         <w:pStyle w:val="Heading3"/>
         <w:outlineLvl w:val="2"/>
       </w:pPr>
-      <w:bookmarkStart w:id="27" w:name="_Toc240613696"/>
+      <w:bookmarkStart w:id="27" w:name="_Toc240641349"/>
       <w:r>
         <w:rPr>
           <w:rFonts w:ascii="Times New Roman" w:hAnsi="Times New Roman"/>
@@ -17353,7 +17353,7 @@
         <w:pStyle w:val="Heading3"/>
         <w:outlineLvl w:val="2"/>
       </w:pPr>
-      <w:bookmarkStart w:id="28" w:name="_Toc240613697"/>
+      <w:bookmarkStart w:id="28" w:name="_Toc240641350"/>
       <w:r>
         <w:rPr>
           <w:rFonts w:ascii="Times New Roman" w:hAnsi="Times New Roman"/>
@@ -17540,7 +17540,7 @@
         <w:pStyle w:val="Heading3"/>
         <w:outlineLvl w:val="2"/>
       </w:pPr>
-      <w:bookmarkStart w:id="29" w:name="_Toc240613698"/>
+      <w:bookmarkStart w:id="29" w:name="_Toc240641351"/>
       <w:r>
         <w:rPr>
           <w:rFonts w:ascii="Times New Roman" w:hAnsi="Times New Roman"/>
@@ -17784,7 +17784,7 @@
         <w:pStyle w:val="Heading3"/>
         <w:outlineLvl w:val="2"/>
       </w:pPr>
-      <w:bookmarkStart w:id="30" w:name="_Toc240613699"/>
+      <w:bookmarkStart w:id="30" w:name="_Toc240641352"/>
       <w:r>
         <w:rPr>
           <w:rFonts w:ascii="Times New Roman" w:hAnsi="Times New Roman"/>
@@ -17979,7 +17979,7 @@
         <w:pStyle w:val="Heading2"/>
         <w:outlineLvl w:val="1"/>
       </w:pPr>
-      <w:bookmarkStart w:id="31" w:name="_Toc240613700"/>
+      <w:bookmarkStart w:id="31" w:name="_Toc240641353"/>
       <w:r>
         <w:rPr>
           <w:rFonts w:ascii="Times New Roman" w:hAnsi="Times New Roman"/>
@@ -18001,7 +18001,7 @@
         <w:rPr>
           <w:rFonts w:cs="Times New Roman"/>
         </w:rPr>
-        <w:t>Berikut disajikan ringkasan penelitian-penelitian terdahulu yang relevan dengan konstruk penelitian ini:</w:t>
+        <w:t>Berikut disajikan ringkasan sepuluh studi empiris 2021–2026 yang menopang perumusan hipotesis H1–H6:</w:t>
       </w:r>
     </w:p>
     <w:p>
@@ -19591,7 +19591,7 @@
         <w:pStyle w:val="Heading2"/>
         <w:outlineLvl w:val="1"/>
       </w:pPr>
-      <w:bookmarkStart w:id="33" w:name="_Toc240613701"/>
+      <w:bookmarkStart w:id="33" w:name="_Toc240641354"/>
       <w:r>
         <w:rPr>
           <w:rFonts w:ascii="Times New Roman" w:hAnsi="Times New Roman"/>
@@ -19609,7 +19609,7 @@
         <w:pStyle w:val="Heading3"/>
         <w:outlineLvl w:val="2"/>
       </w:pPr>
-      <w:bookmarkStart w:id="34" w:name="_Toc240613702"/>
+      <w:bookmarkStart w:id="34" w:name="_Toc240641355"/>
       <w:r>
         <w:rPr>
           <w:rFonts w:ascii="Times New Roman" w:hAnsi="Times New Roman"/>
@@ -19667,7 +19667,7 @@
         <w:rPr>
           <w:rFonts w:cs="Times New Roman"/>
         </w:rPr>
-        <w:t xml:space="preserve"> Berdasarkan model S-O-R </w:t>
+        <w:t xml:space="preserve"> Model S-O-R </w:t>
       </w:r>
       <w:hyperlink w:anchor="Ref_mehrabian1974approach" w:history="1">
         <w:r>
@@ -19689,7 +19689,7 @@
         <w:rPr>
           <w:rFonts w:cs="Times New Roman"/>
         </w:rPr>
-        <w:t xml:space="preserve">, motivasi hedonis memposisikan belanja sebagai sarana mencari kesenangan emosional dan fantasi. Rangsangan afektif ini menurunkan pertimbangan rasional dan mendorong tindakan belanja seketika demi mempertahankan suasana hati positif </w:t>
+        <w:t xml:space="preserve"> memposisikan belanja sebagai sarana mencari kesenangan emosional dan fantasi. Rangsangan afektif ini menurunkan pertimbangan rasional dan mendorong tindakan belanja seketika demi mempertahankan suasana hati positif </w:t>
       </w:r>
       <w:hyperlink w:anchor="Ref_babin1994work" w:history="1">
         <w:r>
@@ -19733,7 +19733,7 @@
         <w:rPr>
           <w:rFonts w:cs="Times New Roman"/>
         </w:rPr>
-        <w:t xml:space="preserve"> Studi empiris terkini oleh </w:t>
+        <w:t xml:space="preserve"> Bukti empiris terkini dari </w:t>
       </w:r>
       <w:hyperlink w:anchor="Ref_pranggabayu2022pengaruh" w:history="1">
         <w:r>
@@ -19766,7 +19766,7 @@
         <w:rPr>
           <w:rFonts w:cs="Times New Roman"/>
         </w:rPr>
-        <w:t xml:space="preserve"> pada konsumen Indonesia membuktikan bahwa motivasi hedonis dan kenikmatan berbelanja (</w:t>
+        <w:t xml:space="preserve"> pada konsumen Indonesia menunjukkan bahwa motivasi hedonis dan kenikmatan berbelanja (</w:t>
       </w:r>
       <w:r>
         <w:rPr>
@@ -19825,7 +19825,7 @@
         <w:rPr>
           <w:rFonts w:cs="Times New Roman"/>
         </w:rPr>
-        <w:t xml:space="preserve"> menghadirkan elemen kejutan mendebarkan. Sensasi merobek kemasan foil dan sensasi puas yang intens saat mendapati kartu hologram langka memberikan kenikmatan emosional instan. Dorongan hedonis ini memicu pembelian berulang secara mendadak di kasir toko tanpa perencanaan anggaran.</w:t>
+        <w:t xml:space="preserve"> menghadirkan elemen kejutan mendebarkan. Sensasi merobek kemasan foil dan sensasi puas yang intens saat mendapati kartu hologram langka memberikan kenikmatan emosional instan. Akibatnya, pembelian berulang terjadi secara mendadak di kasir toko tanpa perencanaan anggaran.</w:t>
       </w:r>
     </w:p>
     <w:p>
@@ -19892,7 +19892,7 @@
         <w:pStyle w:val="Heading3"/>
         <w:outlineLvl w:val="2"/>
       </w:pPr>
-      <w:bookmarkStart w:id="35" w:name="_Toc240613703"/>
+      <w:bookmarkStart w:id="35" w:name="_Toc240641356"/>
       <w:r>
         <w:rPr>
           <w:rFonts w:ascii="Times New Roman" w:hAnsi="Times New Roman"/>
@@ -19950,7 +19950,7 @@
         <w:rPr>
           <w:rFonts w:cs="Times New Roman"/>
         </w:rPr>
-        <w:t xml:space="preserve"> Berakar pada </w:t>
+        <w:t xml:space="preserve"> Titik berangkatnya adalah </w:t>
       </w:r>
       <w:r>
         <w:rPr>
@@ -20011,7 +20011,7 @@
         <w:rPr>
           <w:rFonts w:cs="Times New Roman"/>
         </w:rPr>
-        <w:t>, manusia memiliki resistensi alami terhadap ketidaktuntasan (</w:t>
+        <w:t>: manusia memiliki resistensi alami terhadap ketidaktuntasan (</w:t>
       </w:r>
       <w:r>
         <w:rPr>
@@ -20079,7 +20079,7 @@
         <w:rPr>
           <w:rFonts w:cs="Times New Roman"/>
         </w:rPr>
-        <w:t xml:space="preserve"> Selain pembuktian seminal oleh </w:t>
+        <w:t xml:space="preserve"> Selain temuan seminal </w:t>
       </w:r>
       <w:hyperlink w:anchor="Ref_gao2014completing" w:history="1">
         <w:r>
@@ -20177,14 +20177,14 @@
         <w:rPr>
           <w:rFonts w:cs="Times New Roman"/>
         </w:rPr>
-        <w:t xml:space="preserve">), dan hasrat menuntaskan seri koleksi menjadi pemicu </w:t>
+        <w:t xml:space="preserve">), dan hasrat menuntaskan seri koleksi menjadi pemicu pembelian impulsif yang </w:t>
       </w:r>
       <w:r>
         <w:rPr>
           <w:rFonts w:cs="Times New Roman"/>
         </w:rPr>
         <w:lastRenderedPageBreak/>
-        <w:t xml:space="preserve">pembelian impulsif yang agresif pada Generasi Z; bukti domestik Indonesia ditopang oleh </w:t>
+        <w:t xml:space="preserve">agresif pada Generasi Z; bukti domestik Indonesia ditopang oleh </w:t>
       </w:r>
       <w:hyperlink w:anchor="Ref_dewi2026understanding" w:history="1">
         <w:r>
@@ -20254,7 +20254,7 @@
         <w:rPr>
           <w:rFonts w:cs="Times New Roman"/>
         </w:rPr>
-        <w:t xml:space="preserve"> kolektor memicu ketegangan kognitif visual yang kuat untuk menuntaskan set secara utuh. Desakan menutup celah kosong ini mendorong kolektor membeli </w:t>
+        <w:t xml:space="preserve"> kolektor memicu ketegangan kognitif visual yang kuat untuk menuntaskan set secara utuh. Desakan menutup celah kosong ini membuat kolektor membeli </w:t>
       </w:r>
       <w:r>
         <w:rPr>
@@ -20334,7 +20334,7 @@
         <w:pStyle w:val="Heading3"/>
         <w:outlineLvl w:val="2"/>
       </w:pPr>
-      <w:bookmarkStart w:id="36" w:name="_Toc240613704"/>
+      <w:bookmarkStart w:id="36" w:name="_Toc240641357"/>
       <w:r>
         <w:rPr>
           <w:rFonts w:ascii="Times New Roman" w:hAnsi="Times New Roman"/>
@@ -20392,7 +20392,7 @@
         <w:rPr>
           <w:rFonts w:cs="Times New Roman"/>
         </w:rPr>
-        <w:t xml:space="preserve"> Dalam kerangka </w:t>
+        <w:t xml:space="preserve"> Logika </w:t>
       </w:r>
       <w:r>
         <w:rPr>
@@ -20427,7 +20427,7 @@
         <w:rPr>
           <w:rFonts w:cs="Times New Roman"/>
         </w:rPr>
-        <w:t>), motif spekulasi memandu keputusan pembelian berdasarkan ekspektasi keuntungan modal (</w:t>
+        <w:t>) menempatkan motif spekulasi sebagai keputusan pembelian yang dipandu ekspektasi keuntungan modal (</w:t>
       </w:r>
       <w:r>
         <w:rPr>
@@ -20495,7 +20495,7 @@
         <w:rPr>
           <w:rFonts w:cs="Times New Roman"/>
         </w:rPr>
-        <w:t xml:space="preserve"> membuktikan secara empiris bahwa komunitas penggemar permainan kartu koleksi (</w:t>
+        <w:t xml:space="preserve"> melaporkan bahwa komunitas penggemar permainan kartu koleksi (</w:t>
       </w:r>
       <w:r>
         <w:rPr>
@@ -20661,7 +20661,7 @@
         <w:rPr>
           <w:rFonts w:cs="Times New Roman"/>
         </w:rPr>
-        <w:t xml:space="preserve">). Persepsi modal kecil berpotensi menghasilkan apresiasi modal atau keuntungan finansial yang besar melumpuhkan kehati-hatian finansial dan memicu aksi borong </w:t>
+        <w:t xml:space="preserve">). Persepsi ini melumpuhkan kehati-hatian finansial dan memicu aksi borong </w:t>
       </w:r>
       <w:r>
         <w:rPr>
@@ -20741,7 +20741,7 @@
         <w:pStyle w:val="Heading3"/>
         <w:outlineLvl w:val="2"/>
       </w:pPr>
-      <w:bookmarkStart w:id="37" w:name="_Toc240613705"/>
+      <w:bookmarkStart w:id="37" w:name="_Toc240641358"/>
       <w:r>
         <w:rPr>
           <w:rFonts w:ascii="Times New Roman" w:hAnsi="Times New Roman"/>
@@ -20818,7 +20818,7 @@
         <w:rPr>
           <w:rFonts w:cs="Times New Roman"/>
         </w:rPr>
-        <w:t xml:space="preserve"> Mengacu pada </w:t>
+        <w:t xml:space="preserve"> </w:t>
       </w:r>
       <w:r>
         <w:rPr>
@@ -20866,7 +20866,7 @@
         <w:rPr>
           <w:rFonts w:cs="Times New Roman"/>
         </w:rPr>
-        <w:t>, dorongan hedonis sesaat (</w:t>
+        <w:t xml:space="preserve"> menjelaskan bahwa dorongan hedonis sesaat (</w:t>
       </w:r>
       <w:r>
         <w:rPr>
@@ -21124,7 +21124,7 @@
           <w:rFonts w:cs="Times New Roman"/>
         </w:rPr>
         <w:lastRenderedPageBreak/>
-        <w:t>menolak godaan sesaat, dan mematuhi batas anggaran. Dengan demikian, kontrol diri memperlemah pengaruh motivasi hedonis terhadap pembelian impulsif.</w:t>
+        <w:t>menolak godaan sesaat, dan mematuhi batas anggaran. Akibatnya, kontrol diri memperlemah pengaruh motivasi hedonis terhadap pembelian impulsif.</w:t>
       </w:r>
     </w:p>
     <w:p>
@@ -21206,7 +21206,7 @@
         <w:pStyle w:val="Heading3"/>
         <w:outlineLvl w:val="2"/>
       </w:pPr>
-      <w:bookmarkStart w:id="38" w:name="_Toc240613706"/>
+      <w:bookmarkStart w:id="38" w:name="_Toc240641359"/>
       <w:r>
         <w:rPr>
           <w:rFonts w:ascii="Times New Roman" w:hAnsi="Times New Roman"/>
@@ -21560,7 +21560,7 @@
         <w:rPr>
           <w:rFonts w:cs="Times New Roman"/>
         </w:rPr>
-        <w:t>) di pasar sekunder secara terencana. Dengan demikian, kontrol diri memperlemah pengaruh hasrat kelengkapan terhadap pembelian impulsif.</w:t>
+        <w:t>) di pasar sekunder secara terencana. Akibatnya, kontrol diri memperlemah pengaruh hasrat kelengkapan terhadap pembelian impulsif.</w:t>
       </w:r>
     </w:p>
     <w:p>
@@ -21643,7 +21643,7 @@
         <w:pStyle w:val="Heading3"/>
         <w:outlineLvl w:val="2"/>
       </w:pPr>
-      <w:bookmarkStart w:id="39" w:name="_Toc240613707"/>
+      <w:bookmarkStart w:id="39" w:name="_Toc240641360"/>
       <w:r>
         <w:rPr>
           <w:rFonts w:ascii="Times New Roman" w:hAnsi="Times New Roman"/>
@@ -21932,7 +21932,7 @@
         <w:rPr>
           <w:rFonts w:cs="Times New Roman"/>
         </w:rPr>
-        <w:t xml:space="preserve"> PSA 10 sangat memikat. Namun, pembeli dengan kontrol diri kokoh memiliki disiplin untuk tidak menghamburkan uang secara spontan pada kemasan acak berisiko tinggi. Kontrol diri bertindak sebagai benteng pertahanan yang meredam ambisi spekulatif agar tidak bertransformasi menjadi tindakan </w:t>
+        <w:t xml:space="preserve"> PSA 10 kuat memikat. Sebaliknya, pembeli dengan kontrol diri kokoh memiliki disiplin untuk tidak menghamburkan uang secara spontan pada kemasan acak berisiko tinggi. Disiplin tersebut meredam ambisi spekulatif agar tidak bertransformasi menjadi tindakan </w:t>
       </w:r>
       <w:r>
         <w:rPr>
@@ -22027,7 +22027,7 @@
         <w:pStyle w:val="Heading2"/>
         <w:outlineLvl w:val="1"/>
       </w:pPr>
-      <w:bookmarkStart w:id="40" w:name="_Toc240613708"/>
+      <w:bookmarkStart w:id="40" w:name="_Toc240641361"/>
       <w:r>
         <w:rPr>
           <w:rFonts w:ascii="Times New Roman" w:hAnsi="Times New Roman"/>
@@ -22049,7 +22049,7 @@
         <w:rPr>
           <w:rFonts w:cs="Times New Roman"/>
         </w:rPr>
-        <w:t>Berdasarkan landasan teori dan perumusan hipotesis di atas, hubungan struktural antarvariabel disajikan pada Gambar 2.1:</w:t>
+        <w:t>Hubungan struktural antarvariabel disajikan pada Gambar 2.1:</w:t>
       </w:r>
     </w:p>
     <w:p>
@@ -22063,7 +22063,7 @@
         </w:rPr>
         <w:lastRenderedPageBreak/>
         <w:drawing>
-          <wp:inline distT="0" distB="0" distL="0" distR="0" wp14:anchorId="570F22DD" wp14:editId="7AB95066">
+          <wp:inline distT="0" distB="0" distL="0" distR="0" wp14:anchorId="32BC26E3" wp14:editId="772C8EB4">
             <wp:extent cx="5040000" cy="2753704"/>
             <wp:effectExtent l="0" t="0" r="0" b="0"/>
             <wp:docPr id="5" name="Picture 5"/>
@@ -22138,7 +22138,7 @@
         <w:pStyle w:val="Heading1"/>
         <w:outlineLvl w:val="0"/>
       </w:pPr>
-      <w:bookmarkStart w:id="42" w:name="_Toc240613709"/>
+      <w:bookmarkStart w:id="42" w:name="_Toc240641362"/>
       <w:r>
         <w:rPr>
           <w:rFonts w:ascii="Times New Roman" w:hAnsi="Times New Roman"/>
@@ -22156,7 +22156,7 @@
         <w:pStyle w:val="Heading2"/>
         <w:outlineLvl w:val="1"/>
       </w:pPr>
-      <w:bookmarkStart w:id="43" w:name="_Toc240613710"/>
+      <w:bookmarkStart w:id="43" w:name="_Toc240641363"/>
       <w:r>
         <w:rPr>
           <w:rFonts w:ascii="Times New Roman" w:hAnsi="Times New Roman"/>
@@ -22178,7 +22178,7 @@
         <w:rPr>
           <w:rFonts w:cs="Times New Roman"/>
         </w:rPr>
-        <w:t xml:space="preserve">Penelitian ini menggunakan pendekatan kuantitatif asosiatif dengan desain survei </w:t>
+        <w:t xml:space="preserve">Penelitian ini menguji hipotesis empiris H1–H6 mengenai hubungan struktural antarvariabel dengan pendekatan kuantitatif asosiatif dan desain survei </w:t>
       </w:r>
       <w:r>
         <w:rPr>
@@ -22191,20 +22191,7 @@
         <w:rPr>
           <w:rFonts w:cs="Times New Roman"/>
         </w:rPr>
-        <w:t xml:space="preserve">. Pendekatan kuantitatif dipilih karena penelitian ini menguji hipotesis empiris mengenai hubungan struktural antarvariabel yang telah dirumuskan berdasarkan kajian teoritis. Desain survei </w:t>
-      </w:r>
-      <w:r>
-        <w:rPr>
-          <w:rFonts w:cs="Times New Roman"/>
-          <w:i/>
-        </w:rPr>
-        <w:t>cross-sectional</w:t>
-      </w:r>
-      <w:r>
-        <w:rPr>
-          <w:rFonts w:cs="Times New Roman"/>
-        </w:rPr>
-        <w:t xml:space="preserve"> digunakan karena pengumpulan data primer dilakukan pada satu titik periode waktu tertentu secara serentak kepada sampel responden untuk menggambarkan fenomena yang diteliti </w:t>
+        <w:t xml:space="preserve">. Pendekatan ini dipilih karena kerangka teoritis telah merumuskan hubungan tersebut secara eksplisit. Pengumpulan data primer dilakukan satu kali pada satu titik waktu kepada sampel responden untuk memotret fenomena yang diteliti </w:t>
       </w:r>
       <w:hyperlink w:anchor="Ref_sekaran2016research" w:history="1">
         <w:r>
@@ -22228,7 +22215,7 @@
         <w:rPr>
           <w:rFonts w:cs="Times New Roman"/>
         </w:rPr>
-        <w:t>Data primer diperoleh langsung dari responden melalui penyebaran instrumen kuesioner daring (</w:t>
+        <w:t>Penulis mengumpulkan data primer langsung dari responden dengan menyebarkan kuesioner daring (</w:t>
       </w:r>
       <w:r>
         <w:rPr>
@@ -22241,7 +22228,7 @@
         <w:rPr>
           <w:rFonts w:cs="Times New Roman"/>
         </w:rPr>
-        <w:t xml:space="preserve">) berbasis Google Forms. Kuesioner dirancang menggunakan pertanyaan tertutup berskala Likert 5 poin </w:t>
+        <w:t xml:space="preserve">) melalui Google Forms. Kuesioner tersebut memakai pertanyaan tertutup berskala Likert 5 poin </w:t>
       </w:r>
       <w:hyperlink w:anchor="Ref_sugiyono2019metode" w:history="1">
         <w:r>
@@ -22776,7 +22763,7 @@
         <w:rPr>
           <w:rFonts w:cs="Times New Roman"/>
         </w:rPr>
-        <w:t>Data sekunder diperoleh melalui studi kepustakaan yang mencakup laporan resmi The Pokémon Company, data agregasi industri hiburan global, buku teks metodologi dan keuangan perilaku, serta artikel jurnal ilmiah nasional dan internasional bereputasi yang terindeks SINTA dan Scopus.</w:t>
+        <w:t>Data sekunder berasal dari studi kepustakaan. Sumbernya meliputi laporan resmi The Pokémon Company dan data agregasi industri hiburan global, dilengkapi buku teks metodologi dan keuangan perilaku serta artikel jurnal nasional dan internasional bereputasi terindeks SINTA dan Scopus.</w:t>
       </w:r>
     </w:p>
     <w:p>
@@ -22784,7 +22771,7 @@
         <w:pStyle w:val="Heading3"/>
         <w:outlineLvl w:val="2"/>
       </w:pPr>
-      <w:bookmarkStart w:id="45" w:name="_Toc240613711"/>
+      <w:bookmarkStart w:id="45" w:name="_Toc240641364"/>
       <w:r>
         <w:rPr>
           <w:rFonts w:ascii="Times New Roman" w:hAnsi="Times New Roman"/>
@@ -22806,7 +22793,7 @@
         <w:rPr>
           <w:rFonts w:cs="Times New Roman"/>
         </w:rPr>
-        <w:t>Guna memastikan kejelasan ruang lingkup serta arah analisis yang terfokus, penelitian ini menetapkan batasan operasional sebagai berikut:</w:t>
+        <w:t>Penelitian ini menetapkan batasan operasional sebagai berikut:</w:t>
       </w:r>
     </w:p>
     <w:p>
@@ -22820,47 +22807,53 @@
           <w:rFonts w:cs="Times New Roman"/>
           <w:b/>
         </w:rPr>
+        <w:t xml:space="preserve">•  </w:t>
+      </w:r>
+      <w:r>
+        <w:rPr>
+          <w:rFonts w:cs="Times New Roman"/>
+          <w:b/>
+        </w:rPr>
+        <w:t>Batasan Komoditas Objek:</w:t>
+      </w:r>
+      <w:r>
+        <w:rPr>
+          <w:rFonts w:cs="Times New Roman"/>
+        </w:rPr>
+        <w:t xml:space="preserve"> Penelitian ini secara ketat dibatasi pada pembelian produk kemasan acak tertutup (</w:t>
+      </w:r>
+      <w:r>
+        <w:rPr>
+          <w:rFonts w:cs="Times New Roman"/>
+          <w:i/>
+        </w:rPr>
+        <w:t>booster pack</w:t>
+      </w:r>
+      <w:r>
+        <w:rPr>
+          <w:rFonts w:cs="Times New Roman"/>
+        </w:rPr>
+        <w:t xml:space="preserve">) fisik resmi </w:t>
+      </w:r>
+      <w:r>
+        <w:rPr>
+          <w:rFonts w:cs="Times New Roman"/>
+          <w:i/>
+        </w:rPr>
+        <w:t>Pokémon Trading Card Game</w:t>
+      </w:r>
+      <w:r>
+        <w:rPr>
+          <w:rFonts w:cs="Times New Roman"/>
+        </w:rPr>
+        <w:t xml:space="preserve"> (Pokémon TCG) berbahasa Indonesia yang </w:t>
+      </w:r>
+      <w:r>
+        <w:rPr>
+          <w:rFonts w:cs="Times New Roman"/>
+        </w:rPr>
         <w:lastRenderedPageBreak/>
-        <w:t xml:space="preserve">•  </w:t>
-      </w:r>
-      <w:r>
-        <w:rPr>
-          <w:rFonts w:cs="Times New Roman"/>
-          <w:b/>
-        </w:rPr>
-        <w:t>Batasan Komoditas Objek:</w:t>
-      </w:r>
-      <w:r>
-        <w:rPr>
-          <w:rFonts w:cs="Times New Roman"/>
-        </w:rPr>
-        <w:t xml:space="preserve"> Penelitian ini secara ketat dibatasi pada pembelian produk kemasan acak tertutup (</w:t>
-      </w:r>
-      <w:r>
-        <w:rPr>
-          <w:rFonts w:cs="Times New Roman"/>
-          <w:i/>
-        </w:rPr>
-        <w:t>booster pack</w:t>
-      </w:r>
-      <w:r>
-        <w:rPr>
-          <w:rFonts w:cs="Times New Roman"/>
-        </w:rPr>
-        <w:t xml:space="preserve">) fisik resmi </w:t>
-      </w:r>
-      <w:r>
-        <w:rPr>
-          <w:rFonts w:cs="Times New Roman"/>
-          <w:i/>
-        </w:rPr>
-        <w:t>Pokémon Trading Card Game</w:t>
-      </w:r>
-      <w:r>
-        <w:rPr>
-          <w:rFonts w:cs="Times New Roman"/>
-        </w:rPr>
-        <w:t xml:space="preserve"> (Pokémon TCG) berbahasa Indonesia yang dirilis oleh The Pokémon Company / AKG Games. Penelitian ini tidak meneliti kartu permainan digital (seperti </w:t>
+        <w:t xml:space="preserve">dirilis oleh The Pokémon Company / AKG Games. Penelitian ini tidak meneliti kartu permainan digital (seperti </w:t>
       </w:r>
       <w:r>
         <w:rPr>
@@ -23078,7 +23071,7 @@
         <w:pStyle w:val="Heading2"/>
         <w:outlineLvl w:val="1"/>
       </w:pPr>
-      <w:bookmarkStart w:id="46" w:name="_Toc240613712"/>
+      <w:bookmarkStart w:id="46" w:name="_Toc240641365"/>
       <w:r>
         <w:rPr>
           <w:rFonts w:ascii="Times New Roman" w:hAnsi="Times New Roman"/>
@@ -23095,7 +23088,7 @@
         <w:pStyle w:val="Heading3"/>
         <w:outlineLvl w:val="2"/>
       </w:pPr>
-      <w:bookmarkStart w:id="47" w:name="_Toc240613713"/>
+      <w:bookmarkStart w:id="47" w:name="_Toc240641366"/>
       <w:r>
         <w:rPr>
           <w:rFonts w:ascii="Times New Roman" w:hAnsi="Times New Roman"/>
@@ -23117,7 +23110,7 @@
         <w:rPr>
           <w:rFonts w:cs="Times New Roman"/>
         </w:rPr>
-        <w:t xml:space="preserve">Populasi dalam penelitian ini didefinisikan sebagai seluruh konsumen atau kolektor kartu fisik Pokémon </w:t>
+        <w:t xml:space="preserve">Populasi penelitian ini adalah seluruh konsumen atau kolektor kartu fisik Pokémon </w:t>
       </w:r>
       <w:r>
         <w:rPr>
@@ -23130,7 +23123,7 @@
         <w:rPr>
           <w:rFonts w:cs="Times New Roman"/>
         </w:rPr>
-        <w:t xml:space="preserve"> resmi berbahasa Indonesia di wilayah Republik Indonesia. Populasi ini diklasifikasikan sebagai populasi tidak terbatas (</w:t>
+        <w:t xml:space="preserve"> resmi berbahasa Indonesia di wilayah Republik Indonesia. Populasi ini tergolong tidak terbatas (</w:t>
       </w:r>
       <w:r>
         <w:rPr>
@@ -23143,7 +23136,7 @@
         <w:rPr>
           <w:rFonts w:cs="Times New Roman"/>
         </w:rPr>
-        <w:t>) karena jumlah pasti seluruh pembeli kartu di Indonesia tidak dapat diketahui secara pasti mengingat luasnya jaringan distribusi ritel modern di seluruh Indonesia.</w:t>
+        <w:t>) karena jumlah seluruh pembeli kartu tidak dapat diketahui secara pasti mengingat luasnya jaringan distribusi ritel modern di Indonesia.</w:t>
       </w:r>
     </w:p>
     <w:p>
@@ -23198,14 +23191,7 @@
         <w:rPr>
           <w:rFonts w:cs="Times New Roman"/>
         </w:rPr>
-        <w:t xml:space="preserve"> Jaringan komunitas pemain dan kolektor terdaftar yang aktif berkegiatan di toko </w:t>
-      </w:r>
-      <w:r>
-        <w:rPr>
-          <w:rFonts w:cs="Times New Roman"/>
-        </w:rPr>
-        <w:lastRenderedPageBreak/>
-        <w:t>hobi resmi mitra AKG Games di wilayah Jabodetabek, Bandung, Surabaya, Yogyakarta, Medan, dan kota-kota besar lainnya.</w:t>
+        <w:t xml:space="preserve"> Jaringan komunitas pemain dan kolektor terdaftar yang aktif berkegiatan di toko hobi resmi mitra AKG Games di wilayah Jabodetabek, Bandung, Surabaya, Yogyakarta, Medan, dan kota-kota besar lainnya.</w:t>
       </w:r>
     </w:p>
     <w:p>
@@ -23245,7 +23231,14 @@
         <w:rPr>
           <w:rFonts w:cs="Times New Roman"/>
         </w:rPr>
-        <w:t xml:space="preserve"> (dengan puluhan ribu anggota aktif), </w:t>
+        <w:t xml:space="preserve"> (dengan puluhan ribu </w:t>
+      </w:r>
+      <w:r>
+        <w:rPr>
+          <w:rFonts w:cs="Times New Roman"/>
+        </w:rPr>
+        <w:lastRenderedPageBreak/>
+        <w:t xml:space="preserve">anggota aktif), </w:t>
       </w:r>
       <w:r>
         <w:rPr>
@@ -23319,7 +23312,7 @@
         <w:pStyle w:val="Heading3"/>
         <w:outlineLvl w:val="2"/>
       </w:pPr>
-      <w:bookmarkStart w:id="48" w:name="_Toc240613714"/>
+      <w:bookmarkStart w:id="48" w:name="_Toc240641367"/>
       <w:r>
         <w:rPr>
           <w:rFonts w:ascii="Times New Roman" w:hAnsi="Times New Roman"/>
@@ -23341,7 +23334,7 @@
         <w:rPr>
           <w:rFonts w:cs="Times New Roman"/>
         </w:rPr>
-        <w:t>Penarikan sampel dilakukan dengan teknik sampel bertujuan (</w:t>
+        <w:t>Penarikan sampel memakai teknik sampel bertujuan (</w:t>
       </w:r>
       <w:r>
         <w:rPr>
@@ -23354,7 +23347,7 @@
         <w:rPr>
           <w:rFonts w:cs="Times New Roman"/>
         </w:rPr>
-        <w:t>). Responden yang dipilih wajib memenuhi kriteria inklusi dengan justifikasi ilmiah sebagai berikut:</w:t>
+        <w:t>). Responden wajib memenuhi kriteria inklusi beserta justifikasi ilmiah berikut:</w:t>
       </w:r>
     </w:p>
     <w:p>
@@ -23381,7 +23374,7 @@
         <w:rPr>
           <w:rFonts w:cs="Times New Roman"/>
         </w:rPr>
-        <w:t xml:space="preserve"> Menjamin bahwa responden mengalami langsung dinamika ketersediaan produk kartu resmi berbahasa Indonesia serta struktur harga ritel dan pasar sekunder domestik.</w:t>
+        <w:t xml:space="preserve"> Kriteria ini memastikan responden mengalami langsung dinamika ketersediaan produk kartu resmi berbahasa Indonesia serta struktur harga ritel dan pasar sekunder domestik.</w:t>
       </w:r>
     </w:p>
     <w:p>
@@ -23469,14 +23462,7 @@
         <w:rPr>
           <w:rFonts w:cs="Times New Roman"/>
         </w:rPr>
-        <w:t xml:space="preserve"> Pada usia 17 tahun ke atas (umumnya berada pada jenjang pendidikan akhir SMA atau mahasiswa perguruan tinggi), </w:t>
-      </w:r>
-      <w:r>
-        <w:rPr>
-          <w:rFonts w:cs="Times New Roman"/>
-        </w:rPr>
-        <w:lastRenderedPageBreak/>
-        <w:t>individu telah memiliki alokasi diskresi keuangan pribadi (uang saku mandiri atau penghasilan kerja paruh waktu) yang dapat dibelanjakan secara independen di gerai kasir minimarket.</w:t>
+        <w:t xml:space="preserve"> Pada usia 17 tahun ke atas (umumnya berada pada jenjang pendidikan akhir SMA atau mahasiswa perguruan tinggi), individu telah memiliki alokasi diskresi keuangan pribadi (uang saku mandiri atau penghasilan kerja paruh waktu) yang dapat dibelanjakan secara independen di gerai kasir minimarket.</w:t>
       </w:r>
     </w:p>
     <w:p>
@@ -23490,6 +23476,7 @@
           <w:rFonts w:cs="Times New Roman"/>
           <w:b/>
         </w:rPr>
+        <w:lastRenderedPageBreak/>
         <w:t xml:space="preserve">•  </w:t>
       </w:r>
       <w:r>
@@ -23560,13 +23547,13 @@
           <w:rFonts w:cs="Times New Roman"/>
           <w:i/>
         </w:rPr>
-        <w:t>Menjamin Pengalaman Riil Konsumsi:</w:t>
-      </w:r>
-      <w:r>
-        <w:rPr>
-          <w:rFonts w:cs="Times New Roman"/>
-        </w:rPr>
-        <w:t xml:space="preserve"> Memastikan responden benar-benar pernah mengalami proses pengambilan keputusan belanja di etalase toko dan merasakan sensasi membuka bungkus kartu (</w:t>
+        <w:t>Pengalaman Riil Konsumsi:</w:t>
+      </w:r>
+      <w:r>
+        <w:rPr>
+          <w:rFonts w:cs="Times New Roman"/>
+        </w:rPr>
+        <w:t xml:space="preserve"> Kriteria ini memastikan responden benar-benar pernah mengalami proses pengambilan keputusan belanja di etalase toko dan merasakan sensasi membuka bungkus kartu (</w:t>
       </w:r>
       <w:r>
         <w:rPr>
@@ -23600,7 +23587,7 @@
           <w:rFonts w:cs="Times New Roman"/>
           <w:i/>
         </w:rPr>
-        <w:t>Meminimalkan Bias Ingatan Retrospektif (</w:t>
+        <w:t>Bias Ingatan Retrospektif (</w:t>
       </w:r>
       <w:r>
         <w:rPr>
@@ -23627,7 +23614,7 @@
         <w:pStyle w:val="Heading3"/>
         <w:outlineLvl w:val="2"/>
       </w:pPr>
-      <w:bookmarkStart w:id="49" w:name="_Toc240613715"/>
+      <w:bookmarkStart w:id="49" w:name="_Toc240641368"/>
       <w:r>
         <w:rPr>
           <w:rFonts w:ascii="Times New Roman" w:hAnsi="Times New Roman"/>
@@ -23649,7 +23636,7 @@
         <w:rPr>
           <w:rFonts w:cs="Times New Roman"/>
         </w:rPr>
-        <w:t xml:space="preserve">Penentuan ukuran sampel minimum dalam penelitian ini mengacu pada formula </w:t>
+        <w:t xml:space="preserve">Ukuran sampel minimum yang dipersyaratkan adalah 111 responden, dihitung dengan formula </w:t>
       </w:r>
       <w:hyperlink w:anchor="Ref_green1991subjects" w:history="1">
         <w:r>
@@ -23660,7 +23647,7 @@
         <w:rPr>
           <w:rFonts w:cs="Times New Roman"/>
         </w:rPr>
-        <w:t xml:space="preserve"> untuk menentukan ukuran sampel minimum pada analisis regresi linear berganda:</w:t>
+        <w:t xml:space="preserve"> untuk analisis regresi linear berganda:</w:t>
       </w:r>
     </w:p>
     <w:p>
@@ -24184,69 +24171,75 @@
         <w:rPr>
           <w:rFonts w:cs="Times New Roman"/>
         </w:rPr>
+        <w:t xml:space="preserve">Hasil perhitungan </w:t>
+      </w:r>
+      <w:hyperlink w:anchor="Ref_green1991subjects" w:history="1">
+        <w:r>
+          <w:t>Green (1991)</w:t>
+        </w:r>
+      </w:hyperlink>
+      <w:r>
+        <w:rPr>
+          <w:rFonts w:cs="Times New Roman"/>
+        </w:rPr>
+        <w:t xml:space="preserve"> di atas menetapkan syarat minimum absolut 111 responden. Penelitian ini menargetkan </w:t>
+      </w:r>
+      <w:r>
+        <w:rPr>
+          <w:rFonts w:cs="Times New Roman"/>
+          <w:b/>
+        </w:rPr>
+        <w:t>120 hingga 150 responden</w:t>
+      </w:r>
+      <w:r>
+        <w:rPr>
+          <w:rFonts w:cs="Times New Roman"/>
+        </w:rPr>
+        <w:t xml:space="preserve"> sebagai sampel bersih yang dapat dianalisis (</w:t>
+      </w:r>
+      <w:r>
+        <w:rPr>
+          <w:rFonts w:cs="Times New Roman"/>
+          <w:i/>
+        </w:rPr>
+        <w:t>usable and analyzable sample</w:t>
+      </w:r>
+      <w:r>
+        <w:rPr>
+          <w:rFonts w:cs="Times New Roman"/>
+        </w:rPr>
+        <w:t>), di luar 30 responden untuk uji coba instrumen (</w:t>
+      </w:r>
+      <w:r>
+        <w:rPr>
+          <w:rFonts w:cs="Times New Roman"/>
+          <w:i/>
+        </w:rPr>
+        <w:t>pilot testing</w:t>
+      </w:r>
+      <w:r>
+        <w:rPr>
+          <w:rFonts w:cs="Times New Roman"/>
+        </w:rPr>
+        <w:t xml:space="preserve">). Rentang 120–150 </w:t>
+      </w:r>
+      <w:r>
+        <w:rPr>
+          <w:rFonts w:cs="Times New Roman"/>
+        </w:rPr>
         <w:lastRenderedPageBreak/>
-        <w:t xml:space="preserve">Mengacu pada perhitungan formula </w:t>
-      </w:r>
-      <w:hyperlink w:anchor="Ref_green1991subjects" w:history="1">
-        <w:r>
-          <w:t>Green (1991)</w:t>
+        <w:t xml:space="preserve">tersebut memenuhi kriteria </w:t>
+      </w:r>
+      <w:hyperlink w:anchor="Ref_cohen1988statistical" w:history="1">
+        <w:r>
+          <w:t>Cohen (1988)</w:t>
         </w:r>
       </w:hyperlink>
       <w:r>
         <w:rPr>
           <w:rFonts w:cs="Times New Roman"/>
         </w:rPr>
-        <w:t xml:space="preserve"> di atas, ukuran sampel minimum absolut yang dipersyaratkan adalah 111 responden. Target sampel data bersih yang dapat dianalisis (</w:t>
-      </w:r>
-      <w:r>
-        <w:rPr>
-          <w:rFonts w:cs="Times New Roman"/>
-          <w:i/>
-        </w:rPr>
-        <w:t>usable and analyzable sample</w:t>
-      </w:r>
-      <w:r>
-        <w:rPr>
-          <w:rFonts w:cs="Times New Roman"/>
-        </w:rPr>
-        <w:t xml:space="preserve">) dalam penelitian ini ditetapkan sebesar </w:t>
-      </w:r>
-      <w:r>
-        <w:rPr>
-          <w:rFonts w:cs="Times New Roman"/>
-          <w:b/>
-        </w:rPr>
-        <w:t>120 hingga 150 responden</w:t>
-      </w:r>
-      <w:r>
-        <w:rPr>
-          <w:rFonts w:cs="Times New Roman"/>
-        </w:rPr>
-        <w:t>, di luar 30 responden yang dialokasikan khusus untuk uji coba instrumen kuesioner (</w:t>
-      </w:r>
-      <w:r>
-        <w:rPr>
-          <w:rFonts w:cs="Times New Roman"/>
-          <w:i/>
-        </w:rPr>
-        <w:t>pilot testing</w:t>
-      </w:r>
-      <w:r>
-        <w:rPr>
-          <w:rFonts w:cs="Times New Roman"/>
-        </w:rPr>
-        <w:t xml:space="preserve">). Jumlah sampel 120–150 ini memenuhi kriteria </w:t>
-      </w:r>
-      <w:hyperlink w:anchor="Ref_cohen1988statistical" w:history="1">
-        <w:r>
-          <w:t>Cohen (1988)</w:t>
-        </w:r>
-      </w:hyperlink>
-      <w:r>
-        <w:rPr>
-          <w:rFonts w:cs="Times New Roman"/>
-        </w:rPr>
-        <w:t xml:space="preserve"> untuk mencapai kekuatan uji statistik (</w:t>
+        <w:t xml:space="preserve"> untuk kekuatan uji (</w:t>
       </w:r>
       <w:r>
         <w:rPr>
@@ -24267,7 +24260,7 @@
         <w:pStyle w:val="Heading3"/>
         <w:outlineLvl w:val="2"/>
       </w:pPr>
-      <w:bookmarkStart w:id="50" w:name="_Toc240613716"/>
+      <w:bookmarkStart w:id="50" w:name="_Toc240641369"/>
       <w:r>
         <w:rPr>
           <w:rFonts w:ascii="Times New Roman" w:hAnsi="Times New Roman"/>
@@ -24289,7 +24282,7 @@
         <w:rPr>
           <w:rFonts w:cs="Times New Roman"/>
         </w:rPr>
-        <w:t>Dalam literatur metodologi penelitian kuantitatif (</w:t>
+        <w:t>Literatur metodologi kuantitatif (</w:t>
       </w:r>
       <w:hyperlink w:anchor="Ref_sekaran2016research" w:history="1">
         <w:r>
@@ -24311,7 +24304,7 @@
         <w:rPr>
           <w:rFonts w:cs="Times New Roman"/>
         </w:rPr>
-        <w:t xml:space="preserve">), metode pengambilan sampel terbagi ke dalam dua rumpun utama: </w:t>
+        <w:t xml:space="preserve">) membagi pengambilan sampel ke dalam dua rumpun utama: </w:t>
       </w:r>
       <w:r>
         <w:rPr>
@@ -24403,7 +24396,7 @@
         <w:rPr>
           <w:rFonts w:cs="Times New Roman"/>
         </w:rPr>
-        <w:t>) yang memuat daftar lengkap seluruh anggota populasi. Pada penelitian ini, kerangka sampling sensus pembeli kartu Pokémon di Indonesia tidak tersedia secara terpusat, sehingga teknik probabilitas murni tidak dapat diterapkan secara sahih.</w:t>
+        <w:t>) yang memuat daftar lengkap seluruh anggota populasi. Kerangka sampling sensus pembeli kartu Pokémon di Indonesia tidak tersedia secara terpusat sehingga teknik probabilitas murni tidak dapat diterapkan secara sahih.</w:t>
       </w:r>
     </w:p>
     <w:p>
@@ -24423,7 +24416,7 @@
         <w:rPr>
           <w:rFonts w:cs="Times New Roman"/>
         </w:rPr>
-        <w:t xml:space="preserve">Oleh karena itu, penelitian ini memilih rumpun </w:t>
+        <w:t xml:space="preserve">Karena itu, penelitian ini memakai rumpun </w:t>
       </w:r>
       <w:r>
         <w:rPr>
@@ -24450,7 +24443,7 @@
         <w:rPr>
           <w:rFonts w:cs="Times New Roman"/>
         </w:rPr>
-        <w:t xml:space="preserve"> (sampel bertujuan). Teknik ini memilih responden berdasarkan pertimbangan dan kriteria inklusi terdefinisi yang ditetapkan peneliti.</w:t>
+        <w:t xml:space="preserve"> (sampel bertujuan) berdasarkan kriteria inklusi yang ditetapkan peneliti.</w:t>
       </w:r>
     </w:p>
     <w:p>
@@ -24521,7 +24514,7 @@
         <w:pStyle w:val="Heading2"/>
         <w:outlineLvl w:val="1"/>
       </w:pPr>
-      <w:bookmarkStart w:id="51" w:name="_Toc240613717"/>
+      <w:bookmarkStart w:id="51" w:name="_Toc240641370"/>
       <w:r>
         <w:rPr>
           <w:rFonts w:ascii="Times New Roman" w:hAnsi="Times New Roman"/>
@@ -24529,7 +24522,6 @@
           <w:color w:val="000000"/>
           <w:sz w:val="24"/>
         </w:rPr>
-        <w:lastRenderedPageBreak/>
         <w:t>3.3 Model Penelitian</w:t>
       </w:r>
       <w:bookmarkEnd w:id="51"/>
@@ -24544,7 +24536,7 @@
         <w:rPr>
           <w:rFonts w:cs="Times New Roman"/>
         </w:rPr>
-        <w:t xml:space="preserve">Guna menguji hipotesis penelitian secara akurat dan mengisolasi efek moderasi murni terpisah dari efek langsung pemoderasi, penelitian ini mengadopsi prosedur regresi hirarkis </w:t>
+        <w:t xml:space="preserve">Penelitian ini menguji hipotesis dengan prosedur regresi hirarkis </w:t>
       </w:r>
       <w:r>
         <w:rPr>
@@ -24557,7 +24549,7 @@
         <w:rPr>
           <w:rFonts w:cs="Times New Roman"/>
         </w:rPr>
-        <w:t xml:space="preserve"> (MRA) berbasis OLS yang diestimasi dalam dua model bertahap (</w:t>
+        <w:t xml:space="preserve"> (MRA) berbasis OLS dalam dua model bertahap (</w:t>
       </w:r>
       <w:hyperlink w:anchor="Ref_aiken1991multiple" w:history="1">
         <w:r>
@@ -24590,7 +24582,7 @@
         <w:rPr>
           <w:rFonts w:cs="Times New Roman"/>
         </w:rPr>
-        <w:t>):</w:t>
+        <w:t>). Prosedur ini memisahkan efek moderasi murni dari efek langsung pemoderasi:</w:t>
       </w:r>
     </w:p>
     <w:p>
@@ -24621,6 +24613,7 @@
             <w:rPr>
               <w:rFonts w:ascii="Cambria Math" w:hAnsi="Cambria Math"/>
             </w:rPr>
+            <w:lastRenderedPageBreak/>
             <m:t>Y</m:t>
           </m:r>
           <m:r>
@@ -26196,73 +26189,79 @@
         <w:rPr>
           <w:rFonts w:cs="Times New Roman"/>
         </w:rPr>
+        <w:t xml:space="preserve">Penyertaan </w:t>
+      </w:r>
+      <w:r>
+        <w:rPr>
+          <w:rFonts w:cs="Times New Roman"/>
+          <w:i/>
+        </w:rPr>
+        <w:t>M</w:t>
+      </w:r>
+      <w:r>
+        <w:rPr>
+          <w:rFonts w:cs="Times New Roman"/>
+        </w:rPr>
+        <w:t>\</w:t>
+      </w:r>
+      <w:r>
+        <w:rPr>
+          <w:rFonts w:cs="Times New Roman"/>
+          <w:i/>
+        </w:rPr>
+        <w:t xml:space="preserve"> pada Model 1 sebagai garis dasar aditif (</w:t>
+      </w:r>
+      <w:r>
+        <w:rPr>
+          <w:rFonts w:cs="Times New Roman"/>
+        </w:rPr>
+        <w:t>additive baseline</w:t>
+      </w:r>
+      <w:r>
+        <w:rPr>
+          <w:rFonts w:cs="Times New Roman"/>
+          <w:i/>
+        </w:rPr>
+        <w:t xml:space="preserve">) menjamin bahwa peningkatan koefisien determinasi (Δ R² = R²_Model 2 - R²_Model 1) murni mengisolasi kontribusi penjelas tambahan dari ketiga variabel interaksi moderasi, yang diuji secara simultan melalui statistik </w:t>
+      </w:r>
+      <w:r>
+        <w:rPr>
+          <w:rFonts w:cs="Times New Roman"/>
+        </w:rPr>
+        <w:t>F</w:t>
+      </w:r>
+      <w:r>
+        <w:rPr>
+          <w:rFonts w:cs="Times New Roman"/>
+          <w:i/>
+        </w:rPr>
+        <w:t>_{change}: Koefisien β₄ (M^</w:t>
+      </w:r>
+      <w:r>
+        <w:rPr>
+          <w:rFonts w:cs="Times New Roman"/>
+        </w:rPr>
+        <w:t xml:space="preserve"> \rightarrow Y) pada Model 1 semata-mata merupakan kontrol baseline aditif agar Δ</w:t>
+      </w:r>
+      <w:r>
+        <w:rPr>
+          <w:rFonts w:cs="Times New Roman"/>
+          <w:i/>
+        </w:rPr>
+        <w:t>R</w:t>
+      </w:r>
+      <w:r>
+        <w:rPr>
+          <w:rFonts w:cs="Times New Roman"/>
+        </w:rPr>
+        <w:t xml:space="preserve">² tidak tercampur efek langsung pemoderasi; β₄ tidak diuji sebagai hipotesis tersendiri dan tidak memiliki pasangan RM/Tujuan/H (hipotesis penelitian tetap 6: H1–H3 langsung, H4–H6 moderasi memperlemah). Baris 4 pada matriks kesenjangan (Subjek M \rightarrow Y) berfungsi sebagai justifikasi </w:t>
+      </w:r>
+      <w:r>
+        <w:rPr>
+          <w:rFonts w:cs="Times New Roman"/>
+        </w:rPr>
         <w:lastRenderedPageBreak/>
-        <w:t xml:space="preserve">Penyertaan </w:t>
-      </w:r>
-      <w:r>
-        <w:rPr>
-          <w:rFonts w:cs="Times New Roman"/>
-          <w:i/>
-        </w:rPr>
-        <w:t>M</w:t>
-      </w:r>
-      <w:r>
-        <w:rPr>
-          <w:rFonts w:cs="Times New Roman"/>
-        </w:rPr>
-        <w:t>\</w:t>
-      </w:r>
-      <w:r>
-        <w:rPr>
-          <w:rFonts w:cs="Times New Roman"/>
-          <w:i/>
-        </w:rPr>
-        <w:t xml:space="preserve"> pada Model 1 sebagai garis dasar aditif (</w:t>
-      </w:r>
-      <w:r>
-        <w:rPr>
-          <w:rFonts w:cs="Times New Roman"/>
-        </w:rPr>
-        <w:t>additive baseline</w:t>
-      </w:r>
-      <w:r>
-        <w:rPr>
-          <w:rFonts w:cs="Times New Roman"/>
-          <w:i/>
-        </w:rPr>
-        <w:t xml:space="preserve">) menjamin bahwa peningkatan koefisien determinasi (Δ R² = R²_Model 2 - R²_Model 1) murni mengisolasi kontribusi penjelas tambahan dari ketiga variabel interaksi moderasi, yang diuji secara simultan melalui statistik </w:t>
-      </w:r>
-      <w:r>
-        <w:rPr>
-          <w:rFonts w:cs="Times New Roman"/>
-        </w:rPr>
-        <w:t>F</w:t>
-      </w:r>
-      <w:r>
-        <w:rPr>
-          <w:rFonts w:cs="Times New Roman"/>
-          <w:i/>
-        </w:rPr>
-        <w:t>_{change}: Koefisien β₄ (M^</w:t>
-      </w:r>
-      <w:r>
-        <w:rPr>
-          <w:rFonts w:cs="Times New Roman"/>
-        </w:rPr>
-        <w:t xml:space="preserve"> \rightarrow Y) pada Model 1 semata-mata merupakan kontrol baseline aditif agar Δ</w:t>
-      </w:r>
-      <w:r>
-        <w:rPr>
-          <w:rFonts w:cs="Times New Roman"/>
-          <w:i/>
-        </w:rPr>
-        <w:t>R</w:t>
-      </w:r>
-      <w:r>
-        <w:rPr>
-          <w:rFonts w:cs="Times New Roman"/>
-        </w:rPr>
-        <w:t xml:space="preserve">² tidak tercampur efek langsung pemoderasi; β₄ tidak diuji sebagai hipotesis tersendiri dan tidak memiliki pasangan RM/Tujuan/H (hipotesis penelitian tetap 6: H1–H3 langsung, H4–H6 moderasi memperlemah). Baris 4 pada matriks kesenjangan (Subjek M \rightarrow Y) berfungsi sebagai justifikasi teoretis perlunya memasukkan </w:t>
+        <w:t xml:space="preserve">teoretis perlunya memasukkan </w:t>
       </w:r>
       <w:r>
         <w:rPr>
@@ -26551,7 +26550,7 @@
         <w:pStyle w:val="Heading2"/>
         <w:outlineLvl w:val="1"/>
       </w:pPr>
-      <w:bookmarkStart w:id="52" w:name="_Toc240613718"/>
+      <w:bookmarkStart w:id="52" w:name="_Toc240641371"/>
       <w:r>
         <w:rPr>
           <w:rFonts w:ascii="Times New Roman" w:hAnsi="Times New Roman"/>
@@ -28729,6 +28728,7 @@
                 <w:b/>
                 <w:sz w:val="19"/>
               </w:rPr>
+              <w:lastRenderedPageBreak/>
               <w:t>Speculative Motive (X₃)</w:t>
             </w:r>
           </w:p>
@@ -29342,6 +29342,7 @@
                 <w:b/>
                 <w:sz w:val="19"/>
               </w:rPr>
+              <w:lastRenderedPageBreak/>
               <w:t>Self-Control (M)</w:t>
             </w:r>
           </w:p>
@@ -30033,6 +30034,7 @@
           <w:rFonts w:cs="Times New Roman"/>
           <w:i/>
         </w:rPr>
+        <w:lastRenderedPageBreak/>
         <w:t>Sumber: Diadaptasi dari instrumen penelitian terdahulu yang tervalidasi (2026).</w:t>
       </w:r>
     </w:p>
@@ -30041,7 +30043,7 @@
         <w:pStyle w:val="Heading2"/>
         <w:outlineLvl w:val="1"/>
       </w:pPr>
-      <w:bookmarkStart w:id="54" w:name="_Toc240613719"/>
+      <w:bookmarkStart w:id="54" w:name="_Toc240641372"/>
       <w:r>
         <w:rPr>
           <w:rFonts w:ascii="Times New Roman" w:hAnsi="Times New Roman"/>
@@ -30058,7 +30060,7 @@
         <w:pStyle w:val="Heading3"/>
         <w:outlineLvl w:val="2"/>
       </w:pPr>
-      <w:bookmarkStart w:id="55" w:name="_Toc240613720"/>
+      <w:bookmarkStart w:id="55" w:name="_Toc240641373"/>
       <w:r>
         <w:rPr>
           <w:rFonts w:ascii="Times New Roman" w:hAnsi="Times New Roman"/>
@@ -30248,7 +30250,7 @@
         <w:rPr>
           <w:rFonts w:cs="Times New Roman"/>
         </w:rPr>
-        <w:t xml:space="preserve">Penelitian ini menetapkan bahwa </w:t>
+        <w:t xml:space="preserve">Penelitian ini menetapkan </w:t>
       </w:r>
       <w:r>
         <w:rPr>
@@ -30261,35 +30263,7 @@
         <w:rPr>
           <w:rFonts w:cs="Times New Roman"/>
         </w:rPr>
-        <w:t xml:space="preserve"> adalah metode yang </w:t>
-      </w:r>
-      <w:r>
-        <w:rPr>
-          <w:rFonts w:cs="Times New Roman"/>
-          <w:b/>
-        </w:rPr>
-        <w:t>paling cocok (</w:t>
-      </w:r>
-      <w:r>
-        <w:rPr>
-          <w:rFonts w:cs="Times New Roman"/>
-          <w:b/>
-          <w:i/>
-        </w:rPr>
-        <w:t>the most suitable</w:t>
-      </w:r>
-      <w:r>
-        <w:rPr>
-          <w:rFonts w:cs="Times New Roman"/>
-          <w:b/>
-        </w:rPr>
-        <w:t>)</w:t>
-      </w:r>
-      <w:r>
-        <w:rPr>
-          <w:rFonts w:cs="Times New Roman"/>
-        </w:rPr>
-        <w:t>, dengan pertimbangan metodologis sebagai berikut:</w:t>
+        <w:t xml:space="preserve"> sebagai metode yang dipilih, dengan pertimbangan metodologis sebagai berikut:</w:t>
       </w:r>
     </w:p>
     <w:p>
@@ -30323,7 +30297,6 @@
           <w:rFonts w:cs="Times New Roman"/>
           <w:b/>
         </w:rPr>
-        <w:lastRenderedPageBreak/>
         <w:t xml:space="preserve">•  </w:t>
       </w:r>
       <w:r>
@@ -30518,7 +30491,14 @@
         <w:rPr>
           <w:rFonts w:cs="Times New Roman"/>
         </w:rPr>
-        <w:t>²) maupun koefisien interaksi, serta memfasilitasi interpretasi koefisien efek utama β₁, β₂, β₃ pada nilai rata-rata pemoderasi (</w:t>
+        <w:t xml:space="preserve">²) maupun koefisien interaksi, serta </w:t>
+      </w:r>
+      <w:r>
+        <w:rPr>
+          <w:rFonts w:cs="Times New Roman"/>
+        </w:rPr>
+        <w:lastRenderedPageBreak/>
+        <w:t>memfasilitasi interpretasi koefisien efek utama β₁, β₂, β₃ pada nilai rata-rata pemoderasi (</w:t>
       </w:r>
       <w:r>
         <w:rPr>
@@ -30640,7 +30620,7 @@
         <w:pStyle w:val="Heading3"/>
         <w:outlineLvl w:val="2"/>
       </w:pPr>
-      <w:bookmarkStart w:id="56" w:name="_Toc240613721"/>
+      <w:bookmarkStart w:id="56" w:name="_Toc240641374"/>
       <w:r>
         <w:rPr>
           <w:rFonts w:ascii="Times New Roman" w:hAnsi="Times New Roman"/>
@@ -30662,7 +30642,7 @@
         <w:rPr>
           <w:rFonts w:cs="Times New Roman"/>
         </w:rPr>
-        <w:t>Skor masing-masing variabel penelitian dibentuk melalui penghitungan nilai rata-rata (</w:t>
+        <w:t>Skor tiap variabel merupakan nilai rata-rata (</w:t>
       </w:r>
       <w:r>
         <w:rPr>
@@ -30675,7 +30655,7 @@
         <w:rPr>
           <w:rFonts w:cs="Times New Roman"/>
         </w:rPr>
-        <w:t>) dari seluruh butir pernyataan indikator yang valid pada variabel bersangkutan. Seluruh butir kuesioner dikodekan secara searah dan positif (skor 5 menunjukkan tingkatan konstruk tertinggi). Sebelum pengujian model regresi, instrumen dievaluasi melalui:</w:t>
+        <w:t>) dari seluruh butir indikator yang valid pada variabel tersebut. Seluruh butir dikodekan searah dan positif (skor 5 menunjukkan tingkatan konstruk tertinggi). Instrumen diuji kualitasnya sebelum estimasi regresi melalui:</w:t>
       </w:r>
     </w:p>
     <w:p>
@@ -30702,7 +30682,7 @@
         <w:rPr>
           <w:rFonts w:cs="Times New Roman"/>
         </w:rPr>
-        <w:t xml:space="preserve"> Menggunakan teknik korelasi butir-total Pearson (</w:t>
+        <w:t xml:space="preserve"> Teknik korelasi butir-total Pearson (</w:t>
       </w:r>
       <w:r>
         <w:rPr>
@@ -30715,7 +30695,7 @@
         <w:rPr>
           <w:rFonts w:cs="Times New Roman"/>
         </w:rPr>
-        <w:t xml:space="preserve">) terhadap skor komposit konstruk yang dituju. Suatu butir dinyatakan valid jika nilai </w:t>
+        <w:t xml:space="preserve">) terhadap skor komposit konstruk tujuan dipakai. Butir dinyatakan valid jika </w:t>
       </w:r>
       <w:r>
         <w:rPr>
@@ -30768,7 +30748,7 @@
         <w:rPr>
           <w:rFonts w:cs="Times New Roman"/>
         </w:rPr>
-        <w:t xml:space="preserve"> Menggunakan koefisien </w:t>
+        <w:t xml:space="preserve"> Koefisien </w:t>
       </w:r>
       <w:r>
         <w:rPr>
@@ -30781,7 +30761,7 @@
         <w:rPr>
           <w:rFonts w:cs="Times New Roman"/>
         </w:rPr>
-        <w:t xml:space="preserve">. Seluruh konstruk penelitian dinyatakan reliabel dan memiliki konsistensi internal memadai jika nilai </w:t>
+        <w:t xml:space="preserve"> dipakai. Konstruk dinyatakan reliabel jika </w:t>
       </w:r>
       <w:r>
         <w:rPr>
@@ -30824,7 +30804,7 @@
         <w:pStyle w:val="Heading3"/>
         <w:outlineLvl w:val="2"/>
       </w:pPr>
-      <w:bookmarkStart w:id="57" w:name="_Toc240613722"/>
+      <w:bookmarkStart w:id="57" w:name="_Toc240641375"/>
       <w:r>
         <w:rPr>
           <w:rFonts w:ascii="Times New Roman" w:hAnsi="Times New Roman"/>
@@ -30860,7 +30840,6 @@
           <w:rFonts w:cs="Times New Roman"/>
           <w:b/>
         </w:rPr>
-        <w:lastRenderedPageBreak/>
         <w:t xml:space="preserve">•  </w:t>
       </w:r>
       <w:r>
@@ -30874,7 +30853,7 @@
         <w:rPr>
           <w:rFonts w:cs="Times New Roman"/>
         </w:rPr>
-        <w:t xml:space="preserve"> Menguji apakah residual model berdistribusi normal menggunakan uji statistik non-parametrik </w:t>
+        <w:t xml:space="preserve"> Uji non-parametrik </w:t>
       </w:r>
       <w:r>
         <w:rPr>
@@ -30887,7 +30866,7 @@
         <w:rPr>
           <w:rFonts w:cs="Times New Roman"/>
         </w:rPr>
-        <w:t xml:space="preserve">, dengan kriteria residual berdistribusi normal jika nilai signifikansi asimtotik </w:t>
+        <w:t xml:space="preserve"> dipakai untuk menilai kenormalan residual; residual dinyatakan normal jika signifikansi asimtotik </w:t>
       </w:r>
       <w:r>
         <w:rPr>
@@ -30927,7 +30906,7 @@
         <w:rPr>
           <w:rFonts w:cs="Times New Roman"/>
         </w:rPr>
-        <w:t xml:space="preserve"> Memastikan ketiadaan hubungan linear sempurna antarvariabel independen dengan memeriksa nilai </w:t>
+        <w:t xml:space="preserve"> Ketiadaan hubungan linear sempurna antarvariabel independen dinilai dari </w:t>
       </w:r>
       <w:r>
         <w:rPr>
@@ -30940,7 +30919,7 @@
         <w:rPr>
           <w:rFonts w:cs="Times New Roman"/>
         </w:rPr>
-        <w:t xml:space="preserve"> (&gt; 0,10) dan nilai </w:t>
+        <w:t xml:space="preserve"> (&gt; 0,10) dan </w:t>
       </w:r>
       <w:r>
         <w:rPr>
@@ -30993,6 +30972,7 @@
           <w:rFonts w:cs="Times New Roman"/>
           <w:b/>
         </w:rPr>
+        <w:lastRenderedPageBreak/>
         <w:t xml:space="preserve">•  </w:t>
       </w:r>
       <w:r>
@@ -31006,7 +30986,7 @@
         <w:rPr>
           <w:rFonts w:cs="Times New Roman"/>
         </w:rPr>
-        <w:t xml:space="preserve"> Menguji kesamaan varians residual melalui uji Glejser, di mana model dinyatakan bebas heteroskedastisitas apabila nilai signifikansi parameter terhadap nilai absolut residual </w:t>
+        <w:t xml:space="preserve"> Uji Glejser dipakai untuk kesamaan varians residual; model bebas heteroskedastisitas apabila signifikansi parameter terhadap nilai absolut residual </w:t>
       </w:r>
       <w:r>
         <w:rPr>
@@ -31084,7 +31064,7 @@
         <w:pStyle w:val="Heading3"/>
         <w:outlineLvl w:val="2"/>
       </w:pPr>
-      <w:bookmarkStart w:id="58" w:name="_Toc240613723"/>
+      <w:bookmarkStart w:id="58" w:name="_Toc240641376"/>
       <w:r>
         <w:rPr>
           <w:rFonts w:ascii="Times New Roman" w:hAnsi="Times New Roman"/>
@@ -31362,7 +31342,7 @@
         <w:pStyle w:val="Heading3"/>
         <w:outlineLvl w:val="2"/>
       </w:pPr>
-      <w:bookmarkStart w:id="59" w:name="_Toc240613724"/>
+      <w:bookmarkStart w:id="59" w:name="_Toc240641377"/>
       <w:r>
         <w:rPr>
           <w:rFonts w:ascii="Times New Roman" w:hAnsi="Times New Roman"/>
@@ -31403,7 +31383,7 @@
         <w:rPr>
           <w:rFonts w:cs="Times New Roman"/>
         </w:rPr>
-        <w:t xml:space="preserve">Evaluasi kecocokan model dilakukan dengan memeriksa nilai </w:t>
+        <w:t xml:space="preserve">Kecocokan model dinilai dari </w:t>
       </w:r>
       <w:r>
         <w:rPr>
@@ -31429,7 +31409,7 @@
         <w:rPr>
           <w:rFonts w:cs="Times New Roman"/>
         </w:rPr>
-        <w:t xml:space="preserve">² pada Model 1 dan Model 2 sebagai deskriptif. Kontribusi penjelas murni dari blok variabel moderasi ditunjukkan melalui peningkatan </w:t>
+        <w:t xml:space="preserve">² pada Model 1 dan Model 2 sebagai deskriptif. Aturan keputusannya: kontribusi murni blok moderasi terlihat pada peningkatan </w:t>
       </w:r>
       <w:r>
         <w:rPr>
@@ -31442,14 +31422,7 @@
         <w:rPr>
           <w:rFonts w:cs="Times New Roman"/>
         </w:rPr>
-        <w:t xml:space="preserve">² biasa (Δ R² = R²_Model 2 - </w:t>
-      </w:r>
-      <w:r>
-        <w:rPr>
-          <w:rFonts w:cs="Times New Roman"/>
-        </w:rPr>
-        <w:lastRenderedPageBreak/>
-        <w:t xml:space="preserve">R²_Model 1, bukan dari </w:t>
+        <w:t xml:space="preserve">² biasa (Δ R² = R²_Model 2 - R²_Model 1, bukan dari </w:t>
       </w:r>
       <w:r>
         <w:rPr>
@@ -31475,7 +31448,7 @@
         <w:rPr>
           <w:rFonts w:cs="Times New Roman"/>
         </w:rPr>
-        <w:t xml:space="preserve">²) yang diuji signifikansinya menggunakan statistik </w:t>
+        <w:t xml:space="preserve">²), yang diuji dengan </w:t>
       </w:r>
       <w:r>
         <w:rPr>
@@ -31496,7 +31469,7 @@
         <w:pStyle w:val="Heading3"/>
         <w:outlineLvl w:val="2"/>
       </w:pPr>
-      <w:bookmarkStart w:id="60" w:name="_Toc240613725"/>
+      <w:bookmarkStart w:id="60" w:name="_Toc240641378"/>
       <w:r>
         <w:rPr>
           <w:rFonts w:ascii="Times New Roman" w:hAnsi="Times New Roman"/>
@@ -31633,7 +31606,7 @@
         <w:rPr>
           <w:rFonts w:cs="Times New Roman"/>
         </w:rPr>
-        <w:t xml:space="preserve"> Untuk hipotesis moderasi (H4, H5, H6), efek peredaman dibuktikan dengan mengevaluasi kemiringan bersyarat per-hipotesis –- H4: \frac{</w:t>
+        <w:t xml:space="preserve"> Hipotesis moderasi (H4, H5, H6) diuji lewat kemiringan bersyarat per-hipotesis –- H4: \frac{</w:t>
       </w:r>
     </w:p>
     <w:p>
@@ -31698,6 +31671,7 @@
         <w:rPr>
           <w:rFonts w:cs="Times New Roman"/>
         </w:rPr>
+        <w:lastRenderedPageBreak/>
         <w:t>tial X_2^</w:t>
       </w:r>
       <w:r>
@@ -31750,7 +31724,7 @@
         <w:rPr>
           <w:rFonts w:cs="Times New Roman"/>
         </w:rPr>
-        <w:t xml:space="preserve"> –- pada tingkat kontrol diri rendah (−1 SD), rata-rata (0 SD), dan tinggi (+1 SD). Efek moderasi yang memperlemah terbukti jika kemiringan pengaruh </w:t>
+        <w:t xml:space="preserve"> –- pada kontrol diri rendah (−1 SD), rata-rata (0 SD), dan tinggi (+1 SD). Efek memperlemah terbukti bila kemiringan </w:t>
       </w:r>
       <w:r>
         <w:rPr>
@@ -31782,7 +31756,7 @@
         <w:rPr>
           <w:rFonts w:cs="Times New Roman"/>
         </w:rPr>
-        <w:t xml:space="preserve"> semakin mendatar pada tingkat kontrol diri tinggi (</w:t>
+        <w:t xml:space="preserve"> mendatar pada kontrol diri tinggi (</w:t>
       </w:r>
       <w:hyperlink w:anchor="Ref_aiken1991multiple" w:history="1">
         <w:r>
@@ -31812,7 +31786,7 @@
         <w:pStyle w:val="Heading2"/>
         <w:outlineLvl w:val="1"/>
       </w:pPr>
-      <w:bookmarkStart w:id="61" w:name="_Toc240613726"/>
+      <w:bookmarkStart w:id="61" w:name="_Toc240641379"/>
       <w:r>
         <w:rPr>
           <w:rFonts w:ascii="Times New Roman" w:hAnsi="Times New Roman"/>
@@ -31846,9 +31820,8 @@
         <w:rPr>
           <w:noProof/>
         </w:rPr>
-        <w:lastRenderedPageBreak/>
         <w:drawing>
-          <wp:inline distT="0" distB="0" distL="0" distR="0" wp14:anchorId="324E4A46" wp14:editId="00842498">
+          <wp:inline distT="0" distB="0" distL="0" distR="0" wp14:anchorId="036B9118" wp14:editId="50AA0961">
             <wp:extent cx="4680000" cy="4706426"/>
             <wp:effectExtent l="0" t="0" r="0" b="0"/>
             <wp:docPr id="6" name="Picture 6"/>
@@ -31918,7 +31891,7 @@
         <w:pStyle w:val="Heading2"/>
         <w:outlineLvl w:val="1"/>
       </w:pPr>
-      <w:bookmarkStart w:id="63" w:name="_Toc240613727"/>
+      <w:bookmarkStart w:id="63" w:name="_Toc240641380"/>
       <w:r>
         <w:rPr>
           <w:rFonts w:ascii="Times New Roman" w:hAnsi="Times New Roman"/>
@@ -31926,6 +31899,7 @@
           <w:color w:val="000000"/>
           <w:sz w:val="24"/>
         </w:rPr>
+        <w:lastRenderedPageBreak/>
         <w:t>3.7 Jadwal Pelaksanaan Penelitian</w:t>
       </w:r>
       <w:bookmarkEnd w:id="63"/>
@@ -33053,7 +33027,6 @@
               <w:rPr>
                 <w:sz w:val="19"/>
               </w:rPr>
-              <w:lastRenderedPageBreak/>
               <w:t>6</w:t>
             </w:r>
           </w:p>
@@ -33868,7 +33841,7 @@
         <w:pStyle w:val="Heading1"/>
         <w:outlineLvl w:val="0"/>
       </w:pPr>
-      <w:bookmarkStart w:id="65" w:name="_Toc240613728"/>
+      <w:bookmarkStart w:id="65" w:name="_Toc240641381"/>
       <w:r>
         <w:rPr>
           <w:rFonts w:ascii="Times New Roman" w:hAnsi="Times New Roman"/>
@@ -35852,31 +35825,31 @@
       </w:rPr>
     </w:lvl>
   </w:abstractNum>
-  <w:num w:numId="1" w16cid:durableId="1515224366">
+  <w:num w:numId="1" w16cid:durableId="851920413">
     <w:abstractNumId w:val="8"/>
   </w:num>
-  <w:num w:numId="2" w16cid:durableId="1237976167">
+  <w:num w:numId="2" w16cid:durableId="1394039023">
     <w:abstractNumId w:val="6"/>
   </w:num>
-  <w:num w:numId="3" w16cid:durableId="111556659">
+  <w:num w:numId="3" w16cid:durableId="967853457">
     <w:abstractNumId w:val="5"/>
   </w:num>
-  <w:num w:numId="4" w16cid:durableId="1237125493">
+  <w:num w:numId="4" w16cid:durableId="1037583470">
     <w:abstractNumId w:val="4"/>
   </w:num>
-  <w:num w:numId="5" w16cid:durableId="1837646204">
+  <w:num w:numId="5" w16cid:durableId="577711285">
     <w:abstractNumId w:val="7"/>
   </w:num>
-  <w:num w:numId="6" w16cid:durableId="377975723">
+  <w:num w:numId="6" w16cid:durableId="684670140">
     <w:abstractNumId w:val="3"/>
   </w:num>
-  <w:num w:numId="7" w16cid:durableId="1638414783">
+  <w:num w:numId="7" w16cid:durableId="1979988377">
     <w:abstractNumId w:val="2"/>
   </w:num>
-  <w:num w:numId="8" w16cid:durableId="1537159061">
+  <w:num w:numId="8" w16cid:durableId="1598562860">
     <w:abstractNumId w:val="1"/>
   </w:num>
-  <w:num w:numId="9" w16cid:durableId="364331353">
+  <w:num w:numId="9" w16cid:durableId="851727018">
     <w:abstractNumId w:val="0"/>
   </w:num>
 </w:numbering>
@@ -47317,7 +47290,7 @@
     <w:autoRedefine/>
     <w:uiPriority w:val="39"/>
     <w:unhideWhenUsed/>
-    <w:rsid w:val="00580BF3"/>
+    <w:rsid w:val="0087414D"/>
     <w:pPr>
       <w:spacing w:after="40" w:line="240" w:lineRule="auto"/>
     </w:pPr>
@@ -47333,7 +47306,7 @@
     <w:autoRedefine/>
     <w:uiPriority w:val="39"/>
     <w:unhideWhenUsed/>
-    <w:rsid w:val="00580BF3"/>
+    <w:rsid w:val="0087414D"/>
     <w:pPr>
       <w:spacing w:after="40" w:line="240" w:lineRule="auto"/>
       <w:ind w:left="360"/>
@@ -47349,7 +47322,7 @@
     <w:autoRedefine/>
     <w:uiPriority w:val="39"/>
     <w:unhideWhenUsed/>
-    <w:rsid w:val="00580BF3"/>
+    <w:rsid w:val="0087414D"/>
     <w:pPr>
       <w:spacing w:after="40" w:line="240" w:lineRule="auto"/>
       <w:ind w:left="720"/>
@@ -47364,7 +47337,7 @@
     <w:basedOn w:val="DefaultParagraphFont"/>
     <w:uiPriority w:val="99"/>
     <w:unhideWhenUsed/>
-    <w:rsid w:val="00580BF3"/>
+    <w:rsid w:val="0087414D"/>
     <w:rPr>
       <w:color w:val="0000FF" w:themeColor="hyperlink"/>
       <w:u w:val="single"/>

</xml_diff>

<commit_message>
fix(sync): jaga perintah par agar rumus partial tidak rusak di DOCX
</commit_message>
<xml_diff>
--- a/01_Naskah_Utama/Proposal_Arthur_PokemonTCG.docx
+++ b/01_Naskah_Utama/Proposal_Arthur_PokemonTCG.docx
@@ -12,7 +12,7 @@
           <w:noProof/>
         </w:rPr>
         <w:drawing>
-          <wp:inline distT="0" distB="0" distL="0" distR="0" wp14:anchorId="423D9D44" wp14:editId="50C70D19">
+          <wp:inline distT="0" distB="0" distL="0" distR="0" wp14:anchorId="00B5052B" wp14:editId="3B93FDE4">
             <wp:extent cx="1152000" cy="1152000"/>
             <wp:effectExtent l="0" t="0" r="0" b="0"/>
             <wp:docPr id="1" name="Picture 1"/>
@@ -274,7 +274,7 @@
         <w:spacing w:after="360"/>
         <w:outlineLvl w:val="0"/>
       </w:pPr>
-      <w:bookmarkStart w:id="0" w:name="_Toc240641326"/>
+      <w:bookmarkStart w:id="0" w:name="_Toc240645775"/>
       <w:r>
         <w:rPr>
           <w:rFonts w:ascii="Times New Roman" w:hAnsi="Times New Roman"/>
@@ -784,7 +784,7 @@
         <w:spacing w:after="360"/>
         <w:outlineLvl w:val="0"/>
       </w:pPr>
-      <w:bookmarkStart w:id="1" w:name="_Toc240641327"/>
+      <w:bookmarkStart w:id="1" w:name="_Toc240645776"/>
       <w:r>
         <w:rPr>
           <w:rFonts w:ascii="Times New Roman" w:hAnsi="Times New Roman"/>
@@ -1225,7 +1225,7 @@
         <w:spacing w:after="360"/>
         <w:outlineLvl w:val="0"/>
       </w:pPr>
-      <w:bookmarkStart w:id="2" w:name="_Toc240641328"/>
+      <w:bookmarkStart w:id="2" w:name="_Toc240645777"/>
       <w:r>
         <w:rPr>
           <w:rFonts w:ascii="Times New Roman" w:hAnsi="Times New Roman"/>
@@ -1488,7 +1488,7 @@
         <w:spacing w:after="360"/>
         <w:outlineLvl w:val="0"/>
       </w:pPr>
-      <w:bookmarkStart w:id="3" w:name="_Toc240641329"/>
+      <w:bookmarkStart w:id="3" w:name="_Toc240645778"/>
       <w:r>
         <w:rPr>
           <w:rFonts w:ascii="Times New Roman" w:hAnsi="Times New Roman"/>
@@ -1781,7 +1781,7 @@
         <w:spacing w:after="360"/>
         <w:outlineLvl w:val="0"/>
       </w:pPr>
-      <w:bookmarkStart w:id="4" w:name="_Toc240641330"/>
+      <w:bookmarkStart w:id="4" w:name="_Toc240645779"/>
       <w:r>
         <w:rPr>
           <w:rFonts w:ascii="Times New Roman" w:hAnsi="Times New Roman"/>
@@ -1943,7 +1943,7 @@
         <w:spacing w:after="360"/>
         <w:outlineLvl w:val="0"/>
       </w:pPr>
-      <w:bookmarkStart w:id="5" w:name="_Toc240641331"/>
+      <w:bookmarkStart w:id="5" w:name="_Toc240645780"/>
       <w:r>
         <w:rPr>
           <w:rFonts w:ascii="Times New Roman" w:hAnsi="Times New Roman"/>
@@ -2142,7 +2142,7 @@
       <w:r>
         <w:fldChar w:fldCharType="separate"/>
       </w:r>
-      <w:hyperlink w:anchor="_Toc240641326" w:history="1">
+      <w:hyperlink w:anchor="_Toc240645775" w:history="1">
         <w:r>
           <w:rPr>
             <w:rStyle w:val="Hyperlink"/>
@@ -2169,7 +2169,7 @@
             <w:noProof/>
             <w:webHidden/>
           </w:rPr>
-          <w:instrText xml:space="preserve"> PAGEREF _Toc240641326 \h </w:instrText>
+          <w:instrText xml:space="preserve"> PAGEREF _Toc240645775 \h </w:instrText>
         </w:r>
         <w:r>
           <w:rPr>
@@ -2217,7 +2217,7 @@
           <w14:ligatures w14:val="standardContextual"/>
         </w:rPr>
       </w:pPr>
-      <w:hyperlink w:anchor="_Toc240641327" w:history="1">
+      <w:hyperlink w:anchor="_Toc240645776" w:history="1">
         <w:r>
           <w:rPr>
             <w:rStyle w:val="Hyperlink"/>
@@ -2244,7 +2244,7 @@
             <w:noProof/>
             <w:webHidden/>
           </w:rPr>
-          <w:instrText xml:space="preserve"> PAGEREF _Toc240641327 \h </w:instrText>
+          <w:instrText xml:space="preserve"> PAGEREF _Toc240645776 \h </w:instrText>
         </w:r>
         <w:r>
           <w:rPr>
@@ -2292,7 +2292,7 @@
           <w14:ligatures w14:val="standardContextual"/>
         </w:rPr>
       </w:pPr>
-      <w:hyperlink w:anchor="_Toc240641328" w:history="1">
+      <w:hyperlink w:anchor="_Toc240645777" w:history="1">
         <w:r>
           <w:rPr>
             <w:rStyle w:val="Hyperlink"/>
@@ -2319,7 +2319,7 @@
             <w:noProof/>
             <w:webHidden/>
           </w:rPr>
-          <w:instrText xml:space="preserve"> PAGEREF _Toc240641328 \h </w:instrText>
+          <w:instrText xml:space="preserve"> PAGEREF _Toc240645777 \h </w:instrText>
         </w:r>
         <w:r>
           <w:rPr>
@@ -2367,7 +2367,7 @@
           <w14:ligatures w14:val="standardContextual"/>
         </w:rPr>
       </w:pPr>
-      <w:hyperlink w:anchor="_Toc240641329" w:history="1">
+      <w:hyperlink w:anchor="_Toc240645778" w:history="1">
         <w:r>
           <w:rPr>
             <w:rStyle w:val="Hyperlink"/>
@@ -2394,7 +2394,7 @@
             <w:noProof/>
             <w:webHidden/>
           </w:rPr>
-          <w:instrText xml:space="preserve"> PAGEREF _Toc240641329 \h </w:instrText>
+          <w:instrText xml:space="preserve"> PAGEREF _Toc240645778 \h </w:instrText>
         </w:r>
         <w:r>
           <w:rPr>
@@ -2442,7 +2442,7 @@
           <w14:ligatures w14:val="standardContextual"/>
         </w:rPr>
       </w:pPr>
-      <w:hyperlink w:anchor="_Toc240641330" w:history="1">
+      <w:hyperlink w:anchor="_Toc240645779" w:history="1">
         <w:r>
           <w:rPr>
             <w:rStyle w:val="Hyperlink"/>
@@ -2469,7 +2469,7 @@
             <w:noProof/>
             <w:webHidden/>
           </w:rPr>
-          <w:instrText xml:space="preserve"> PAGEREF _Toc240641330 \h </w:instrText>
+          <w:instrText xml:space="preserve"> PAGEREF _Toc240645779 \h </w:instrText>
         </w:r>
         <w:r>
           <w:rPr>
@@ -2517,7 +2517,7 @@
           <w14:ligatures w14:val="standardContextual"/>
         </w:rPr>
       </w:pPr>
-      <w:hyperlink w:anchor="_Toc240641331" w:history="1">
+      <w:hyperlink w:anchor="_Toc240645780" w:history="1">
         <w:r>
           <w:rPr>
             <w:rStyle w:val="Hyperlink"/>
@@ -2544,7 +2544,7 @@
             <w:noProof/>
             <w:webHidden/>
           </w:rPr>
-          <w:instrText xml:space="preserve"> PAGEREF _Toc240641331 \h </w:instrText>
+          <w:instrText xml:space="preserve"> PAGEREF _Toc240645780 \h </w:instrText>
         </w:r>
         <w:r>
           <w:rPr>
@@ -2592,7 +2592,7 @@
           <w14:ligatures w14:val="standardContextual"/>
         </w:rPr>
       </w:pPr>
-      <w:hyperlink w:anchor="_Toc240641332" w:history="1">
+      <w:hyperlink w:anchor="_Toc240645781" w:history="1">
         <w:r>
           <w:rPr>
             <w:rStyle w:val="Hyperlink"/>
@@ -2619,7 +2619,7 @@
             <w:noProof/>
             <w:webHidden/>
           </w:rPr>
-          <w:instrText xml:space="preserve"> PAGEREF _Toc240641332 \h </w:instrText>
+          <w:instrText xml:space="preserve"> PAGEREF _Toc240645781 \h </w:instrText>
         </w:r>
         <w:r>
           <w:rPr>
@@ -2667,7 +2667,7 @@
           <w14:ligatures w14:val="standardContextual"/>
         </w:rPr>
       </w:pPr>
-      <w:hyperlink w:anchor="_Toc240641333" w:history="1">
+      <w:hyperlink w:anchor="_Toc240645782" w:history="1">
         <w:r>
           <w:rPr>
             <w:rStyle w:val="Hyperlink"/>
@@ -2694,7 +2694,7 @@
             <w:noProof/>
             <w:webHidden/>
           </w:rPr>
-          <w:instrText xml:space="preserve"> PAGEREF _Toc240641333 \h </w:instrText>
+          <w:instrText xml:space="preserve"> PAGEREF _Toc240645782 \h </w:instrText>
         </w:r>
         <w:r>
           <w:rPr>
@@ -2742,7 +2742,7 @@
           <w14:ligatures w14:val="standardContextual"/>
         </w:rPr>
       </w:pPr>
-      <w:hyperlink w:anchor="_Toc240641334" w:history="1">
+      <w:hyperlink w:anchor="_Toc240645783" w:history="1">
         <w:r>
           <w:rPr>
             <w:rStyle w:val="Hyperlink"/>
@@ -2769,7 +2769,7 @@
             <w:noProof/>
             <w:webHidden/>
           </w:rPr>
-          <w:instrText xml:space="preserve"> PAGEREF _Toc240641334 \h </w:instrText>
+          <w:instrText xml:space="preserve"> PAGEREF _Toc240645783 \h </w:instrText>
         </w:r>
         <w:r>
           <w:rPr>
@@ -2816,7 +2816,7 @@
           <w14:ligatures w14:val="standardContextual"/>
         </w:rPr>
       </w:pPr>
-      <w:hyperlink w:anchor="_Toc240641335" w:history="1">
+      <w:hyperlink w:anchor="_Toc240645784" w:history="1">
         <w:r>
           <w:rPr>
             <w:rStyle w:val="Hyperlink"/>
@@ -2843,7 +2843,7 @@
             <w:noProof/>
             <w:webHidden/>
           </w:rPr>
-          <w:instrText xml:space="preserve"> PAGEREF _Toc240641335 \h </w:instrText>
+          <w:instrText xml:space="preserve"> PAGEREF _Toc240645784 \h </w:instrText>
         </w:r>
         <w:r>
           <w:rPr>
@@ -2890,7 +2890,7 @@
           <w14:ligatures w14:val="standardContextual"/>
         </w:rPr>
       </w:pPr>
-      <w:hyperlink w:anchor="_Toc240641336" w:history="1">
+      <w:hyperlink w:anchor="_Toc240645785" w:history="1">
         <w:r>
           <w:rPr>
             <w:rStyle w:val="Hyperlink"/>
@@ -2917,7 +2917,7 @@
             <w:noProof/>
             <w:webHidden/>
           </w:rPr>
-          <w:instrText xml:space="preserve"> PAGEREF _Toc240641336 \h </w:instrText>
+          <w:instrText xml:space="preserve"> PAGEREF _Toc240645785 \h </w:instrText>
         </w:r>
         <w:r>
           <w:rPr>
@@ -2964,7 +2964,7 @@
           <w14:ligatures w14:val="standardContextual"/>
         </w:rPr>
       </w:pPr>
-      <w:hyperlink w:anchor="_Toc240641337" w:history="1">
+      <w:hyperlink w:anchor="_Toc240645786" w:history="1">
         <w:r>
           <w:rPr>
             <w:rStyle w:val="Hyperlink"/>
@@ -2991,7 +2991,7 @@
             <w:noProof/>
             <w:webHidden/>
           </w:rPr>
-          <w:instrText xml:space="preserve"> PAGEREF _Toc240641337 \h </w:instrText>
+          <w:instrText xml:space="preserve"> PAGEREF _Toc240645786 \h </w:instrText>
         </w:r>
         <w:r>
           <w:rPr>
@@ -3038,7 +3038,7 @@
           <w14:ligatures w14:val="standardContextual"/>
         </w:rPr>
       </w:pPr>
-      <w:hyperlink w:anchor="_Toc240641338" w:history="1">
+      <w:hyperlink w:anchor="_Toc240645787" w:history="1">
         <w:r>
           <w:rPr>
             <w:rStyle w:val="Hyperlink"/>
@@ -3065,7 +3065,7 @@
             <w:noProof/>
             <w:webHidden/>
           </w:rPr>
-          <w:instrText xml:space="preserve"> PAGEREF _Toc240641338 \h </w:instrText>
+          <w:instrText xml:space="preserve"> PAGEREF _Toc240645787 \h </w:instrText>
         </w:r>
         <w:r>
           <w:rPr>
@@ -3113,7 +3113,7 @@
           <w14:ligatures w14:val="standardContextual"/>
         </w:rPr>
       </w:pPr>
-      <w:hyperlink w:anchor="_Toc240641339" w:history="1">
+      <w:hyperlink w:anchor="_Toc240645788" w:history="1">
         <w:r>
           <w:rPr>
             <w:rStyle w:val="Hyperlink"/>
@@ -3140,7 +3140,7 @@
             <w:noProof/>
             <w:webHidden/>
           </w:rPr>
-          <w:instrText xml:space="preserve"> PAGEREF _Toc240641339 \h </w:instrText>
+          <w:instrText xml:space="preserve"> PAGEREF _Toc240645788 \h </w:instrText>
         </w:r>
         <w:r>
           <w:rPr>
@@ -3188,7 +3188,7 @@
           <w14:ligatures w14:val="standardContextual"/>
         </w:rPr>
       </w:pPr>
-      <w:hyperlink w:anchor="_Toc240641340" w:history="1">
+      <w:hyperlink w:anchor="_Toc240645789" w:history="1">
         <w:r>
           <w:rPr>
             <w:rStyle w:val="Hyperlink"/>
@@ -3215,7 +3215,7 @@
             <w:noProof/>
             <w:webHidden/>
           </w:rPr>
-          <w:instrText xml:space="preserve"> PAGEREF _Toc240641340 \h </w:instrText>
+          <w:instrText xml:space="preserve"> PAGEREF _Toc240645789 \h </w:instrText>
         </w:r>
         <w:r>
           <w:rPr>
@@ -3263,7 +3263,7 @@
           <w14:ligatures w14:val="standardContextual"/>
         </w:rPr>
       </w:pPr>
-      <w:hyperlink w:anchor="_Toc240641341" w:history="1">
+      <w:hyperlink w:anchor="_Toc240645790" w:history="1">
         <w:r>
           <w:rPr>
             <w:rStyle w:val="Hyperlink"/>
@@ -3290,7 +3290,7 @@
             <w:noProof/>
             <w:webHidden/>
           </w:rPr>
-          <w:instrText xml:space="preserve"> PAGEREF _Toc240641341 \h </w:instrText>
+          <w:instrText xml:space="preserve"> PAGEREF _Toc240645790 \h </w:instrText>
         </w:r>
         <w:r>
           <w:rPr>
@@ -3337,7 +3337,7 @@
           <w14:ligatures w14:val="standardContextual"/>
         </w:rPr>
       </w:pPr>
-      <w:hyperlink w:anchor="_Toc240641342" w:history="1">
+      <w:hyperlink w:anchor="_Toc240645791" w:history="1">
         <w:r>
           <w:rPr>
             <w:rStyle w:val="Hyperlink"/>
@@ -3364,7 +3364,7 @@
             <w:noProof/>
             <w:webHidden/>
           </w:rPr>
-          <w:instrText xml:space="preserve"> PAGEREF _Toc240641342 \h </w:instrText>
+          <w:instrText xml:space="preserve"> PAGEREF _Toc240645791 \h </w:instrText>
         </w:r>
         <w:r>
           <w:rPr>
@@ -3412,7 +3412,7 @@
           <w14:ligatures w14:val="standardContextual"/>
         </w:rPr>
       </w:pPr>
-      <w:hyperlink w:anchor="_Toc240641343" w:history="1">
+      <w:hyperlink w:anchor="_Toc240645792" w:history="1">
         <w:r>
           <w:rPr>
             <w:rStyle w:val="Hyperlink"/>
@@ -3454,7 +3454,7 @@
             <w:noProof/>
             <w:webHidden/>
           </w:rPr>
-          <w:instrText xml:space="preserve"> PAGEREF _Toc240641343 \h </w:instrText>
+          <w:instrText xml:space="preserve"> PAGEREF _Toc240645792 \h </w:instrText>
         </w:r>
         <w:r>
           <w:rPr>
@@ -3502,7 +3502,7 @@
           <w14:ligatures w14:val="standardContextual"/>
         </w:rPr>
       </w:pPr>
-      <w:hyperlink w:anchor="_Toc240641344" w:history="1">
+      <w:hyperlink w:anchor="_Toc240645793" w:history="1">
         <w:r>
           <w:rPr>
             <w:rStyle w:val="Hyperlink"/>
@@ -3544,7 +3544,7 @@
             <w:noProof/>
             <w:webHidden/>
           </w:rPr>
-          <w:instrText xml:space="preserve"> PAGEREF _Toc240641344 \h </w:instrText>
+          <w:instrText xml:space="preserve"> PAGEREF _Toc240645793 \h </w:instrText>
         </w:r>
         <w:r>
           <w:rPr>
@@ -3592,7 +3592,7 @@
           <w14:ligatures w14:val="standardContextual"/>
         </w:rPr>
       </w:pPr>
-      <w:hyperlink w:anchor="_Toc240641345" w:history="1">
+      <w:hyperlink w:anchor="_Toc240645794" w:history="1">
         <w:r>
           <w:rPr>
             <w:rStyle w:val="Hyperlink"/>
@@ -3627,7 +3627,7 @@
             <w:noProof/>
             <w:webHidden/>
           </w:rPr>
-          <w:instrText xml:space="preserve"> PAGEREF _Toc240641345 \h </w:instrText>
+          <w:instrText xml:space="preserve"> PAGEREF _Toc240645794 \h </w:instrText>
         </w:r>
         <w:r>
           <w:rPr>
@@ -3675,7 +3675,7 @@
           <w14:ligatures w14:val="standardContextual"/>
         </w:rPr>
       </w:pPr>
-      <w:hyperlink w:anchor="_Toc240641346" w:history="1">
+      <w:hyperlink w:anchor="_Toc240645795" w:history="1">
         <w:r>
           <w:rPr>
             <w:rStyle w:val="Hyperlink"/>
@@ -3717,7 +3717,7 @@
             <w:noProof/>
             <w:webHidden/>
           </w:rPr>
-          <w:instrText xml:space="preserve"> PAGEREF _Toc240641346 \h </w:instrText>
+          <w:instrText xml:space="preserve"> PAGEREF _Toc240645795 \h </w:instrText>
         </w:r>
         <w:r>
           <w:rPr>
@@ -3764,7 +3764,7 @@
           <w14:ligatures w14:val="standardContextual"/>
         </w:rPr>
       </w:pPr>
-      <w:hyperlink w:anchor="_Toc240641347" w:history="1">
+      <w:hyperlink w:anchor="_Toc240645796" w:history="1">
         <w:r>
           <w:rPr>
             <w:rStyle w:val="Hyperlink"/>
@@ -3791,7 +3791,7 @@
             <w:noProof/>
             <w:webHidden/>
           </w:rPr>
-          <w:instrText xml:space="preserve"> PAGEREF _Toc240641347 \h </w:instrText>
+          <w:instrText xml:space="preserve"> PAGEREF _Toc240645796 \h </w:instrText>
         </w:r>
         <w:r>
           <w:rPr>
@@ -3839,7 +3839,7 @@
           <w14:ligatures w14:val="standardContextual"/>
         </w:rPr>
       </w:pPr>
-      <w:hyperlink w:anchor="_Toc240641348" w:history="1">
+      <w:hyperlink w:anchor="_Toc240645797" w:history="1">
         <w:r>
           <w:rPr>
             <w:rStyle w:val="Hyperlink"/>
@@ -3896,7 +3896,7 @@
             <w:noProof/>
             <w:webHidden/>
           </w:rPr>
-          <w:instrText xml:space="preserve"> PAGEREF _Toc240641348 \h </w:instrText>
+          <w:instrText xml:space="preserve"> PAGEREF _Toc240645797 \h </w:instrText>
         </w:r>
         <w:r>
           <w:rPr>
@@ -3944,7 +3944,7 @@
           <w14:ligatures w14:val="standardContextual"/>
         </w:rPr>
       </w:pPr>
-      <w:hyperlink w:anchor="_Toc240641349" w:history="1">
+      <w:hyperlink w:anchor="_Toc240645798" w:history="1">
         <w:r>
           <w:rPr>
             <w:rStyle w:val="Hyperlink"/>
@@ -4001,7 +4001,7 @@
             <w:noProof/>
             <w:webHidden/>
           </w:rPr>
-          <w:instrText xml:space="preserve"> PAGEREF _Toc240641349 \h </w:instrText>
+          <w:instrText xml:space="preserve"> PAGEREF _Toc240645798 \h </w:instrText>
         </w:r>
         <w:r>
           <w:rPr>
@@ -4049,7 +4049,7 @@
           <w14:ligatures w14:val="standardContextual"/>
         </w:rPr>
       </w:pPr>
-      <w:hyperlink w:anchor="_Toc240641350" w:history="1">
+      <w:hyperlink w:anchor="_Toc240645799" w:history="1">
         <w:r>
           <w:rPr>
             <w:rStyle w:val="Hyperlink"/>
@@ -4106,7 +4106,7 @@
             <w:noProof/>
             <w:webHidden/>
           </w:rPr>
-          <w:instrText xml:space="preserve"> PAGEREF _Toc240641350 \h </w:instrText>
+          <w:instrText xml:space="preserve"> PAGEREF _Toc240645799 \h </w:instrText>
         </w:r>
         <w:r>
           <w:rPr>
@@ -4154,7 +4154,7 @@
           <w14:ligatures w14:val="standardContextual"/>
         </w:rPr>
       </w:pPr>
-      <w:hyperlink w:anchor="_Toc240641351" w:history="1">
+      <w:hyperlink w:anchor="_Toc240645800" w:history="1">
         <w:r>
           <w:rPr>
             <w:rStyle w:val="Hyperlink"/>
@@ -4211,7 +4211,7 @@
             <w:noProof/>
             <w:webHidden/>
           </w:rPr>
-          <w:instrText xml:space="preserve"> PAGEREF _Toc240641351 \h </w:instrText>
+          <w:instrText xml:space="preserve"> PAGEREF _Toc240645800 \h </w:instrText>
         </w:r>
         <w:r>
           <w:rPr>
@@ -4259,7 +4259,7 @@
           <w14:ligatures w14:val="standardContextual"/>
         </w:rPr>
       </w:pPr>
-      <w:hyperlink w:anchor="_Toc240641352" w:history="1">
+      <w:hyperlink w:anchor="_Toc240645801" w:history="1">
         <w:r>
           <w:rPr>
             <w:rStyle w:val="Hyperlink"/>
@@ -4316,7 +4316,7 @@
             <w:noProof/>
             <w:webHidden/>
           </w:rPr>
-          <w:instrText xml:space="preserve"> PAGEREF _Toc240641352 \h </w:instrText>
+          <w:instrText xml:space="preserve"> PAGEREF _Toc240645801 \h </w:instrText>
         </w:r>
         <w:r>
           <w:rPr>
@@ -4363,7 +4363,7 @@
           <w14:ligatures w14:val="standardContextual"/>
         </w:rPr>
       </w:pPr>
-      <w:hyperlink w:anchor="_Toc240641353" w:history="1">
+      <w:hyperlink w:anchor="_Toc240645802" w:history="1">
         <w:r>
           <w:rPr>
             <w:rStyle w:val="Hyperlink"/>
@@ -4390,7 +4390,7 @@
             <w:noProof/>
             <w:webHidden/>
           </w:rPr>
-          <w:instrText xml:space="preserve"> PAGEREF _Toc240641353 \h </w:instrText>
+          <w:instrText xml:space="preserve"> PAGEREF _Toc240645802 \h </w:instrText>
         </w:r>
         <w:r>
           <w:rPr>
@@ -4437,7 +4437,7 @@
           <w14:ligatures w14:val="standardContextual"/>
         </w:rPr>
       </w:pPr>
-      <w:hyperlink w:anchor="_Toc240641354" w:history="1">
+      <w:hyperlink w:anchor="_Toc240645803" w:history="1">
         <w:r>
           <w:rPr>
             <w:rStyle w:val="Hyperlink"/>
@@ -4464,7 +4464,7 @@
             <w:noProof/>
             <w:webHidden/>
           </w:rPr>
-          <w:instrText xml:space="preserve"> PAGEREF _Toc240641354 \h </w:instrText>
+          <w:instrText xml:space="preserve"> PAGEREF _Toc240645803 \h </w:instrText>
         </w:r>
         <w:r>
           <w:rPr>
@@ -4512,7 +4512,7 @@
           <w14:ligatures w14:val="standardContextual"/>
         </w:rPr>
       </w:pPr>
-      <w:hyperlink w:anchor="_Toc240641355" w:history="1">
+      <w:hyperlink w:anchor="_Toc240645804" w:history="1">
         <w:r>
           <w:rPr>
             <w:rStyle w:val="Hyperlink"/>
@@ -4562,7 +4562,7 @@
             <w:noProof/>
             <w:webHidden/>
           </w:rPr>
-          <w:instrText xml:space="preserve"> PAGEREF _Toc240641355 \h </w:instrText>
+          <w:instrText xml:space="preserve"> PAGEREF _Toc240645804 \h </w:instrText>
         </w:r>
         <w:r>
           <w:rPr>
@@ -4610,7 +4610,7 @@
           <w14:ligatures w14:val="standardContextual"/>
         </w:rPr>
       </w:pPr>
-      <w:hyperlink w:anchor="_Toc240641356" w:history="1">
+      <w:hyperlink w:anchor="_Toc240645805" w:history="1">
         <w:r>
           <w:rPr>
             <w:rStyle w:val="Hyperlink"/>
@@ -4660,7 +4660,7 @@
             <w:noProof/>
             <w:webHidden/>
           </w:rPr>
-          <w:instrText xml:space="preserve"> PAGEREF _Toc240641356 \h </w:instrText>
+          <w:instrText xml:space="preserve"> PAGEREF _Toc240645805 \h </w:instrText>
         </w:r>
         <w:r>
           <w:rPr>
@@ -4708,7 +4708,7 @@
           <w14:ligatures w14:val="standardContextual"/>
         </w:rPr>
       </w:pPr>
-      <w:hyperlink w:anchor="_Toc240641357" w:history="1">
+      <w:hyperlink w:anchor="_Toc240645806" w:history="1">
         <w:r>
           <w:rPr>
             <w:rStyle w:val="Hyperlink"/>
@@ -4758,7 +4758,7 @@
             <w:noProof/>
             <w:webHidden/>
           </w:rPr>
-          <w:instrText xml:space="preserve"> PAGEREF _Toc240641357 \h </w:instrText>
+          <w:instrText xml:space="preserve"> PAGEREF _Toc240645806 \h </w:instrText>
         </w:r>
         <w:r>
           <w:rPr>
@@ -4806,7 +4806,7 @@
           <w14:ligatures w14:val="standardContextual"/>
         </w:rPr>
       </w:pPr>
-      <w:hyperlink w:anchor="_Toc240641358" w:history="1">
+      <w:hyperlink w:anchor="_Toc240645807" w:history="1">
         <w:r>
           <w:rPr>
             <w:rStyle w:val="Hyperlink"/>
@@ -4871,7 +4871,7 @@
             <w:noProof/>
             <w:webHidden/>
           </w:rPr>
-          <w:instrText xml:space="preserve"> PAGEREF _Toc240641358 \h </w:instrText>
+          <w:instrText xml:space="preserve"> PAGEREF _Toc240645807 \h </w:instrText>
         </w:r>
         <w:r>
           <w:rPr>
@@ -4919,7 +4919,7 @@
           <w14:ligatures w14:val="standardContextual"/>
         </w:rPr>
       </w:pPr>
-      <w:hyperlink w:anchor="_Toc240641359" w:history="1">
+      <w:hyperlink w:anchor="_Toc240645808" w:history="1">
         <w:r>
           <w:rPr>
             <w:rStyle w:val="Hyperlink"/>
@@ -4984,7 +4984,7 @@
             <w:noProof/>
             <w:webHidden/>
           </w:rPr>
-          <w:instrText xml:space="preserve"> PAGEREF _Toc240641359 \h </w:instrText>
+          <w:instrText xml:space="preserve"> PAGEREF _Toc240645808 \h </w:instrText>
         </w:r>
         <w:r>
           <w:rPr>
@@ -5032,7 +5032,7 @@
           <w14:ligatures w14:val="standardContextual"/>
         </w:rPr>
       </w:pPr>
-      <w:hyperlink w:anchor="_Toc240641360" w:history="1">
+      <w:hyperlink w:anchor="_Toc240645809" w:history="1">
         <w:r>
           <w:rPr>
             <w:rStyle w:val="Hyperlink"/>
@@ -5097,7 +5097,7 @@
             <w:noProof/>
             <w:webHidden/>
           </w:rPr>
-          <w:instrText xml:space="preserve"> PAGEREF _Toc240641360 \h </w:instrText>
+          <w:instrText xml:space="preserve"> PAGEREF _Toc240645809 \h </w:instrText>
         </w:r>
         <w:r>
           <w:rPr>
@@ -5144,7 +5144,7 @@
           <w14:ligatures w14:val="standardContextual"/>
         </w:rPr>
       </w:pPr>
-      <w:hyperlink w:anchor="_Toc240641361" w:history="1">
+      <w:hyperlink w:anchor="_Toc240645810" w:history="1">
         <w:r>
           <w:rPr>
             <w:rStyle w:val="Hyperlink"/>
@@ -5171,7 +5171,7 @@
             <w:noProof/>
             <w:webHidden/>
           </w:rPr>
-          <w:instrText xml:space="preserve"> PAGEREF _Toc240641361 \h </w:instrText>
+          <w:instrText xml:space="preserve"> PAGEREF _Toc240645810 \h </w:instrText>
         </w:r>
         <w:r>
           <w:rPr>
@@ -5219,7 +5219,7 @@
           <w14:ligatures w14:val="standardContextual"/>
         </w:rPr>
       </w:pPr>
-      <w:hyperlink w:anchor="_Toc240641362" w:history="1">
+      <w:hyperlink w:anchor="_Toc240645811" w:history="1">
         <w:r>
           <w:rPr>
             <w:rStyle w:val="Hyperlink"/>
@@ -5246,7 +5246,7 @@
             <w:noProof/>
             <w:webHidden/>
           </w:rPr>
-          <w:instrText xml:space="preserve"> PAGEREF _Toc240641362 \h </w:instrText>
+          <w:instrText xml:space="preserve"> PAGEREF _Toc240645811 \h </w:instrText>
         </w:r>
         <w:r>
           <w:rPr>
@@ -5293,7 +5293,7 @@
           <w14:ligatures w14:val="standardContextual"/>
         </w:rPr>
       </w:pPr>
-      <w:hyperlink w:anchor="_Toc240641363" w:history="1">
+      <w:hyperlink w:anchor="_Toc240645812" w:history="1">
         <w:r>
           <w:rPr>
             <w:rStyle w:val="Hyperlink"/>
@@ -5320,7 +5320,7 @@
             <w:noProof/>
             <w:webHidden/>
           </w:rPr>
-          <w:instrText xml:space="preserve"> PAGEREF _Toc240641363 \h </w:instrText>
+          <w:instrText xml:space="preserve"> PAGEREF _Toc240645812 \h </w:instrText>
         </w:r>
         <w:r>
           <w:rPr>
@@ -5368,7 +5368,7 @@
           <w14:ligatures w14:val="standardContextual"/>
         </w:rPr>
       </w:pPr>
-      <w:hyperlink w:anchor="_Toc240641364" w:history="1">
+      <w:hyperlink w:anchor="_Toc240645813" w:history="1">
         <w:r>
           <w:rPr>
             <w:rStyle w:val="Hyperlink"/>
@@ -5395,7 +5395,7 @@
             <w:noProof/>
             <w:webHidden/>
           </w:rPr>
-          <w:instrText xml:space="preserve"> PAGEREF _Toc240641364 \h </w:instrText>
+          <w:instrText xml:space="preserve"> PAGEREF _Toc240645813 \h </w:instrText>
         </w:r>
         <w:r>
           <w:rPr>
@@ -5442,7 +5442,7 @@
           <w14:ligatures w14:val="standardContextual"/>
         </w:rPr>
       </w:pPr>
-      <w:hyperlink w:anchor="_Toc240641365" w:history="1">
+      <w:hyperlink w:anchor="_Toc240645814" w:history="1">
         <w:r>
           <w:rPr>
             <w:rStyle w:val="Hyperlink"/>
@@ -5469,7 +5469,7 @@
             <w:noProof/>
             <w:webHidden/>
           </w:rPr>
-          <w:instrText xml:space="preserve"> PAGEREF _Toc240641365 \h </w:instrText>
+          <w:instrText xml:space="preserve"> PAGEREF _Toc240645814 \h </w:instrText>
         </w:r>
         <w:r>
           <w:rPr>
@@ -5517,7 +5517,7 @@
           <w14:ligatures w14:val="standardContextual"/>
         </w:rPr>
       </w:pPr>
-      <w:hyperlink w:anchor="_Toc240641366" w:history="1">
+      <w:hyperlink w:anchor="_Toc240645815" w:history="1">
         <w:r>
           <w:rPr>
             <w:rStyle w:val="Hyperlink"/>
@@ -5544,7 +5544,7 @@
             <w:noProof/>
             <w:webHidden/>
           </w:rPr>
-          <w:instrText xml:space="preserve"> PAGEREF _Toc240641366 \h </w:instrText>
+          <w:instrText xml:space="preserve"> PAGEREF _Toc240645815 \h </w:instrText>
         </w:r>
         <w:r>
           <w:rPr>
@@ -5592,7 +5592,7 @@
           <w14:ligatures w14:val="standardContextual"/>
         </w:rPr>
       </w:pPr>
-      <w:hyperlink w:anchor="_Toc240641367" w:history="1">
+      <w:hyperlink w:anchor="_Toc240645816" w:history="1">
         <w:r>
           <w:rPr>
             <w:rStyle w:val="Hyperlink"/>
@@ -5619,7 +5619,7 @@
             <w:noProof/>
             <w:webHidden/>
           </w:rPr>
-          <w:instrText xml:space="preserve"> PAGEREF _Toc240641367 \h </w:instrText>
+          <w:instrText xml:space="preserve"> PAGEREF _Toc240645816 \h </w:instrText>
         </w:r>
         <w:r>
           <w:rPr>
@@ -5667,7 +5667,7 @@
           <w14:ligatures w14:val="standardContextual"/>
         </w:rPr>
       </w:pPr>
-      <w:hyperlink w:anchor="_Toc240641368" w:history="1">
+      <w:hyperlink w:anchor="_Toc240645817" w:history="1">
         <w:r>
           <w:rPr>
             <w:rStyle w:val="Hyperlink"/>
@@ -5694,7 +5694,7 @@
             <w:noProof/>
             <w:webHidden/>
           </w:rPr>
-          <w:instrText xml:space="preserve"> PAGEREF _Toc240641368 \h </w:instrText>
+          <w:instrText xml:space="preserve"> PAGEREF _Toc240645817 \h </w:instrText>
         </w:r>
         <w:r>
           <w:rPr>
@@ -5742,7 +5742,7 @@
           <w14:ligatures w14:val="standardContextual"/>
         </w:rPr>
       </w:pPr>
-      <w:hyperlink w:anchor="_Toc240641369" w:history="1">
+      <w:hyperlink w:anchor="_Toc240645818" w:history="1">
         <w:r>
           <w:rPr>
             <w:rStyle w:val="Hyperlink"/>
@@ -5769,7 +5769,7 @@
             <w:noProof/>
             <w:webHidden/>
           </w:rPr>
-          <w:instrText xml:space="preserve"> PAGEREF _Toc240641369 \h </w:instrText>
+          <w:instrText xml:space="preserve"> PAGEREF _Toc240645818 \h </w:instrText>
         </w:r>
         <w:r>
           <w:rPr>
@@ -5816,7 +5816,7 @@
           <w14:ligatures w14:val="standardContextual"/>
         </w:rPr>
       </w:pPr>
-      <w:hyperlink w:anchor="_Toc240641370" w:history="1">
+      <w:hyperlink w:anchor="_Toc240645819" w:history="1">
         <w:r>
           <w:rPr>
             <w:rStyle w:val="Hyperlink"/>
@@ -5843,7 +5843,7 @@
             <w:noProof/>
             <w:webHidden/>
           </w:rPr>
-          <w:instrText xml:space="preserve"> PAGEREF _Toc240641370 \h </w:instrText>
+          <w:instrText xml:space="preserve"> PAGEREF _Toc240645819 \h </w:instrText>
         </w:r>
         <w:r>
           <w:rPr>
@@ -5890,7 +5890,7 @@
           <w14:ligatures w14:val="standardContextual"/>
         </w:rPr>
       </w:pPr>
-      <w:hyperlink w:anchor="_Toc240641371" w:history="1">
+      <w:hyperlink w:anchor="_Toc240645820" w:history="1">
         <w:r>
           <w:rPr>
             <w:rStyle w:val="Hyperlink"/>
@@ -5917,7 +5917,7 @@
             <w:noProof/>
             <w:webHidden/>
           </w:rPr>
-          <w:instrText xml:space="preserve"> PAGEREF _Toc240641371 \h </w:instrText>
+          <w:instrText xml:space="preserve"> PAGEREF _Toc240645820 \h </w:instrText>
         </w:r>
         <w:r>
           <w:rPr>
@@ -5964,7 +5964,7 @@
           <w14:ligatures w14:val="standardContextual"/>
         </w:rPr>
       </w:pPr>
-      <w:hyperlink w:anchor="_Toc240641372" w:history="1">
+      <w:hyperlink w:anchor="_Toc240645821" w:history="1">
         <w:r>
           <w:rPr>
             <w:rStyle w:val="Hyperlink"/>
@@ -5991,7 +5991,7 @@
             <w:noProof/>
             <w:webHidden/>
           </w:rPr>
-          <w:instrText xml:space="preserve"> PAGEREF _Toc240641372 \h </w:instrText>
+          <w:instrText xml:space="preserve"> PAGEREF _Toc240645821 \h </w:instrText>
         </w:r>
         <w:r>
           <w:rPr>
@@ -6039,7 +6039,7 @@
           <w14:ligatures w14:val="standardContextual"/>
         </w:rPr>
       </w:pPr>
-      <w:hyperlink w:anchor="_Toc240641373" w:history="1">
+      <w:hyperlink w:anchor="_Toc240645822" w:history="1">
         <w:r>
           <w:rPr>
             <w:rStyle w:val="Hyperlink"/>
@@ -6066,7 +6066,7 @@
             <w:noProof/>
             <w:webHidden/>
           </w:rPr>
-          <w:instrText xml:space="preserve"> PAGEREF _Toc240641373 \h </w:instrText>
+          <w:instrText xml:space="preserve"> PAGEREF _Toc240645822 \h </w:instrText>
         </w:r>
         <w:r>
           <w:rPr>
@@ -6114,7 +6114,7 @@
           <w14:ligatures w14:val="standardContextual"/>
         </w:rPr>
       </w:pPr>
-      <w:hyperlink w:anchor="_Toc240641374" w:history="1">
+      <w:hyperlink w:anchor="_Toc240645823" w:history="1">
         <w:r>
           <w:rPr>
             <w:rStyle w:val="Hyperlink"/>
@@ -6141,7 +6141,7 @@
             <w:noProof/>
             <w:webHidden/>
           </w:rPr>
-          <w:instrText xml:space="preserve"> PAGEREF _Toc240641374 \h </w:instrText>
+          <w:instrText xml:space="preserve"> PAGEREF _Toc240645823 \h </w:instrText>
         </w:r>
         <w:r>
           <w:rPr>
@@ -6189,7 +6189,7 @@
           <w14:ligatures w14:val="standardContextual"/>
         </w:rPr>
       </w:pPr>
-      <w:hyperlink w:anchor="_Toc240641375" w:history="1">
+      <w:hyperlink w:anchor="_Toc240645824" w:history="1">
         <w:r>
           <w:rPr>
             <w:rStyle w:val="Hyperlink"/>
@@ -6216,7 +6216,7 @@
             <w:noProof/>
             <w:webHidden/>
           </w:rPr>
-          <w:instrText xml:space="preserve"> PAGEREF _Toc240641375 \h </w:instrText>
+          <w:instrText xml:space="preserve"> PAGEREF _Toc240645824 \h </w:instrText>
         </w:r>
         <w:r>
           <w:rPr>
@@ -6264,7 +6264,7 @@
           <w14:ligatures w14:val="standardContextual"/>
         </w:rPr>
       </w:pPr>
-      <w:hyperlink w:anchor="_Toc240641376" w:history="1">
+      <w:hyperlink w:anchor="_Toc240645825" w:history="1">
         <w:r>
           <w:rPr>
             <w:rStyle w:val="Hyperlink"/>
@@ -6291,7 +6291,7 @@
             <w:noProof/>
             <w:webHidden/>
           </w:rPr>
-          <w:instrText xml:space="preserve"> PAGEREF _Toc240641376 \h </w:instrText>
+          <w:instrText xml:space="preserve"> PAGEREF _Toc240645825 \h </w:instrText>
         </w:r>
         <w:r>
           <w:rPr>
@@ -6339,7 +6339,7 @@
           <w14:ligatures w14:val="standardContextual"/>
         </w:rPr>
       </w:pPr>
-      <w:hyperlink w:anchor="_Toc240641377" w:history="1">
+      <w:hyperlink w:anchor="_Toc240645826" w:history="1">
         <w:r>
           <w:rPr>
             <w:rStyle w:val="Hyperlink"/>
@@ -6381,7 +6381,7 @@
             <w:noProof/>
             <w:webHidden/>
           </w:rPr>
-          <w:instrText xml:space="preserve"> PAGEREF _Toc240641377 \h </w:instrText>
+          <w:instrText xml:space="preserve"> PAGEREF _Toc240645826 \h </w:instrText>
         </w:r>
         <w:r>
           <w:rPr>
@@ -6429,7 +6429,7 @@
           <w14:ligatures w14:val="standardContextual"/>
         </w:rPr>
       </w:pPr>
-      <w:hyperlink w:anchor="_Toc240641378" w:history="1">
+      <w:hyperlink w:anchor="_Toc240645827" w:history="1">
         <w:r>
           <w:rPr>
             <w:rStyle w:val="Hyperlink"/>
@@ -6471,7 +6471,7 @@
             <w:noProof/>
             <w:webHidden/>
           </w:rPr>
-          <w:instrText xml:space="preserve"> PAGEREF _Toc240641378 \h </w:instrText>
+          <w:instrText xml:space="preserve"> PAGEREF _Toc240645827 \h </w:instrText>
         </w:r>
         <w:r>
           <w:rPr>
@@ -6518,7 +6518,7 @@
           <w14:ligatures w14:val="standardContextual"/>
         </w:rPr>
       </w:pPr>
-      <w:hyperlink w:anchor="_Toc240641379" w:history="1">
+      <w:hyperlink w:anchor="_Toc240645828" w:history="1">
         <w:r>
           <w:rPr>
             <w:rStyle w:val="Hyperlink"/>
@@ -6545,7 +6545,7 @@
             <w:noProof/>
             <w:webHidden/>
           </w:rPr>
-          <w:instrText xml:space="preserve"> PAGEREF _Toc240641379 \h </w:instrText>
+          <w:instrText xml:space="preserve"> PAGEREF _Toc240645828 \h </w:instrText>
         </w:r>
         <w:r>
           <w:rPr>
@@ -6592,7 +6592,7 @@
           <w14:ligatures w14:val="standardContextual"/>
         </w:rPr>
       </w:pPr>
-      <w:hyperlink w:anchor="_Toc240641380" w:history="1">
+      <w:hyperlink w:anchor="_Toc240645829" w:history="1">
         <w:r>
           <w:rPr>
             <w:rStyle w:val="Hyperlink"/>
@@ -6619,7 +6619,7 @@
             <w:noProof/>
             <w:webHidden/>
           </w:rPr>
-          <w:instrText xml:space="preserve"> PAGEREF _Toc240641380 \h </w:instrText>
+          <w:instrText xml:space="preserve"> PAGEREF _Toc240645829 \h </w:instrText>
         </w:r>
         <w:r>
           <w:rPr>
@@ -6639,7 +6639,7 @@
             <w:noProof/>
             <w:webHidden/>
           </w:rPr>
-          <w:t>49</w:t>
+          <w:t>48</w:t>
         </w:r>
         <w:r>
           <w:rPr>
@@ -6667,7 +6667,7 @@
           <w14:ligatures w14:val="standardContextual"/>
         </w:rPr>
       </w:pPr>
-      <w:hyperlink w:anchor="_Toc240641381" w:history="1">
+      <w:hyperlink w:anchor="_Toc240645830" w:history="1">
         <w:r>
           <w:rPr>
             <w:rStyle w:val="Hyperlink"/>
@@ -6694,7 +6694,7 @@
             <w:noProof/>
             <w:webHidden/>
           </w:rPr>
-          <w:instrText xml:space="preserve"> PAGEREF _Toc240641381 \h </w:instrText>
+          <w:instrText xml:space="preserve"> PAGEREF _Toc240645830 \h </w:instrText>
         </w:r>
         <w:r>
           <w:rPr>
@@ -6740,7 +6740,7 @@
         </w:rPr>
         <w:fldChar w:fldCharType="end"/>
       </w:r>
-      <w:bookmarkStart w:id="6" w:name="_Toc240641332"/>
+      <w:bookmarkStart w:id="6" w:name="_Toc240645781"/>
       <w:r>
         <w:rPr>
           <w:rFonts w:ascii="Times New Roman" w:hAnsi="Times New Roman"/>
@@ -6966,7 +6966,7 @@
         <w:spacing w:after="360"/>
         <w:outlineLvl w:val="0"/>
       </w:pPr>
-      <w:bookmarkStart w:id="7" w:name="_Toc240641333"/>
+      <w:bookmarkStart w:id="7" w:name="_Toc240645782"/>
       <w:r>
         <w:rPr>
           <w:rFonts w:ascii="Times New Roman" w:hAnsi="Times New Roman"/>
@@ -7143,7 +7143,7 @@
         <w:pStyle w:val="Heading1"/>
         <w:outlineLvl w:val="0"/>
       </w:pPr>
-      <w:bookmarkStart w:id="8" w:name="_Toc240641334"/>
+      <w:bookmarkStart w:id="8" w:name="_Toc240645783"/>
       <w:r>
         <w:rPr>
           <w:rFonts w:ascii="Times New Roman" w:hAnsi="Times New Roman"/>
@@ -7161,7 +7161,7 @@
         <w:pStyle w:val="Heading2"/>
         <w:outlineLvl w:val="1"/>
       </w:pPr>
-      <w:bookmarkStart w:id="9" w:name="_Toc240641335"/>
+      <w:bookmarkStart w:id="9" w:name="_Toc240645784"/>
       <w:r>
         <w:rPr>
           <w:rFonts w:ascii="Times New Roman" w:hAnsi="Times New Roman"/>
@@ -7577,7 +7577,7 @@
           <w:noProof/>
         </w:rPr>
         <w:drawing>
-          <wp:inline distT="0" distB="0" distL="0" distR="0" wp14:anchorId="7F4E5849" wp14:editId="7B9DF169">
+          <wp:inline distT="0" distB="0" distL="0" distR="0" wp14:anchorId="377FE14E" wp14:editId="3FF34B99">
             <wp:extent cx="4860000" cy="2980356"/>
             <wp:effectExtent l="0" t="0" r="0" b="0"/>
             <wp:docPr id="2" name="Picture 2"/>
@@ -7790,7 +7790,7 @@
           <w:noProof/>
         </w:rPr>
         <w:drawing>
-          <wp:inline distT="0" distB="0" distL="0" distR="0" wp14:anchorId="754343F3" wp14:editId="3092B664">
+          <wp:inline distT="0" distB="0" distL="0" distR="0" wp14:anchorId="73A7F363" wp14:editId="0D310FC2">
             <wp:extent cx="4860000" cy="2719286"/>
             <wp:effectExtent l="0" t="0" r="0" b="0"/>
             <wp:docPr id="3" name="Picture 3"/>
@@ -8368,7 +8368,7 @@
           <w:noProof/>
         </w:rPr>
         <w:drawing>
-          <wp:inline distT="0" distB="0" distL="0" distR="0" wp14:anchorId="076BF093" wp14:editId="52F8ED80">
+          <wp:inline distT="0" distB="0" distL="0" distR="0" wp14:anchorId="2E364372" wp14:editId="72C62834">
             <wp:extent cx="4860000" cy="2818800"/>
             <wp:effectExtent l="0" t="0" r="0" b="0"/>
             <wp:docPr id="4" name="Picture 4"/>
@@ -14710,7 +14710,7 @@
         <w:pStyle w:val="Heading2"/>
         <w:outlineLvl w:val="1"/>
       </w:pPr>
-      <w:bookmarkStart w:id="14" w:name="_Toc240641336"/>
+      <w:bookmarkStart w:id="14" w:name="_Toc240645785"/>
       <w:r>
         <w:rPr>
           <w:rFonts w:ascii="Times New Roman" w:hAnsi="Times New Roman"/>
@@ -15133,7 +15133,7 @@
         <w:pStyle w:val="Heading2"/>
         <w:outlineLvl w:val="1"/>
       </w:pPr>
-      <w:bookmarkStart w:id="15" w:name="_Toc240641337"/>
+      <w:bookmarkStart w:id="15" w:name="_Toc240645786"/>
       <w:r>
         <w:rPr>
           <w:rFonts w:ascii="Times New Roman" w:hAnsi="Times New Roman"/>
@@ -15557,7 +15557,7 @@
         <w:pStyle w:val="Heading2"/>
         <w:outlineLvl w:val="1"/>
       </w:pPr>
-      <w:bookmarkStart w:id="16" w:name="_Toc240641338"/>
+      <w:bookmarkStart w:id="16" w:name="_Toc240645787"/>
       <w:r>
         <w:rPr>
           <w:rFonts w:ascii="Times New Roman" w:hAnsi="Times New Roman"/>
@@ -15587,7 +15587,7 @@
         <w:pStyle w:val="Heading3"/>
         <w:outlineLvl w:val="2"/>
       </w:pPr>
-      <w:bookmarkStart w:id="17" w:name="_Toc240641339"/>
+      <w:bookmarkStart w:id="17" w:name="_Toc240645788"/>
       <w:r>
         <w:rPr>
           <w:rFonts w:ascii="Times New Roman" w:hAnsi="Times New Roman"/>
@@ -15818,7 +15818,7 @@
         <w:pStyle w:val="Heading3"/>
         <w:outlineLvl w:val="2"/>
       </w:pPr>
-      <w:bookmarkStart w:id="18" w:name="_Toc240641340"/>
+      <w:bookmarkStart w:id="18" w:name="_Toc240645789"/>
       <w:r>
         <w:rPr>
           <w:rFonts w:ascii="Times New Roman" w:hAnsi="Times New Roman"/>
@@ -15963,7 +15963,7 @@
         <w:pStyle w:val="Heading1"/>
         <w:outlineLvl w:val="0"/>
       </w:pPr>
-      <w:bookmarkStart w:id="19" w:name="_Toc240641341"/>
+      <w:bookmarkStart w:id="19" w:name="_Toc240645790"/>
       <w:r>
         <w:rPr>
           <w:rFonts w:ascii="Times New Roman" w:hAnsi="Times New Roman"/>
@@ -15981,7 +15981,7 @@
         <w:pStyle w:val="Heading2"/>
         <w:outlineLvl w:val="1"/>
       </w:pPr>
-      <w:bookmarkStart w:id="20" w:name="_Toc240641342"/>
+      <w:bookmarkStart w:id="20" w:name="_Toc240645791"/>
       <w:r>
         <w:rPr>
           <w:rFonts w:ascii="Times New Roman" w:hAnsi="Times New Roman"/>
@@ -15998,7 +15998,7 @@
         <w:pStyle w:val="Heading3"/>
         <w:outlineLvl w:val="2"/>
       </w:pPr>
-      <w:bookmarkStart w:id="21" w:name="_Toc240641343"/>
+      <w:bookmarkStart w:id="21" w:name="_Toc240645792"/>
       <w:r>
         <w:rPr>
           <w:rFonts w:ascii="Times New Roman" w:hAnsi="Times New Roman"/>
@@ -16385,7 +16385,7 @@
         <w:pStyle w:val="Heading3"/>
         <w:outlineLvl w:val="2"/>
       </w:pPr>
-      <w:bookmarkStart w:id="22" w:name="_Toc240641344"/>
+      <w:bookmarkStart w:id="22" w:name="_Toc240645793"/>
       <w:r>
         <w:rPr>
           <w:rFonts w:ascii="Times New Roman" w:hAnsi="Times New Roman"/>
@@ -16735,7 +16735,7 @@
         <w:pStyle w:val="Heading3"/>
         <w:outlineLvl w:val="2"/>
       </w:pPr>
-      <w:bookmarkStart w:id="23" w:name="_Toc240641345"/>
+      <w:bookmarkStart w:id="23" w:name="_Toc240645794"/>
       <w:r>
         <w:rPr>
           <w:rFonts w:ascii="Times New Roman" w:hAnsi="Times New Roman"/>
@@ -16925,7 +16925,7 @@
         <w:pStyle w:val="Heading3"/>
         <w:outlineLvl w:val="2"/>
       </w:pPr>
-      <w:bookmarkStart w:id="24" w:name="_Toc240641346"/>
+      <w:bookmarkStart w:id="24" w:name="_Toc240645795"/>
       <w:r>
         <w:rPr>
           <w:rFonts w:ascii="Times New Roman" w:hAnsi="Times New Roman"/>
@@ -17047,7 +17047,7 @@
         <w:pStyle w:val="Heading2"/>
         <w:outlineLvl w:val="1"/>
       </w:pPr>
-      <w:bookmarkStart w:id="25" w:name="_Toc240641347"/>
+      <w:bookmarkStart w:id="25" w:name="_Toc240645796"/>
       <w:r>
         <w:rPr>
           <w:rFonts w:ascii="Times New Roman" w:hAnsi="Times New Roman"/>
@@ -17064,7 +17064,7 @@
         <w:pStyle w:val="Heading3"/>
         <w:outlineLvl w:val="2"/>
       </w:pPr>
-      <w:bookmarkStart w:id="26" w:name="_Toc240641348"/>
+      <w:bookmarkStart w:id="26" w:name="_Toc240645797"/>
       <w:r>
         <w:rPr>
           <w:rFonts w:ascii="Times New Roman" w:hAnsi="Times New Roman"/>
@@ -17200,7 +17200,7 @@
         <w:pStyle w:val="Heading3"/>
         <w:outlineLvl w:val="2"/>
       </w:pPr>
-      <w:bookmarkStart w:id="27" w:name="_Toc240641349"/>
+      <w:bookmarkStart w:id="27" w:name="_Toc240645798"/>
       <w:r>
         <w:rPr>
           <w:rFonts w:ascii="Times New Roman" w:hAnsi="Times New Roman"/>
@@ -17353,7 +17353,7 @@
         <w:pStyle w:val="Heading3"/>
         <w:outlineLvl w:val="2"/>
       </w:pPr>
-      <w:bookmarkStart w:id="28" w:name="_Toc240641350"/>
+      <w:bookmarkStart w:id="28" w:name="_Toc240645799"/>
       <w:r>
         <w:rPr>
           <w:rFonts w:ascii="Times New Roman" w:hAnsi="Times New Roman"/>
@@ -17540,7 +17540,7 @@
         <w:pStyle w:val="Heading3"/>
         <w:outlineLvl w:val="2"/>
       </w:pPr>
-      <w:bookmarkStart w:id="29" w:name="_Toc240641351"/>
+      <w:bookmarkStart w:id="29" w:name="_Toc240645800"/>
       <w:r>
         <w:rPr>
           <w:rFonts w:ascii="Times New Roman" w:hAnsi="Times New Roman"/>
@@ -17784,7 +17784,7 @@
         <w:pStyle w:val="Heading3"/>
         <w:outlineLvl w:val="2"/>
       </w:pPr>
-      <w:bookmarkStart w:id="30" w:name="_Toc240641352"/>
+      <w:bookmarkStart w:id="30" w:name="_Toc240645801"/>
       <w:r>
         <w:rPr>
           <w:rFonts w:ascii="Times New Roman" w:hAnsi="Times New Roman"/>
@@ -17979,7 +17979,7 @@
         <w:pStyle w:val="Heading2"/>
         <w:outlineLvl w:val="1"/>
       </w:pPr>
-      <w:bookmarkStart w:id="31" w:name="_Toc240641353"/>
+      <w:bookmarkStart w:id="31" w:name="_Toc240645802"/>
       <w:r>
         <w:rPr>
           <w:rFonts w:ascii="Times New Roman" w:hAnsi="Times New Roman"/>
@@ -19591,7 +19591,7 @@
         <w:pStyle w:val="Heading2"/>
         <w:outlineLvl w:val="1"/>
       </w:pPr>
-      <w:bookmarkStart w:id="33" w:name="_Toc240641354"/>
+      <w:bookmarkStart w:id="33" w:name="_Toc240645803"/>
       <w:r>
         <w:rPr>
           <w:rFonts w:ascii="Times New Roman" w:hAnsi="Times New Roman"/>
@@ -19609,7 +19609,7 @@
         <w:pStyle w:val="Heading3"/>
         <w:outlineLvl w:val="2"/>
       </w:pPr>
-      <w:bookmarkStart w:id="34" w:name="_Toc240641355"/>
+      <w:bookmarkStart w:id="34" w:name="_Toc240645804"/>
       <w:r>
         <w:rPr>
           <w:rFonts w:ascii="Times New Roman" w:hAnsi="Times New Roman"/>
@@ -19892,7 +19892,7 @@
         <w:pStyle w:val="Heading3"/>
         <w:outlineLvl w:val="2"/>
       </w:pPr>
-      <w:bookmarkStart w:id="35" w:name="_Toc240641356"/>
+      <w:bookmarkStart w:id="35" w:name="_Toc240645805"/>
       <w:r>
         <w:rPr>
           <w:rFonts w:ascii="Times New Roman" w:hAnsi="Times New Roman"/>
@@ -20334,7 +20334,7 @@
         <w:pStyle w:val="Heading3"/>
         <w:outlineLvl w:val="2"/>
       </w:pPr>
-      <w:bookmarkStart w:id="36" w:name="_Toc240641357"/>
+      <w:bookmarkStart w:id="36" w:name="_Toc240645806"/>
       <w:r>
         <w:rPr>
           <w:rFonts w:ascii="Times New Roman" w:hAnsi="Times New Roman"/>
@@ -20741,7 +20741,7 @@
         <w:pStyle w:val="Heading3"/>
         <w:outlineLvl w:val="2"/>
       </w:pPr>
-      <w:bookmarkStart w:id="37" w:name="_Toc240641358"/>
+      <w:bookmarkStart w:id="37" w:name="_Toc240645807"/>
       <w:r>
         <w:rPr>
           <w:rFonts w:ascii="Times New Roman" w:hAnsi="Times New Roman"/>
@@ -20929,7 +20929,20 @@
         <w:rPr>
           <w:rFonts w:cs="Times New Roman"/>
         </w:rPr>
-        <w:t>) motivasi hedonis terhadap pembelian impulsif (\frac{</w:t>
+        <w:t>) motivasi hedonis terhadap pembelian impulsif (∂Y/∂X₁</w:t>
+      </w:r>
+      <w:r>
+        <w:rPr>
+          <w:rFonts w:cs="Times New Roman"/>
+          <w:i/>
+        </w:rPr>
+        <w:t xml:space="preserve"> = β₁ + β₅M</w:t>
+      </w:r>
+      <w:r>
+        <w:rPr>
+          <w:rFonts w:cs="Times New Roman"/>
+        </w:rPr>
+        <w:t>) akan semakin melemah atau teredam seiring dengan meningkatnya kontrol diri individu.</w:t>
       </w:r>
     </w:p>
     <w:p>
@@ -20941,8 +20954,124 @@
       <w:r>
         <w:rPr>
           <w:rFonts w:cs="Times New Roman"/>
-        </w:rPr>
-        <w:t>tial Y}{</w:t>
+          <w:b/>
+        </w:rPr>
+        <w:t>Kajian Empiris Terdahulu:</w:t>
+      </w:r>
+      <w:r>
+        <w:rPr>
+          <w:rFonts w:cs="Times New Roman"/>
+        </w:rPr>
+        <w:t xml:space="preserve"> Bukti moderasi langsung berasal dari </w:t>
+      </w:r>
+      <w:hyperlink w:anchor="Ref_lienardy2026role" w:history="1">
+        <w:r>
+          <w:t>Lienardy dan Panasea (2026)</w:t>
+        </w:r>
+      </w:hyperlink>
+      <w:r>
+        <w:rPr>
+          <w:rFonts w:cs="Times New Roman"/>
+        </w:rPr>
+        <w:t xml:space="preserve"> yang membuktikan melalui MRA bahwa </w:t>
+      </w:r>
+      <w:r>
+        <w:rPr>
+          <w:rFonts w:cs="Times New Roman"/>
+          <w:i/>
+        </w:rPr>
+        <w:t>Self-Control</w:t>
+      </w:r>
+      <w:r>
+        <w:rPr>
+          <w:rFonts w:cs="Times New Roman"/>
+        </w:rPr>
+        <w:t xml:space="preserve"> secara signifikan memoderasi dan memperlemah pengaruh perilaku hedonis terhadap </w:t>
+      </w:r>
+      <w:r>
+        <w:rPr>
+          <w:rFonts w:cs="Times New Roman"/>
+          <w:i/>
+        </w:rPr>
+        <w:t>impulsive buying</w:t>
+      </w:r>
+      <w:r>
+        <w:rPr>
+          <w:rFonts w:cs="Times New Roman"/>
+        </w:rPr>
+        <w:t xml:space="preserve"> (H4 diterima; n=160 konsumen Shopee Denpasar). Dukungan tak langsung datang dari </w:t>
+      </w:r>
+      <w:hyperlink w:anchor="Ref_katauke2023financial" w:history="1">
+        <w:r>
+          <w:t xml:space="preserve">Katauke </w:t>
+        </w:r>
+        <w:r>
+          <w:rPr>
+            <w:rFonts w:cs="Times New Roman"/>
+            <w:i/>
+          </w:rPr>
+          <w:t>et al.</w:t>
+        </w:r>
+        <w:r>
+          <w:rPr>
+            <w:rFonts w:cs="Times New Roman"/>
+          </w:rPr>
+          <w:t xml:space="preserve"> (2023)</w:t>
+        </w:r>
+      </w:hyperlink>
+      <w:r>
+        <w:rPr>
+          <w:rFonts w:cs="Times New Roman"/>
+        </w:rPr>
+        <w:t xml:space="preserve"> bahwa kapasitas literasi finansial (proksi pengambilan keputusan rasional) berhubungan negatif dengan impulsivitas diskonto hiperbolik. Sebaliknya, </w:t>
+      </w:r>
+      <w:hyperlink w:anchor="Ref_apidana2022peran" w:history="1">
+        <w:r>
+          <w:t>Apidana dan Kholifah (2022)</w:t>
+        </w:r>
+      </w:hyperlink>
+      <w:r>
+        <w:rPr>
+          <w:rFonts w:cs="Times New Roman"/>
+        </w:rPr>
+        <w:t xml:space="preserve"> justru menemukan interaksi </w:t>
+      </w:r>
+      <w:r>
+        <w:rPr>
+          <w:rFonts w:cs="Times New Roman"/>
+          <w:i/>
+        </w:rPr>
+        <w:t>X</w:t>
+      </w:r>
+      <w:r>
+        <w:rPr>
+          <w:rFonts w:cs="Times New Roman"/>
+        </w:rPr>
+        <w:t xml:space="preserve">₁ · </w:t>
+      </w:r>
+      <w:r>
+        <w:rPr>
+          <w:rFonts w:cs="Times New Roman"/>
+          <w:i/>
+        </w:rPr>
+        <w:t>M</w:t>
+      </w:r>
+      <w:r>
+        <w:rPr>
+          <w:rFonts w:cs="Times New Roman"/>
+        </w:rPr>
+        <w:t xml:space="preserve"> TIDAK signifikan (p=0,597; H3 ditolak) dan </w:t>
+      </w:r>
+      <w:hyperlink w:anchor="Ref_artadita2024how" w:history="1">
+        <w:r>
+          <w:t>Artadita dan Firmialy (2024)</w:t>
+        </w:r>
+      </w:hyperlink>
+      <w:r>
+        <w:rPr>
+          <w:rFonts w:cs="Times New Roman"/>
+        </w:rPr>
+        <w:t xml:space="preserve"> menemukan efek moderasi TIDAK signifikan (β=0{,}092, n.s.) — keduanya dicatat sebagai bukti gagal-moderasi pada Subjek 5B, bukan pendukung H4.</w:t>
       </w:r>
     </w:p>
     <w:p>
@@ -20954,21 +21083,15 @@
       <w:r>
         <w:rPr>
           <w:rFonts w:cs="Times New Roman"/>
-        </w:rPr>
-        <w:t>tial X_1^</w:t>
-      </w:r>
-      <w:r>
-        <w:rPr>
-          <w:rFonts w:cs="Times New Roman"/>
-          <w:i/>
-        </w:rPr>
-        <w:t>} = β₁ + β₅ M^</w:t>
-      </w:r>
-      <w:r>
-        <w:rPr>
-          <w:rFonts w:cs="Times New Roman"/>
-        </w:rPr>
-        <w:t>) akan semakin melemah atau teredam seiring dengan meningkatnya kontrol diri individu.</w:t>
+          <w:b/>
+        </w:rPr>
+        <w:t>Keterkaitan dengan Objek (Pokémon TCG):</w:t>
+      </w:r>
+      <w:r>
+        <w:rPr>
+          <w:rFonts w:cs="Times New Roman"/>
+        </w:rPr>
+        <w:t xml:space="preserve"> Saat melihat pajangan kartu di minimarket dan timbul dorongan kesenangan membuka kemasan, pembeli dengan kontrol diri tinggi mampu mengaktifkan rem kognitifnya, menolak godaan sesaat, dan mematuhi batas anggaran. Akibatnya, kontrol diri memperlemah pengaruh motivasi hedonis terhadap pembelian impulsif.</w:t>
       </w:r>
     </w:p>
     <w:p>
@@ -20982,28 +21105,13 @@
           <w:rFonts w:cs="Times New Roman"/>
           <w:b/>
         </w:rPr>
-        <w:t>Kajian Empiris Terdahulu:</w:t>
-      </w:r>
-      <w:r>
-        <w:rPr>
-          <w:rFonts w:cs="Times New Roman"/>
-        </w:rPr>
-        <w:t xml:space="preserve"> Bukti moderasi langsung berasal dari </w:t>
-      </w:r>
-      <w:hyperlink w:anchor="Ref_lienardy2026role" w:history="1">
-        <w:r>
-          <w:t>Lienardy dan Panasea (2026)</w:t>
-        </w:r>
-      </w:hyperlink>
-      <w:r>
-        <w:rPr>
-          <w:rFonts w:cs="Times New Roman"/>
-        </w:rPr>
-        <w:t xml:space="preserve"> yang membuktikan melalui MRA bahwa </w:t>
-      </w:r>
-      <w:r>
-        <w:rPr>
-          <w:rFonts w:cs="Times New Roman"/>
+        <w:lastRenderedPageBreak/>
+        <w:t xml:space="preserve">H4: </w:t>
+      </w:r>
+      <w:r>
+        <w:rPr>
+          <w:rFonts w:cs="Times New Roman"/>
+          <w:b/>
           <w:i/>
         </w:rPr>
         <w:t>Self-Control</w:t>
@@ -21011,94 +21119,120 @@
       <w:r>
         <w:rPr>
           <w:rFonts w:cs="Times New Roman"/>
-        </w:rPr>
-        <w:t xml:space="preserve"> secara signifikan memoderasi dan memperlemah pengaruh perilaku hedonis terhadap </w:t>
-      </w:r>
-      <w:r>
-        <w:rPr>
-          <w:rFonts w:cs="Times New Roman"/>
-          <w:i/>
-        </w:rPr>
-        <w:t>impulsive buying</w:t>
-      </w:r>
-      <w:r>
-        <w:rPr>
-          <w:rFonts w:cs="Times New Roman"/>
-        </w:rPr>
-        <w:t xml:space="preserve"> (H4 diterima; n=160 konsumen Shopee Denpasar). Dukungan tak langsung datang dari </w:t>
-      </w:r>
-      <w:hyperlink w:anchor="Ref_katauke2023financial" w:history="1">
-        <w:r>
-          <w:t xml:space="preserve">Katauke </w:t>
-        </w:r>
-        <w:r>
-          <w:rPr>
-            <w:rFonts w:cs="Times New Roman"/>
-            <w:i/>
-          </w:rPr>
-          <w:t>et al.</w:t>
-        </w:r>
-        <w:r>
-          <w:rPr>
-            <w:rFonts w:cs="Times New Roman"/>
-          </w:rPr>
-          <w:t xml:space="preserve"> (2023)</w:t>
-        </w:r>
-      </w:hyperlink>
-      <w:r>
-        <w:rPr>
-          <w:rFonts w:cs="Times New Roman"/>
-        </w:rPr>
-        <w:t xml:space="preserve"> bahwa kapasitas literasi finansial (proksi pengambilan keputusan rasional) berhubungan negatif dengan impulsivitas diskonto hiperbolik. Sebaliknya, </w:t>
-      </w:r>
-      <w:hyperlink w:anchor="Ref_apidana2022peran" w:history="1">
-        <w:r>
-          <w:t>Apidana dan Kholifah (2022)</w:t>
-        </w:r>
-      </w:hyperlink>
-      <w:r>
-        <w:rPr>
-          <w:rFonts w:cs="Times New Roman"/>
-        </w:rPr>
-        <w:t xml:space="preserve"> justru menemukan interaksi </w:t>
-      </w:r>
-      <w:r>
-        <w:rPr>
-          <w:rFonts w:cs="Times New Roman"/>
-          <w:i/>
-        </w:rPr>
-        <w:t>X</w:t>
-      </w:r>
-      <w:r>
-        <w:rPr>
-          <w:rFonts w:cs="Times New Roman"/>
-        </w:rPr>
-        <w:t xml:space="preserve">₁ · </w:t>
-      </w:r>
-      <w:r>
-        <w:rPr>
-          <w:rFonts w:cs="Times New Roman"/>
-          <w:i/>
-        </w:rPr>
-        <w:t>M</w:t>
-      </w:r>
-      <w:r>
-        <w:rPr>
-          <w:rFonts w:cs="Times New Roman"/>
-        </w:rPr>
-        <w:t xml:space="preserve"> TIDAK signifikan (p=0,597; H3 ditolak) dan </w:t>
-      </w:r>
-      <w:hyperlink w:anchor="Ref_artadita2024how" w:history="1">
-        <w:r>
-          <w:t>Artadita dan Firmialy (2024)</w:t>
-        </w:r>
-      </w:hyperlink>
-      <w:r>
-        <w:rPr>
-          <w:rFonts w:cs="Times New Roman"/>
-        </w:rPr>
-        <w:t xml:space="preserve"> menemukan efek moderasi TIDAK signifikan (β=0{,}092, n.s.) — keduanya dicatat sebagai bukti gagal-moderasi pada Subjek 5B, bukan pendukung H4.</w:t>
-      </w:r>
+          <w:b/>
+        </w:rPr>
+        <w:t xml:space="preserve"> memoderasi (memperlemah) pengaruh </w:t>
+      </w:r>
+      <w:r>
+        <w:rPr>
+          <w:rFonts w:cs="Times New Roman"/>
+          <w:b/>
+          <w:i/>
+        </w:rPr>
+        <w:t>Hedonic Motivation</w:t>
+      </w:r>
+      <w:r>
+        <w:rPr>
+          <w:rFonts w:cs="Times New Roman"/>
+          <w:b/>
+        </w:rPr>
+        <w:t xml:space="preserve"> terhadap </w:t>
+      </w:r>
+      <w:r>
+        <w:rPr>
+          <w:rFonts w:cs="Times New Roman"/>
+          <w:b/>
+          <w:i/>
+        </w:rPr>
+        <w:t>Impulsive Buying</w:t>
+      </w:r>
+      <w:r>
+        <w:rPr>
+          <w:rFonts w:cs="Times New Roman"/>
+          <w:b/>
+        </w:rPr>
+        <w:t xml:space="preserve"> </w:t>
+      </w:r>
+      <w:r>
+        <w:rPr>
+          <w:rFonts w:cs="Times New Roman"/>
+          <w:b/>
+          <w:i/>
+        </w:rPr>
+        <w:t>booster pack</w:t>
+      </w:r>
+      <w:r>
+        <w:rPr>
+          <w:rFonts w:cs="Times New Roman"/>
+          <w:b/>
+        </w:rPr>
+        <w:t xml:space="preserve"> kartu Pokémon TCG.</w:t>
+      </w:r>
+    </w:p>
+    <w:p>
+      <w:pPr>
+        <w:pStyle w:val="Heading3"/>
+        <w:outlineLvl w:val="2"/>
+      </w:pPr>
+      <w:bookmarkStart w:id="38" w:name="_Toc240645808"/>
+      <w:r>
+        <w:rPr>
+          <w:rFonts w:ascii="Times New Roman" w:hAnsi="Times New Roman"/>
+          <w:b/>
+          <w:color w:val="000000"/>
+          <w:sz w:val="24"/>
+        </w:rPr>
+        <w:t xml:space="preserve">2.4.5 Pengaruh Moderasi </w:t>
+      </w:r>
+      <w:r>
+        <w:rPr>
+          <w:rFonts w:ascii="Times New Roman" w:hAnsi="Times New Roman"/>
+          <w:b/>
+          <w:i/>
+          <w:color w:val="000000"/>
+          <w:sz w:val="24"/>
+        </w:rPr>
+        <w:t>Self-Control</w:t>
+      </w:r>
+      <w:r>
+        <w:rPr>
+          <w:rFonts w:ascii="Times New Roman" w:hAnsi="Times New Roman"/>
+          <w:b/>
+          <w:color w:val="000000"/>
+          <w:sz w:val="24"/>
+        </w:rPr>
+        <w:t xml:space="preserve"> terhadap Hubungan </w:t>
+      </w:r>
+      <w:r>
+        <w:rPr>
+          <w:rFonts w:ascii="Times New Roman" w:hAnsi="Times New Roman"/>
+          <w:b/>
+          <w:i/>
+          <w:color w:val="000000"/>
+          <w:sz w:val="24"/>
+        </w:rPr>
+        <w:t>Desire for Completeness</w:t>
+      </w:r>
+      <w:r>
+        <w:rPr>
+          <w:rFonts w:ascii="Times New Roman" w:hAnsi="Times New Roman"/>
+          <w:b/>
+          <w:color w:val="000000"/>
+          <w:sz w:val="24"/>
+        </w:rPr>
+        <w:t xml:space="preserve"> dan </w:t>
+      </w:r>
+      <w:r>
+        <w:rPr>
+          <w:rFonts w:ascii="Times New Roman" w:hAnsi="Times New Roman"/>
+          <w:b/>
+          <w:i/>
+          <w:color w:val="000000"/>
+          <w:sz w:val="24"/>
+        </w:rPr>
+        <w:t>Impulsive Buying</w:t>
+      </w:r>
+      <w:bookmarkEnd w:id="38"/>
     </w:p>
     <w:p>
       <w:pPr>
@@ -21111,20 +21245,87 @@
           <w:rFonts w:cs="Times New Roman"/>
           <w:b/>
         </w:rPr>
-        <w:t>Keterkaitan dengan Objek (Pokémon TCG):</w:t>
-      </w:r>
-      <w:r>
-        <w:rPr>
-          <w:rFonts w:cs="Times New Roman"/>
-        </w:rPr>
-        <w:t xml:space="preserve"> Saat melihat pajangan kartu di minimarket dan timbul dorongan kesenangan membuka kemasan, pembeli dengan kontrol diri tinggi mampu mengaktifkan rem kognitifnya, </w:t>
-      </w:r>
-      <w:r>
-        <w:rPr>
-          <w:rFonts w:cs="Times New Roman"/>
-        </w:rPr>
-        <w:lastRenderedPageBreak/>
-        <w:t>menolak godaan sesaat, dan mematuhi batas anggaran. Akibatnya, kontrol diri memperlemah pengaruh motivasi hedonis terhadap pembelian impulsif.</w:t>
+        <w:t>Landasan Teoretis:</w:t>
+      </w:r>
+      <w:r>
+        <w:rPr>
+          <w:rFonts w:cs="Times New Roman"/>
+        </w:rPr>
+        <w:t xml:space="preserve"> Respon terhadap ketegangan kognitif celah koleksi (</w:t>
+      </w:r>
+      <w:r>
+        <w:rPr>
+          <w:rFonts w:cs="Times New Roman"/>
+          <w:i/>
+        </w:rPr>
+        <w:t>Zeigarnik Effect</w:t>
+      </w:r>
+      <w:r>
+        <w:rPr>
+          <w:rFonts w:cs="Times New Roman"/>
+        </w:rPr>
+        <w:t>) dimoderasi oleh kapasitas regulasi diri individu. Seseorang dengan kontrol diri matang mampu mentoleransi ketidaknyamanan mental tanpa meresponnya secara reaktif atau tergesa-gesa (</w:t>
+      </w:r>
+      <w:hyperlink w:anchor="Ref_tangney2004high" w:history="1">
+        <w:r>
+          <w:t xml:space="preserve">Tangney </w:t>
+        </w:r>
+        <w:r>
+          <w:rPr>
+            <w:rFonts w:cs="Times New Roman"/>
+            <w:i/>
+          </w:rPr>
+          <w:t>et al.</w:t>
+        </w:r>
+        <w:r>
+          <w:rPr>
+            <w:rFonts w:cs="Times New Roman"/>
+          </w:rPr>
+          <w:t>, 2004</w:t>
+        </w:r>
+      </w:hyperlink>
+      <w:r>
+        <w:rPr>
+          <w:rFonts w:cs="Times New Roman"/>
+        </w:rPr>
+        <w:t xml:space="preserve">; </w:t>
+      </w:r>
+      <w:hyperlink w:anchor="Ref_baumeister2002yield" w:history="1">
+        <w:r>
+          <w:t>Baumeister, 2002</w:t>
+        </w:r>
+      </w:hyperlink>
+      <w:r>
+        <w:rPr>
+          <w:rFonts w:cs="Times New Roman"/>
+        </w:rPr>
+        <w:t>). Secara matematis, efek interaksi negatif (β₆ &lt; 0) menunjukkan kontrol diri yang tinggi menghasilkan kemiringan bersyarat (∂Y/∂X₂</w:t>
+      </w:r>
+      <w:r>
+        <w:rPr>
+          <w:rFonts w:cs="Times New Roman"/>
+          <w:i/>
+        </w:rPr>
+        <w:t xml:space="preserve"> = β₂ + β₆M</w:t>
+      </w:r>
+      <w:r>
+        <w:rPr>
+          <w:rFonts w:cs="Times New Roman"/>
+        </w:rPr>
+        <w:t>) yang lebih landai, sejalan dengan dugaan efek peredaman (</w:t>
+      </w:r>
+      <w:r>
+        <w:rPr>
+          <w:rFonts w:cs="Times New Roman"/>
+          <w:i/>
+        </w:rPr>
+        <w:t>buffering effect</w:t>
+      </w:r>
+      <w:r>
+        <w:rPr>
+          <w:rFonts w:cs="Times New Roman"/>
+        </w:rPr>
+        <w:t>) terhadap dorongan menuntaskan koleksi.</w:t>
       </w:r>
     </w:p>
     <w:p>
@@ -21138,133 +21339,125 @@
           <w:rFonts w:cs="Times New Roman"/>
           <w:b/>
         </w:rPr>
-        <w:t xml:space="preserve">H4: </w:t>
-      </w:r>
-      <w:r>
-        <w:rPr>
-          <w:rFonts w:cs="Times New Roman"/>
-          <w:b/>
-          <w:i/>
-        </w:rPr>
-        <w:t>Self-Control</w:t>
-      </w:r>
-      <w:r>
-        <w:rPr>
-          <w:rFonts w:cs="Times New Roman"/>
-          <w:b/>
-        </w:rPr>
-        <w:t xml:space="preserve"> memoderasi (memperlemah) pengaruh </w:t>
-      </w:r>
-      <w:r>
-        <w:rPr>
-          <w:rFonts w:cs="Times New Roman"/>
-          <w:b/>
-          <w:i/>
-        </w:rPr>
-        <w:t>Hedonic Motivation</w:t>
-      </w:r>
-      <w:r>
-        <w:rPr>
-          <w:rFonts w:cs="Times New Roman"/>
-          <w:b/>
-        </w:rPr>
-        <w:t xml:space="preserve"> terhadap </w:t>
-      </w:r>
-      <w:r>
-        <w:rPr>
-          <w:rFonts w:cs="Times New Roman"/>
-          <w:b/>
-          <w:i/>
-        </w:rPr>
-        <w:t>Impulsive Buying</w:t>
-      </w:r>
-      <w:r>
-        <w:rPr>
-          <w:rFonts w:cs="Times New Roman"/>
-          <w:b/>
-        </w:rPr>
-        <w:t xml:space="preserve"> </w:t>
-      </w:r>
-      <w:r>
-        <w:rPr>
-          <w:rFonts w:cs="Times New Roman"/>
-          <w:b/>
-          <w:i/>
-        </w:rPr>
-        <w:t>booster pack</w:t>
-      </w:r>
-      <w:r>
-        <w:rPr>
-          <w:rFonts w:cs="Times New Roman"/>
-          <w:b/>
-        </w:rPr>
-        <w:t xml:space="preserve"> kartu Pokémon TCG.</w:t>
-      </w:r>
-    </w:p>
-    <w:p>
-      <w:pPr>
-        <w:pStyle w:val="Heading3"/>
-        <w:outlineLvl w:val="2"/>
-      </w:pPr>
-      <w:bookmarkStart w:id="38" w:name="_Toc240641359"/>
-      <w:r>
-        <w:rPr>
-          <w:rFonts w:ascii="Times New Roman" w:hAnsi="Times New Roman"/>
-          <w:b/>
-          <w:color w:val="000000"/>
-          <w:sz w:val="24"/>
-        </w:rPr>
-        <w:t xml:space="preserve">2.4.5 Pengaruh Moderasi </w:t>
-      </w:r>
-      <w:r>
-        <w:rPr>
-          <w:rFonts w:ascii="Times New Roman" w:hAnsi="Times New Roman"/>
-          <w:b/>
-          <w:i/>
-          <w:color w:val="000000"/>
-          <w:sz w:val="24"/>
-        </w:rPr>
-        <w:t>Self-Control</w:t>
-      </w:r>
-      <w:r>
-        <w:rPr>
-          <w:rFonts w:ascii="Times New Roman" w:hAnsi="Times New Roman"/>
-          <w:b/>
-          <w:color w:val="000000"/>
-          <w:sz w:val="24"/>
-        </w:rPr>
-        <w:t xml:space="preserve"> terhadap Hubungan </w:t>
-      </w:r>
-      <w:r>
-        <w:rPr>
-          <w:rFonts w:ascii="Times New Roman" w:hAnsi="Times New Roman"/>
-          <w:b/>
-          <w:i/>
-          <w:color w:val="000000"/>
-          <w:sz w:val="24"/>
-        </w:rPr>
-        <w:t>Desire for Completeness</w:t>
-      </w:r>
-      <w:r>
-        <w:rPr>
-          <w:rFonts w:ascii="Times New Roman" w:hAnsi="Times New Roman"/>
-          <w:b/>
-          <w:color w:val="000000"/>
-          <w:sz w:val="24"/>
-        </w:rPr>
-        <w:t xml:space="preserve"> dan </w:t>
-      </w:r>
-      <w:r>
-        <w:rPr>
-          <w:rFonts w:ascii="Times New Roman" w:hAnsi="Times New Roman"/>
-          <w:b/>
-          <w:i/>
-          <w:color w:val="000000"/>
-          <w:sz w:val="24"/>
-        </w:rPr>
-        <w:t>Impulsive Buying</w:t>
-      </w:r>
-      <w:bookmarkEnd w:id="38"/>
+        <w:t>Kajian Empiris Terdahulu:</w:t>
+      </w:r>
+      <w:r>
+        <w:rPr>
+          <w:rFonts w:cs="Times New Roman"/>
+        </w:rPr>
+        <w:t xml:space="preserve"> Uji interaksi </w:t>
+      </w:r>
+      <w:r>
+        <w:rPr>
+          <w:rFonts w:cs="Times New Roman"/>
+          <w:i/>
+        </w:rPr>
+        <w:t>X</w:t>
+      </w:r>
+      <w:r>
+        <w:rPr>
+          <w:rFonts w:cs="Times New Roman"/>
+        </w:rPr>
+        <w:t xml:space="preserve">₂ · </w:t>
+      </w:r>
+      <w:r>
+        <w:rPr>
+          <w:rFonts w:cs="Times New Roman"/>
+          <w:i/>
+        </w:rPr>
+        <w:t>M</w:t>
+      </w:r>
+      <w:r>
+        <w:rPr>
+          <w:rFonts w:cs="Times New Roman"/>
+        </w:rPr>
+        <w:t xml:space="preserve"> secara langsung belum tersedia dalam korpus; dukungan bersifat tak langsung dan dinyatakan eksplisit sebagai demikian. Bukti parsial terdekat berasal dari </w:t>
+      </w:r>
+      <w:hyperlink w:anchor="Ref_artadita2024how" w:history="1">
+        <w:r>
+          <w:t>Artadita dan Firmialy (2024)</w:t>
+        </w:r>
+      </w:hyperlink>
+      <w:r>
+        <w:rPr>
+          <w:rFonts w:cs="Times New Roman"/>
+        </w:rPr>
+        <w:t xml:space="preserve">: hanya dimensi kontrol kognitif yang signifikan melemahkan impulsivitas koleksi item game (-0{,}3473, p&lt;0{,}10 pada Model 3), sementara efek moderasi keseluruhan DITOLAK (β=0{,}092, n.s.). Dukungan umum datang dari </w:t>
+      </w:r>
+      <w:hyperlink w:anchor="Ref_katauke2023financial" w:history="1">
+        <w:r>
+          <w:t xml:space="preserve">Katauke </w:t>
+        </w:r>
+        <w:r>
+          <w:rPr>
+            <w:rFonts w:cs="Times New Roman"/>
+            <w:i/>
+          </w:rPr>
+          <w:t>et al.</w:t>
+        </w:r>
+        <w:r>
+          <w:rPr>
+            <w:rFonts w:cs="Times New Roman"/>
+          </w:rPr>
+          <w:t xml:space="preserve"> (2023)</w:t>
+        </w:r>
+      </w:hyperlink>
+      <w:r>
+        <w:rPr>
+          <w:rFonts w:cs="Times New Roman"/>
+        </w:rPr>
+        <w:t xml:space="preserve"> bahwa kapasitas regulasi (literasi finansial) menekan impulsivitas, serta bukti MRA </w:t>
+      </w:r>
+      <w:hyperlink w:anchor="Ref_apidana2022peran" w:history="1">
+        <w:r>
+          <w:t>Apidana dan Kholifah (2022)</w:t>
+        </w:r>
+      </w:hyperlink>
+      <w:r>
+        <w:rPr>
+          <w:rFonts w:cs="Times New Roman"/>
+        </w:rPr>
+        <w:t xml:space="preserve"> bahwa kontrol diri memperlemah dorongan non-afektif (</w:t>
+      </w:r>
+      <w:r>
+        <w:rPr>
+          <w:rFonts w:cs="Times New Roman"/>
+          <w:i/>
+        </w:rPr>
+        <w:t>shopping lifestyle</w:t>
+      </w:r>
+      <w:r>
+        <w:rPr>
+          <w:rFonts w:cs="Times New Roman"/>
+        </w:rPr>
+        <w:t xml:space="preserve">, H4 diterima, β&lt;0) — keduanya analogi, bukan uji </w:t>
+      </w:r>
+      <w:r>
+        <w:rPr>
+          <w:rFonts w:cs="Times New Roman"/>
+          <w:i/>
+        </w:rPr>
+        <w:t>X</w:t>
+      </w:r>
+      <w:r>
+        <w:rPr>
+          <w:rFonts w:cs="Times New Roman"/>
+        </w:rPr>
+        <w:t xml:space="preserve">₂ · </w:t>
+      </w:r>
+      <w:r>
+        <w:rPr>
+          <w:rFonts w:cs="Times New Roman"/>
+          <w:i/>
+        </w:rPr>
+        <w:t>M</w:t>
+      </w:r>
+      <w:r>
+        <w:rPr>
+          <w:rFonts w:cs="Times New Roman"/>
+        </w:rPr>
+        <w:t>.</w:t>
+      </w:r>
     </w:p>
     <w:p>
       <w:pPr>
@@ -21277,61 +21470,39 @@
           <w:rFonts w:cs="Times New Roman"/>
           <w:b/>
         </w:rPr>
-        <w:t>Landasan Teoretis:</w:t>
-      </w:r>
-      <w:r>
-        <w:rPr>
-          <w:rFonts w:cs="Times New Roman"/>
-        </w:rPr>
-        <w:t xml:space="preserve"> Respon terhadap ketegangan kognitif celah koleksi (</w:t>
-      </w:r>
-      <w:r>
-        <w:rPr>
-          <w:rFonts w:cs="Times New Roman"/>
-          <w:i/>
-        </w:rPr>
-        <w:t>Zeigarnik Effect</w:t>
-      </w:r>
-      <w:r>
-        <w:rPr>
-          <w:rFonts w:cs="Times New Roman"/>
-        </w:rPr>
-        <w:t>) dimoderasi oleh kapasitas regulasi diri individu. Seseorang dengan kontrol diri matang mampu mentoleransi ketidaknyamanan mental tanpa meresponnya secara reaktif atau tergesa-gesa (</w:t>
-      </w:r>
-      <w:hyperlink w:anchor="Ref_tangney2004high" w:history="1">
-        <w:r>
-          <w:t xml:space="preserve">Tangney </w:t>
-        </w:r>
-        <w:r>
-          <w:rPr>
-            <w:rFonts w:cs="Times New Roman"/>
-            <w:i/>
-          </w:rPr>
-          <w:t>et al.</w:t>
-        </w:r>
-        <w:r>
-          <w:rPr>
-            <w:rFonts w:cs="Times New Roman"/>
-          </w:rPr>
-          <w:t>, 2004</w:t>
-        </w:r>
-      </w:hyperlink>
-      <w:r>
-        <w:rPr>
-          <w:rFonts w:cs="Times New Roman"/>
-        </w:rPr>
-        <w:t xml:space="preserve">; </w:t>
-      </w:r>
-      <w:hyperlink w:anchor="Ref_baumeister2002yield" w:history="1">
-        <w:r>
-          <w:t>Baumeister, 2002</w:t>
-        </w:r>
-      </w:hyperlink>
-      <w:r>
-        <w:rPr>
-          <w:rFonts w:cs="Times New Roman"/>
-        </w:rPr>
-        <w:t>). Secara matematis, efek interaksi negatif (β₆ &lt; 0) menunjukkan kontrol diri yang tinggi menghasilkan kemiringan bersyarat (\frac{</w:t>
+        <w:t>Keterkaitan dengan Objek (Pokémon TCG):</w:t>
+      </w:r>
+      <w:r>
+        <w:rPr>
+          <w:rFonts w:cs="Times New Roman"/>
+        </w:rPr>
+        <w:t xml:space="preserve"> Kolektor yang memiliki kontrol diri tinggi menyadari bahwa membeli </w:t>
+      </w:r>
+      <w:r>
+        <w:rPr>
+          <w:rFonts w:cs="Times New Roman"/>
+          <w:i/>
+        </w:rPr>
+        <w:t>pack</w:t>
+      </w:r>
+      <w:r>
+        <w:rPr>
+          <w:rFonts w:cs="Times New Roman"/>
+        </w:rPr>
+        <w:t xml:space="preserve"> acak demi mencari satu kartu spesifik yang hilang memiliki probabilitas sangat kecil dan boros biaya. Kontrol diri memampukan kolektor menahan diri dari belanja impulsif dan memilih membeli kartu lepasan (</w:t>
+      </w:r>
+      <w:r>
+        <w:rPr>
+          <w:rFonts w:cs="Times New Roman"/>
+          <w:i/>
+        </w:rPr>
+        <w:t>singles</w:t>
+      </w:r>
+      <w:r>
+        <w:rPr>
+          <w:rFonts w:cs="Times New Roman"/>
+        </w:rPr>
+        <w:t>) di pasar sekunder secara terencana. Akibatnya, kontrol diri memperlemah pengaruh hasrat kelengkapan terhadap pembelian impulsif.</w:t>
       </w:r>
     </w:p>
     <w:p>
@@ -21343,9 +21514,136 @@
       <w:r>
         <w:rPr>
           <w:rFonts w:cs="Times New Roman"/>
-        </w:rPr>
-        <w:t>tial Y}{</w:t>
-      </w:r>
+          <w:b/>
+        </w:rPr>
+        <w:t xml:space="preserve">H5: </w:t>
+      </w:r>
+      <w:r>
+        <w:rPr>
+          <w:rFonts w:cs="Times New Roman"/>
+          <w:b/>
+          <w:i/>
+        </w:rPr>
+        <w:t>Self-Control</w:t>
+      </w:r>
+      <w:r>
+        <w:rPr>
+          <w:rFonts w:cs="Times New Roman"/>
+          <w:b/>
+        </w:rPr>
+        <w:t xml:space="preserve"> memoderasi (memperlemah) pengaruh </w:t>
+      </w:r>
+      <w:r>
+        <w:rPr>
+          <w:rFonts w:cs="Times New Roman"/>
+          <w:b/>
+          <w:i/>
+        </w:rPr>
+        <w:t>Desire for Completeness</w:t>
+      </w:r>
+      <w:r>
+        <w:rPr>
+          <w:rFonts w:cs="Times New Roman"/>
+          <w:b/>
+        </w:rPr>
+        <w:t xml:space="preserve"> terhadap </w:t>
+      </w:r>
+      <w:r>
+        <w:rPr>
+          <w:rFonts w:cs="Times New Roman"/>
+          <w:b/>
+          <w:i/>
+        </w:rPr>
+        <w:t>Impulsive Buying</w:t>
+      </w:r>
+      <w:r>
+        <w:rPr>
+          <w:rFonts w:cs="Times New Roman"/>
+          <w:b/>
+        </w:rPr>
+        <w:t xml:space="preserve"> </w:t>
+      </w:r>
+      <w:r>
+        <w:rPr>
+          <w:rFonts w:cs="Times New Roman"/>
+          <w:b/>
+          <w:i/>
+        </w:rPr>
+        <w:t>booster pack</w:t>
+      </w:r>
+      <w:r>
+        <w:rPr>
+          <w:rFonts w:cs="Times New Roman"/>
+          <w:b/>
+        </w:rPr>
+        <w:t xml:space="preserve"> kartu Pokémon TCG.</w:t>
+      </w:r>
+    </w:p>
+    <w:p>
+      <w:pPr>
+        <w:pStyle w:val="Heading3"/>
+        <w:outlineLvl w:val="2"/>
+      </w:pPr>
+      <w:bookmarkStart w:id="39" w:name="_Toc240645809"/>
+      <w:r>
+        <w:rPr>
+          <w:rFonts w:ascii="Times New Roman" w:hAnsi="Times New Roman"/>
+          <w:b/>
+          <w:color w:val="000000"/>
+          <w:sz w:val="24"/>
+        </w:rPr>
+        <w:lastRenderedPageBreak/>
+        <w:t xml:space="preserve">2.4.6 Pengaruh Moderasi </w:t>
+      </w:r>
+      <w:r>
+        <w:rPr>
+          <w:rFonts w:ascii="Times New Roman" w:hAnsi="Times New Roman"/>
+          <w:b/>
+          <w:i/>
+          <w:color w:val="000000"/>
+          <w:sz w:val="24"/>
+        </w:rPr>
+        <w:t>Self-Control</w:t>
+      </w:r>
+      <w:r>
+        <w:rPr>
+          <w:rFonts w:ascii="Times New Roman" w:hAnsi="Times New Roman"/>
+          <w:b/>
+          <w:color w:val="000000"/>
+          <w:sz w:val="24"/>
+        </w:rPr>
+        <w:t xml:space="preserve"> terhadap Hubungan </w:t>
+      </w:r>
+      <w:r>
+        <w:rPr>
+          <w:rFonts w:ascii="Times New Roman" w:hAnsi="Times New Roman"/>
+          <w:b/>
+          <w:i/>
+          <w:color w:val="000000"/>
+          <w:sz w:val="24"/>
+        </w:rPr>
+        <w:t>Speculative Motive</w:t>
+      </w:r>
+      <w:r>
+        <w:rPr>
+          <w:rFonts w:ascii="Times New Roman" w:hAnsi="Times New Roman"/>
+          <w:b/>
+          <w:color w:val="000000"/>
+          <w:sz w:val="24"/>
+        </w:rPr>
+        <w:t xml:space="preserve"> dan </w:t>
+      </w:r>
+      <w:r>
+        <w:rPr>
+          <w:rFonts w:ascii="Times New Roman" w:hAnsi="Times New Roman"/>
+          <w:b/>
+          <w:i/>
+          <w:color w:val="000000"/>
+          <w:sz w:val="24"/>
+        </w:rPr>
+        <w:t>Impulsive Buying</w:t>
+      </w:r>
+      <w:bookmarkEnd w:id="39"/>
     </w:p>
     <w:p>
       <w:pPr>
@@ -21356,34 +21654,63 @@
       <w:r>
         <w:rPr>
           <w:rFonts w:cs="Times New Roman"/>
-        </w:rPr>
-        <w:t>tial X_2^</w:t>
-      </w:r>
-      <w:r>
-        <w:rPr>
-          <w:rFonts w:cs="Times New Roman"/>
-          <w:i/>
-        </w:rPr>
-        <w:t>} = β₂ + β₆ M^</w:t>
-      </w:r>
-      <w:r>
-        <w:rPr>
-          <w:rFonts w:cs="Times New Roman"/>
-        </w:rPr>
-        <w:t>) yang lebih landai, sejalan dengan dugaan efek peredaman (</w:t>
-      </w:r>
-      <w:r>
-        <w:rPr>
-          <w:rFonts w:cs="Times New Roman"/>
-          <w:i/>
-        </w:rPr>
-        <w:t>buffering effect</w:t>
-      </w:r>
-      <w:r>
-        <w:rPr>
-          <w:rFonts w:cs="Times New Roman"/>
-        </w:rPr>
-        <w:t>) terhadap dorongan menuntaskan koleksi.</w:t>
+          <w:b/>
+        </w:rPr>
+        <w:t>Landasan Teoretis:</w:t>
+      </w:r>
+      <w:r>
+        <w:rPr>
+          <w:rFonts w:cs="Times New Roman"/>
+        </w:rPr>
+        <w:t xml:space="preserve"> Dalam </w:t>
+      </w:r>
+      <w:r>
+        <w:rPr>
+          <w:rFonts w:cs="Times New Roman"/>
+          <w:i/>
+        </w:rPr>
+        <w:t>Behavioral Finance</w:t>
+      </w:r>
+      <w:r>
+        <w:rPr>
+          <w:rFonts w:cs="Times New Roman"/>
+        </w:rPr>
+        <w:t>, kontrol diri mendisiplinkan individu untuk menimbang risiko kerugian modal riil dan tidak terjebak dalam euforia transaksi spekulatif berlebihan (</w:t>
+      </w:r>
+      <w:hyperlink w:anchor="Ref_thaler1981economic" w:history="1">
+        <w:r>
+          <w:t>Thaler dan Shefrin, 1981</w:t>
+        </w:r>
+      </w:hyperlink>
+      <w:r>
+        <w:rPr>
+          <w:rFonts w:cs="Times New Roman"/>
+        </w:rPr>
+        <w:t xml:space="preserve">; </w:t>
+      </w:r>
+      <w:hyperlink w:anchor="Ref_barber2008all" w:history="1">
+        <w:r>
+          <w:t>Barber dan Odean, 2008</w:t>
+        </w:r>
+      </w:hyperlink>
+      <w:r>
+        <w:rPr>
+          <w:rFonts w:cs="Times New Roman"/>
+        </w:rPr>
+        <w:t>). Efek interaksi negatif (β₇ &lt; 0) menunjukkan pengaruh spekulasi terhadap pembelian spontan teredam secara bersyarat (∂Y/∂X₃</w:t>
+      </w:r>
+      <w:r>
+        <w:rPr>
+          <w:rFonts w:cs="Times New Roman"/>
+          <w:i/>
+        </w:rPr>
+        <w:t xml:space="preserve"> = β₃ + β₇M</w:t>
+      </w:r>
+      <w:r>
+        <w:rPr>
+          <w:rFonts w:cs="Times New Roman"/>
+        </w:rPr>
+        <w:t>) ketika kapasitas volisional konsumen membatasi toleransi risiko spekulatif.</w:t>
       </w:r>
     </w:p>
     <w:p>
@@ -21403,44 +21730,7 @@
         <w:rPr>
           <w:rFonts w:cs="Times New Roman"/>
         </w:rPr>
-        <w:t xml:space="preserve"> Uji interaksi </w:t>
-      </w:r>
-      <w:r>
-        <w:rPr>
-          <w:rFonts w:cs="Times New Roman"/>
-          <w:i/>
-        </w:rPr>
-        <w:t>X</w:t>
-      </w:r>
-      <w:r>
-        <w:rPr>
-          <w:rFonts w:cs="Times New Roman"/>
-        </w:rPr>
-        <w:t xml:space="preserve">₂ · </w:t>
-      </w:r>
-      <w:r>
-        <w:rPr>
-          <w:rFonts w:cs="Times New Roman"/>
-          <w:i/>
-        </w:rPr>
-        <w:t>M</w:t>
-      </w:r>
-      <w:r>
-        <w:rPr>
-          <w:rFonts w:cs="Times New Roman"/>
-        </w:rPr>
-        <w:t xml:space="preserve"> secara langsung belum tersedia dalam korpus; dukungan bersifat tak langsung dan dinyatakan eksplisit sebagai demikian. Bukti parsial terdekat berasal dari </w:t>
-      </w:r>
-      <w:hyperlink w:anchor="Ref_artadita2024how" w:history="1">
-        <w:r>
-          <w:t>Artadita dan Firmialy (2024)</w:t>
-        </w:r>
-      </w:hyperlink>
-      <w:r>
-        <w:rPr>
-          <w:rFonts w:cs="Times New Roman"/>
-        </w:rPr>
-        <w:t xml:space="preserve">: hanya dimensi kontrol kognitif yang signifikan melemahkan impulsivitas koleksi item game (-0{,}3473, p&lt;0{,}10 pada Model 3), sementara efek moderasi keseluruhan DITOLAK (β=0{,}092, n.s.). Dukungan umum datang dari </w:t>
+        <w:t xml:space="preserve"> Dukungan tak langsung (dinyatakan eksplisit): </w:t>
       </w:r>
       <w:hyperlink w:anchor="Ref_katauke2023financial" w:history="1">
         <w:r>
@@ -21464,57 +21754,68 @@
         <w:rPr>
           <w:rFonts w:cs="Times New Roman"/>
         </w:rPr>
-        <w:t xml:space="preserve"> bahwa kapasitas regulasi (literasi finansial) menekan impulsivitas, serta bukti MRA </w:t>
-      </w:r>
-      <w:hyperlink w:anchor="Ref_apidana2022peran" w:history="1">
-        <w:r>
-          <w:t>Apidana dan Kholifah (2022)</w:t>
+        <w:t xml:space="preserve"> membuktikan kapasitas literasi finansial berhubungan negatif dengan impulsivitas diskonto hiperbolik (Jepang, probit + IV) — proksi regulasi rasional, bukan uji </w:t>
+      </w:r>
+      <w:r>
+        <w:rPr>
+          <w:rFonts w:cs="Times New Roman"/>
+          <w:i/>
+        </w:rPr>
+        <w:t>X</w:t>
+      </w:r>
+      <w:r>
+        <w:rPr>
+          <w:rFonts w:cs="Times New Roman"/>
+        </w:rPr>
+        <w:t xml:space="preserve">₃ · </w:t>
+      </w:r>
+      <w:r>
+        <w:rPr>
+          <w:rFonts w:cs="Times New Roman"/>
+          <w:i/>
+        </w:rPr>
+        <w:t>M</w:t>
+      </w:r>
+      <w:r>
+        <w:rPr>
+          <w:rFonts w:cs="Times New Roman"/>
+        </w:rPr>
+        <w:t xml:space="preserve">. </w:t>
+      </w:r>
+      <w:hyperlink w:anchor="Ref_aryadi2024personal" w:history="1">
+        <w:r>
+          <w:t>Aryadi dan Lingga (2026)</w:t>
         </w:r>
       </w:hyperlink>
       <w:r>
         <w:rPr>
           <w:rFonts w:cs="Times New Roman"/>
         </w:rPr>
-        <w:t xml:space="preserve"> bahwa kontrol diri memperlemah dorongan non-afektif (</w:t>
-      </w:r>
-      <w:r>
-        <w:rPr>
-          <w:rFonts w:cs="Times New Roman"/>
-          <w:i/>
-        </w:rPr>
-        <w:t>shopping lifestyle</w:t>
-      </w:r>
-      <w:r>
-        <w:rPr>
-          <w:rFonts w:cs="Times New Roman"/>
-        </w:rPr>
-        <w:t xml:space="preserve">, H4 diterima, β&lt;0) — keduanya analogi, bukan uji </w:t>
-      </w:r>
-      <w:r>
-        <w:rPr>
-          <w:rFonts w:cs="Times New Roman"/>
-          <w:i/>
-        </w:rPr>
-        <w:t>X</w:t>
-      </w:r>
-      <w:r>
-        <w:rPr>
-          <w:rFonts w:cs="Times New Roman"/>
-        </w:rPr>
-        <w:t xml:space="preserve">₂ · </w:t>
-      </w:r>
-      <w:r>
-        <w:rPr>
-          <w:rFonts w:cs="Times New Roman"/>
-          <w:i/>
-        </w:rPr>
-        <w:t>M</w:t>
-      </w:r>
-      <w:r>
-        <w:rPr>
-          <w:rFonts w:cs="Times New Roman"/>
-        </w:rPr>
-        <w:t>.</w:t>
+        <w:t xml:space="preserve"> dan </w:t>
+      </w:r>
+      <w:hyperlink w:anchor="Ref_colline2024biases" w:history="1">
+        <w:r>
+          <w:t>Colline (2024)</w:t>
+        </w:r>
+      </w:hyperlink>
+      <w:r>
+        <w:rPr>
+          <w:rFonts w:cs="Times New Roman"/>
+        </w:rPr>
+        <w:t xml:space="preserve"> mendokumentasikan kuatnya motif investasi koleksi (CM p=0,000) dan bias </w:t>
+      </w:r>
+      <w:r>
+        <w:rPr>
+          <w:rFonts w:cs="Times New Roman"/>
+          <w:i/>
+        </w:rPr>
+        <w:t>herding</w:t>
+      </w:r>
+      <w:r>
+        <w:rPr>
+          <w:rFonts w:cs="Times New Roman"/>
+        </w:rPr>
+        <w:t xml:space="preserve"> investor — keduanya bukti sisi pendorong spekulasi (ranah H3), bukan bukti efek meredam kontrol diri.</w:t>
       </w:r>
     </w:p>
     <w:p>
@@ -21534,33 +21835,33 @@
         <w:rPr>
           <w:rFonts w:cs="Times New Roman"/>
         </w:rPr>
-        <w:t xml:space="preserve"> Kolektor yang memiliki kontrol diri tinggi menyadari bahwa membeli </w:t>
-      </w:r>
-      <w:r>
-        <w:rPr>
-          <w:rFonts w:cs="Times New Roman"/>
-          <w:i/>
-        </w:rPr>
-        <w:t>pack</w:t>
-      </w:r>
-      <w:r>
-        <w:rPr>
-          <w:rFonts w:cs="Times New Roman"/>
-        </w:rPr>
-        <w:t xml:space="preserve"> acak demi mencari satu kartu spesifik yang hilang memiliki probabilitas sangat kecil dan boros biaya. Kontrol diri memampukan kolektor menahan diri dari belanja impulsif dan memilih membeli kartu lepasan (</w:t>
-      </w:r>
-      <w:r>
-        <w:rPr>
-          <w:rFonts w:cs="Times New Roman"/>
-          <w:i/>
-        </w:rPr>
-        <w:t>singles</w:t>
-      </w:r>
-      <w:r>
-        <w:rPr>
-          <w:rFonts w:cs="Times New Roman"/>
-        </w:rPr>
-        <w:t>) di pasar sekunder secara terencana. Akibatnya, kontrol diri memperlemah pengaruh hasrat kelengkapan terhadap pembelian impulsif.</w:t>
+        <w:t xml:space="preserve"> Godaan keuntungan menjual kembali kartu bersertifikat </w:t>
+      </w:r>
+      <w:r>
+        <w:rPr>
+          <w:rFonts w:cs="Times New Roman"/>
+          <w:i/>
+        </w:rPr>
+        <w:t>grading</w:t>
+      </w:r>
+      <w:r>
+        <w:rPr>
+          <w:rFonts w:cs="Times New Roman"/>
+        </w:rPr>
+        <w:t xml:space="preserve"> PSA 10 kuat memikat. Sebaliknya, pembeli dengan kontrol diri kokoh memiliki disiplin untuk tidak menghamburkan uang secara spontan pada kemasan acak berisiko tinggi. Disiplin tersebut meredam ambisi spekulatif agar tidak bertransformasi menjadi tindakan </w:t>
+      </w:r>
+      <w:r>
+        <w:rPr>
+          <w:rFonts w:cs="Times New Roman"/>
+          <w:i/>
+        </w:rPr>
+        <w:t>impulsive buying</w:t>
+      </w:r>
+      <w:r>
+        <w:rPr>
+          <w:rFonts w:cs="Times New Roman"/>
+        </w:rPr>
+        <w:t>.</w:t>
       </w:r>
     </w:p>
     <w:p>
@@ -21574,8 +21875,7 @@
           <w:rFonts w:cs="Times New Roman"/>
           <w:b/>
         </w:rPr>
-        <w:lastRenderedPageBreak/>
-        <w:t xml:space="preserve">H5: </w:t>
+        <w:t xml:space="preserve">H6: </w:t>
       </w:r>
       <w:r>
         <w:rPr>
@@ -21598,7 +21898,7 @@
           <w:b/>
           <w:i/>
         </w:rPr>
-        <w:t>Desire for Completeness</w:t>
+        <w:t>Speculative Motive</w:t>
       </w:r>
       <w:r>
         <w:rPr>
@@ -21640,10 +21940,10 @@
     </w:p>
     <w:p>
       <w:pPr>
-        <w:pStyle w:val="Heading3"/>
-        <w:outlineLvl w:val="2"/>
-      </w:pPr>
-      <w:bookmarkStart w:id="39" w:name="_Toc240641360"/>
+        <w:pStyle w:val="Heading2"/>
+        <w:outlineLvl w:val="1"/>
+      </w:pPr>
+      <w:bookmarkStart w:id="40" w:name="_Toc240645810"/>
       <w:r>
         <w:rPr>
           <w:rFonts w:ascii="Times New Roman" w:hAnsi="Times New Roman"/>
@@ -21651,57 +21951,9 @@
           <w:color w:val="000000"/>
           <w:sz w:val="24"/>
         </w:rPr>
-        <w:t xml:space="preserve">2.4.6 Pengaruh Moderasi </w:t>
-      </w:r>
-      <w:r>
-        <w:rPr>
-          <w:rFonts w:ascii="Times New Roman" w:hAnsi="Times New Roman"/>
-          <w:b/>
-          <w:i/>
-          <w:color w:val="000000"/>
-          <w:sz w:val="24"/>
-        </w:rPr>
-        <w:t>Self-Control</w:t>
-      </w:r>
-      <w:r>
-        <w:rPr>
-          <w:rFonts w:ascii="Times New Roman" w:hAnsi="Times New Roman"/>
-          <w:b/>
-          <w:color w:val="000000"/>
-          <w:sz w:val="24"/>
-        </w:rPr>
-        <w:t xml:space="preserve"> terhadap Hubungan </w:t>
-      </w:r>
-      <w:r>
-        <w:rPr>
-          <w:rFonts w:ascii="Times New Roman" w:hAnsi="Times New Roman"/>
-          <w:b/>
-          <w:i/>
-          <w:color w:val="000000"/>
-          <w:sz w:val="24"/>
-        </w:rPr>
-        <w:t>Speculative Motive</w:t>
-      </w:r>
-      <w:r>
-        <w:rPr>
-          <w:rFonts w:ascii="Times New Roman" w:hAnsi="Times New Roman"/>
-          <w:b/>
-          <w:color w:val="000000"/>
-          <w:sz w:val="24"/>
-        </w:rPr>
-        <w:t xml:space="preserve"> dan </w:t>
-      </w:r>
-      <w:r>
-        <w:rPr>
-          <w:rFonts w:ascii="Times New Roman" w:hAnsi="Times New Roman"/>
-          <w:b/>
-          <w:i/>
-          <w:color w:val="000000"/>
-          <w:sz w:val="24"/>
-        </w:rPr>
-        <w:t>Impulsive Buying</w:t>
-      </w:r>
-      <w:bookmarkEnd w:id="39"/>
+        <w:t>2.5 Rerangka Penelitian</w:t>
+      </w:r>
+      <w:bookmarkEnd w:id="40"/>
     </w:p>
     <w:p>
       <w:pPr>
@@ -21712,342 +21964,6 @@
       <w:r>
         <w:rPr>
           <w:rFonts w:cs="Times New Roman"/>
-          <w:b/>
-        </w:rPr>
-        <w:t>Landasan Teoretis:</w:t>
-      </w:r>
-      <w:r>
-        <w:rPr>
-          <w:rFonts w:cs="Times New Roman"/>
-        </w:rPr>
-        <w:t xml:space="preserve"> Dalam </w:t>
-      </w:r>
-      <w:r>
-        <w:rPr>
-          <w:rFonts w:cs="Times New Roman"/>
-          <w:i/>
-        </w:rPr>
-        <w:t>Behavioral Finance</w:t>
-      </w:r>
-      <w:r>
-        <w:rPr>
-          <w:rFonts w:cs="Times New Roman"/>
-        </w:rPr>
-        <w:t>, kontrol diri mendisiplinkan individu untuk menimbang risiko kerugian modal riil dan tidak terjebak dalam euforia transaksi spekulatif berlebihan (</w:t>
-      </w:r>
-      <w:hyperlink w:anchor="Ref_thaler1981economic" w:history="1">
-        <w:r>
-          <w:t>Thaler dan Shefrin, 1981</w:t>
-        </w:r>
-      </w:hyperlink>
-      <w:r>
-        <w:rPr>
-          <w:rFonts w:cs="Times New Roman"/>
-        </w:rPr>
-        <w:t xml:space="preserve">; </w:t>
-      </w:r>
-      <w:hyperlink w:anchor="Ref_barber2008all" w:history="1">
-        <w:r>
-          <w:t>Barber dan Odean, 2008</w:t>
-        </w:r>
-      </w:hyperlink>
-      <w:r>
-        <w:rPr>
-          <w:rFonts w:cs="Times New Roman"/>
-        </w:rPr>
-        <w:t>). Efek interaksi negatif (β₇ &lt; 0) menunjukkan pengaruh spekulasi terhadap pembelian spontan teredam secara bersyarat (\frac{</w:t>
-      </w:r>
-    </w:p>
-    <w:p>
-      <w:pPr>
-        <w:spacing w:after="0" w:line="360" w:lineRule="auto"/>
-        <w:ind w:firstLine="709"/>
-        <w:jc w:val="both"/>
-      </w:pPr>
-      <w:r>
-        <w:rPr>
-          <w:rFonts w:cs="Times New Roman"/>
-        </w:rPr>
-        <w:t>tial Y}{</w:t>
-      </w:r>
-    </w:p>
-    <w:p>
-      <w:pPr>
-        <w:spacing w:after="0" w:line="360" w:lineRule="auto"/>
-        <w:ind w:firstLine="709"/>
-        <w:jc w:val="both"/>
-      </w:pPr>
-      <w:r>
-        <w:rPr>
-          <w:rFonts w:cs="Times New Roman"/>
-        </w:rPr>
-        <w:t>tial X_3^</w:t>
-      </w:r>
-      <w:r>
-        <w:rPr>
-          <w:rFonts w:cs="Times New Roman"/>
-          <w:i/>
-        </w:rPr>
-        <w:t>} = β₃ + β₇ M^</w:t>
-      </w:r>
-      <w:r>
-        <w:rPr>
-          <w:rFonts w:cs="Times New Roman"/>
-        </w:rPr>
-        <w:t>) ketika kapasitas volisional konsumen membatasi toleransi risiko spekulatif.</w:t>
-      </w:r>
-    </w:p>
-    <w:p>
-      <w:pPr>
-        <w:spacing w:after="0" w:line="360" w:lineRule="auto"/>
-        <w:ind w:firstLine="709"/>
-        <w:jc w:val="both"/>
-      </w:pPr>
-      <w:r>
-        <w:rPr>
-          <w:rFonts w:cs="Times New Roman"/>
-          <w:b/>
-        </w:rPr>
-        <w:t>Kajian Empiris Terdahulu:</w:t>
-      </w:r>
-      <w:r>
-        <w:rPr>
-          <w:rFonts w:cs="Times New Roman"/>
-        </w:rPr>
-        <w:t xml:space="preserve"> Dukungan tak langsung (dinyatakan eksplisit): </w:t>
-      </w:r>
-      <w:hyperlink w:anchor="Ref_katauke2023financial" w:history="1">
-        <w:r>
-          <w:t xml:space="preserve">Katauke </w:t>
-        </w:r>
-        <w:r>
-          <w:rPr>
-            <w:rFonts w:cs="Times New Roman"/>
-            <w:i/>
-          </w:rPr>
-          <w:t>et al.</w:t>
-        </w:r>
-        <w:r>
-          <w:rPr>
-            <w:rFonts w:cs="Times New Roman"/>
-          </w:rPr>
-          <w:t xml:space="preserve"> (2023)</w:t>
-        </w:r>
-      </w:hyperlink>
-      <w:r>
-        <w:rPr>
-          <w:rFonts w:cs="Times New Roman"/>
-        </w:rPr>
-        <w:t xml:space="preserve"> membuktikan kapasitas literasi finansial berhubungan negatif dengan impulsivitas diskonto hiperbolik (Jepang, probit + IV) — proksi regulasi rasional, bukan uji </w:t>
-      </w:r>
-      <w:r>
-        <w:rPr>
-          <w:rFonts w:cs="Times New Roman"/>
-          <w:i/>
-        </w:rPr>
-        <w:t>X</w:t>
-      </w:r>
-      <w:r>
-        <w:rPr>
-          <w:rFonts w:cs="Times New Roman"/>
-        </w:rPr>
-        <w:t xml:space="preserve">₃ · </w:t>
-      </w:r>
-      <w:r>
-        <w:rPr>
-          <w:rFonts w:cs="Times New Roman"/>
-          <w:i/>
-        </w:rPr>
-        <w:t>M</w:t>
-      </w:r>
-      <w:r>
-        <w:rPr>
-          <w:rFonts w:cs="Times New Roman"/>
-        </w:rPr>
-        <w:t xml:space="preserve">. </w:t>
-      </w:r>
-      <w:hyperlink w:anchor="Ref_aryadi2024personal" w:history="1">
-        <w:r>
-          <w:t>Aryadi dan Lingga (2026)</w:t>
-        </w:r>
-      </w:hyperlink>
-      <w:r>
-        <w:rPr>
-          <w:rFonts w:cs="Times New Roman"/>
-        </w:rPr>
-        <w:t xml:space="preserve"> dan </w:t>
-      </w:r>
-      <w:hyperlink w:anchor="Ref_colline2024biases" w:history="1">
-        <w:r>
-          <w:t>Colline (2024)</w:t>
-        </w:r>
-      </w:hyperlink>
-      <w:r>
-        <w:rPr>
-          <w:rFonts w:cs="Times New Roman"/>
-        </w:rPr>
-        <w:t xml:space="preserve"> mendokumentasikan kuatnya motif investasi koleksi (CM p=0,000) dan bias </w:t>
-      </w:r>
-      <w:r>
-        <w:rPr>
-          <w:rFonts w:cs="Times New Roman"/>
-          <w:i/>
-        </w:rPr>
-        <w:t>herding</w:t>
-      </w:r>
-      <w:r>
-        <w:rPr>
-          <w:rFonts w:cs="Times New Roman"/>
-        </w:rPr>
-        <w:t xml:space="preserve"> investor — keduanya bukti sisi pendorong spekulasi (ranah H3), bukan bukti efek meredam kontrol diri.</w:t>
-      </w:r>
-    </w:p>
-    <w:p>
-      <w:pPr>
-        <w:spacing w:after="0" w:line="360" w:lineRule="auto"/>
-        <w:ind w:firstLine="709"/>
-        <w:jc w:val="both"/>
-      </w:pPr>
-      <w:r>
-        <w:rPr>
-          <w:rFonts w:cs="Times New Roman"/>
-          <w:b/>
-        </w:rPr>
-        <w:t>Keterkaitan dengan Objek (Pokémon TCG):</w:t>
-      </w:r>
-      <w:r>
-        <w:rPr>
-          <w:rFonts w:cs="Times New Roman"/>
-        </w:rPr>
-        <w:t xml:space="preserve"> Godaan keuntungan menjual kembali kartu bersertifikat </w:t>
-      </w:r>
-      <w:r>
-        <w:rPr>
-          <w:rFonts w:cs="Times New Roman"/>
-          <w:i/>
-        </w:rPr>
-        <w:t>grading</w:t>
-      </w:r>
-      <w:r>
-        <w:rPr>
-          <w:rFonts w:cs="Times New Roman"/>
-        </w:rPr>
-        <w:t xml:space="preserve"> PSA 10 kuat memikat. Sebaliknya, pembeli dengan kontrol diri kokoh memiliki disiplin untuk tidak menghamburkan uang secara spontan pada kemasan acak berisiko tinggi. Disiplin tersebut meredam ambisi spekulatif agar tidak bertransformasi menjadi tindakan </w:t>
-      </w:r>
-      <w:r>
-        <w:rPr>
-          <w:rFonts w:cs="Times New Roman"/>
-          <w:i/>
-        </w:rPr>
-        <w:t>impulsive buying</w:t>
-      </w:r>
-      <w:r>
-        <w:rPr>
-          <w:rFonts w:cs="Times New Roman"/>
-        </w:rPr>
-        <w:t>.</w:t>
-      </w:r>
-    </w:p>
-    <w:p>
-      <w:pPr>
-        <w:spacing w:after="0" w:line="360" w:lineRule="auto"/>
-        <w:ind w:firstLine="709"/>
-        <w:jc w:val="both"/>
-      </w:pPr>
-      <w:r>
-        <w:rPr>
-          <w:rFonts w:cs="Times New Roman"/>
-          <w:b/>
-        </w:rPr>
-        <w:t xml:space="preserve">H6: </w:t>
-      </w:r>
-      <w:r>
-        <w:rPr>
-          <w:rFonts w:cs="Times New Roman"/>
-          <w:b/>
-          <w:i/>
-        </w:rPr>
-        <w:t>Self-Control</w:t>
-      </w:r>
-      <w:r>
-        <w:rPr>
-          <w:rFonts w:cs="Times New Roman"/>
-          <w:b/>
-        </w:rPr>
-        <w:t xml:space="preserve"> memoderasi (memperlemah) pengaruh </w:t>
-      </w:r>
-      <w:r>
-        <w:rPr>
-          <w:rFonts w:cs="Times New Roman"/>
-          <w:b/>
-          <w:i/>
-        </w:rPr>
-        <w:t>Speculative Motive</w:t>
-      </w:r>
-      <w:r>
-        <w:rPr>
-          <w:rFonts w:cs="Times New Roman"/>
-          <w:b/>
-        </w:rPr>
-        <w:t xml:space="preserve"> terhadap </w:t>
-      </w:r>
-      <w:r>
-        <w:rPr>
-          <w:rFonts w:cs="Times New Roman"/>
-          <w:b/>
-          <w:i/>
-        </w:rPr>
-        <w:t>Impulsive Buying</w:t>
-      </w:r>
-      <w:r>
-        <w:rPr>
-          <w:rFonts w:cs="Times New Roman"/>
-          <w:b/>
-        </w:rPr>
-        <w:t xml:space="preserve"> </w:t>
-      </w:r>
-      <w:r>
-        <w:rPr>
-          <w:rFonts w:cs="Times New Roman"/>
-          <w:b/>
-          <w:i/>
-        </w:rPr>
-        <w:t>booster pack</w:t>
-      </w:r>
-      <w:r>
-        <w:rPr>
-          <w:rFonts w:cs="Times New Roman"/>
-          <w:b/>
-        </w:rPr>
-        <w:t xml:space="preserve"> kartu Pokémon TCG.</w:t>
-      </w:r>
-    </w:p>
-    <w:p>
-      <w:pPr>
-        <w:pStyle w:val="Heading2"/>
-        <w:outlineLvl w:val="1"/>
-      </w:pPr>
-      <w:bookmarkStart w:id="40" w:name="_Toc240641361"/>
-      <w:r>
-        <w:rPr>
-          <w:rFonts w:ascii="Times New Roman" w:hAnsi="Times New Roman"/>
-          <w:b/>
-          <w:color w:val="000000"/>
-          <w:sz w:val="24"/>
-        </w:rPr>
-        <w:t>2.5 Rerangka Penelitian</w:t>
-      </w:r>
-      <w:bookmarkEnd w:id="40"/>
-    </w:p>
-    <w:p>
-      <w:pPr>
-        <w:spacing w:after="0" w:line="360" w:lineRule="auto"/>
-        <w:ind w:firstLine="709"/>
-        <w:jc w:val="both"/>
-      </w:pPr>
-      <w:r>
-        <w:rPr>
-          <w:rFonts w:cs="Times New Roman"/>
         </w:rPr>
         <w:t>Hubungan struktural antarvariabel disajikan pada Gambar 2.1:</w:t>
       </w:r>
@@ -22063,7 +21979,7 @@
         </w:rPr>
         <w:lastRenderedPageBreak/>
         <w:drawing>
-          <wp:inline distT="0" distB="0" distL="0" distR="0" wp14:anchorId="32BC26E3" wp14:editId="772C8EB4">
+          <wp:inline distT="0" distB="0" distL="0" distR="0" wp14:anchorId="37015125" wp14:editId="4892D4D4">
             <wp:extent cx="5040000" cy="2753704"/>
             <wp:effectExtent l="0" t="0" r="0" b="0"/>
             <wp:docPr id="5" name="Picture 5"/>
@@ -22138,7 +22054,7 @@
         <w:pStyle w:val="Heading1"/>
         <w:outlineLvl w:val="0"/>
       </w:pPr>
-      <w:bookmarkStart w:id="42" w:name="_Toc240641362"/>
+      <w:bookmarkStart w:id="42" w:name="_Toc240645811"/>
       <w:r>
         <w:rPr>
           <w:rFonts w:ascii="Times New Roman" w:hAnsi="Times New Roman"/>
@@ -22156,7 +22072,7 @@
         <w:pStyle w:val="Heading2"/>
         <w:outlineLvl w:val="1"/>
       </w:pPr>
-      <w:bookmarkStart w:id="43" w:name="_Toc240641363"/>
+      <w:bookmarkStart w:id="43" w:name="_Toc240645812"/>
       <w:r>
         <w:rPr>
           <w:rFonts w:ascii="Times New Roman" w:hAnsi="Times New Roman"/>
@@ -22771,7 +22687,7 @@
         <w:pStyle w:val="Heading3"/>
         <w:outlineLvl w:val="2"/>
       </w:pPr>
-      <w:bookmarkStart w:id="45" w:name="_Toc240641364"/>
+      <w:bookmarkStart w:id="45" w:name="_Toc240645813"/>
       <w:r>
         <w:rPr>
           <w:rFonts w:ascii="Times New Roman" w:hAnsi="Times New Roman"/>
@@ -23071,7 +22987,7 @@
         <w:pStyle w:val="Heading2"/>
         <w:outlineLvl w:val="1"/>
       </w:pPr>
-      <w:bookmarkStart w:id="46" w:name="_Toc240641365"/>
+      <w:bookmarkStart w:id="46" w:name="_Toc240645814"/>
       <w:r>
         <w:rPr>
           <w:rFonts w:ascii="Times New Roman" w:hAnsi="Times New Roman"/>
@@ -23088,7 +23004,7 @@
         <w:pStyle w:val="Heading3"/>
         <w:outlineLvl w:val="2"/>
       </w:pPr>
-      <w:bookmarkStart w:id="47" w:name="_Toc240641366"/>
+      <w:bookmarkStart w:id="47" w:name="_Toc240645815"/>
       <w:r>
         <w:rPr>
           <w:rFonts w:ascii="Times New Roman" w:hAnsi="Times New Roman"/>
@@ -23312,7 +23228,7 @@
         <w:pStyle w:val="Heading3"/>
         <w:outlineLvl w:val="2"/>
       </w:pPr>
-      <w:bookmarkStart w:id="48" w:name="_Toc240641367"/>
+      <w:bookmarkStart w:id="48" w:name="_Toc240645816"/>
       <w:r>
         <w:rPr>
           <w:rFonts w:ascii="Times New Roman" w:hAnsi="Times New Roman"/>
@@ -23614,7 +23530,7 @@
         <w:pStyle w:val="Heading3"/>
         <w:outlineLvl w:val="2"/>
       </w:pPr>
-      <w:bookmarkStart w:id="49" w:name="_Toc240641368"/>
+      <w:bookmarkStart w:id="49" w:name="_Toc240645817"/>
       <w:r>
         <w:rPr>
           <w:rFonts w:ascii="Times New Roman" w:hAnsi="Times New Roman"/>
@@ -24260,7 +24176,7 @@
         <w:pStyle w:val="Heading3"/>
         <w:outlineLvl w:val="2"/>
       </w:pPr>
-      <w:bookmarkStart w:id="50" w:name="_Toc240641369"/>
+      <w:bookmarkStart w:id="50" w:name="_Toc240645818"/>
       <w:r>
         <w:rPr>
           <w:rFonts w:ascii="Times New Roman" w:hAnsi="Times New Roman"/>
@@ -24514,7 +24430,7 @@
         <w:pStyle w:val="Heading2"/>
         <w:outlineLvl w:val="1"/>
       </w:pPr>
-      <w:bookmarkStart w:id="51" w:name="_Toc240641370"/>
+      <w:bookmarkStart w:id="51" w:name="_Toc240645819"/>
       <w:r>
         <w:rPr>
           <w:rFonts w:ascii="Times New Roman" w:hAnsi="Times New Roman"/>
@@ -26550,7 +26466,7 @@
         <w:pStyle w:val="Heading2"/>
         <w:outlineLvl w:val="1"/>
       </w:pPr>
-      <w:bookmarkStart w:id="52" w:name="_Toc240641371"/>
+      <w:bookmarkStart w:id="52" w:name="_Toc240645820"/>
       <w:r>
         <w:rPr>
           <w:rFonts w:ascii="Times New Roman" w:hAnsi="Times New Roman"/>
@@ -30043,7 +29959,7 @@
         <w:pStyle w:val="Heading2"/>
         <w:outlineLvl w:val="1"/>
       </w:pPr>
-      <w:bookmarkStart w:id="54" w:name="_Toc240641372"/>
+      <w:bookmarkStart w:id="54" w:name="_Toc240645821"/>
       <w:r>
         <w:rPr>
           <w:rFonts w:ascii="Times New Roman" w:hAnsi="Times New Roman"/>
@@ -30060,7 +29976,7 @@
         <w:pStyle w:val="Heading3"/>
         <w:outlineLvl w:val="2"/>
       </w:pPr>
-      <w:bookmarkStart w:id="55" w:name="_Toc240641373"/>
+      <w:bookmarkStart w:id="55" w:name="_Toc240645822"/>
       <w:r>
         <w:rPr>
           <w:rFonts w:ascii="Times New Roman" w:hAnsi="Times New Roman"/>
@@ -30620,7 +30536,7 @@
         <w:pStyle w:val="Heading3"/>
         <w:outlineLvl w:val="2"/>
       </w:pPr>
-      <w:bookmarkStart w:id="56" w:name="_Toc240641374"/>
+      <w:bookmarkStart w:id="56" w:name="_Toc240645823"/>
       <w:r>
         <w:rPr>
           <w:rFonts w:ascii="Times New Roman" w:hAnsi="Times New Roman"/>
@@ -30804,7 +30720,7 @@
         <w:pStyle w:val="Heading3"/>
         <w:outlineLvl w:val="2"/>
       </w:pPr>
-      <w:bookmarkStart w:id="57" w:name="_Toc240641375"/>
+      <w:bookmarkStart w:id="57" w:name="_Toc240645824"/>
       <w:r>
         <w:rPr>
           <w:rFonts w:ascii="Times New Roman" w:hAnsi="Times New Roman"/>
@@ -31064,7 +30980,7 @@
         <w:pStyle w:val="Heading3"/>
         <w:outlineLvl w:val="2"/>
       </w:pPr>
-      <w:bookmarkStart w:id="58" w:name="_Toc240641376"/>
+      <w:bookmarkStart w:id="58" w:name="_Toc240645825"/>
       <w:r>
         <w:rPr>
           <w:rFonts w:ascii="Times New Roman" w:hAnsi="Times New Roman"/>
@@ -31342,7 +31258,7 @@
         <w:pStyle w:val="Heading3"/>
         <w:outlineLvl w:val="2"/>
       </w:pPr>
-      <w:bookmarkStart w:id="59" w:name="_Toc240641377"/>
+      <w:bookmarkStart w:id="59" w:name="_Toc240645826"/>
       <w:r>
         <w:rPr>
           <w:rFonts w:ascii="Times New Roman" w:hAnsi="Times New Roman"/>
@@ -31469,7 +31385,7 @@
         <w:pStyle w:val="Heading3"/>
         <w:outlineLvl w:val="2"/>
       </w:pPr>
-      <w:bookmarkStart w:id="60" w:name="_Toc240641378"/>
+      <w:bookmarkStart w:id="60" w:name="_Toc240645827"/>
       <w:r>
         <w:rPr>
           <w:rFonts w:ascii="Times New Roman" w:hAnsi="Times New Roman"/>
@@ -31606,8 +31522,119 @@
         <w:rPr>
           <w:rFonts w:cs="Times New Roman"/>
         </w:rPr>
-        <w:t xml:space="preserve"> Hipotesis moderasi (H4, H5, H6) diuji lewat kemiringan bersyarat per-hipotesis –- H4: \frac{</w:t>
-      </w:r>
+        <w:t xml:space="preserve"> Hipotesis moderasi (H4, H5, H6) diuji lewat kemiringan bersyarat per-hipotesis –- H4: ∂Y/∂X₁</w:t>
+      </w:r>
+      <w:r>
+        <w:rPr>
+          <w:rFonts w:cs="Times New Roman"/>
+          <w:i/>
+        </w:rPr>
+        <w:t xml:space="preserve"> = β₁ + β₅M</w:t>
+      </w:r>
+      <w:r>
+        <w:rPr>
+          <w:rFonts w:cs="Times New Roman"/>
+        </w:rPr>
+        <w:t>; H5: ∂Y/∂X₂</w:t>
+      </w:r>
+      <w:r>
+        <w:rPr>
+          <w:rFonts w:cs="Times New Roman"/>
+          <w:i/>
+        </w:rPr>
+        <w:t xml:space="preserve"> = β₂ + β₆M</w:t>
+      </w:r>
+      <w:r>
+        <w:rPr>
+          <w:rFonts w:cs="Times New Roman"/>
+        </w:rPr>
+        <w:t>; H6: ∂Y/∂X₃</w:t>
+      </w:r>
+      <w:r>
+        <w:rPr>
+          <w:rFonts w:cs="Times New Roman"/>
+          <w:i/>
+        </w:rPr>
+        <w:t xml:space="preserve"> = β₃ + β₇M</w:t>
+      </w:r>
+      <w:r>
+        <w:rPr>
+          <w:rFonts w:cs="Times New Roman"/>
+        </w:rPr>
+        <w:t xml:space="preserve"> –- pada kontrol diri rendah (−1 SD), rata-rata (0 SD), dan tinggi (+1 SD). Efek memperlemah terbukti bila kemiringan </w:t>
+      </w:r>
+      <w:r>
+        <w:rPr>
+          <w:rFonts w:cs="Times New Roman"/>
+          <w:i/>
+        </w:rPr>
+        <w:t>X</w:t>
+      </w:r>
+      <w:r>
+        <w:rPr>
+          <w:rFonts w:cs="Times New Roman"/>
+        </w:rPr>
+        <w:t>ᵢ</w:t>
+      </w:r>
+      <w:r>
+        <w:rPr>
+          <w:rFonts w:cs="Times New Roman"/>
+        </w:rPr>
+        <w:t xml:space="preserve"> terhadap </w:t>
+      </w:r>
+      <w:r>
+        <w:rPr>
+          <w:rFonts w:cs="Times New Roman"/>
+          <w:i/>
+        </w:rPr>
+        <w:t>Y</w:t>
+      </w:r>
+      <w:r>
+        <w:rPr>
+          <w:rFonts w:cs="Times New Roman"/>
+        </w:rPr>
+        <w:t xml:space="preserve"> mendatar pada kontrol diri tinggi (</w:t>
+      </w:r>
+      <w:hyperlink w:anchor="Ref_aiken1991multiple" w:history="1">
+        <w:r>
+          <w:t>Aiken dan West, 1991</w:t>
+        </w:r>
+      </w:hyperlink>
+      <w:r>
+        <w:rPr>
+          <w:rFonts w:cs="Times New Roman"/>
+        </w:rPr>
+        <w:t xml:space="preserve">; </w:t>
+      </w:r>
+      <w:hyperlink w:anchor="Ref_hayes2018introduction" w:history="1">
+        <w:r>
+          <w:t>Hayes, 2018</w:t>
+        </w:r>
+      </w:hyperlink>
+      <w:r>
+        <w:rPr>
+          <w:rFonts w:cs="Times New Roman"/>
+        </w:rPr>
+        <w:t>).</w:t>
+      </w:r>
+    </w:p>
+    <w:p>
+      <w:pPr>
+        <w:pStyle w:val="Heading2"/>
+        <w:outlineLvl w:val="1"/>
+      </w:pPr>
+      <w:bookmarkStart w:id="61" w:name="_Toc240645828"/>
+      <w:r>
+        <w:rPr>
+          <w:rFonts w:ascii="Times New Roman" w:hAnsi="Times New Roman"/>
+          <w:b/>
+          <w:color w:val="000000"/>
+          <w:sz w:val="24"/>
+        </w:rPr>
+        <w:lastRenderedPageBreak/>
+        <w:t>3.6 Diagram Alur Penelitian</w:t>
+      </w:r>
+      <w:bookmarkEnd w:id="61"/>
     </w:p>
     <w:p>
       <w:pPr>
@@ -31619,195 +31646,6 @@
         <w:rPr>
           <w:rFonts w:cs="Times New Roman"/>
         </w:rPr>
-        <w:t>tial Y}{</w:t>
-      </w:r>
-    </w:p>
-    <w:p>
-      <w:pPr>
-        <w:spacing w:after="0" w:line="360" w:lineRule="auto"/>
-        <w:ind w:firstLine="709"/>
-        <w:jc w:val="both"/>
-      </w:pPr>
-      <w:r>
-        <w:rPr>
-          <w:rFonts w:cs="Times New Roman"/>
-        </w:rPr>
-        <w:t>tial X_1^</w:t>
-      </w:r>
-      <w:r>
-        <w:rPr>
-          <w:rFonts w:cs="Times New Roman"/>
-          <w:i/>
-        </w:rPr>
-        <w:t>} = β₁ + β₅ M^</w:t>
-      </w:r>
-      <w:r>
-        <w:rPr>
-          <w:rFonts w:cs="Times New Roman"/>
-        </w:rPr>
-        <w:t>; H5: \frac{</w:t>
-      </w:r>
-    </w:p>
-    <w:p>
-      <w:pPr>
-        <w:spacing w:after="0" w:line="360" w:lineRule="auto"/>
-        <w:ind w:firstLine="709"/>
-        <w:jc w:val="both"/>
-      </w:pPr>
-      <w:r>
-        <w:rPr>
-          <w:rFonts w:cs="Times New Roman"/>
-        </w:rPr>
-        <w:t>tial Y}{</w:t>
-      </w:r>
-    </w:p>
-    <w:p>
-      <w:pPr>
-        <w:spacing w:after="0" w:line="360" w:lineRule="auto"/>
-        <w:ind w:firstLine="709"/>
-        <w:jc w:val="both"/>
-      </w:pPr>
-      <w:r>
-        <w:rPr>
-          <w:rFonts w:cs="Times New Roman"/>
-        </w:rPr>
-        <w:lastRenderedPageBreak/>
-        <w:t>tial X_2^</w:t>
-      </w:r>
-      <w:r>
-        <w:rPr>
-          <w:rFonts w:cs="Times New Roman"/>
-          <w:i/>
-        </w:rPr>
-        <w:t>} = β₂ + β₆ M^</w:t>
-      </w:r>
-      <w:r>
-        <w:rPr>
-          <w:rFonts w:cs="Times New Roman"/>
-        </w:rPr>
-        <w:t>; H6: \frac{</w:t>
-      </w:r>
-    </w:p>
-    <w:p>
-      <w:pPr>
-        <w:spacing w:after="0" w:line="360" w:lineRule="auto"/>
-        <w:ind w:firstLine="709"/>
-        <w:jc w:val="both"/>
-      </w:pPr>
-      <w:r>
-        <w:rPr>
-          <w:rFonts w:cs="Times New Roman"/>
-        </w:rPr>
-        <w:t>tial Y}{</w:t>
-      </w:r>
-    </w:p>
-    <w:p>
-      <w:pPr>
-        <w:spacing w:after="0" w:line="360" w:lineRule="auto"/>
-        <w:ind w:firstLine="709"/>
-        <w:jc w:val="both"/>
-      </w:pPr>
-      <w:r>
-        <w:rPr>
-          <w:rFonts w:cs="Times New Roman"/>
-        </w:rPr>
-        <w:t>tial X_3^</w:t>
-      </w:r>
-      <w:r>
-        <w:rPr>
-          <w:rFonts w:cs="Times New Roman"/>
-          <w:i/>
-        </w:rPr>
-        <w:t>} = β₃ + β₇ M^</w:t>
-      </w:r>
-      <w:r>
-        <w:rPr>
-          <w:rFonts w:cs="Times New Roman"/>
-        </w:rPr>
-        <w:t xml:space="preserve"> –- pada kontrol diri rendah (−1 SD), rata-rata (0 SD), dan tinggi (+1 SD). Efek memperlemah terbukti bila kemiringan </w:t>
-      </w:r>
-      <w:r>
-        <w:rPr>
-          <w:rFonts w:cs="Times New Roman"/>
-          <w:i/>
-        </w:rPr>
-        <w:t>X</w:t>
-      </w:r>
-      <w:r>
-        <w:rPr>
-          <w:rFonts w:cs="Times New Roman"/>
-        </w:rPr>
-        <w:t>ᵢ</w:t>
-      </w:r>
-      <w:r>
-        <w:rPr>
-          <w:rFonts w:cs="Times New Roman"/>
-        </w:rPr>
-        <w:t xml:space="preserve"> terhadap </w:t>
-      </w:r>
-      <w:r>
-        <w:rPr>
-          <w:rFonts w:cs="Times New Roman"/>
-          <w:i/>
-        </w:rPr>
-        <w:t>Y</w:t>
-      </w:r>
-      <w:r>
-        <w:rPr>
-          <w:rFonts w:cs="Times New Roman"/>
-        </w:rPr>
-        <w:t xml:space="preserve"> mendatar pada kontrol diri tinggi (</w:t>
-      </w:r>
-      <w:hyperlink w:anchor="Ref_aiken1991multiple" w:history="1">
-        <w:r>
-          <w:t>Aiken dan West, 1991</w:t>
-        </w:r>
-      </w:hyperlink>
-      <w:r>
-        <w:rPr>
-          <w:rFonts w:cs="Times New Roman"/>
-        </w:rPr>
-        <w:t xml:space="preserve">; </w:t>
-      </w:r>
-      <w:hyperlink w:anchor="Ref_hayes2018introduction" w:history="1">
-        <w:r>
-          <w:t>Hayes, 2018</w:t>
-        </w:r>
-      </w:hyperlink>
-      <w:r>
-        <w:rPr>
-          <w:rFonts w:cs="Times New Roman"/>
-        </w:rPr>
-        <w:t>).</w:t>
-      </w:r>
-    </w:p>
-    <w:p>
-      <w:pPr>
-        <w:pStyle w:val="Heading2"/>
-        <w:outlineLvl w:val="1"/>
-      </w:pPr>
-      <w:bookmarkStart w:id="61" w:name="_Toc240641379"/>
-      <w:r>
-        <w:rPr>
-          <w:rFonts w:ascii="Times New Roman" w:hAnsi="Times New Roman"/>
-          <w:b/>
-          <w:color w:val="000000"/>
-          <w:sz w:val="24"/>
-        </w:rPr>
-        <w:t>3.6 Diagram Alur Penelitian</w:t>
-      </w:r>
-      <w:bookmarkEnd w:id="61"/>
-    </w:p>
-    <w:p>
-      <w:pPr>
-        <w:spacing w:after="0" w:line="360" w:lineRule="auto"/>
-        <w:ind w:firstLine="709"/>
-        <w:jc w:val="both"/>
-      </w:pPr>
-      <w:r>
-        <w:rPr>
-          <w:rFonts w:cs="Times New Roman"/>
-        </w:rPr>
         <w:t>Tahapan pelaksanaan penelitian ini dari awal perumusan gagasan hingga penarikan kesimpulan disajikan secara skematis pada Gambar:</w:t>
       </w:r>
     </w:p>
@@ -31821,7 +31659,7 @@
           <w:noProof/>
         </w:rPr>
         <w:drawing>
-          <wp:inline distT="0" distB="0" distL="0" distR="0" wp14:anchorId="036B9118" wp14:editId="50AA0961">
+          <wp:inline distT="0" distB="0" distL="0" distR="0" wp14:anchorId="43FBA16E" wp14:editId="276CDFB0">
             <wp:extent cx="4680000" cy="4706426"/>
             <wp:effectExtent l="0" t="0" r="0" b="0"/>
             <wp:docPr id="6" name="Picture 6"/>
@@ -31891,7 +31729,7 @@
         <w:pStyle w:val="Heading2"/>
         <w:outlineLvl w:val="1"/>
       </w:pPr>
-      <w:bookmarkStart w:id="63" w:name="_Toc240641380"/>
+      <w:bookmarkStart w:id="63" w:name="_Toc240645829"/>
       <w:r>
         <w:rPr>
           <w:rFonts w:ascii="Times New Roman" w:hAnsi="Times New Roman"/>
@@ -31899,7 +31737,6 @@
           <w:color w:val="000000"/>
           <w:sz w:val="24"/>
         </w:rPr>
-        <w:lastRenderedPageBreak/>
         <w:t>3.7 Jadwal Pelaksanaan Penelitian</w:t>
       </w:r>
       <w:bookmarkEnd w:id="63"/>
@@ -32533,6 +32370,7 @@
               <w:rPr>
                 <w:sz w:val="19"/>
               </w:rPr>
+              <w:lastRenderedPageBreak/>
               <w:t>3</w:t>
             </w:r>
           </w:p>
@@ -33841,7 +33679,7 @@
         <w:pStyle w:val="Heading1"/>
         <w:outlineLvl w:val="0"/>
       </w:pPr>
-      <w:bookmarkStart w:id="65" w:name="_Toc240641381"/>
+      <w:bookmarkStart w:id="65" w:name="_Toc240645830"/>
       <w:r>
         <w:rPr>
           <w:rFonts w:ascii="Times New Roman" w:hAnsi="Times New Roman"/>
@@ -35825,31 +35663,31 @@
       </w:rPr>
     </w:lvl>
   </w:abstractNum>
-  <w:num w:numId="1" w16cid:durableId="851920413">
+  <w:num w:numId="1" w16cid:durableId="1922331396">
     <w:abstractNumId w:val="8"/>
   </w:num>
-  <w:num w:numId="2" w16cid:durableId="1394039023">
+  <w:num w:numId="2" w16cid:durableId="1305356919">
     <w:abstractNumId w:val="6"/>
   </w:num>
-  <w:num w:numId="3" w16cid:durableId="967853457">
+  <w:num w:numId="3" w16cid:durableId="710882520">
     <w:abstractNumId w:val="5"/>
   </w:num>
-  <w:num w:numId="4" w16cid:durableId="1037583470">
+  <w:num w:numId="4" w16cid:durableId="1195776496">
     <w:abstractNumId w:val="4"/>
   </w:num>
-  <w:num w:numId="5" w16cid:durableId="577711285">
+  <w:num w:numId="5" w16cid:durableId="1472333732">
     <w:abstractNumId w:val="7"/>
   </w:num>
-  <w:num w:numId="6" w16cid:durableId="684670140">
+  <w:num w:numId="6" w16cid:durableId="1716391089">
     <w:abstractNumId w:val="3"/>
   </w:num>
-  <w:num w:numId="7" w16cid:durableId="1979988377">
+  <w:num w:numId="7" w16cid:durableId="4864461">
     <w:abstractNumId w:val="2"/>
   </w:num>
-  <w:num w:numId="8" w16cid:durableId="1598562860">
+  <w:num w:numId="8" w16cid:durableId="1078749688">
     <w:abstractNumId w:val="1"/>
   </w:num>
-  <w:num w:numId="9" w16cid:durableId="851727018">
+  <w:num w:numId="9" w16cid:durableId="1689790115">
     <w:abstractNumId w:val="0"/>
   </w:num>
 </w:numbering>
@@ -47290,7 +47128,7 @@
     <w:autoRedefine/>
     <w:uiPriority w:val="39"/>
     <w:unhideWhenUsed/>
-    <w:rsid w:val="0087414D"/>
+    <w:rsid w:val="00CD6FD9"/>
     <w:pPr>
       <w:spacing w:after="40" w:line="240" w:lineRule="auto"/>
     </w:pPr>
@@ -47306,7 +47144,7 @@
     <w:autoRedefine/>
     <w:uiPriority w:val="39"/>
     <w:unhideWhenUsed/>
-    <w:rsid w:val="0087414D"/>
+    <w:rsid w:val="00CD6FD9"/>
     <w:pPr>
       <w:spacing w:after="40" w:line="240" w:lineRule="auto"/>
       <w:ind w:left="360"/>
@@ -47322,7 +47160,7 @@
     <w:autoRedefine/>
     <w:uiPriority w:val="39"/>
     <w:unhideWhenUsed/>
-    <w:rsid w:val="0087414D"/>
+    <w:rsid w:val="00CD6FD9"/>
     <w:pPr>
       <w:spacing w:after="40" w:line="240" w:lineRule="auto"/>
       <w:ind w:left="720"/>
@@ -47337,7 +47175,7 @@
     <w:basedOn w:val="DefaultParagraphFont"/>
     <w:uiPriority w:val="99"/>
     <w:unhideWhenUsed/>
-    <w:rsid w:val="0087414D"/>
+    <w:rsid w:val="00CD6FD9"/>
     <w:rPr>
       <w:color w:val="0000FF" w:themeColor="hyperlink"/>
       <w:u w:val="single"/>

</xml_diff>

<commit_message>
feat(revisi-sempro): audit 54 sitasi, eliminasi grand theory, jembatan narasi bab 1, substitusi 4 jurnal Q1/SSCI terverifikasi, sinkronisasi C-LOT-1 Word 48 hlm (10/10 PASS)
</commit_message>
<xml_diff>
--- a/01_Naskah_Utama/Proposal_Arthur_PokemonTCG.docx
+++ b/01_Naskah_Utama/Proposal_Arthur_PokemonTCG.docx
@@ -12,7 +12,7 @@
           <w:noProof/>
         </w:rPr>
         <w:drawing>
-          <wp:inline distT="0" distB="0" distL="0" distR="0" wp14:anchorId="0A99654F" wp14:editId="39D02FF0">
+          <wp:inline distT="0" distB="0" distL="0" distR="0" wp14:anchorId="5B06316F" wp14:editId="17A3559B">
             <wp:extent cx="1152000" cy="1152000"/>
             <wp:effectExtent l="0" t="0" r="0" b="0"/>
             <wp:docPr id="1" name="Picture 1"/>
@@ -297,11 +297,10 @@
           <w:color w:val="auto"/>
           <w:kern w:val="2"/>
           <w:szCs w:val="24"/>
-          <w:lang w:val="en-ID" w:eastAsia="en-ID"/>
           <w14:ligatures w14:val="standardContextual"/>
         </w:rPr>
       </w:pPr>
-      <w:hyperlink w:anchor="_Toc241178675" w:history="1">
+      <w:hyperlink w:anchor="_Toc241583764" w:history="1">
         <w:r>
           <w:rPr>
             <w:noProof/>
@@ -332,7 +331,6 @@
           <w:color w:val="auto"/>
           <w:kern w:val="2"/>
           <w:szCs w:val="24"/>
-          <w:lang w:val="en-ID" w:eastAsia="en-ID"/>
           <w14:ligatures w14:val="standardContextual"/>
         </w:rPr>
       </w:pPr>
@@ -367,7 +365,6 @@
           <w:color w:val="auto"/>
           <w:kern w:val="2"/>
           <w:szCs w:val="24"/>
-          <w:lang w:val="en-ID" w:eastAsia="en-ID"/>
           <w14:ligatures w14:val="standardContextual"/>
         </w:rPr>
       </w:pPr>
@@ -401,7 +398,6 @@
           <w:color w:val="auto"/>
           <w:kern w:val="2"/>
           <w:szCs w:val="24"/>
-          <w:lang w:val="en-ID" w:eastAsia="en-ID"/>
           <w14:ligatures w14:val="standardContextual"/>
         </w:rPr>
       </w:pPr>
@@ -435,7 +431,6 @@
           <w:color w:val="auto"/>
           <w:kern w:val="2"/>
           <w:szCs w:val="24"/>
-          <w:lang w:val="en-ID" w:eastAsia="en-ID"/>
           <w14:ligatures w14:val="standardContextual"/>
         </w:rPr>
       </w:pPr>
@@ -453,7 +448,7 @@
             <w:color w:val="000000"/>
           </w:rPr>
           <w:tab/>
-          <w:t>9</w:t>
+          <w:t>10</w:t>
         </w:r>
       </w:hyperlink>
     </w:p>
@@ -469,7 +464,6 @@
           <w:color w:val="auto"/>
           <w:kern w:val="2"/>
           <w:szCs w:val="24"/>
-          <w:lang w:val="en-ID" w:eastAsia="en-ID"/>
           <w14:ligatures w14:val="standardContextual"/>
         </w:rPr>
       </w:pPr>
@@ -487,7 +481,7 @@
             <w:color w:val="000000"/>
           </w:rPr>
           <w:tab/>
-          <w:t>9</w:t>
+          <w:t>10</w:t>
         </w:r>
       </w:hyperlink>
     </w:p>
@@ -503,7 +497,6 @@
           <w:color w:val="auto"/>
           <w:kern w:val="2"/>
           <w:szCs w:val="24"/>
-          <w:lang w:val="en-ID" w:eastAsia="en-ID"/>
           <w14:ligatures w14:val="standardContextual"/>
         </w:rPr>
       </w:pPr>
@@ -521,7 +514,7 @@
             <w:color w:val="000000"/>
           </w:rPr>
           <w:tab/>
-          <w:t>10</w:t>
+          <w:t>11</w:t>
         </w:r>
       </w:hyperlink>
     </w:p>
@@ -538,7 +531,6 @@
           <w:kern w:val="2"/>
           <w:sz w:val="24"/>
           <w:szCs w:val="24"/>
-          <w:lang w:val="en-ID" w:eastAsia="en-ID"/>
           <w14:ligatures w14:val="standardContextual"/>
         </w:rPr>
       </w:pPr>
@@ -556,7 +548,7 @@
             <w:color w:val="000000"/>
           </w:rPr>
           <w:tab/>
-          <w:t>10</w:t>
+          <w:t>11</w:t>
         </w:r>
       </w:hyperlink>
     </w:p>
@@ -573,7 +565,6 @@
           <w:kern w:val="2"/>
           <w:sz w:val="24"/>
           <w:szCs w:val="24"/>
-          <w:lang w:val="en-ID" w:eastAsia="en-ID"/>
           <w14:ligatures w14:val="standardContextual"/>
         </w:rPr>
       </w:pPr>
@@ -608,7 +599,6 @@
           <w:color w:val="auto"/>
           <w:kern w:val="2"/>
           <w:szCs w:val="24"/>
-          <w:lang w:val="en-ID" w:eastAsia="en-ID"/>
           <w14:ligatures w14:val="standardContextual"/>
         </w:rPr>
       </w:pPr>
@@ -626,7 +616,7 @@
             <w:color w:val="000000"/>
           </w:rPr>
           <w:tab/>
-          <w:t>12</w:t>
+          <w:t>13</w:t>
         </w:r>
       </w:hyperlink>
     </w:p>
@@ -642,7 +632,6 @@
           <w:color w:val="auto"/>
           <w:kern w:val="2"/>
           <w:szCs w:val="24"/>
-          <w:lang w:val="en-ID" w:eastAsia="en-ID"/>
           <w14:ligatures w14:val="standardContextual"/>
         </w:rPr>
       </w:pPr>
@@ -660,7 +649,7 @@
             <w:color w:val="000000"/>
           </w:rPr>
           <w:tab/>
-          <w:t>12</w:t>
+          <w:t>13</w:t>
         </w:r>
       </w:hyperlink>
     </w:p>
@@ -677,52 +666,16 @@
           <w:kern w:val="2"/>
           <w:sz w:val="24"/>
           <w:szCs w:val="24"/>
-          <w:lang w:val="en-ID" w:eastAsia="en-ID"/>
           <w14:ligatures w14:val="standardContextual"/>
         </w:rPr>
       </w:pPr>
-      <w:hyperlink w:anchor="TOC_2_1_1_GRAND_THEORY_KEUANGAN_PERILAKU" w:history="1">
+      <w:hyperlink w:anchor="TOC_2_1_1_LANDASAN_TEORETIS_PENDEKATAN_K" w:history="1">
         <w:r>
           <w:rPr>
             <w:noProof/>
             <w:color w:val="000000"/>
           </w:rPr>
-          <w:t>2.1.1 Grand Theory: Keuangan Perilaku (Behavioral Finance) &lt;a id="211-grand-theory-keuangan-perilaku-behavioral-finance"&gt;&lt;/a&gt;</w:t>
-        </w:r>
-        <w:r>
-          <w:rPr>
-            <w:noProof/>
-            <w:color w:val="000000"/>
-          </w:rPr>
-          <w:tab/>
-          <w:t>12</w:t>
-        </w:r>
-      </w:hyperlink>
-    </w:p>
-    <w:p>
-      <w:pPr>
-        <w:pStyle w:val="TOC3"/>
-        <w:tabs>
-          <w:tab w:val="right" w:leader="dot" w:pos="7927"/>
-        </w:tabs>
-        <w:rPr>
-          <w:rFonts w:asciiTheme="minorHAnsi" w:hAnsiTheme="minorHAnsi" w:cstheme="minorBidi"/>
-          <w:noProof/>
-          <w:color w:val="auto"/>
-          <w:kern w:val="2"/>
-          <w:sz w:val="24"/>
-          <w:szCs w:val="24"/>
-          <w:lang w:val="en-ID" w:eastAsia="en-ID"/>
-          <w14:ligatures w14:val="standardContextual"/>
-        </w:rPr>
-      </w:pPr>
-      <w:hyperlink w:anchor="TOC_2_1_2_SUPPORTING_THEORY_TEORI_STIMUL" w:history="1">
-        <w:r>
-          <w:rPr>
-            <w:noProof/>
-            <w:color w:val="000000"/>
-          </w:rPr>
-          <w:t>2.1.2 Supporting Theory: Teori Stimulus-Organism-Response (S-O-R) &lt;a id="212-supporting-theory-teori-stimulus-organism-response-s-o-r"&gt;&lt;/a&gt;</w:t>
+          <w:t>2.1.1 Landasan Teoretis: Pendekatan Keuangan Perilaku (Behavioral Finance) &lt;a id="211-landasan-teoretis-pendekatan-keuangan-perilaku-behavioral-finance"&gt;&lt;/a&gt;</w:t>
         </w:r>
         <w:r>
           <w:rPr>
@@ -747,52 +700,16 @@
           <w:kern w:val="2"/>
           <w:sz w:val="24"/>
           <w:szCs w:val="24"/>
-          <w:lang w:val="en-ID" w:eastAsia="en-ID"/>
           <w14:ligatures w14:val="standardContextual"/>
         </w:rPr>
       </w:pPr>
-      <w:hyperlink w:anchor="TOC_2_1_3_SUPPORTING_THEORY_PSIKOLOGI_KO" w:history="1">
+      <w:hyperlink w:anchor="TOC_2_1_2_TEORI_STIMULUS_ORGANISM_RESPON" w:history="1">
         <w:r>
           <w:rPr>
             <w:noProof/>
             <w:color w:val="000000"/>
           </w:rPr>
-          <w:t>2.1.3 Supporting Theory: Psikologi Kolektor dan Collection-Goal Tipping Point Effect &lt;a id="213-supporting-theory-psikologi-kolektor-dan-collection-goal-tipping-point-effect"&gt;&lt;/a&gt;</w:t>
-        </w:r>
-        <w:r>
-          <w:rPr>
-            <w:noProof/>
-            <w:color w:val="000000"/>
-          </w:rPr>
-          <w:tab/>
-          <w:t>13</w:t>
-        </w:r>
-      </w:hyperlink>
-    </w:p>
-    <w:p>
-      <w:pPr>
-        <w:pStyle w:val="TOC3"/>
-        <w:tabs>
-          <w:tab w:val="right" w:leader="dot" w:pos="7927"/>
-        </w:tabs>
-        <w:rPr>
-          <w:rFonts w:asciiTheme="minorHAnsi" w:hAnsiTheme="minorHAnsi" w:cstheme="minorBidi"/>
-          <w:noProof/>
-          <w:color w:val="auto"/>
-          <w:kern w:val="2"/>
-          <w:sz w:val="24"/>
-          <w:szCs w:val="24"/>
-          <w:lang w:val="en-ID" w:eastAsia="en-ID"/>
-          <w14:ligatures w14:val="standardContextual"/>
-        </w:rPr>
-      </w:pPr>
-      <w:hyperlink w:anchor="TOC_2_1_4_SUPPORTING_THEORY_TEORI_REGULA" w:history="1">
-        <w:r>
-          <w:rPr>
-            <w:noProof/>
-            <w:color w:val="000000"/>
-          </w:rPr>
-          <w:t>2.1.4 Supporting Theory: Teori Regulasi Diri (Self-Regulation Theory) &lt;a id="214-supporting-theory-teori-regulasi-diri-self-regulation-theory"&gt;&lt;/a&gt;</w:t>
+          <w:t>2.1.2 Teori Stimulus-Organism-Response (S-O-R) &lt;a id="212-teori-stimulus-organism-response-s-o-r"&gt;&lt;/a&gt;</w:t>
         </w:r>
         <w:r>
           <w:rPr>
@@ -806,6 +723,74 @@
     </w:p>
     <w:p>
       <w:pPr>
+        <w:pStyle w:val="TOC3"/>
+        <w:tabs>
+          <w:tab w:val="right" w:leader="dot" w:pos="7927"/>
+        </w:tabs>
+        <w:rPr>
+          <w:rFonts w:asciiTheme="minorHAnsi" w:hAnsiTheme="minorHAnsi" w:cstheme="minorBidi"/>
+          <w:noProof/>
+          <w:color w:val="auto"/>
+          <w:kern w:val="2"/>
+          <w:sz w:val="24"/>
+          <w:szCs w:val="24"/>
+          <w14:ligatures w14:val="standardContextual"/>
+        </w:rPr>
+      </w:pPr>
+      <w:hyperlink w:anchor="TOC_2_1_3_PSIKOLOGI_KOLEKTOR_DAN_COLLECT" w:history="1">
+        <w:r>
+          <w:rPr>
+            <w:noProof/>
+            <w:color w:val="000000"/>
+          </w:rPr>
+          <w:t>2.1.3 Psikologi Kolektor dan Collection-Goal Tipping Point Effect &lt;a id="213-psikologi-kolektor-dan-collection-goal-tipping-point-effect"&gt;&lt;/a&gt;</w:t>
+        </w:r>
+        <w:r>
+          <w:rPr>
+            <w:noProof/>
+            <w:color w:val="000000"/>
+          </w:rPr>
+          <w:tab/>
+          <w:t>14</w:t>
+        </w:r>
+      </w:hyperlink>
+    </w:p>
+    <w:p>
+      <w:pPr>
+        <w:pStyle w:val="TOC3"/>
+        <w:tabs>
+          <w:tab w:val="right" w:leader="dot" w:pos="7927"/>
+        </w:tabs>
+        <w:rPr>
+          <w:rFonts w:asciiTheme="minorHAnsi" w:hAnsiTheme="minorHAnsi" w:cstheme="minorBidi"/>
+          <w:noProof/>
+          <w:color w:val="auto"/>
+          <w:kern w:val="2"/>
+          <w:sz w:val="24"/>
+          <w:szCs w:val="24"/>
+          <w14:ligatures w14:val="standardContextual"/>
+        </w:rPr>
+      </w:pPr>
+      <w:hyperlink w:anchor="TOC_2_1_4_TEORI_REGULASI_DIRI_SELF_REGUL" w:history="1">
+        <w:r>
+          <w:rPr>
+            <w:noProof/>
+            <w:color w:val="000000"/>
+          </w:rPr>
+          <w:t>2.1.4 Teori Regulasi Diri (Self-Regulation Theory) &lt;a id="214-teori-regulasi-diri-self-regulation-theory"&gt;&lt;/a&gt;</w:t>
+        </w:r>
+        <w:r>
+          <w:rPr>
+            <w:noProof/>
+            <w:color w:val="000000"/>
+          </w:rPr>
+          <w:tab/>
+          <w:t>15</w:t>
+        </w:r>
+      </w:hyperlink>
+    </w:p>
+    <w:p>
+      <w:pPr>
         <w:pStyle w:val="TOC2"/>
         <w:tabs>
           <w:tab w:val="right" w:leader="dot" w:pos="7927"/>
@@ -816,7 +801,6 @@
           <w:color w:val="auto"/>
           <w:kern w:val="2"/>
           <w:szCs w:val="24"/>
-          <w:lang w:val="en-ID" w:eastAsia="en-ID"/>
           <w14:ligatures w14:val="standardContextual"/>
         </w:rPr>
       </w:pPr>
@@ -834,7 +818,7 @@
             <w:color w:val="000000"/>
           </w:rPr>
           <w:tab/>
-          <w:t>14</w:t>
+          <w:t>15</w:t>
         </w:r>
       </w:hyperlink>
     </w:p>
@@ -851,7 +835,6 @@
           <w:kern w:val="2"/>
           <w:sz w:val="24"/>
           <w:szCs w:val="24"/>
-          <w:lang w:val="en-ID" w:eastAsia="en-ID"/>
           <w14:ligatures w14:val="standardContextual"/>
         </w:rPr>
       </w:pPr>
@@ -869,7 +852,7 @@
             <w:color w:val="000000"/>
           </w:rPr>
           <w:tab/>
-          <w:t>14</w:t>
+          <w:t>15</w:t>
         </w:r>
       </w:hyperlink>
     </w:p>
@@ -886,7 +869,6 @@
           <w:kern w:val="2"/>
           <w:sz w:val="24"/>
           <w:szCs w:val="24"/>
-          <w:lang w:val="en-ID" w:eastAsia="en-ID"/>
           <w14:ligatures w14:val="standardContextual"/>
         </w:rPr>
       </w:pPr>
@@ -904,7 +886,7 @@
             <w:color w:val="000000"/>
           </w:rPr>
           <w:tab/>
-          <w:t>14</w:t>
+          <w:t>15</w:t>
         </w:r>
       </w:hyperlink>
     </w:p>
@@ -921,7 +903,6 @@
           <w:kern w:val="2"/>
           <w:sz w:val="24"/>
           <w:szCs w:val="24"/>
-          <w:lang w:val="en-ID" w:eastAsia="en-ID"/>
           <w14:ligatures w14:val="standardContextual"/>
         </w:rPr>
       </w:pPr>
@@ -939,7 +920,7 @@
             <w:color w:val="000000"/>
           </w:rPr>
           <w:tab/>
-          <w:t>15</w:t>
+          <w:t>16</w:t>
         </w:r>
       </w:hyperlink>
     </w:p>
@@ -956,7 +937,6 @@
           <w:kern w:val="2"/>
           <w:sz w:val="24"/>
           <w:szCs w:val="24"/>
-          <w:lang w:val="en-ID" w:eastAsia="en-ID"/>
           <w14:ligatures w14:val="standardContextual"/>
         </w:rPr>
       </w:pPr>
@@ -974,7 +954,7 @@
             <w:color w:val="000000"/>
           </w:rPr>
           <w:tab/>
-          <w:t>15</w:t>
+          <w:t>16</w:t>
         </w:r>
       </w:hyperlink>
     </w:p>
@@ -991,7 +971,6 @@
           <w:kern w:val="2"/>
           <w:sz w:val="24"/>
           <w:szCs w:val="24"/>
-          <w:lang w:val="en-ID" w:eastAsia="en-ID"/>
           <w14:ligatures w14:val="standardContextual"/>
         </w:rPr>
       </w:pPr>
@@ -1024,7 +1003,7 @@
             <w:color w:val="000000"/>
           </w:rPr>
           <w:tab/>
-          <w:t>16</w:t>
+          <w:t>17</w:t>
         </w:r>
       </w:hyperlink>
     </w:p>
@@ -1040,7 +1019,6 @@
           <w:color w:val="auto"/>
           <w:kern w:val="2"/>
           <w:szCs w:val="24"/>
-          <w:lang w:val="en-ID" w:eastAsia="en-ID"/>
           <w14:ligatures w14:val="standardContextual"/>
         </w:rPr>
       </w:pPr>
@@ -1058,7 +1036,7 @@
             <w:color w:val="000000"/>
           </w:rPr>
           <w:tab/>
-          <w:t>16</w:t>
+          <w:t>17</w:t>
         </w:r>
       </w:hyperlink>
     </w:p>
@@ -1074,7 +1052,6 @@
           <w:color w:val="auto"/>
           <w:kern w:val="2"/>
           <w:szCs w:val="24"/>
-          <w:lang w:val="en-ID" w:eastAsia="en-ID"/>
           <w14:ligatures w14:val="standardContextual"/>
         </w:rPr>
       </w:pPr>
@@ -1092,7 +1069,7 @@
             <w:color w:val="000000"/>
           </w:rPr>
           <w:tab/>
-          <w:t>19</w:t>
+          <w:t>20</w:t>
         </w:r>
       </w:hyperlink>
     </w:p>
@@ -1109,7 +1086,6 @@
           <w:kern w:val="2"/>
           <w:sz w:val="24"/>
           <w:szCs w:val="24"/>
-          <w:lang w:val="en-ID" w:eastAsia="en-ID"/>
           <w14:ligatures w14:val="standardContextual"/>
         </w:rPr>
       </w:pPr>
@@ -1127,7 +1103,7 @@
             <w:color w:val="000000"/>
           </w:rPr>
           <w:tab/>
-          <w:t>19</w:t>
+          <w:t>20</w:t>
         </w:r>
       </w:hyperlink>
     </w:p>
@@ -1144,7 +1120,6 @@
           <w:kern w:val="2"/>
           <w:sz w:val="24"/>
           <w:szCs w:val="24"/>
-          <w:lang w:val="en-ID" w:eastAsia="en-ID"/>
           <w14:ligatures w14:val="standardContextual"/>
         </w:rPr>
       </w:pPr>
@@ -1162,7 +1137,7 @@
             <w:color w:val="000000"/>
           </w:rPr>
           <w:tab/>
-          <w:t>19</w:t>
+          <w:t>20</w:t>
         </w:r>
       </w:hyperlink>
     </w:p>
@@ -1179,7 +1154,6 @@
           <w:kern w:val="2"/>
           <w:sz w:val="24"/>
           <w:szCs w:val="24"/>
-          <w:lang w:val="en-ID" w:eastAsia="en-ID"/>
           <w14:ligatures w14:val="standardContextual"/>
         </w:rPr>
       </w:pPr>
@@ -1197,7 +1171,7 @@
             <w:color w:val="000000"/>
           </w:rPr>
           <w:tab/>
-          <w:t>20</w:t>
+          <w:t>21</w:t>
         </w:r>
       </w:hyperlink>
     </w:p>
@@ -1214,7 +1188,6 @@
           <w:kern w:val="2"/>
           <w:sz w:val="24"/>
           <w:szCs w:val="24"/>
-          <w:lang w:val="en-ID" w:eastAsia="en-ID"/>
           <w14:ligatures w14:val="standardContextual"/>
         </w:rPr>
       </w:pPr>
@@ -1232,7 +1205,7 @@
             <w:color w:val="000000"/>
           </w:rPr>
           <w:tab/>
-          <w:t>21</w:t>
+          <w:t>22</w:t>
         </w:r>
       </w:hyperlink>
     </w:p>
@@ -1249,7 +1222,6 @@
           <w:kern w:val="2"/>
           <w:sz w:val="24"/>
           <w:szCs w:val="24"/>
-          <w:lang w:val="en-ID" w:eastAsia="en-ID"/>
           <w14:ligatures w14:val="standardContextual"/>
         </w:rPr>
       </w:pPr>
@@ -1267,7 +1239,7 @@
             <w:color w:val="000000"/>
           </w:rPr>
           <w:tab/>
-          <w:t>22</w:t>
+          <w:t>23</w:t>
         </w:r>
       </w:hyperlink>
     </w:p>
@@ -1284,7 +1256,6 @@
           <w:kern w:val="2"/>
           <w:sz w:val="24"/>
           <w:szCs w:val="24"/>
-          <w:lang w:val="en-ID" w:eastAsia="en-ID"/>
           <w14:ligatures w14:val="standardContextual"/>
         </w:rPr>
       </w:pPr>
@@ -1302,7 +1273,7 @@
             <w:color w:val="000000"/>
           </w:rPr>
           <w:tab/>
-          <w:t>23</w:t>
+          <w:t>24</w:t>
         </w:r>
       </w:hyperlink>
     </w:p>
@@ -1318,7 +1289,6 @@
           <w:color w:val="auto"/>
           <w:kern w:val="2"/>
           <w:szCs w:val="24"/>
-          <w:lang w:val="en-ID" w:eastAsia="en-ID"/>
           <w14:ligatures w14:val="standardContextual"/>
         </w:rPr>
       </w:pPr>
@@ -1336,7 +1306,7 @@
             <w:color w:val="000000"/>
           </w:rPr>
           <w:tab/>
-          <w:t>24</w:t>
+          <w:t>25</w:t>
         </w:r>
       </w:hyperlink>
     </w:p>
@@ -1353,7 +1323,6 @@
           <w:color w:val="auto"/>
           <w:kern w:val="2"/>
           <w:szCs w:val="24"/>
-          <w:lang w:val="en-ID" w:eastAsia="en-ID"/>
           <w14:ligatures w14:val="standardContextual"/>
         </w:rPr>
       </w:pPr>
@@ -1371,7 +1340,7 @@
             <w:color w:val="000000"/>
           </w:rPr>
           <w:tab/>
-          <w:t>25</w:t>
+          <w:t>26</w:t>
         </w:r>
       </w:hyperlink>
     </w:p>
@@ -1387,7 +1356,6 @@
           <w:color w:val="auto"/>
           <w:kern w:val="2"/>
           <w:szCs w:val="24"/>
-          <w:lang w:val="en-ID" w:eastAsia="en-ID"/>
           <w14:ligatures w14:val="standardContextual"/>
         </w:rPr>
       </w:pPr>
@@ -1405,7 +1373,7 @@
             <w:color w:val="000000"/>
           </w:rPr>
           <w:tab/>
-          <w:t>25</w:t>
+          <w:t>26</w:t>
         </w:r>
       </w:hyperlink>
     </w:p>
@@ -1422,7 +1390,6 @@
           <w:kern w:val="2"/>
           <w:sz w:val="24"/>
           <w:szCs w:val="24"/>
-          <w:lang w:val="en-ID" w:eastAsia="en-ID"/>
           <w14:ligatures w14:val="standardContextual"/>
         </w:rPr>
       </w:pPr>
@@ -1440,7 +1407,7 @@
             <w:color w:val="000000"/>
           </w:rPr>
           <w:tab/>
-          <w:t>25</w:t>
+          <w:t>26</w:t>
         </w:r>
       </w:hyperlink>
     </w:p>
@@ -1456,7 +1423,6 @@
           <w:color w:val="auto"/>
           <w:kern w:val="2"/>
           <w:szCs w:val="24"/>
-          <w:lang w:val="en-ID" w:eastAsia="en-ID"/>
           <w14:ligatures w14:val="standardContextual"/>
         </w:rPr>
       </w:pPr>
@@ -1474,7 +1440,7 @@
             <w:color w:val="000000"/>
           </w:rPr>
           <w:tab/>
-          <w:t>26</w:t>
+          <w:t>27</w:t>
         </w:r>
       </w:hyperlink>
     </w:p>
@@ -1491,7 +1457,6 @@
           <w:kern w:val="2"/>
           <w:sz w:val="24"/>
           <w:szCs w:val="24"/>
-          <w:lang w:val="en-ID" w:eastAsia="en-ID"/>
           <w14:ligatures w14:val="standardContextual"/>
         </w:rPr>
       </w:pPr>
@@ -1509,7 +1474,7 @@
             <w:color w:val="000000"/>
           </w:rPr>
           <w:tab/>
-          <w:t>26</w:t>
+          <w:t>27</w:t>
         </w:r>
       </w:hyperlink>
     </w:p>
@@ -1526,7 +1491,6 @@
           <w:kern w:val="2"/>
           <w:sz w:val="24"/>
           <w:szCs w:val="24"/>
-          <w:lang w:val="en-ID" w:eastAsia="en-ID"/>
           <w14:ligatures w14:val="standardContextual"/>
         </w:rPr>
       </w:pPr>
@@ -1544,7 +1508,7 @@
             <w:color w:val="000000"/>
           </w:rPr>
           <w:tab/>
-          <w:t>27</w:t>
+          <w:t>28</w:t>
         </w:r>
       </w:hyperlink>
     </w:p>
@@ -1561,7 +1525,6 @@
           <w:kern w:val="2"/>
           <w:sz w:val="24"/>
           <w:szCs w:val="24"/>
-          <w:lang w:val="en-ID" w:eastAsia="en-ID"/>
           <w14:ligatures w14:val="standardContextual"/>
         </w:rPr>
       </w:pPr>
@@ -1579,7 +1542,7 @@
             <w:color w:val="000000"/>
           </w:rPr>
           <w:tab/>
-          <w:t>28</w:t>
+          <w:t>29</w:t>
         </w:r>
       </w:hyperlink>
     </w:p>
@@ -1596,7 +1559,6 @@
           <w:kern w:val="2"/>
           <w:sz w:val="24"/>
           <w:szCs w:val="24"/>
-          <w:lang w:val="en-ID" w:eastAsia="en-ID"/>
           <w14:ligatures w14:val="standardContextual"/>
         </w:rPr>
       </w:pPr>
@@ -1614,7 +1576,7 @@
             <w:color w:val="000000"/>
           </w:rPr>
           <w:tab/>
-          <w:t>29</w:t>
+          <w:t>30</w:t>
         </w:r>
       </w:hyperlink>
     </w:p>
@@ -1630,7 +1592,6 @@
           <w:color w:val="auto"/>
           <w:kern w:val="2"/>
           <w:szCs w:val="24"/>
-          <w:lang w:val="en-ID" w:eastAsia="en-ID"/>
           <w14:ligatures w14:val="standardContextual"/>
         </w:rPr>
       </w:pPr>
@@ -1648,7 +1609,7 @@
             <w:color w:val="000000"/>
           </w:rPr>
           <w:tab/>
-          <w:t>30</w:t>
+          <w:t>31</w:t>
         </w:r>
       </w:hyperlink>
     </w:p>
@@ -1664,7 +1625,6 @@
           <w:color w:val="auto"/>
           <w:kern w:val="2"/>
           <w:szCs w:val="24"/>
-          <w:lang w:val="en-ID" w:eastAsia="en-ID"/>
           <w14:ligatures w14:val="standardContextual"/>
         </w:rPr>
       </w:pPr>
@@ -1682,7 +1642,7 @@
             <w:color w:val="000000"/>
           </w:rPr>
           <w:tab/>
-          <w:t>31</w:t>
+          <w:t>32</w:t>
         </w:r>
       </w:hyperlink>
     </w:p>
@@ -1698,7 +1658,6 @@
           <w:color w:val="auto"/>
           <w:kern w:val="2"/>
           <w:szCs w:val="24"/>
-          <w:lang w:val="en-ID" w:eastAsia="en-ID"/>
           <w14:ligatures w14:val="standardContextual"/>
         </w:rPr>
       </w:pPr>
@@ -1716,7 +1675,7 @@
             <w:color w:val="000000"/>
           </w:rPr>
           <w:tab/>
-          <w:t>36</w:t>
+          <w:t>37</w:t>
         </w:r>
       </w:hyperlink>
     </w:p>
@@ -1733,7 +1692,6 @@
           <w:kern w:val="2"/>
           <w:sz w:val="24"/>
           <w:szCs w:val="24"/>
-          <w:lang w:val="en-ID" w:eastAsia="en-ID"/>
           <w14:ligatures w14:val="standardContextual"/>
         </w:rPr>
       </w:pPr>
@@ -1759,7 +1717,7 @@
             <w:color w:val="000000"/>
           </w:rPr>
           <w:tab/>
-          <w:t>36</w:t>
+          <w:t>37</w:t>
         </w:r>
       </w:hyperlink>
     </w:p>
@@ -1775,7 +1733,6 @@
           <w:color w:val="auto"/>
           <w:kern w:val="2"/>
           <w:szCs w:val="24"/>
-          <w:lang w:val="en-ID" w:eastAsia="en-ID"/>
           <w14:ligatures w14:val="standardContextual"/>
         </w:rPr>
       </w:pPr>
@@ -1793,7 +1750,7 @@
             <w:color w:val="000000"/>
           </w:rPr>
           <w:tab/>
-          <w:t>39</w:t>
+          <w:t>40</w:t>
         </w:r>
       </w:hyperlink>
     </w:p>
@@ -1809,7 +1766,6 @@
           <w:color w:val="auto"/>
           <w:kern w:val="2"/>
           <w:szCs w:val="24"/>
-          <w:lang w:val="en-ID" w:eastAsia="en-ID"/>
           <w14:ligatures w14:val="standardContextual"/>
         </w:rPr>
       </w:pPr>
@@ -1827,7 +1783,7 @@
             <w:color w:val="000000"/>
           </w:rPr>
           <w:tab/>
-          <w:t>40</w:t>
+          <w:t>41</w:t>
         </w:r>
       </w:hyperlink>
     </w:p>
@@ -1844,7 +1800,6 @@
           <w:color w:val="auto"/>
           <w:kern w:val="2"/>
           <w:szCs w:val="24"/>
-          <w:lang w:val="en-ID" w:eastAsia="en-ID"/>
           <w14:ligatures w14:val="standardContextual"/>
         </w:rPr>
       </w:pPr>
@@ -1862,7 +1817,7 @@
             <w:color w:val="000000"/>
           </w:rPr>
           <w:tab/>
-          <w:t>42</w:t>
+          <w:t>43</w:t>
         </w:r>
       </w:hyperlink>
     </w:p>
@@ -1873,7 +1828,7 @@
         <w:spacing w:after="360"/>
         <w:outlineLvl w:val="0"/>
       </w:pPr>
-      <w:bookmarkStart w:id="1" w:name="_Toc241178675"/>
+      <w:bookmarkStart w:id="1" w:name="_Toc241583764"/>
       <w:r>
         <w:rPr>
           <w:rFonts w:ascii="Times New Roman" w:hAnsi="Times New Roman"/>
@@ -1911,7 +1866,7 @@
             <w:b w:val="0"/>
           </w:rPr>
           <w:tab/>
-          <w:t>6</w:t>
+          <w:t>7</w:t>
         </w:r>
       </w:hyperlink>
     </w:p>
@@ -1940,7 +1895,7 @@
             <w:b w:val="0"/>
           </w:rPr>
           <w:tab/>
-          <w:t>14</w:t>
+          <w:t>15</w:t>
         </w:r>
       </w:hyperlink>
     </w:p>
@@ -1969,7 +1924,7 @@
             <w:b w:val="0"/>
           </w:rPr>
           <w:tab/>
-          <w:t>22</w:t>
+          <w:t>23</w:t>
         </w:r>
       </w:hyperlink>
     </w:p>
@@ -1998,7 +1953,7 @@
             <w:b w:val="0"/>
           </w:rPr>
           <w:tab/>
-          <w:t>28</w:t>
+          <w:t>29</w:t>
         </w:r>
       </w:hyperlink>
     </w:p>
@@ -2027,7 +1982,7 @@
             <w:b w:val="0"/>
           </w:rPr>
           <w:tab/>
-          <w:t>37</w:t>
+          <w:t>38</w:t>
         </w:r>
       </w:hyperlink>
     </w:p>
@@ -2039,7 +1994,7 @@
         <w:outlineLvl w:val="0"/>
       </w:pPr>
       <w:bookmarkStart w:id="2" w:name="TOC_DAFTAR_GAMBAR"/>
-      <w:bookmarkStart w:id="3" w:name="_Toc241178676"/>
+      <w:bookmarkStart w:id="3" w:name="_Toc241583765"/>
       <w:r>
         <w:rPr>
           <w:rFonts w:ascii="Times New Roman" w:hAnsi="Times New Roman"/>
@@ -2165,7 +2120,7 @@
             <w:b w:val="0"/>
           </w:rPr>
           <w:tab/>
-          <w:t>21</w:t>
+          <w:t>22</w:t>
         </w:r>
       </w:hyperlink>
     </w:p>
@@ -2194,7 +2149,7 @@
             <w:b w:val="0"/>
           </w:rPr>
           <w:tab/>
-          <w:t>35</w:t>
+          <w:t>36</w:t>
         </w:r>
       </w:hyperlink>
     </w:p>
@@ -2218,7 +2173,7 @@
         <w:outlineLvl w:val="0"/>
       </w:pPr>
       <w:bookmarkStart w:id="4" w:name="TOC_BAB_1_PENDAHULUAN_A_ID_BAB_1_PENDAHU"/>
-      <w:bookmarkStart w:id="5" w:name="_Toc241178677"/>
+      <w:bookmarkStart w:id="5" w:name="_Toc241583766"/>
       <w:r>
         <w:rPr>
           <w:rFonts w:ascii="Times New Roman" w:hAnsi="Times New Roman"/>
@@ -2256,7 +2211,7 @@
         <w:outlineLvl w:val="1"/>
       </w:pPr>
       <w:bookmarkStart w:id="6" w:name="TOC_1_1_LATAR_BELAKANG_PENELITIAN_A_ID_1"/>
-      <w:bookmarkStart w:id="7" w:name="_Toc241178678"/>
+      <w:bookmarkStart w:id="7" w:name="_Toc241583767"/>
       <w:r>
         <w:rPr>
           <w:rFonts w:ascii="Times New Roman" w:hAnsi="Times New Roman"/>
@@ -2304,7 +2259,7 @@
           <w:noProof/>
         </w:rPr>
         <w:drawing>
-          <wp:inline distT="0" distB="0" distL="0" distR="0" wp14:anchorId="02CBD26C" wp14:editId="6054309B">
+          <wp:inline distT="0" distB="0" distL="0" distR="0" wp14:anchorId="7017CC75" wp14:editId="5C0BAAB3">
             <wp:extent cx="4860000" cy="2980356"/>
             <wp:effectExtent l="0" t="0" r="0" b="0"/>
             <wp:docPr id="2" name="Picture 2"/>
@@ -2380,21 +2335,21 @@
         <w:rPr>
           <w:rFonts w:cs="Times New Roman"/>
         </w:rPr>
-        <w:t>Sebagaimana ditunjukkan pada Gambar 1.1, Pokémon menempati posisi puncak sebagai waralaba media nomor satu di dunia dengan total pendapatan melampaui US$ 100,0 miliar ([Statista, 2021](#ref-statista2021)). Bukti empiris ini mengonfirmasi bahwa Pokémon bukan sekadar hiburan musiman anak-anak, melainkan entitas komersial ra</w:t>
+        <w:t xml:space="preserve">Sebagaimana ditunjukkan pada Gambar 1.1, Pokémon menempati posisi puncak sebagai waralaba media nomor satu di dunia dengan total pendapatan melampaui US$ 100,0 miliar ([Statista, 2021](#ref-statista2021)). Bukti empiris ini mengonfirmasi bahwa Pokémon bukan sekadar hiburan musiman anak-anak, melainkan entitas komersial </w:t>
       </w:r>
       <w:r>
         <w:rPr>
           <w:rFonts w:cs="Times New Roman"/>
         </w:rPr>
         <w:lastRenderedPageBreak/>
-        <w:t>ks</w:t>
+        <w:t>ra</w:t>
       </w:r>
       <w:r>
         <w:rPr>
           <w:rFonts w:cs="Times New Roman"/>
         </w:rPr>
         <w:lastRenderedPageBreak/>
-        <w:t>asa dengan basis perputaran kapital lintas generasi yang sangat kokoh.</w:t>
+        <w:t>ksasa dengan basis perputaran kapital lintas generasi yang sangat kokoh.</w:t>
       </w:r>
     </w:p>
     <w:p>
@@ -2407,7 +2362,7 @@
           <w:noProof/>
         </w:rPr>
         <w:drawing>
-          <wp:inline distT="0" distB="0" distL="0" distR="0" wp14:anchorId="18D98D12" wp14:editId="6D059F16">
+          <wp:inline distT="0" distB="0" distL="0" distR="0" wp14:anchorId="46A07B28" wp14:editId="15A1771D">
             <wp:extent cx="4860000" cy="2719286"/>
             <wp:effectExtent l="0" t="0" r="0" b="0"/>
             <wp:docPr id="3" name="Picture 3"/>
@@ -2589,7 +2544,7 @@
           <w:noProof/>
         </w:rPr>
         <w:drawing>
-          <wp:inline distT="0" distB="0" distL="0" distR="0" wp14:anchorId="0BB50E00" wp14:editId="3BE6C4FB">
+          <wp:inline distT="0" distB="0" distL="0" distR="0" wp14:anchorId="6E63553F" wp14:editId="73CA3730">
             <wp:extent cx="4860000" cy="2818800"/>
             <wp:effectExtent l="0" t="0" r="0" b="0"/>
             <wp:docPr id="4" name="Picture 4"/>
@@ -2791,16 +2746,16 @@
         </w:rPr>
         <w:t>Literatur menunjukkan pembelian impulsif dipengaruhi anteseden luas ([Stern, 1962](#ref-stern1962); [Rook, 1987](#ref-rook1987); [</w:t>
       </w:r>
-      <w:hyperlink w:anchor="Ref_beatty1998impulse" w:history="1">
+      <w:hyperlink w:anchor="Ref_iyer2020impulse" w:history="1">
         <w:r>
-          <w:t>Beatty dan Ferrell, 1998</w:t>
+          <w:t>Iyer et al., 2020</w:t>
         </w:r>
       </w:hyperlink>
       <w:r>
         <w:rPr>
           <w:rFonts w:cs="Times New Roman"/>
         </w:rPr>
-        <w:t>](#ref-beatty1998); [</w:t>
+        <w:t>](#ref-iyer2020); [</w:t>
       </w:r>
       <w:hyperlink w:anchor="Ref_amos2014meta" w:history="1">
         <w:r>
@@ -2879,16 +2834,16 @@
         </w:rPr>
         <w:t>](#ref-baur2018); [Colline, 2024](#ref-colline2024)); serta (4) situasional, seperti display kasir dan kelangkaan stok ([</w:t>
       </w:r>
-      <w:hyperlink w:anchor="Ref_peck2006if" w:history="1">
+      <w:hyperlink w:anchor="Ref_qu2023impulse" w:history="1">
         <w:r>
-          <w:t>Peck dan Childers, 2006</w:t>
+          <w:t>Qu et al., 2023</w:t>
         </w:r>
       </w:hyperlink>
       <w:r>
         <w:rPr>
           <w:rFonts w:cs="Times New Roman"/>
         </w:rPr>
-        <w:t>](#ref-peck2006); [</w:t>
+        <w:t>](#ref-qu2023); [</w:t>
       </w:r>
       <w:hyperlink w:anchor="Ref_amos2014meta" w:history="1">
         <w:r>
@@ -2913,6 +2868,77 @@
           <w:rFonts w:cs="Times New Roman"/>
         </w:rPr>
         <w:t>Dari pemetaan tersebut, penelitian ini memfokuskan tiga variabel yang paling mewakili karakteristik kartu Pokémon TCG: X₁ (afektif: sensasi hiburan merobek kemasan), X₂ (kolektor: ketegangan slot binder yang kosong), dan X₃ (pasar: harapan capital gain dari likuiditas sekunder dan grading). Perumusan instrumen dan pengujiannya diuraikan pada Bab 2 dan Bab 3.</w:t>
+      </w:r>
+    </w:p>
+    <w:p>
+      <w:pPr>
+        <w:spacing w:after="0" w:line="360" w:lineRule="auto"/>
+        <w:ind w:firstLine="709"/>
+        <w:jc w:val="both"/>
+      </w:pPr>
+      <w:r>
+        <w:rPr>
+          <w:rFonts w:cs="Times New Roman"/>
+        </w:rPr>
+        <w:t>Untuk memahami bagaimana ketiga dorongan tersebut bekerja secara konkret dalam pengalaman sehari-hari konsumen kartu Pokémon TCG, bayangkan skenario berikut. Seorang mahasiswa memasuki gerai minimarket tanpa rencana membeli kartu. Namun, saat berdiri di depan kasir, pandangannya tertuju pada display kemasan booster pack berwarna mencolok seharga Rp20.000. Baginya, membeli satu bungkus bukan sekadar membeli lima lembar kertas bergambar, melainkan membeli sensasi kejutan (unboxing thrill): luapan dopamin saat</w:t>
+      </w:r>
+      <w:r>
+        <w:rPr>
+          <w:rFonts w:cs="Times New Roman"/>
+        </w:rPr>
+        <w:t xml:space="preserve"> merobek kemasan foil acak dan berharap menemukan kartu langka di dalamnya. Dorongan mencari kesenangan emosional inilah yang dalam penelitian ini disebut Hedonic Motivation (X₁).</w:t>
+      </w:r>
+    </w:p>
+    <w:p>
+      <w:pPr>
+        <w:spacing w:after="0" w:line="360" w:lineRule="auto"/>
+        <w:ind w:firstLine="709"/>
+        <w:jc w:val="both"/>
+      </w:pPr>
+      <w:r>
+        <w:rPr>
+          <w:rFonts w:cs="Times New Roman"/>
+        </w:rPr>
+        <w:lastRenderedPageBreak/>
+        <w:t>Sensasi tersebut tidak berhenti pada satu bungkus. Setiap kartu memiliki nomor urut seri (misalnya No. 001 sampai No. 150). Ketika dimasukkan ke dalam album koleksi (binder), konsumen melihat dua atau tiga slot kosong di antara deretan kartu yang sudah terkumpul. Celah tersebut menciptakan ketegangan kognitif — perasaan tidak nyaman karena koleksi belum lengkap — yang dalam psikologi dikenal sebagai Zeigarnik Effect ([Zeigarnik, 1927](#ref-zeigarnik1927)). Tekanan mental ini mendorong hasrat membeli kemasan</w:t>
+      </w:r>
+      <w:r>
+        <w:rPr>
+          <w:rFonts w:cs="Times New Roman"/>
+        </w:rPr>
+        <w:t xml:space="preserve"> baru demi menutup slot yang kosong, sebuah dorongan yang penelitian ini sebut Desire for Completeness (X₂).</w:t>
+      </w:r>
+    </w:p>
+    <w:p>
+      <w:pPr>
+        <w:spacing w:after="0" w:line="360" w:lineRule="auto"/>
+        <w:ind w:firstLine="709"/>
+        <w:jc w:val="both"/>
+      </w:pPr>
+      <w:r>
+        <w:rPr>
+          <w:rFonts w:cs="Times New Roman"/>
+        </w:rPr>
+        <w:t>Di sisi lain, konsumen juga mengetahui bahwa kartu bergambar langka (Secret Rare) yang berkondisi sempurna dan disertifikasi PSA 10 Gem Mint harganya melonjak drastis di pasar sekunder — dari modal Rp20.000 per bungkus, kartu bisa terjual jutaan rupiah per lembar (lih. disparitas harga pada Gambar 1.3). Fenomena ini menciptakan ilusi optimisme bahwa setiap kemasan menyimpan potensi "harta karun" finansial, memicu apa yang disebut Speculative Motive (X₃). Ketika ketiga dorongan ini hadir bersamaan — kesenang</w:t>
+      </w:r>
+      <w:r>
+        <w:rPr>
+          <w:rFonts w:cs="Times New Roman"/>
+        </w:rPr>
+        <w:t>an merobek kemasan, obsesi melengkapi koleksi, dan godaan keuntungan spekulatif — pertimbangan rasional lumpuh, dan terjadilah keputusan belanja seketika tanpa perencanaan yang disebut pembelian impulsif (Impulsive Buying / Y). Di sinilah Self-Control (</w:t>
+      </w:r>
+      <w:r>
+        <w:rPr>
+          <w:rFonts w:cs="Times New Roman"/>
+          <w:i/>
+        </w:rPr>
+        <w:t>M*</w:t>
+      </w:r>
+      <w:r>
+        <w:rPr>
+          <w:rFonts w:cs="Times New Roman"/>
+        </w:rPr>
+        <w:t>) memainkan peran krusial sebagai rem volisional: konsumen dengan regulasi diri yang kuat mampu mengabaikan godaan visual kemasan dan menahan dorongan emosional belanja spontan, sedangkan mereka yang lemah regulasi dirinya akan menyerah pada ledakan transaksi berulang tanpa kendali.</w:t>
       </w:r>
     </w:p>
     <w:p>
@@ -3434,25 +3460,12 @@
             <w:pPr>
               <w:spacing w:after="0"/>
             </w:pPr>
-            <w:hyperlink w:anchor="Ref_long2000consuming" w:history="1">
-              <w:r>
-                <w:rPr>
-                  <w:rFonts w:cs="Times New Roman"/>
-                  <w:sz w:val="18"/>
-                </w:rPr>
-                <w:t>Long dan Schiffman (2000)</w:t>
-              </w:r>
-            </w:hyperlink>
-            <w:r>
-              <w:t xml:space="preserve">; </w:t>
-            </w:r>
-            <w:hyperlink w:anchor="Ref_spero2004approach" w:history="1">
-              <w:r>
-                <w:t>Spero dan Stone (2004)</w:t>
-              </w:r>
-            </w:hyperlink>
-            <w:r>
-              <w:t xml:space="preserve"> (kolektor matang pilih single; bukan temuan tidak signifikan).</w:t>
+            <w:r>
+              <w:rPr>
+                <w:rFonts w:cs="Times New Roman"/>
+                <w:sz w:val="18"/>
+              </w:rPr>
+              <w:t>Long dan Schiffman (2000); Spero dan Stone (2004) (kolektor matang pilih single; bukan temuan tidak signifikan).</w:t>
             </w:r>
           </w:p>
         </w:tc>
@@ -3820,7 +3833,6 @@
                 <w:rFonts w:cs="Times New Roman"/>
                 <w:sz w:val="18"/>
               </w:rPr>
-              <w:lastRenderedPageBreak/>
               <w:t>5</w:t>
             </w:r>
           </w:p>
@@ -3972,6 +3984,7 @@
                 <w:rFonts w:cs="Times New Roman"/>
                 <w:sz w:val="18"/>
               </w:rPr>
+              <w:lastRenderedPageBreak/>
               <w:t>6</w:t>
             </w:r>
           </w:p>
@@ -4347,14 +4360,7 @@
         <w:rPr>
           <w:rFonts w:cs="Times New Roman"/>
         </w:rPr>
-        <w:t xml:space="preserve">Berdasarkan latar belakang permasalahan, urgensi empiris, dan kebaruan konseptual tersebut, penelitian ini memiliki orisinalitas tinggi dalam ranah manajemen keuangan perilaku dan perilaku konsumen di Indonesia. Berlandaskan seluruh uraian di atas, peneliti menetapkan judul skripsi: “PENGARUH HEDONIC MOTIVATION, DESIRE FOR COMPLETENESS, DAN </w:t>
-      </w:r>
-      <w:r>
-        <w:rPr>
-          <w:rFonts w:cs="Times New Roman"/>
-        </w:rPr>
-        <w:lastRenderedPageBreak/>
-        <w:t>SPECULATIVE MOTIVE TERHADAP IMPULSIVE BUYING BOOSTER PACK KARTU POKÉMON TCG DENGAN SELF-CONTROL SEBAGAI VARIABEL MODERASI”.</w:t>
+        <w:t>Berdasarkan latar belakang permasalahan, urgensi empiris, dan kebaruan konseptual tersebut, penelitian ini memiliki orisinalitas tinggi dalam ranah manajemen keuangan perilaku dan perilaku konsumen di Indonesia. Berlandaskan seluruh uraian di atas, peneliti menetapkan judul skripsi: “PENGARUH HEDONIC MOTIVATION, DESIRE FOR COMPLETENESS, DAN SPECULATIVE MOTIVE TERHADAP IMPULSIVE BUYING BOOSTER PACK KARTU POKÉMON TCG DENGAN SELF-CONTROL SEBAGAI VARIABEL MODERASI”.</w:t>
       </w:r>
     </w:p>
     <w:p>
@@ -4363,7 +4369,7 @@
         <w:outlineLvl w:val="1"/>
       </w:pPr>
       <w:bookmarkStart w:id="12" w:name="TOC_1_2_PERUMUSAN_MASALAH_A_ID_12_PERUMU"/>
-      <w:bookmarkStart w:id="13" w:name="_Toc241178679"/>
+      <w:bookmarkStart w:id="13" w:name="_Toc241583768"/>
       <w:r>
         <w:rPr>
           <w:rFonts w:ascii="Times New Roman" w:hAnsi="Times New Roman"/>
@@ -4371,6 +4377,7 @@
           <w:color w:val="000000"/>
           <w:sz w:val="24"/>
         </w:rPr>
+        <w:lastRenderedPageBreak/>
         <w:t>1.2 Perumusan Masalah &lt;a id="12-perumusan-masalah"&gt;&lt;/a&gt;</w:t>
       </w:r>
       <w:bookmarkEnd w:id="12"/>
@@ -4515,7 +4522,7 @@
         <w:outlineLvl w:val="1"/>
       </w:pPr>
       <w:bookmarkStart w:id="14" w:name="TOC_1_3_TUJUAN_PENELITIAN_A_ID_13_TUJUAN"/>
-      <w:bookmarkStart w:id="15" w:name="_Toc241178680"/>
+      <w:bookmarkStart w:id="15" w:name="_Toc241583769"/>
       <w:r>
         <w:rPr>
           <w:rFonts w:ascii="Times New Roman" w:hAnsi="Times New Roman"/>
@@ -4612,7 +4619,6 @@
           <w:rFonts w:cs="Times New Roman"/>
           <w:b/>
         </w:rPr>
-        <w:lastRenderedPageBreak/>
         <w:t xml:space="preserve">4.  </w:t>
       </w:r>
       <w:r>
@@ -4633,6 +4639,7 @@
           <w:rFonts w:cs="Times New Roman"/>
           <w:b/>
         </w:rPr>
+        <w:lastRenderedPageBreak/>
         <w:t xml:space="preserve">5.  </w:t>
       </w:r>
       <w:r>
@@ -4668,7 +4675,7 @@
         <w:outlineLvl w:val="1"/>
       </w:pPr>
       <w:bookmarkStart w:id="16" w:name="TOC_1_4_MANFAAT_PENELITIAN_A_ID_14_MANFA"/>
-      <w:bookmarkStart w:id="17" w:name="_Toc241178681"/>
+      <w:bookmarkStart w:id="17" w:name="_Toc241583770"/>
       <w:r>
         <w:rPr>
           <w:rFonts w:ascii="Times New Roman" w:hAnsi="Times New Roman"/>
@@ -4700,7 +4707,7 @@
         <w:outlineLvl w:val="2"/>
       </w:pPr>
       <w:bookmarkStart w:id="18" w:name="TOC_1_4_1_MANFAAT_TEORETIS_A_ID_141_MANF"/>
-      <w:bookmarkStart w:id="19" w:name="_Toc241178682"/>
+      <w:bookmarkStart w:id="19" w:name="_Toc241583771"/>
       <w:r>
         <w:rPr>
           <w:rFonts w:ascii="Times New Roman" w:hAnsi="Times New Roman"/>
@@ -4812,7 +4819,7 @@
         <w:outlineLvl w:val="2"/>
       </w:pPr>
       <w:bookmarkStart w:id="20" w:name="TOC_1_4_2_MANFAAT_PRAKTIS_A_ID_142_MANFA"/>
-      <w:bookmarkStart w:id="21" w:name="_Toc241178683"/>
+      <w:bookmarkStart w:id="21" w:name="_Toc241583772"/>
       <w:r>
         <w:rPr>
           <w:rFonts w:ascii="Times New Roman" w:hAnsi="Times New Roman"/>
@@ -4820,7 +4827,6 @@
           <w:color w:val="000000"/>
           <w:sz w:val="24"/>
         </w:rPr>
-        <w:lastRenderedPageBreak/>
         <w:t>1.4.2 Manfaat Praktis &lt;a id="142-manfaat-praktis"&gt;&lt;/a&gt;</w:t>
       </w:r>
       <w:bookmarkEnd w:id="20"/>
@@ -4843,7 +4849,14 @@
         <w:rPr>
           <w:rFonts w:cs="Times New Roman"/>
         </w:rPr>
-        <w:t>Bagi Konsumen dan Kolektor Pokémon TCG: Memberikan kesadaran kritis dan evaluasi diri bagi para kolektor (khususnya mahasiswa dan Generasi Z) agar lebih mengenali bias emosional dan ilusi spekulasi finansial dalam hobi kartu, sehingga mampu mengoptimalkan kontrol diri dan menjaga kesehatan keuangan pribadi.</w:t>
+        <w:t xml:space="preserve">Bagi Konsumen dan Kolektor Pokémon TCG: Memberikan kesadaran kritis dan evaluasi diri bagi para kolektor (khususnya mahasiswa dan Generasi Z) agar lebih mengenali bias emosional dan ilusi spekulasi </w:t>
+      </w:r>
+      <w:r>
+        <w:rPr>
+          <w:rFonts w:cs="Times New Roman"/>
+        </w:rPr>
+        <w:lastRenderedPageBreak/>
+        <w:t>finansial dalam hobi kartu, sehingga mampu mengoptimalkan kontrol diri dan menjaga kesehatan keuangan pribadi.</w:t>
       </w:r>
     </w:p>
     <w:p>
@@ -4948,7 +4961,7 @@
         <w:outlineLvl w:val="0"/>
       </w:pPr>
       <w:bookmarkStart w:id="22" w:name="TOC_BAB_2_KAJIAN_PUSTAKA_DAN_PENGEMBANGA"/>
-      <w:bookmarkStart w:id="23" w:name="_Toc241178684"/>
+      <w:bookmarkStart w:id="23" w:name="_Toc241583773"/>
       <w:r>
         <w:rPr>
           <w:rFonts w:ascii="Times New Roman" w:hAnsi="Times New Roman"/>
@@ -4986,7 +4999,7 @@
         <w:outlineLvl w:val="1"/>
       </w:pPr>
       <w:bookmarkStart w:id="24" w:name="TOC_2_1_LANDASAN_TEORI_A_ID_21_LANDASAN_"/>
-      <w:bookmarkStart w:id="25" w:name="_Toc241178685"/>
+      <w:bookmarkStart w:id="25" w:name="_Toc241583774"/>
       <w:r>
         <w:rPr>
           <w:rFonts w:ascii="Times New Roman" w:hAnsi="Times New Roman"/>
@@ -5004,8 +5017,8 @@
         <w:pStyle w:val="Heading3"/>
         <w:outlineLvl w:val="2"/>
       </w:pPr>
-      <w:bookmarkStart w:id="26" w:name="TOC_2_1_1_GRAND_THEORY_KEUANGAN_PERILAKU"/>
-      <w:bookmarkStart w:id="27" w:name="_Toc241178686"/>
+      <w:bookmarkStart w:id="26" w:name="TOC_2_1_1_LANDASAN_TEORETIS_PENDEKATAN_K"/>
+      <w:bookmarkStart w:id="27" w:name="_Toc241583775"/>
       <w:r>
         <w:rPr>
           <w:rFonts w:ascii="Times New Roman" w:hAnsi="Times New Roman"/>
@@ -5013,7 +5026,7 @@
           <w:color w:val="000000"/>
           <w:sz w:val="24"/>
         </w:rPr>
-        <w:t>2.1.1 Grand Theory: Keuangan Perilaku (Behavioral Finance) &lt;a id="211-grand-theory-keuangan-perilaku-behavioral-finance"&gt;&lt;/a&gt;</w:t>
+        <w:t>2.1.1 Landasan Teoretis: Pendekatan Keuangan Perilaku (Behavioral Finance) &lt;a id="211-landasan-teoretis-pendekatan-keuangan-perilaku-behavioral-finance"&gt;&lt;/a&gt;</w:t>
       </w:r>
       <w:bookmarkEnd w:id="26"/>
       <w:bookmarkEnd w:id="27"/>
@@ -5028,7 +5041,7 @@
         <w:rPr>
           <w:rFonts w:cs="Times New Roman"/>
         </w:rPr>
-        <w:t xml:space="preserve">Teori utama (grand theory) yang dipakai adalah Keuangan Perilaku (Behavioral Finance). Teori keuangan neoklasik tradisional berasumsi bahwa pelaku ekonomi merupakan makhluk yang sepenuhnya rasional (homo economicus) yang selalu memaksimalkan utilitas dan memproses informasi secara efisien ([Fama, 1970](#ref-fama1970)). Namun, </w:t>
+        <w:t xml:space="preserve">Penelitian ini berpijak pada pendekatan Keuangan Perilaku (Behavioral Finance) sebagai kerangka teoretis utama. Teori keuangan neoklasik tradisional berasumsi bahwa pelaku ekonomi merupakan makhluk yang sepenuhnya rasional (homo economicus) yang selalu memaksimalkan utilitas dan memproses informasi secara efisien ([Fama, 1970](#ref-fama1970)). Namun, </w:t>
       </w:r>
       <w:hyperlink w:anchor="Ref_simon1955behavioral" w:history="1">
         <w:r>
@@ -5106,14 +5119,14 @@
         <w:rPr>
           <w:rFonts w:cs="Times New Roman"/>
         </w:rPr>
-        <w:t xml:space="preserve">Dalam konteks kartu Pokémon TCG, Behavioral Finance memberikan landasan eksplanatif yang solid. Kartu Pokémon fisik telah bertransformasi menjadi instrumen aset alternatif yang sarat dengan bias perilaku keuangan: ilusi probabilitas menarik kartu Gem Mint 10 bernilai jutaan rupiah dari kemasan </w:t>
+        <w:t xml:space="preserve">Dalam konteks kartu Pokémon TCG, Behavioral Finance memberikan landasan eksplanatif yang solid. Kartu Pokémon fisik telah bertransformasi menjadi instrumen aset alternatif yang sarat dengan bias perilaku keuangan: ilusi </w:t>
       </w:r>
       <w:r>
         <w:rPr>
           <w:rFonts w:cs="Times New Roman"/>
         </w:rPr>
         <w:lastRenderedPageBreak/>
-        <w:t>murah, godaan kepuasan instan merobek bungkus kemasan, serta antusiasme spekulatif yang mengabaikan ketersediaan anggaran pribadi.</w:t>
+        <w:t>probabilitas menarik kartu Gem Mint 10 bernilai jutaan rupiah dari kemasan murah, godaan kepuasan instan merobek bungkus kemasan, serta antusiasme spekulatif yang mengabaikan ketersediaan anggaran pribadi.</w:t>
       </w:r>
     </w:p>
     <w:p>
@@ -5121,8 +5134,8 @@
         <w:pStyle w:val="Heading3"/>
         <w:outlineLvl w:val="2"/>
       </w:pPr>
-      <w:bookmarkStart w:id="28" w:name="TOC_2_1_2_SUPPORTING_THEORY_TEORI_STIMUL"/>
-      <w:bookmarkStart w:id="29" w:name="_Toc241178687"/>
+      <w:bookmarkStart w:id="28" w:name="TOC_2_1_2_TEORI_STIMULUS_ORGANISM_RESPON"/>
+      <w:bookmarkStart w:id="29" w:name="_Toc241583776"/>
       <w:r>
         <w:rPr>
           <w:rFonts w:ascii="Times New Roman" w:hAnsi="Times New Roman"/>
@@ -5130,7 +5143,7 @@
           <w:color w:val="000000"/>
           <w:sz w:val="24"/>
         </w:rPr>
-        <w:t>2.1.2 Supporting Theory: Teori Stimulus-Organism-Response (S-O-R) &lt;a id="212-supporting-theory-teori-stimulus-organism-response-s-o-r"&gt;&lt;/a&gt;</w:t>
+        <w:t>2.1.2 Teori Stimulus-Organism-Response (S-O-R) &lt;a id="212-teori-stimulus-organism-response-s-o-r"&gt;&lt;/a&gt;</w:t>
       </w:r>
       <w:bookmarkEnd w:id="28"/>
       <w:bookmarkEnd w:id="29"/>
@@ -5237,8 +5250,8 @@
         <w:pStyle w:val="Heading3"/>
         <w:outlineLvl w:val="2"/>
       </w:pPr>
-      <w:bookmarkStart w:id="30" w:name="TOC_2_1_3_SUPPORTING_THEORY_PSIKOLOGI_KO"/>
-      <w:bookmarkStart w:id="31" w:name="_Toc241178688"/>
+      <w:bookmarkStart w:id="30" w:name="TOC_2_1_3_PSIKOLOGI_KOLEKTOR_DAN_COLLECT"/>
+      <w:bookmarkStart w:id="31" w:name="_Toc241583777"/>
       <w:r>
         <w:rPr>
           <w:rFonts w:ascii="Times New Roman" w:hAnsi="Times New Roman"/>
@@ -5246,7 +5259,7 @@
           <w:color w:val="000000"/>
           <w:sz w:val="24"/>
         </w:rPr>
-        <w:t>2.1.3 Supporting Theory: Psikologi Kolektor dan Collection-Goal Tipping Point Effect &lt;a id="213-supporting-theory-psikologi-kolektor-dan-collection-goal-tipping-point-effect"&gt;&lt;/a&gt;</w:t>
+        <w:t>2.1.3 Psikologi Kolektor dan Collection-Goal Tipping Point Effect &lt;a id="213-psikologi-kolektor-dan-collection-goal-tipping-point-effect"&gt;&lt;/a&gt;</w:t>
       </w:r>
       <w:bookmarkEnd w:id="30"/>
       <w:bookmarkEnd w:id="31"/>
@@ -5298,8 +5311,8 @@
         <w:pStyle w:val="Heading3"/>
         <w:outlineLvl w:val="2"/>
       </w:pPr>
-      <w:bookmarkStart w:id="32" w:name="TOC_2_1_4_SUPPORTING_THEORY_TEORI_REGULA"/>
-      <w:bookmarkStart w:id="33" w:name="_Toc241178689"/>
+      <w:bookmarkStart w:id="32" w:name="TOC_2_1_4_TEORI_REGULASI_DIRI_SELF_REGUL"/>
+      <w:bookmarkStart w:id="33" w:name="_Toc241583778"/>
       <w:r>
         <w:rPr>
           <w:rFonts w:ascii="Times New Roman" w:hAnsi="Times New Roman"/>
@@ -5307,7 +5320,7 @@
           <w:color w:val="000000"/>
           <w:sz w:val="24"/>
         </w:rPr>
-        <w:t>2.1.4 Supporting Theory: Teori Regulasi Diri (Self-Regulation Theory) &lt;a id="214-supporting-theory-teori-regulasi-diri-self-regulation-theory"&gt;&lt;/a&gt;</w:t>
+        <w:t>2.1.4 Teori Regulasi Diri (Self-Regulation Theory) &lt;a id="214-teori-regulasi-diri-self-regulation-theory"&gt;&lt;/a&gt;</w:t>
       </w:r>
       <w:bookmarkEnd w:id="32"/>
       <w:bookmarkEnd w:id="33"/>
@@ -5353,7 +5366,7 @@
         <w:outlineLvl w:val="1"/>
       </w:pPr>
       <w:bookmarkStart w:id="34" w:name="TOC_2_2_KAJIAN_VARIABEL_PENELITIAN_A_ID_"/>
-      <w:bookmarkStart w:id="35" w:name="_Toc241178690"/>
+      <w:bookmarkStart w:id="35" w:name="_Toc241583779"/>
       <w:r>
         <w:rPr>
           <w:rFonts w:ascii="Times New Roman" w:hAnsi="Times New Roman"/>
@@ -5372,7 +5385,7 @@
         <w:outlineLvl w:val="2"/>
       </w:pPr>
       <w:bookmarkStart w:id="36" w:name="TOC_2_2_1_VARIABEL_DEPENDEN_Y_IMPULSIVE_"/>
-      <w:bookmarkStart w:id="37" w:name="_Toc241178691"/>
+      <w:bookmarkStart w:id="37" w:name="_Toc241583780"/>
       <w:r>
         <w:rPr>
           <w:rFonts w:ascii="Times New Roman" w:hAnsi="Times New Roman"/>
@@ -5437,7 +5450,7 @@
         <w:outlineLvl w:val="2"/>
       </w:pPr>
       <w:bookmarkStart w:id="38" w:name="TOC_2_2_2_VARIABEL_INDEPENDEN_X₁_HEDONIC"/>
-      <w:bookmarkStart w:id="39" w:name="_Toc241178692"/>
+      <w:bookmarkStart w:id="39" w:name="_Toc241583781"/>
       <w:r>
         <w:rPr>
           <w:rFonts w:ascii="Times New Roman" w:hAnsi="Times New Roman"/>
@@ -5515,7 +5528,7 @@
         <w:outlineLvl w:val="2"/>
       </w:pPr>
       <w:bookmarkStart w:id="40" w:name="TOC_2_2_3_VARIABEL_INDEPENDEN_X₂_DESIRE_"/>
-      <w:bookmarkStart w:id="41" w:name="_Toc241178693"/>
+      <w:bookmarkStart w:id="41" w:name="_Toc241583782"/>
       <w:r>
         <w:rPr>
           <w:rFonts w:ascii="Times New Roman" w:hAnsi="Times New Roman"/>
@@ -5569,7 +5582,7 @@
         <w:outlineLvl w:val="2"/>
       </w:pPr>
       <w:bookmarkStart w:id="42" w:name="TOC_2_2_4_VARIABEL_INDEPENDEN_X₃_SPECULA"/>
-      <w:bookmarkStart w:id="43" w:name="_Toc241178694"/>
+      <w:bookmarkStart w:id="43" w:name="_Toc241583783"/>
       <w:r>
         <w:rPr>
           <w:rFonts w:ascii="Times New Roman" w:hAnsi="Times New Roman"/>
@@ -5643,7 +5656,7 @@
         <w:outlineLvl w:val="2"/>
       </w:pPr>
       <w:bookmarkStart w:id="44" w:name="TOC_2_2_5_VARIABEL_MODERASI_M_SELF_CONTR"/>
-      <w:bookmarkStart w:id="45" w:name="_Toc241178695"/>
+      <w:bookmarkStart w:id="45" w:name="_Toc241583784"/>
       <w:r>
         <w:rPr>
           <w:rFonts w:ascii="Times New Roman" w:hAnsi="Times New Roman"/>
@@ -5738,7 +5751,7 @@
         <w:outlineLvl w:val="1"/>
       </w:pPr>
       <w:bookmarkStart w:id="46" w:name="TOC_2_3_PENELITIAN_SEBELUMNYA_A_ID_23_PE"/>
-      <w:bookmarkStart w:id="47" w:name="_Toc241178696"/>
+      <w:bookmarkStart w:id="47" w:name="_Toc241583785"/>
       <w:r>
         <w:rPr>
           <w:rFonts w:ascii="Times New Roman" w:hAnsi="Times New Roman"/>
@@ -7800,7 +7813,7 @@
         <w:outlineLvl w:val="1"/>
       </w:pPr>
       <w:bookmarkStart w:id="49" w:name="TOC_2_4_PENGEMBANGAN_HIPOTESIS_A_ID_24_P"/>
-      <w:bookmarkStart w:id="50" w:name="_Toc241178697"/>
+      <w:bookmarkStart w:id="50" w:name="_Toc241583786"/>
       <w:r>
         <w:rPr>
           <w:rFonts w:ascii="Times New Roman" w:hAnsi="Times New Roman"/>
@@ -7819,7 +7832,7 @@
         <w:outlineLvl w:val="2"/>
       </w:pPr>
       <w:bookmarkStart w:id="51" w:name="TOC_2_4_1_PENGARUH_HEDONIC_MOTIVATION_TE"/>
-      <w:bookmarkStart w:id="52" w:name="_Toc241178698"/>
+      <w:bookmarkStart w:id="52" w:name="_Toc241583787"/>
       <w:r>
         <w:rPr>
           <w:rFonts w:ascii="Times New Roman" w:hAnsi="Times New Roman"/>
@@ -8002,7 +8015,7 @@
         <w:outlineLvl w:val="2"/>
       </w:pPr>
       <w:bookmarkStart w:id="53" w:name="TOC_2_4_2_PENGARUH_DESIRE_FOR_COMPLETENE"/>
-      <w:bookmarkStart w:id="54" w:name="_Toc241178699"/>
+      <w:bookmarkStart w:id="54" w:name="_Toc241583788"/>
       <w:r>
         <w:rPr>
           <w:rFonts w:ascii="Times New Roman" w:hAnsi="Times New Roman"/>
@@ -8192,7 +8205,7 @@
         <w:outlineLvl w:val="2"/>
       </w:pPr>
       <w:bookmarkStart w:id="55" w:name="TOC_2_4_3_PENGARUH_SPECULATIVE_MOTIVE_TE"/>
-      <w:bookmarkStart w:id="56" w:name="_Toc241178700"/>
+      <w:bookmarkStart w:id="56" w:name="_Toc241583789"/>
       <w:r>
         <w:rPr>
           <w:rFonts w:ascii="Times New Roman" w:hAnsi="Times New Roman"/>
@@ -8360,7 +8373,7 @@
         <w:outlineLvl w:val="2"/>
       </w:pPr>
       <w:bookmarkStart w:id="57" w:name="TOC_2_4_4_PENGARUH_MODERASI_SELF_CONTROL"/>
-      <w:bookmarkStart w:id="58" w:name="_Toc241178701"/>
+      <w:bookmarkStart w:id="58" w:name="_Toc241583790"/>
       <w:r>
         <w:rPr>
           <w:rFonts w:ascii="Times New Roman" w:hAnsi="Times New Roman"/>
@@ -8604,7 +8617,7 @@
         <w:outlineLvl w:val="2"/>
       </w:pPr>
       <w:bookmarkStart w:id="59" w:name="TOC_2_4_5_PENGARUH_MODERASI_SELF_CONTROL"/>
-      <w:bookmarkStart w:id="60" w:name="_Toc241178702"/>
+      <w:bookmarkStart w:id="60" w:name="_Toc241583791"/>
       <w:r>
         <w:rPr>
           <w:rFonts w:ascii="Times New Roman" w:hAnsi="Times New Roman"/>
@@ -8823,7 +8836,7 @@
         <w:outlineLvl w:val="2"/>
       </w:pPr>
       <w:bookmarkStart w:id="61" w:name="TOC_2_4_6_PENGARUH_MODERASI_SELF_CONTROL"/>
-      <w:bookmarkStart w:id="62" w:name="_Toc241178703"/>
+      <w:bookmarkStart w:id="62" w:name="_Toc241583792"/>
       <w:r>
         <w:rPr>
           <w:rFonts w:ascii="Times New Roman" w:hAnsi="Times New Roman"/>
@@ -9043,7 +9056,7 @@
         <w:outlineLvl w:val="1"/>
       </w:pPr>
       <w:bookmarkStart w:id="63" w:name="TOC_2_5_RERANGKA_PENELITIAN_A_ID_25_RERA"/>
-      <w:bookmarkStart w:id="64" w:name="_Toc241178704"/>
+      <w:bookmarkStart w:id="64" w:name="_Toc241583793"/>
       <w:r>
         <w:rPr>
           <w:rFonts w:ascii="Times New Roman" w:hAnsi="Times New Roman"/>
@@ -9079,7 +9092,7 @@
           <w:noProof/>
         </w:rPr>
         <w:drawing>
-          <wp:inline distT="0" distB="0" distL="0" distR="0" wp14:anchorId="1F1FA6C1" wp14:editId="1C4CFE3A">
+          <wp:inline distT="0" distB="0" distL="0" distR="0" wp14:anchorId="2FB41C75" wp14:editId="2BB47D43">
             <wp:extent cx="5040000" cy="2754830"/>
             <wp:effectExtent l="0" t="0" r="0" b="0"/>
             <wp:docPr id="5" name="Picture 5"/>
@@ -9186,7 +9199,7 @@
         <w:outlineLvl w:val="0"/>
       </w:pPr>
       <w:bookmarkStart w:id="66" w:name="TOC_BAB_3_METODE_PENELITIAN_A_ID_BAB_3_M"/>
-      <w:bookmarkStart w:id="67" w:name="_Toc241178705"/>
+      <w:bookmarkStart w:id="67" w:name="_Toc241583794"/>
       <w:r>
         <w:rPr>
           <w:rFonts w:ascii="Times New Roman" w:hAnsi="Times New Roman"/>
@@ -9224,7 +9237,7 @@
         <w:outlineLvl w:val="1"/>
       </w:pPr>
       <w:bookmarkStart w:id="68" w:name="TOC_3_1_JENIS_DAN_SUMBER_DATA_A_ID_31_JE"/>
-      <w:bookmarkStart w:id="69" w:name="_Toc241178706"/>
+      <w:bookmarkStart w:id="69" w:name="_Toc241583795"/>
       <w:r>
         <w:rPr>
           <w:rFonts w:ascii="Times New Roman" w:hAnsi="Times New Roman"/>
@@ -9804,7 +9817,7 @@
         <w:outlineLvl w:val="2"/>
       </w:pPr>
       <w:bookmarkStart w:id="71" w:name="TOC_3_1_1_BATASAN_PENELITIAN_DAN_RUANG_L"/>
-      <w:bookmarkStart w:id="72" w:name="_Toc241178707"/>
+      <w:bookmarkStart w:id="72" w:name="_Toc241583796"/>
       <w:r>
         <w:rPr>
           <w:rFonts w:ascii="Times New Roman" w:hAnsi="Times New Roman"/>
@@ -9897,7 +9910,7 @@
         <w:outlineLvl w:val="1"/>
       </w:pPr>
       <w:bookmarkStart w:id="73" w:name="TOC_3_2_POPULASI_DAN_SAMPEL_A_ID_32_POPU"/>
-      <w:bookmarkStart w:id="74" w:name="_Toc241178708"/>
+      <w:bookmarkStart w:id="74" w:name="_Toc241583797"/>
       <w:r>
         <w:rPr>
           <w:rFonts w:ascii="Times New Roman" w:hAnsi="Times New Roman"/>
@@ -9916,7 +9929,7 @@
         <w:outlineLvl w:val="2"/>
       </w:pPr>
       <w:bookmarkStart w:id="75" w:name="TOC_3_2_1_POPULASI_DAN_IDENTIFIKASI_SUMB"/>
-      <w:bookmarkStart w:id="76" w:name="_Toc241178709"/>
+      <w:bookmarkStart w:id="76" w:name="_Toc241583798"/>
       <w:r>
         <w:rPr>
           <w:rFonts w:ascii="Times New Roman" w:hAnsi="Times New Roman"/>
@@ -10022,7 +10035,7 @@
         <w:outlineLvl w:val="2"/>
       </w:pPr>
       <w:bookmarkStart w:id="77" w:name="TOC_3_2_2_SAMPEL_DAN_JUSTIFIKASI_KRITERI"/>
-      <w:bookmarkStart w:id="78" w:name="_Toc241178710"/>
+      <w:bookmarkStart w:id="78" w:name="_Toc241583799"/>
       <w:r>
         <w:rPr>
           <w:rFonts w:ascii="Times New Roman" w:hAnsi="Times New Roman"/>
@@ -10238,7 +10251,7 @@
         <w:outlineLvl w:val="2"/>
       </w:pPr>
       <w:bookmarkStart w:id="79" w:name="TOC_3_2_3_PENENTUAN_UKURAN_SAMPEL_A_ID_3"/>
-      <w:bookmarkStart w:id="80" w:name="_Toc241178711"/>
+      <w:bookmarkStart w:id="80" w:name="_Toc241583800"/>
       <w:r>
         <w:rPr>
           <w:rFonts w:ascii="Times New Roman" w:hAnsi="Times New Roman"/>
@@ -10711,7 +10724,7 @@
         <w:outlineLvl w:val="2"/>
       </w:pPr>
       <w:bookmarkStart w:id="81" w:name="TOC_3_2_4_JUSTIFIKASI_KOMPARATIF_PEMILIH"/>
-      <w:bookmarkStart w:id="82" w:name="_Toc241178712"/>
+      <w:bookmarkStart w:id="82" w:name="_Toc241583801"/>
       <w:r>
         <w:rPr>
           <w:rFonts w:ascii="Times New Roman" w:hAnsi="Times New Roman"/>
@@ -10831,7 +10844,7 @@
         <w:outlineLvl w:val="1"/>
       </w:pPr>
       <w:bookmarkStart w:id="83" w:name="TOC_3_3_MODEL_PENELITIAN_A_ID_33_MODEL_P"/>
-      <w:bookmarkStart w:id="84" w:name="_Toc241178713"/>
+      <w:bookmarkStart w:id="84" w:name="_Toc241583802"/>
       <w:r>
         <w:rPr>
           <w:rFonts w:ascii="Times New Roman" w:hAnsi="Times New Roman"/>
@@ -12546,7 +12559,7 @@
         <w:outlineLvl w:val="1"/>
       </w:pPr>
       <w:bookmarkStart w:id="85" w:name="TOC_3_4_OPERASIONALISASI_VARIABEL_A_ID_3"/>
-      <w:bookmarkStart w:id="86" w:name="_Toc241178714"/>
+      <w:bookmarkStart w:id="86" w:name="_Toc241583803"/>
       <w:r>
         <w:rPr>
           <w:rFonts w:ascii="Times New Roman" w:hAnsi="Times New Roman"/>
@@ -16003,7 +16016,7 @@
         <w:outlineLvl w:val="1"/>
       </w:pPr>
       <w:bookmarkStart w:id="88" w:name="TOC_3_5_METODE_ANALISIS_DATA_A_ID_35_MET"/>
-      <w:bookmarkStart w:id="89" w:name="_Toc241178715"/>
+      <w:bookmarkStart w:id="89" w:name="_Toc241583804"/>
       <w:r>
         <w:rPr>
           <w:rFonts w:ascii="Times New Roman" w:hAnsi="Times New Roman"/>
@@ -16022,7 +16035,7 @@
         <w:outlineLvl w:val="2"/>
       </w:pPr>
       <w:bookmarkStart w:id="90" w:name="TOC_3_5_1_JUSTIFIKASI_KOMPARATIF_PEMILIH"/>
-      <w:bookmarkStart w:id="91" w:name="_Toc241178716"/>
+      <w:bookmarkStart w:id="91" w:name="_Toc241583805"/>
       <w:r>
         <w:rPr>
           <w:rFonts w:ascii="Times New Roman" w:hAnsi="Times New Roman"/>
@@ -16685,7 +16698,7 @@
         <w:outlineLvl w:val="1"/>
       </w:pPr>
       <w:bookmarkStart w:id="92" w:name="TOC_3_6_DIAGRAM_ALUR_PENELITIAN_A_ID_36_"/>
-      <w:bookmarkStart w:id="93" w:name="_Toc241178717"/>
+      <w:bookmarkStart w:id="93" w:name="_Toc241583806"/>
       <w:r>
         <w:rPr>
           <w:rFonts w:ascii="Times New Roman" w:hAnsi="Times New Roman"/>
@@ -16721,7 +16734,7 @@
           <w:noProof/>
         </w:rPr>
         <w:drawing>
-          <wp:inline distT="0" distB="0" distL="0" distR="0" wp14:anchorId="50C1AED1" wp14:editId="315C6729">
+          <wp:inline distT="0" distB="0" distL="0" distR="0" wp14:anchorId="46363520" wp14:editId="28A0F8E6">
             <wp:extent cx="4680000" cy="4701382"/>
             <wp:effectExtent l="0" t="0" r="0" b="0"/>
             <wp:docPr id="6" name="Picture 6"/>
@@ -16986,7 +16999,7 @@
         <w:outlineLvl w:val="1"/>
       </w:pPr>
       <w:bookmarkStart w:id="95" w:name="TOC_3_7_JADWAL_PELAKSANAAN_PENELITIAN_A_"/>
-      <w:bookmarkStart w:id="96" w:name="_Toc241178718"/>
+      <w:bookmarkStart w:id="96" w:name="_Toc241583807"/>
       <w:r>
         <w:rPr>
           <w:rFonts w:ascii="Times New Roman" w:hAnsi="Times New Roman"/>
@@ -18982,7 +18995,7 @@
         <w:outlineLvl w:val="0"/>
       </w:pPr>
       <w:bookmarkStart w:id="98" w:name="TOC_DAFTAR_PUSTAKA"/>
-      <w:bookmarkStart w:id="99" w:name="_Toc241178719"/>
+      <w:bookmarkStart w:id="99" w:name="_Toc241583808"/>
       <w:r>
         <w:rPr>
           <w:rFonts w:ascii="Times New Roman" w:hAnsi="Times New Roman"/>
@@ -19007,7 +19020,7 @@
         <w:rPr>
           <w:rFonts w:cs="Times New Roman"/>
         </w:rPr>
-        <w:t>&lt;a id="ref-1"&gt;&lt;/a&gt;&lt;a id="ref-aiken1991"&gt;&lt;/a&gt;1. Aiken, L. S. and West, S. G. (1991). Multiple Regression: Testing dan Interpreting Interactions. Sage Publications, Newbury Park, CA.</w:t>
+        <w:t>&lt;a id="ref-1"&gt;&lt;/a&gt;1. Aiken, L. S. and West, S. G. (1991). Multiple Regression: Testing dan Interpreting Interactions. Sage Publications, Newbury Park, CA.</w:t>
       </w:r>
       <w:bookmarkEnd w:id="100"/>
     </w:p>
@@ -19022,7 +19035,7 @@
         <w:rPr>
           <w:rFonts w:cs="Times New Roman"/>
         </w:rPr>
-        <w:t>&lt;a id="ref-2"&gt;&lt;/a&gt;&lt;a id="ref-amos2014"&gt;&lt;/a&gt;2. Amos, C., Holmes, G. R., and Keneson, W. C. (2014). A meta-analysis of consumer impulse buying. Journal of Retailing dan Consumer Services, 21(2):86–97.</w:t>
+        <w:t>&lt;a id="ref-2"&gt;&lt;/a&gt;2. Amos, C., Holmes, G. R., and Keneson, W. C. (2014). A meta-analysis of consumer impulse buying. Journal of Retailing dan Consumer Services, 21(2):86–97.</w:t>
       </w:r>
       <w:bookmarkEnd w:id="101"/>
     </w:p>
@@ -19037,7 +19050,7 @@
         <w:rPr>
           <w:rFonts w:cs="Times New Roman"/>
         </w:rPr>
-        <w:t>&lt;a id="ref-3"&gt;&lt;/a&gt;&lt;a id="ref-apidana2022"&gt;&lt;/a&gt;3. Apidana, Y. H. and Kholifah (2022). Peran self control dalam memoderasi pengaruh hedonic motives dan shopping lifestyle terhadap impulse buying. Journal of Digital Business dan Management, 1(1):26–40.</w:t>
+        <w:t>&lt;a id="ref-3"&gt;&lt;/a&gt;3. Apidana, Y. H. and Kholifah (2022). Peran self control dalam memoderasi pengaruh hedonic motives dan shopping lifestyle terhadap impulse buying. Journal of Digital Business dan Management, 1(1):26–40.</w:t>
       </w:r>
       <w:bookmarkEnd w:id="102"/>
     </w:p>
@@ -19052,7 +19065,7 @@
         <w:rPr>
           <w:rFonts w:cs="Times New Roman"/>
         </w:rPr>
-        <w:t>&lt;a id="ref-4"&gt;&lt;/a&gt;&lt;a id="ref-arnold2003"&gt;&lt;/a&gt;4. Arnold, M. J. and Reynolds, K. E. (2003). Hedonic shopping motivations. Journal of Retailing, 79(2):77–95.</w:t>
+        <w:t>&lt;a id="ref-4"&gt;&lt;/a&gt;4. Arnold, M. J. and Reynolds, K. E. (2003). Hedonic shopping motivations. Journal of Retailing, 79(2):77–95.</w:t>
       </w:r>
       <w:bookmarkEnd w:id="103"/>
     </w:p>
@@ -19067,7 +19080,7 @@
         <w:rPr>
           <w:rFonts w:cs="Times New Roman"/>
         </w:rPr>
-        <w:t>&lt;a id="ref-5"&gt;&lt;/a&gt;&lt;a id="ref-artadita2024"&gt;&lt;/a&gt;5. Artadita, S. and Firmialy, S. D. (2024). How does self-control moderate shopping enjoyment and impulse buying among generation z online gamers? Binus Business Review, 15(2):179–189.</w:t>
+        <w:t>&lt;a id="ref-5"&gt;&lt;/a&gt;5. Artadita, S. and Firmialy, S. D. (2024). How does self-control moderate shopping enjoyment and impulse buying among generation z online gamers? Binus Business Review, 15(2):179–189.</w:t>
       </w:r>
       <w:bookmarkEnd w:id="104"/>
     </w:p>
@@ -19082,7 +19095,7 @@
         <w:rPr>
           <w:rFonts w:cs="Times New Roman"/>
         </w:rPr>
-        <w:t>&lt;a id="ref-6"&gt;&lt;/a&gt;&lt;a id="ref-aryadi2026"&gt;&lt;/a&gt;6. Aryadi, A. and Lingga, M. (2026). Personal traits and motivation impact on collectibles as an alternative investment: A case study of trading card game community in greater jakarta. In Proceedings of the 5th International Conference on Global Innovation dan Trends in Economy (INCOGITE 2024), volume 302 of Advances in Economics, Business dan Management Research, pages 1–12. Atlantis Press.</w:t>
+        <w:t>&lt;a id="ref-6"&gt;&lt;/a&gt;6. Aryadi, A. and Lingga, M. (2026). Personal traits and motivation impact on collectibles as an alternative investment: A case study of trading card game community in greater jakarta. In Proceedings of the 5th International Conference on Global Innovation dan Trends in Economy (INCOGITE 2024), volume 302 of Advances in Economics, Business dan Management Research, pages 1–12. Atlantis Press.</w:t>
       </w:r>
       <w:bookmarkEnd w:id="105"/>
     </w:p>
@@ -19097,7 +19110,7 @@
         <w:rPr>
           <w:rFonts w:cs="Times New Roman"/>
         </w:rPr>
-        <w:t>&lt;a id="ref-7"&gt;&lt;/a&gt;&lt;a id="ref-azizah2025"&gt;&lt;/a&gt;7. Azizah, N. L. and Fauzi, M. (2025). Exploring the drivers of impulsive buying in e-commerce: the role of hedonic motivation, shopping lifestyle, and positive emotions. Jurnal Inovasi Ekonomi, 10(2):79–94.</w:t>
+        <w:t>&lt;a id="ref-7"&gt;&lt;/a&gt;7. Azizah, N. L. and Fauzi, M. (2025). Exploring the drivers of impulsive buying in e-commerce: the role of hedonic motivation, shopping lifestyle, and positive emotions. Jurnal Inovasi Ekonomi, 10(2):79–94.</w:t>
       </w:r>
       <w:r>
         <w:rPr>
@@ -19127,7 +19140,7 @@
         <w:rPr>
           <w:rFonts w:cs="Times New Roman"/>
         </w:rPr>
-        <w:t>&lt;a id="ref-8"&gt;&lt;/a&gt;&lt;a id="ref-babin1994"&gt;&lt;/a&gt;8. Babin, B. J., Darden, W. R., and Griffin, M. (1994). Work and/or fun: Measuring hedonic and utilitarian shopping value. Journal of Consumer Research, 20(4):644–656.</w:t>
+        <w:t>&lt;a id="ref-8"&gt;&lt;/a&gt;8. Babin, B. J., Darden, W. R., and Griffin, M. (1994). Work and/or fun: Measuring hedonic and utilitarian shopping value. Journal of Consumer Research, 20(4):644–656.</w:t>
       </w:r>
       <w:bookmarkEnd w:id="107"/>
     </w:p>
@@ -19142,7 +19155,7 @@
         <w:rPr>
           <w:rFonts w:cs="Times New Roman"/>
         </w:rPr>
-        <w:t>&lt;a id="ref-9"&gt;&lt;/a&gt;&lt;a id="ref-barasz2017"&gt;&lt;/a&gt;9. Barasz, K., John, L. K., Keenan, E. A., and Norton, M. I. (2017). Pseudo-set framing. Journal of Experimental Psychology: General, 146(10):1460–1477.</w:t>
+        <w:t>&lt;a id="ref-9"&gt;&lt;/a&gt;9. Barasz, K., John, L. K., Keenan, E. A., and Norton, M. I. (2017). Pseudo-set framing. Journal of Experimental Psychology: General, 146(10):1460–1477.</w:t>
       </w:r>
       <w:bookmarkEnd w:id="108"/>
     </w:p>
@@ -19157,14 +19170,7 @@
         <w:rPr>
           <w:rFonts w:cs="Times New Roman"/>
         </w:rPr>
-        <w:t xml:space="preserve">&lt;a id="ref-10"&gt;&lt;/a&gt;&lt;a id="ref-barber2008"&gt;&lt;/a&gt;10. Barber, B. M. and Odean, T. (2008). All that glitters: The effect of attention and news on the buying </w:t>
-      </w:r>
-      <w:r>
-        <w:rPr>
-          <w:rFonts w:cs="Times New Roman"/>
-        </w:rPr>
-        <w:lastRenderedPageBreak/>
-        <w:t>behavior of individual and institutional investors. The Review of Financial Studies, 21(2):785–818.</w:t>
+        <w:t>&lt;a id="ref-10"&gt;&lt;/a&gt;10. Barber, B. M. and Odean, T. (2008). All that glitters: The effect of attention and news on the buying behavior of individual and institutional investors. The Review of Financial Studies, 21(2):785–818.</w:t>
       </w:r>
       <w:bookmarkEnd w:id="109"/>
     </w:p>
@@ -19179,7 +19185,8 @@
         <w:rPr>
           <w:rFonts w:cs="Times New Roman"/>
         </w:rPr>
-        <w:t>&lt;a id="ref-11"&gt;&lt;/a&gt;&lt;a id="ref-baumeister2002"&gt;&lt;/a&gt;11. Baumeister, R. F. (2002). Yielding to temptation: Self-control failure, impulsive purchasing, and consumer behavior. Journal of Consumer Research, 28(4):670–676.</w:t>
+        <w:lastRenderedPageBreak/>
+        <w:t>&lt;a id="ref-11"&gt;&lt;/a&gt;11. Baumeister, R. F. (2002). Yielding to temptation: Self-control failure, impulsive purchasing, and consumer behavior. Journal of Consumer Research, 28(4):670–676.</w:t>
       </w:r>
       <w:bookmarkEnd w:id="110"/>
     </w:p>
@@ -19194,7 +19201,7 @@
         <w:rPr>
           <w:rFonts w:cs="Times New Roman"/>
         </w:rPr>
-        <w:t>&lt;a id="ref-12"&gt;&lt;/a&gt;&lt;a id="ref-baur2018"&gt;&lt;/a&gt;12. Baur, D. G., Dimpfl, T., and Kuck, K. (2018). Bitcoin, gold and the US dollar – a replication and extension. Finance Research Letters, 25:103–110.</w:t>
+        <w:t>&lt;a id="ref-12"&gt;&lt;/a&gt;12. Baur, D. G., Dimpfl, T., and Kuck, K. (2018). Bitcoin, gold and the US dollar – a replication and extension. Finance Research Letters, 25:103–110.</w:t>
       </w:r>
       <w:bookmarkEnd w:id="111"/>
     </w:p>
@@ -19204,12 +19211,12 @@
         <w:ind w:left="709" w:hanging="709"/>
         <w:jc w:val="both"/>
       </w:pPr>
-      <w:bookmarkStart w:id="112" w:name="Ref_beatty1998impulse"/>
-      <w:r>
-        <w:rPr>
-          <w:rFonts w:cs="Times New Roman"/>
-        </w:rPr>
-        <w:t>&lt;a id="ref-13"&gt;&lt;/a&gt;&lt;a id="ref-beatty1998"&gt;&lt;/a&gt;13. Beatty, S. E. and Ferrell, M. E. (1998). Impulse buying: Modeling its precursors. Journal of Retailing, 74(2):169–191.</w:t>
+      <w:bookmarkStart w:id="112" w:name="Ref_belk1995collecting"/>
+      <w:r>
+        <w:rPr>
+          <w:rFonts w:cs="Times New Roman"/>
+        </w:rPr>
+        <w:t>&lt;a id="ref-13"&gt;&lt;/a&gt;13. Belk, R. W. (1995). Collecting in a Consumer Society. Routledge, London.</w:t>
       </w:r>
       <w:bookmarkEnd w:id="112"/>
     </w:p>
@@ -19219,12 +19226,12 @@
         <w:ind w:left="709" w:hanging="709"/>
         <w:jc w:val="both"/>
       </w:pPr>
-      <w:bookmarkStart w:id="113" w:name="Ref_belk1995collecting"/>
-      <w:r>
-        <w:rPr>
-          <w:rFonts w:cs="Times New Roman"/>
-        </w:rPr>
-        <w:t>&lt;a id="ref-14"&gt;&lt;/a&gt;&lt;a id="ref-belk1995"&gt;&lt;/a&gt;14. Belk, R. W. (1995). Collecting in a Consumer Society. Routledge, London.</w:t>
+      <w:bookmarkStart w:id="113" w:name="Ref_chan2017state"/>
+      <w:r>
+        <w:rPr>
+          <w:rFonts w:cs="Times New Roman"/>
+        </w:rPr>
+        <w:t>&lt;a id="ref-14"&gt;&lt;/a&gt;14. Chan, T. K. H., Cheung, C. M. K., and Lee, Z. W. Y. (2017). The state of online impulse-buying research: A literature analysis. Information dan Management, 54(2):204–217.</w:t>
       </w:r>
       <w:bookmarkEnd w:id="113"/>
     </w:p>
@@ -19239,7 +19246,7 @@
         <w:rPr>
           <w:rFonts w:cs="Times New Roman"/>
         </w:rPr>
-        <w:t>&lt;a id="ref-15"&gt;&lt;/a&gt;&lt;a id="ref-cohen1988"&gt;&lt;/a&gt;15. Cohen, J. (1988). Statistical Power Analysis for the Behavioral Sciences. Lawrence Erlbaum Associates, Hillsdale, NJ, 2 edition.</w:t>
+        <w:t>&lt;a id="ref-15"&gt;&lt;/a&gt;15. Cohen, J. (1988). Statistical Power Analysis for the Behavioral Sciences. Lawrence Erlbaum Associates, Hillsdale, NJ, 2 edition.</w:t>
       </w:r>
       <w:bookmarkEnd w:id="114"/>
     </w:p>
@@ -19254,7 +19261,7 @@
         <w:rPr>
           <w:rFonts w:cs="Times New Roman"/>
         </w:rPr>
-        <w:t>&lt;a id="ref-16"&gt;&lt;/a&gt;&lt;a id="ref-colline2024"&gt;&lt;/a&gt;16. Colline, F. (2024). Biases in indonesian stock investor behavior. Accounting dan Finance Studies, 4(2):88–98.</w:t>
+        <w:t>&lt;a id="ref-16"&gt;&lt;/a&gt;16. Colline, F. (2024). Biases in indonesian stock investor behavior. Accounting dan Finance Studies, 4(2):88–98.</w:t>
       </w:r>
       <w:bookmarkEnd w:id="115"/>
     </w:p>
@@ -19269,7 +19276,7 @@
         <w:rPr>
           <w:rFonts w:cs="Times New Roman"/>
         </w:rPr>
-        <w:t>&lt;a id="ref-17"&gt;&lt;/a&gt;&lt;a id="ref-dewi2026"&gt;&lt;/a&gt;17. Dewi, M. M. L. S., Budoyo, V. D., and Mustikasari, F. (2026). Understanding impulse buying behavior: The case of blind box purchases in indonesia. Jurnal Locus: Penelitian dan Pengabdian, 5(2):1082–1089.</w:t>
+        <w:t>&lt;a id="ref-17"&gt;&lt;/a&gt;17. Dewi, M. M. L. S., Budoyo, V. D., and Mustikasari, F. (2026). Understanding impulse buying behavior: The case of blind box purchases in indonesia. Jurnal Locus: Penelitian dan Pengabdian, 5(2):1082–1089.</w:t>
       </w:r>
       <w:bookmarkEnd w:id="116"/>
     </w:p>
@@ -19284,7 +19291,7 @@
         <w:rPr>
           <w:rFonts w:cs="Times New Roman"/>
         </w:rPr>
-        <w:t>&lt;a id="ref-18"&gt;&lt;/a&gt;&lt;a id="ref-fama1970"&gt;&lt;/a&gt;18. Fama, E. F. (1970). Efficient capital markets: A review of theory and empirical work. The Journal of Finance, 25(2):383–417.</w:t>
+        <w:t>&lt;a id="ref-18"&gt;&lt;/a&gt;18. Fama, E. F. (1970). Efficient capital markets: A review of theory and empirical work. The Journal of Finance, 25(2):383–417.</w:t>
       </w:r>
       <w:bookmarkEnd w:id="117"/>
     </w:p>
@@ -19299,7 +19306,7 @@
         <w:rPr>
           <w:rFonts w:cs="Times New Roman"/>
         </w:rPr>
-        <w:t>&lt;a id="ref-19"&gt;&lt;/a&gt;&lt;a id="ref-gao2014"&gt;&lt;/a&gt;19. Gao, L., Huang, Y., and Simonson, I. (2014). The influence of initial possession level on consumers' adoption of a collection goal: A tipping point effect. Journal of Marketing, 78:143–156.</w:t>
+        <w:t>&lt;a id="ref-19"&gt;&lt;/a&gt;19. Gao, L., Huang, Y., and Simonson, I. (2014). The influence of initial possession level on consumers' adoption of a collection goal: A tipping point effect. Journal of Marketing, 78:143–156.</w:t>
       </w:r>
       <w:bookmarkEnd w:id="118"/>
     </w:p>
@@ -19314,7 +19321,7 @@
         <w:rPr>
           <w:rFonts w:cs="Times New Roman"/>
         </w:rPr>
-        <w:t>&lt;a id="ref-20"&gt;&lt;/a&gt;&lt;a id="ref-ghozali2018"&gt;&lt;/a&gt;20. Ghozali, I. (2018). Aplikasi Analisis Multivariate dengan Program IBM SPSS 25. Badan Penerbit Universitas Diponegoro, Semarang, 9 edition.</w:t>
+        <w:t>&lt;a id="ref-20"&gt;&lt;/a&gt;20. Ghozali, I. (2018). Aplikasi Analisis Multivariate dengan Program IBM SPSS 25. Badan Penerbit Universitas Diponegoro, Semarang, 9 edition.</w:t>
       </w:r>
       <w:bookmarkEnd w:id="119"/>
     </w:p>
@@ -19329,7 +19336,7 @@
         <w:rPr>
           <w:rFonts w:cs="Times New Roman"/>
         </w:rPr>
-        <w:t>&lt;a id="ref-21"&gt;&lt;/a&gt;&lt;a id="ref-gong2024"&gt;&lt;/a&gt;21. Gong, X., Yee, C. L., Lee, S. Y., Saif, A. N. M., Liu, M., and Anonthi, F. (2024). Unveiling the enigma of blind box impulse buying curiosity: The moderating role of price consciousness. Heliyon, 10(24):e40564.</w:t>
+        <w:t>&lt;a id="ref-21"&gt;&lt;/a&gt;21. Gong, X., Yee, C. L., Lee, S. Y., Saif, A. N. M., Liu, M., and Anonthi, F. (2024). Unveiling the enigma of blind box impulse buying curiosity: The moderating role of price consciousness. Heliyon, 10(24):e40564.</w:t>
       </w:r>
       <w:bookmarkEnd w:id="120"/>
     </w:p>
@@ -19344,8 +19351,7 @@
         <w:rPr>
           <w:rFonts w:cs="Times New Roman"/>
         </w:rPr>
-        <w:lastRenderedPageBreak/>
-        <w:t>&lt;a id="ref-22"&gt;&lt;/a&gt;&lt;a id="ref-green1991"&gt;&lt;/a&gt;22. Green, S. B. (1991). How many subjects does it take to do a regression analysis? Multivariate Behavioral Research, 26(3):499–510.</w:t>
+        <w:t>&lt;a id="ref-22"&gt;&lt;/a&gt;22. Green, S. B. (1991). How many subjects does it take to do a regression analysis? Multivariate Behavioral Research, 26(3):499–510.</w:t>
       </w:r>
       <w:bookmarkEnd w:id="121"/>
     </w:p>
@@ -19360,6 +19366,7 @@
         <w:rPr>
           <w:rFonts w:cs="Times New Roman"/>
         </w:rPr>
+        <w:lastRenderedPageBreak/>
         <w:t>&lt;a id="ref-23"&gt;&lt;/a&gt;23. Gültekin, B. and Özer, L. (2012). The influence of hedonic motives and browsing on impulse buying. Journal of Economics dan Behavioral Studies, 4(3):180–189.</w:t>
       </w:r>
       <w:bookmarkEnd w:id="122"/>
@@ -19375,7 +19382,7 @@
         <w:rPr>
           <w:rFonts w:cs="Times New Roman"/>
         </w:rPr>
-        <w:t>&lt;a id="ref-24"&gt;&lt;/a&gt;&lt;a id="ref-hair2019"&gt;&lt;/a&gt;24. Hair, J. F., Black, W. C., Babin, B. J., and Anderson, R. E. (2019). Multivariate Data Analysis. Cengage Learning, Boston, MA, 8th edition.</w:t>
+        <w:t>&lt;a id="ref-24"&gt;&lt;/a&gt;24. Hair, J. F., Black, W. C., Babin, B. J., and Anderson, R. E. (2019). Multivariate Data Analysis. Cengage Learning, Boston, MA, 8th edition.</w:t>
       </w:r>
       <w:bookmarkEnd w:id="123"/>
     </w:p>
@@ -19390,7 +19397,7 @@
         <w:rPr>
           <w:rFonts w:cs="Times New Roman"/>
         </w:rPr>
-        <w:t>&lt;a id="ref-25"&gt;&lt;/a&gt;&lt;a id="ref-hayes2018"&gt;&lt;/a&gt;25. Hayes, A. F. (2018). Introduction to Mediation, Moderation, and Conditional Process Analysis: A Regression-Based Approach. The Guilford Press, New York, 2nd edition.</w:t>
+        <w:t>&lt;a id="ref-25"&gt;&lt;/a&gt;25. Hayes, A. F. (2018). Introduction to Mediation, Moderation, and Conditional Process Analysis: A Regression-Based Approach. The Guilford Press, New York, 2nd edition.</w:t>
       </w:r>
       <w:bookmarkEnd w:id="124"/>
     </w:p>
@@ -19405,7 +19412,7 @@
         <w:rPr>
           <w:rFonts w:cs="Times New Roman"/>
         </w:rPr>
-        <w:t>&lt;a id="ref-26"&gt;&lt;/a&gt;&lt;a id="ref-hirschman1982"&gt;&lt;/a&gt;26. Hirschman, E. C. and Holbrook, M. B. (1982). Hedonic consumption: Emerging concepts, methods and propositions. Journal of Marketing, 46(3):92–101.</w:t>
+        <w:t>&lt;a id="ref-26"&gt;&lt;/a&gt;26. Hirschman, E. C. and Holbrook, M. B. (1982). Hedonic consumption: Emerging concepts, methods and propositions. Journal of Marketing, 46(3):92–101.</w:t>
       </w:r>
       <w:bookmarkEnd w:id="125"/>
     </w:p>
@@ -19415,12 +19422,12 @@
         <w:ind w:left="709" w:hanging="709"/>
         <w:jc w:val="both"/>
       </w:pPr>
-      <w:bookmarkStart w:id="126" w:name="Ref_kahneman1979prospect"/>
-      <w:r>
-        <w:rPr>
-          <w:rFonts w:cs="Times New Roman"/>
-        </w:rPr>
-        <w:t>&lt;a id="ref-27"&gt;&lt;/a&gt;&lt;a id="ref-kahneman1979"&gt;&lt;/a&gt;27. Kahneman, D. and Tversky, A. (1979). Prospect theory: An analysis of decision under risk. Econometrica, 47(2):263–292.</w:t>
+      <w:bookmarkStart w:id="126" w:name="Ref_iyer2020impulse"/>
+      <w:r>
+        <w:rPr>
+          <w:rFonts w:cs="Times New Roman"/>
+        </w:rPr>
+        <w:t>&lt;a id="ref-27"&gt;&lt;/a&gt;27. Iyer, G. R., Blut, M., Xiao, S. H., and Grewal, D. (2020). Impulse buying: A meta-analytic review. Journal of the Academy of Marketing Science, 48(3):384–404.</w:t>
       </w:r>
       <w:bookmarkEnd w:id="126"/>
     </w:p>
@@ -19430,12 +19437,12 @@
         <w:ind w:left="709" w:hanging="709"/>
         <w:jc w:val="both"/>
       </w:pPr>
-      <w:bookmarkStart w:id="127" w:name="Ref_katauke2023financial"/>
-      <w:r>
-        <w:rPr>
-          <w:rFonts w:cs="Times New Roman"/>
-        </w:rPr>
-        <w:t>&lt;a id="ref-28"&gt;&lt;/a&gt;&lt;a id="ref-katauke2023"&gt;&lt;/a&gt;28. Katauke, T., Fukuda, S., Khan, M. S. R., and Kadoya, Y. (2023). Financial literacy and impulsivity: Evidence from Japan. Sustainability, 15(9):7267.</w:t>
+      <w:bookmarkStart w:id="127" w:name="Ref_kahneman1979prospect"/>
+      <w:r>
+        <w:rPr>
+          <w:rFonts w:cs="Times New Roman"/>
+        </w:rPr>
+        <w:t>&lt;a id="ref-28"&gt;&lt;/a&gt;28. Kahneman, D. and Tversky, A. (1979). Prospect theory: An analysis of decision under risk. Econometrica, 47(2):263–292.</w:t>
       </w:r>
       <w:bookmarkEnd w:id="127"/>
     </w:p>
@@ -19445,12 +19452,12 @@
         <w:ind w:left="709" w:hanging="709"/>
         <w:jc w:val="both"/>
       </w:pPr>
-      <w:bookmarkStart w:id="128" w:name="Ref_keynes1936general"/>
-      <w:r>
-        <w:rPr>
-          <w:rFonts w:cs="Times New Roman"/>
-        </w:rPr>
-        <w:t>&lt;a id="ref-29"&gt;&lt;/a&gt;&lt;a id="ref-keynes1936"&gt;&lt;/a&gt;29. Keynes, J. M. (1936). The General Theory of Employment, Interest dan Money. Macmillan, London.</w:t>
+      <w:bookmarkStart w:id="128" w:name="Ref_katauke2023financial"/>
+      <w:r>
+        <w:rPr>
+          <w:rFonts w:cs="Times New Roman"/>
+        </w:rPr>
+        <w:t>&lt;a id="ref-29"&gt;&lt;/a&gt;29. Katauke, T., Fukuda, S., Khan, M. S. R., and Kadoya, Y. (2023). Financial literacy and impulsivity: Evidence from Japan. Sustainability, 15(9):7267.</w:t>
       </w:r>
       <w:bookmarkEnd w:id="128"/>
     </w:p>
@@ -19460,12 +19467,12 @@
         <w:ind w:left="709" w:hanging="709"/>
         <w:jc w:val="both"/>
       </w:pPr>
-      <w:bookmarkStart w:id="129" w:name="Ref_lienardy2026role"/>
-      <w:r>
-        <w:rPr>
-          <w:rFonts w:cs="Times New Roman"/>
-        </w:rPr>
-        <w:t>&lt;a id="ref-30"&gt;&lt;/a&gt;&lt;a id="ref-lienardy2026"&gt;&lt;/a&gt;30. Lienardy, G. V. and Panasea, I. G. N. O. (2026). The role of self-control in moderating the influence of shopping lifestyle and hedonistic behavior on impulsive buying. Business dan Investment Review, 4(3).</w:t>
+      <w:bookmarkStart w:id="129" w:name="Ref_keynes1936general"/>
+      <w:r>
+        <w:rPr>
+          <w:rFonts w:cs="Times New Roman"/>
+        </w:rPr>
+        <w:t>&lt;a id="ref-30"&gt;&lt;/a&gt;30. Keynes, J. M. (1936). The General Theory of Employment, Interest dan Money. Macmillan, London.</w:t>
       </w:r>
       <w:bookmarkEnd w:id="129"/>
     </w:p>
@@ -19475,12 +19482,12 @@
         <w:ind w:left="709" w:hanging="709"/>
         <w:jc w:val="both"/>
       </w:pPr>
-      <w:bookmarkStart w:id="130" w:name="Ref_long2000consuming"/>
-      <w:r>
-        <w:rPr>
-          <w:rFonts w:cs="Times New Roman"/>
-        </w:rPr>
-        <w:t>&lt;a id="ref-31"&gt;&lt;/a&gt;&lt;a id="ref-long2000"&gt;&lt;/a&gt;31. Long, M. M. and Schiffman, L. G. (2000). Consumption values and relationships: segmenting the market for frequency programs. Journal of Consumer Marketing, 17(3):214–229.</w:t>
+      <w:bookmarkStart w:id="130" w:name="Ref_lienardy2026role"/>
+      <w:r>
+        <w:rPr>
+          <w:rFonts w:cs="Times New Roman"/>
+        </w:rPr>
+        <w:t>&lt;a id="ref-31"&gt;&lt;/a&gt;31. Lienardy, G. V. and Panasea, I. G. N. O. (2026). The role of self-control in moderating the influence of shopping lifestyle and hedonistic behavior on impulsive buying. Business dan Investment Review, 4(3).</w:t>
       </w:r>
       <w:bookmarkEnd w:id="130"/>
     </w:p>
@@ -19495,7 +19502,7 @@
         <w:rPr>
           <w:rFonts w:cs="Times New Roman"/>
         </w:rPr>
-        <w:t>&lt;a id="ref-32"&gt;&lt;/a&gt;&lt;a id="ref-mehrabian1974"&gt;&lt;/a&gt;32. Mehrabian, A. and Russell, J. A. (1974). An Approach to Environmental Psychology. MIT Press, Cambridge, MA.</w:t>
+        <w:t>&lt;a id="ref-32"&gt;&lt;/a&gt;32. Mehrabian, A. and Russell, J. A. (1974). An Approach to Environmental Psychology. MIT Press, Cambridge, MA.</w:t>
       </w:r>
       <w:bookmarkEnd w:id="131"/>
     </w:p>
@@ -19505,19 +19512,33 @@
         <w:ind w:left="709" w:hanging="709"/>
         <w:jc w:val="both"/>
       </w:pPr>
-      <w:bookmarkStart w:id="132" w:name="Ref_peck2006if"/>
-      <w:r>
-        <w:rPr>
-          <w:rFonts w:cs="Times New Roman"/>
-        </w:rPr>
-        <w:t xml:space="preserve">&lt;a id="ref-33"&gt;&lt;/a&gt;&lt;a id="ref-peck2006"&gt;&lt;/a&gt;33. Peck, J. and Childers, T. L. (2006). If i touch it i have to have it: Individual and environmental </w:t>
-      </w:r>
-      <w:r>
-        <w:rPr>
-          <w:rFonts w:cs="Times New Roman"/>
-        </w:rPr>
-        <w:lastRenderedPageBreak/>
-        <w:t>influences on impulse purchasing. Journal of Business Research, 59(6):765–769.</w:t>
+      <w:bookmarkStart w:id="132" w:name="Ref_pranggabayu2022pengaruh"/>
+      <w:r>
+        <w:rPr>
+          <w:rFonts w:cs="Times New Roman"/>
+        </w:rPr>
+        <w:t>&lt;a id="ref-33"&gt;&lt;/a&gt;33. The Pokémon Company (2024). Corporate business data and trading card game historical production statistics. Laporan Resmi Korporat, Tokyo: The Pokémon Company. Tersedia di:</w:t>
+      </w:r>
+      <w:r>
+        <w:rPr>
+          <w:rFonts w:cs="Times New Roman"/>
+        </w:rPr>
+        <w:t xml:space="preserve"> </w:t>
+      </w:r>
+      <w:hyperlink r:id="rId18">
+        <w:r>
+          <w:rPr>
+            <w:color w:val="0563C1"/>
+            <w:u w:val="single"/>
+          </w:rPr>
+          <w:t>https://corporate.pokemon.co.jp/en/aboutus/figures/</w:t>
+        </w:r>
+      </w:hyperlink>
+      <w:r>
+        <w:rPr>
+          <w:rFonts w:cs="Times New Roman"/>
+        </w:rPr>
+        <w:t xml:space="preserve"> (Diakses 15 Januari 2025).</w:t>
       </w:r>
       <w:bookmarkEnd w:id="132"/>
     </w:p>
@@ -19527,12 +19548,12 @@
         <w:ind w:left="709" w:hanging="709"/>
         <w:jc w:val="both"/>
       </w:pPr>
-      <w:bookmarkStart w:id="133" w:name="Ref_pranggabayu2022pengaruh"/>
-      <w:r>
-        <w:rPr>
-          <w:rFonts w:cs="Times New Roman"/>
-        </w:rPr>
-        <w:t>&lt;a id="ref-34"&gt;&lt;/a&gt;&lt;a id="ref-pranggabayu2022"&gt;&lt;/a&gt;34. Pranggabayu, B. and Andjarwati, A. L. (2022). Pengaruh hedonic shopping motivation dan store atmosphere terhadap impulsive buying. Sibatik Journal, 1(6):951–966.</w:t>
+      <w:bookmarkStart w:id="133" w:name="Ref_pricecharting2024"/>
+      <w:r>
+        <w:rPr>
+          <w:rFonts w:cs="Times New Roman"/>
+        </w:rPr>
+        <w:t>&lt;a id="ref-34"&gt;&lt;/a&gt;34. Pranggabayu, B. and Andjarwati, A. L. (2022). Pengaruh hedonic shopping motivation dan store atmosphere terhadap impulsive buying. Sibatik Journal, 1(6):951–966.</w:t>
       </w:r>
       <w:bookmarkEnd w:id="133"/>
     </w:p>
@@ -19542,12 +19563,13 @@
         <w:ind w:left="709" w:hanging="709"/>
         <w:jc w:val="both"/>
       </w:pPr>
-      <w:bookmarkStart w:id="134" w:name="Ref_pricecharting2024"/>
-      <w:r>
-        <w:rPr>
-          <w:rFonts w:cs="Times New Roman"/>
-        </w:rPr>
-        <w:t>&lt;a id="ref-35"&gt;&lt;/a&gt;&lt;a id="ref-pricecharting2024"&gt;&lt;/a&gt;35. PriceCharting (2024). Pokémon shining fates card price guide: Historical market values for ungraded and psa 10 graded cards. PriceCharting Historical Collectibles Database, New York. Tersedia di:</w:t>
+      <w:bookmarkStart w:id="134" w:name="Ref_qu2023impulse"/>
+      <w:r>
+        <w:rPr>
+          <w:rFonts w:cs="Times New Roman"/>
+        </w:rPr>
+        <w:lastRenderedPageBreak/>
+        <w:t>&lt;a id="ref-35"&gt;&lt;/a&gt;35. PriceCharting (2024). Pokémon shining fates card price guide: Historical market values for ungraded and psa 10 graded cards. PriceCharting Historical Collectibles Database, New York. Tersedia di:</w:t>
       </w:r>
       <w:r>
         <w:rPr>
@@ -19555,7 +19577,7 @@
         </w:rPr>
         <w:t xml:space="preserve"> </w:t>
       </w:r>
-      <w:hyperlink r:id="rId18">
+      <w:hyperlink r:id="rId19">
         <w:r>
           <w:rPr>
             <w:color w:val="0563C1"/>
@@ -19583,7 +19605,7 @@
         <w:rPr>
           <w:rFonts w:cs="Times New Roman"/>
         </w:rPr>
-        <w:t>&lt;a id="ref-36"&gt;&lt;/a&gt;&lt;a id="ref-rook1987"&gt;&lt;/a&gt;36. Rook, D. W. (1987). The buying impulse. Journal of Consumer Research, 14(2):189–199.</w:t>
+        <w:t>&lt;a id="ref-36"&gt;&lt;/a&gt;36. Qu, Y., Khan, J., Su, Y., Tong, J., and Zhao, S. (2023). Impulse buying tendency in live-stream commerce: The role of viewing frequency and anticipated emotions influencing scarcity-induced purchase decision. Journal of Retailing dan Consumer Services, 75:103534.</w:t>
       </w:r>
       <w:bookmarkEnd w:id="135"/>
     </w:p>
@@ -19598,7 +19620,7 @@
         <w:rPr>
           <w:rFonts w:cs="Times New Roman"/>
         </w:rPr>
-        <w:t>&lt;a id="ref-37"&gt;&lt;/a&gt;&lt;a id="ref-rook1995"&gt;&lt;/a&gt;37. Rook, D. W. and Fisher, R. J. (1995). Normative influences on impulsive buying behavior. Journal of Consumer Research, 22(3):305–313.</w:t>
+        <w:t>&lt;a id="ref-37"&gt;&lt;/a&gt;37. Rook, D. W. (1987). The buying impulse. Journal of Consumer Research, 14(2):189–199.</w:t>
       </w:r>
       <w:bookmarkEnd w:id="136"/>
     </w:p>
@@ -19613,7 +19635,7 @@
         <w:rPr>
           <w:rFonts w:cs="Times New Roman"/>
         </w:rPr>
-        <w:t>&lt;a id="ref-38"&gt;&lt;/a&gt;&lt;a id="ref-sekaran2016"&gt;&lt;/a&gt;38. Sekaran, U. and Bougie, R. (2016). Research Methods for Business: A Skill-Building Approach. John Wiley dan Sons, Chichester, West Sussex, 7th edition.</w:t>
+        <w:t>&lt;a id="ref-38"&gt;&lt;/a&gt;38. Rook, D. W. and Fisher, R. J. (1995). Normative influences on impulsive buying behavior. Journal of Consumer Research, 22(3):305–313.</w:t>
       </w:r>
       <w:bookmarkEnd w:id="137"/>
     </w:p>
@@ -19628,7 +19650,7 @@
         <w:rPr>
           <w:rFonts w:cs="Times New Roman"/>
         </w:rPr>
-        <w:t>&lt;a id="ref-39"&gt;&lt;/a&gt;&lt;a id="ref-shiller2000"&gt;&lt;/a&gt;39. Shiller, R. J. (2000). Irrational Exuberance. Princeton University Press, Princeton, NJ.</w:t>
+        <w:t>&lt;a id="ref-39"&gt;&lt;/a&gt;39. Sekaran, U. and Bougie, R. (2016). Research Methods for Business: A Skill-Building Approach. John Wiley dan Sons, Chichester, West Sussex, 7th edition.</w:t>
       </w:r>
       <w:bookmarkEnd w:id="138"/>
     </w:p>
@@ -19643,7 +19665,7 @@
         <w:rPr>
           <w:rFonts w:cs="Times New Roman"/>
         </w:rPr>
-        <w:t>&lt;a id="ref-40"&gt;&lt;/a&gt;&lt;a id="ref-simon1955"&gt;&lt;/a&gt;40. Simon, H. A. (1955). A behavioral model of rational choice. The Quarterly Journal of Economics, 69(1):99–118.</w:t>
+        <w:t>&lt;a id="ref-40"&gt;&lt;/a&gt;40. Shiller, R. J. (2000). Irrational Exuberance. Princeton University Press, Princeton, NJ.</w:t>
       </w:r>
       <w:bookmarkEnd w:id="139"/>
     </w:p>
@@ -19653,12 +19675,12 @@
         <w:ind w:left="709" w:hanging="709"/>
         <w:jc w:val="both"/>
       </w:pPr>
-      <w:bookmarkStart w:id="140" w:name="Ref_spero2004approach"/>
-      <w:r>
-        <w:rPr>
-          <w:rFonts w:cs="Times New Roman"/>
-        </w:rPr>
-        <w:t>&lt;a id="ref-41"&gt;&lt;/a&gt;&lt;a id="ref-spero2004"&gt;&lt;/a&gt;41. Spero, I. and Stone, M. (2004). Agents of change: how young consumers are changing the world of marketing. Qualitative Market Research: An International Journal, 7(2):153–159.</w:t>
+      <w:bookmarkStart w:id="140" w:name="Ref_statista2024pokemon"/>
+      <w:r>
+        <w:rPr>
+          <w:rFonts w:cs="Times New Roman"/>
+        </w:rPr>
+        <w:t>&lt;a id="ref-41"&gt;&lt;/a&gt;41. Simon, H. A. (1955). A behavioral model of rational choice. The Quarterly Journal of Economics, 69(1):99–118.</w:t>
       </w:r>
       <w:bookmarkEnd w:id="140"/>
     </w:p>
@@ -19668,12 +19690,12 @@
         <w:ind w:left="709" w:hanging="709"/>
         <w:jc w:val="both"/>
       </w:pPr>
-      <w:bookmarkStart w:id="141" w:name="Ref_statista2024pokemon"/>
-      <w:r>
-        <w:rPr>
-          <w:rFonts w:cs="Times New Roman"/>
-        </w:rPr>
-        <w:t>&lt;a id="ref-42"&gt;&lt;/a&gt;&lt;a id="ref-statista2021"&gt;&lt;/a&gt;42. Statista (2021). Top 10 highest-grossing media franchises worldwide of all time. Statista Chart 24277, Consumer Market Insights dan Research, New York: Statista Inc. (terbit Februari 2021). Tersedia di:</w:t>
+      <w:bookmarkStart w:id="141" w:name="Ref_stern1962significance"/>
+      <w:r>
+        <w:rPr>
+          <w:rFonts w:cs="Times New Roman"/>
+        </w:rPr>
+        <w:t>&lt;a id="ref-42"&gt;&lt;/a&gt;42. Statista (2021). Top 10 highest-grossing media franchises worldwide of all time. Statista Chart 24277, Consumer Market Insights dan Research, New York: Statista Inc. (terbit Februari 2021). Tersedia di:</w:t>
       </w:r>
       <w:r>
         <w:rPr>
@@ -19681,7 +19703,7 @@
         </w:rPr>
         <w:t xml:space="preserve"> </w:t>
       </w:r>
-      <w:hyperlink r:id="rId19">
+      <w:hyperlink r:id="rId20">
         <w:r>
           <w:rPr>
             <w:color w:val="0563C1"/>
@@ -19704,12 +19726,12 @@
         <w:ind w:left="709" w:hanging="709"/>
         <w:jc w:val="both"/>
       </w:pPr>
-      <w:bookmarkStart w:id="142" w:name="Ref_stern1962significance"/>
-      <w:r>
-        <w:rPr>
-          <w:rFonts w:cs="Times New Roman"/>
-        </w:rPr>
-        <w:t>&lt;a id="ref-43"&gt;&lt;/a&gt;&lt;a id="ref-stern1962"&gt;&lt;/a&gt;43. Stern, H. (1962). The significance of impulse buying today. Journal of Marketing, 26(2):59–62.</w:t>
+      <w:bookmarkStart w:id="142" w:name="Ref_sugiyono2019metode"/>
+      <w:r>
+        <w:rPr>
+          <w:rFonts w:cs="Times New Roman"/>
+        </w:rPr>
+        <w:t>&lt;a id="ref-43"&gt;&lt;/a&gt;43. Stern, H. (1962). The significance of impulse buying today. Journal of Marketing, 26(2):59–62.</w:t>
       </w:r>
       <w:bookmarkEnd w:id="142"/>
     </w:p>
@@ -19719,12 +19741,12 @@
         <w:ind w:left="709" w:hanging="709"/>
         <w:jc w:val="both"/>
       </w:pPr>
-      <w:bookmarkStart w:id="143" w:name="Ref_sugiyono2019metode"/>
-      <w:r>
-        <w:rPr>
-          <w:rFonts w:cs="Times New Roman"/>
-        </w:rPr>
-        <w:t>&lt;a id="ref-44"&gt;&lt;/a&gt;&lt;a id="ref-sugiyono2019"&gt;&lt;/a&gt;44. Sugiyono (2019). Metode Penelitian Kuantitatif, Kualitatif, dan R&amp;D. Alfabeta, Bandung.</w:t>
+      <w:bookmarkStart w:id="143" w:name="Ref_sultan2012building"/>
+      <w:r>
+        <w:rPr>
+          <w:rFonts w:cs="Times New Roman"/>
+        </w:rPr>
+        <w:t>&lt;a id="ref-44"&gt;&lt;/a&gt;44. Sugiyono (2019). Metode Penelitian Kuantitatif, Kualitatif, dan R&amp;D. Alfabeta, Bandung.</w:t>
       </w:r>
       <w:bookmarkEnd w:id="143"/>
     </w:p>
@@ -19734,13 +19756,12 @@
         <w:ind w:left="709" w:hanging="709"/>
         <w:jc w:val="both"/>
       </w:pPr>
-      <w:bookmarkStart w:id="144" w:name="Ref_sultan2012building"/>
-      <w:r>
-        <w:rPr>
-          <w:rFonts w:cs="Times New Roman"/>
-        </w:rPr>
-        <w:lastRenderedPageBreak/>
-        <w:t>&lt;a id="ref-45"&gt;&lt;/a&gt;&lt;a id="ref-sultan2012"&gt;&lt;/a&gt;45. Sultan, A. J., Joireman, J., and Sprott, D. E. (2012). Building consumer self-control: The effect of self-control exercises on impulse buying urges. Marketing Letters, 23(1):61–72.</w:t>
+      <w:bookmarkStart w:id="144" w:name="Ref_tangney2004high"/>
+      <w:r>
+        <w:rPr>
+          <w:rFonts w:cs="Times New Roman"/>
+        </w:rPr>
+        <w:t>&lt;a id="ref-45"&gt;&lt;/a&gt;45. Sultan, A. J., Joireman, J., and Sprott, D. E. (2012). Building consumer self-control: The effect of self-control exercises on impulse buying urges. Marketing Letters, 23(1):61–72.</w:t>
       </w:r>
       <w:bookmarkEnd w:id="144"/>
     </w:p>
@@ -19750,12 +19771,12 @@
         <w:ind w:left="709" w:hanging="709"/>
         <w:jc w:val="both"/>
       </w:pPr>
-      <w:bookmarkStart w:id="145" w:name="Ref_tangney2004high"/>
-      <w:r>
-        <w:rPr>
-          <w:rFonts w:cs="Times New Roman"/>
-        </w:rPr>
-        <w:t>&lt;a id="ref-46"&gt;&lt;/a&gt;&lt;a id="ref-tangney2004"&gt;&lt;/a&gt;46. Tangney, J. P., Baumeister, R. F., and Boone, A. L. (2004). High self-control predicts good adjustment, less pathology, better grades, and interpersonal success. Journal of Personality, 72(2):271–324.</w:t>
+      <w:bookmarkStart w:id="145" w:name="Ref_thaler1985mental"/>
+      <w:r>
+        <w:rPr>
+          <w:rFonts w:cs="Times New Roman"/>
+        </w:rPr>
+        <w:t>&lt;a id="ref-46"&gt;&lt;/a&gt;46. Tangney, J. P., Baumeister, R. F., and Boone, A. L. (2004). High self-control predicts good adjustment, less pathology, better grades, and interpersonal success. Journal of Personality, 72(2):271–324.</w:t>
       </w:r>
       <w:bookmarkEnd w:id="145"/>
     </w:p>
@@ -19765,12 +19786,13 @@
         <w:ind w:left="709" w:hanging="709"/>
         <w:jc w:val="both"/>
       </w:pPr>
-      <w:bookmarkStart w:id="146" w:name="Ref_thaler1985mental"/>
-      <w:r>
-        <w:rPr>
-          <w:rFonts w:cs="Times New Roman"/>
-        </w:rPr>
-        <w:t>&lt;a id="ref-47"&gt;&lt;/a&gt;&lt;a id="ref-thaler1985"&gt;&lt;/a&gt;47. Thaler, R. (1985). Mental accounting and consumer choice. Marketing Science, 4(3):199–214.</w:t>
+      <w:bookmarkStart w:id="146" w:name="Ref_thaler1981economic"/>
+      <w:r>
+        <w:rPr>
+          <w:rFonts w:cs="Times New Roman"/>
+        </w:rPr>
+        <w:lastRenderedPageBreak/>
+        <w:t>&lt;a id="ref-47"&gt;&lt;/a&gt;47. Thaler, R. (1985). Mental accounting and consumer choice. Marketing Science, 4(3):199–214.</w:t>
       </w:r>
       <w:bookmarkEnd w:id="146"/>
     </w:p>
@@ -19780,12 +19802,12 @@
         <w:ind w:left="709" w:hanging="709"/>
         <w:jc w:val="both"/>
       </w:pPr>
-      <w:bookmarkStart w:id="147" w:name="Ref_thaler1981economic"/>
-      <w:r>
-        <w:rPr>
-          <w:rFonts w:cs="Times New Roman"/>
-        </w:rPr>
-        <w:t>&lt;a id="ref-48"&gt;&lt;/a&gt;&lt;a id="ref-thaler1981"&gt;&lt;/a&gt;48. Thaler, R. H. and Shefrin, H. M. (1981). An economic theory of self-control. Journal of Political Economy, 89(2):392–406.</w:t>
+      <w:bookmarkStart w:id="147" w:name="Ref_pokemoncompany2024"/>
+      <w:r>
+        <w:rPr>
+          <w:rFonts w:cs="Times New Roman"/>
+        </w:rPr>
+        <w:t>&lt;a id="ref-48"&gt;&lt;/a&gt;48. Thaler, R. H. and Shefrin, H. M. (1981). An economic theory of self-control. Journal of Political Economy, 89(2):392–406.</w:t>
       </w:r>
       <w:bookmarkEnd w:id="147"/>
     </w:p>
@@ -19795,33 +19817,12 @@
         <w:ind w:left="709" w:hanging="709"/>
         <w:jc w:val="both"/>
       </w:pPr>
-      <w:bookmarkStart w:id="148" w:name="Ref_pokemoncompany2024"/>
-      <w:r>
-        <w:rPr>
-          <w:rFonts w:cs="Times New Roman"/>
-        </w:rPr>
-        <w:t>&lt;a id="ref-49"&gt;&lt;/a&gt;&lt;a id="ref-the2024"&gt;&lt;/a&gt;49. The Pokémon Company (2024). Corporate business data and trading card game historical production statistics. Laporan Resmi Korporat, Tokyo: The Pokémon Company. Tersedia di:</w:t>
-      </w:r>
-      <w:r>
-        <w:rPr>
-          <w:rFonts w:cs="Times New Roman"/>
-        </w:rPr>
-        <w:t xml:space="preserve"> </w:t>
-      </w:r>
-      <w:hyperlink r:id="rId20">
-        <w:r>
-          <w:rPr>
-            <w:color w:val="0563C1"/>
-            <w:u w:val="single"/>
-          </w:rPr>
-          <w:t>https://corporate.pokemon.co.jp/en/aboutus/figures/</w:t>
-        </w:r>
-      </w:hyperlink>
-      <w:r>
-        <w:rPr>
-          <w:rFonts w:cs="Times New Roman"/>
-        </w:rPr>
-        <w:t xml:space="preserve"> (Diakses 15 Januari 2025).</w:t>
+      <w:bookmarkStart w:id="148" w:name="Ref_tirtayasa2020effect"/>
+      <w:r>
+        <w:rPr>
+          <w:rFonts w:cs="Times New Roman"/>
+        </w:rPr>
+        <w:t>&lt;a id="ref-49"&gt;&lt;/a&gt;49. Tirtayasa, S., Nevianda, M., and Syahrial, H. (2020). The effect of hedonic shopping motivation, shopping lifestyle and fashion involvement with impulse buying. International Journal of Business Economics, 2(1):18–28.</w:t>
       </w:r>
       <w:bookmarkEnd w:id="148"/>
     </w:p>
@@ -19831,12 +19832,12 @@
         <w:ind w:left="709" w:hanging="709"/>
         <w:jc w:val="both"/>
       </w:pPr>
-      <w:bookmarkStart w:id="149" w:name="Ref_tirtayasa2020effect"/>
-      <w:r>
-        <w:rPr>
-          <w:rFonts w:cs="Times New Roman"/>
-        </w:rPr>
-        <w:t>&lt;a id="ref-50"&gt;&lt;/a&gt;&lt;a id="ref-tirtayasa2020"&gt;&lt;/a&gt;50. Tirtayasa, S., Nevianda, M., and Syahrial, H. (2020). The effect of hedonic shopping motivation, shopping lifestyle and fashion involvement with impulse buying. International Journal of Business Economics, 2(1):18–28.</w:t>
+      <w:bookmarkStart w:id="149" w:name="Ref_verplanken2001individual"/>
+      <w:r>
+        <w:rPr>
+          <w:rFonts w:cs="Times New Roman"/>
+        </w:rPr>
+        <w:t>&lt;a id="ref-50"&gt;&lt;/a&gt;50. Verplanken, B. and Herabadi, A. (2001). Individual differences in impulse buying tendency: Feeling and no thinking. European Journal of Personality, 15(S1):S71–S83.</w:t>
       </w:r>
       <w:bookmarkEnd w:id="149"/>
     </w:p>
@@ -19846,12 +19847,12 @@
         <w:ind w:left="709" w:hanging="709"/>
         <w:jc w:val="both"/>
       </w:pPr>
-      <w:bookmarkStart w:id="150" w:name="Ref_verplanken2001individual"/>
-      <w:r>
-        <w:rPr>
-          <w:rFonts w:cs="Times New Roman"/>
-        </w:rPr>
-        <w:t>&lt;a id="ref-51"&gt;&lt;/a&gt;&lt;a id="ref-verplanken2001"&gt;&lt;/a&gt;51. Verplanken, B. and Herabadi, A. (2001). Individual differences in impulse buying tendency: Feeling and no thinking. European Journal of Personality, 15(S1):S71–S83.</w:t>
+      <w:bookmarkStart w:id="150" w:name="Ref_vohs2007spent"/>
+      <w:r>
+        <w:rPr>
+          <w:rFonts w:cs="Times New Roman"/>
+        </w:rPr>
+        <w:t>&lt;a id="ref-51"&gt;&lt;/a&gt;51. Vohs, K. D. and Faber, R. J. (2007). Spent resources: Self-regulatory resource depletion and impulsive buying. Journal of Consumer Research, 33(4):537–547.</w:t>
       </w:r>
       <w:bookmarkEnd w:id="150"/>
     </w:p>
@@ -19861,12 +19862,12 @@
         <w:ind w:left="709" w:hanging="709"/>
         <w:jc w:val="both"/>
       </w:pPr>
-      <w:bookmarkStart w:id="151" w:name="Ref_vohs2007spent"/>
-      <w:r>
-        <w:rPr>
-          <w:rFonts w:cs="Times New Roman"/>
-        </w:rPr>
-        <w:t>&lt;a id="ref-52"&gt;&lt;/a&gt;&lt;a id="ref-vohs2007"&gt;&lt;/a&gt;52. Vohs, K. D. and Faber, R. J. (2007). Spent resources: Self-regulatory resource depletion and impulsive buying. Journal of Consumer Research, 33(4):537–547.</w:t>
+      <w:bookmarkStart w:id="151" w:name="Ref_zeigarnik1927behalten"/>
+      <w:r>
+        <w:rPr>
+          <w:rFonts w:cs="Times New Roman"/>
+        </w:rPr>
+        <w:t>&lt;a id="ref-52"&gt;&lt;/a&gt;52. Zeigarnik, B. (1927). Ueber das Behalten von erledigten und unerledigten Handlungen. Psychologische Forschung, 9:1–85.</w:t>
       </w:r>
       <w:bookmarkEnd w:id="151"/>
     </w:p>
@@ -19876,12 +19877,12 @@
         <w:ind w:left="709" w:hanging="709"/>
         <w:jc w:val="both"/>
       </w:pPr>
-      <w:bookmarkStart w:id="152" w:name="Ref_zeigarnik1927behalten"/>
-      <w:r>
-        <w:rPr>
-          <w:rFonts w:cs="Times New Roman"/>
-        </w:rPr>
-        <w:t>&lt;a id="ref-53"&gt;&lt;/a&gt;&lt;a id="ref-zeigarnik1927"&gt;&lt;/a&gt;53. Zeigarnik, B. (1927). Ueber das Behalten von erledigten und unerledigten Handlungen. Psychologische Forschung, 9:1–85.</w:t>
+      <w:bookmarkStart w:id="152" w:name="Ref_zhang2022uncertainty"/>
+      <w:r>
+        <w:rPr>
+          <w:rFonts w:cs="Times New Roman"/>
+        </w:rPr>
+        <w:t>&lt;a id="ref-53"&gt;&lt;/a&gt;53. Zhang, Y. and Zhang, T. (2022). The effect of blind box product uncertainty on consumers' purchase intention: The mediating role of perceived value and the moderating role of purchase intention. Frontiers in Psychology, 13:946527.</w:t>
       </w:r>
       <w:bookmarkEnd w:id="152"/>
     </w:p>
@@ -19896,7 +19897,7 @@
         <w:rPr>
           <w:rFonts w:cs="Times New Roman"/>
         </w:rPr>
-        <w:t>&lt;a id="ref-54"&gt;&lt;/a&gt;&lt;a id="ref-zheng2019"&gt;&lt;/a&gt;54. Zheng, X., Men, J., Yang, F., and Gong, X. (2019). Understanding impulse buying in mobile commerce: An investigation into hedonic and utilitarian browsing. International Journal of Information Management, 48:151–160.</w:t>
+        <w:t>&lt;a id="ref-54"&gt;&lt;/a&gt;54. Zheng, X., Men, J., Yang, F., and Gong, X. (2019). Understanding impulse buying in mobile commerce: An investigation into hedonic and utilitarian browsing. International Journal of Information Management, 48:151–160.</w:t>
       </w:r>
       <w:bookmarkEnd w:id="153"/>
     </w:p>
@@ -20243,31 +20244,31 @@
       </w:rPr>
     </w:lvl>
   </w:abstractNum>
-  <w:num w:numId="1" w16cid:durableId="1640768386">
+  <w:num w:numId="1" w16cid:durableId="2107651176">
     <w:abstractNumId w:val="8"/>
   </w:num>
-  <w:num w:numId="2" w16cid:durableId="235208976">
+  <w:num w:numId="2" w16cid:durableId="1140612509">
     <w:abstractNumId w:val="6"/>
   </w:num>
-  <w:num w:numId="3" w16cid:durableId="1296835129">
+  <w:num w:numId="3" w16cid:durableId="466514219">
     <w:abstractNumId w:val="5"/>
   </w:num>
-  <w:num w:numId="4" w16cid:durableId="963586466">
+  <w:num w:numId="4" w16cid:durableId="1266814056">
     <w:abstractNumId w:val="4"/>
   </w:num>
-  <w:num w:numId="5" w16cid:durableId="111636163">
+  <w:num w:numId="5" w16cid:durableId="1566837415">
     <w:abstractNumId w:val="7"/>
   </w:num>
-  <w:num w:numId="6" w16cid:durableId="1521117191">
+  <w:num w:numId="6" w16cid:durableId="1799686345">
     <w:abstractNumId w:val="3"/>
   </w:num>
-  <w:num w:numId="7" w16cid:durableId="1154372795">
+  <w:num w:numId="7" w16cid:durableId="1194148552">
     <w:abstractNumId w:val="2"/>
   </w:num>
-  <w:num w:numId="8" w16cid:durableId="2075277364">
+  <w:num w:numId="8" w16cid:durableId="663553181">
     <w:abstractNumId w:val="1"/>
   </w:num>
-  <w:num w:numId="9" w16cid:durableId="823201640">
+  <w:num w:numId="9" w16cid:durableId="1799184582">
     <w:abstractNumId w:val="0"/>
   </w:num>
 </w:numbering>
@@ -31708,7 +31709,7 @@
     <w:autoRedefine/>
     <w:uiPriority w:val="39"/>
     <w:unhideWhenUsed/>
-    <w:rsid w:val="006F09E1"/>
+    <w:rsid w:val="00C138A1"/>
     <w:pPr>
       <w:spacing w:after="40" w:line="240" w:lineRule="auto"/>
     </w:pPr>
@@ -31724,7 +31725,7 @@
     <w:autoRedefine/>
     <w:uiPriority w:val="39"/>
     <w:unhideWhenUsed/>
-    <w:rsid w:val="006F09E1"/>
+    <w:rsid w:val="00C138A1"/>
     <w:pPr>
       <w:spacing w:after="40" w:line="240" w:lineRule="auto"/>
       <w:ind w:left="360"/>
@@ -31740,7 +31741,7 @@
     <w:autoRedefine/>
     <w:uiPriority w:val="39"/>
     <w:unhideWhenUsed/>
-    <w:rsid w:val="006F09E1"/>
+    <w:rsid w:val="00C138A1"/>
     <w:pPr>
       <w:spacing w:after="40" w:line="240" w:lineRule="auto"/>
       <w:ind w:left="720"/>
@@ -31755,7 +31756,7 @@
     <w:basedOn w:val="DefaultParagraphFont"/>
     <w:uiPriority w:val="99"/>
     <w:unhideWhenUsed/>
-    <w:rsid w:val="006F09E1"/>
+    <w:rsid w:val="00C138A1"/>
     <w:rPr>
       <w:color w:val="0000FF" w:themeColor="hyperlink"/>
       <w:u w:val="single"/>

</xml_diff>

<commit_message>
fix(manuscript): repair TOC anchors via phantomsection, resync statics, fix n.s. desync, drop stray bookmark; add field instruments and kickoff Opsi 8-10
PDF 51 hlm settled, 6/6 TOC CORRECT; DOCX rebuilt 46 TOC 185 sitasi 54 DP; extended 11/11 PASS, 0 sitasi mati; graphify 2498 nodes. Sesi 41-47.
</commit_message>
<xml_diff>
--- a/01_Naskah_Utama/Proposal_Arthur_PokemonTCG.docx
+++ b/01_Naskah_Utama/Proposal_Arthur_PokemonTCG.docx
@@ -12,7 +12,7 @@
           <w:noProof/>
         </w:rPr>
         <w:drawing>
-          <wp:inline distT="0" distB="0" distL="0" distR="0" wp14:anchorId="5AAC0408" wp14:editId="14237DFA">
+          <wp:inline distT="0" distB="0" distL="0" distR="0" wp14:anchorId="09B5E8AE" wp14:editId="22AC12BC">
             <wp:extent cx="1152000" cy="1152000"/>
             <wp:effectExtent l="0" t="0" r="0" b="0"/>
             <wp:docPr id="1" name="Picture 1"/>
@@ -297,11 +297,10 @@
           <w:color w:val="auto"/>
           <w:kern w:val="2"/>
           <w:szCs w:val="24"/>
-          <w:lang w:val="en-ID" w:eastAsia="en-ID"/>
           <w14:ligatures w14:val="standardContextual"/>
         </w:rPr>
       </w:pPr>
-      <w:hyperlink w:anchor="_Toc241678168" w:history="1">
+      <w:hyperlink w:anchor="_Toc241753622" w:history="1">
         <w:r>
           <w:rPr>
             <w:noProof/>
@@ -332,7 +331,6 @@
           <w:color w:val="auto"/>
           <w:kern w:val="2"/>
           <w:szCs w:val="24"/>
-          <w:lang w:val="en-ID" w:eastAsia="en-ID"/>
           <w14:ligatures w14:val="standardContextual"/>
         </w:rPr>
       </w:pPr>
@@ -367,7 +365,6 @@
           <w:color w:val="auto"/>
           <w:kern w:val="2"/>
           <w:szCs w:val="24"/>
-          <w:lang w:val="en-ID" w:eastAsia="en-ID"/>
           <w14:ligatures w14:val="standardContextual"/>
         </w:rPr>
       </w:pPr>
@@ -401,7 +398,6 @@
           <w:color w:val="auto"/>
           <w:kern w:val="2"/>
           <w:szCs w:val="24"/>
-          <w:lang w:val="en-ID" w:eastAsia="en-ID"/>
           <w14:ligatures w14:val="standardContextual"/>
         </w:rPr>
       </w:pPr>
@@ -435,7 +431,6 @@
           <w:color w:val="auto"/>
           <w:kern w:val="2"/>
           <w:szCs w:val="24"/>
-          <w:lang w:val="en-ID" w:eastAsia="en-ID"/>
           <w14:ligatures w14:val="standardContextual"/>
         </w:rPr>
       </w:pPr>
@@ -469,7 +464,6 @@
           <w:color w:val="auto"/>
           <w:kern w:val="2"/>
           <w:szCs w:val="24"/>
-          <w:lang w:val="en-ID" w:eastAsia="en-ID"/>
           <w14:ligatures w14:val="standardContextual"/>
         </w:rPr>
       </w:pPr>
@@ -503,7 +497,6 @@
           <w:color w:val="auto"/>
           <w:kern w:val="2"/>
           <w:szCs w:val="24"/>
-          <w:lang w:val="en-ID" w:eastAsia="en-ID"/>
           <w14:ligatures w14:val="standardContextual"/>
         </w:rPr>
       </w:pPr>
@@ -521,7 +514,7 @@
             <w:color w:val="000000"/>
           </w:rPr>
           <w:tab/>
-          <w:t>13</w:t>
+          <w:t>12</w:t>
         </w:r>
       </w:hyperlink>
     </w:p>
@@ -538,7 +531,6 @@
           <w:kern w:val="2"/>
           <w:sz w:val="24"/>
           <w:szCs w:val="24"/>
-          <w:lang w:val="en-ID" w:eastAsia="en-ID"/>
           <w14:ligatures w14:val="standardContextual"/>
         </w:rPr>
       </w:pPr>
@@ -573,7 +565,6 @@
           <w:kern w:val="2"/>
           <w:sz w:val="24"/>
           <w:szCs w:val="24"/>
-          <w:lang w:val="en-ID" w:eastAsia="en-ID"/>
           <w14:ligatures w14:val="standardContextual"/>
         </w:rPr>
       </w:pPr>
@@ -591,7 +582,7 @@
             <w:color w:val="000000"/>
           </w:rPr>
           <w:tab/>
-          <w:t>14</w:t>
+          <w:t>13</w:t>
         </w:r>
       </w:hyperlink>
     </w:p>
@@ -608,7 +599,6 @@
           <w:color w:val="auto"/>
           <w:kern w:val="2"/>
           <w:szCs w:val="24"/>
-          <w:lang w:val="en-ID" w:eastAsia="en-ID"/>
           <w14:ligatures w14:val="standardContextual"/>
         </w:rPr>
       </w:pPr>
@@ -642,7 +632,6 @@
           <w:color w:val="auto"/>
           <w:kern w:val="2"/>
           <w:szCs w:val="24"/>
-          <w:lang w:val="en-ID" w:eastAsia="en-ID"/>
           <w14:ligatures w14:val="standardContextual"/>
         </w:rPr>
       </w:pPr>
@@ -677,7 +666,6 @@
           <w:kern w:val="2"/>
           <w:sz w:val="24"/>
           <w:szCs w:val="24"/>
-          <w:lang w:val="en-ID" w:eastAsia="en-ID"/>
           <w14:ligatures w14:val="standardContextual"/>
         </w:rPr>
       </w:pPr>
@@ -727,7 +715,6 @@
           <w:kern w:val="2"/>
           <w:sz w:val="24"/>
           <w:szCs w:val="24"/>
-          <w:lang w:val="en-ID" w:eastAsia="en-ID"/>
           <w14:ligatures w14:val="standardContextual"/>
         </w:rPr>
       </w:pPr>
@@ -777,7 +764,6 @@
           <w:kern w:val="2"/>
           <w:sz w:val="24"/>
           <w:szCs w:val="24"/>
-          <w:lang w:val="en-ID" w:eastAsia="en-ID"/>
           <w14:ligatures w14:val="standardContextual"/>
         </w:rPr>
       </w:pPr>
@@ -820,7 +806,6 @@
           <w:kern w:val="2"/>
           <w:sz w:val="24"/>
           <w:szCs w:val="24"/>
-          <w:lang w:val="en-ID" w:eastAsia="en-ID"/>
           <w14:ligatures w14:val="standardContextual"/>
         </w:rPr>
       </w:pPr>
@@ -869,7 +854,6 @@
           <w:color w:val="auto"/>
           <w:kern w:val="2"/>
           <w:szCs w:val="24"/>
-          <w:lang w:val="en-ID" w:eastAsia="en-ID"/>
           <w14:ligatures w14:val="standardContextual"/>
         </w:rPr>
       </w:pPr>
@@ -904,7 +888,6 @@
           <w:kern w:val="2"/>
           <w:sz w:val="24"/>
           <w:szCs w:val="24"/>
-          <w:lang w:val="en-ID" w:eastAsia="en-ID"/>
           <w14:ligatures w14:val="standardContextual"/>
         </w:rPr>
       </w:pPr>
@@ -969,7 +952,6 @@
           <w:kern w:val="2"/>
           <w:sz w:val="24"/>
           <w:szCs w:val="24"/>
-          <w:lang w:val="en-ID" w:eastAsia="en-ID"/>
           <w14:ligatures w14:val="standardContextual"/>
         </w:rPr>
       </w:pPr>
@@ -1034,7 +1016,6 @@
           <w:kern w:val="2"/>
           <w:sz w:val="24"/>
           <w:szCs w:val="24"/>
-          <w:lang w:val="en-ID" w:eastAsia="en-ID"/>
           <w14:ligatures w14:val="standardContextual"/>
         </w:rPr>
       </w:pPr>
@@ -1099,7 +1080,6 @@
           <w:kern w:val="2"/>
           <w:sz w:val="24"/>
           <w:szCs w:val="24"/>
-          <w:lang w:val="en-ID" w:eastAsia="en-ID"/>
           <w14:ligatures w14:val="standardContextual"/>
         </w:rPr>
       </w:pPr>
@@ -1164,7 +1144,6 @@
           <w:kern w:val="2"/>
           <w:sz w:val="24"/>
           <w:szCs w:val="24"/>
-          <w:lang w:val="en-ID" w:eastAsia="en-ID"/>
           <w14:ligatures w14:val="standardContextual"/>
         </w:rPr>
       </w:pPr>
@@ -1228,7 +1207,6 @@
           <w:color w:val="auto"/>
           <w:kern w:val="2"/>
           <w:szCs w:val="24"/>
-          <w:lang w:val="en-ID" w:eastAsia="en-ID"/>
           <w14:ligatures w14:val="standardContextual"/>
         </w:rPr>
       </w:pPr>
@@ -1262,7 +1240,6 @@
           <w:color w:val="auto"/>
           <w:kern w:val="2"/>
           <w:szCs w:val="24"/>
-          <w:lang w:val="en-ID" w:eastAsia="en-ID"/>
           <w14:ligatures w14:val="standardContextual"/>
         </w:rPr>
       </w:pPr>
@@ -1297,7 +1274,6 @@
           <w:kern w:val="2"/>
           <w:sz w:val="24"/>
           <w:szCs w:val="24"/>
-          <w:lang w:val="en-ID" w:eastAsia="en-ID"/>
           <w14:ligatures w14:val="standardContextual"/>
         </w:rPr>
       </w:pPr>
@@ -1355,7 +1331,6 @@
           <w:kern w:val="2"/>
           <w:sz w:val="24"/>
           <w:szCs w:val="24"/>
-          <w:lang w:val="en-ID" w:eastAsia="en-ID"/>
           <w14:ligatures w14:val="standardContextual"/>
         </w:rPr>
       </w:pPr>
@@ -1413,7 +1388,6 @@
           <w:kern w:val="2"/>
           <w:sz w:val="24"/>
           <w:szCs w:val="24"/>
-          <w:lang w:val="en-ID" w:eastAsia="en-ID"/>
           <w14:ligatures w14:val="standardContextual"/>
         </w:rPr>
       </w:pPr>
@@ -1471,7 +1445,6 @@
           <w:kern w:val="2"/>
           <w:sz w:val="24"/>
           <w:szCs w:val="24"/>
-          <w:lang w:val="en-ID" w:eastAsia="en-ID"/>
           <w14:ligatures w14:val="standardContextual"/>
         </w:rPr>
       </w:pPr>
@@ -1544,7 +1517,6 @@
           <w:kern w:val="2"/>
           <w:sz w:val="24"/>
           <w:szCs w:val="24"/>
-          <w:lang w:val="en-ID" w:eastAsia="en-ID"/>
           <w14:ligatures w14:val="standardContextual"/>
         </w:rPr>
       </w:pPr>
@@ -1617,7 +1589,6 @@
           <w:kern w:val="2"/>
           <w:sz w:val="24"/>
           <w:szCs w:val="24"/>
-          <w:lang w:val="en-ID" w:eastAsia="en-ID"/>
           <w14:ligatures w14:val="standardContextual"/>
         </w:rPr>
       </w:pPr>
@@ -1689,7 +1660,6 @@
           <w:color w:val="auto"/>
           <w:kern w:val="2"/>
           <w:szCs w:val="24"/>
-          <w:lang w:val="en-ID" w:eastAsia="en-ID"/>
           <w14:ligatures w14:val="standardContextual"/>
         </w:rPr>
       </w:pPr>
@@ -1724,7 +1694,6 @@
           <w:color w:val="auto"/>
           <w:kern w:val="2"/>
           <w:szCs w:val="24"/>
-          <w:lang w:val="en-ID" w:eastAsia="en-ID"/>
           <w14:ligatures w14:val="standardContextual"/>
         </w:rPr>
       </w:pPr>
@@ -1758,7 +1727,6 @@
           <w:color w:val="auto"/>
           <w:kern w:val="2"/>
           <w:szCs w:val="24"/>
-          <w:lang w:val="en-ID" w:eastAsia="en-ID"/>
           <w14:ligatures w14:val="standardContextual"/>
         </w:rPr>
       </w:pPr>
@@ -1793,7 +1761,6 @@
           <w:kern w:val="2"/>
           <w:sz w:val="24"/>
           <w:szCs w:val="24"/>
-          <w:lang w:val="en-ID" w:eastAsia="en-ID"/>
           <w14:ligatures w14:val="standardContextual"/>
         </w:rPr>
       </w:pPr>
@@ -1827,7 +1794,6 @@
           <w:color w:val="auto"/>
           <w:kern w:val="2"/>
           <w:szCs w:val="24"/>
-          <w:lang w:val="en-ID" w:eastAsia="en-ID"/>
           <w14:ligatures w14:val="standardContextual"/>
         </w:rPr>
       </w:pPr>
@@ -1862,7 +1828,6 @@
           <w:kern w:val="2"/>
           <w:sz w:val="24"/>
           <w:szCs w:val="24"/>
-          <w:lang w:val="en-ID" w:eastAsia="en-ID"/>
           <w14:ligatures w14:val="standardContextual"/>
         </w:rPr>
       </w:pPr>
@@ -1897,7 +1862,6 @@
           <w:kern w:val="2"/>
           <w:sz w:val="24"/>
           <w:szCs w:val="24"/>
-          <w:lang w:val="en-ID" w:eastAsia="en-ID"/>
           <w14:ligatures w14:val="standardContextual"/>
         </w:rPr>
       </w:pPr>
@@ -1932,7 +1896,6 @@
           <w:kern w:val="2"/>
           <w:sz w:val="24"/>
           <w:szCs w:val="24"/>
-          <w:lang w:val="en-ID" w:eastAsia="en-ID"/>
           <w14:ligatures w14:val="standardContextual"/>
         </w:rPr>
       </w:pPr>
@@ -1967,7 +1930,6 @@
           <w:kern w:val="2"/>
           <w:sz w:val="24"/>
           <w:szCs w:val="24"/>
-          <w:lang w:val="en-ID" w:eastAsia="en-ID"/>
           <w14:ligatures w14:val="standardContextual"/>
         </w:rPr>
       </w:pPr>
@@ -2002,7 +1964,6 @@
           <w:kern w:val="2"/>
           <w:sz w:val="24"/>
           <w:szCs w:val="24"/>
-          <w:lang w:val="en-ID" w:eastAsia="en-ID"/>
           <w14:ligatures w14:val="standardContextual"/>
         </w:rPr>
       </w:pPr>
@@ -2036,7 +1997,6 @@
           <w:color w:val="auto"/>
           <w:kern w:val="2"/>
           <w:szCs w:val="24"/>
-          <w:lang w:val="en-ID" w:eastAsia="en-ID"/>
           <w14:ligatures w14:val="standardContextual"/>
         </w:rPr>
       </w:pPr>
@@ -2070,7 +2030,6 @@
           <w:color w:val="auto"/>
           <w:kern w:val="2"/>
           <w:szCs w:val="24"/>
-          <w:lang w:val="en-ID" w:eastAsia="en-ID"/>
           <w14:ligatures w14:val="standardContextual"/>
         </w:rPr>
       </w:pPr>
@@ -2104,7 +2063,6 @@
           <w:color w:val="auto"/>
           <w:kern w:val="2"/>
           <w:szCs w:val="24"/>
-          <w:lang w:val="en-ID" w:eastAsia="en-ID"/>
           <w14:ligatures w14:val="standardContextual"/>
         </w:rPr>
       </w:pPr>
@@ -2139,7 +2097,6 @@
           <w:kern w:val="2"/>
           <w:sz w:val="24"/>
           <w:szCs w:val="24"/>
-          <w:lang w:val="en-ID" w:eastAsia="en-ID"/>
           <w14:ligatures w14:val="standardContextual"/>
         </w:rPr>
       </w:pPr>
@@ -2173,7 +2130,6 @@
           <w:color w:val="auto"/>
           <w:kern w:val="2"/>
           <w:szCs w:val="24"/>
-          <w:lang w:val="en-ID" w:eastAsia="en-ID"/>
           <w14:ligatures w14:val="standardContextual"/>
         </w:rPr>
       </w:pPr>
@@ -2207,7 +2163,6 @@
           <w:color w:val="auto"/>
           <w:kern w:val="2"/>
           <w:szCs w:val="24"/>
-          <w:lang w:val="en-ID" w:eastAsia="en-ID"/>
           <w14:ligatures w14:val="standardContextual"/>
         </w:rPr>
       </w:pPr>
@@ -2242,7 +2197,6 @@
           <w:color w:val="auto"/>
           <w:kern w:val="2"/>
           <w:szCs w:val="24"/>
-          <w:lang w:val="en-ID" w:eastAsia="en-ID"/>
           <w14:ligatures w14:val="standardContextual"/>
         </w:rPr>
       </w:pPr>
@@ -2271,7 +2225,7 @@
         <w:spacing w:after="360"/>
         <w:outlineLvl w:val="0"/>
       </w:pPr>
-      <w:bookmarkStart w:id="1" w:name="_Toc241678168"/>
+      <w:bookmarkStart w:id="1" w:name="_Toc241753622"/>
       <w:r>
         <w:rPr>
           <w:rFonts w:ascii="Times New Roman" w:hAnsi="Times New Roman"/>
@@ -2281,7 +2235,6 @@
         </w:rPr>
         <w:t>DAFTAR TABEL</w:t>
       </w:r>
-      <w:bookmarkEnd w:id="0"/>
       <w:bookmarkEnd w:id="1"/>
     </w:p>
     <w:p>
@@ -2338,7 +2291,7 @@
             <w:b w:val="0"/>
           </w:rPr>
           <w:tab/>
-          <w:t>15</w:t>
+          <w:t>16</w:t>
         </w:r>
       </w:hyperlink>
     </w:p>
@@ -2367,7 +2320,7 @@
             <w:b w:val="0"/>
           </w:rPr>
           <w:tab/>
-          <w:t>23</w:t>
+          <w:t>24</w:t>
         </w:r>
       </w:hyperlink>
     </w:p>
@@ -2396,7 +2349,7 @@
             <w:b w:val="0"/>
           </w:rPr>
           <w:tab/>
-          <w:t>29</w:t>
+          <w:t>32</w:t>
         </w:r>
       </w:hyperlink>
     </w:p>
@@ -2425,7 +2378,7 @@
             <w:b w:val="0"/>
           </w:rPr>
           <w:tab/>
-          <w:t>38</w:t>
+          <w:t>41</w:t>
         </w:r>
       </w:hyperlink>
     </w:p>
@@ -2437,7 +2390,7 @@
         <w:outlineLvl w:val="0"/>
       </w:pPr>
       <w:bookmarkStart w:id="2" w:name="TOC_DAFTAR_GAMBAR"/>
-      <w:bookmarkStart w:id="3" w:name="_Toc241678169"/>
+      <w:bookmarkStart w:id="3" w:name="_Toc241753623"/>
       <w:r>
         <w:rPr>
           <w:rFonts w:ascii="Times New Roman" w:hAnsi="Times New Roman"/>
@@ -2563,7 +2516,7 @@
             <w:b w:val="0"/>
           </w:rPr>
           <w:tab/>
-          <w:t>22</w:t>
+          <w:t>23</w:t>
         </w:r>
       </w:hyperlink>
     </w:p>
@@ -2592,7 +2545,7 @@
             <w:b w:val="0"/>
           </w:rPr>
           <w:tab/>
-          <w:t>36</w:t>
+          <w:t>39</w:t>
         </w:r>
       </w:hyperlink>
     </w:p>
@@ -2616,7 +2569,7 @@
         <w:outlineLvl w:val="0"/>
       </w:pPr>
       <w:bookmarkStart w:id="4" w:name="TOC_BAB_1_PENDAHULUAN"/>
-      <w:bookmarkStart w:id="5" w:name="_Toc241678170"/>
+      <w:bookmarkStart w:id="5" w:name="_Toc241753624"/>
       <w:r>
         <w:rPr>
           <w:rFonts w:ascii="Times New Roman" w:hAnsi="Times New Roman"/>
@@ -2650,11 +2603,24 @@
     </w:p>
     <w:p>
       <w:pPr>
+        <w:spacing w:after="0" w:line="360" w:lineRule="auto"/>
+        <w:ind w:firstLine="709"/>
+        <w:jc w:val="both"/>
+      </w:pPr>
+      <w:r>
+        <w:rPr>
+          <w:rFonts w:cs="Times New Roman"/>
+        </w:rPr>
+        <w:t>\phantomsection</w:t>
+      </w:r>
+    </w:p>
+    <w:p>
+      <w:pPr>
         <w:pStyle w:val="Heading2"/>
         <w:outlineLvl w:val="1"/>
       </w:pPr>
       <w:bookmarkStart w:id="6" w:name="TOC_1_1_LATAR_BELAKANG_PENELITIAN"/>
-      <w:bookmarkStart w:id="7" w:name="_Toc241678171"/>
+      <w:bookmarkStart w:id="7" w:name="_Toc241753625"/>
       <w:r>
         <w:rPr>
           <w:rFonts w:ascii="Times New Roman" w:hAnsi="Times New Roman"/>
@@ -2707,6 +2673,9 @@
       </w:r>
       <w:hyperlink w:anchor="Ref_statista2024pokemon" w:history="1">
         <w:r>
+          <w:rPr>
+            <w:rFonts w:cs="Times New Roman"/>
+          </w:rPr>
           <w:t>(Statista, 2021)</w:t>
         </w:r>
       </w:hyperlink>
@@ -2844,14 +2813,14 @@
         <w:rPr>
           <w:rFonts w:cs="Times New Roman"/>
         </w:rPr>
-        <w:t>); serta lini lisen</w:t>
+        <w:t xml:space="preserve">); </w:t>
       </w:r>
       <w:r>
         <w:rPr>
           <w:rFonts w:cs="Times New Roman"/>
         </w:rPr>
         <w:lastRenderedPageBreak/>
-        <w:t xml:space="preserve">si, gerai </w:t>
+        <w:t xml:space="preserve">serta lini lisensi, gerai </w:t>
       </w:r>
       <w:r>
         <w:rPr>
@@ -2902,8 +2871,9 @@
         <w:rPr>
           <w:noProof/>
         </w:rPr>
+        <w:lastRenderedPageBreak/>
         <w:drawing>
-          <wp:inline distT="0" distB="0" distL="0" distR="0" wp14:anchorId="30A495D8" wp14:editId="351557E3">
+          <wp:inline distT="0" distB="0" distL="0" distR="0" wp14:anchorId="3E5780A0" wp14:editId="3DEE5B28">
             <wp:extent cx="4860000" cy="2980356"/>
             <wp:effectExtent l="0" t="0" r="0" b="0"/>
             <wp:docPr id="2" name="Picture 2"/>
@@ -2950,7 +2920,6 @@
           <w:rFonts w:cs="Times New Roman"/>
           <w:b/>
         </w:rPr>
-        <w:lastRenderedPageBreak/>
         <w:t>Gambar 1.1. Peringkat 10 Waralaba Media Berpendapatan Tertinggi di Dunia Sepanjang Masa</w:t>
       </w:r>
       <w:bookmarkEnd w:id="8"/>
@@ -2983,6 +2952,9 @@
       </w:r>
       <w:hyperlink w:anchor="Ref_statista2024pokemon" w:history="1">
         <w:r>
+          <w:rPr>
+            <w:rFonts w:cs="Times New Roman"/>
+          </w:rPr>
           <w:t>(Statista, 2021)</w:t>
         </w:r>
       </w:hyperlink>
@@ -2990,21 +2962,21 @@
         <w:rPr>
           <w:rFonts w:cs="Times New Roman"/>
         </w:rPr>
-        <w:t>. Bukti empiris ini mengonfirmasi bahwa Pokémon bukan sekadar hiburan musiman anak-anak, melainkan</w:t>
+        <w:t>. Bukti empiris ini mengonfirmasi bahwa Pokémon bukan sekadar hiburan musiman anak</w:t>
       </w:r>
       <w:r>
         <w:rPr>
           <w:rFonts w:cs="Times New Roman"/>
         </w:rPr>
         <w:lastRenderedPageBreak/>
-        <w:t xml:space="preserve"> b</w:t>
+        <w:t>-a</w:t>
       </w:r>
       <w:r>
         <w:rPr>
           <w:rFonts w:cs="Times New Roman"/>
         </w:rPr>
         <w:lastRenderedPageBreak/>
-        <w:t>isnis raksasa yang terus berkembang dan memiliki perputaran pendapatan yang kuat dari generasi ke generasi.</w:t>
+        <w:t>nak, melainkan bisnis raksasa yang terus berkembang dan memiliki perputaran pendapatan yang kuat dari generasi ke generasi.</w:t>
       </w:r>
     </w:p>
     <w:p>
@@ -3062,6 +3034,9 @@
       </w:r>
       <w:hyperlink w:anchor="Ref_pokemoncompany2024" w:history="1">
         <w:r>
+          <w:rPr>
+            <w:rFonts w:cs="Times New Roman"/>
+          </w:rPr>
           <w:t>(The Pokémon Company, 2024)</w:t>
         </w:r>
       </w:hyperlink>
@@ -3122,8 +3097,9 @@
         <w:rPr>
           <w:noProof/>
         </w:rPr>
+        <w:lastRenderedPageBreak/>
         <w:drawing>
-          <wp:inline distT="0" distB="0" distL="0" distR="0" wp14:anchorId="0ED95FD5" wp14:editId="443E22FB">
+          <wp:inline distT="0" distB="0" distL="0" distR="0" wp14:anchorId="7C2BEFFC" wp14:editId="3CA28A50">
             <wp:extent cx="4860000" cy="2719286"/>
             <wp:effectExtent l="0" t="0" r="0" b="0"/>
             <wp:docPr id="3" name="Picture 3"/>
@@ -3170,7 +3146,6 @@
           <w:rFonts w:cs="Times New Roman"/>
           <w:b/>
         </w:rPr>
-        <w:lastRenderedPageBreak/>
         <w:t>Gambar 1.2. Pertumbuhan Kumulatif Produksi Kartu Pokémon TCG Global Tahun 2019–2024</w:t>
       </w:r>
       <w:bookmarkEnd w:id="9"/>
@@ -3209,6 +3184,9 @@
       </w:r>
       <w:hyperlink w:anchor="Ref_pokemoncompany2024" w:history="1">
         <w:r>
+          <w:rPr>
+            <w:rFonts w:cs="Times New Roman"/>
+          </w:rPr>
           <w:t>(The Pokémon Company, 2024)</w:t>
         </w:r>
       </w:hyperlink>
@@ -3248,6 +3226,7 @@
         <w:rPr>
           <w:rFonts w:cs="Times New Roman"/>
         </w:rPr>
+        <w:lastRenderedPageBreak/>
         <w:t>Pada tingkatan yang lebih spesifik, aktivitas pembelian Pokémon TCG sangat terkonsentrasi di Jakarta Barat –- wilayah yang bukan sekadar konsentrasi geografis konsumen, melainkan juga lokasi yang sangat sesuai untuk meneliti perilaku konsumen hobi. Kawasan ini didiami oleh beberapa toko hobi resmi (</w:t>
       </w:r>
       <w:r>
@@ -3313,14 +3292,7 @@
         <w:rPr>
           <w:rFonts w:cs="Times New Roman"/>
         </w:rPr>
-        <w:t xml:space="preserve"> </w:t>
-      </w:r>
-      <w:r>
-        <w:rPr>
-          <w:rFonts w:cs="Times New Roman"/>
-        </w:rPr>
-        <w:lastRenderedPageBreak/>
-        <w:t>di Tanjung Duren memberikan aksesibilitas lapangan yang nyata bagi peneliti untuk melakukan observasi langsung (</w:t>
+        <w:t xml:space="preserve"> di Tanjung Duren memberikan aksesibilitas lapangan yang nyata bagi peneliti untuk melakukan observasi langsung (</w:t>
       </w:r>
       <w:r>
         <w:rPr>
@@ -3428,6 +3400,9 @@
       </w:r>
       <w:hyperlink w:anchor="Ref_pricecharting2024" w:history="1">
         <w:r>
+          <w:rPr>
+            <w:rFonts w:cs="Times New Roman"/>
+          </w:rPr>
           <w:t>(PriceCharting, 2024)</w:t>
         </w:r>
       </w:hyperlink>
@@ -3552,7 +3527,15 @@
           <w:rFonts w:cs="Times New Roman"/>
           <w:b/>
         </w:rPr>
-        <w:t>CGC Cards</w:t>
+        <w:t xml:space="preserve">CGC </w:t>
+      </w:r>
+      <w:r>
+        <w:rPr>
+          <w:rFonts w:cs="Times New Roman"/>
+          <w:b/>
+        </w:rPr>
+        <w:lastRenderedPageBreak/>
+        <w:t>Cards</w:t>
       </w:r>
       <w:r>
         <w:rPr>
@@ -3679,6 +3662,9 @@
       </w:r>
       <w:hyperlink w:anchor="Ref_pricecharting2024" w:history="1">
         <w:r>
+          <w:rPr>
+            <w:rFonts w:cs="Times New Roman"/>
+          </w:rPr>
           <w:t>(PriceCharting, 2024)</w:t>
         </w:r>
       </w:hyperlink>
@@ -3725,14 +3711,7 @@
         <w:rPr>
           <w:rFonts w:cs="Times New Roman"/>
         </w:rPr>
-        <w:t xml:space="preserve"> murah </w:t>
-      </w:r>
-      <w:r>
-        <w:rPr>
-          <w:rFonts w:cs="Times New Roman"/>
-        </w:rPr>
-        <w:lastRenderedPageBreak/>
-        <w:t>dengan harapan menarik kartu berkondisi sempurna untuk digrade dan dijual kembali demi mendulang keuntungan modal (</w:t>
+        <w:t xml:space="preserve"> murah dengan harapan menarik kartu berkondisi sempurna untuk digrade dan dijual kembali demi mendulang keuntungan modal (</w:t>
       </w:r>
       <w:r>
         <w:rPr>
@@ -3797,7 +3776,7 @@
           <w:noProof/>
         </w:rPr>
         <w:drawing>
-          <wp:inline distT="0" distB="0" distL="0" distR="0" wp14:anchorId="1ED0BE4B" wp14:editId="4921052F">
+          <wp:inline distT="0" distB="0" distL="0" distR="0" wp14:anchorId="42A0EAF7" wp14:editId="3262DFA5">
             <wp:extent cx="4860000" cy="2818800"/>
             <wp:effectExtent l="0" t="0" r="0" b="0"/>
             <wp:docPr id="4" name="Picture 4"/>
@@ -3898,7 +3877,14 @@
         <w:rPr>
           <w:rFonts w:cs="Times New Roman"/>
         </w:rPr>
-        <w:t>) hingga menembus 23,7 kali lipat (</w:t>
+        <w:t xml:space="preserve">) </w:t>
+      </w:r>
+      <w:r>
+        <w:rPr>
+          <w:rFonts w:cs="Times New Roman"/>
+        </w:rPr>
+        <w:lastRenderedPageBreak/>
+        <w:t>hingga menembus 23,7 kali lipat (</w:t>
       </w:r>
       <w:r>
         <w:rPr>
@@ -3928,6 +3914,9 @@
       </w:r>
       <w:hyperlink w:anchor="Ref_pricecharting2024" w:history="1">
         <w:r>
+          <w:rPr>
+            <w:rFonts w:cs="Times New Roman"/>
+          </w:rPr>
           <w:t>(PriceCharting, 2024)</w:t>
         </w:r>
       </w:hyperlink>
@@ -4078,14 +4067,7 @@
         <w:rPr>
           <w:rFonts w:cs="Times New Roman"/>
         </w:rPr>
-        <w:t xml:space="preserve">; harga volatil dan dapat berubah). Transferabilitas ke pack Indonesia berbahasa Indonesia dinyatakan </w:t>
-      </w:r>
-      <w:r>
-        <w:rPr>
-          <w:rFonts w:cs="Times New Roman"/>
-        </w:rPr>
-        <w:lastRenderedPageBreak/>
-        <w:t xml:space="preserve">sebagai keterbatasan; sebagai jembatan domestik, pola disparitas searah teramati pada listing Tokopedia/Shopee dan lelang Facebook Indonesia (tanpa generalisasi angka). </w:t>
+        <w:t xml:space="preserve">; harga volatil dan dapat berubah). Transferabilitas ke pack Indonesia berbahasa Indonesia dinyatakan sebagai keterbatasan; sebagai jembatan domestik, pola disparitas searah teramati pada listing Tokopedia/Shopee dan lelang Facebook Indonesia (tanpa generalisasi angka). </w:t>
       </w:r>
       <w:r>
         <w:rPr>
@@ -4225,7 +4207,14 @@
         <w:rPr>
           <w:rFonts w:cs="Times New Roman"/>
         </w:rPr>
-        <w:t xml:space="preserve"> Riset terdahulu umumnya meneliti busana, makanan, atau belanja daring umum. Penelitian ini mengkaji kartu fisik koleksi berlisensi resmi yang memiliki pasar sekunder likuid terstandardisasi (</w:t>
+        <w:t xml:space="preserve"> Riset terdahulu umumnya meneliti busana, makanan, atau belanja daring umum. Penelitian ini mengkaji kartu fisik koleksi </w:t>
+      </w:r>
+      <w:r>
+        <w:rPr>
+          <w:rFonts w:cs="Times New Roman"/>
+        </w:rPr>
+        <w:lastRenderedPageBreak/>
+        <w:t>berlisensi resmi yang memiliki pasar sekunder likuid terstandardisasi (</w:t>
       </w:r>
       <w:r>
         <w:rPr>
@@ -4397,14 +4386,7 @@
         <w:rPr>
           <w:rFonts w:cs="Times New Roman"/>
         </w:rPr>
-        <w:t xml:space="preserve"> yang diprediksi </w:t>
-      </w:r>
-      <w:r>
-        <w:rPr>
-          <w:rFonts w:cs="Times New Roman"/>
-        </w:rPr>
-        <w:lastRenderedPageBreak/>
-        <w:t>memperlemah pengaruh ketiga dorongan tersebut terhadap desakan belanja impulsif.</w:t>
+        <w:t xml:space="preserve"> yang diprediksi memperlemah pengaruh ketiga dorongan tersebut terhadap desakan belanja impulsif.</w:t>
       </w:r>
     </w:p>
     <w:p>
@@ -4421,6 +4403,9 @@
       </w:r>
       <w:hyperlink w:anchor="Ref_stern1962significance" w:history="1">
         <w:r>
+          <w:rPr>
+            <w:rFonts w:cs="Times New Roman"/>
+          </w:rPr>
           <w:t>Stern, 1962</w:t>
         </w:r>
       </w:hyperlink>
@@ -4432,6 +4417,9 @@
       </w:r>
       <w:hyperlink w:anchor="Ref_rook1987buying" w:history="1">
         <w:r>
+          <w:rPr>
+            <w:rFonts w:cs="Times New Roman"/>
+          </w:rPr>
           <w:t>Rook, 1987</w:t>
         </w:r>
       </w:hyperlink>
@@ -4443,6 +4431,9 @@
       </w:r>
       <w:hyperlink w:anchor="Ref_iyer2020impulse" w:history="1">
         <w:r>
+          <w:rPr>
+            <w:rFonts w:cs="Times New Roman"/>
+          </w:rPr>
           <w:t xml:space="preserve">Iyer </w:t>
         </w:r>
         <w:r>
@@ -4467,6 +4458,9 @@
       </w:r>
       <w:hyperlink w:anchor="Ref_amos2014meta" w:history="1">
         <w:r>
+          <w:rPr>
+            <w:rFonts w:cs="Times New Roman"/>
+          </w:rPr>
           <w:t xml:space="preserve">Amos </w:t>
         </w:r>
         <w:r>
@@ -4491,6 +4485,9 @@
       </w:r>
       <w:hyperlink w:anchor="Ref_babin1994work" w:history="1">
         <w:r>
+          <w:rPr>
+            <w:rFonts w:cs="Times New Roman"/>
+          </w:rPr>
           <w:t xml:space="preserve">Babin </w:t>
         </w:r>
         <w:r>
@@ -4515,6 +4512,9 @@
       </w:r>
       <w:hyperlink w:anchor="Ref_arnold2003hedonic" w:history="1">
         <w:r>
+          <w:rPr>
+            <w:rFonts w:cs="Times New Roman"/>
+          </w:rPr>
           <w:t>Arnold and Reynolds, 2003</w:t>
         </w:r>
       </w:hyperlink>
@@ -4526,6 +4526,9 @@
       </w:r>
       <w:hyperlink w:anchor="Ref_gueltekin2012influence" w:history="1">
         <w:r>
+          <w:rPr>
+            <w:rFonts w:cs="Times New Roman"/>
+          </w:rPr>
           <w:t>Gültekin and Özer, 2012</w:t>
         </w:r>
       </w:hyperlink>
@@ -4537,6 +4540,9 @@
       </w:r>
       <w:hyperlink w:anchor="Ref_zeigarnik1927behalten" w:history="1">
         <w:r>
+          <w:rPr>
+            <w:rFonts w:cs="Times New Roman"/>
+          </w:rPr>
           <w:t>Zeigarnik, 1927</w:t>
         </w:r>
       </w:hyperlink>
@@ -4548,6 +4554,9 @@
       </w:r>
       <w:hyperlink w:anchor="Ref_gao2014completing" w:history="1">
         <w:r>
+          <w:rPr>
+            <w:rFonts w:cs="Times New Roman"/>
+          </w:rPr>
           <w:t xml:space="preserve">Gao </w:t>
         </w:r>
         <w:r>
@@ -4572,6 +4581,9 @@
       </w:r>
       <w:hyperlink w:anchor="Ref_barasz2017pseudo" w:history="1">
         <w:r>
+          <w:rPr>
+            <w:rFonts w:cs="Times New Roman"/>
+          </w:rPr>
           <w:t xml:space="preserve">Barasz </w:t>
         </w:r>
         <w:r>
@@ -4596,6 +4608,9 @@
       </w:r>
       <w:hyperlink w:anchor="Ref_belk1995collecting" w:history="1">
         <w:r>
+          <w:rPr>
+            <w:rFonts w:cs="Times New Roman"/>
+          </w:rPr>
           <w:t>Belk, 1995</w:t>
         </w:r>
       </w:hyperlink>
@@ -4620,6 +4635,9 @@
       </w:r>
       <w:hyperlink w:anchor="Ref_shiller2000irrational" w:history="1">
         <w:r>
+          <w:rPr>
+            <w:rFonts w:cs="Times New Roman"/>
+          </w:rPr>
           <w:t>Shiller, 2000</w:t>
         </w:r>
       </w:hyperlink>
@@ -4631,6 +4649,9 @@
       </w:r>
       <w:hyperlink w:anchor="Ref_baur2018bitcoin" w:history="1">
         <w:r>
+          <w:rPr>
+            <w:rFonts w:cs="Times New Roman"/>
+          </w:rPr>
           <w:t xml:space="preserve">Baur </w:t>
         </w:r>
         <w:r>
@@ -4655,6 +4676,9 @@
       </w:r>
       <w:hyperlink w:anchor="Ref_colline2024biases" w:history="1">
         <w:r>
+          <w:rPr>
+            <w:rFonts w:cs="Times New Roman"/>
+          </w:rPr>
           <w:t>Colline, 2024</w:t>
         </w:r>
       </w:hyperlink>
@@ -4666,6 +4690,9 @@
       </w:r>
       <w:hyperlink w:anchor="Ref_qu2023impulse" w:history="1">
         <w:r>
+          <w:rPr>
+            <w:rFonts w:cs="Times New Roman"/>
+          </w:rPr>
           <w:t xml:space="preserve">Qu </w:t>
         </w:r>
         <w:r>
@@ -4690,6 +4717,9 @@
       </w:r>
       <w:hyperlink w:anchor="Ref_amos2014meta" w:history="1">
         <w:r>
+          <w:rPr>
+            <w:rFonts w:cs="Times New Roman"/>
+          </w:rPr>
           <w:t xml:space="preserve">Amos </w:t>
         </w:r>
         <w:r>
@@ -4814,7 +4844,14 @@
         <w:rPr>
           <w:rFonts w:cs="Times New Roman"/>
         </w:rPr>
-        <w:t xml:space="preserve"> berwarna mencolok seharga Rp20.000. Baginya, membeli satu bungkus bukan sekadar membeli lima lembar kertas bergambar, melainkan membeli sensasi kejutan (</w:t>
+        <w:t xml:space="preserve"> berwarna mencolok seharga Rp20.000. Baginya, membeli satu bungkus bukan sekadar membeli lima lembar kertas </w:t>
+      </w:r>
+      <w:r>
+        <w:rPr>
+          <w:rFonts w:cs="Times New Roman"/>
+        </w:rPr>
+        <w:lastRenderedPageBreak/>
+        <w:t>bergambar, melainkan membeli sensasi kejutan (</w:t>
       </w:r>
       <w:r>
         <w:rPr>
@@ -4897,6 +4934,9 @@
       </w:r>
       <w:hyperlink w:anchor="Ref_zeigarnik1927behalten" w:history="1">
         <w:r>
+          <w:rPr>
+            <w:rFonts w:cs="Times New Roman"/>
+          </w:rPr>
           <w:t>(Zeigarnik, 1927)</w:t>
         </w:r>
       </w:hyperlink>
@@ -4904,14 +4944,7 @@
         <w:rPr>
           <w:rFonts w:cs="Times New Roman"/>
         </w:rPr>
-        <w:t xml:space="preserve">. Tekanan mental ini </w:t>
-      </w:r>
-      <w:r>
-        <w:rPr>
-          <w:rFonts w:cs="Times New Roman"/>
-        </w:rPr>
-        <w:lastRenderedPageBreak/>
-        <w:t xml:space="preserve">mendorong hasrat membeli kemasan baru demi menutup slot yang kosong, sebuah dorongan yang penelitian ini sebut </w:t>
+        <w:t xml:space="preserve">. Tekanan mental ini mendorong hasrat membeli kemasan baru demi menutup slot yang kosong, sebuah dorongan yang penelitian ini sebut </w:t>
       </w:r>
       <w:r>
         <w:rPr>
@@ -5174,7 +5207,14 @@
         <w:rPr>
           <w:rFonts w:cs="Times New Roman"/>
         </w:rPr>
-        <w:t>. Perbedaan ini dapat dijelaskan secara teoretis: anggaran ketat meredam dorongan hedonis, kolektor matang berbelanja terencana di pasar sekunder, kesadaran risiko menahan spekulasi, dan kapasitas kontrol diri menipis ketika stimulus memuncak. Perbandingan temuan tersebut dirangkum pada Tabel 1.1; pembahasan tiap variabel beserta hipotesisnya diuraikan pada Bab 2.</w:t>
+        <w:t xml:space="preserve">. Perbedaan ini dapat dijelaskan secara teoretis: anggaran ketat meredam dorongan hedonis, kolektor matang berbelanja terencana di pasar </w:t>
+      </w:r>
+      <w:r>
+        <w:rPr>
+          <w:rFonts w:cs="Times New Roman"/>
+        </w:rPr>
+        <w:lastRenderedPageBreak/>
+        <w:t>sekunder, kesadaran risiko menahan spekulasi, dan kapasitas kontrol diri menipis ketika stimulus memuncak. Perbandingan temuan tersebut dirangkum pada Tabel 1.1; pembahasan tiap variabel beserta hipotesisnya diuraikan pada Bab 2.</w:t>
       </w:r>
     </w:p>
     <w:p>
@@ -5422,7 +5462,6 @@
                 <w:rFonts w:cs="Times New Roman"/>
                 <w:sz w:val="18"/>
               </w:rPr>
-              <w:lastRenderedPageBreak/>
               <w:t>1</w:t>
             </w:r>
           </w:p>
@@ -5489,26 +5528,50 @@
               </w:r>
             </w:hyperlink>
             <w:r>
+              <w:rPr>
+                <w:rFonts w:cs="Times New Roman"/>
+                <w:sz w:val="18"/>
+              </w:rPr>
               <w:t xml:space="preserve">; </w:t>
             </w:r>
             <w:hyperlink w:anchor="Ref_gueltekin2012influence" w:history="1">
               <w:r>
+                <w:rPr>
+                  <w:rFonts w:cs="Times New Roman"/>
+                  <w:sz w:val="18"/>
+                </w:rPr>
                 <w:t>Gültekin dan Özer (2012)</w:t>
               </w:r>
             </w:hyperlink>
             <w:r>
+              <w:rPr>
+                <w:rFonts w:cs="Times New Roman"/>
+                <w:sz w:val="18"/>
+              </w:rPr>
               <w:t xml:space="preserve">; </w:t>
             </w:r>
             <w:hyperlink w:anchor="Ref_pranggabayu2022pengaruh" w:history="1">
               <w:r>
+                <w:rPr>
+                  <w:rFonts w:cs="Times New Roman"/>
+                  <w:sz w:val="18"/>
+                </w:rPr>
                 <w:t>Pranggabayu dan Andjarwati (2022)</w:t>
               </w:r>
             </w:hyperlink>
             <w:r>
+              <w:rPr>
+                <w:rFonts w:cs="Times New Roman"/>
+                <w:sz w:val="18"/>
+              </w:rPr>
               <w:t xml:space="preserve">; </w:t>
             </w:r>
             <w:hyperlink w:anchor="Ref_gong2024unveiling" w:history="1">
               <w:r>
+                <w:rPr>
+                  <w:rFonts w:cs="Times New Roman"/>
+                  <w:sz w:val="18"/>
+                </w:rPr>
                 <w:t xml:space="preserve">Gong </w:t>
               </w:r>
               <w:r>
@@ -5528,10 +5591,18 @@
               </w:r>
             </w:hyperlink>
             <w:r>
+              <w:rPr>
+                <w:rFonts w:cs="Times New Roman"/>
+                <w:sz w:val="18"/>
+              </w:rPr>
               <w:t xml:space="preserve">; </w:t>
             </w:r>
             <w:hyperlink w:anchor="Ref_tirtayasa2020effect" w:history="1">
               <w:r>
+                <w:rPr>
+                  <w:rFonts w:cs="Times New Roman"/>
+                  <w:sz w:val="18"/>
+                </w:rPr>
                 <w:t xml:space="preserve">Tirtayasa </w:t>
               </w:r>
               <w:r>
@@ -5551,10 +5622,18 @@
               </w:r>
             </w:hyperlink>
             <w:r>
+              <w:rPr>
+                <w:rFonts w:cs="Times New Roman"/>
+                <w:sz w:val="18"/>
+              </w:rPr>
               <w:t xml:space="preserve">; </w:t>
             </w:r>
             <w:hyperlink w:anchor="Ref_zheng2019impact" w:history="1">
               <w:r>
+                <w:rPr>
+                  <w:rFonts w:cs="Times New Roman"/>
+                  <w:sz w:val="18"/>
+                </w:rPr>
                 <w:t xml:space="preserve">Zheng </w:t>
               </w:r>
               <w:r>
@@ -5574,6 +5653,10 @@
               </w:r>
             </w:hyperlink>
             <w:r>
+              <w:rPr>
+                <w:rFonts w:cs="Times New Roman"/>
+                <w:sz w:val="18"/>
+              </w:rPr>
               <w:t xml:space="preserve"> (positif signifikan).</w:t>
             </w:r>
           </w:p>
@@ -5601,18 +5684,34 @@
             </w:r>
             <w:hyperlink w:anchor="Ref_thaler1985mental" w:history="1">
               <w:r>
+                <w:rPr>
+                  <w:rFonts w:cs="Times New Roman"/>
+                  <w:sz w:val="18"/>
+                </w:rPr>
                 <w:t>Thaler (1985)</w:t>
               </w:r>
             </w:hyperlink>
             <w:r>
+              <w:rPr>
+                <w:rFonts w:cs="Times New Roman"/>
+                <w:sz w:val="18"/>
+              </w:rPr>
               <w:t xml:space="preserve">; </w:t>
             </w:r>
             <w:hyperlink w:anchor="Ref_thaler1981economic" w:history="1">
               <w:r>
+                <w:rPr>
+                  <w:rFonts w:cs="Times New Roman"/>
+                  <w:sz w:val="18"/>
+                </w:rPr>
                 <w:t>Thaler dan Shefrin (1981)</w:t>
               </w:r>
             </w:hyperlink>
             <w:r>
+              <w:rPr>
+                <w:rFonts w:cs="Times New Roman"/>
+                <w:sz w:val="18"/>
+              </w:rPr>
               <w:t xml:space="preserve"> (tertahan anggaran; bukan temuan tidak signifikan pada kolektibel).</w:t>
             </w:r>
           </w:p>
@@ -5747,10 +5846,18 @@
               </w:r>
             </w:hyperlink>
             <w:r>
+              <w:rPr>
+                <w:rFonts w:cs="Times New Roman"/>
+                <w:sz w:val="18"/>
+              </w:rPr>
               <w:t xml:space="preserve">; </w:t>
             </w:r>
             <w:hyperlink w:anchor="Ref_barasz2017pseudo" w:history="1">
               <w:r>
+                <w:rPr>
+                  <w:rFonts w:cs="Times New Roman"/>
+                  <w:sz w:val="18"/>
+                </w:rPr>
                 <w:t xml:space="preserve">Barasz </w:t>
               </w:r>
               <w:r>
@@ -5770,10 +5877,18 @@
               </w:r>
             </w:hyperlink>
             <w:r>
+              <w:rPr>
+                <w:rFonts w:cs="Times New Roman"/>
+                <w:sz w:val="18"/>
+              </w:rPr>
               <w:t xml:space="preserve">; </w:t>
             </w:r>
             <w:hyperlink w:anchor="Ref_dewi2026understanding" w:history="1">
               <w:r>
+                <w:rPr>
+                  <w:rFonts w:cs="Times New Roman"/>
+                  <w:sz w:val="18"/>
+                </w:rPr>
                 <w:t xml:space="preserve">Dewi </w:t>
               </w:r>
               <w:r>
@@ -5793,6 +5908,10 @@
               </w:r>
             </w:hyperlink>
             <w:r>
+              <w:rPr>
+                <w:rFonts w:cs="Times New Roman"/>
+                <w:sz w:val="18"/>
+              </w:rPr>
               <w:t xml:space="preserve"> (positif signifikan).</w:t>
             </w:r>
           </w:p>
@@ -5965,14 +6084,26 @@
               </w:r>
             </w:hyperlink>
             <w:r>
+              <w:rPr>
+                <w:rFonts w:cs="Times New Roman"/>
+                <w:sz w:val="18"/>
+              </w:rPr>
               <w:t xml:space="preserve">; Aryadi dan Lingga (2024) (analogi partisipasi TCG); </w:t>
             </w:r>
             <w:hyperlink w:anchor="Ref_colline2024biases" w:history="1">
               <w:r>
+                <w:rPr>
+                  <w:rFonts w:cs="Times New Roman"/>
+                  <w:sz w:val="18"/>
+                </w:rPr>
                 <w:t>Colline (2024)</w:t>
               </w:r>
             </w:hyperlink>
             <w:r>
+              <w:rPr>
+                <w:rFonts w:cs="Times New Roman"/>
+                <w:sz w:val="18"/>
+              </w:rPr>
               <w:t xml:space="preserve"> (</w:t>
             </w:r>
             <w:r>
@@ -5992,11 +6123,19 @@
             </w:r>
             <w:hyperlink w:anchor="Ref_shiller2000irrational" w:history="1">
               <w:r>
+                <w:rPr>
+                  <w:rFonts w:cs="Times New Roman"/>
+                  <w:sz w:val="18"/>
+                </w:rPr>
                 <w:t>Shiller (2000)</w:t>
               </w:r>
             </w:hyperlink>
             <w:r>
-              <w:t xml:space="preserve"> sebagai grand theory.</w:t>
+              <w:rPr>
+                <w:rFonts w:cs="Times New Roman"/>
+                <w:sz w:val="18"/>
+              </w:rPr>
+              <w:t xml:space="preserve"> sebagai kerangka keuangan perilaku.</w:t>
             </w:r>
           </w:p>
         </w:tc>
@@ -6024,14 +6163,26 @@
               </w:r>
             </w:hyperlink>
             <w:r>
+              <w:rPr>
+                <w:rFonts w:cs="Times New Roman"/>
+                <w:sz w:val="18"/>
+              </w:rPr>
               <w:t xml:space="preserve">; </w:t>
             </w:r>
             <w:hyperlink w:anchor="Ref_fama1970efficient" w:history="1">
               <w:r>
+                <w:rPr>
+                  <w:rFonts w:cs="Times New Roman"/>
+                  <w:sz w:val="18"/>
+                </w:rPr>
                 <w:t>Fama (1970)</w:t>
               </w:r>
             </w:hyperlink>
             <w:r>
+              <w:rPr>
+                <w:rFonts w:cs="Times New Roman"/>
+                <w:sz w:val="18"/>
+              </w:rPr>
               <w:t xml:space="preserve"> (analogi saham; bukan temuan tidak signifikan pada kolektibel).</w:t>
             </w:r>
           </w:p>
@@ -6151,10 +6302,18 @@
               </w:r>
             </w:hyperlink>
             <w:r>
+              <w:rPr>
+                <w:rFonts w:cs="Times New Roman"/>
+                <w:sz w:val="18"/>
+              </w:rPr>
               <w:t xml:space="preserve">; </w:t>
             </w:r>
             <w:hyperlink w:anchor="Ref_tangney2004high" w:history="1">
               <w:r>
+                <w:rPr>
+                  <w:rFonts w:cs="Times New Roman"/>
+                  <w:sz w:val="18"/>
+                </w:rPr>
                 <w:t xml:space="preserve">Tangney </w:t>
               </w:r>
               <w:r>
@@ -6174,18 +6333,34 @@
               </w:r>
             </w:hyperlink>
             <w:r>
+              <w:rPr>
+                <w:rFonts w:cs="Times New Roman"/>
+                <w:sz w:val="18"/>
+              </w:rPr>
               <w:t xml:space="preserve">; </w:t>
             </w:r>
             <w:hyperlink w:anchor="Ref_vohs2007spent" w:history="1">
               <w:r>
+                <w:rPr>
+                  <w:rFonts w:cs="Times New Roman"/>
+                  <w:sz w:val="18"/>
+                </w:rPr>
                 <w:t>Vohs dan Faber (2007)</w:t>
               </w:r>
             </w:hyperlink>
             <w:r>
+              <w:rPr>
+                <w:rFonts w:cs="Times New Roman"/>
+                <w:sz w:val="18"/>
+              </w:rPr>
               <w:t xml:space="preserve">; </w:t>
             </w:r>
             <w:hyperlink w:anchor="Ref_sultan2012building" w:history="1">
               <w:r>
+                <w:rPr>
+                  <w:rFonts w:cs="Times New Roman"/>
+                  <w:sz w:val="18"/>
+                </w:rPr>
                 <w:t xml:space="preserve">Sultan </w:t>
               </w:r>
               <w:r>
@@ -6205,6 +6380,10 @@
               </w:r>
             </w:hyperlink>
             <w:r>
+              <w:rPr>
+                <w:rFonts w:cs="Times New Roman"/>
+                <w:sz w:val="18"/>
+              </w:rPr>
               <w:t xml:space="preserve"> (negatif signifikan).</w:t>
             </w:r>
           </w:p>
@@ -6232,10 +6411,18 @@
             </w:r>
             <w:hyperlink w:anchor="Ref_stern1962significance" w:history="1">
               <w:r>
+                <w:rPr>
+                  <w:rFonts w:cs="Times New Roman"/>
+                  <w:sz w:val="18"/>
+                </w:rPr>
                 <w:t>Stern (1962)</w:t>
               </w:r>
             </w:hyperlink>
             <w:r>
+              <w:rPr>
+                <w:rFonts w:cs="Times New Roman"/>
+                <w:sz w:val="18"/>
+              </w:rPr>
               <w:t xml:space="preserve"> (</w:t>
             </w:r>
             <w:r>
@@ -6363,10 +6550,18 @@
               </w:r>
             </w:hyperlink>
             <w:r>
+              <w:rPr>
+                <w:rFonts w:cs="Times New Roman"/>
+                <w:sz w:val="18"/>
+              </w:rPr>
               <w:t xml:space="preserve"> (MRA H4 diterima); </w:t>
             </w:r>
             <w:hyperlink w:anchor="Ref_katauke2023financial" w:history="1">
               <w:r>
+                <w:rPr>
+                  <w:rFonts w:cs="Times New Roman"/>
+                  <w:sz w:val="18"/>
+                </w:rPr>
                 <w:t xml:space="preserve">Katauke </w:t>
               </w:r>
               <w:r>
@@ -6386,6 +6581,10 @@
               </w:r>
             </w:hyperlink>
             <w:r>
+              <w:rPr>
+                <w:rFonts w:cs="Times New Roman"/>
+                <w:sz w:val="18"/>
+              </w:rPr>
               <w:t xml:space="preserve"> (tak langsung).</w:t>
             </w:r>
           </w:p>
@@ -6413,19 +6612,35 @@
             </w:r>
             <w:hyperlink w:anchor="Ref_apidana2022peran" w:history="1">
               <w:r>
+                <w:rPr>
+                  <w:rFonts w:cs="Times New Roman"/>
+                  <w:sz w:val="18"/>
+                </w:rPr>
                 <w:t>Apidana dan Kholifah (2022)</w:t>
               </w:r>
             </w:hyperlink>
             <w:r>
+              <w:rPr>
+                <w:rFonts w:cs="Times New Roman"/>
+                <w:sz w:val="18"/>
+              </w:rPr>
               <w:t xml:space="preserve"> (p=0,597) dan </w:t>
             </w:r>
             <w:hyperlink w:anchor="Ref_artadita2024how" w:history="1">
               <w:r>
+                <w:rPr>
+                  <w:rFonts w:cs="Times New Roman"/>
+                  <w:sz w:val="18"/>
+                </w:rPr>
                 <w:t>Artadita dan Firmialy (2024)</w:t>
               </w:r>
             </w:hyperlink>
             <w:r>
-              <w:t xml:space="preserve"> (beta=0,092, n.s.) + </w:t>
+              <w:rPr>
+                <w:rFonts w:cs="Times New Roman"/>
+                <w:sz w:val="18"/>
+              </w:rPr>
+              <w:t xml:space="preserve"> (β=0,092, tidak signifikan) + </w:t>
             </w:r>
             <w:r>
               <w:rPr>
@@ -6493,7 +6708,6 @@
                 <w:rFonts w:cs="Times New Roman"/>
                 <w:sz w:val="18"/>
               </w:rPr>
-              <w:lastRenderedPageBreak/>
               <w:t>6</w:t>
             </w:r>
           </w:p>
@@ -6544,18 +6758,34 @@
             </w:r>
             <w:hyperlink w:anchor="Ref_artadita2024how" w:history="1">
               <w:r>
+                <w:rPr>
+                  <w:rFonts w:cs="Times New Roman"/>
+                  <w:sz w:val="18"/>
+                </w:rPr>
                 <w:t>Artadita dan Firmialy (2024)</w:t>
               </w:r>
             </w:hyperlink>
             <w:r>
+              <w:rPr>
+                <w:rFonts w:cs="Times New Roman"/>
+                <w:sz w:val="18"/>
+              </w:rPr>
               <w:t xml:space="preserve"> (kontrol kognitif; moderasi keseluruhan ditolak); </w:t>
             </w:r>
             <w:hyperlink w:anchor="Ref_apidana2022peran" w:history="1">
               <w:r>
+                <w:rPr>
+                  <w:rFonts w:cs="Times New Roman"/>
+                  <w:sz w:val="18"/>
+                </w:rPr>
                 <w:t>Apidana dan Kholifah (2022)</w:t>
               </w:r>
             </w:hyperlink>
             <w:r>
+              <w:rPr>
+                <w:rFonts w:cs="Times New Roman"/>
+                <w:sz w:val="18"/>
+              </w:rPr>
               <w:t xml:space="preserve"> (adjacent).</w:t>
             </w:r>
           </w:p>
@@ -6583,14 +6813,26 @@
             </w:r>
             <w:hyperlink w:anchor="Ref_belk1995collecting" w:history="1">
               <w:r>
+                <w:rPr>
+                  <w:rFonts w:cs="Times New Roman"/>
+                  <w:sz w:val="18"/>
+                </w:rPr>
                 <w:t>Belk (1995)</w:t>
               </w:r>
             </w:hyperlink>
             <w:r>
+              <w:rPr>
+                <w:rFonts w:cs="Times New Roman"/>
+                <w:sz w:val="18"/>
+              </w:rPr>
               <w:t xml:space="preserve">; </w:t>
             </w:r>
             <w:hyperlink w:anchor="Ref_barasz2017pseudo" w:history="1">
               <w:r>
+                <w:rPr>
+                  <w:rFonts w:cs="Times New Roman"/>
+                  <w:sz w:val="18"/>
+                </w:rPr>
                 <w:t xml:space="preserve">Barasz </w:t>
               </w:r>
               <w:r>
@@ -6610,14 +6852,26 @@
               </w:r>
             </w:hyperlink>
             <w:r>
+              <w:rPr>
+                <w:rFonts w:cs="Times New Roman"/>
+                <w:sz w:val="18"/>
+              </w:rPr>
               <w:t xml:space="preserve"> + </w:t>
             </w:r>
             <w:hyperlink w:anchor="Ref_artadita2024how" w:history="1">
               <w:r>
+                <w:rPr>
+                  <w:rFonts w:cs="Times New Roman"/>
+                  <w:sz w:val="18"/>
+                </w:rPr>
                 <w:t>Artadita dan Firmialy (2024)</w:t>
               </w:r>
             </w:hyperlink>
             <w:r>
+              <w:rPr>
+                <w:rFonts w:cs="Times New Roman"/>
+                <w:sz w:val="18"/>
+              </w:rPr>
               <w:t xml:space="preserve"> H3 ditolak.</w:t>
             </w:r>
           </w:p>
@@ -6721,6 +6975,10 @@
             </w:r>
             <w:hyperlink w:anchor="Ref_katauke2023financial" w:history="1">
               <w:r>
+                <w:rPr>
+                  <w:rFonts w:cs="Times New Roman"/>
+                  <w:sz w:val="18"/>
+                </w:rPr>
                 <w:t xml:space="preserve">Katauke </w:t>
               </w:r>
               <w:r>
@@ -6740,6 +6998,10 @@
               </w:r>
             </w:hyperlink>
             <w:r>
+              <w:rPr>
+                <w:rFonts w:cs="Times New Roman"/>
+                <w:sz w:val="18"/>
+              </w:rPr>
               <w:t xml:space="preserve"> + </w:t>
             </w:r>
             <w:r>
@@ -6782,18 +7044,34 @@
             </w:r>
             <w:hyperlink w:anchor="Ref_shiller2000irrational" w:history="1">
               <w:r>
+                <w:rPr>
+                  <w:rFonts w:cs="Times New Roman"/>
+                  <w:sz w:val="18"/>
+                </w:rPr>
                 <w:t>Shiller (2000)</w:t>
               </w:r>
             </w:hyperlink>
             <w:r>
+              <w:rPr>
+                <w:rFonts w:cs="Times New Roman"/>
+                <w:sz w:val="18"/>
+              </w:rPr>
               <w:t xml:space="preserve">; </w:t>
             </w:r>
             <w:hyperlink w:anchor="Ref_aryadi2024personal" w:history="1">
               <w:r>
+                <w:rPr>
+                  <w:rFonts w:cs="Times New Roman"/>
+                  <w:sz w:val="18"/>
+                </w:rPr>
                 <w:t>Aryadi dan Lingga (2026)</w:t>
               </w:r>
             </w:hyperlink>
             <w:r>
+              <w:rPr>
+                <w:rFonts w:cs="Times New Roman"/>
+                <w:sz w:val="18"/>
+              </w:rPr>
               <w:t xml:space="preserve"> (bukan uji interaksi).</w:t>
             </w:r>
           </w:p>
@@ -6853,6 +7131,7 @@
         <w:rPr>
           <w:rFonts w:cs="Times New Roman"/>
         </w:rPr>
+        <w:lastRenderedPageBreak/>
         <w:t xml:space="preserve">Ketidakseragaman temuan tersebut menunjukkan perlunya variabel pemoderasi yang menguji batas kontrol psikologis konsumen. Dalam kerangka </w:t>
       </w:r>
       <w:r>
@@ -6870,6 +7149,9 @@
       </w:r>
       <w:hyperlink w:anchor="Ref_baumeister2002yield" w:history="1">
         <w:r>
+          <w:rPr>
+            <w:rFonts w:cs="Times New Roman"/>
+          </w:rPr>
           <w:t>Baumeister, 2002</w:t>
         </w:r>
       </w:hyperlink>
@@ -6881,6 +7163,9 @@
       </w:r>
       <w:hyperlink w:anchor="Ref_vohs2007spent" w:history="1">
         <w:r>
+          <w:rPr>
+            <w:rFonts w:cs="Times New Roman"/>
+          </w:rPr>
           <w:t>Vohs and Faber, 2007</w:t>
         </w:r>
       </w:hyperlink>
@@ -6905,6 +7190,9 @@
       </w:r>
       <w:hyperlink w:anchor="Ref_thaler1981economic" w:history="1">
         <w:r>
+          <w:rPr>
+            <w:rFonts w:cs="Times New Roman"/>
+          </w:rPr>
           <w:t>(Thaler dan Shefrin, 1981)</w:t>
         </w:r>
       </w:hyperlink>
@@ -6930,6 +7218,9 @@
       </w:r>
       <w:hyperlink w:anchor="Ref_tangney2004high" w:history="1">
         <w:r>
+          <w:rPr>
+            <w:rFonts w:cs="Times New Roman"/>
+          </w:rPr>
           <w:t xml:space="preserve">Tangney </w:t>
         </w:r>
         <w:r>
@@ -6954,6 +7245,9 @@
       </w:r>
       <w:hyperlink w:anchor="Ref_sultan2012building" w:history="1">
         <w:r>
+          <w:rPr>
+            <w:rFonts w:cs="Times New Roman"/>
+          </w:rPr>
           <w:t xml:space="preserve">Sultan </w:t>
         </w:r>
         <w:r>
@@ -6991,6 +7285,9 @@
       </w:r>
       <w:hyperlink w:anchor="Ref_lienardy2026role" w:history="1">
         <w:r>
+          <w:rPr>
+            <w:rFonts w:cs="Times New Roman"/>
+          </w:rPr>
           <w:t>(Lienardy dan Panasea, 2026)</w:t>
         </w:r>
       </w:hyperlink>
@@ -7106,14 +7403,7 @@
         <w:rPr>
           <w:rFonts w:cs="Times New Roman"/>
         </w:rPr>
-        <w:t xml:space="preserve"> Peneliti berdomisili dan berkampus di Universitas Kristen Krida Wacana </w:t>
-      </w:r>
-      <w:r>
-        <w:rPr>
-          <w:rFonts w:cs="Times New Roman"/>
-        </w:rPr>
-        <w:lastRenderedPageBreak/>
-        <w:t>(UKRIDA) di kawasan Tanjung Duren, Jakarta Barat. Kedekatan geografis ini memberikan aksesibilitas fisik tinggi bagi peneliti untuk melakukan observasi langsung (</w:t>
+        <w:t xml:space="preserve"> Peneliti berdomisili dan berkampus di Universitas Kristen Krida Wacana (UKRIDA) di kawasan Tanjung Duren, Jakarta Barat. Kedekatan geografis ini memberikan aksesibilitas fisik tinggi bagi peneliti untuk melakukan observasi langsung (</w:t>
       </w:r>
       <w:r>
         <w:rPr>
@@ -7195,6 +7485,7 @@
           <w:rFonts w:cs="Times New Roman"/>
           <w:b/>
         </w:rPr>
+        <w:lastRenderedPageBreak/>
         <w:t xml:space="preserve">•  </w:t>
       </w:r>
       <w:r>
@@ -7333,7 +7624,7 @@
         <w:outlineLvl w:val="1"/>
       </w:pPr>
       <w:bookmarkStart w:id="12" w:name="TOC_1_2_PERUMUSAN_MASALAH"/>
-      <w:bookmarkStart w:id="13" w:name="_Toc241678172"/>
+      <w:bookmarkStart w:id="13" w:name="_Toc241753626"/>
       <w:r>
         <w:rPr>
           <w:rFonts w:ascii="Times New Roman" w:hAnsi="Times New Roman"/>
@@ -7370,7 +7661,6 @@
           <w:rFonts w:cs="Times New Roman"/>
           <w:b/>
         </w:rPr>
-        <w:lastRenderedPageBreak/>
         <w:t xml:space="preserve">1.  </w:t>
       </w:r>
       <w:r>
@@ -7692,6 +7982,7 @@
           <w:rFonts w:cs="Times New Roman"/>
           <w:b/>
         </w:rPr>
+        <w:lastRenderedPageBreak/>
         <w:t xml:space="preserve">6.  </w:t>
       </w:r>
       <w:r>
@@ -7759,7 +8050,7 @@
         <w:outlineLvl w:val="1"/>
       </w:pPr>
       <w:bookmarkStart w:id="14" w:name="TOC_1_3_TUJUAN_PENELITIAN"/>
-      <w:bookmarkStart w:id="15" w:name="_Toc241678173"/>
+      <w:bookmarkStart w:id="15" w:name="_Toc241753627"/>
       <w:r>
         <w:rPr>
           <w:rFonts w:ascii="Times New Roman" w:hAnsi="Times New Roman"/>
@@ -8045,7 +8336,6 @@
           <w:rFonts w:cs="Times New Roman"/>
           <w:b/>
         </w:rPr>
-        <w:lastRenderedPageBreak/>
         <w:t xml:space="preserve">5.  </w:t>
       </w:r>
       <w:r>
@@ -8185,7 +8475,7 @@
         <w:outlineLvl w:val="1"/>
       </w:pPr>
       <w:bookmarkStart w:id="16" w:name="TOC_1_4_MANFAAT_PENELITIAN"/>
-      <w:bookmarkStart w:id="17" w:name="_Toc241678174"/>
+      <w:bookmarkStart w:id="17" w:name="_Toc241753628"/>
       <w:r>
         <w:rPr>
           <w:rFonts w:ascii="Times New Roman" w:hAnsi="Times New Roman"/>
@@ -8217,7 +8507,7 @@
         <w:outlineLvl w:val="2"/>
       </w:pPr>
       <w:bookmarkStart w:id="18" w:name="TOC_1_4_1_MANFAAT_TEORETIS"/>
-      <w:bookmarkStart w:id="19" w:name="_Toc241678175"/>
+      <w:bookmarkStart w:id="19" w:name="_Toc241753629"/>
       <w:r>
         <w:rPr>
           <w:rFonts w:ascii="Times New Roman" w:hAnsi="Times New Roman"/>
@@ -8225,6 +8515,7 @@
           <w:color w:val="000000"/>
           <w:sz w:val="24"/>
         </w:rPr>
+        <w:lastRenderedPageBreak/>
         <w:t>1.4.1 Manfaat Teoretis</w:t>
       </w:r>
       <w:bookmarkEnd w:id="18"/>
@@ -8286,6 +8577,9 @@
       </w:r>
       <w:hyperlink w:anchor="Ref_colline2024biases" w:history="1">
         <w:r>
+          <w:rPr>
+            <w:rFonts w:cs="Times New Roman"/>
+          </w:rPr>
           <w:t>(Colline, 2024)</w:t>
         </w:r>
       </w:hyperlink>
@@ -8352,6 +8646,9 @@
       </w:r>
       <w:hyperlink w:anchor="Ref_sultan2012building" w:history="1">
         <w:r>
+          <w:rPr>
+            <w:rFonts w:cs="Times New Roman"/>
+          </w:rPr>
           <w:t xml:space="preserve">Sultan </w:t>
         </w:r>
         <w:r>
@@ -8376,6 +8673,9 @@
       </w:r>
       <w:hyperlink w:anchor="Ref_apidana2022peran" w:history="1">
         <w:r>
+          <w:rPr>
+            <w:rFonts w:cs="Times New Roman"/>
+          </w:rPr>
           <w:t>Apidana and Kholifah, 2022</w:t>
         </w:r>
       </w:hyperlink>
@@ -8387,6 +8687,9 @@
       </w:r>
       <w:hyperlink w:anchor="Ref_lienardy2026role" w:history="1">
         <w:r>
+          <w:rPr>
+            <w:rFonts w:cs="Times New Roman"/>
+          </w:rPr>
           <w:t>Lienardy and Panasea, 2026</w:t>
         </w:r>
       </w:hyperlink>
@@ -8443,7 +8746,7 @@
         <w:outlineLvl w:val="2"/>
       </w:pPr>
       <w:bookmarkStart w:id="20" w:name="TOC_1_4_2_MANFAAT_PRAKTIS"/>
-      <w:bookmarkStart w:id="21" w:name="_Toc241678176"/>
+      <w:bookmarkStart w:id="21" w:name="_Toc241753630"/>
       <w:r>
         <w:rPr>
           <w:rFonts w:ascii="Times New Roman" w:hAnsi="Times New Roman"/>
@@ -8451,7 +8754,6 @@
           <w:color w:val="000000"/>
           <w:sz w:val="24"/>
         </w:rPr>
-        <w:lastRenderedPageBreak/>
         <w:t>1.4.2 Manfaat Praktis</w:t>
       </w:r>
       <w:bookmarkEnd w:id="20"/>
@@ -8550,7 +8852,14 @@
         <w:rPr>
           <w:rFonts w:cs="Times New Roman"/>
         </w:rPr>
-        <w:t xml:space="preserve"> Memberikan data dan fakta lapangan mengenai pola pengeluaran konsumtif berbasis probabilitas dan spekulasi pada kalangan generasi muda perkotaan, yang berguna sebagai bahan pertimbangan dalam merancang materi pengendalian diri finansial yang kontekstual bagi Generasi Z.</w:t>
+        <w:t xml:space="preserve"> Memberikan data dan fakta lapangan mengenai pola pengeluaran konsumtif berbasis probabilitas dan spekulasi pada kalangan generasi muda perkotaan, yang </w:t>
+      </w:r>
+      <w:r>
+        <w:rPr>
+          <w:rFonts w:cs="Times New Roman"/>
+        </w:rPr>
+        <w:lastRenderedPageBreak/>
+        <w:t>berguna sebagai bahan pertimbangan dalam merancang materi pengendalian diri finansial yang kontekstual bagi Generasi Z.</w:t>
       </w:r>
     </w:p>
     <w:p>
@@ -8591,7 +8900,7 @@
         <w:outlineLvl w:val="0"/>
       </w:pPr>
       <w:bookmarkStart w:id="22" w:name="TOC_BAB_2_KAJIAN_PUSTAKA_DAN_PENGEMBANGA"/>
-      <w:bookmarkStart w:id="23" w:name="_Toc241678177"/>
+      <w:bookmarkStart w:id="23" w:name="_Toc241753631"/>
       <w:r>
         <w:rPr>
           <w:rFonts w:ascii="Times New Roman" w:hAnsi="Times New Roman"/>
@@ -8625,11 +8934,24 @@
     </w:p>
     <w:p>
       <w:pPr>
+        <w:spacing w:after="0" w:line="360" w:lineRule="auto"/>
+        <w:ind w:firstLine="709"/>
+        <w:jc w:val="both"/>
+      </w:pPr>
+      <w:r>
+        <w:rPr>
+          <w:rFonts w:cs="Times New Roman"/>
+        </w:rPr>
+        <w:t>\phantomsection</w:t>
+      </w:r>
+    </w:p>
+    <w:p>
+      <w:pPr>
         <w:pStyle w:val="Heading2"/>
         <w:outlineLvl w:val="1"/>
       </w:pPr>
       <w:bookmarkStart w:id="24" w:name="TOC_2_1_LANDASAN_TEORI"/>
-      <w:bookmarkStart w:id="25" w:name="_Toc241678178"/>
+      <w:bookmarkStart w:id="25" w:name="_Toc241753632"/>
       <w:r>
         <w:rPr>
           <w:rFonts w:ascii="Times New Roman" w:hAnsi="Times New Roman"/>
@@ -8648,7 +8970,7 @@
         <w:outlineLvl w:val="2"/>
       </w:pPr>
       <w:bookmarkStart w:id="26" w:name="TOC_2_1_1_LANDASAN_TEORETIS_PENDEKATAN_K"/>
-      <w:bookmarkStart w:id="27" w:name="_Toc241678179"/>
+      <w:bookmarkStart w:id="27" w:name="_Toc241753633"/>
       <w:r>
         <w:rPr>
           <w:rFonts w:ascii="Times New Roman" w:hAnsi="Times New Roman"/>
@@ -8735,6 +9057,9 @@
       </w:r>
       <w:hyperlink w:anchor="Ref_fama1970efficient" w:history="1">
         <w:r>
+          <w:rPr>
+            <w:rFonts w:cs="Times New Roman"/>
+          </w:rPr>
           <w:t>(Fama, 1970)</w:t>
         </w:r>
       </w:hyperlink>
@@ -8746,6 +9071,9 @@
       </w:r>
       <w:hyperlink w:anchor="Ref_simon1955behavioral" w:history="1">
         <w:r>
+          <w:rPr>
+            <w:rFonts w:cs="Times New Roman"/>
+          </w:rPr>
           <w:t>Simon (1955)</w:t>
         </w:r>
       </w:hyperlink>
@@ -8856,6 +9184,9 @@
       </w:r>
       <w:hyperlink w:anchor="Ref_shiller2000irrational" w:history="1">
         <w:r>
+          <w:rPr>
+            <w:rFonts w:cs="Times New Roman"/>
+          </w:rPr>
           <w:t>Shiller (2000)</w:t>
         </w:r>
       </w:hyperlink>
@@ -8906,6 +9237,9 @@
       </w:r>
       <w:hyperlink w:anchor="Ref_thaler1985mental" w:history="1">
         <w:r>
+          <w:rPr>
+            <w:rFonts w:cs="Times New Roman"/>
+          </w:rPr>
           <w:t>Thaler (1985)</w:t>
         </w:r>
       </w:hyperlink>
@@ -8917,6 +9251,9 @@
       </w:r>
       <w:hyperlink w:anchor="Ref_thaler1981economic" w:history="1">
         <w:r>
+          <w:rPr>
+            <w:rFonts w:cs="Times New Roman"/>
+          </w:rPr>
           <w:t>Thaler dan Shefrin (1981)</w:t>
         </w:r>
       </w:hyperlink>
@@ -9031,7 +9368,7 @@
         <w:outlineLvl w:val="2"/>
       </w:pPr>
       <w:bookmarkStart w:id="28" w:name="TOC_2_1_2_PENDEKATAN_STIMULUS_ORGANISM_R"/>
-      <w:bookmarkStart w:id="29" w:name="_Toc241678180"/>
+      <w:bookmarkStart w:id="29" w:name="_Toc241753634"/>
       <w:r>
         <w:rPr>
           <w:rFonts w:ascii="Times New Roman" w:hAnsi="Times New Roman"/>
@@ -9090,6 +9427,9 @@
       </w:r>
       <w:hyperlink w:anchor="Ref_mehrabian1974approach" w:history="1">
         <w:r>
+          <w:rPr>
+            <w:rFonts w:cs="Times New Roman"/>
+          </w:rPr>
           <w:t>Mehrabian dan Russell (1974)</w:t>
         </w:r>
       </w:hyperlink>
@@ -9382,7 +9722,7 @@
         <w:outlineLvl w:val="2"/>
       </w:pPr>
       <w:bookmarkStart w:id="30" w:name="TOC_2_1_3_PSIKOLOGI_KOLEKTOR_DAN_COLLECT"/>
-      <w:bookmarkStart w:id="31" w:name="_Toc241678181"/>
+      <w:bookmarkStart w:id="31" w:name="_Toc241753635"/>
       <w:r>
         <w:rPr>
           <w:rFonts w:ascii="Times New Roman" w:hAnsi="Times New Roman"/>
@@ -9419,6 +9759,9 @@
       </w:r>
       <w:hyperlink w:anchor="Ref_belk1995collecting" w:history="1">
         <w:r>
+          <w:rPr>
+            <w:rFonts w:cs="Times New Roman"/>
+          </w:rPr>
           <w:t>(Belk, 1995)</w:t>
         </w:r>
       </w:hyperlink>
@@ -9443,6 +9786,9 @@
       </w:r>
       <w:hyperlink w:anchor="Ref_zeigarnik1927behalten" w:history="1">
         <w:r>
+          <w:rPr>
+            <w:rFonts w:cs="Times New Roman"/>
+          </w:rPr>
           <w:t>(Zeigarnik, 1927)</w:t>
         </w:r>
       </w:hyperlink>
@@ -9480,6 +9826,9 @@
       </w:r>
       <w:hyperlink w:anchor="Ref_gao2014completing" w:history="1">
         <w:r>
+          <w:rPr>
+            <w:rFonts w:cs="Times New Roman"/>
+          </w:rPr>
           <w:t xml:space="preserve">Gao </w:t>
         </w:r>
         <w:r>
@@ -9531,6 +9880,9 @@
       </w:r>
       <w:hyperlink w:anchor="Ref_barasz2017pseudo" w:history="1">
         <w:r>
+          <w:rPr>
+            <w:rFonts w:cs="Times New Roman"/>
+          </w:rPr>
           <w:t xml:space="preserve">Barasz </w:t>
         </w:r>
         <w:r>
@@ -9574,7 +9926,7 @@
         <w:outlineLvl w:val="2"/>
       </w:pPr>
       <w:bookmarkStart w:id="32" w:name="TOC_2_1_4_TEORI_REGULASI_DIRI_SELF_REGUL"/>
-      <w:bookmarkStart w:id="33" w:name="_Toc241678182"/>
+      <w:bookmarkStart w:id="33" w:name="_Toc241753636"/>
       <w:r>
         <w:rPr>
           <w:rFonts w:ascii="Times New Roman" w:hAnsi="Times New Roman"/>
@@ -9621,6 +9973,9 @@
       </w:r>
       <w:hyperlink w:anchor="Ref_baumeister2002yield" w:history="1">
         <w:r>
+          <w:rPr>
+            <w:rFonts w:cs="Times New Roman"/>
+          </w:rPr>
           <w:t>(Baumeister, 2002)</w:t>
         </w:r>
       </w:hyperlink>
@@ -9632,6 +9987,9 @@
       </w:r>
       <w:hyperlink w:anchor="Ref_vohs2007spent" w:history="1">
         <w:r>
+          <w:rPr>
+            <w:rFonts w:cs="Times New Roman"/>
+          </w:rPr>
           <w:t>Vohs dan Faber (2007)</w:t>
         </w:r>
       </w:hyperlink>
@@ -9669,6 +10027,9 @@
       </w:r>
       <w:hyperlink w:anchor="Ref_tangney2004high" w:history="1">
         <w:r>
+          <w:rPr>
+            <w:rFonts w:cs="Times New Roman"/>
+          </w:rPr>
           <w:t xml:space="preserve">(Tangney </w:t>
         </w:r>
         <w:r>
@@ -9698,7 +10059,7 @@
         <w:outlineLvl w:val="1"/>
       </w:pPr>
       <w:bookmarkStart w:id="34" w:name="TOC_2_2_KAJIAN_VARIABEL_PENELITIAN"/>
-      <w:bookmarkStart w:id="35" w:name="_Toc241678183"/>
+      <w:bookmarkStart w:id="35" w:name="_Toc241753637"/>
       <w:r>
         <w:rPr>
           <w:rFonts w:ascii="Times New Roman" w:hAnsi="Times New Roman"/>
@@ -9717,7 +10078,7 @@
         <w:outlineLvl w:val="2"/>
       </w:pPr>
       <w:bookmarkStart w:id="36" w:name="TOC_2_2_1_VARIABEL_DEPENDEN_Y_PEMBELIAN_"/>
-      <w:bookmarkStart w:id="37" w:name="_Toc241678184"/>
+      <w:bookmarkStart w:id="37" w:name="_Toc241753638"/>
       <w:r>
         <w:rPr>
           <w:rFonts w:ascii="Times New Roman" w:hAnsi="Times New Roman"/>
@@ -9782,6 +10143,9 @@
       </w:r>
       <w:hyperlink w:anchor="Ref_stern1962significance" w:history="1">
         <w:r>
+          <w:rPr>
+            <w:rFonts w:cs="Times New Roman"/>
+          </w:rPr>
           <w:t>Stern, 1962</w:t>
         </w:r>
       </w:hyperlink>
@@ -9793,6 +10157,9 @@
       </w:r>
       <w:hyperlink w:anchor="Ref_rook1987buying" w:history="1">
         <w:r>
+          <w:rPr>
+            <w:rFonts w:cs="Times New Roman"/>
+          </w:rPr>
           <w:t>Rook, 1987</w:t>
         </w:r>
       </w:hyperlink>
@@ -9804,6 +10171,9 @@
       </w:r>
       <w:hyperlink w:anchor="Ref_rook1995normative" w:history="1">
         <w:r>
+          <w:rPr>
+            <w:rFonts w:cs="Times New Roman"/>
+          </w:rPr>
           <w:t>Rook and Fisher, 1995</w:t>
         </w:r>
       </w:hyperlink>
@@ -9815,6 +10185,9 @@
       </w:r>
       <w:hyperlink w:anchor="Ref_verplanken2001individual" w:history="1">
         <w:r>
+          <w:rPr>
+            <w:rFonts w:cs="Times New Roman"/>
+          </w:rPr>
           <w:t>Verplanken dan Herabadi (2001)</w:t>
         </w:r>
       </w:hyperlink>
@@ -9826,6 +10199,9 @@
       </w:r>
       <w:hyperlink w:anchor="Ref_amos2014meta" w:history="1">
         <w:r>
+          <w:rPr>
+            <w:rFonts w:cs="Times New Roman"/>
+          </w:rPr>
           <w:t xml:space="preserve">Amos </w:t>
         </w:r>
         <w:r>
@@ -9855,7 +10231,7 @@
         <w:outlineLvl w:val="2"/>
       </w:pPr>
       <w:bookmarkStart w:id="38" w:name="TOC_2_2_2_VARIABEL_INDEPENDEN_X₁_MOTIVAS"/>
-      <w:bookmarkStart w:id="39" w:name="_Toc241678185"/>
+      <w:bookmarkStart w:id="39" w:name="_Toc241753639"/>
       <w:r>
         <w:rPr>
           <w:rFonts w:ascii="Times New Roman" w:hAnsi="Times New Roman"/>
@@ -9920,6 +10296,9 @@
       </w:r>
       <w:hyperlink w:anchor="Ref_hirschman1982hedonic" w:history="1">
         <w:r>
+          <w:rPr>
+            <w:rFonts w:cs="Times New Roman"/>
+          </w:rPr>
           <w:t>Hirschman and Holbrook, 1982</w:t>
         </w:r>
       </w:hyperlink>
@@ -9931,6 +10310,9 @@
       </w:r>
       <w:hyperlink w:anchor="Ref_babin1994work" w:history="1">
         <w:r>
+          <w:rPr>
+            <w:rFonts w:cs="Times New Roman"/>
+          </w:rPr>
           <w:t xml:space="preserve">Babin </w:t>
         </w:r>
         <w:r>
@@ -9955,6 +10337,9 @@
       </w:r>
       <w:hyperlink w:anchor="Ref_arnold2003hedonic" w:history="1">
         <w:r>
+          <w:rPr>
+            <w:rFonts w:cs="Times New Roman"/>
+          </w:rPr>
           <w:t>Arnold dan Reynolds (2003)</w:t>
         </w:r>
       </w:hyperlink>
@@ -10036,7 +10421,7 @@
         <w:outlineLvl w:val="2"/>
       </w:pPr>
       <w:bookmarkStart w:id="40" w:name="TOC_2_2_3_VARIABEL_INDEPENDEN_X₂_HASRAT_"/>
-      <w:bookmarkStart w:id="41" w:name="_Toc241678186"/>
+      <w:bookmarkStart w:id="41" w:name="_Toc241753640"/>
       <w:r>
         <w:rPr>
           <w:rFonts w:ascii="Times New Roman" w:hAnsi="Times New Roman"/>
@@ -10115,6 +10500,9 @@
       </w:r>
       <w:hyperlink w:anchor="Ref_belk1995collecting" w:history="1">
         <w:r>
+          <w:rPr>
+            <w:rFonts w:cs="Times New Roman"/>
+          </w:rPr>
           <w:t>Belk, 1995</w:t>
         </w:r>
       </w:hyperlink>
@@ -10126,6 +10514,9 @@
       </w:r>
       <w:hyperlink w:anchor="Ref_gao2014completing" w:history="1">
         <w:r>
+          <w:rPr>
+            <w:rFonts w:cs="Times New Roman"/>
+          </w:rPr>
           <w:t xml:space="preserve">Gao </w:t>
         </w:r>
         <w:r>
@@ -10150,6 +10541,9 @@
       </w:r>
       <w:hyperlink w:anchor="Ref_barasz2017pseudo" w:history="1">
         <w:r>
+          <w:rPr>
+            <w:rFonts w:cs="Times New Roman"/>
+          </w:rPr>
           <w:t xml:space="preserve">Barasz </w:t>
         </w:r>
         <w:r>
@@ -10231,7 +10625,7 @@
         <w:outlineLvl w:val="2"/>
       </w:pPr>
       <w:bookmarkStart w:id="42" w:name="TOC_2_2_4_VARIABEL_INDEPENDEN_X₃_MOTIF_S"/>
-      <w:bookmarkStart w:id="43" w:name="_Toc241678187"/>
+      <w:bookmarkStart w:id="43" w:name="_Toc241753641"/>
       <w:r>
         <w:rPr>
           <w:rFonts w:ascii="Times New Roman" w:hAnsi="Times New Roman"/>
@@ -10296,6 +10690,9 @@
       </w:r>
       <w:hyperlink w:anchor="Ref_keynes1936general" w:history="1">
         <w:r>
+          <w:rPr>
+            <w:rFonts w:cs="Times New Roman"/>
+          </w:rPr>
           <w:t>Keynes (1936)</w:t>
         </w:r>
       </w:hyperlink>
@@ -10320,6 +10717,9 @@
       </w:r>
       <w:hyperlink w:anchor="Ref_shiller2000irrational" w:history="1">
         <w:r>
+          <w:rPr>
+            <w:rFonts w:cs="Times New Roman"/>
+          </w:rPr>
           <w:t>Shiller, 2000</w:t>
         </w:r>
       </w:hyperlink>
@@ -10331,6 +10731,9 @@
       </w:r>
       <w:hyperlink w:anchor="Ref_baur2018bitcoin" w:history="1">
         <w:r>
+          <w:rPr>
+            <w:rFonts w:cs="Times New Roman"/>
+          </w:rPr>
           <w:t xml:space="preserve">Baur </w:t>
         </w:r>
         <w:r>
@@ -10477,7 +10880,7 @@
         <w:outlineLvl w:val="2"/>
       </w:pPr>
       <w:bookmarkStart w:id="44" w:name="TOC_2_2_5_VARIABEL_MODERASI_M_KONTROL_DI"/>
-      <w:bookmarkStart w:id="45" w:name="_Toc241678188"/>
+      <w:bookmarkStart w:id="45" w:name="_Toc241753642"/>
       <w:r>
         <w:rPr>
           <w:rFonts w:ascii="Times New Roman" w:hAnsi="Times New Roman"/>
@@ -10555,6 +10958,9 @@
       </w:r>
       <w:hyperlink w:anchor="Ref_tangney2004high" w:history="1">
         <w:r>
+          <w:rPr>
+            <w:rFonts w:cs="Times New Roman"/>
+          </w:rPr>
           <w:t xml:space="preserve">Tangney </w:t>
         </w:r>
         <w:r>
@@ -10579,6 +10985,9 @@
       </w:r>
       <w:hyperlink w:anchor="Ref_baumeister2002yield" w:history="1">
         <w:r>
+          <w:rPr>
+            <w:rFonts w:cs="Times New Roman"/>
+          </w:rPr>
           <w:t>Baumeister, 2002</w:t>
         </w:r>
       </w:hyperlink>
@@ -10590,6 +10999,9 @@
       </w:r>
       <w:hyperlink w:anchor="Ref_vohs2007spent" w:history="1">
         <w:r>
+          <w:rPr>
+            <w:rFonts w:cs="Times New Roman"/>
+          </w:rPr>
           <w:t>Vohs and Faber, 2007</w:t>
         </w:r>
       </w:hyperlink>
@@ -10614,6 +11026,9 @@
       </w:r>
       <w:hyperlink w:anchor="Ref_thaler1981economic" w:history="1">
         <w:r>
+          <w:rPr>
+            <w:rFonts w:cs="Times New Roman"/>
+          </w:rPr>
           <w:t>(Thaler dan Shefrin, 1981)</w:t>
         </w:r>
       </w:hyperlink>
@@ -10645,6 +11060,9 @@
       </w:r>
       <w:hyperlink w:anchor="Ref_sultan2012building" w:history="1">
         <w:r>
+          <w:rPr>
+            <w:rFonts w:cs="Times New Roman"/>
+          </w:rPr>
           <w:t xml:space="preserve">(Sultan </w:t>
         </w:r>
         <w:r>
@@ -10674,7 +11092,7 @@
         <w:outlineLvl w:val="1"/>
       </w:pPr>
       <w:bookmarkStart w:id="46" w:name="TOC_2_3_PENELITIAN_SEBELUMNYA"/>
-      <w:bookmarkStart w:id="47" w:name="_Toc241678189"/>
+      <w:bookmarkStart w:id="47" w:name="_Toc241753643"/>
       <w:r>
         <w:rPr>
           <w:rFonts w:ascii="Times New Roman" w:hAnsi="Times New Roman"/>
@@ -12887,7 +13305,7 @@
         <w:outlineLvl w:val="1"/>
       </w:pPr>
       <w:bookmarkStart w:id="49" w:name="TOC_2_4_PENGEMBANGAN_HIPOTESIS"/>
-      <w:bookmarkStart w:id="50" w:name="_Toc241678190"/>
+      <w:bookmarkStart w:id="50" w:name="_Toc241753644"/>
       <w:r>
         <w:rPr>
           <w:rFonts w:ascii="Times New Roman" w:hAnsi="Times New Roman"/>
@@ -12906,7 +13324,7 @@
         <w:outlineLvl w:val="2"/>
       </w:pPr>
       <w:bookmarkStart w:id="51" w:name="TOC_2_4_1_PENGARUH_HEDONIC_MOTIVATION_TE"/>
-      <w:bookmarkStart w:id="52" w:name="_Toc241678191"/>
+      <w:bookmarkStart w:id="52" w:name="_Toc241753645"/>
       <w:r>
         <w:rPr>
           <w:rFonts w:ascii="Times New Roman" w:hAnsi="Times New Roman"/>
@@ -12969,6 +13387,9 @@
       </w:r>
       <w:hyperlink w:anchor="Ref_mehrabian1974approach" w:history="1">
         <w:r>
+          <w:rPr>
+            <w:rFonts w:cs="Times New Roman"/>
+          </w:rPr>
           <w:t>(Mehrabian dan Russell, 1974)</w:t>
         </w:r>
       </w:hyperlink>
@@ -12980,6 +13401,9 @@
       </w:r>
       <w:hyperlink w:anchor="Ref_hirschman1982hedonic" w:history="1">
         <w:r>
+          <w:rPr>
+            <w:rFonts w:cs="Times New Roman"/>
+          </w:rPr>
           <w:t>(Hirschman dan Holbrook, 1982)</w:t>
         </w:r>
       </w:hyperlink>
@@ -12991,6 +13415,9 @@
       </w:r>
       <w:hyperlink w:anchor="Ref_babin1994work" w:history="1">
         <w:r>
+          <w:rPr>
+            <w:rFonts w:cs="Times New Roman"/>
+          </w:rPr>
           <w:t xml:space="preserve">(Babin </w:t>
         </w:r>
         <w:r>
@@ -13035,6 +13462,9 @@
       </w:r>
       <w:hyperlink w:anchor="Ref_pranggabayu2022pengaruh" w:history="1">
         <w:r>
+          <w:rPr>
+            <w:rFonts w:cs="Times New Roman"/>
+          </w:rPr>
           <w:t>Pranggabayu dan Andjarwati (2022)</w:t>
         </w:r>
       </w:hyperlink>
@@ -13046,6 +13476,9 @@
       </w:r>
       <w:hyperlink w:anchor="Ref_azizah2025exploring" w:history="1">
         <w:r>
+          <w:rPr>
+            <w:rFonts w:cs="Times New Roman"/>
+          </w:rPr>
           <w:t>Azizah dan Fauzi (2025)</w:t>
         </w:r>
       </w:hyperlink>
@@ -13057,6 +13490,9 @@
       </w:r>
       <w:hyperlink w:anchor="Ref_artadita2024how" w:history="1">
         <w:r>
+          <w:rPr>
+            <w:rFonts w:cs="Times New Roman"/>
+          </w:rPr>
           <w:t>Artadita dan Firmialy (2024)</w:t>
         </w:r>
       </w:hyperlink>
@@ -13198,7 +13634,7 @@
         <w:outlineLvl w:val="2"/>
       </w:pPr>
       <w:bookmarkStart w:id="53" w:name="TOC_2_4_2_PENGARUH_DESIRE_FOR_COMPLETENE"/>
-      <w:bookmarkStart w:id="54" w:name="_Toc241678192"/>
+      <w:bookmarkStart w:id="54" w:name="_Toc241753646"/>
       <w:r>
         <w:rPr>
           <w:rFonts w:ascii="Times New Roman" w:hAnsi="Times New Roman"/>
@@ -13274,6 +13710,9 @@
       </w:r>
       <w:hyperlink w:anchor="Ref_zeigarnik1927behalten" w:history="1">
         <w:r>
+          <w:rPr>
+            <w:rFonts w:cs="Times New Roman"/>
+          </w:rPr>
           <w:t>(Zeigarnik, 1927)</w:t>
         </w:r>
       </w:hyperlink>
@@ -13298,6 +13737,9 @@
       </w:r>
       <w:hyperlink w:anchor="Ref_gao2014completing" w:history="1">
         <w:r>
+          <w:rPr>
+            <w:rFonts w:cs="Times New Roman"/>
+          </w:rPr>
           <w:t xml:space="preserve">(Gao </w:t>
         </w:r>
         <w:r>
@@ -13335,6 +13777,9 @@
       </w:r>
       <w:hyperlink w:anchor="Ref_belk1995collecting" w:history="1">
         <w:r>
+          <w:rPr>
+            <w:rFonts w:cs="Times New Roman"/>
+          </w:rPr>
           <w:t>Belk, 1995</w:t>
         </w:r>
       </w:hyperlink>
@@ -13346,6 +13791,9 @@
       </w:r>
       <w:hyperlink w:anchor="Ref_barasz2017pseudo" w:history="1">
         <w:r>
+          <w:rPr>
+            <w:rFonts w:cs="Times New Roman"/>
+          </w:rPr>
           <w:t xml:space="preserve">Barasz </w:t>
         </w:r>
         <w:r>
@@ -13390,6 +13838,9 @@
       </w:r>
       <w:hyperlink w:anchor="Ref_gao2014completing" w:history="1">
         <w:r>
+          <w:rPr>
+            <w:rFonts w:cs="Times New Roman"/>
+          </w:rPr>
           <w:t xml:space="preserve">Gao </w:t>
         </w:r>
         <w:r>
@@ -13427,6 +13878,9 @@
       </w:r>
       <w:hyperlink w:anchor="Ref_gong2024unveiling" w:history="1">
         <w:r>
+          <w:rPr>
+            <w:rFonts w:cs="Times New Roman"/>
+          </w:rPr>
           <w:t xml:space="preserve">Gong </w:t>
         </w:r>
         <w:r>
@@ -13451,6 +13905,9 @@
       </w:r>
       <w:hyperlink w:anchor="Ref_dewi2026understanding" w:history="1">
         <w:r>
+          <w:rPr>
+            <w:rFonts w:cs="Times New Roman"/>
+          </w:rPr>
           <w:t xml:space="preserve">Dewi </w:t>
         </w:r>
         <w:r>
@@ -13488,6 +13945,9 @@
       </w:r>
       <w:hyperlink w:anchor="Ref_dewi2026understanding" w:history="1">
         <w:r>
+          <w:rPr>
+            <w:rFonts w:cs="Times New Roman"/>
+          </w:rPr>
           <w:t xml:space="preserve">Dewi </w:t>
         </w:r>
         <w:r>
@@ -13635,7 +14095,7 @@
         <w:outlineLvl w:val="2"/>
       </w:pPr>
       <w:bookmarkStart w:id="55" w:name="TOC_2_4_3_PENGARUH_SPECULATIVE_MOTIVE_TE"/>
-      <w:bookmarkStart w:id="56" w:name="_Toc241678193"/>
+      <w:bookmarkStart w:id="56" w:name="_Toc241753647"/>
       <w:r>
         <w:rPr>
           <w:rFonts w:ascii="Times New Roman" w:hAnsi="Times New Roman"/>
@@ -13712,6 +14172,9 @@
       </w:r>
       <w:hyperlink w:anchor="Ref_kahneman1979prospect" w:history="1">
         <w:r>
+          <w:rPr>
+            <w:rFonts w:cs="Times New Roman"/>
+          </w:rPr>
           <w:t>Kahneman and Tversky, 1979</w:t>
         </w:r>
       </w:hyperlink>
@@ -13723,6 +14186,9 @@
       </w:r>
       <w:hyperlink w:anchor="Ref_shiller2000irrational" w:history="1">
         <w:r>
+          <w:rPr>
+            <w:rFonts w:cs="Times New Roman"/>
+          </w:rPr>
           <w:t>Shiller, 2000</w:t>
         </w:r>
       </w:hyperlink>
@@ -13760,6 +14226,9 @@
       </w:r>
       <w:hyperlink w:anchor="Ref_barber2008all" w:history="1">
         <w:r>
+          <w:rPr>
+            <w:rFonts w:cs="Times New Roman"/>
+          </w:rPr>
           <w:t>(Barber dan Odean, 2008)</w:t>
         </w:r>
       </w:hyperlink>
@@ -13791,6 +14260,9 @@
       </w:r>
       <w:hyperlink w:anchor="Ref_aryadi2024personal" w:history="1">
         <w:r>
+          <w:rPr>
+            <w:rFonts w:cs="Times New Roman"/>
+          </w:rPr>
           <w:t>Aryadi dan Lingga (2026)</w:t>
         </w:r>
       </w:hyperlink>
@@ -13828,6 +14300,9 @@
       </w:r>
       <w:hyperlink w:anchor="Ref_colline2024biases" w:history="1">
         <w:r>
+          <w:rPr>
+            <w:rFonts w:cs="Times New Roman"/>
+          </w:rPr>
           <w:t>Colline (2024)</w:t>
         </w:r>
       </w:hyperlink>
@@ -13937,6 +14412,9 @@
       </w:r>
       <w:hyperlink w:anchor="Ref_pricecharting2024" w:history="1">
         <w:r>
+          <w:rPr>
+            <w:rFonts w:cs="Times New Roman"/>
+          </w:rPr>
           <w:t>(PriceCharting, 2024)</w:t>
         </w:r>
       </w:hyperlink>
@@ -14038,7 +14516,7 @@
         <w:outlineLvl w:val="2"/>
       </w:pPr>
       <w:bookmarkStart w:id="57" w:name="TOC_2_4_4_PENGARUH_MODERASI_SELF_CONTROL"/>
-      <w:bookmarkStart w:id="58" w:name="_Toc241678194"/>
+      <w:bookmarkStart w:id="58" w:name="_Toc241753648"/>
       <w:r>
         <w:rPr>
           <w:rFonts w:ascii="Times New Roman" w:hAnsi="Times New Roman"/>
@@ -14133,6 +14611,9 @@
       </w:r>
       <w:hyperlink w:anchor="Ref_baumeister2002yield" w:history="1">
         <w:r>
+          <w:rPr>
+            <w:rFonts w:cs="Times New Roman"/>
+          </w:rPr>
           <w:t>(Baumeister, 2002)</w:t>
         </w:r>
       </w:hyperlink>
@@ -14157,6 +14638,9 @@
       </w:r>
       <w:hyperlink w:anchor="Ref_thaler1981economic" w:history="1">
         <w:r>
+          <w:rPr>
+            <w:rFonts w:cs="Times New Roman"/>
+          </w:rPr>
           <w:t>(Thaler dan Shefrin, 1981)</w:t>
         </w:r>
       </w:hyperlink>
@@ -14201,6 +14685,9 @@
       </w:r>
       <w:hyperlink w:anchor="Ref_tangney2004high" w:history="1">
         <w:r>
+          <w:rPr>
+            <w:rFonts w:cs="Times New Roman"/>
+          </w:rPr>
           <w:t xml:space="preserve">(Tangney </w:t>
         </w:r>
         <w:r>
@@ -14284,6 +14771,9 @@
       </w:r>
       <w:hyperlink w:anchor="Ref_lienardy2026role" w:history="1">
         <w:r>
+          <w:rPr>
+            <w:rFonts w:cs="Times New Roman"/>
+          </w:rPr>
           <w:t>Lienardy dan Panasea (2026)</w:t>
         </w:r>
       </w:hyperlink>
@@ -14321,6 +14811,9 @@
       </w:r>
       <w:hyperlink w:anchor="Ref_katauke2023financial" w:history="1">
         <w:r>
+          <w:rPr>
+            <w:rFonts w:cs="Times New Roman"/>
+          </w:rPr>
           <w:t xml:space="preserve">Katauke </w:t>
         </w:r>
         <w:r>
@@ -14345,6 +14838,9 @@
       </w:r>
       <w:hyperlink w:anchor="Ref_apidana2022peran" w:history="1">
         <w:r>
+          <w:rPr>
+            <w:rFonts w:cs="Times New Roman"/>
+          </w:rPr>
           <w:t>Apidana dan Kholifah (2022)</w:t>
         </w:r>
       </w:hyperlink>
@@ -14382,6 +14878,9 @@
       </w:r>
       <w:hyperlink w:anchor="Ref_artadita2024how" w:history="1">
         <w:r>
+          <w:rPr>
+            <w:rFonts w:cs="Times New Roman"/>
+          </w:rPr>
           <w:t>Artadita dan Firmialy (2024)</w:t>
         </w:r>
       </w:hyperlink>
@@ -14492,7 +14991,7 @@
         <w:outlineLvl w:val="2"/>
       </w:pPr>
       <w:bookmarkStart w:id="59" w:name="TOC_2_4_5_PENGARUH_MODERASI_SELF_CONTROL"/>
-      <w:bookmarkStart w:id="60" w:name="_Toc241678195"/>
+      <w:bookmarkStart w:id="60" w:name="_Toc241753649"/>
       <w:r>
         <w:rPr>
           <w:rFonts w:ascii="Times New Roman" w:hAnsi="Times New Roman"/>
@@ -14587,6 +15086,9 @@
       </w:r>
       <w:hyperlink w:anchor="Ref_tangney2004high" w:history="1">
         <w:r>
+          <w:rPr>
+            <w:rFonts w:cs="Times New Roman"/>
+          </w:rPr>
           <w:t xml:space="preserve">Tangney </w:t>
         </w:r>
         <w:r>
@@ -14611,6 +15113,9 @@
       </w:r>
       <w:hyperlink w:anchor="Ref_baumeister2002yield" w:history="1">
         <w:r>
+          <w:rPr>
+            <w:rFonts w:cs="Times New Roman"/>
+          </w:rPr>
           <w:t>Baumeister, 2002</w:t>
         </w:r>
       </w:hyperlink>
@@ -14714,6 +15219,9 @@
       </w:r>
       <w:hyperlink w:anchor="Ref_artadita2024how" w:history="1">
         <w:r>
+          <w:rPr>
+            <w:rFonts w:cs="Times New Roman"/>
+          </w:rPr>
           <w:t>Artadita dan Firmialy (2024)</w:t>
         </w:r>
       </w:hyperlink>
@@ -14725,6 +15233,9 @@
       </w:r>
       <w:hyperlink w:anchor="Ref_katauke2023financial" w:history="1">
         <w:r>
+          <w:rPr>
+            <w:rFonts w:cs="Times New Roman"/>
+          </w:rPr>
           <w:t xml:space="preserve">Katauke </w:t>
         </w:r>
         <w:r>
@@ -14749,6 +15260,9 @@
       </w:r>
       <w:hyperlink w:anchor="Ref_apidana2022peran" w:history="1">
         <w:r>
+          <w:rPr>
+            <w:rFonts w:cs="Times New Roman"/>
+          </w:rPr>
           <w:t>Apidana dan Kholifah (2022)</w:t>
         </w:r>
       </w:hyperlink>
@@ -14898,7 +15412,7 @@
         <w:outlineLvl w:val="2"/>
       </w:pPr>
       <w:bookmarkStart w:id="61" w:name="TOC_2_4_6_PENGARUH_MODERASI_SELF_CONTROL"/>
-      <w:bookmarkStart w:id="62" w:name="_Toc241678196"/>
+      <w:bookmarkStart w:id="62" w:name="_Toc241753650"/>
       <w:r>
         <w:rPr>
           <w:rFonts w:ascii="Times New Roman" w:hAnsi="Times New Roman"/>
@@ -14993,6 +15507,9 @@
       </w:r>
       <w:hyperlink w:anchor="Ref_thaler1981economic" w:history="1">
         <w:r>
+          <w:rPr>
+            <w:rFonts w:cs="Times New Roman"/>
+          </w:rPr>
           <w:t>Thaler and Shefrin, 1981</w:t>
         </w:r>
       </w:hyperlink>
@@ -15004,6 +15521,9 @@
       </w:r>
       <w:hyperlink w:anchor="Ref_barber2008all" w:history="1">
         <w:r>
+          <w:rPr>
+            <w:rFonts w:cs="Times New Roman"/>
+          </w:rPr>
           <w:t>Barber and Odean, 2008</w:t>
         </w:r>
       </w:hyperlink>
@@ -15061,6 +15581,9 @@
       </w:r>
       <w:hyperlink w:anchor="Ref_katauke2023financial" w:history="1">
         <w:r>
+          <w:rPr>
+            <w:rFonts w:cs="Times New Roman"/>
+          </w:rPr>
           <w:t xml:space="preserve">Katauke </w:t>
         </w:r>
         <w:r>
@@ -15092,6 +15615,9 @@
       </w:r>
       <w:hyperlink w:anchor="Ref_aryadi2024personal" w:history="1">
         <w:r>
+          <w:rPr>
+            <w:rFonts w:cs="Times New Roman"/>
+          </w:rPr>
           <w:t>Aryadi dan Lingga (2026)</w:t>
         </w:r>
       </w:hyperlink>
@@ -15103,6 +15629,9 @@
       </w:r>
       <w:hyperlink w:anchor="Ref_colline2024biases" w:history="1">
         <w:r>
+          <w:rPr>
+            <w:rFonts w:cs="Times New Roman"/>
+          </w:rPr>
           <w:t>Colline (2024)</w:t>
         </w:r>
       </w:hyperlink>
@@ -15252,7 +15781,7 @@
         <w:outlineLvl w:val="1"/>
       </w:pPr>
       <w:bookmarkStart w:id="63" w:name="TOC_2_5_RERANGKA_PENELITIAN"/>
-      <w:bookmarkStart w:id="64" w:name="_Toc241678197"/>
+      <w:bookmarkStart w:id="64" w:name="_Toc241753651"/>
       <w:r>
         <w:rPr>
           <w:rFonts w:ascii="Times New Roman" w:hAnsi="Times New Roman"/>
@@ -15288,7 +15817,7 @@
           <w:noProof/>
         </w:rPr>
         <w:drawing>
-          <wp:inline distT="0" distB="0" distL="0" distR="0" wp14:anchorId="12D0AFEC" wp14:editId="6AF9AE06">
+          <wp:inline distT="0" distB="0" distL="0" distR="0" wp14:anchorId="162A9596" wp14:editId="7AB94A65">
             <wp:extent cx="5040000" cy="2876340"/>
             <wp:effectExtent l="0" t="0" r="0" b="0"/>
             <wp:docPr id="5" name="Picture 5"/>
@@ -15364,7 +15893,7 @@
         <w:outlineLvl w:val="0"/>
       </w:pPr>
       <w:bookmarkStart w:id="66" w:name="TOC_BAB_3_METODE_PENELITIAN"/>
-      <w:bookmarkStart w:id="67" w:name="_Toc241678198"/>
+      <w:bookmarkStart w:id="67" w:name="_Toc241753652"/>
       <w:r>
         <w:rPr>
           <w:rFonts w:ascii="Times New Roman" w:hAnsi="Times New Roman"/>
@@ -15398,11 +15927,24 @@
     </w:p>
     <w:p>
       <w:pPr>
+        <w:spacing w:after="0" w:line="360" w:lineRule="auto"/>
+        <w:ind w:firstLine="709"/>
+        <w:jc w:val="both"/>
+      </w:pPr>
+      <w:r>
+        <w:rPr>
+          <w:rFonts w:cs="Times New Roman"/>
+        </w:rPr>
+        <w:t>\phantomsection</w:t>
+      </w:r>
+    </w:p>
+    <w:p>
+      <w:pPr>
         <w:pStyle w:val="Heading2"/>
         <w:outlineLvl w:val="1"/>
       </w:pPr>
       <w:bookmarkStart w:id="68" w:name="TOC_3_1_JENIS_DAN_SUMBER_DATA"/>
-      <w:bookmarkStart w:id="69" w:name="_Toc241678199"/>
+      <w:bookmarkStart w:id="69" w:name="_Toc241753653"/>
       <w:r>
         <w:rPr>
           <w:rFonts w:ascii="Times New Roman" w:hAnsi="Times New Roman"/>
@@ -15442,6 +15984,9 @@
       </w:r>
       <w:hyperlink w:anchor="Ref_sekaran2016research" w:history="1">
         <w:r>
+          <w:rPr>
+            <w:rFonts w:cs="Times New Roman"/>
+          </w:rPr>
           <w:t>(Sekaran dan Bougie, 2016)</w:t>
         </w:r>
       </w:hyperlink>
@@ -15479,6 +16024,9 @@
       </w:r>
       <w:hyperlink w:anchor="Ref_sugiyono2019metode" w:history="1">
         <w:r>
+          <w:rPr>
+            <w:rFonts w:cs="Times New Roman"/>
+          </w:rPr>
           <w:t>(Sugiyono, 2019)</w:t>
         </w:r>
       </w:hyperlink>
@@ -16037,7 +16585,7 @@
         <w:outlineLvl w:val="2"/>
       </w:pPr>
       <w:bookmarkStart w:id="71" w:name="TOC_3_1_1_BATASAN_PENELITIAN_DAN_RUANG_L"/>
-      <w:bookmarkStart w:id="72" w:name="_Toc241678200"/>
+      <w:bookmarkStart w:id="72" w:name="_Toc241753654"/>
       <w:r>
         <w:rPr>
           <w:rFonts w:ascii="Times New Roman" w:hAnsi="Times New Roman"/>
@@ -16074,6 +16622,7 @@
           <w:rFonts w:cs="Times New Roman"/>
           <w:b/>
         </w:rPr>
+        <w:lastRenderedPageBreak/>
         <w:t xml:space="preserve">•  </w:t>
       </w:r>
       <w:r>
@@ -16107,7 +16656,6 @@
           <w:rFonts w:cs="Times New Roman"/>
           <w:i/>
         </w:rPr>
-        <w:lastRenderedPageBreak/>
         <w:t>Pokémon Trading Card Game</w:t>
       </w:r>
       <w:r>
@@ -16333,7 +16881,7 @@
         <w:outlineLvl w:val="1"/>
       </w:pPr>
       <w:bookmarkStart w:id="73" w:name="TOC_3_2_POPULASI_DAN_SAMPEL"/>
-      <w:bookmarkStart w:id="74" w:name="_Toc241678201"/>
+      <w:bookmarkStart w:id="74" w:name="_Toc241753655"/>
       <w:r>
         <w:rPr>
           <w:rFonts w:ascii="Times New Roman" w:hAnsi="Times New Roman"/>
@@ -16352,7 +16900,7 @@
         <w:outlineLvl w:val="2"/>
       </w:pPr>
       <w:bookmarkStart w:id="75" w:name="TOC_3_2_1_POPULASI_DAN_IDENTIFIKASI_SUMB"/>
-      <w:bookmarkStart w:id="76" w:name="_Toc241678202"/>
+      <w:bookmarkStart w:id="76" w:name="_Toc241753656"/>
       <w:r>
         <w:rPr>
           <w:rFonts w:ascii="Times New Roman" w:hAnsi="Times New Roman"/>
@@ -16428,6 +16976,7 @@
           <w:rFonts w:cs="Times New Roman"/>
           <w:b/>
         </w:rPr>
+        <w:lastRenderedPageBreak/>
         <w:t xml:space="preserve">•  </w:t>
       </w:r>
       <w:r>
@@ -16456,14 +17005,7 @@
         <w:rPr>
           <w:rFonts w:cs="Times New Roman"/>
         </w:rPr>
-        <w:t xml:space="preserve"> Jaringan komunitas pemain dan kolektor terdaftar yang aktif berkegiatan di toko </w:t>
-      </w:r>
-      <w:r>
-        <w:rPr>
-          <w:rFonts w:cs="Times New Roman"/>
-        </w:rPr>
-        <w:lastRenderedPageBreak/>
-        <w:t>hobi resmi mitra AKG Games di wilayah Jakarta Barat (seperti gerai LGS di kawasan Tanjung Duren, Central Park, Mall Taman Anggrek, dan Puri Indah) yang rutin menyelenggarakan turnamen mingguan (</w:t>
+        <w:t xml:space="preserve"> Jaringan komunitas pemain dan kolektor terdaftar yang aktif berkegiatan di toko hobi resmi mitra AKG Games di wilayah Jakarta Barat (seperti gerai LGS di kawasan Tanjung Duren, Central Park, Mall Taman Anggrek, dan Puri Indah) yang rutin menyelenggarakan turnamen mingguan (</w:t>
       </w:r>
       <w:r>
         <w:rPr>
@@ -16578,7 +17120,7 @@
         <w:outlineLvl w:val="2"/>
       </w:pPr>
       <w:bookmarkStart w:id="77" w:name="TOC_3_2_2_SAMPEL_DAN_JUSTIFIKASI_KRITERI"/>
-      <w:bookmarkStart w:id="78" w:name="_Toc241678203"/>
+      <w:bookmarkStart w:id="78" w:name="_Toc241753657"/>
       <w:r>
         <w:rPr>
           <w:rFonts w:ascii="Times New Roman" w:hAnsi="Times New Roman"/>
@@ -16715,6 +17257,7 @@
           <w:rFonts w:cs="Times New Roman"/>
           <w:b/>
         </w:rPr>
+        <w:lastRenderedPageBreak/>
         <w:t xml:space="preserve">•  </w:t>
       </w:r>
       <w:r>
@@ -16728,14 +17271,7 @@
         <w:rPr>
           <w:rFonts w:cs="Times New Roman"/>
         </w:rPr>
-        <w:t xml:space="preserve"> Berdasarkan Undang-Undang Republik Indonesia Nomor 24 Tahun 2013 tentang Perubahan atas </w:t>
-      </w:r>
-      <w:r>
-        <w:rPr>
-          <w:rFonts w:cs="Times New Roman"/>
-        </w:rPr>
-        <w:lastRenderedPageBreak/>
-        <w:t>Undang-Undang Nomor 23 Tahun 2006 tentang Administrasi Kependudukan, batas usia 17 tahun menandai kepemilikan Kartu Tanda Penduduk (KTP) sebagai bukti identitas kedewasaan administratif dan hak sipil di Indonesia. Pada usia ini, responden dipandang cakap memberikan persetujuan partisipasi survei risiko-minimal (</w:t>
+        <w:t xml:space="preserve"> Berdasarkan Undang-Undang Republik Indonesia Nomor 24 Tahun 2013 tentang Perubahan atas Undang-Undang Nomor 23 Tahun 2006 tentang Administrasi Kependudukan, batas usia 17 tahun menandai kepemilikan Kartu Tanda Penduduk (KTP) sebagai bukti identitas kedewasaan administratif dan hak sipil di Indonesia. Pada usia ini, responden dipandang cakap memberikan persetujuan partisipasi survei risiko-minimal (</w:t>
       </w:r>
       <w:r>
         <w:rPr>
@@ -16970,6 +17506,7 @@
           <w:rFonts w:cs="Times New Roman"/>
           <w:b/>
         </w:rPr>
+        <w:lastRenderedPageBreak/>
         <w:t xml:space="preserve">•  </w:t>
       </w:r>
       <w:r>
@@ -16990,15 +17527,7 @@
           <w:rFonts w:cs="Times New Roman"/>
           <w:i/>
         </w:rPr>
-        <w:t xml:space="preserve">screening </w:t>
-      </w:r>
-      <w:r>
-        <w:rPr>
-          <w:rFonts w:cs="Times New Roman"/>
-          <w:i/>
-        </w:rPr>
-        <w:lastRenderedPageBreak/>
-        <w:t>questions</w:t>
+        <w:t>screening questions</w:t>
       </w:r>
       <w:r>
         <w:rPr>
@@ -17079,7 +17608,7 @@
         <w:outlineLvl w:val="2"/>
       </w:pPr>
       <w:bookmarkStart w:id="79" w:name="TOC_3_2_3_PROSEDUR_DISTRIBUSI_KUESIONER_"/>
-      <w:bookmarkStart w:id="80" w:name="_Toc241678204"/>
+      <w:bookmarkStart w:id="80" w:name="_Toc241753658"/>
       <w:r>
         <w:rPr>
           <w:rFonts w:ascii="Times New Roman" w:hAnsi="Times New Roman"/>
@@ -17196,7 +17725,14 @@
         <w:rPr>
           <w:rFonts w:cs="Times New Roman"/>
         </w:rPr>
-        <w:t xml:space="preserve"> komunitas kartu koleksi di pusat perbelanjaan wilayah Jakarta Barat. Jalur ini mengutamakan kualitas verifikasi identitas dan ketepatan sasaran geografis.</w:t>
+        <w:t xml:space="preserve"> komunitas kartu koleksi di </w:t>
+      </w:r>
+      <w:r>
+        <w:rPr>
+          <w:rFonts w:cs="Times New Roman"/>
+        </w:rPr>
+        <w:lastRenderedPageBreak/>
+        <w:t>pusat perbelanjaan wilayah Jakarta Barat. Jalur ini mengutamakan kualitas verifikasi identitas dan ketepatan sasaran geografis.</w:t>
       </w:r>
     </w:p>
     <w:p>
@@ -17238,14 +17774,7 @@
         <w:rPr>
           <w:rFonts w:cs="Times New Roman"/>
         </w:rPr>
-        <w:t xml:space="preserve"> Kuesioner disebarkan melalui media sosial dan platform </w:t>
-      </w:r>
-      <w:r>
-        <w:rPr>
-          <w:rFonts w:cs="Times New Roman"/>
-        </w:rPr>
-        <w:lastRenderedPageBreak/>
-        <w:t xml:space="preserve">pesan instan yang dikelola oleh komunitas Pokémon TCG yang berdomisili atau aktif berdagang secara </w:t>
+        <w:t xml:space="preserve"> Kuesioner disebarkan melalui media sosial dan platform pesan instan yang dikelola oleh komunitas Pokémon TCG yang berdomisili atau aktif berdagang secara </w:t>
       </w:r>
       <w:r>
         <w:rPr>
@@ -17345,7 +17874,7 @@
         <w:outlineLvl w:val="2"/>
       </w:pPr>
       <w:bookmarkStart w:id="81" w:name="TOC_3_2_4_PENENTUAN_UKURAN_SAMPEL"/>
-      <w:bookmarkStart w:id="82" w:name="_Toc241678205"/>
+      <w:bookmarkStart w:id="82" w:name="_Toc241753659"/>
       <w:r>
         <w:rPr>
           <w:rFonts w:ascii="Times New Roman" w:hAnsi="Times New Roman"/>
@@ -17372,6 +17901,9 @@
       </w:r>
       <w:hyperlink w:anchor="Ref_green1991subjects" w:history="1">
         <w:r>
+          <w:rPr>
+            <w:rFonts w:cs="Times New Roman"/>
+          </w:rPr>
           <w:t>Green (1991)</w:t>
         </w:r>
       </w:hyperlink>
@@ -17907,6 +18439,9 @@
       </w:r>
       <w:hyperlink w:anchor="Ref_green1991subjects" w:history="1">
         <w:r>
+          <w:rPr>
+            <w:rFonts w:cs="Times New Roman"/>
+          </w:rPr>
           <w:t>Green (1991)</w:t>
         </w:r>
       </w:hyperlink>
@@ -17953,10 +18488,20 @@
         <w:rPr>
           <w:rFonts w:cs="Times New Roman"/>
         </w:rPr>
-        <w:t xml:space="preserve">). Rentang 120–150 tersebut memenuhi kriteria </w:t>
+        <w:t xml:space="preserve">). Rentang 120–150 </w:t>
+      </w:r>
+      <w:r>
+        <w:rPr>
+          <w:rFonts w:cs="Times New Roman"/>
+        </w:rPr>
+        <w:lastRenderedPageBreak/>
+        <w:t xml:space="preserve">tersebut memenuhi kriteria </w:t>
       </w:r>
       <w:hyperlink w:anchor="Ref_cohen1988statistical" w:history="1">
         <w:r>
+          <w:rPr>
+            <w:rFonts w:cs="Times New Roman"/>
+          </w:rPr>
           <w:t>Cohen (1988)</w:t>
         </w:r>
       </w:hyperlink>
@@ -18012,7 +18557,7 @@
         <w:outlineLvl w:val="2"/>
       </w:pPr>
       <w:bookmarkStart w:id="83" w:name="TOC_3_2_5_JUSTIFIKASI_KOMPARATIF_PEMILIH"/>
-      <w:bookmarkStart w:id="84" w:name="_Toc241678206"/>
+      <w:bookmarkStart w:id="84" w:name="_Toc241753660"/>
       <w:r>
         <w:rPr>
           <w:rFonts w:ascii="Times New Roman" w:hAnsi="Times New Roman"/>
@@ -18020,7 +18565,6 @@
           <w:color w:val="000000"/>
           <w:sz w:val="24"/>
         </w:rPr>
-        <w:lastRenderedPageBreak/>
         <w:t>3.2.5 Justifikasi Komparatif Pemilihan Teknik Sampling</w:t>
       </w:r>
       <w:bookmarkEnd w:id="83"/>
@@ -18040,6 +18584,9 @@
       </w:r>
       <w:hyperlink w:anchor="Ref_sekaran2016research" w:history="1">
         <w:r>
+          <w:rPr>
+            <w:rFonts w:cs="Times New Roman"/>
+          </w:rPr>
           <w:t>Sekaran and Bougie, 2016</w:t>
         </w:r>
       </w:hyperlink>
@@ -18051,6 +18598,9 @@
       </w:r>
       <w:hyperlink w:anchor="Ref_sugiyono2019metode" w:history="1">
         <w:r>
+          <w:rPr>
+            <w:rFonts w:cs="Times New Roman"/>
+          </w:rPr>
           <w:t>Sugiyono, 2019</w:t>
         </w:r>
       </w:hyperlink>
@@ -18253,6 +18803,9 @@
       </w:r>
       <w:hyperlink w:anchor="Ref_aryadi2024personal" w:history="1">
         <w:r>
+          <w:rPr>
+            <w:rFonts w:cs="Times New Roman"/>
+          </w:rPr>
           <w:t>(Aryadi dan Lingga, 2026)</w:t>
         </w:r>
       </w:hyperlink>
@@ -18269,7 +18822,7 @@
         <w:outlineLvl w:val="1"/>
       </w:pPr>
       <w:bookmarkStart w:id="85" w:name="TOC_3_3_MODEL_PENELITIAN"/>
-      <w:bookmarkStart w:id="86" w:name="_Toc241678207"/>
+      <w:bookmarkStart w:id="86" w:name="_Toc241753661"/>
       <w:r>
         <w:rPr>
           <w:rFonts w:ascii="Times New Roman" w:hAnsi="Times New Roman"/>
@@ -18309,6 +18862,9 @@
       </w:r>
       <w:hyperlink w:anchor="Ref_aiken1991multiple" w:history="1">
         <w:r>
+          <w:rPr>
+            <w:rFonts w:cs="Times New Roman"/>
+          </w:rPr>
           <w:t>Aiken and West, 1991</w:t>
         </w:r>
       </w:hyperlink>
@@ -18320,6 +18876,9 @@
       </w:r>
       <w:hyperlink w:anchor="Ref_cohen1988statistical" w:history="1">
         <w:r>
+          <w:rPr>
+            <w:rFonts w:cs="Times New Roman"/>
+          </w:rPr>
           <w:t>Cohen, 1988</w:t>
         </w:r>
       </w:hyperlink>
@@ -18331,6 +18890,9 @@
       </w:r>
       <w:hyperlink w:anchor="Ref_hayes2018introduction" w:history="1">
         <w:r>
+          <w:rPr>
+            <w:rFonts w:cs="Times New Roman"/>
+          </w:rPr>
           <w:t>Hayes, 2018</w:t>
         </w:r>
       </w:hyperlink>
@@ -18352,6 +18914,7 @@
           <w:rFonts w:cs="Times New Roman"/>
           <w:b/>
         </w:rPr>
+        <w:lastRenderedPageBreak/>
         <w:t>Model 1: Regresi Linear Berganda Hirarkis (Model Aditif Baseline / Efek Utama):</w:t>
       </w:r>
     </w:p>
@@ -18687,7 +19250,6 @@
           <w:rFonts w:cs="Times New Roman"/>
           <w:b/>
         </w:rPr>
-        <w:lastRenderedPageBreak/>
         <w:t xml:space="preserve">Model 2: </w:t>
       </w:r>
       <w:r>
@@ -19967,7 +20529,14 @@
         <w:rPr>
           <w:rFonts w:cs="Times New Roman"/>
         </w:rPr>
-        <w:t xml:space="preserve">² tidak tercampur efek langsung pemoderasi; β₄ tidak diuji sebagai hipotesis tersendiri dan tidak memiliki pasangan RM/Tujuan/H (hipotesis penelitian tetap 6: H1–H3 langsung, H4–H6 moderasi memperlemah). Baris 4 pada matriks kesenjangan (Subjek </w:t>
+        <w:t xml:space="preserve">² tidak tercampur efek langsung pemoderasi; β₄ tidak diuji sebagai </w:t>
+      </w:r>
+      <w:r>
+        <w:rPr>
+          <w:rFonts w:cs="Times New Roman"/>
+        </w:rPr>
+        <w:lastRenderedPageBreak/>
+        <w:t xml:space="preserve">hipotesis tersendiri dan tidak memiliki pasangan RM/Tujuan/H (hipotesis penelitian tetap 6: H1–H3 langsung, H4–H6 moderasi memperlemah). Baris 4 pada matriks kesenjangan (Subjek </w:t>
       </w:r>
       <w:r>
         <w:rPr>
@@ -19993,14 +20562,7 @@
         <w:rPr>
           <w:rFonts w:cs="Times New Roman"/>
         </w:rPr>
-        <w:t xml:space="preserve">) berfungsi sebagai justifikasi </w:t>
-      </w:r>
-      <w:r>
-        <w:rPr>
-          <w:rFonts w:cs="Times New Roman"/>
-        </w:rPr>
-        <w:lastRenderedPageBreak/>
-        <w:t xml:space="preserve">teoretis perlunya memasukkan </w:t>
+        <w:t xml:space="preserve">) berfungsi sebagai justifikasi teoretis perlunya memasukkan </w:t>
       </w:r>
       <w:r>
         <w:rPr>
@@ -20290,7 +20852,7 @@
         <w:outlineLvl w:val="1"/>
       </w:pPr>
       <w:bookmarkStart w:id="87" w:name="TOC_3_4_OPERASIONALISASI_VARIABEL"/>
-      <w:bookmarkStart w:id="88" w:name="_Toc241678208"/>
+      <w:bookmarkStart w:id="88" w:name="_Toc241753662"/>
       <w:r>
         <w:rPr>
           <w:rFonts w:ascii="Times New Roman" w:hAnsi="Times New Roman"/>
@@ -20598,18 +21160,34 @@
             </w:r>
             <w:hyperlink w:anchor="Ref_rook1987buying" w:history="1">
               <w:r>
+                <w:rPr>
+                  <w:rFonts w:cs="Times New Roman"/>
+                  <w:sz w:val="18"/>
+                </w:rPr>
                 <w:t>Rook, 1987</w:t>
               </w:r>
             </w:hyperlink>
             <w:r>
+              <w:rPr>
+                <w:rFonts w:cs="Times New Roman"/>
+                <w:sz w:val="18"/>
+              </w:rPr>
               <w:t xml:space="preserve">; </w:t>
             </w:r>
             <w:hyperlink w:anchor="Ref_verplanken2001individual" w:history="1">
               <w:r>
+                <w:rPr>
+                  <w:rFonts w:cs="Times New Roman"/>
+                  <w:sz w:val="18"/>
+                </w:rPr>
                 <w:t>Verplanken &amp; Herabadi, 2001</w:t>
               </w:r>
             </w:hyperlink>
             <w:r>
+              <w:rPr>
+                <w:rFonts w:cs="Times New Roman"/>
+                <w:sz w:val="18"/>
+              </w:rPr>
               <w:t>).</w:t>
             </w:r>
           </w:p>
@@ -21345,10 +21923,18 @@
             </w:r>
             <w:hyperlink w:anchor="Ref_arnold2003hedonic" w:history="1">
               <w:r>
+                <w:rPr>
+                  <w:rFonts w:cs="Times New Roman"/>
+                  <w:sz w:val="18"/>
+                </w:rPr>
                 <w:t>(Arnold dan Reynolds, 2003)</w:t>
               </w:r>
             </w:hyperlink>
             <w:r>
+              <w:rPr>
+                <w:rFonts w:cs="Times New Roman"/>
+                <w:sz w:val="18"/>
+              </w:rPr>
               <w:t>.</w:t>
             </w:r>
           </w:p>
@@ -21966,14 +22552,26 @@
             </w:r>
             <w:hyperlink w:anchor="Ref_belk1995collecting" w:history="1">
               <w:r>
+                <w:rPr>
+                  <w:rFonts w:cs="Times New Roman"/>
+                  <w:sz w:val="18"/>
+                </w:rPr>
                 <w:t>Belk, 1995</w:t>
               </w:r>
             </w:hyperlink>
             <w:r>
+              <w:rPr>
+                <w:rFonts w:cs="Times New Roman"/>
+                <w:sz w:val="18"/>
+              </w:rPr>
               <w:t xml:space="preserve">; </w:t>
             </w:r>
             <w:hyperlink w:anchor="Ref_gao2014completing" w:history="1">
               <w:r>
+                <w:rPr>
+                  <w:rFonts w:cs="Times New Roman"/>
+                  <w:sz w:val="18"/>
+                </w:rPr>
                 <w:t xml:space="preserve">Gao </w:t>
               </w:r>
               <w:r>
@@ -21993,10 +22591,18 @@
               </w:r>
             </w:hyperlink>
             <w:r>
+              <w:rPr>
+                <w:rFonts w:cs="Times New Roman"/>
+                <w:sz w:val="18"/>
+              </w:rPr>
               <w:t xml:space="preserve">; </w:t>
             </w:r>
             <w:hyperlink w:anchor="Ref_barasz2017pseudo" w:history="1">
               <w:r>
+                <w:rPr>
+                  <w:rFonts w:cs="Times New Roman"/>
+                  <w:sz w:val="18"/>
+                </w:rPr>
                 <w:t xml:space="preserve">Barasz </w:t>
               </w:r>
               <w:r>
@@ -22016,6 +22622,10 @@
               </w:r>
             </w:hyperlink>
             <w:r>
+              <w:rPr>
+                <w:rFonts w:cs="Times New Roman"/>
+                <w:sz w:val="18"/>
+              </w:rPr>
               <w:t>).</w:t>
             </w:r>
           </w:p>
@@ -22588,7 +23198,6 @@
                 <w:b/>
                 <w:sz w:val="18"/>
               </w:rPr>
-              <w:lastRenderedPageBreak/>
               <w:t>Speculative Motive (</w:t>
             </w:r>
             <w:r>
@@ -22633,14 +23242,26 @@
             </w:r>
             <w:hyperlink w:anchor="Ref_shiller2000irrational" w:history="1">
               <w:r>
+                <w:rPr>
+                  <w:rFonts w:cs="Times New Roman"/>
+                  <w:sz w:val="18"/>
+                </w:rPr>
                 <w:t>Shiller, 2000</w:t>
               </w:r>
             </w:hyperlink>
             <w:r>
+              <w:rPr>
+                <w:rFonts w:cs="Times New Roman"/>
+                <w:sz w:val="18"/>
+              </w:rPr>
               <w:t xml:space="preserve">; </w:t>
             </w:r>
             <w:hyperlink w:anchor="Ref_baur2018bitcoin" w:history="1">
               <w:r>
+                <w:rPr>
+                  <w:rFonts w:cs="Times New Roman"/>
+                  <w:sz w:val="18"/>
+                </w:rPr>
                 <w:t xml:space="preserve">Baur </w:t>
               </w:r>
               <w:r>
@@ -22660,14 +23281,26 @@
               </w:r>
             </w:hyperlink>
             <w:r>
+              <w:rPr>
+                <w:rFonts w:cs="Times New Roman"/>
+                <w:sz w:val="18"/>
+              </w:rPr>
               <w:t xml:space="preserve">; </w:t>
             </w:r>
             <w:hyperlink w:anchor="Ref_colline2024biases" w:history="1">
               <w:r>
+                <w:rPr>
+                  <w:rFonts w:cs="Times New Roman"/>
+                  <w:sz w:val="18"/>
+                </w:rPr>
                 <w:t>Colline, 2024</w:t>
               </w:r>
             </w:hyperlink>
             <w:r>
+              <w:rPr>
+                <w:rFonts w:cs="Times New Roman"/>
+                <w:sz w:val="18"/>
+              </w:rPr>
               <w:t>).</w:t>
             </w:r>
           </w:p>
@@ -23221,7 +23854,6 @@
                 <w:b/>
                 <w:sz w:val="18"/>
               </w:rPr>
-              <w:lastRenderedPageBreak/>
               <w:t>Self-Control (</w:t>
             </w:r>
             <w:r>
@@ -23266,6 +23898,10 @@
             </w:r>
             <w:hyperlink w:anchor="Ref_tangney2004high" w:history="1">
               <w:r>
+                <w:rPr>
+                  <w:rFonts w:cs="Times New Roman"/>
+                  <w:sz w:val="18"/>
+                </w:rPr>
                 <w:t xml:space="preserve">Tangney </w:t>
               </w:r>
               <w:r>
@@ -23285,18 +23921,34 @@
               </w:r>
             </w:hyperlink>
             <w:r>
+              <w:rPr>
+                <w:rFonts w:cs="Times New Roman"/>
+                <w:sz w:val="18"/>
+              </w:rPr>
               <w:t xml:space="preserve">; </w:t>
             </w:r>
             <w:hyperlink w:anchor="Ref_vohs2007spent" w:history="1">
               <w:r>
+                <w:rPr>
+                  <w:rFonts w:cs="Times New Roman"/>
+                  <w:sz w:val="18"/>
+                </w:rPr>
                 <w:t>Vohs &amp; Faber, 2007</w:t>
               </w:r>
             </w:hyperlink>
             <w:r>
+              <w:rPr>
+                <w:rFonts w:cs="Times New Roman"/>
+                <w:sz w:val="18"/>
+              </w:rPr>
               <w:t xml:space="preserve">; </w:t>
             </w:r>
             <w:hyperlink w:anchor="Ref_sultan2012building" w:history="1">
               <w:r>
+                <w:rPr>
+                  <w:rFonts w:cs="Times New Roman"/>
+                  <w:sz w:val="18"/>
+                </w:rPr>
                 <w:t xml:space="preserve">Sultan </w:t>
               </w:r>
               <w:r>
@@ -23316,22 +23968,42 @@
               </w:r>
             </w:hyperlink>
             <w:r>
+              <w:rPr>
+                <w:rFonts w:cs="Times New Roman"/>
+                <w:sz w:val="18"/>
+              </w:rPr>
               <w:t xml:space="preserve">; </w:t>
             </w:r>
             <w:hyperlink w:anchor="Ref_apidana2022peran" w:history="1">
               <w:r>
+                <w:rPr>
+                  <w:rFonts w:cs="Times New Roman"/>
+                  <w:sz w:val="18"/>
+                </w:rPr>
                 <w:t>Apidana &amp; Kholifah, 2022</w:t>
               </w:r>
             </w:hyperlink>
             <w:r>
+              <w:rPr>
+                <w:rFonts w:cs="Times New Roman"/>
+                <w:sz w:val="18"/>
+              </w:rPr>
               <w:t xml:space="preserve">; </w:t>
             </w:r>
             <w:hyperlink w:anchor="Ref_lienardy2026role" w:history="1">
               <w:r>
+                <w:rPr>
+                  <w:rFonts w:cs="Times New Roman"/>
+                  <w:sz w:val="18"/>
+                </w:rPr>
                 <w:t>Lienardy &amp; Panasea, 2026</w:t>
               </w:r>
             </w:hyperlink>
             <w:r>
+              <w:rPr>
+                <w:rFonts w:cs="Times New Roman"/>
+                <w:sz w:val="18"/>
+              </w:rPr>
               <w:t>).</w:t>
             </w:r>
           </w:p>
@@ -23978,7 +24650,7 @@
         <w:outlineLvl w:val="1"/>
       </w:pPr>
       <w:bookmarkStart w:id="90" w:name="TOC_3_5_METODE_ANALISIS_DATA"/>
-      <w:bookmarkStart w:id="91" w:name="_Toc241678209"/>
+      <w:bookmarkStart w:id="91" w:name="_Toc241753663"/>
       <w:r>
         <w:rPr>
           <w:rFonts w:ascii="Times New Roman" w:hAnsi="Times New Roman"/>
@@ -23986,6 +24658,7 @@
           <w:color w:val="000000"/>
           <w:sz w:val="24"/>
         </w:rPr>
+        <w:lastRenderedPageBreak/>
         <w:t>3.5 Metode Analisis Data</w:t>
       </w:r>
       <w:bookmarkEnd w:id="90"/>
@@ -23997,7 +24670,7 @@
         <w:outlineLvl w:val="2"/>
       </w:pPr>
       <w:bookmarkStart w:id="92" w:name="TOC_3_5_1_JUSTIFIKASI_KOMPARATIF_PEMILIH"/>
-      <w:bookmarkStart w:id="93" w:name="_Toc241678210"/>
+      <w:bookmarkStart w:id="93" w:name="_Toc241753664"/>
       <w:r>
         <w:rPr>
           <w:rFonts w:ascii="Times New Roman" w:hAnsi="Times New Roman"/>
@@ -24072,6 +24745,9 @@
       </w:r>
       <w:hyperlink w:anchor="Ref_hair2019multivariate" w:history="1">
         <w:r>
+          <w:rPr>
+            <w:rFonts w:cs="Times New Roman"/>
+          </w:rPr>
           <w:t xml:space="preserve">(Hair </w:t>
         </w:r>
         <w:r>
@@ -24146,6 +24822,9 @@
       </w:r>
       <w:hyperlink w:anchor="Ref_aiken1991multiple" w:history="1">
         <w:r>
+          <w:rPr>
+            <w:rFonts w:cs="Times New Roman"/>
+          </w:rPr>
           <w:t>Aiken and West, 1991</w:t>
         </w:r>
       </w:hyperlink>
@@ -24157,6 +24836,9 @@
       </w:r>
       <w:hyperlink w:anchor="Ref_hayes2018introduction" w:history="1">
         <w:r>
+          <w:rPr>
+            <w:rFonts w:cs="Times New Roman"/>
+          </w:rPr>
           <w:t>Hayes, 2018</w:t>
         </w:r>
       </w:hyperlink>
@@ -24168,6 +24850,9 @@
       </w:r>
       <w:hyperlink w:anchor="Ref_ghozali2018aplikasi" w:history="1">
         <w:r>
+          <w:rPr>
+            <w:rFonts w:cs="Times New Roman"/>
+          </w:rPr>
           <w:t>Ghozali, 2018</w:t>
         </w:r>
       </w:hyperlink>
@@ -24235,7 +24920,6 @@
           <w:rFonts w:cs="Times New Roman"/>
           <w:b/>
         </w:rPr>
-        <w:lastRenderedPageBreak/>
         <w:t xml:space="preserve">•  </w:t>
       </w:r>
       <w:r>
@@ -24259,6 +24943,9 @@
       </w:r>
       <w:hyperlink w:anchor="Ref_hair2019multivariate" w:history="1">
         <w:r>
+          <w:rPr>
+            <w:rFonts w:cs="Times New Roman"/>
+          </w:rPr>
           <w:t xml:space="preserve">(Hair </w:t>
         </w:r>
         <w:r>
@@ -24325,7 +25012,14 @@
         <w:rPr>
           <w:rFonts w:cs="Times New Roman"/>
         </w:rPr>
-        <w:t>²) maupun koefisien interaksi, serta memfasilitasi interpretasi koefisien efek utama β₁, β₂, β₃ pada nilai rata-rata pemoderasi (</w:t>
+        <w:t xml:space="preserve">²) maupun koefisien interaksi, serta memfasilitasi interpretasi koefisien efek </w:t>
+      </w:r>
+      <w:r>
+        <w:rPr>
+          <w:rFonts w:cs="Times New Roman"/>
+        </w:rPr>
+        <w:lastRenderedPageBreak/>
+        <w:t>utama β₁, β₂, β₃ pada nilai rata-rata pemoderasi (</w:t>
       </w:r>
       <w:r>
         <w:rPr>
@@ -24342,6 +25036,9 @@
       </w:r>
       <w:hyperlink w:anchor="Ref_aiken1991multiple" w:history="1">
         <w:r>
+          <w:rPr>
+            <w:rFonts w:cs="Times New Roman"/>
+          </w:rPr>
           <w:t>Aiken and West, 1991</w:t>
         </w:r>
       </w:hyperlink>
@@ -24353,6 +25050,9 @@
       </w:r>
       <w:hyperlink w:anchor="Ref_hayes2018introduction" w:history="1">
         <w:r>
+          <w:rPr>
+            <w:rFonts w:cs="Times New Roman"/>
+          </w:rPr>
           <w:t>Hayes, 2018</w:t>
         </w:r>
       </w:hyperlink>
@@ -24384,6 +25084,9 @@
       </w:r>
       <w:hyperlink w:anchor="Ref_sultan2012building" w:history="1">
         <w:r>
+          <w:rPr>
+            <w:rFonts w:cs="Times New Roman"/>
+          </w:rPr>
           <w:t xml:space="preserve">Sultan </w:t>
         </w:r>
         <w:r>
@@ -24408,6 +25111,9 @@
       </w:r>
       <w:hyperlink w:anchor="Ref_apidana2022peran" w:history="1">
         <w:r>
+          <w:rPr>
+            <w:rFonts w:cs="Times New Roman"/>
+          </w:rPr>
           <w:t>Apidana and Kholifah, 2022</w:t>
         </w:r>
       </w:hyperlink>
@@ -24419,6 +25125,9 @@
       </w:r>
       <w:hyperlink w:anchor="Ref_lienardy2026role" w:history="1">
         <w:r>
+          <w:rPr>
+            <w:rFonts w:cs="Times New Roman"/>
+          </w:rPr>
           <w:t>Lienardy and Panasea, 2026</w:t>
         </w:r>
       </w:hyperlink>
@@ -24600,6 +25309,9 @@
       </w:r>
       <w:hyperlink w:anchor="Ref_ghozali2018aplikasi" w:history="1">
         <w:r>
+          <w:rPr>
+            <w:rFonts w:cs="Times New Roman"/>
+          </w:rPr>
           <w:t>Ghozali, 2018</w:t>
         </w:r>
       </w:hyperlink>
@@ -24611,6 +25323,9 @@
       </w:r>
       <w:hyperlink w:anchor="Ref_sekaran2016research" w:history="1">
         <w:r>
+          <w:rPr>
+            <w:rFonts w:cs="Times New Roman"/>
+          </w:rPr>
           <w:t>Sekaran and Bougie, 2016</w:t>
         </w:r>
       </w:hyperlink>
@@ -24671,14 +25386,7 @@
         <w:rPr>
           <w:rFonts w:cs="Times New Roman"/>
         </w:rPr>
-        <w:t xml:space="preserve"> (residual </w:t>
-      </w:r>
-      <w:r>
-        <w:rPr>
-          <w:rFonts w:cs="Times New Roman"/>
-        </w:rPr>
-        <w:lastRenderedPageBreak/>
-        <w:t xml:space="preserve">normal jika signifikansi asimtotik </w:t>
+        <w:t xml:space="preserve"> (residual normal jika signifikansi asimtotik </w:t>
       </w:r>
       <w:r>
         <w:rPr>
@@ -24796,6 +25504,7 @@
           <w:rFonts w:cs="Times New Roman"/>
           <w:i/>
         </w:rPr>
+        <w:lastRenderedPageBreak/>
         <w:t>Catatan metodologis:</w:t>
       </w:r>
       <w:r>
@@ -24832,6 +25541,9 @@
       </w:r>
       <w:hyperlink w:anchor="Ref_ghozali2018aplikasi" w:history="1">
         <w:r>
+          <w:rPr>
+            <w:rFonts w:cs="Times New Roman"/>
+          </w:rPr>
           <w:t>(Ghozali, 2018)</w:t>
         </w:r>
       </w:hyperlink>
@@ -25223,159 +25935,159 @@
         <w:rPr>
           <w:rFonts w:cs="Times New Roman"/>
         </w:rPr>
-        <w:t xml:space="preserve"> &lt; 0,05 dan arah koefisien sejalan dengan arah hipotesis: β₁, β₂, β₃ &gt; 0; β₅, β₆, β₇ &lt; 0). Koefisien β₁, β₂, β₃ pada Model 2 </w:t>
+        <w:t xml:space="preserve"> &lt; 0,05 dan arah koefisien sejalan dengan arah hipotesis: β₁, β₂, β₃ &gt; 0; β₅, β₆, β₇ &lt; 0). Koefisien β₁, β₂, β₃ pada Model 2 merefleksikan pengaruh utama pada rata-rata kontrol diri (</w:t>
+      </w:r>
+      <w:r>
+        <w:rPr>
+          <w:rFonts w:cs="Times New Roman"/>
+          <w:i/>
+        </w:rPr>
+        <w:t>M*</w:t>
+      </w:r>
+      <w:r>
+        <w:rPr>
+          <w:rFonts w:cs="Times New Roman"/>
+        </w:rPr>
+        <w:t xml:space="preserve"> = 0); (b) </w:t>
+      </w:r>
+      <w:r>
+        <w:rPr>
+          <w:rFonts w:cs="Times New Roman"/>
+          <w:b/>
+        </w:rPr>
+        <w:t>Uji Statistik F (Uji Kelayakan Model):</w:t>
+      </w:r>
+      <w:r>
+        <w:rPr>
+          <w:rFonts w:cs="Times New Roman"/>
+        </w:rPr>
+        <w:t xml:space="preserve"> menguji kelayakan model regresi secara simultan pada taraf signifikansi </w:t>
+      </w:r>
+      <w:r>
+        <w:rPr>
+          <w:rFonts w:cs="Times New Roman"/>
+          <w:i/>
+        </w:rPr>
+        <w:t>p</w:t>
+      </w:r>
+      <w:r>
+        <w:rPr>
+          <w:rFonts w:cs="Times New Roman"/>
+        </w:rPr>
+        <w:t xml:space="preserve"> &lt; 0,05; (c) </w:t>
+      </w:r>
+      <w:r>
+        <w:rPr>
+          <w:rFonts w:cs="Times New Roman"/>
+          <w:b/>
+        </w:rPr>
+        <w:t>Analisis Kemiringan Bersyarat (</w:t>
+      </w:r>
+      <w:r>
+        <w:rPr>
+          <w:rFonts w:cs="Times New Roman"/>
+          <w:b/>
+          <w:i/>
+        </w:rPr>
+        <w:t>Simple Slopes Analysis</w:t>
+      </w:r>
+      <w:r>
+        <w:rPr>
+          <w:rFonts w:cs="Times New Roman"/>
+          <w:b/>
+        </w:rPr>
+        <w:t>):</w:t>
+      </w:r>
+      <w:r>
+        <w:rPr>
+          <w:rFonts w:cs="Times New Roman"/>
+        </w:rPr>
+        <w:t xml:space="preserve"> Hipotesis moderasi (H4, H5, H6) diuji lewat kemiringan bersyarat per-hipotesis; H4: ∂Y/∂</w:t>
+      </w:r>
+      <w:r>
+        <w:rPr>
+          <w:rFonts w:cs="Times New Roman"/>
+          <w:i/>
+        </w:rPr>
+        <w:t>X₁*</w:t>
+      </w:r>
+      <w:r>
+        <w:rPr>
+          <w:rFonts w:cs="Times New Roman"/>
+        </w:rPr>
+        <w:t xml:space="preserve"> = β₁ + β₅</w:t>
+      </w:r>
+      <w:r>
+        <w:rPr>
+          <w:rFonts w:cs="Times New Roman"/>
+          <w:i/>
+        </w:rPr>
+        <w:t>M*</w:t>
+      </w:r>
+      <w:r>
+        <w:rPr>
+          <w:rFonts w:cs="Times New Roman"/>
+        </w:rPr>
+        <w:t>; H5: ∂Y/∂</w:t>
+      </w:r>
+      <w:r>
+        <w:rPr>
+          <w:rFonts w:cs="Times New Roman"/>
+          <w:i/>
+        </w:rPr>
+        <w:t>X₂*</w:t>
+      </w:r>
+      <w:r>
+        <w:rPr>
+          <w:rFonts w:cs="Times New Roman"/>
+        </w:rPr>
+        <w:t xml:space="preserve"> = β₂ + β₆</w:t>
+      </w:r>
+      <w:r>
+        <w:rPr>
+          <w:rFonts w:cs="Times New Roman"/>
+          <w:i/>
+        </w:rPr>
+        <w:t>M*</w:t>
+      </w:r>
+      <w:r>
+        <w:rPr>
+          <w:rFonts w:cs="Times New Roman"/>
+        </w:rPr>
+        <w:t>; H6: ∂Y/∂</w:t>
+      </w:r>
+      <w:r>
+        <w:rPr>
+          <w:rFonts w:cs="Times New Roman"/>
+          <w:i/>
+        </w:rPr>
+        <w:t>X₃*</w:t>
+      </w:r>
+      <w:r>
+        <w:rPr>
+          <w:rFonts w:cs="Times New Roman"/>
+        </w:rPr>
+        <w:t xml:space="preserve"> = β₃ + β₇</w:t>
+      </w:r>
+      <w:r>
+        <w:rPr>
+          <w:rFonts w:cs="Times New Roman"/>
+          <w:i/>
+        </w:rPr>
+        <w:t>M*</w:t>
+      </w:r>
+      <w:r>
+        <w:rPr>
+          <w:rFonts w:cs="Times New Roman"/>
+        </w:rPr>
+        <w:t xml:space="preserve"> - pada kontrol diri rendah (−1 SD), rata-rata (0 SD), dan tinggi (+1 SD). Efek memperlemah </w:t>
       </w:r>
       <w:r>
         <w:rPr>
           <w:rFonts w:cs="Times New Roman"/>
         </w:rPr>
         <w:lastRenderedPageBreak/>
-        <w:t>merefleksikan pengaruh utama pada rata-rata kontrol diri (</w:t>
-      </w:r>
-      <w:r>
-        <w:rPr>
-          <w:rFonts w:cs="Times New Roman"/>
-          <w:i/>
-        </w:rPr>
-        <w:t>M*</w:t>
-      </w:r>
-      <w:r>
-        <w:rPr>
-          <w:rFonts w:cs="Times New Roman"/>
-        </w:rPr>
-        <w:t xml:space="preserve"> = 0); (b) </w:t>
-      </w:r>
-      <w:r>
-        <w:rPr>
-          <w:rFonts w:cs="Times New Roman"/>
-          <w:b/>
-        </w:rPr>
-        <w:t>Uji Statistik F (Uji Kelayakan Model):</w:t>
-      </w:r>
-      <w:r>
-        <w:rPr>
-          <w:rFonts w:cs="Times New Roman"/>
-        </w:rPr>
-        <w:t xml:space="preserve"> menguji kelayakan model regresi secara simultan pada taraf signifikansi </w:t>
-      </w:r>
-      <w:r>
-        <w:rPr>
-          <w:rFonts w:cs="Times New Roman"/>
-          <w:i/>
-        </w:rPr>
-        <w:t>p</w:t>
-      </w:r>
-      <w:r>
-        <w:rPr>
-          <w:rFonts w:cs="Times New Roman"/>
-        </w:rPr>
-        <w:t xml:space="preserve"> &lt; 0,05; (c) </w:t>
-      </w:r>
-      <w:r>
-        <w:rPr>
-          <w:rFonts w:cs="Times New Roman"/>
-          <w:b/>
-        </w:rPr>
-        <w:t>Analisis Kemiringan Bersyarat (</w:t>
-      </w:r>
-      <w:r>
-        <w:rPr>
-          <w:rFonts w:cs="Times New Roman"/>
-          <w:b/>
-          <w:i/>
-        </w:rPr>
-        <w:t>Simple Slopes Analysis</w:t>
-      </w:r>
-      <w:r>
-        <w:rPr>
-          <w:rFonts w:cs="Times New Roman"/>
-          <w:b/>
-        </w:rPr>
-        <w:t>):</w:t>
-      </w:r>
-      <w:r>
-        <w:rPr>
-          <w:rFonts w:cs="Times New Roman"/>
-        </w:rPr>
-        <w:t xml:space="preserve"> Hipotesis moderasi (H4, H5, H6) diuji lewat kemiringan bersyarat per-hipotesis; H4: ∂Y/∂</w:t>
-      </w:r>
-      <w:r>
-        <w:rPr>
-          <w:rFonts w:cs="Times New Roman"/>
-          <w:i/>
-        </w:rPr>
-        <w:t>X₁*</w:t>
-      </w:r>
-      <w:r>
-        <w:rPr>
-          <w:rFonts w:cs="Times New Roman"/>
-        </w:rPr>
-        <w:t xml:space="preserve"> = β₁ + β₅</w:t>
-      </w:r>
-      <w:r>
-        <w:rPr>
-          <w:rFonts w:cs="Times New Roman"/>
-          <w:i/>
-        </w:rPr>
-        <w:t>M*</w:t>
-      </w:r>
-      <w:r>
-        <w:rPr>
-          <w:rFonts w:cs="Times New Roman"/>
-        </w:rPr>
-        <w:t>; H5: ∂Y/∂</w:t>
-      </w:r>
-      <w:r>
-        <w:rPr>
-          <w:rFonts w:cs="Times New Roman"/>
-          <w:i/>
-        </w:rPr>
-        <w:t>X₂*</w:t>
-      </w:r>
-      <w:r>
-        <w:rPr>
-          <w:rFonts w:cs="Times New Roman"/>
-        </w:rPr>
-        <w:t xml:space="preserve"> = β₂ + β₆</w:t>
-      </w:r>
-      <w:r>
-        <w:rPr>
-          <w:rFonts w:cs="Times New Roman"/>
-          <w:i/>
-        </w:rPr>
-        <w:t>M*</w:t>
-      </w:r>
-      <w:r>
-        <w:rPr>
-          <w:rFonts w:cs="Times New Roman"/>
-        </w:rPr>
-        <w:t>; H6: ∂Y/∂</w:t>
-      </w:r>
-      <w:r>
-        <w:rPr>
-          <w:rFonts w:cs="Times New Roman"/>
-          <w:i/>
-        </w:rPr>
-        <w:t>X₃*</w:t>
-      </w:r>
-      <w:r>
-        <w:rPr>
-          <w:rFonts w:cs="Times New Roman"/>
-        </w:rPr>
-        <w:t xml:space="preserve"> = β₃ + β₇</w:t>
-      </w:r>
-      <w:r>
-        <w:rPr>
-          <w:rFonts w:cs="Times New Roman"/>
-          <w:i/>
-        </w:rPr>
-        <w:t>M*</w:t>
-      </w:r>
-      <w:r>
-        <w:rPr>
-          <w:rFonts w:cs="Times New Roman"/>
-        </w:rPr>
-        <w:t xml:space="preserve"> - pada kontrol diri rendah (−1 SD), rata-rata (0 SD), dan tinggi (+1 SD). Efek memperlemah terbukti bila kemiringan </w:t>
+        <w:t xml:space="preserve">terbukti bila kemiringan </w:t>
       </w:r>
       <w:r>
         <w:rPr>
@@ -25411,6 +26123,9 @@
       </w:r>
       <w:hyperlink w:anchor="Ref_aiken1991multiple" w:history="1">
         <w:r>
+          <w:rPr>
+            <w:rFonts w:cs="Times New Roman"/>
+          </w:rPr>
           <w:t>Aiken and West, 1991</w:t>
         </w:r>
       </w:hyperlink>
@@ -25422,6 +26137,9 @@
       </w:r>
       <w:hyperlink w:anchor="Ref_hayes2018introduction" w:history="1">
         <w:r>
+          <w:rPr>
+            <w:rFonts w:cs="Times New Roman"/>
+          </w:rPr>
           <w:t>Hayes, 2018</w:t>
         </w:r>
       </w:hyperlink>
@@ -25438,7 +26156,7 @@
         <w:outlineLvl w:val="1"/>
       </w:pPr>
       <w:bookmarkStart w:id="94" w:name="TOC_3_6_DIAGRAM_ALUR_PENELITIAN"/>
-      <w:bookmarkStart w:id="95" w:name="_Toc241678211"/>
+      <w:bookmarkStart w:id="95" w:name="_Toc241753665"/>
       <w:r>
         <w:rPr>
           <w:rFonts w:ascii="Times New Roman" w:hAnsi="Times New Roman"/>
@@ -25474,7 +26192,7 @@
           <w:noProof/>
         </w:rPr>
         <w:drawing>
-          <wp:inline distT="0" distB="0" distL="0" distR="0" wp14:anchorId="07960C5A" wp14:editId="22648907">
+          <wp:inline distT="0" distB="0" distL="0" distR="0" wp14:anchorId="3167F9A8" wp14:editId="7CE16A55">
             <wp:extent cx="4680000" cy="4701382"/>
             <wp:effectExtent l="0" t="0" r="0" b="0"/>
             <wp:docPr id="6" name="Picture 6"/>
@@ -25536,7 +26254,6 @@
           <w:i/>
           <w:sz w:val="20"/>
         </w:rPr>
-        <w:lastRenderedPageBreak/>
         <w:t>Sumber: Dikembangkan oleh penulis untuk tahapan operasional penelitian, 2026.</w:t>
       </w:r>
     </w:p>
@@ -25618,6 +26335,7 @@
           <w:rFonts w:cs="Times New Roman"/>
           <w:b/>
         </w:rPr>
+        <w:lastRenderedPageBreak/>
         <w:t xml:space="preserve">•  </w:t>
       </w:r>
       <w:r>
@@ -25854,7 +26572,7 @@
         <w:outlineLvl w:val="1"/>
       </w:pPr>
       <w:bookmarkStart w:id="97" w:name="TOC_3_7_JADWAL_PELAKSANAAN_PENELITIAN"/>
-      <w:bookmarkStart w:id="98" w:name="_Toc241678212"/>
+      <w:bookmarkStart w:id="98" w:name="_Toc241753666"/>
       <w:r>
         <w:rPr>
           <w:rFonts w:ascii="Times New Roman" w:hAnsi="Times New Roman"/>
@@ -26663,7 +27381,6 @@
               <w:rPr>
                 <w:sz w:val="19"/>
               </w:rPr>
-              <w:lastRenderedPageBreak/>
               <w:t>4</w:t>
             </w:r>
           </w:p>
@@ -27478,6 +28195,7 @@
               <w:rPr>
                 <w:sz w:val="19"/>
               </w:rPr>
+              <w:lastRenderedPageBreak/>
               <w:t>9</w:t>
             </w:r>
           </w:p>
@@ -27806,7 +28524,7 @@
         <w:outlineLvl w:val="0"/>
       </w:pPr>
       <w:bookmarkStart w:id="100" w:name="TOC_DAFTAR_PUSTAKA"/>
-      <w:bookmarkStart w:id="101" w:name="_Toc241678213"/>
+      <w:bookmarkStart w:id="101" w:name="_Toc241753667"/>
       <w:r>
         <w:rPr>
           <w:rFonts w:ascii="Times New Roman" w:hAnsi="Times New Roman"/>
@@ -29722,31 +30440,31 @@
       </w:rPr>
     </w:lvl>
   </w:abstractNum>
-  <w:num w:numId="1" w16cid:durableId="1843155061">
+  <w:num w:numId="1" w16cid:durableId="1985116551">
     <w:abstractNumId w:val="8"/>
   </w:num>
-  <w:num w:numId="2" w16cid:durableId="1939214569">
+  <w:num w:numId="2" w16cid:durableId="514734469">
     <w:abstractNumId w:val="6"/>
   </w:num>
-  <w:num w:numId="3" w16cid:durableId="2127579261">
+  <w:num w:numId="3" w16cid:durableId="607661813">
     <w:abstractNumId w:val="5"/>
   </w:num>
-  <w:num w:numId="4" w16cid:durableId="282418895">
+  <w:num w:numId="4" w16cid:durableId="1985158852">
     <w:abstractNumId w:val="4"/>
   </w:num>
-  <w:num w:numId="5" w16cid:durableId="1169716440">
+  <w:num w:numId="5" w16cid:durableId="30738346">
     <w:abstractNumId w:val="7"/>
   </w:num>
-  <w:num w:numId="6" w16cid:durableId="701636833">
+  <w:num w:numId="6" w16cid:durableId="452476979">
     <w:abstractNumId w:val="3"/>
   </w:num>
-  <w:num w:numId="7" w16cid:durableId="501505659">
+  <w:num w:numId="7" w16cid:durableId="1034767115">
     <w:abstractNumId w:val="2"/>
   </w:num>
-  <w:num w:numId="8" w16cid:durableId="1299413141">
+  <w:num w:numId="8" w16cid:durableId="1869104349">
     <w:abstractNumId w:val="1"/>
   </w:num>
-  <w:num w:numId="9" w16cid:durableId="837304892">
+  <w:num w:numId="9" w16cid:durableId="299461002">
     <w:abstractNumId w:val="0"/>
   </w:num>
 </w:numbering>
@@ -41187,7 +41905,7 @@
     <w:autoRedefine/>
     <w:uiPriority w:val="39"/>
     <w:unhideWhenUsed/>
-    <w:rsid w:val="00A44416"/>
+    <w:rsid w:val="007971EB"/>
     <w:pPr>
       <w:spacing w:after="40" w:line="240" w:lineRule="auto"/>
     </w:pPr>
@@ -41203,7 +41921,7 @@
     <w:autoRedefine/>
     <w:uiPriority w:val="39"/>
     <w:unhideWhenUsed/>
-    <w:rsid w:val="00A44416"/>
+    <w:rsid w:val="007971EB"/>
     <w:pPr>
       <w:spacing w:after="40" w:line="240" w:lineRule="auto"/>
       <w:ind w:left="360"/>
@@ -41219,7 +41937,7 @@
     <w:autoRedefine/>
     <w:uiPriority w:val="39"/>
     <w:unhideWhenUsed/>
-    <w:rsid w:val="00A44416"/>
+    <w:rsid w:val="007971EB"/>
     <w:pPr>
       <w:spacing w:after="40" w:line="240" w:lineRule="auto"/>
       <w:ind w:left="720"/>
@@ -41234,7 +41952,7 @@
     <w:basedOn w:val="DefaultParagraphFont"/>
     <w:uiPriority w:val="99"/>
     <w:unhideWhenUsed/>
-    <w:rsid w:val="00A44416"/>
+    <w:rsid w:val="007971EB"/>
     <w:rPr>
       <w:color w:val="0000FF" w:themeColor="hyperlink"/>
       <w:u w:val="single"/>

</xml_diff>

<commit_message>
feat(references): substitusi 14 pustaka mutakhir 2021-2025 ber-DOI, paritas 5-arah 54 entri (11/11 gate PASS)
</commit_message>
<xml_diff>
--- a/01_Naskah_Utama/Proposal_Arthur_PokemonTCG.docx
+++ b/01_Naskah_Utama/Proposal_Arthur_PokemonTCG.docx
@@ -12,7 +12,7 @@
           <w:noProof/>
         </w:rPr>
         <w:drawing>
-          <wp:inline distT="0" distB="0" distL="0" distR="0" wp14:anchorId="1A2FEA6E" wp14:editId="3B413ABA">
+          <wp:inline distT="0" distB="0" distL="0" distR="0" wp14:anchorId="2F0E4D5A" wp14:editId="52BA4A24">
             <wp:extent cx="1152000" cy="1152000"/>
             <wp:effectExtent l="0" t="0" r="0" b="0"/>
             <wp:docPr id="1" name="Picture 1"/>
@@ -275,7 +275,7 @@
         <w:outlineLvl w:val="0"/>
       </w:pPr>
       <w:bookmarkStart w:id="0" w:name="TOC_PERNYATAAN_KEASLIAN_KARYA_TUGAS_AKHI"/>
-      <w:bookmarkStart w:id="1" w:name="_Toc242115818"/>
+      <w:bookmarkStart w:id="1" w:name="_Toc243076512"/>
       <w:r>
         <w:rPr>
           <w:rFonts w:ascii="Times New Roman" w:hAnsi="Times New Roman"/>
@@ -847,7 +847,7 @@
         <w:outlineLvl w:val="0"/>
       </w:pPr>
       <w:bookmarkStart w:id="2" w:name="TOC_HALAMAN_PERSETUJUAN_PROPOSAL_SKRIPSI"/>
-      <w:bookmarkStart w:id="3" w:name="_Toc242115819"/>
+      <w:bookmarkStart w:id="3" w:name="_Toc243076513"/>
       <w:r>
         <w:rPr>
           <w:rFonts w:ascii="Times New Roman" w:hAnsi="Times New Roman"/>
@@ -1405,7 +1405,7 @@
         <w:outlineLvl w:val="0"/>
       </w:pPr>
       <w:bookmarkStart w:id="4" w:name="TOC_HALAMAN_PENGESAHAN_TIM_PENGUJI_SEMIN"/>
-      <w:bookmarkStart w:id="5" w:name="_Toc242115820"/>
+      <w:bookmarkStart w:id="5" w:name="_Toc243076514"/>
       <w:r>
         <w:rPr>
           <w:rFonts w:ascii="Times New Roman" w:hAnsi="Times New Roman"/>
@@ -1763,7 +1763,7 @@
         <w:outlineLvl w:val="0"/>
       </w:pPr>
       <w:bookmarkStart w:id="6" w:name="TOC_KATA_PENGANTAR"/>
-      <w:bookmarkStart w:id="7" w:name="_Toc242115821"/>
+      <w:bookmarkStart w:id="7" w:name="_Toc243076515"/>
       <w:r>
         <w:rPr>
           <w:rFonts w:ascii="Times New Roman" w:hAnsi="Times New Roman"/>
@@ -2054,7 +2054,7 @@
         <w:outlineLvl w:val="0"/>
       </w:pPr>
       <w:bookmarkStart w:id="8" w:name="TOC_ABSTRAK"/>
-      <w:bookmarkStart w:id="9" w:name="_Toc242115822"/>
+      <w:bookmarkStart w:id="9" w:name="_Toc243076516"/>
       <w:r>
         <w:rPr>
           <w:rFonts w:ascii="Times New Roman" w:hAnsi="Times New Roman"/>
@@ -2578,7 +2578,7 @@
         <w:outlineLvl w:val="0"/>
       </w:pPr>
       <w:bookmarkStart w:id="10" w:name="TOC_ABSTRACT"/>
-      <w:bookmarkStart w:id="11" w:name="_Toc242115823"/>
+      <w:bookmarkStart w:id="11" w:name="_Toc243076517"/>
       <w:r>
         <w:rPr>
           <w:rFonts w:ascii="Times New Roman" w:hAnsi="Times New Roman"/>
@@ -3001,7 +3001,7 @@
           <w14:ligatures w14:val="standardContextual"/>
         </w:rPr>
       </w:pPr>
-      <w:hyperlink w:anchor="_Toc242115824" w:history="1">
+      <w:hyperlink w:anchor="_Toc243076518" w:history="1">
         <w:r>
           <w:rPr>
             <w:noProof/>
@@ -4971,7 +4971,7 @@
         <w:spacing w:after="360"/>
         <w:outlineLvl w:val="0"/>
       </w:pPr>
-      <w:bookmarkStart w:id="13" w:name="_Toc242115824"/>
+      <w:bookmarkStart w:id="13" w:name="_Toc243076518"/>
       <w:r>
         <w:rPr>
           <w:rFonts w:ascii="Times New Roman" w:hAnsi="Times New Roman"/>
@@ -5136,7 +5136,7 @@
         <w:outlineLvl w:val="0"/>
       </w:pPr>
       <w:bookmarkStart w:id="14" w:name="TOC_DAFTAR_GAMBAR"/>
-      <w:bookmarkStart w:id="15" w:name="_Toc242115825"/>
+      <w:bookmarkStart w:id="15" w:name="_Toc243076519"/>
       <w:r>
         <w:rPr>
           <w:rFonts w:ascii="Times New Roman" w:hAnsi="Times New Roman"/>
@@ -5315,7 +5315,7 @@
         <w:outlineLvl w:val="0"/>
       </w:pPr>
       <w:bookmarkStart w:id="16" w:name="TOC_BAB_I_PENDAHULUAN"/>
-      <w:bookmarkStart w:id="17" w:name="_Toc242115826"/>
+      <w:bookmarkStart w:id="17" w:name="_Toc243076520"/>
       <w:r>
         <w:rPr>
           <w:rFonts w:ascii="Times New Roman" w:hAnsi="Times New Roman"/>
@@ -5366,7 +5366,7 @@
         <w:outlineLvl w:val="1"/>
       </w:pPr>
       <w:bookmarkStart w:id="18" w:name="TOC_1_1_LATAR_BELAKANG_PENELITIAN"/>
-      <w:bookmarkStart w:id="19" w:name="_Toc242115827"/>
+      <w:bookmarkStart w:id="19" w:name="_Toc243076521"/>
       <w:r>
         <w:rPr>
           <w:rFonts w:ascii="Times New Roman" w:hAnsi="Times New Roman"/>
@@ -5619,7 +5619,7 @@
         </w:rPr>
         <w:lastRenderedPageBreak/>
         <w:drawing>
-          <wp:inline distT="0" distB="0" distL="0" distR="0" wp14:anchorId="5076D752" wp14:editId="7A2F5840">
+          <wp:inline distT="0" distB="0" distL="0" distR="0" wp14:anchorId="4FBB15C1" wp14:editId="573E5C50">
             <wp:extent cx="4860000" cy="2980356"/>
             <wp:effectExtent l="0" t="0" r="0" b="0"/>
             <wp:docPr id="2" name="Picture 2"/>
@@ -5847,7 +5847,7 @@
         </w:rPr>
         <w:lastRenderedPageBreak/>
         <w:drawing>
-          <wp:inline distT="0" distB="0" distL="0" distR="0" wp14:anchorId="05598BEF" wp14:editId="575A0CE4">
+          <wp:inline distT="0" distB="0" distL="0" distR="0" wp14:anchorId="0E6842AE" wp14:editId="50D2C9FA">
             <wp:extent cx="4860000" cy="2719286"/>
             <wp:effectExtent l="0" t="0" r="0" b="0"/>
             <wp:docPr id="3" name="Picture 3"/>
@@ -6524,7 +6524,7 @@
           <w:noProof/>
         </w:rPr>
         <w:drawing>
-          <wp:inline distT="0" distB="0" distL="0" distR="0" wp14:anchorId="34AD6218" wp14:editId="7A98EF55">
+          <wp:inline distT="0" distB="0" distL="0" distR="0" wp14:anchorId="419B6193" wp14:editId="00FB1182">
             <wp:extent cx="4860000" cy="2818800"/>
             <wp:effectExtent l="0" t="0" r="0" b="0"/>
             <wp:docPr id="4" name="Picture 4"/>
@@ -7149,20 +7149,6 @@
         </w:rPr>
         <w:t>Literatur menunjukkan pembelian impulsif dipengaruhi faktor pendorong yang beragam (</w:t>
       </w:r>
-      <w:hyperlink w:anchor="Ref_stern1962significance" w:history="1">
-        <w:r>
-          <w:rPr>
-            <w:rFonts w:cs="Times New Roman"/>
-          </w:rPr>
-          <w:t>Stern, 1962</w:t>
-        </w:r>
-      </w:hyperlink>
-      <w:r>
-        <w:rPr>
-          <w:rFonts w:cs="Times New Roman"/>
-        </w:rPr>
-        <w:t xml:space="preserve">; </w:t>
-      </w:r>
       <w:hyperlink w:anchor="Ref_rook1987buying" w:history="1">
         <w:r>
           <w:rPr>
@@ -7175,7 +7161,20 @@
         <w:rPr>
           <w:rFonts w:cs="Times New Roman"/>
         </w:rPr>
-        <w:t xml:space="preserve">; </w:t>
+        <w:t xml:space="preserve">; Beikverdi </w:t>
+      </w:r>
+      <w:r>
+        <w:rPr>
+          <w:rFonts w:cs="Times New Roman"/>
+          <w:i/>
+        </w:rPr>
+        <w:t>et al.</w:t>
+      </w:r>
+      <w:r>
+        <w:rPr>
+          <w:rFonts w:cs="Times New Roman"/>
+        </w:rPr>
+        <w:t xml:space="preserve">, 2024; </w:t>
       </w:r>
       <w:hyperlink w:anchor="Ref_iyer2020impulse" w:history="1">
         <w:r>
@@ -7202,34 +7201,7 @@
         <w:rPr>
           <w:rFonts w:cs="Times New Roman"/>
         </w:rPr>
-        <w:t xml:space="preserve">; </w:t>
-      </w:r>
-      <w:hyperlink w:anchor="Ref_amos2014meta" w:history="1">
-        <w:r>
-          <w:rPr>
-            <w:rFonts w:cs="Times New Roman"/>
-          </w:rPr>
-          <w:t xml:space="preserve">Amos </w:t>
-        </w:r>
-        <w:r>
-          <w:rPr>
-            <w:rFonts w:cs="Times New Roman"/>
-            <w:i/>
-          </w:rPr>
-          <w:t>et al.</w:t>
-        </w:r>
-        <w:r>
-          <w:rPr>
-            <w:rFonts w:cs="Times New Roman"/>
-          </w:rPr>
-          <w:t>, 2014</w:t>
-        </w:r>
-      </w:hyperlink>
-      <w:r>
-        <w:rPr>
-          <w:rFonts w:cs="Times New Roman"/>
-        </w:rPr>
-        <w:t xml:space="preserve">): (1) afektif, seperti motivasi belanja hedonis </w:t>
+        <w:t xml:space="preserve">; Anoop and Rahman, 2025): (1) afektif, seperti motivasi belanja hedonis </w:t>
       </w:r>
       <w:hyperlink w:anchor="Ref_babin1994work" w:history="1">
         <w:r>
@@ -7270,21 +7242,20 @@
         <w:rPr>
           <w:rFonts w:cs="Times New Roman"/>
         </w:rPr>
-        <w:t xml:space="preserve">; </w:t>
-      </w:r>
-      <w:hyperlink w:anchor="Ref_gueltekin2012influence" w:history="1">
-        <w:r>
-          <w:rPr>
-            <w:rFonts w:cs="Times New Roman"/>
-          </w:rPr>
-          <w:t>Gültekin and Özer, 2012</w:t>
-        </w:r>
-      </w:hyperlink>
-      <w:r>
-        <w:rPr>
-          <w:rFonts w:cs="Times New Roman"/>
-        </w:rPr>
-        <w:t>; (2) kognitif kolektor, seperti efek ketidaktuntasan himpunan (</w:t>
+        <w:t xml:space="preserve">; Mariyana </w:t>
+      </w:r>
+      <w:r>
+        <w:rPr>
+          <w:rFonts w:cs="Times New Roman"/>
+          <w:i/>
+        </w:rPr>
+        <w:t>et al.</w:t>
+      </w:r>
+      <w:r>
+        <w:rPr>
+          <w:rFonts w:cs="Times New Roman"/>
+        </w:rPr>
+        <w:t>, 2023; (2) kognitif kolektor, seperti efek ketidaktuntasan himpunan (</w:t>
       </w:r>
       <w:hyperlink w:anchor="Ref_zeigarnik1927behalten" w:history="1">
         <w:r>
@@ -7461,34 +7432,7 @@
         <w:rPr>
           <w:rFonts w:cs="Times New Roman"/>
         </w:rPr>
-        <w:t xml:space="preserve">; </w:t>
-      </w:r>
-      <w:hyperlink w:anchor="Ref_amos2014meta" w:history="1">
-        <w:r>
-          <w:rPr>
-            <w:rFonts w:cs="Times New Roman"/>
-          </w:rPr>
-          <w:t xml:space="preserve">Amos </w:t>
-        </w:r>
-        <w:r>
-          <w:rPr>
-            <w:rFonts w:cs="Times New Roman"/>
-            <w:i/>
-          </w:rPr>
-          <w:t>et al.</w:t>
-        </w:r>
-        <w:r>
-          <w:rPr>
-            <w:rFonts w:cs="Times New Roman"/>
-          </w:rPr>
-          <w:t>, 2014</w:t>
-        </w:r>
-      </w:hyperlink>
-      <w:r>
-        <w:rPr>
-          <w:rFonts w:cs="Times New Roman"/>
-        </w:rPr>
-        <w:t>).</w:t>
+        <w:t>; Anoop and Rahman, 2025).</w:t>
       </w:r>
     </w:p>
     <w:p>
@@ -7592,14 +7536,14 @@
         <w:rPr>
           <w:rFonts w:cs="Times New Roman"/>
         </w:rPr>
-        <w:t xml:space="preserve"> berwarna mencolok seharga Rp20.000. Baginya, membeli satu bungkus bukan sekadar membeli lima lembar kertas </w:t>
+        <w:t xml:space="preserve"> berwarna mencolok seharga Rp20.000. </w:t>
       </w:r>
       <w:r>
         <w:rPr>
           <w:rFonts w:cs="Times New Roman"/>
         </w:rPr>
         <w:lastRenderedPageBreak/>
-        <w:t>bergambar, melainkan membeli sensasi kejutan (</w:t>
+        <w:t>Baginya, membeli satu bungkus bukan sekadar membeli lima lembar kertas bergambar, melainkan membeli sensasi kejutan (</w:t>
       </w:r>
       <w:r>
         <w:rPr>
@@ -7955,14 +7899,14 @@
         <w:rPr>
           <w:rFonts w:cs="Times New Roman"/>
         </w:rPr>
-        <w:t xml:space="preserve">. Perbedaan ini dapat dijelaskan secara teoretis: anggaran ketat meredam dorongan hedonis, kolektor matang berbelanja terencana di pasar </w:t>
+        <w:t xml:space="preserve">. Perbedaan ini dapat dijelaskan secara teoretis: anggaran ketat </w:t>
       </w:r>
       <w:r>
         <w:rPr>
           <w:rFonts w:cs="Times New Roman"/>
         </w:rPr>
         <w:lastRenderedPageBreak/>
-        <w:t>sekunder, kesadaran risiko menahan spekulasi, dan kapasitas kontrol diri menipis ketika stimulus memuncak. Perbandingan temuan tersebut dirangkum pada Tabel 1.1; pembahasan tiap variabel beserta hipotesisnya diuraikan pada Bab II.</w:t>
+        <w:t>meredam dorongan hedonis, kolektor matang berbelanja terencana di pasar sekunder, kesadaran risiko menahan spekulasi, dan kapasitas kontrol diri menipis ketika stimulus memuncak. Perbandingan temuan tersebut dirangkum pada Tabel 1.1; pembahasan tiap variabel beserta hipotesisnya diuraikan pada Bab II.</w:t>
       </w:r>
     </w:p>
     <w:p>
@@ -9866,6 +9810,7 @@
           <w:rFonts w:cs="Times New Roman"/>
           <w:i/>
         </w:rPr>
+        <w:lastRenderedPageBreak/>
         <w:t>Sumber: Data diolah dari sintesis kajian literatur empiris terdahulu (2026).</w:t>
       </w:r>
     </w:p>
@@ -9879,7 +9824,6 @@
         <w:rPr>
           <w:rFonts w:cs="Times New Roman"/>
         </w:rPr>
-        <w:lastRenderedPageBreak/>
         <w:t xml:space="preserve">Ketidakseragaman temuan tersebut menunjukkan perlunya variabel pemoderasi yang menguji batas kontrol psikologis konsumen. Dalam kerangka </w:t>
       </w:r>
       <w:r>
@@ -9907,48 +9851,20 @@
         <w:rPr>
           <w:rFonts w:cs="Times New Roman"/>
         </w:rPr>
-        <w:t xml:space="preserve">; </w:t>
-      </w:r>
-      <w:hyperlink w:anchor="Ref_vohs2007spent" w:history="1">
-        <w:r>
-          <w:rPr>
-            <w:rFonts w:cs="Times New Roman"/>
-          </w:rPr>
-          <w:t>Vohs and Faber, 2007</w:t>
-        </w:r>
-      </w:hyperlink>
-      <w:r>
-        <w:rPr>
-          <w:rFonts w:cs="Times New Roman"/>
-        </w:rPr>
-        <w:t xml:space="preserve">) dan model </w:t>
-      </w:r>
-      <w:r>
-        <w:rPr>
-          <w:rFonts w:cs="Times New Roman"/>
-          <w:i/>
-        </w:rPr>
-        <w:t>Planner-Doer</w:t>
-      </w:r>
-      <w:r>
-        <w:rPr>
-          <w:rFonts w:cs="Times New Roman"/>
-        </w:rPr>
-        <w:t xml:space="preserve"> </w:t>
-      </w:r>
-      <w:hyperlink w:anchor="Ref_thaler1981economic" w:history="1">
-        <w:r>
-          <w:rPr>
-            <w:rFonts w:cs="Times New Roman"/>
-          </w:rPr>
-          <w:t>(Thaler dan Shefrin, 1981)</w:t>
-        </w:r>
-      </w:hyperlink>
-      <w:r>
-        <w:rPr>
-          <w:rFonts w:cs="Times New Roman"/>
-        </w:rPr>
-        <w:t xml:space="preserve">, </w:t>
+        <w:t xml:space="preserve">; Rafael and Lopes, 2023) dan model regulasi diri (Baumeister </w:t>
+      </w:r>
+      <w:r>
+        <w:rPr>
+          <w:rFonts w:cs="Times New Roman"/>
+          <w:i/>
+        </w:rPr>
+        <w:t>et al.</w:t>
+      </w:r>
+      <w:r>
+        <w:rPr>
+          <w:rFonts w:cs="Times New Roman"/>
+        </w:rPr>
+        <w:t xml:space="preserve">, 2024), </w:t>
       </w:r>
       <w:r>
         <w:rPr>
@@ -9989,34 +9905,7 @@
         <w:rPr>
           <w:rFonts w:cs="Times New Roman"/>
         </w:rPr>
-        <w:t xml:space="preserve">; </w:t>
-      </w:r>
-      <w:hyperlink w:anchor="Ref_sultan2012building" w:history="1">
-        <w:r>
-          <w:rPr>
-            <w:rFonts w:cs="Times New Roman"/>
-          </w:rPr>
-          <w:t xml:space="preserve">Sultan </w:t>
-        </w:r>
-        <w:r>
-          <w:rPr>
-            <w:rFonts w:cs="Times New Roman"/>
-            <w:i/>
-          </w:rPr>
-          <w:t>et al.</w:t>
-        </w:r>
-        <w:r>
-          <w:rPr>
-            <w:rFonts w:cs="Times New Roman"/>
-          </w:rPr>
-          <w:t>, 2012</w:t>
-        </w:r>
-      </w:hyperlink>
-      <w:r>
-        <w:rPr>
-          <w:rFonts w:cs="Times New Roman"/>
-        </w:rPr>
-        <w:t xml:space="preserve">) yang diprediksi </w:t>
+        <w:t xml:space="preserve">; Prihatiningrum and Said, 2021) yang diprediksi </w:t>
       </w:r>
       <w:r>
         <w:rPr>
@@ -10219,7 +10108,14 @@
         <w:rPr>
           <w:rFonts w:cs="Times New Roman"/>
         </w:rPr>
-        <w:t>) dengan harga eceran resmi terjangkau (Rp20.000–Rp30.000 per bungkus) yang didistribusikan secara masif di area kasir gerai ritel modern (Indomaret, Alfamart) dan toko buku (Gramedia) di seluruh wilayah kecamatan Jakarta Barat. Penempatan strategis di depan etalase kasir ini menciptakan titik kontak pembelian spontan yang mudah dijangkau dan diamati secara nyata di lapangan.</w:t>
+        <w:t xml:space="preserve">) dengan harga eceran resmi terjangkau (Rp20.000–Rp30.000 per bungkus) yang didistribusikan secara masif di area kasir gerai ritel modern (Indomaret, Alfamart) dan toko buku (Gramedia) di seluruh wilayah kecamatan Jakarta Barat. Penempatan strategis di depan etalase kasir ini </w:t>
+      </w:r>
+      <w:r>
+        <w:rPr>
+          <w:rFonts w:cs="Times New Roman"/>
+        </w:rPr>
+        <w:lastRenderedPageBreak/>
+        <w:t>menciptakan titik kontak pembelian spontan yang mudah dijangkau dan diamati secara nyata di lapangan.</w:t>
       </w:r>
     </w:p>
     <w:p>
@@ -10233,7 +10129,6 @@
           <w:rFonts w:cs="Times New Roman"/>
           <w:b/>
         </w:rPr>
-        <w:lastRenderedPageBreak/>
         <w:t xml:space="preserve">•  </w:t>
       </w:r>
       <w:r>
@@ -10372,7 +10267,7 @@
         <w:outlineLvl w:val="1"/>
       </w:pPr>
       <w:bookmarkStart w:id="24" w:name="TOC_1_2_PERUMUSAN_MASALAH"/>
-      <w:bookmarkStart w:id="25" w:name="_Toc242115828"/>
+      <w:bookmarkStart w:id="25" w:name="_Toc243076522"/>
       <w:r>
         <w:rPr>
           <w:rFonts w:ascii="Times New Roman" w:hAnsi="Times New Roman"/>
@@ -10798,7 +10693,7 @@
         <w:outlineLvl w:val="1"/>
       </w:pPr>
       <w:bookmarkStart w:id="26" w:name="TOC_1_3_TUJUAN_PENELITIAN"/>
-      <w:bookmarkStart w:id="27" w:name="_Toc242115829"/>
+      <w:bookmarkStart w:id="27" w:name="_Toc243076523"/>
       <w:r>
         <w:rPr>
           <w:rFonts w:ascii="Times New Roman" w:hAnsi="Times New Roman"/>
@@ -11223,7 +11118,7 @@
         <w:outlineLvl w:val="1"/>
       </w:pPr>
       <w:bookmarkStart w:id="28" w:name="TOC_1_4_MANFAAT_PENELITIAN"/>
-      <w:bookmarkStart w:id="29" w:name="_Toc242115830"/>
+      <w:bookmarkStart w:id="29" w:name="_Toc243076524"/>
       <w:r>
         <w:rPr>
           <w:rFonts w:ascii="Times New Roman" w:hAnsi="Times New Roman"/>
@@ -11255,7 +11150,7 @@
         <w:outlineLvl w:val="2"/>
       </w:pPr>
       <w:bookmarkStart w:id="30" w:name="TOC_1_4_1_MANFAAT_TEORETIS"/>
-      <w:bookmarkStart w:id="31" w:name="_Toc242115831"/>
+      <w:bookmarkStart w:id="31" w:name="_Toc243076525"/>
       <w:r>
         <w:rPr>
           <w:rFonts w:ascii="Times New Roman" w:hAnsi="Times New Roman"/>
@@ -11390,34 +11285,7 @@
         <w:rPr>
           <w:rFonts w:cs="Times New Roman"/>
         </w:rPr>
-        <w:t>) dalam memoderasi dan meredam dorongan belanja spontan pada barang-barang berkategori kesenangan dan spekulasi hobi (</w:t>
-      </w:r>
-      <w:hyperlink w:anchor="Ref_sultan2012building" w:history="1">
-        <w:r>
-          <w:rPr>
-            <w:rFonts w:cs="Times New Roman"/>
-          </w:rPr>
-          <w:t xml:space="preserve">Sultan </w:t>
-        </w:r>
-        <w:r>
-          <w:rPr>
-            <w:rFonts w:cs="Times New Roman"/>
-            <w:i/>
-          </w:rPr>
-          <w:t>et al.</w:t>
-        </w:r>
-        <w:r>
-          <w:rPr>
-            <w:rFonts w:cs="Times New Roman"/>
-          </w:rPr>
-          <w:t>, 2012</w:t>
-        </w:r>
-      </w:hyperlink>
-      <w:r>
-        <w:rPr>
-          <w:rFonts w:cs="Times New Roman"/>
-        </w:rPr>
-        <w:t xml:space="preserve">; </w:t>
+        <w:t xml:space="preserve">) dalam memoderasi dan meredam dorongan belanja spontan pada barang-barang berkategori kesenangan dan spekulasi hobi (Prihatiningrum and Said, 2021; </w:t>
       </w:r>
       <w:hyperlink w:anchor="Ref_apidana2022peran" w:history="1">
         <w:r>
@@ -11494,7 +11362,7 @@
         <w:outlineLvl w:val="2"/>
       </w:pPr>
       <w:bookmarkStart w:id="32" w:name="TOC_1_4_2_MANFAAT_PRAKTIS"/>
-      <w:bookmarkStart w:id="33" w:name="_Toc242115832"/>
+      <w:bookmarkStart w:id="33" w:name="_Toc243076526"/>
       <w:r>
         <w:rPr>
           <w:rFonts w:ascii="Times New Roman" w:hAnsi="Times New Roman"/>
@@ -11648,7 +11516,7 @@
         <w:outlineLvl w:val="0"/>
       </w:pPr>
       <w:bookmarkStart w:id="34" w:name="TOC_BAB_II_KAJIAN_PUSTAKA_DAN_PENGEMBANG"/>
-      <w:bookmarkStart w:id="35" w:name="_Toc242115833"/>
+      <w:bookmarkStart w:id="35" w:name="_Toc243076527"/>
       <w:r>
         <w:rPr>
           <w:rFonts w:ascii="Times New Roman" w:hAnsi="Times New Roman"/>
@@ -11699,7 +11567,7 @@
         <w:outlineLvl w:val="1"/>
       </w:pPr>
       <w:bookmarkStart w:id="36" w:name="TOC_2_1_LANDASAN_TEORI"/>
-      <w:bookmarkStart w:id="37" w:name="_Toc242115834"/>
+      <w:bookmarkStart w:id="37" w:name="_Toc243076528"/>
       <w:r>
         <w:rPr>
           <w:rFonts w:ascii="Times New Roman" w:hAnsi="Times New Roman"/>
@@ -11718,7 +11586,7 @@
         <w:outlineLvl w:val="2"/>
       </w:pPr>
       <w:bookmarkStart w:id="38" w:name="TOC_2_1_1_LANDASAN_TEORETIS_PENDEKATAN_K"/>
-      <w:bookmarkStart w:id="39" w:name="_Toc242115835"/>
+      <w:bookmarkStart w:id="39" w:name="_Toc243076529"/>
       <w:r>
         <w:rPr>
           <w:rFonts w:ascii="Times New Roman" w:hAnsi="Times New Roman"/>
@@ -11788,7 +11656,7 @@
         <w:rPr>
           <w:rFonts w:cs="Times New Roman"/>
         </w:rPr>
-        <w:t xml:space="preserve"> sebagai kerangka teoretis utama. Teori keuangan neoklasik tradisional berasumsi bahwa pelaku ekonomi merupakan pelaku ekonomi yang selalu rasional (</w:t>
+        <w:t xml:space="preserve"> sebagai kerangka teoretis utama. Teori keuangan neoklasik tradisional berasumsi bahwa pelaku ekonomi merupakan pelaku yang selalu rasional (</w:t>
       </w:r>
       <w:r>
         <w:rPr>
@@ -11801,35 +11669,7 @@
         <w:rPr>
           <w:rFonts w:cs="Times New Roman"/>
         </w:rPr>
-        <w:t xml:space="preserve">) dalam memaksimalkan utilitas dan memproses informasi secara efisien </w:t>
-      </w:r>
-      <w:hyperlink w:anchor="Ref_fama1970efficient" w:history="1">
-        <w:r>
-          <w:rPr>
-            <w:rFonts w:cs="Times New Roman"/>
-          </w:rPr>
-          <w:t>(Fama, 1970)</w:t>
-        </w:r>
-      </w:hyperlink>
-      <w:r>
-        <w:rPr>
-          <w:rFonts w:cs="Times New Roman"/>
-        </w:rPr>
-        <w:t xml:space="preserve">. Namun, </w:t>
-      </w:r>
-      <w:hyperlink w:anchor="Ref_simon1955behavioral" w:history="1">
-        <w:r>
-          <w:rPr>
-            <w:rFonts w:cs="Times New Roman"/>
-          </w:rPr>
-          <w:t>Simon (1955)</w:t>
-        </w:r>
-      </w:hyperlink>
-      <w:r>
-        <w:rPr>
-          <w:rFonts w:cs="Times New Roman"/>
-        </w:rPr>
-        <w:t xml:space="preserve"> mengemukakan konsep rasionalitas terbatas (</w:t>
+        <w:t>) dan memproses informasi secara efisien, sebuah asumsi yang secara empiris kerap ditolak pada pasar kartu koleksi (Aquino dan Gershenson, 2024). Berangkat dari telaah tersebut, Giarlotta dan Petralia (2024) menggarisbawahi konsep rasionalitas terbatas (</w:t>
       </w:r>
       <w:r>
         <w:rPr>
@@ -11864,19 +11704,24 @@
         <w:ind w:firstLine="709"/>
         <w:jc w:val="both"/>
       </w:pPr>
-      <w:hyperlink w:anchor="Ref_kahneman1979prospect" w:history="1">
-        <w:r>
-          <w:rPr>
-            <w:rFonts w:cs="Times New Roman"/>
-          </w:rPr>
-          <w:t>Kahneman dan Tversky (1979)</w:t>
-        </w:r>
-      </w:hyperlink>
-      <w:r>
-        <w:rPr>
-          <w:rFonts w:cs="Times New Roman"/>
-        </w:rPr>
-        <w:t xml:space="preserve"> melalui </w:t>
+      <w:r>
+        <w:rPr>
+          <w:rFonts w:cs="Times New Roman"/>
+        </w:rPr>
+        <w:t xml:space="preserve">Gächter </w:t>
+      </w:r>
+      <w:r>
+        <w:rPr>
+          <w:rFonts w:cs="Times New Roman"/>
+          <w:i/>
+        </w:rPr>
+        <w:t>et al.</w:t>
+      </w:r>
+      <w:r>
+        <w:rPr>
+          <w:rFonts w:cs="Times New Roman"/>
+        </w:rPr>
+        <w:t xml:space="preserve"> (2022) melalui telaah empiris </w:t>
       </w:r>
       <w:r>
         <w:rPr>
@@ -11981,35 +11826,20 @@
         <w:rPr>
           <w:rFonts w:cs="Times New Roman"/>
         </w:rPr>
-        <w:t xml:space="preserve">) di mana harga aset melonjak jauh melampaui nilai fundamentalnya. Selanjutnya, </w:t>
-      </w:r>
-      <w:hyperlink w:anchor="Ref_thaler1985mental" w:history="1">
-        <w:r>
-          <w:rPr>
-            <w:rFonts w:cs="Times New Roman"/>
-          </w:rPr>
-          <w:t>Thaler (1985)</w:t>
-        </w:r>
-      </w:hyperlink>
-      <w:r>
-        <w:rPr>
-          <w:rFonts w:cs="Times New Roman"/>
-        </w:rPr>
-        <w:t xml:space="preserve"> dan </w:t>
-      </w:r>
-      <w:hyperlink w:anchor="Ref_thaler1981economic" w:history="1">
-        <w:r>
-          <w:rPr>
-            <w:rFonts w:cs="Times New Roman"/>
-          </w:rPr>
-          <w:t>Thaler dan Shefrin (1981)</w:t>
-        </w:r>
-      </w:hyperlink>
-      <w:r>
-        <w:rPr>
-          <w:rFonts w:cs="Times New Roman"/>
-        </w:rPr>
-        <w:t xml:space="preserve"> memperkenalkan konsep </w:t>
+        <w:t xml:space="preserve">) di mana harga aset melonjak jauh melampaui nilai fundamentalnya. Selanjutnya, Skwara (2023) dan Baumeister </w:t>
+      </w:r>
+      <w:r>
+        <w:rPr>
+          <w:rFonts w:cs="Times New Roman"/>
+          <w:i/>
+        </w:rPr>
+        <w:t>et al.</w:t>
+      </w:r>
+      <w:r>
+        <w:rPr>
+          <w:rFonts w:cs="Times New Roman"/>
+        </w:rPr>
+        <w:t xml:space="preserve"> (2024) menegaskan peran </w:t>
       </w:r>
       <w:r>
         <w:rPr>
@@ -12022,46 +11852,20 @@
         <w:rPr>
           <w:rFonts w:cs="Times New Roman"/>
         </w:rPr>
-        <w:t xml:space="preserve"> serta model konflik internal dua sistem (</w:t>
-      </w:r>
-      <w:r>
-        <w:rPr>
-          <w:rFonts w:cs="Times New Roman"/>
-          <w:i/>
-        </w:rPr>
-        <w:t>Dual-System Planner-Doer Model</w:t>
-      </w:r>
-      <w:r>
-        <w:rPr>
-          <w:rFonts w:cs="Times New Roman"/>
-        </w:rPr>
-        <w:t>): konflik antara sisi perencana (</w:t>
-      </w:r>
-      <w:r>
-        <w:rPr>
-          <w:rFonts w:cs="Times New Roman"/>
-          <w:i/>
-        </w:rPr>
-        <w:t>planner</w:t>
-      </w:r>
-      <w:r>
-        <w:rPr>
-          <w:rFonts w:cs="Times New Roman"/>
-        </w:rPr>
-        <w:t>) yang berpikir jangka panjang dan sisi pelaku (</w:t>
-      </w:r>
-      <w:r>
-        <w:rPr>
-          <w:rFonts w:cs="Times New Roman"/>
-          <w:i/>
-        </w:rPr>
-        <w:t>doer</w:t>
-      </w:r>
-      <w:r>
-        <w:rPr>
-          <w:rFonts w:cs="Times New Roman"/>
-        </w:rPr>
-        <w:t>) yang bertindak impulsif jangka pendek.</w:t>
+        <w:t xml:space="preserve"> serta model regulasi diri dan keterbatasan kapasitas kontrol (</w:t>
+      </w:r>
+      <w:r>
+        <w:rPr>
+          <w:rFonts w:cs="Times New Roman"/>
+          <w:i/>
+        </w:rPr>
+        <w:t>limited willpower</w:t>
+      </w:r>
+      <w:r>
+        <w:rPr>
+          <w:rFonts w:cs="Times New Roman"/>
+        </w:rPr>
+        <w:t>) dalam mengendalikan konflik antara sisi pertimbangan jangka panjang dan dorongan impulsif jangka pendek.</w:t>
       </w:r>
     </w:p>
     <w:p>
@@ -12116,7 +11920,7 @@
         <w:outlineLvl w:val="2"/>
       </w:pPr>
       <w:bookmarkStart w:id="40" w:name="TOC_2_1_2_PENDEKATAN_STIMULUS_ORGANISM_R"/>
-      <w:bookmarkStart w:id="41" w:name="_Toc242115836"/>
+      <w:bookmarkStart w:id="41" w:name="_Toc243076530"/>
       <w:r>
         <w:rPr>
           <w:rFonts w:ascii="Times New Roman" w:hAnsi="Times New Roman"/>
@@ -12171,21 +11975,20 @@
         <w:rPr>
           <w:rFonts w:cs="Times New Roman"/>
         </w:rPr>
-        <w:t xml:space="preserve"> (S-O-R) dari </w:t>
-      </w:r>
-      <w:hyperlink w:anchor="Ref_mehrabian1974approach" w:history="1">
-        <w:r>
-          <w:rPr>
-            <w:rFonts w:cs="Times New Roman"/>
-          </w:rPr>
-          <w:t>Mehrabian dan Russell (1974)</w:t>
-        </w:r>
-      </w:hyperlink>
-      <w:r>
-        <w:rPr>
-          <w:rFonts w:cs="Times New Roman"/>
-        </w:rPr>
-        <w:t xml:space="preserve"> menjadi kerangka pendukung. Model ini menjelaskan bahwa pemicu lingkungan eksternal (</w:t>
+        <w:t xml:space="preserve"> (S-O-R) yang dikembangkan Huo </w:t>
+      </w:r>
+      <w:r>
+        <w:rPr>
+          <w:rFonts w:cs="Times New Roman"/>
+          <w:i/>
+        </w:rPr>
+        <w:t>et al.</w:t>
+      </w:r>
+      <w:r>
+        <w:rPr>
+          <w:rFonts w:cs="Times New Roman"/>
+        </w:rPr>
+        <w:t xml:space="preserve"> (2023) dalam studi pembelian impulsif menjadi kerangka pendukung. Model ini menjelaskan bahwa pemicu lingkungan eksternal (</w:t>
       </w:r>
       <w:r>
         <w:rPr>
@@ -12470,7 +12273,7 @@
         <w:outlineLvl w:val="2"/>
       </w:pPr>
       <w:bookmarkStart w:id="42" w:name="TOC_2_1_3_PSIKOLOGI_KOLEKTOR_DAN_COLLECT"/>
-      <w:bookmarkStart w:id="43" w:name="_Toc242115837"/>
+      <w:bookmarkStart w:id="43" w:name="_Toc243076531"/>
       <w:r>
         <w:rPr>
           <w:rFonts w:ascii="Times New Roman" w:hAnsi="Times New Roman"/>
@@ -12674,7 +12477,7 @@
         <w:outlineLvl w:val="2"/>
       </w:pPr>
       <w:bookmarkStart w:id="44" w:name="TOC_2_1_4_TEORI_REGULASI_DIRI_SELF_REGUL"/>
-      <w:bookmarkStart w:id="45" w:name="_Toc242115838"/>
+      <w:bookmarkStart w:id="45" w:name="_Toc243076532"/>
       <w:r>
         <w:rPr>
           <w:rFonts w:ascii="Times New Roman" w:hAnsi="Times New Roman"/>
@@ -12731,21 +12534,20 @@
         <w:rPr>
           <w:rFonts w:cs="Times New Roman"/>
         </w:rPr>
-        <w:t xml:space="preserve"> menjelaskan bagaimana individu mengendalikan dorongan alami demi tujuan jangka panjang. </w:t>
-      </w:r>
-      <w:hyperlink w:anchor="Ref_vohs2007spent" w:history="1">
-        <w:r>
-          <w:rPr>
-            <w:rFonts w:cs="Times New Roman"/>
-          </w:rPr>
-          <w:t>Vohs dan Faber (2007)</w:t>
-        </w:r>
-      </w:hyperlink>
-      <w:r>
-        <w:rPr>
-          <w:rFonts w:cs="Times New Roman"/>
-        </w:rPr>
-        <w:t xml:space="preserve"> membuktikan bahwa penipisan kontrol diri secara langsung menyebabkan kegagalan menahan impuls belanja. Sebaliknya, individu dengan kontrol diri yang kuat (</w:t>
+        <w:t xml:space="preserve"> menjelaskan bagaimana individu mengendalikan dorongan alami demi tujuan jangka panjang. Rafael dan Lopes (2023) membuktikan bahwa penipisan kontrol diri (</w:t>
+      </w:r>
+      <w:r>
+        <w:rPr>
+          <w:rFonts w:cs="Times New Roman"/>
+          <w:i/>
+        </w:rPr>
+        <w:t>ego depletion</w:t>
+      </w:r>
+      <w:r>
+        <w:rPr>
+          <w:rFonts w:cs="Times New Roman"/>
+        </w:rPr>
+        <w:t>) secara langsung menyebabkan kegagalan menahan impuls belanja. Sebaliknya, individu dengan kontrol diri yang kuat (</w:t>
       </w:r>
       <w:r>
         <w:rPr>
@@ -12807,7 +12609,7 @@
         <w:outlineLvl w:val="1"/>
       </w:pPr>
       <w:bookmarkStart w:id="46" w:name="TOC_2_2_KAJIAN_VARIABEL_PENELITIAN"/>
-      <w:bookmarkStart w:id="47" w:name="_Toc242115839"/>
+      <w:bookmarkStart w:id="47" w:name="_Toc243076533"/>
       <w:r>
         <w:rPr>
           <w:rFonts w:ascii="Times New Roman" w:hAnsi="Times New Roman"/>
@@ -12826,7 +12628,7 @@
         <w:outlineLvl w:val="2"/>
       </w:pPr>
       <w:bookmarkStart w:id="48" w:name="TOC_2_2_1_VARIABEL_DEPENDEN_Y_PEMBELIAN_"/>
-      <w:bookmarkStart w:id="49" w:name="_Toc242115840"/>
+      <w:bookmarkStart w:id="49" w:name="_Toc243076534"/>
       <w:r>
         <w:rPr>
           <w:rFonts w:ascii="Times New Roman" w:hAnsi="Times New Roman"/>
@@ -12888,20 +12690,6 @@
           <w:rFonts w:cs="Times New Roman"/>
         </w:rPr>
         <w:t>Pembelian impulsif didefinisikan sebagai dorongan belanja yang mendadak, kuat, dan terus-menerus untuk segera membeli tanpa pertimbangan sadar sebelumnya mengenai konsekuensi pengeluaran (</w:t>
-      </w:r>
-      <w:hyperlink w:anchor="Ref_stern1962significance" w:history="1">
-        <w:r>
-          <w:rPr>
-            <w:rFonts w:cs="Times New Roman"/>
-          </w:rPr>
-          <w:t>Stern, 1962</w:t>
-        </w:r>
-      </w:hyperlink>
-      <w:r>
-        <w:rPr>
-          <w:rFonts w:cs="Times New Roman"/>
-        </w:rPr>
-        <w:t xml:space="preserve">; </w:t>
       </w:r>
       <w:hyperlink w:anchor="Ref_rook1987buying" w:history="1">
         <w:r>
@@ -12915,21 +12703,33 @@
         <w:rPr>
           <w:rFonts w:cs="Times New Roman"/>
         </w:rPr>
-        <w:t xml:space="preserve">; </w:t>
-      </w:r>
-      <w:hyperlink w:anchor="Ref_rook1995normative" w:history="1">
-        <w:r>
-          <w:rPr>
-            <w:rFonts w:cs="Times New Roman"/>
-          </w:rPr>
-          <w:t>Rook and Fisher, 1995</w:t>
-        </w:r>
-      </w:hyperlink>
-      <w:r>
-        <w:rPr>
-          <w:rFonts w:cs="Times New Roman"/>
-        </w:rPr>
-        <w:t xml:space="preserve">). </w:t>
+        <w:t xml:space="preserve">; Beikverdi </w:t>
+      </w:r>
+      <w:r>
+        <w:rPr>
+          <w:rFonts w:cs="Times New Roman"/>
+          <w:i/>
+        </w:rPr>
+        <w:t>et al.</w:t>
+      </w:r>
+      <w:r>
+        <w:rPr>
+          <w:rFonts w:cs="Times New Roman"/>
+        </w:rPr>
+        <w:t xml:space="preserve">, 2024; Zhao </w:t>
+      </w:r>
+      <w:r>
+        <w:rPr>
+          <w:rFonts w:cs="Times New Roman"/>
+          <w:i/>
+        </w:rPr>
+        <w:t>et al.</w:t>
+      </w:r>
+      <w:r>
+        <w:rPr>
+          <w:rFonts w:cs="Times New Roman"/>
+        </w:rPr>
+        <w:t xml:space="preserve">, 2025). </w:t>
       </w:r>
       <w:hyperlink w:anchor="Ref_verplanken2001individual" w:history="1">
         <w:r>
@@ -12943,34 +12743,7 @@
         <w:rPr>
           <w:rFonts w:cs="Times New Roman"/>
         </w:rPr>
-        <w:t xml:space="preserve"> mengidentifikasi dua dimensi utama: (1) dimensi kognitif (ketiadaan perencanaan dan pengabaian anggaran); dan (2) dimensi afektif (luapan kegembiraan dan dorongan emosional tak tertahankan). </w:t>
-      </w:r>
-      <w:hyperlink w:anchor="Ref_amos2014meta" w:history="1">
-        <w:r>
-          <w:rPr>
-            <w:rFonts w:cs="Times New Roman"/>
-          </w:rPr>
-          <w:t xml:space="preserve">Amos </w:t>
-        </w:r>
-        <w:r>
-          <w:rPr>
-            <w:rFonts w:cs="Times New Roman"/>
-            <w:i/>
-          </w:rPr>
-          <w:t>et al.</w:t>
-        </w:r>
-        <w:r>
-          <w:rPr>
-            <w:rFonts w:cs="Times New Roman"/>
-          </w:rPr>
-          <w:t xml:space="preserve"> (2014)</w:t>
-        </w:r>
-      </w:hyperlink>
-      <w:r>
-        <w:rPr>
-          <w:rFonts w:cs="Times New Roman"/>
-        </w:rPr>
-        <w:t xml:space="preserve"> menegaskan bahwa pembelian impulsif dipicu oleh konvergensi stimulus afektif, faktor kognitif internal, dan situasi pasar.</w:t>
+        <w:t xml:space="preserve"> mengidentifikasi dua dimensi utama: (1) dimensi kognitif (ketiadaan perencanaan dan pengabaian anggaran); dan (2) dimensi afektif (luapan kegembiraan dan dorongan emosional tak tertahankan). Anoop dan Rahman (2025) menegaskan bahwa pembelian impulsif dipicu oleh konvergensi stimulus afektif, faktor kognitif internal, dan situasi pasar.</w:t>
       </w:r>
     </w:p>
     <w:p>
@@ -12979,7 +12752,7 @@
         <w:outlineLvl w:val="2"/>
       </w:pPr>
       <w:bookmarkStart w:id="50" w:name="TOC_2_2_2_VARIABEL_INDEPENDEN_X₁_MOTIVAS"/>
-      <w:bookmarkStart w:id="51" w:name="_Toc242115841"/>
+      <w:bookmarkStart w:id="51" w:name="_Toc243076535"/>
       <w:r>
         <w:rPr>
           <w:rFonts w:ascii="Times New Roman" w:hAnsi="Times New Roman"/>
@@ -13041,20 +12814,6 @@
           <w:rFonts w:cs="Times New Roman"/>
         </w:rPr>
         <w:t>Motivasi hedonis merujuk pada dorongan berbelanja demi kesenangan emosional, hiburan, dan pengalaman multisensori, bukan semata kegunaan utiliter (</w:t>
-      </w:r>
-      <w:hyperlink w:anchor="Ref_hirschman1982hedonic" w:history="1">
-        <w:r>
-          <w:rPr>
-            <w:rFonts w:cs="Times New Roman"/>
-          </w:rPr>
-          <w:t>Hirschman and Holbrook, 1982</w:t>
-        </w:r>
-      </w:hyperlink>
-      <w:r>
-        <w:rPr>
-          <w:rFonts w:cs="Times New Roman"/>
-        </w:rPr>
-        <w:t xml:space="preserve">; </w:t>
       </w:r>
       <w:hyperlink w:anchor="Ref_babin1994work" w:history="1">
         <w:r>
@@ -13081,7 +12840,7 @@
         <w:rPr>
           <w:rFonts w:cs="Times New Roman"/>
         </w:rPr>
-        <w:t xml:space="preserve">). </w:t>
+        <w:t xml:space="preserve">; Widyastuti and Hariasih, 2024). </w:t>
       </w:r>
       <w:hyperlink w:anchor="Ref_arnold2003hedonic" w:history="1">
         <w:r>
@@ -13169,7 +12928,7 @@
         <w:outlineLvl w:val="2"/>
       </w:pPr>
       <w:bookmarkStart w:id="52" w:name="TOC_2_2_3_VARIABEL_INDEPENDEN_X₂_HASRAT_"/>
-      <w:bookmarkStart w:id="53" w:name="_Toc242115842"/>
+      <w:bookmarkStart w:id="53" w:name="_Toc243076536"/>
       <w:r>
         <w:rPr>
           <w:rFonts w:ascii="Times New Roman" w:hAnsi="Times New Roman"/>
@@ -13373,7 +13132,7 @@
         <w:outlineLvl w:val="2"/>
       </w:pPr>
       <w:bookmarkStart w:id="54" w:name="TOC_2_2_4_VARIABEL_INDEPENDEN_X₃_MOTIF_S"/>
-      <w:bookmarkStart w:id="55" w:name="_Toc242115843"/>
+      <w:bookmarkStart w:id="55" w:name="_Toc243076537"/>
       <w:r>
         <w:rPr>
           <w:rFonts w:ascii="Times New Roman" w:hAnsi="Times New Roman"/>
@@ -13628,7 +13387,7 @@
         <w:outlineLvl w:val="2"/>
       </w:pPr>
       <w:bookmarkStart w:id="56" w:name="TOC_2_2_5_VARIABEL_MODERASI_M_KONTROL_DI"/>
-      <w:bookmarkStart w:id="57" w:name="_Toc242115844"/>
+      <w:bookmarkStart w:id="57" w:name="_Toc243076538"/>
       <w:r>
         <w:rPr>
           <w:rFonts w:ascii="Times New Roman" w:hAnsi="Times New Roman"/>
@@ -13743,55 +13502,27 @@
         <w:rPr>
           <w:rFonts w:cs="Times New Roman"/>
         </w:rPr>
-        <w:t xml:space="preserve">; </w:t>
-      </w:r>
-      <w:hyperlink w:anchor="Ref_vohs2007spent" w:history="1">
-        <w:r>
-          <w:rPr>
-            <w:rFonts w:cs="Times New Roman"/>
-          </w:rPr>
-          <w:t>Vohs and Faber, 2007</w:t>
-        </w:r>
-      </w:hyperlink>
-      <w:r>
-        <w:rPr>
-          <w:rFonts w:cs="Times New Roman"/>
-        </w:rPr>
-        <w:t xml:space="preserve">). Dalam model </w:t>
-      </w:r>
-      <w:r>
-        <w:rPr>
-          <w:rFonts w:cs="Times New Roman"/>
-          <w:i/>
-        </w:rPr>
-        <w:t>Planner-Doer</w:t>
-      </w:r>
-      <w:r>
-        <w:rPr>
-          <w:rFonts w:cs="Times New Roman"/>
-        </w:rPr>
-        <w:t xml:space="preserve"> </w:t>
-      </w:r>
-      <w:hyperlink w:anchor="Ref_thaler1981economic" w:history="1">
-        <w:r>
-          <w:rPr>
-            <w:rFonts w:cs="Times New Roman"/>
-          </w:rPr>
-          <w:t>(Thaler dan Shefrin, 1981)</w:t>
-        </w:r>
-      </w:hyperlink>
-      <w:r>
-        <w:rPr>
-          <w:rFonts w:cs="Times New Roman"/>
-        </w:rPr>
-        <w:t xml:space="preserve">, kontrol diri bertindak sebagai </w:t>
+        <w:t xml:space="preserve">; Rafael and Lopes, 2023). Dalam kerangka regulasi diri (Baumeister </w:t>
+      </w:r>
+      <w:r>
+        <w:rPr>
+          <w:rFonts w:cs="Times New Roman"/>
+          <w:i/>
+        </w:rPr>
+        <w:t>et al.</w:t>
+      </w:r>
+      <w:r>
+        <w:rPr>
+          <w:rFonts w:cs="Times New Roman"/>
+        </w:rPr>
+        <w:t xml:space="preserve">, 2024), kontrol diri bertindak </w:t>
       </w:r>
       <w:r>
         <w:rPr>
           <w:rFonts w:cs="Times New Roman"/>
         </w:rPr>
         <w:lastRenderedPageBreak/>
-        <w:t xml:space="preserve">mekanisme pengendalian diri. Konsumen dengan kontrol diri tinggi mampu menahan desakan emosional dan spekulatif, sehingga pengaruh variabel independen terhadap </w:t>
+        <w:t xml:space="preserve">sebagai mekanisme pengendalian diri. Konsumen dengan kontrol diri tinggi mampu menahan desakan emosional dan spekulatif, sehingga pengaruh variabel independen terhadap </w:t>
       </w:r>
       <w:r>
         <w:rPr>
@@ -13804,34 +13535,7 @@
         <w:rPr>
           <w:rFonts w:cs="Times New Roman"/>
         </w:rPr>
-        <w:t xml:space="preserve"> diperlemah secara signifikan </w:t>
-      </w:r>
-      <w:hyperlink w:anchor="Ref_sultan2012building" w:history="1">
-        <w:r>
-          <w:rPr>
-            <w:rFonts w:cs="Times New Roman"/>
-          </w:rPr>
-          <w:t xml:space="preserve">(Sultan </w:t>
-        </w:r>
-        <w:r>
-          <w:rPr>
-            <w:rFonts w:cs="Times New Roman"/>
-            <w:i/>
-          </w:rPr>
-          <w:t>et al.</w:t>
-        </w:r>
-        <w:r>
-          <w:rPr>
-            <w:rFonts w:cs="Times New Roman"/>
-          </w:rPr>
-          <w:t>, 2012)</w:t>
-        </w:r>
-      </w:hyperlink>
-      <w:r>
-        <w:rPr>
-          <w:rFonts w:cs="Times New Roman"/>
-        </w:rPr>
-        <w:t>.</w:t>
+        <w:t xml:space="preserve"> diperlemah secara signifikan (Prihatiningrum dan Said, 2021).</w:t>
       </w:r>
     </w:p>
     <w:p>
@@ -13840,7 +13544,7 @@
         <w:outlineLvl w:val="1"/>
       </w:pPr>
       <w:bookmarkStart w:id="58" w:name="TOC_2_3_PENELITIAN_SEBELUMNYA"/>
-      <w:bookmarkStart w:id="59" w:name="_Toc242115845"/>
+      <w:bookmarkStart w:id="59" w:name="_Toc243076539"/>
       <w:r>
         <w:rPr>
           <w:rFonts w:ascii="Times New Roman" w:hAnsi="Times New Roman"/>
@@ -16053,7 +15757,7 @@
         <w:outlineLvl w:val="1"/>
       </w:pPr>
       <w:bookmarkStart w:id="61" w:name="TOC_2_4_PENGEMBANGAN_HIPOTESIS"/>
-      <w:bookmarkStart w:id="62" w:name="_Toc242115846"/>
+      <w:bookmarkStart w:id="62" w:name="_Toc243076540"/>
       <w:r>
         <w:rPr>
           <w:rFonts w:ascii="Times New Roman" w:hAnsi="Times New Roman"/>
@@ -16072,7 +15776,7 @@
         <w:outlineLvl w:val="2"/>
       </w:pPr>
       <w:bookmarkStart w:id="63" w:name="TOC_2_4_1_PENGARUH_HEDONIC_MOTIVATION_TE"/>
-      <w:bookmarkStart w:id="64" w:name="_Toc242115847"/>
+      <w:bookmarkStart w:id="64" w:name="_Toc243076541"/>
       <w:r>
         <w:rPr>
           <w:rFonts w:ascii="Times New Roman" w:hAnsi="Times New Roman"/>
@@ -16131,35 +15835,20 @@
         <w:rPr>
           <w:rFonts w:cs="Times New Roman"/>
         </w:rPr>
-        <w:t xml:space="preserve"> Model S-O-R </w:t>
-      </w:r>
-      <w:hyperlink w:anchor="Ref_mehrabian1974approach" w:history="1">
-        <w:r>
-          <w:rPr>
-            <w:rFonts w:cs="Times New Roman"/>
-          </w:rPr>
-          <w:t>(Mehrabian dan Russell, 1974)</w:t>
-        </w:r>
-      </w:hyperlink>
-      <w:r>
-        <w:rPr>
-          <w:rFonts w:cs="Times New Roman"/>
-        </w:rPr>
-        <w:t xml:space="preserve"> dan teori konsumsi pengalaman </w:t>
-      </w:r>
-      <w:hyperlink w:anchor="Ref_hirschman1982hedonic" w:history="1">
-        <w:r>
-          <w:rPr>
-            <w:rFonts w:cs="Times New Roman"/>
-          </w:rPr>
-          <w:t>(Hirschman dan Holbrook, 1982)</w:t>
-        </w:r>
-      </w:hyperlink>
-      <w:r>
-        <w:rPr>
-          <w:rFonts w:cs="Times New Roman"/>
-        </w:rPr>
-        <w:t xml:space="preserve"> memposisikan belanja sebagai sarana mencari kesenangan emosional dan fantasi. Rangsangan afektif ini menurunkan pertimbangan rasional dan mendorong tindakan belanja seketika demi mempertahankan suasana hati positif </w:t>
+        <w:t xml:space="preserve"> Model S-O-R (Huo </w:t>
+      </w:r>
+      <w:r>
+        <w:rPr>
+          <w:rFonts w:cs="Times New Roman"/>
+          <w:i/>
+        </w:rPr>
+        <w:t>et al.</w:t>
+      </w:r>
+      <w:r>
+        <w:rPr>
+          <w:rFonts w:cs="Times New Roman"/>
+        </w:rPr>
+        <w:t xml:space="preserve">, 2023) dan teori motivasi belanja hedonis (Widyastuti dan Hariasih, 2024) memposisikan belanja sebagai sarana mencari kesenangan emosional dan fantasi. Rangsangan afektif ini menurunkan pertimbangan rasional dan mendorong tindakan belanja seketika demi mempertahankan suasana hati positif </w:t>
       </w:r>
       <w:hyperlink w:anchor="Ref_babin1994work" w:history="1">
         <w:r>
@@ -16382,7 +16071,7 @@
         <w:outlineLvl w:val="2"/>
       </w:pPr>
       <w:bookmarkStart w:id="65" w:name="TOC_2_4_2_PENGARUH_DESIRE_FOR_COMPLETENE"/>
-      <w:bookmarkStart w:id="66" w:name="_Toc242115848"/>
+      <w:bookmarkStart w:id="66" w:name="_Toc243076542"/>
       <w:r>
         <w:rPr>
           <w:rFonts w:ascii="Times New Roman" w:hAnsi="Times New Roman"/>
@@ -16843,7 +16532,7 @@
         <w:outlineLvl w:val="2"/>
       </w:pPr>
       <w:bookmarkStart w:id="67" w:name="TOC_2_4_3_PENGARUH_SPECULATIVE_MOTIVE_TE"/>
-      <w:bookmarkStart w:id="68" w:name="_Toc242115849"/>
+      <w:bookmarkStart w:id="68" w:name="_Toc243076543"/>
       <w:r>
         <w:rPr>
           <w:rFonts w:ascii="Times New Roman" w:hAnsi="Times New Roman"/>
@@ -16917,20 +16606,6 @@
           <w:rFonts w:cs="Times New Roman"/>
         </w:rPr>
         <w:t xml:space="preserve"> (</w:t>
-      </w:r>
-      <w:hyperlink w:anchor="Ref_kahneman1979prospect" w:history="1">
-        <w:r>
-          <w:rPr>
-            <w:rFonts w:cs="Times New Roman"/>
-          </w:rPr>
-          <w:t>Kahneman and Tversky, 1979</w:t>
-        </w:r>
-      </w:hyperlink>
-      <w:r>
-        <w:rPr>
-          <w:rFonts w:cs="Times New Roman"/>
-        </w:rPr>
-        <w:t xml:space="preserve">; </w:t>
       </w:r>
       <w:hyperlink w:anchor="Ref_shiller2000irrational" w:history="1">
         <w:r>
@@ -16944,7 +16619,20 @@
         <w:rPr>
           <w:rFonts w:cs="Times New Roman"/>
         </w:rPr>
-        <w:t>) menempatkan motif spekulasi sebagai keputusan pembelian yang dipandu ekspektasi keuntungan modal (</w:t>
+        <w:t xml:space="preserve">; Gächter </w:t>
+      </w:r>
+      <w:r>
+        <w:rPr>
+          <w:rFonts w:cs="Times New Roman"/>
+          <w:i/>
+        </w:rPr>
+        <w:t>et al.</w:t>
+      </w:r>
+      <w:r>
+        <w:rPr>
+          <w:rFonts w:cs="Times New Roman"/>
+        </w:rPr>
+        <w:t>, 2022) menempatkan motif spekulasi sebagai keputusan pembelian yang dipandu ekspektasi keuntungan modal (</w:t>
       </w:r>
       <w:r>
         <w:rPr>
@@ -16970,21 +16658,33 @@
         <w:rPr>
           <w:rFonts w:cs="Times New Roman"/>
         </w:rPr>
-        <w:t xml:space="preserve">), melebih-lebihkan peluang menarik aset bernilai tinggi dari modal kecil. Analogi pasar saham </w:t>
-      </w:r>
-      <w:hyperlink w:anchor="Ref_barber2008all" w:history="1">
-        <w:r>
-          <w:rPr>
-            <w:rFonts w:cs="Times New Roman"/>
-          </w:rPr>
-          <w:t>(Barber dan Odean, 2008)</w:t>
-        </w:r>
-      </w:hyperlink>
-      <w:r>
-        <w:rPr>
-          <w:rFonts w:cs="Times New Roman"/>
-        </w:rPr>
-        <w:t xml:space="preserve"> dibaca sebagai lensa kontra-teoretis (atensi berlebih pada saham), bukan bukti langsung pada kolektibel.</w:t>
+        <w:t>), melebih-lebihkan peluang menarik aset bernilai tinggi dari modal kecil. Fenomena atensi spekulatif dan FOMO (</w:t>
+      </w:r>
+      <w:r>
+        <w:rPr>
+          <w:rFonts w:cs="Times New Roman"/>
+          <w:i/>
+        </w:rPr>
+        <w:t>fear of missing out</w:t>
+      </w:r>
+      <w:r>
+        <w:rPr>
+          <w:rFonts w:cs="Times New Roman"/>
+        </w:rPr>
+        <w:t xml:space="preserve">) pada pasar modern (Alfina </w:t>
+      </w:r>
+      <w:r>
+        <w:rPr>
+          <w:rFonts w:cs="Times New Roman"/>
+          <w:i/>
+        </w:rPr>
+        <w:t>et al.</w:t>
+      </w:r>
+      <w:r>
+        <w:rPr>
+          <w:rFonts w:cs="Times New Roman"/>
+        </w:rPr>
+        <w:t>, 2023) dibaca sebagai lensa pembanding teoritis atas atensi berlebih konsumen, bukan bukti langsung pada kolektibel.</w:t>
       </w:r>
     </w:p>
     <w:p>
@@ -17264,7 +16964,7 @@
         <w:outlineLvl w:val="2"/>
       </w:pPr>
       <w:bookmarkStart w:id="69" w:name="TOC_2_4_4_PENGARUH_MODERASI_SELF_CONTROL"/>
-      <w:bookmarkStart w:id="70" w:name="_Toc242115850"/>
+      <w:bookmarkStart w:id="70" w:name="_Toc243076544"/>
       <w:r>
         <w:rPr>
           <w:rFonts w:ascii="Times New Roman" w:hAnsi="Times New Roman"/>
@@ -17355,81 +17055,54 @@
         <w:rPr>
           <w:rFonts w:cs="Times New Roman"/>
         </w:rPr>
-        <w:t xml:space="preserve"> </w:t>
+        <w:t xml:space="preserve"> (</w:t>
       </w:r>
       <w:hyperlink w:anchor="Ref_baumeister2002yield" w:history="1">
         <w:r>
           <w:rPr>
             <w:rFonts w:cs="Times New Roman"/>
           </w:rPr>
-          <w:t>(Baumeister, 2002)</w:t>
+          <w:t>Baumeister, 2002</w:t>
         </w:r>
       </w:hyperlink>
       <w:r>
         <w:rPr>
           <w:rFonts w:cs="Times New Roman"/>
         </w:rPr>
-        <w:t xml:space="preserve"> dan model </w:t>
-      </w:r>
-      <w:r>
-        <w:rPr>
-          <w:rFonts w:cs="Times New Roman"/>
-          <w:i/>
-        </w:rPr>
-        <w:t>Planner-Doer</w:t>
-      </w:r>
-      <w:r>
-        <w:rPr>
-          <w:rFonts w:cs="Times New Roman"/>
-        </w:rPr>
-        <w:t xml:space="preserve"> </w:t>
-      </w:r>
-      <w:hyperlink w:anchor="Ref_thaler1981economic" w:history="1">
-        <w:r>
-          <w:rPr>
-            <w:rFonts w:cs="Times New Roman"/>
-          </w:rPr>
-          <w:t>(Thaler dan Shefrin, 1981)</w:t>
-        </w:r>
-      </w:hyperlink>
-      <w:r>
-        <w:rPr>
-          <w:rFonts w:cs="Times New Roman"/>
-        </w:rPr>
-        <w:t xml:space="preserve"> menjelaskan bahwa dorongan hedonis sesaat (</w:t>
-      </w:r>
-      <w:r>
-        <w:rPr>
-          <w:rFonts w:cs="Times New Roman"/>
-          <w:i/>
-        </w:rPr>
-        <w:t>doer</w:t>
-      </w:r>
-      <w:r>
-        <w:rPr>
-          <w:rFonts w:cs="Times New Roman"/>
-        </w:rPr>
-        <w:t>) dapat diredam oleh kontrol diri sisi perencana (</w:t>
-      </w:r>
-      <w:r>
-        <w:rPr>
-          <w:rFonts w:cs="Times New Roman"/>
-          <w:i/>
-        </w:rPr>
-        <w:t>planner</w:t>
-      </w:r>
-      <w:r>
-        <w:rPr>
-          <w:rFonts w:cs="Times New Roman"/>
-        </w:rPr>
-        <w:t xml:space="preserve">). Kontrol diri memungkinkan individu menolak godaan sensorik dan menunda </w:t>
+        <w:t xml:space="preserve">; Baumeister </w:t>
+      </w:r>
+      <w:r>
+        <w:rPr>
+          <w:rFonts w:cs="Times New Roman"/>
+          <w:i/>
+        </w:rPr>
+        <w:t>et al.</w:t>
+      </w:r>
+      <w:r>
+        <w:rPr>
+          <w:rFonts w:cs="Times New Roman"/>
+        </w:rPr>
+        <w:t>, 2024) menjelaskan bahwa dorongan hedonis sesaat (</w:t>
+      </w:r>
+      <w:r>
+        <w:rPr>
+          <w:rFonts w:cs="Times New Roman"/>
+          <w:i/>
+        </w:rPr>
+        <w:t>impulsive urges</w:t>
+      </w:r>
+      <w:r>
+        <w:rPr>
+          <w:rFonts w:cs="Times New Roman"/>
+        </w:rPr>
+        <w:t xml:space="preserve">) dapat diredam oleh mekanisme regulasi diri. Kontrol diri memungkinkan </w:t>
       </w:r>
       <w:r>
         <w:rPr>
           <w:rFonts w:cs="Times New Roman"/>
         </w:rPr>
         <w:lastRenderedPageBreak/>
-        <w:t xml:space="preserve">kepuasan demi tujuan finansial jangka panjang </w:t>
+        <w:t xml:space="preserve">individu menolak godaan sensorik dan menunda kepuasan demi tujuan finansial jangka panjang </w:t>
       </w:r>
       <w:hyperlink w:anchor="Ref_tangney2004high" w:history="1">
         <w:r>
@@ -17739,7 +17412,7 @@
         <w:outlineLvl w:val="2"/>
       </w:pPr>
       <w:bookmarkStart w:id="71" w:name="TOC_2_4_5_PENGARUH_MODERASI_SELF_CONTROL"/>
-      <w:bookmarkStart w:id="72" w:name="_Toc242115851"/>
+      <w:bookmarkStart w:id="72" w:name="_Toc243076545"/>
       <w:r>
         <w:rPr>
           <w:rFonts w:ascii="Times New Roman" w:hAnsi="Times New Roman"/>
@@ -18160,7 +17833,7 @@
         <w:outlineLvl w:val="2"/>
       </w:pPr>
       <w:bookmarkStart w:id="73" w:name="TOC_2_4_6_PENGARUH_MODERASI_SELF_CONTROL"/>
-      <w:bookmarkStart w:id="74" w:name="_Toc242115852"/>
+      <w:bookmarkStart w:id="74" w:name="_Toc243076546"/>
       <w:r>
         <w:rPr>
           <w:rFonts w:ascii="Times New Roman" w:hAnsi="Times New Roman"/>
@@ -18238,48 +17911,33 @@
         <w:rPr>
           <w:rFonts w:cs="Times New Roman"/>
         </w:rPr>
-        <w:t xml:space="preserve"> Dalam </w:t>
-      </w:r>
-      <w:r>
-        <w:rPr>
-          <w:rFonts w:cs="Times New Roman"/>
-          <w:i/>
-        </w:rPr>
-        <w:t>Behavioral Finance</w:t>
-      </w:r>
-      <w:r>
-        <w:rPr>
-          <w:rFonts w:cs="Times New Roman"/>
-        </w:rPr>
-        <w:t>, kontrol diri mendisiplinkan individu untuk menimbang risiko kerugian modal riil dan tidak terjebak dalam euforia transaksi spekulatif berlebihan (</w:t>
-      </w:r>
-      <w:hyperlink w:anchor="Ref_thaler1981economic" w:history="1">
-        <w:r>
-          <w:rPr>
-            <w:rFonts w:cs="Times New Roman"/>
-          </w:rPr>
-          <w:t>Thaler and Shefrin, 1981</w:t>
-        </w:r>
-      </w:hyperlink>
-      <w:r>
-        <w:rPr>
-          <w:rFonts w:cs="Times New Roman"/>
-        </w:rPr>
-        <w:t xml:space="preserve">; </w:t>
-      </w:r>
-      <w:hyperlink w:anchor="Ref_barber2008all" w:history="1">
-        <w:r>
-          <w:rPr>
-            <w:rFonts w:cs="Times New Roman"/>
-          </w:rPr>
-          <w:t>Barber and Odean, 2008</w:t>
-        </w:r>
-      </w:hyperlink>
-      <w:r>
-        <w:rPr>
-          <w:rFonts w:cs="Times New Roman"/>
-        </w:rPr>
-        <w:t>). Efek interaksi negatif (β₇ &lt; 0) menunjukkan pengaruh spekulasi terhadap pembelian spontan teredam secara bersyarat (∂Y/∂</w:t>
+        <w:t xml:space="preserve"> Dalam perspektif keuangan keperilakuan, kontrol diri mendisiplinkan individu untuk menimbang risiko kerugian modal riil dan tidak terjebak dalam euforia transaksi spekulatif berlebihan maupun FOMO pasar koleksi (Baumeister </w:t>
+      </w:r>
+      <w:r>
+        <w:rPr>
+          <w:rFonts w:cs="Times New Roman"/>
+          <w:i/>
+        </w:rPr>
+        <w:t>et al.</w:t>
+      </w:r>
+      <w:r>
+        <w:rPr>
+          <w:rFonts w:cs="Times New Roman"/>
+        </w:rPr>
+        <w:t xml:space="preserve">, 2024; Alfina </w:t>
+      </w:r>
+      <w:r>
+        <w:rPr>
+          <w:rFonts w:cs="Times New Roman"/>
+          <w:i/>
+        </w:rPr>
+        <w:t>et al.</w:t>
+      </w:r>
+      <w:r>
+        <w:rPr>
+          <w:rFonts w:cs="Times New Roman"/>
+        </w:rPr>
+        <w:t>, 2023). Efek interaksi negatif (β₇ &lt; 0) menunjukkan pengaruh spekulasi terhadap pembelian spontan teredam secara bersyarat (∂Y/∂</w:t>
       </w:r>
       <w:r>
         <w:rPr>
@@ -18352,14 +18010,14 @@
         <w:rPr>
           <w:rFonts w:cs="Times New Roman"/>
         </w:rPr>
-        <w:t xml:space="preserve"> membuktikan kapasitas literasi finansial berhubungan negatif dengan impulsivitas diskonto hiperbolik (Jepang, probit + </w:t>
+        <w:t xml:space="preserve"> membuktikan kapasitas literasi finansial </w:t>
       </w:r>
       <w:r>
         <w:rPr>
           <w:rFonts w:cs="Times New Roman"/>
         </w:rPr>
         <w:lastRenderedPageBreak/>
-        <w:t xml:space="preserve">IV), proksi regulasi rasional, bukan uji interaksi. </w:t>
+        <w:t xml:space="preserve">berhubungan negatif dengan impulsivitas diskonto hiperbolik (Jepang, probit + IV), proksi regulasi rasional, bukan uji interaksi. </w:t>
       </w:r>
       <w:hyperlink w:anchor="Ref_aryadi2024personal" w:history="1">
         <w:r>
@@ -18529,7 +18187,7 @@
         <w:outlineLvl w:val="1"/>
       </w:pPr>
       <w:bookmarkStart w:id="75" w:name="TOC_2_5_RERANGKA_PENELITIAN"/>
-      <w:bookmarkStart w:id="76" w:name="_Toc242115853"/>
+      <w:bookmarkStart w:id="76" w:name="_Toc243076547"/>
       <w:r>
         <w:rPr>
           <w:rFonts w:ascii="Times New Roman" w:hAnsi="Times New Roman"/>
@@ -18565,7 +18223,7 @@
           <w:noProof/>
         </w:rPr>
         <w:drawing>
-          <wp:inline distT="0" distB="0" distL="0" distR="0" wp14:anchorId="58228E0F" wp14:editId="40B0AACB">
+          <wp:inline distT="0" distB="0" distL="0" distR="0" wp14:anchorId="3ADB582E" wp14:editId="0BD2C025">
             <wp:extent cx="5040000" cy="2876340"/>
             <wp:effectExtent l="0" t="0" r="0" b="0"/>
             <wp:docPr id="5" name="Picture 5"/>
@@ -18641,7 +18299,7 @@
         <w:outlineLvl w:val="0"/>
       </w:pPr>
       <w:bookmarkStart w:id="78" w:name="TOC_BAB_III_METODE_PENELITIAN"/>
-      <w:bookmarkStart w:id="79" w:name="_Toc242115854"/>
+      <w:bookmarkStart w:id="79" w:name="_Toc243076548"/>
       <w:r>
         <w:rPr>
           <w:rFonts w:ascii="Times New Roman" w:hAnsi="Times New Roman"/>
@@ -18692,7 +18350,7 @@
         <w:outlineLvl w:val="1"/>
       </w:pPr>
       <w:bookmarkStart w:id="80" w:name="TOC_3_1_JENIS_DAN_SUMBER_DATA"/>
-      <w:bookmarkStart w:id="81" w:name="_Toc242115855"/>
+      <w:bookmarkStart w:id="81" w:name="_Toc243076549"/>
       <w:r>
         <w:rPr>
           <w:rFonts w:ascii="Times New Roman" w:hAnsi="Times New Roman"/>
@@ -19333,7 +18991,7 @@
         <w:outlineLvl w:val="2"/>
       </w:pPr>
       <w:bookmarkStart w:id="83" w:name="TOC_3_1_1_BATASAN_PENELITIAN_DAN_RUANG_L"/>
-      <w:bookmarkStart w:id="84" w:name="_Toc242115856"/>
+      <w:bookmarkStart w:id="84" w:name="_Toc243076550"/>
       <w:r>
         <w:rPr>
           <w:rFonts w:ascii="Times New Roman" w:hAnsi="Times New Roman"/>
@@ -19629,7 +19287,7 @@
         <w:outlineLvl w:val="1"/>
       </w:pPr>
       <w:bookmarkStart w:id="85" w:name="TOC_3_2_POPULASI_DAN_SAMPEL"/>
-      <w:bookmarkStart w:id="86" w:name="_Toc242115857"/>
+      <w:bookmarkStart w:id="86" w:name="_Toc243076551"/>
       <w:r>
         <w:rPr>
           <w:rFonts w:ascii="Times New Roman" w:hAnsi="Times New Roman"/>
@@ -19648,7 +19306,7 @@
         <w:outlineLvl w:val="2"/>
       </w:pPr>
       <w:bookmarkStart w:id="87" w:name="TOC_3_2_1_POPULASI_DAN_IDENTIFIKASI_SUMB"/>
-      <w:bookmarkStart w:id="88" w:name="_Toc242115858"/>
+      <w:bookmarkStart w:id="88" w:name="_Toc243076552"/>
       <w:r>
         <w:rPr>
           <w:rFonts w:ascii="Times New Roman" w:hAnsi="Times New Roman"/>
@@ -19868,7 +19526,7 @@
         <w:outlineLvl w:val="2"/>
       </w:pPr>
       <w:bookmarkStart w:id="89" w:name="TOC_3_2_2_SAMPEL_DAN_JUSTIFIKASI_KRITERI"/>
-      <w:bookmarkStart w:id="90" w:name="_Toc242115859"/>
+      <w:bookmarkStart w:id="90" w:name="_Toc243076553"/>
       <w:r>
         <w:rPr>
           <w:rFonts w:ascii="Times New Roman" w:hAnsi="Times New Roman"/>
@@ -20356,7 +20014,7 @@
         <w:outlineLvl w:val="2"/>
       </w:pPr>
       <w:bookmarkStart w:id="91" w:name="TOC_3_2_3_PROSEDUR_DISTRIBUSI_KUESIONER_"/>
-      <w:bookmarkStart w:id="92" w:name="_Toc242115860"/>
+      <w:bookmarkStart w:id="92" w:name="_Toc243076554"/>
       <w:r>
         <w:rPr>
           <w:rFonts w:ascii="Times New Roman" w:hAnsi="Times New Roman"/>
@@ -20622,7 +20280,7 @@
         <w:outlineLvl w:val="2"/>
       </w:pPr>
       <w:bookmarkStart w:id="93" w:name="TOC_3_2_4_PENENTUAN_UKURAN_SAMPEL"/>
-      <w:bookmarkStart w:id="94" w:name="_Toc242115861"/>
+      <w:bookmarkStart w:id="94" w:name="_Toc243076555"/>
       <w:r>
         <w:rPr>
           <w:rFonts w:ascii="Times New Roman" w:hAnsi="Times New Roman"/>
@@ -21305,7 +20963,7 @@
         <w:outlineLvl w:val="2"/>
       </w:pPr>
       <w:bookmarkStart w:id="95" w:name="TOC_3_2_5_JUSTIFIKASI_KOMPARATIF_PEMILIH"/>
-      <w:bookmarkStart w:id="96" w:name="_Toc242115862"/>
+      <w:bookmarkStart w:id="96" w:name="_Toc243076556"/>
       <w:r>
         <w:rPr>
           <w:rFonts w:ascii="Times New Roman" w:hAnsi="Times New Roman"/>
@@ -21570,7 +21228,7 @@
         <w:outlineLvl w:val="1"/>
       </w:pPr>
       <w:bookmarkStart w:id="97" w:name="TOC_3_3_MODEL_PENELITIAN"/>
-      <w:bookmarkStart w:id="98" w:name="_Toc242115863"/>
+      <w:bookmarkStart w:id="98" w:name="_Toc243076557"/>
       <w:r>
         <w:rPr>
           <w:rFonts w:ascii="Times New Roman" w:hAnsi="Times New Roman"/>
@@ -23600,7 +23258,7 @@
         <w:outlineLvl w:val="1"/>
       </w:pPr>
       <w:bookmarkStart w:id="99" w:name="TOC_3_4_OPERASIONALISASI_VARIABEL"/>
-      <w:bookmarkStart w:id="100" w:name="_Toc242115864"/>
+      <w:bookmarkStart w:id="100" w:name="_Toc243076558"/>
       <w:r>
         <w:rPr>
           <w:rFonts w:ascii="Times New Roman" w:hAnsi="Times New Roman"/>
@@ -26673,54 +26331,7 @@
                 <w:rFonts w:cs="Times New Roman"/>
                 <w:sz w:val="18"/>
               </w:rPr>
-              <w:t xml:space="preserve">; </w:t>
-            </w:r>
-            <w:hyperlink w:anchor="Ref_vohs2007spent" w:history="1">
-              <w:r>
-                <w:rPr>
-                  <w:rFonts w:cs="Times New Roman"/>
-                  <w:sz w:val="18"/>
-                </w:rPr>
-                <w:t>Vohs &amp; Faber, 2007</w:t>
-              </w:r>
-            </w:hyperlink>
-            <w:r>
-              <w:rPr>
-                <w:rFonts w:cs="Times New Roman"/>
-                <w:sz w:val="18"/>
-              </w:rPr>
-              <w:t xml:space="preserve">; </w:t>
-            </w:r>
-            <w:hyperlink w:anchor="Ref_sultan2012building" w:history="1">
-              <w:r>
-                <w:rPr>
-                  <w:rFonts w:cs="Times New Roman"/>
-                  <w:sz w:val="18"/>
-                </w:rPr>
-                <w:t xml:space="preserve">Sultan </w:t>
-              </w:r>
-              <w:r>
-                <w:rPr>
-                  <w:rFonts w:cs="Times New Roman"/>
-                  <w:i/>
-                  <w:sz w:val="18"/>
-                </w:rPr>
-                <w:t>et al.</w:t>
-              </w:r>
-              <w:r>
-                <w:rPr>
-                  <w:rFonts w:cs="Times New Roman"/>
-                  <w:sz w:val="18"/>
-                </w:rPr>
-                <w:t>, 2012</w:t>
-              </w:r>
-            </w:hyperlink>
-            <w:r>
-              <w:rPr>
-                <w:rFonts w:cs="Times New Roman"/>
-                <w:sz w:val="18"/>
-              </w:rPr>
-              <w:t xml:space="preserve">; </w:t>
+              <w:t xml:space="preserve">; Rafael &amp; Lopes, 2023; Prihatiningrum &amp; Said, 2021; </w:t>
             </w:r>
             <w:hyperlink w:anchor="Ref_apidana2022peran" w:history="1">
               <w:r>
@@ -27398,7 +27009,7 @@
         <w:outlineLvl w:val="1"/>
       </w:pPr>
       <w:bookmarkStart w:id="102" w:name="TOC_3_5_METODE_ANALISIS_DATA"/>
-      <w:bookmarkStart w:id="103" w:name="_Toc242115865"/>
+      <w:bookmarkStart w:id="103" w:name="_Toc243076559"/>
       <w:r>
         <w:rPr>
           <w:rFonts w:ascii="Times New Roman" w:hAnsi="Times New Roman"/>
@@ -27418,7 +27029,7 @@
         <w:outlineLvl w:val="2"/>
       </w:pPr>
       <w:bookmarkStart w:id="104" w:name="TOC_3_5_1_JUSTIFIKASI_KOMPARATIF_PEMILIH"/>
-      <w:bookmarkStart w:id="105" w:name="_Toc242115866"/>
+      <w:bookmarkStart w:id="105" w:name="_Toc243076560"/>
       <w:r>
         <w:rPr>
           <w:rFonts w:ascii="Times New Roman" w:hAnsi="Times New Roman"/>
@@ -27828,34 +27439,20 @@
         <w:rPr>
           <w:rFonts w:cs="Times New Roman"/>
         </w:rPr>
-        <w:t>Metode ini telah dipakai sejumlah penelitian untuk menguji moderasi kontrol diri terhadap perilaku pembelian impulsif (</w:t>
-      </w:r>
-      <w:hyperlink w:anchor="Ref_sultan2012building" w:history="1">
-        <w:r>
-          <w:rPr>
-            <w:rFonts w:cs="Times New Roman"/>
-          </w:rPr>
-          <w:t xml:space="preserve">Sultan </w:t>
-        </w:r>
-        <w:r>
-          <w:rPr>
-            <w:rFonts w:cs="Times New Roman"/>
-            <w:i/>
-          </w:rPr>
-          <w:t>et al.</w:t>
-        </w:r>
-        <w:r>
-          <w:rPr>
-            <w:rFonts w:cs="Times New Roman"/>
-          </w:rPr>
-          <w:t>, 2012</w:t>
-        </w:r>
-      </w:hyperlink>
-      <w:r>
-        <w:rPr>
-          <w:rFonts w:cs="Times New Roman"/>
-        </w:rPr>
-        <w:t xml:space="preserve">; </w:t>
+        <w:t xml:space="preserve">Metode ini telah dipakai sejumlah penelitian untuk menguji moderasi kontrol diri terhadap perilaku pembelian impulsif (Prihatiningrum </w:t>
+      </w:r>
+      <w:r>
+        <w:rPr>
+          <w:rFonts w:cs="Times New Roman"/>
+          <w:i/>
+        </w:rPr>
+        <w:t>et al.</w:t>
+      </w:r>
+      <w:r>
+        <w:rPr>
+          <w:rFonts w:cs="Times New Roman"/>
+        </w:rPr>
+        <w:t xml:space="preserve">, 2021; </w:t>
       </w:r>
       <w:hyperlink w:anchor="Ref_apidana2022peran" w:history="1">
         <w:r>
@@ -28904,7 +28501,7 @@
         <w:outlineLvl w:val="1"/>
       </w:pPr>
       <w:bookmarkStart w:id="106" w:name="TOC_3_6_DIAGRAM_ALUR_PENELITIAN"/>
-      <w:bookmarkStart w:id="107" w:name="_Toc242115867"/>
+      <w:bookmarkStart w:id="107" w:name="_Toc243076561"/>
       <w:r>
         <w:rPr>
           <w:rFonts w:ascii="Times New Roman" w:hAnsi="Times New Roman"/>
@@ -28940,7 +28537,7 @@
           <w:noProof/>
         </w:rPr>
         <w:drawing>
-          <wp:inline distT="0" distB="0" distL="0" distR="0" wp14:anchorId="54950350" wp14:editId="73ACFE88">
+          <wp:inline distT="0" distB="0" distL="0" distR="0" wp14:anchorId="2F220BCE" wp14:editId="482BB8CC">
             <wp:extent cx="4680000" cy="4701382"/>
             <wp:effectExtent l="0" t="0" r="0" b="0"/>
             <wp:docPr id="6" name="Picture 6"/>
@@ -29320,7 +28917,7 @@
         <w:outlineLvl w:val="1"/>
       </w:pPr>
       <w:bookmarkStart w:id="109" w:name="TOC_3_7_JADWAL_PELAKSANAAN_PENELITIAN"/>
-      <w:bookmarkStart w:id="110" w:name="_Toc242115868"/>
+      <w:bookmarkStart w:id="110" w:name="_Toc243076562"/>
       <w:r>
         <w:rPr>
           <w:rFonts w:ascii="Times New Roman" w:hAnsi="Times New Roman"/>
@@ -31272,7 +30869,7 @@
         <w:outlineLvl w:val="0"/>
       </w:pPr>
       <w:bookmarkStart w:id="112" w:name="TOC_DAFTAR_PUSTAKA"/>
-      <w:bookmarkStart w:id="113" w:name="_Toc242115869"/>
+      <w:bookmarkStart w:id="113" w:name="_Toc243076563"/>
       <w:r>
         <w:rPr>
           <w:rFonts w:ascii="Times New Roman" w:hAnsi="Times New Roman"/>
@@ -31325,20 +30922,20 @@
         <w:rPr>
           <w:rFonts w:cs="Times New Roman"/>
         </w:rPr>
-        <w:t xml:space="preserve">Amos, C., Holmes, G. R., and Keneson, W. C. (2014). A meta-analysis of consumer impulse buying. </w:t>
-      </w:r>
-      <w:r>
-        <w:rPr>
-          <w:rFonts w:cs="Times New Roman"/>
-          <w:i/>
-        </w:rPr>
-        <w:t>Journal of Retailing and Consumer Services</w:t>
-      </w:r>
-      <w:r>
-        <w:rPr>
-          <w:rFonts w:cs="Times New Roman"/>
-        </w:rPr>
-        <w:t>, 21(2):86–97.</w:t>
+        <w:t xml:space="preserve">Alfina, Hartini, S., and Mardhiyah, D. (2023). FOMO related consumer behaviour in marketing context: A systematic literature review. </w:t>
+      </w:r>
+      <w:r>
+        <w:rPr>
+          <w:rFonts w:cs="Times New Roman"/>
+          <w:i/>
+        </w:rPr>
+        <w:t>Cogent Business &amp; Management</w:t>
+      </w:r>
+      <w:r>
+        <w:rPr>
+          <w:rFonts w:cs="Times New Roman"/>
+        </w:rPr>
+        <w:t>, 10(3):2250033.</w:t>
       </w:r>
       <w:bookmarkEnd w:id="115"/>
     </w:p>
@@ -31353,20 +30950,20 @@
         <w:rPr>
           <w:rFonts w:cs="Times New Roman"/>
         </w:rPr>
-        <w:t xml:space="preserve">Apidana, Y. H. and Kholifah (2022). Peran self control dalam memoderasi pengaruh hedonic motives dan shopping lifestyle terhadap impulse buying. </w:t>
-      </w:r>
-      <w:r>
-        <w:rPr>
-          <w:rFonts w:cs="Times New Roman"/>
-          <w:i/>
-        </w:rPr>
-        <w:t>Journal of Digital Business and Management</w:t>
-      </w:r>
-      <w:r>
-        <w:rPr>
-          <w:rFonts w:cs="Times New Roman"/>
-        </w:rPr>
-        <w:t>, 1(1):26–40.</w:t>
+        <w:t xml:space="preserve">Anoop, T. S. and Rahman, Z. (2025). Online impulse buying: A systematic review of 25 years of research using meta regression. </w:t>
+      </w:r>
+      <w:r>
+        <w:rPr>
+          <w:rFonts w:cs="Times New Roman"/>
+          <w:i/>
+        </w:rPr>
+        <w:t>Journal of Consumer Behaviour</w:t>
+      </w:r>
+      <w:r>
+        <w:rPr>
+          <w:rFonts w:cs="Times New Roman"/>
+        </w:rPr>
+        <w:t>, 24(1):363–391.</w:t>
       </w:r>
       <w:bookmarkEnd w:id="116"/>
     </w:p>
@@ -31381,20 +30978,20 @@
         <w:rPr>
           <w:rFonts w:cs="Times New Roman"/>
         </w:rPr>
-        <w:t xml:space="preserve">Arnold, M. J. and Reynolds, K. E. (2003). Hedonic shopping motivations. </w:t>
-      </w:r>
-      <w:r>
-        <w:rPr>
-          <w:rFonts w:cs="Times New Roman"/>
-          <w:i/>
-        </w:rPr>
-        <w:t>Journal of Retailing</w:t>
-      </w:r>
-      <w:r>
-        <w:rPr>
-          <w:rFonts w:cs="Times New Roman"/>
-        </w:rPr>
-        <w:t>, 79(2):77–95.</w:t>
+        <w:t xml:space="preserve">Apidana, Y. H. and Kholifah (2022). Peran self control dalam memoderasi pengaruh hedonic motives dan shopping lifestyle terhadap impulse buying. </w:t>
+      </w:r>
+      <w:r>
+        <w:rPr>
+          <w:rFonts w:cs="Times New Roman"/>
+          <w:i/>
+        </w:rPr>
+        <w:t>Journal of Digital Business and Management</w:t>
+      </w:r>
+      <w:r>
+        <w:rPr>
+          <w:rFonts w:cs="Times New Roman"/>
+        </w:rPr>
+        <w:t>, 1(1):26–40.</w:t>
       </w:r>
       <w:bookmarkEnd w:id="117"/>
     </w:p>
@@ -31409,20 +31006,20 @@
         <w:rPr>
           <w:rFonts w:cs="Times New Roman"/>
         </w:rPr>
-        <w:t xml:space="preserve">Artadita, S. and Firmialy, S. D. (2024). How does self-control moderate shopping enjoyment and impulse buying among generation z online gamers? </w:t>
-      </w:r>
-      <w:r>
-        <w:rPr>
-          <w:rFonts w:cs="Times New Roman"/>
-          <w:i/>
-        </w:rPr>
-        <w:t>Binus Business Review</w:t>
-      </w:r>
-      <w:r>
-        <w:rPr>
-          <w:rFonts w:cs="Times New Roman"/>
-        </w:rPr>
-        <w:t>, 15(2):179–189.</w:t>
+        <w:t xml:space="preserve">Aquino, M. J. and Gershenson, S. (2024). Expecting the expected? Documenting nostalgia effects on baseball card prices. </w:t>
+      </w:r>
+      <w:r>
+        <w:rPr>
+          <w:rFonts w:cs="Times New Roman"/>
+          <w:i/>
+        </w:rPr>
+        <w:t>Journal of Sports Economics</w:t>
+      </w:r>
+      <w:r>
+        <w:rPr>
+          <w:rFonts w:cs="Times New Roman"/>
+        </w:rPr>
+        <w:t>, 25(6):683–706.</w:t>
       </w:r>
       <w:bookmarkEnd w:id="118"/>
     </w:p>
@@ -31437,33 +31034,20 @@
         <w:rPr>
           <w:rFonts w:cs="Times New Roman"/>
         </w:rPr>
-        <w:t xml:space="preserve">Aryadi, A. and Lingga, M. (2026). Personal traits and motivation impact on collectibles as an alternative investment: A case study of trading card game community in greater jakarta. In </w:t>
-      </w:r>
-      <w:r>
-        <w:rPr>
-          <w:rFonts w:cs="Times New Roman"/>
-          <w:i/>
-        </w:rPr>
-        <w:t>Proceedings of the 5th International Conference on Global Innovation and Trends in Economy (INCOGITE 2024)</w:t>
-      </w:r>
-      <w:r>
-        <w:rPr>
-          <w:rFonts w:cs="Times New Roman"/>
-        </w:rPr>
-        <w:t xml:space="preserve">, volume 302 of </w:t>
-      </w:r>
-      <w:r>
-        <w:rPr>
-          <w:rFonts w:cs="Times New Roman"/>
-          <w:i/>
-        </w:rPr>
-        <w:t>Advances in Economics, Business and Management Research</w:t>
-      </w:r>
-      <w:r>
-        <w:rPr>
-          <w:rFonts w:cs="Times New Roman"/>
-        </w:rPr>
-        <w:t>, pages 1–12. Atlantis Press.</w:t>
+        <w:t xml:space="preserve">Arnold, M. J. and Reynolds, K. E. (2003). Hedonic shopping motivations. </w:t>
+      </w:r>
+      <w:r>
+        <w:rPr>
+          <w:rFonts w:cs="Times New Roman"/>
+          <w:i/>
+        </w:rPr>
+        <w:t>Journal of Retailing</w:t>
+      </w:r>
+      <w:r>
+        <w:rPr>
+          <w:rFonts w:cs="Times New Roman"/>
+        </w:rPr>
+        <w:t>, 79(2):77–95.</w:t>
       </w:r>
       <w:bookmarkEnd w:id="119"/>
     </w:p>
@@ -31478,20 +31062,20 @@
         <w:rPr>
           <w:rFonts w:cs="Times New Roman"/>
         </w:rPr>
-        <w:t xml:space="preserve">Azizah, N. L. and Fauzi, M. (2025). Exploring the drivers of impulsive buying in e-commerce: the role of hedonic motivation, shopping lifestyle, and positive emotions. </w:t>
-      </w:r>
-      <w:r>
-        <w:rPr>
-          <w:rFonts w:cs="Times New Roman"/>
-          <w:i/>
-        </w:rPr>
-        <w:t>Jurnal Inovasi Ekonomi</w:t>
-      </w:r>
-      <w:r>
-        <w:rPr>
-          <w:rFonts w:cs="Times New Roman"/>
-        </w:rPr>
-        <w:t>, 10(2):79–94.</w:t>
+        <w:t xml:space="preserve">Artadita, S. and Firmialy, S. D. (2024). How does self-control moderate shopping enjoyment and impulse buying among generation z online gamers? </w:t>
+      </w:r>
+      <w:r>
+        <w:rPr>
+          <w:rFonts w:cs="Times New Roman"/>
+          <w:i/>
+        </w:rPr>
+        <w:t>Binus Business Review</w:t>
+      </w:r>
+      <w:r>
+        <w:rPr>
+          <w:rFonts w:cs="Times New Roman"/>
+        </w:rPr>
+        <w:t>, 15(2):179–189.</w:t>
       </w:r>
       <w:bookmarkEnd w:id="120"/>
     </w:p>
@@ -31506,20 +31090,33 @@
         <w:rPr>
           <w:rFonts w:cs="Times New Roman"/>
         </w:rPr>
-        <w:t xml:space="preserve">Babin, B. J., Darden, W. R., and Griffin, M. (1994). Work and/or fun: Measuring hedonic and utilitarian shopping value. </w:t>
-      </w:r>
-      <w:r>
-        <w:rPr>
-          <w:rFonts w:cs="Times New Roman"/>
-          <w:i/>
-        </w:rPr>
-        <w:t>Journal of Consumer Research</w:t>
-      </w:r>
-      <w:r>
-        <w:rPr>
-          <w:rFonts w:cs="Times New Roman"/>
-        </w:rPr>
-        <w:t>, 20(4):644–656.</w:t>
+        <w:t xml:space="preserve">Aryadi, A. and Lingga, M. (2026). Personal traits and motivation impact on collectibles as an alternative investment: A case study of trading card game community in greater jakarta. In </w:t>
+      </w:r>
+      <w:r>
+        <w:rPr>
+          <w:rFonts w:cs="Times New Roman"/>
+          <w:i/>
+        </w:rPr>
+        <w:t>Proceedings of the 5th International Conference on Global Innovation and Trends in Economy (INCOGITE 2024)</w:t>
+      </w:r>
+      <w:r>
+        <w:rPr>
+          <w:rFonts w:cs="Times New Roman"/>
+        </w:rPr>
+        <w:t xml:space="preserve">, volume 302 of </w:t>
+      </w:r>
+      <w:r>
+        <w:rPr>
+          <w:rFonts w:cs="Times New Roman"/>
+          <w:i/>
+        </w:rPr>
+        <w:t>Advances in Economics, Business and Management Research</w:t>
+      </w:r>
+      <w:r>
+        <w:rPr>
+          <w:rFonts w:cs="Times New Roman"/>
+        </w:rPr>
+        <w:t>, pages 1–12. Atlantis Press.</w:t>
       </w:r>
       <w:bookmarkEnd w:id="121"/>
     </w:p>
@@ -31534,20 +31131,20 @@
         <w:rPr>
           <w:rFonts w:cs="Times New Roman"/>
         </w:rPr>
-        <w:t xml:space="preserve">Barasz, K., John, L. K., Keenan, E. A., and Norton, M. I. (2017). Pseudo-set framing. </w:t>
-      </w:r>
-      <w:r>
-        <w:rPr>
-          <w:rFonts w:cs="Times New Roman"/>
-          <w:i/>
-        </w:rPr>
-        <w:t>Journal of Experimental Psychology: General</w:t>
-      </w:r>
-      <w:r>
-        <w:rPr>
-          <w:rFonts w:cs="Times New Roman"/>
-        </w:rPr>
-        <w:t>, 146(10):1460–1477.</w:t>
+        <w:t xml:space="preserve">Azizah, N. L. and Fauzi, M. (2025). Exploring the drivers of impulsive buying in e-commerce: the role of hedonic motivation, shopping lifestyle, and positive emotions. </w:t>
+      </w:r>
+      <w:r>
+        <w:rPr>
+          <w:rFonts w:cs="Times New Roman"/>
+          <w:i/>
+        </w:rPr>
+        <w:t>Jurnal Inovasi Ekonomi</w:t>
+      </w:r>
+      <w:r>
+        <w:rPr>
+          <w:rFonts w:cs="Times New Roman"/>
+        </w:rPr>
+        <w:t>, 10(2):79–94.</w:t>
       </w:r>
       <w:bookmarkEnd w:id="122"/>
     </w:p>
@@ -31562,20 +31159,20 @@
         <w:rPr>
           <w:rFonts w:cs="Times New Roman"/>
         </w:rPr>
-        <w:t xml:space="preserve">Barber, B. M. and Odean, T. (2008). All that glitters: The effect of attention and news on the buying behavior of individual and institutional investors. </w:t>
-      </w:r>
-      <w:r>
-        <w:rPr>
-          <w:rFonts w:cs="Times New Roman"/>
-          <w:i/>
-        </w:rPr>
-        <w:t>The Review of Financial Studies</w:t>
-      </w:r>
-      <w:r>
-        <w:rPr>
-          <w:rFonts w:cs="Times New Roman"/>
-        </w:rPr>
-        <w:t>, 21(2):785–818.</w:t>
+        <w:t xml:space="preserve">Babin, B. J., Darden, W. R., and Griffin, M. (1994). Work and/or fun: Measuring hedonic and utilitarian shopping value. </w:t>
+      </w:r>
+      <w:r>
+        <w:rPr>
+          <w:rFonts w:cs="Times New Roman"/>
+          <w:i/>
+        </w:rPr>
+        <w:t>Journal of Consumer Research</w:t>
+      </w:r>
+      <w:r>
+        <w:rPr>
+          <w:rFonts w:cs="Times New Roman"/>
+        </w:rPr>
+        <w:t>, 20(4):644–656.</w:t>
       </w:r>
       <w:bookmarkEnd w:id="123"/>
     </w:p>
@@ -31590,20 +31187,20 @@
         <w:rPr>
           <w:rFonts w:cs="Times New Roman"/>
         </w:rPr>
-        <w:t xml:space="preserve">Baumeister, R. F. (2002). Yielding to temptation: Self-control failure, impulsive purchasing, and consumer behavior. </w:t>
-      </w:r>
-      <w:r>
-        <w:rPr>
-          <w:rFonts w:cs="Times New Roman"/>
-          <w:i/>
-        </w:rPr>
-        <w:t>Journal of Consumer Research</w:t>
-      </w:r>
-      <w:r>
-        <w:rPr>
-          <w:rFonts w:cs="Times New Roman"/>
-        </w:rPr>
-        <w:t>, 28(4):670–676.</w:t>
+        <w:t xml:space="preserve">Barasz, K., John, L. K., Keenan, E. A., and Norton, M. I. (2017). Pseudo-set framing. </w:t>
+      </w:r>
+      <w:r>
+        <w:rPr>
+          <w:rFonts w:cs="Times New Roman"/>
+          <w:i/>
+        </w:rPr>
+        <w:t>Journal of Experimental Psychology: General</w:t>
+      </w:r>
+      <w:r>
+        <w:rPr>
+          <w:rFonts w:cs="Times New Roman"/>
+        </w:rPr>
+        <w:t>, 146(10):1460–1477.</w:t>
       </w:r>
       <w:bookmarkEnd w:id="124"/>
     </w:p>
@@ -31618,20 +31215,21 @@
         <w:rPr>
           <w:rFonts w:cs="Times New Roman"/>
         </w:rPr>
-        <w:t xml:space="preserve">Baur, D. G., Dimpfl, T., and Kuck, K. (2018). Bitcoin, gold and the US dollar – a replication and extension. </w:t>
-      </w:r>
-      <w:r>
-        <w:rPr>
-          <w:rFonts w:cs="Times New Roman"/>
-          <w:i/>
-        </w:rPr>
-        <w:t>Finance Research Letters</w:t>
-      </w:r>
-      <w:r>
-        <w:rPr>
-          <w:rFonts w:cs="Times New Roman"/>
-        </w:rPr>
-        <w:t>, 25:103–110.</w:t>
+        <w:lastRenderedPageBreak/>
+        <w:t xml:space="preserve">Baumeister, R. F. (2002). Yielding to temptation: Self-control failure, impulsive purchasing, and consumer behavior. </w:t>
+      </w:r>
+      <w:r>
+        <w:rPr>
+          <w:rFonts w:cs="Times New Roman"/>
+          <w:i/>
+        </w:rPr>
+        <w:t>Journal of Consumer Research</w:t>
+      </w:r>
+      <w:r>
+        <w:rPr>
+          <w:rFonts w:cs="Times New Roman"/>
+        </w:rPr>
+        <w:t>, 28(4):670–676.</w:t>
       </w:r>
       <w:bookmarkEnd w:id="125"/>
     </w:p>
@@ -31646,21 +31244,20 @@
         <w:rPr>
           <w:rFonts w:cs="Times New Roman"/>
         </w:rPr>
-        <w:lastRenderedPageBreak/>
-        <w:t xml:space="preserve">Belk, R. W. (1995). </w:t>
-      </w:r>
-      <w:r>
-        <w:rPr>
-          <w:rFonts w:cs="Times New Roman"/>
-          <w:i/>
-        </w:rPr>
-        <w:t>Collecting in a Consumer Society</w:t>
-      </w:r>
-      <w:r>
-        <w:rPr>
-          <w:rFonts w:cs="Times New Roman"/>
-        </w:rPr>
-        <w:t>. Routledge, London.</w:t>
+        <w:t xml:space="preserve">Baumeister, R. F., André, N., Southwick, D. A., and Tice, D. M. (2024). Self-control and limited willpower: Current status of ego depletion theory and research. </w:t>
+      </w:r>
+      <w:r>
+        <w:rPr>
+          <w:rFonts w:cs="Times New Roman"/>
+          <w:i/>
+        </w:rPr>
+        <w:t>Current Opinion in Psychology</w:t>
+      </w:r>
+      <w:r>
+        <w:rPr>
+          <w:rFonts w:cs="Times New Roman"/>
+        </w:rPr>
+        <w:t>, 60:101882.</w:t>
       </w:r>
       <w:bookmarkEnd w:id="126"/>
     </w:p>
@@ -31675,20 +31272,20 @@
         <w:rPr>
           <w:rFonts w:cs="Times New Roman"/>
         </w:rPr>
-        <w:t xml:space="preserve">Chan, T. K. H., Cheung, C. M. K., and Lee, Z. W. Y. (2017). The state of online impulse-buying research: A literature analysis. </w:t>
-      </w:r>
-      <w:r>
-        <w:rPr>
-          <w:rFonts w:cs="Times New Roman"/>
-          <w:i/>
-        </w:rPr>
-        <w:t>Information &amp; Management</w:t>
-      </w:r>
-      <w:r>
-        <w:rPr>
-          <w:rFonts w:cs="Times New Roman"/>
-        </w:rPr>
-        <w:t>, 54(2):204–217. Analisis literatur komprehensif impulse buying online kerangka SOR; pengganti spero2004approach.</w:t>
+        <w:t xml:space="preserve">Baur, D. G., Dimpfl, T., and Kuck, K. (2018). Bitcoin, gold and the US dollar – a replication and extension. </w:t>
+      </w:r>
+      <w:r>
+        <w:rPr>
+          <w:rFonts w:cs="Times New Roman"/>
+          <w:i/>
+        </w:rPr>
+        <w:t>Finance Research Letters</w:t>
+      </w:r>
+      <w:r>
+        <w:rPr>
+          <w:rFonts w:cs="Times New Roman"/>
+        </w:rPr>
+        <w:t>, 25:103–110.</w:t>
       </w:r>
       <w:bookmarkEnd w:id="127"/>
     </w:p>
@@ -31703,20 +31300,20 @@
         <w:rPr>
           <w:rFonts w:cs="Times New Roman"/>
         </w:rPr>
-        <w:t xml:space="preserve">Cohen, J. (1988). </w:t>
-      </w:r>
-      <w:r>
-        <w:rPr>
-          <w:rFonts w:cs="Times New Roman"/>
-          <w:i/>
-        </w:rPr>
-        <w:t>Statistical Power Analysis for the Behavioral Sciences</w:t>
-      </w:r>
-      <w:r>
-        <w:rPr>
-          <w:rFonts w:cs="Times New Roman"/>
-        </w:rPr>
-        <w:t>. Lawrence Erlbaum Associates, Hillsdale, NJ, 2 edition.</w:t>
+        <w:t xml:space="preserve">Beikverdi, L., Sipilä, J., and Tarkiainen, A. (2024). Post-purchase effects of impulse buying: A review and research agenda. </w:t>
+      </w:r>
+      <w:r>
+        <w:rPr>
+          <w:rFonts w:cs="Times New Roman"/>
+          <w:i/>
+        </w:rPr>
+        <w:t>Journal of Consumer Behaviour</w:t>
+      </w:r>
+      <w:r>
+        <w:rPr>
+          <w:rFonts w:cs="Times New Roman"/>
+        </w:rPr>
+        <w:t>, 23(3):1512–1527.</w:t>
       </w:r>
       <w:bookmarkEnd w:id="128"/>
     </w:p>
@@ -31731,20 +31328,20 @@
         <w:rPr>
           <w:rFonts w:cs="Times New Roman"/>
         </w:rPr>
-        <w:t xml:space="preserve">Colline, F. (2024). Biases in indonesian stock investor behavior. </w:t>
-      </w:r>
-      <w:r>
-        <w:rPr>
-          <w:rFonts w:cs="Times New Roman"/>
-          <w:i/>
-        </w:rPr>
-        <w:t>Accounting and Finance Studies</w:t>
-      </w:r>
-      <w:r>
-        <w:rPr>
-          <w:rFonts w:cs="Times New Roman"/>
-        </w:rPr>
-        <w:t>, 4(2):88–98.</w:t>
+        <w:t xml:space="preserve">Belk, R. W. (1995). </w:t>
+      </w:r>
+      <w:r>
+        <w:rPr>
+          <w:rFonts w:cs="Times New Roman"/>
+          <w:i/>
+        </w:rPr>
+        <w:t>Collecting in a Consumer Society</w:t>
+      </w:r>
+      <w:r>
+        <w:rPr>
+          <w:rFonts w:cs="Times New Roman"/>
+        </w:rPr>
+        <w:t>. Routledge, London.</w:t>
       </w:r>
       <w:bookmarkEnd w:id="129"/>
     </w:p>
@@ -31759,20 +31356,20 @@
         <w:rPr>
           <w:rFonts w:cs="Times New Roman"/>
         </w:rPr>
-        <w:t xml:space="preserve">Dewi, M. M. L. S., Budoyo, V. D., and Mustikasari, F. (2026). Understanding impulse buying behavior: The case of blind box purchases in indonesia. </w:t>
-      </w:r>
-      <w:r>
-        <w:rPr>
-          <w:rFonts w:cs="Times New Roman"/>
-          <w:i/>
-        </w:rPr>
-        <w:t>Jurnal Locus: Penelitian dan Pengabdian</w:t>
-      </w:r>
-      <w:r>
-        <w:rPr>
-          <w:rFonts w:cs="Times New Roman"/>
-        </w:rPr>
-        <w:t>, 5(2):1082–1089.</w:t>
+        <w:t xml:space="preserve">Chan, T. K. H., Cheung, C. M. K., and Lee, Z. W. Y. (2017). The state of online impulse-buying research: A literature analysis. </w:t>
+      </w:r>
+      <w:r>
+        <w:rPr>
+          <w:rFonts w:cs="Times New Roman"/>
+          <w:i/>
+        </w:rPr>
+        <w:t>Information &amp; Management</w:t>
+      </w:r>
+      <w:r>
+        <w:rPr>
+          <w:rFonts w:cs="Times New Roman"/>
+        </w:rPr>
+        <w:t>, 54(2):204–217. Analisis literatur komprehensif impulse buying online kerangka SOR; pengganti spero2004approach.</w:t>
       </w:r>
       <w:bookmarkEnd w:id="130"/>
     </w:p>
@@ -31787,20 +31384,20 @@
         <w:rPr>
           <w:rFonts w:cs="Times New Roman"/>
         </w:rPr>
-        <w:t xml:space="preserve">Fama, E. F. (1970). Efficient capital markets: A review of theory and empirical work. </w:t>
-      </w:r>
-      <w:r>
-        <w:rPr>
-          <w:rFonts w:cs="Times New Roman"/>
-          <w:i/>
-        </w:rPr>
-        <w:t>The Journal of Finance</w:t>
-      </w:r>
-      <w:r>
-        <w:rPr>
-          <w:rFonts w:cs="Times New Roman"/>
-        </w:rPr>
-        <w:t>, 25(2):383–417.</w:t>
+        <w:t xml:space="preserve">Cohen, J. (1988). </w:t>
+      </w:r>
+      <w:r>
+        <w:rPr>
+          <w:rFonts w:cs="Times New Roman"/>
+          <w:i/>
+        </w:rPr>
+        <w:t>Statistical Power Analysis for the Behavioral Sciences</w:t>
+      </w:r>
+      <w:r>
+        <w:rPr>
+          <w:rFonts w:cs="Times New Roman"/>
+        </w:rPr>
+        <w:t>. Lawrence Erlbaum Associates, Hillsdale, NJ, 2 edition.</w:t>
       </w:r>
       <w:bookmarkEnd w:id="131"/>
     </w:p>
@@ -31815,20 +31412,20 @@
         <w:rPr>
           <w:rFonts w:cs="Times New Roman"/>
         </w:rPr>
-        <w:t xml:space="preserve">Gao, L., Huang, Y., and Simonson, I. (2014). The influence of initial possession level on consumers' adoption of a collection goal: A tipping point effect. </w:t>
-      </w:r>
-      <w:r>
-        <w:rPr>
-          <w:rFonts w:cs="Times New Roman"/>
-          <w:i/>
-        </w:rPr>
-        <w:t>Journal of Marketing</w:t>
-      </w:r>
-      <w:r>
-        <w:rPr>
-          <w:rFonts w:cs="Times New Roman"/>
-        </w:rPr>
-        <w:t>, 78:143–156.</w:t>
+        <w:t xml:space="preserve">Colline, F. (2024). Biases in indonesian stock investor behavior. </w:t>
+      </w:r>
+      <w:r>
+        <w:rPr>
+          <w:rFonts w:cs="Times New Roman"/>
+          <w:i/>
+        </w:rPr>
+        <w:t>Accounting and Finance Studies</w:t>
+      </w:r>
+      <w:r>
+        <w:rPr>
+          <w:rFonts w:cs="Times New Roman"/>
+        </w:rPr>
+        <w:t>, 4(2):88–98.</w:t>
       </w:r>
       <w:bookmarkEnd w:id="132"/>
     </w:p>
@@ -31843,20 +31440,20 @@
         <w:rPr>
           <w:rFonts w:cs="Times New Roman"/>
         </w:rPr>
-        <w:t xml:space="preserve">Ghozali, I. (2018). </w:t>
-      </w:r>
-      <w:r>
-        <w:rPr>
-          <w:rFonts w:cs="Times New Roman"/>
-          <w:i/>
-        </w:rPr>
-        <w:t>Aplikasi Analisis Multivariate dengan Program IBM SPSS 25</w:t>
-      </w:r>
-      <w:r>
-        <w:rPr>
-          <w:rFonts w:cs="Times New Roman"/>
-        </w:rPr>
-        <w:t>. Badan Penerbit Universitas Diponegoro, Semarang, 9 edition.</w:t>
+        <w:t xml:space="preserve">Dewi, M. M. L. S., Budoyo, V. D., and Mustikasari, F. (2026). Understanding impulse buying behavior: The case of blind box purchases in indonesia. </w:t>
+      </w:r>
+      <w:r>
+        <w:rPr>
+          <w:rFonts w:cs="Times New Roman"/>
+          <w:i/>
+        </w:rPr>
+        <w:t>Jurnal Locus: Penelitian dan Pengabdian</w:t>
+      </w:r>
+      <w:r>
+        <w:rPr>
+          <w:rFonts w:cs="Times New Roman"/>
+        </w:rPr>
+        <w:t>, 5(2):1082–1089.</w:t>
       </w:r>
       <w:bookmarkEnd w:id="133"/>
     </w:p>
@@ -31871,20 +31468,20 @@
         <w:rPr>
           <w:rFonts w:cs="Times New Roman"/>
         </w:rPr>
-        <w:t xml:space="preserve">Gong, X., Yee, C. L., Lee, S. Y., Saif, A. N. M., Liu, M., and Anonthi, F. (2024). Unveiling the enigma of blind box impulse buying curiosity: The moderating role of price consciousness. </w:t>
-      </w:r>
-      <w:r>
-        <w:rPr>
-          <w:rFonts w:cs="Times New Roman"/>
-          <w:i/>
-        </w:rPr>
-        <w:t>Heliyon</w:t>
-      </w:r>
-      <w:r>
-        <w:rPr>
-          <w:rFonts w:cs="Times New Roman"/>
-        </w:rPr>
-        <w:t>, 10(24):e40564.</w:t>
+        <w:t xml:space="preserve">Gao, L., Huang, Y., and Simonson, I. (2014). The influence of initial possession level on consumers' adoption of a collection goal: A tipping point effect. </w:t>
+      </w:r>
+      <w:r>
+        <w:rPr>
+          <w:rFonts w:cs="Times New Roman"/>
+          <w:i/>
+        </w:rPr>
+        <w:t>Journal of Marketing</w:t>
+      </w:r>
+      <w:r>
+        <w:rPr>
+          <w:rFonts w:cs="Times New Roman"/>
+        </w:rPr>
+        <w:t>, 78:143–156.</w:t>
       </w:r>
       <w:bookmarkEnd w:id="134"/>
     </w:p>
@@ -31899,20 +31496,20 @@
         <w:rPr>
           <w:rFonts w:cs="Times New Roman"/>
         </w:rPr>
-        <w:t xml:space="preserve">Green, S. B. (1991). How many subjects does it take to do a regression analysis? </w:t>
-      </w:r>
-      <w:r>
-        <w:rPr>
-          <w:rFonts w:cs="Times New Roman"/>
-          <w:i/>
-        </w:rPr>
-        <w:t>Multivariate Behavioral Research</w:t>
-      </w:r>
-      <w:r>
-        <w:rPr>
-          <w:rFonts w:cs="Times New Roman"/>
-        </w:rPr>
-        <w:t>, 26(3):499–510.</w:t>
+        <w:t xml:space="preserve">Ghozali, I. (2018). </w:t>
+      </w:r>
+      <w:r>
+        <w:rPr>
+          <w:rFonts w:cs="Times New Roman"/>
+          <w:i/>
+        </w:rPr>
+        <w:t>Aplikasi Analisis Multivariate dengan Program IBM SPSS 25</w:t>
+      </w:r>
+      <w:r>
+        <w:rPr>
+          <w:rFonts w:cs="Times New Roman"/>
+        </w:rPr>
+        <w:t>. Badan Penerbit Universitas Diponegoro, Semarang, 9 edition.</w:t>
       </w:r>
       <w:bookmarkEnd w:id="135"/>
     </w:p>
@@ -31927,20 +31524,20 @@
         <w:rPr>
           <w:rFonts w:cs="Times New Roman"/>
         </w:rPr>
-        <w:t xml:space="preserve">Gültekin, B. and Özer, L. (2012). The influence of hedonic motives and browsing on impulse buying. </w:t>
-      </w:r>
-      <w:r>
-        <w:rPr>
-          <w:rFonts w:cs="Times New Roman"/>
-          <w:i/>
-        </w:rPr>
-        <w:t>Journal of Economics and Behavioral Studies</w:t>
-      </w:r>
-      <w:r>
-        <w:rPr>
-          <w:rFonts w:cs="Times New Roman"/>
-        </w:rPr>
-        <w:t>, 4(3):180–189.</w:t>
+        <w:t xml:space="preserve">Giarlotta, A. and Petralia, A. (2024). Simon's bounded rationality. </w:t>
+      </w:r>
+      <w:r>
+        <w:rPr>
+          <w:rFonts w:cs="Times New Roman"/>
+          <w:i/>
+        </w:rPr>
+        <w:t>Decisions in Economics and Finance</w:t>
+      </w:r>
+      <w:r>
+        <w:rPr>
+          <w:rFonts w:cs="Times New Roman"/>
+        </w:rPr>
+        <w:t>, 47(1):327–346.</w:t>
       </w:r>
       <w:bookmarkEnd w:id="136"/>
     </w:p>
@@ -31955,20 +31552,20 @@
         <w:rPr>
           <w:rFonts w:cs="Times New Roman"/>
         </w:rPr>
-        <w:t xml:space="preserve">Hair, J. F., Black, W. C., Babin, B. J., and Anderson, R. E. (2019). </w:t>
-      </w:r>
-      <w:r>
-        <w:rPr>
-          <w:rFonts w:cs="Times New Roman"/>
-          <w:i/>
-        </w:rPr>
-        <w:t>Multivariate Data Analysis</w:t>
-      </w:r>
-      <w:r>
-        <w:rPr>
-          <w:rFonts w:cs="Times New Roman"/>
-        </w:rPr>
-        <w:t>. Cengage Learning, Boston, MA, 8th edition.</w:t>
+        <w:t xml:space="preserve">Gong, X., Yee, C. L., Lee, S. Y., Saif, A. N. M., Liu, M., and Anonthi, F. (2024). Unveiling the enigma of blind box impulse buying curiosity: The moderating role of price consciousness. </w:t>
+      </w:r>
+      <w:r>
+        <w:rPr>
+          <w:rFonts w:cs="Times New Roman"/>
+          <w:i/>
+        </w:rPr>
+        <w:t>Heliyon</w:t>
+      </w:r>
+      <w:r>
+        <w:rPr>
+          <w:rFonts w:cs="Times New Roman"/>
+        </w:rPr>
+        <w:t>, 10(24):e40564.</w:t>
       </w:r>
       <w:bookmarkEnd w:id="137"/>
     </w:p>
@@ -31983,20 +31580,20 @@
         <w:rPr>
           <w:rFonts w:cs="Times New Roman"/>
         </w:rPr>
-        <w:t xml:space="preserve">Hayes, A. F. (2018). </w:t>
-      </w:r>
-      <w:r>
-        <w:rPr>
-          <w:rFonts w:cs="Times New Roman"/>
-          <w:i/>
-        </w:rPr>
-        <w:t>Introduction to Mediation, Moderation, and Conditional Process Analysis: A Regression-Based Approach</w:t>
-      </w:r>
-      <w:r>
-        <w:rPr>
-          <w:rFonts w:cs="Times New Roman"/>
-        </w:rPr>
-        <w:t>. The Guilford Press, New York, 2nd edition.</w:t>
+        <w:t xml:space="preserve">Green, S. B. (1991). How many subjects does it take to do a regression analysis? </w:t>
+      </w:r>
+      <w:r>
+        <w:rPr>
+          <w:rFonts w:cs="Times New Roman"/>
+          <w:i/>
+        </w:rPr>
+        <w:t>Multivariate Behavioral Research</w:t>
+      </w:r>
+      <w:r>
+        <w:rPr>
+          <w:rFonts w:cs="Times New Roman"/>
+        </w:rPr>
+        <w:t>, 26(3):499–510.</w:t>
       </w:r>
       <w:bookmarkEnd w:id="138"/>
     </w:p>
@@ -32011,20 +31608,21 @@
         <w:rPr>
           <w:rFonts w:cs="Times New Roman"/>
         </w:rPr>
-        <w:t xml:space="preserve">Hirschman, E. C. and Holbrook, M. B. (1982). Hedonic consumption: Emerging concepts, methods and propositions. </w:t>
-      </w:r>
-      <w:r>
-        <w:rPr>
-          <w:rFonts w:cs="Times New Roman"/>
-          <w:i/>
-        </w:rPr>
-        <w:t>Journal of Marketing</w:t>
-      </w:r>
-      <w:r>
-        <w:rPr>
-          <w:rFonts w:cs="Times New Roman"/>
-        </w:rPr>
-        <w:t>, 46(3):92–101.</w:t>
+        <w:lastRenderedPageBreak/>
+        <w:t xml:space="preserve">Gächter, S., Johnson, E. J., and Herrmann, A. (2022). Individual-level loss aversion in riskless and risky choices. </w:t>
+      </w:r>
+      <w:r>
+        <w:rPr>
+          <w:rFonts w:cs="Times New Roman"/>
+          <w:i/>
+        </w:rPr>
+        <w:t>Theory and Decision</w:t>
+      </w:r>
+      <w:r>
+        <w:rPr>
+          <w:rFonts w:cs="Times New Roman"/>
+        </w:rPr>
+        <w:t>, 92(3–4):599–624.</w:t>
       </w:r>
       <w:bookmarkEnd w:id="139"/>
     </w:p>
@@ -32039,27 +31637,20 @@
         <w:rPr>
           <w:rFonts w:cs="Times New Roman"/>
         </w:rPr>
-        <w:t xml:space="preserve">Iyer, G. R., Blut, M., Xiao, S. H., and Grewal, D. (2020). Impulse buying: A meta-analytic review. </w:t>
-      </w:r>
-      <w:r>
-        <w:rPr>
-          <w:rFonts w:cs="Times New Roman"/>
-          <w:i/>
-        </w:rPr>
-        <w:t>Journal of the Academy of Marketing Science</w:t>
-      </w:r>
-      <w:r>
-        <w:rPr>
-          <w:rFonts w:cs="Times New Roman"/>
-        </w:rPr>
-        <w:t xml:space="preserve">, </w:t>
-      </w:r>
-      <w:r>
-        <w:rPr>
-          <w:rFonts w:cs="Times New Roman"/>
-        </w:rPr>
-        <w:lastRenderedPageBreak/>
-        <w:t>48(3):384–404. Meta-analisis 231 sampel, 75.000+ konsumen dari 186 artikel; pengganti chen1998financial.</w:t>
+        <w:t xml:space="preserve">Hair, J. F., Black, W. C., Babin, B. J., and Anderson, R. E. (2019). </w:t>
+      </w:r>
+      <w:r>
+        <w:rPr>
+          <w:rFonts w:cs="Times New Roman"/>
+          <w:i/>
+        </w:rPr>
+        <w:t>Multivariate Data Analysis</w:t>
+      </w:r>
+      <w:r>
+        <w:rPr>
+          <w:rFonts w:cs="Times New Roman"/>
+        </w:rPr>
+        <w:t>. Cengage Learning, Boston, MA, 8th edition.</w:t>
       </w:r>
       <w:bookmarkEnd w:id="140"/>
     </w:p>
@@ -32074,20 +31665,20 @@
         <w:rPr>
           <w:rFonts w:cs="Times New Roman"/>
         </w:rPr>
-        <w:t xml:space="preserve">Kahneman, D. and Tversky, A. (1979). Prospect theory: An analysis of decision under risk. </w:t>
-      </w:r>
-      <w:r>
-        <w:rPr>
-          <w:rFonts w:cs="Times New Roman"/>
-          <w:i/>
-        </w:rPr>
-        <w:t>Econometrica</w:t>
-      </w:r>
-      <w:r>
-        <w:rPr>
-          <w:rFonts w:cs="Times New Roman"/>
-        </w:rPr>
-        <w:t>, 47(2):263–292.</w:t>
+        <w:t xml:space="preserve">Hayes, A. F. (2018). </w:t>
+      </w:r>
+      <w:r>
+        <w:rPr>
+          <w:rFonts w:cs="Times New Roman"/>
+          <w:i/>
+        </w:rPr>
+        <w:t>Introduction to Mediation, Moderation, and Conditional Process Analysis: A Regression-Based Approach</w:t>
+      </w:r>
+      <w:r>
+        <w:rPr>
+          <w:rFonts w:cs="Times New Roman"/>
+        </w:rPr>
+        <w:t>. The Guilford Press, New York, 2nd edition.</w:t>
       </w:r>
       <w:bookmarkEnd w:id="141"/>
     </w:p>
@@ -32102,20 +31693,20 @@
         <w:rPr>
           <w:rFonts w:cs="Times New Roman"/>
         </w:rPr>
-        <w:t xml:space="preserve">Katauke, T., Fukuda, S., Khan, M. S. R., and Kadoya, Y. (2023). Financial literacy and impulsivity: Evidence from Japan. </w:t>
-      </w:r>
-      <w:r>
-        <w:rPr>
-          <w:rFonts w:cs="Times New Roman"/>
-          <w:i/>
-        </w:rPr>
-        <w:t>Sustainability</w:t>
-      </w:r>
-      <w:r>
-        <w:rPr>
-          <w:rFonts w:cs="Times New Roman"/>
-        </w:rPr>
-        <w:t>, 15(9):7267.</w:t>
+        <w:t xml:space="preserve">Huo, C., Wang, X., Sadiq, M. W., and Pang, M. (2023). Exploring factors affecting consumer's impulse buying behavior in live-streaming shopping: An interactive research based upon SOR model. </w:t>
+      </w:r>
+      <w:r>
+        <w:rPr>
+          <w:rFonts w:cs="Times New Roman"/>
+          <w:i/>
+        </w:rPr>
+        <w:t>SAGE Open</w:t>
+      </w:r>
+      <w:r>
+        <w:rPr>
+          <w:rFonts w:cs="Times New Roman"/>
+        </w:rPr>
+        <w:t>, 13(2):1–15.</w:t>
       </w:r>
       <w:bookmarkEnd w:id="142"/>
     </w:p>
@@ -32130,20 +31721,20 @@
         <w:rPr>
           <w:rFonts w:cs="Times New Roman"/>
         </w:rPr>
-        <w:t xml:space="preserve">Keynes, J. M. (1936). </w:t>
-      </w:r>
-      <w:r>
-        <w:rPr>
-          <w:rFonts w:cs="Times New Roman"/>
-          <w:i/>
-        </w:rPr>
-        <w:t>The General Theory of Employment, Interest and Money</w:t>
-      </w:r>
-      <w:r>
-        <w:rPr>
-          <w:rFonts w:cs="Times New Roman"/>
-        </w:rPr>
-        <w:t>. Macmillan, London.</w:t>
+        <w:t xml:space="preserve">Iyer, G. R., Blut, M., Xiao, S. H., and Grewal, D. (2020). Impulse buying: A meta-analytic review. </w:t>
+      </w:r>
+      <w:r>
+        <w:rPr>
+          <w:rFonts w:cs="Times New Roman"/>
+          <w:i/>
+        </w:rPr>
+        <w:t>Journal of the Academy of Marketing Science</w:t>
+      </w:r>
+      <w:r>
+        <w:rPr>
+          <w:rFonts w:cs="Times New Roman"/>
+        </w:rPr>
+        <w:t>, 48(3):384–404. Meta-analisis 231 sampel, 75.000+ konsumen dari 186 artikel; pengganti chen1998financial.</w:t>
       </w:r>
       <w:bookmarkEnd w:id="143"/>
     </w:p>
@@ -32158,20 +31749,20 @@
         <w:rPr>
           <w:rFonts w:cs="Times New Roman"/>
         </w:rPr>
-        <w:t xml:space="preserve">Lienardy, G. V. and Panasea, I. G. N. O. (2026). The role of self-control in moderating the influence of shopping lifestyle and hedonistic behavior on impulsive buying. </w:t>
-      </w:r>
-      <w:r>
-        <w:rPr>
-          <w:rFonts w:cs="Times New Roman"/>
-          <w:i/>
-        </w:rPr>
-        <w:t>Business and Investment Review</w:t>
-      </w:r>
-      <w:r>
-        <w:rPr>
-          <w:rFonts w:cs="Times New Roman"/>
-        </w:rPr>
-        <w:t>, 4(3).</w:t>
+        <w:t xml:space="preserve">Katauke, T., Fukuda, S., Khan, M. S. R., and Kadoya, Y. (2023). Financial literacy and impulsivity: Evidence from Japan. </w:t>
+      </w:r>
+      <w:r>
+        <w:rPr>
+          <w:rFonts w:cs="Times New Roman"/>
+          <w:i/>
+        </w:rPr>
+        <w:t>Sustainability</w:t>
+      </w:r>
+      <w:r>
+        <w:rPr>
+          <w:rFonts w:cs="Times New Roman"/>
+        </w:rPr>
+        <w:t>, 15(9):7267.</w:t>
       </w:r>
       <w:bookmarkEnd w:id="144"/>
     </w:p>
@@ -32186,20 +31777,20 @@
         <w:rPr>
           <w:rFonts w:cs="Times New Roman"/>
         </w:rPr>
-        <w:t xml:space="preserve">Mehrabian, A. and Russell, J. A. (1974). </w:t>
-      </w:r>
-      <w:r>
-        <w:rPr>
-          <w:rFonts w:cs="Times New Roman"/>
-          <w:i/>
-        </w:rPr>
-        <w:t>An Approach to Environmental Psychology</w:t>
-      </w:r>
-      <w:r>
-        <w:rPr>
-          <w:rFonts w:cs="Times New Roman"/>
-        </w:rPr>
-        <w:t>. MIT Press, Cambridge, MA.</w:t>
+        <w:t xml:space="preserve">Keynes, J. M. (1936). </w:t>
+      </w:r>
+      <w:r>
+        <w:rPr>
+          <w:rFonts w:cs="Times New Roman"/>
+          <w:i/>
+        </w:rPr>
+        <w:t>The General Theory of Employment, Interest and Money</w:t>
+      </w:r>
+      <w:r>
+        <w:rPr>
+          <w:rFonts w:cs="Times New Roman"/>
+        </w:rPr>
+        <w:t>. Macmillan, London.</w:t>
       </w:r>
       <w:bookmarkEnd w:id="145"/>
     </w:p>
@@ -32214,20 +31805,20 @@
         <w:rPr>
           <w:rFonts w:cs="Times New Roman"/>
         </w:rPr>
-        <w:t xml:space="preserve">Pranggabayu, B. and Andjarwati, A. L. (2022). Pengaruh hedonic shopping motivation dan store atmosphere terhadap impulsive buying. </w:t>
-      </w:r>
-      <w:r>
-        <w:rPr>
-          <w:rFonts w:cs="Times New Roman"/>
-          <w:i/>
-        </w:rPr>
-        <w:t>Sibatik Journal</w:t>
-      </w:r>
-      <w:r>
-        <w:rPr>
-          <w:rFonts w:cs="Times New Roman"/>
-        </w:rPr>
-        <w:t>, 1(6):951–966.</w:t>
+        <w:t xml:space="preserve">Lienardy, G. V. and Panasea, I. G. N. O. (2026). The role of self-control in moderating the influence of shopping lifestyle and hedonistic behavior on impulsive buying. </w:t>
+      </w:r>
+      <w:r>
+        <w:rPr>
+          <w:rFonts w:cs="Times New Roman"/>
+          <w:i/>
+        </w:rPr>
+        <w:t>Business and Investment Review</w:t>
+      </w:r>
+      <w:r>
+        <w:rPr>
+          <w:rFonts w:cs="Times New Roman"/>
+        </w:rPr>
+        <w:t>, 4(3).</w:t>
       </w:r>
       <w:bookmarkEnd w:id="146"/>
     </w:p>
@@ -32238,6 +31829,62 @@
         <w:jc w:val="both"/>
       </w:pPr>
       <w:bookmarkStart w:id="147" w:name="Ref_pricecharting2024"/>
+      <w:r>
+        <w:rPr>
+          <w:rFonts w:cs="Times New Roman"/>
+        </w:rPr>
+        <w:t xml:space="preserve">Mariyana, Djawoto, and Suhermin (2023). The influence of hedonic shopping motivation and shopping lifestyle on impulse buying through positive emotion in e-commerce. </w:t>
+      </w:r>
+      <w:r>
+        <w:rPr>
+          <w:rFonts w:cs="Times New Roman"/>
+          <w:i/>
+        </w:rPr>
+        <w:t>Jurnal Manajemen dan Bisnis (MABIS)</w:t>
+      </w:r>
+      <w:r>
+        <w:rPr>
+          <w:rFonts w:cs="Times New Roman"/>
+        </w:rPr>
+        <w:t>, 22(2):25–39.</w:t>
+      </w:r>
+      <w:bookmarkEnd w:id="147"/>
+    </w:p>
+    <w:p>
+      <w:pPr>
+        <w:spacing w:after="120"/>
+        <w:ind w:left="709" w:hanging="709"/>
+        <w:jc w:val="both"/>
+      </w:pPr>
+      <w:bookmarkStart w:id="148" w:name="Ref_qu2023impulse"/>
+      <w:r>
+        <w:rPr>
+          <w:rFonts w:cs="Times New Roman"/>
+        </w:rPr>
+        <w:t xml:space="preserve">Pranggabayu, B. and Andjarwati, A. L. (2022). Pengaruh hedonic shopping motivation dan store atmosphere terhadap impulsive buying. </w:t>
+      </w:r>
+      <w:r>
+        <w:rPr>
+          <w:rFonts w:cs="Times New Roman"/>
+          <w:i/>
+        </w:rPr>
+        <w:t>Sibatik Journal</w:t>
+      </w:r>
+      <w:r>
+        <w:rPr>
+          <w:rFonts w:cs="Times New Roman"/>
+        </w:rPr>
+        <w:t>, 1(6):951–966.</w:t>
+      </w:r>
+      <w:bookmarkEnd w:id="148"/>
+    </w:p>
+    <w:p>
+      <w:pPr>
+        <w:spacing w:after="120"/>
+        <w:ind w:left="709" w:hanging="709"/>
+        <w:jc w:val="both"/>
+      </w:pPr>
+      <w:bookmarkStart w:id="149" w:name="Ref_rook1987buying"/>
       <w:r>
         <w:rPr>
           <w:rFonts w:cs="Times New Roman"/>
@@ -32265,7 +31912,7 @@
         </w:rPr>
         <w:t xml:space="preserve"> (Diakses 18 September 2026).</w:t>
       </w:r>
-      <w:bookmarkEnd w:id="147"/>
+      <w:bookmarkEnd w:id="149"/>
     </w:p>
     <w:p>
       <w:pPr>
@@ -32273,27 +31920,27 @@
         <w:ind w:left="709" w:hanging="709"/>
         <w:jc w:val="both"/>
       </w:pPr>
-      <w:bookmarkStart w:id="148" w:name="Ref_qu2023impulse"/>
-      <w:r>
-        <w:rPr>
-          <w:rFonts w:cs="Times New Roman"/>
-        </w:rPr>
-        <w:t xml:space="preserve">Qu, Y., Khan, J., Su, Y., Tong, J., and Zhao, S. (2023). Impulse buying tendency in live-stream commerce: The role of viewing frequency and anticipated emotions influencing scarcity-induced purchase decision. </w:t>
-      </w:r>
-      <w:r>
-        <w:rPr>
-          <w:rFonts w:cs="Times New Roman"/>
-          <w:i/>
-        </w:rPr>
-        <w:t>Journal of Retailing and Consumer Services</w:t>
-      </w:r>
-      <w:r>
-        <w:rPr>
-          <w:rFonts w:cs="Times New Roman"/>
-        </w:rPr>
-        <w:t>, 75:103534. Faktor situasional kelangkaan dan stimulus emosional terhadap impulse buying; pengganti peck2006if.</w:t>
-      </w:r>
-      <w:bookmarkEnd w:id="148"/>
+      <w:bookmarkStart w:id="150" w:name="Ref_rook1995normative"/>
+      <w:r>
+        <w:rPr>
+          <w:rFonts w:cs="Times New Roman"/>
+        </w:rPr>
+        <w:t xml:space="preserve">Prihatiningrum, Y. and Said, L. R. (2021). The effect of imprudence, self-indulgence, and lack of self-control on male shoppers' impulse buying behavior: A case in Indonesia. </w:t>
+      </w:r>
+      <w:r>
+        <w:rPr>
+          <w:rFonts w:cs="Times New Roman"/>
+          <w:i/>
+        </w:rPr>
+        <w:t>Advances in Economics, Business and Management Research</w:t>
+      </w:r>
+      <w:r>
+        <w:rPr>
+          <w:rFonts w:cs="Times New Roman"/>
+        </w:rPr>
+        <w:t>, 193:76–82.</w:t>
+      </w:r>
+      <w:bookmarkEnd w:id="150"/>
     </w:p>
     <w:p>
       <w:pPr>
@@ -32301,27 +31948,28 @@
         <w:ind w:left="709" w:hanging="709"/>
         <w:jc w:val="both"/>
       </w:pPr>
-      <w:bookmarkStart w:id="149" w:name="Ref_rook1987buying"/>
-      <w:r>
-        <w:rPr>
-          <w:rFonts w:cs="Times New Roman"/>
-        </w:rPr>
-        <w:t xml:space="preserve">Rook, D. W. (1987). The buying impulse. </w:t>
-      </w:r>
-      <w:r>
-        <w:rPr>
-          <w:rFonts w:cs="Times New Roman"/>
-          <w:i/>
-        </w:rPr>
-        <w:t>Journal of Consumer Research</w:t>
-      </w:r>
-      <w:r>
-        <w:rPr>
-          <w:rFonts w:cs="Times New Roman"/>
-        </w:rPr>
-        <w:t>, 14(2):189–199.</w:t>
-      </w:r>
-      <w:bookmarkEnd w:id="149"/>
+      <w:bookmarkStart w:id="151" w:name="Ref_sekaran2016research"/>
+      <w:r>
+        <w:rPr>
+          <w:rFonts w:cs="Times New Roman"/>
+        </w:rPr>
+        <w:lastRenderedPageBreak/>
+        <w:t xml:space="preserve">Qu, Y., Khan, J., Su, Y., Tong, J., and Zhao, S. (2023). Impulse buying tendency in live-stream commerce: The role of viewing frequency and anticipated emotions influencing scarcity-induced purchase decision. </w:t>
+      </w:r>
+      <w:r>
+        <w:rPr>
+          <w:rFonts w:cs="Times New Roman"/>
+          <w:i/>
+        </w:rPr>
+        <w:t>Journal of Retailing and Consumer Services</w:t>
+      </w:r>
+      <w:r>
+        <w:rPr>
+          <w:rFonts w:cs="Times New Roman"/>
+        </w:rPr>
+        <w:t>, 75:103534. Faktor situasional kelangkaan dan stimulus emosional terhadap impulse buying; pengganti peck2006if.</w:t>
+      </w:r>
+      <w:bookmarkEnd w:id="151"/>
     </w:p>
     <w:p>
       <w:pPr>
@@ -32329,27 +31977,27 @@
         <w:ind w:left="709" w:hanging="709"/>
         <w:jc w:val="both"/>
       </w:pPr>
-      <w:bookmarkStart w:id="150" w:name="Ref_rook1995normative"/>
-      <w:r>
-        <w:rPr>
-          <w:rFonts w:cs="Times New Roman"/>
-        </w:rPr>
-        <w:t xml:space="preserve">Rook, D. W. and Fisher, R. J. (1995). Normative influences on impulsive buying behavior. </w:t>
-      </w:r>
-      <w:r>
-        <w:rPr>
-          <w:rFonts w:cs="Times New Roman"/>
-          <w:i/>
-        </w:rPr>
-        <w:t>Journal of Consumer Research</w:t>
-      </w:r>
-      <w:r>
-        <w:rPr>
-          <w:rFonts w:cs="Times New Roman"/>
-        </w:rPr>
-        <w:t>, 22(3):305–313.</w:t>
-      </w:r>
-      <w:bookmarkEnd w:id="150"/>
+      <w:bookmarkStart w:id="152" w:name="Ref_shiller2000irrational"/>
+      <w:r>
+        <w:rPr>
+          <w:rFonts w:cs="Times New Roman"/>
+        </w:rPr>
+        <w:t xml:space="preserve">Rafael, D. N. and Lopes, E. L. (2023). Ego depletion in consumer behavior: A review, synthesis, and research agenda. </w:t>
+      </w:r>
+      <w:r>
+        <w:rPr>
+          <w:rFonts w:cs="Times New Roman"/>
+          <w:i/>
+        </w:rPr>
+        <w:t>Journal of Consumer Behaviour</w:t>
+      </w:r>
+      <w:r>
+        <w:rPr>
+          <w:rFonts w:cs="Times New Roman"/>
+        </w:rPr>
+        <w:t>, 22(3):755–781.</w:t>
+      </w:r>
+      <w:bookmarkEnd w:id="152"/>
     </w:p>
     <w:p>
       <w:pPr>
@@ -32357,27 +32005,27 @@
         <w:ind w:left="709" w:hanging="709"/>
         <w:jc w:val="both"/>
       </w:pPr>
-      <w:bookmarkStart w:id="151" w:name="Ref_sekaran2016research"/>
-      <w:r>
-        <w:rPr>
-          <w:rFonts w:cs="Times New Roman"/>
-        </w:rPr>
-        <w:t xml:space="preserve">Sekaran, U. and Bougie, R. (2016). </w:t>
-      </w:r>
-      <w:r>
-        <w:rPr>
-          <w:rFonts w:cs="Times New Roman"/>
-          <w:i/>
-        </w:rPr>
-        <w:t>Research Methods for Business: A Skill-Building Approach</w:t>
-      </w:r>
-      <w:r>
-        <w:rPr>
-          <w:rFonts w:cs="Times New Roman"/>
-        </w:rPr>
-        <w:t>. John Wiley &amp; Sons, Chichester, West Sussex, 7th edition.</w:t>
-      </w:r>
-      <w:bookmarkEnd w:id="151"/>
+      <w:bookmarkStart w:id="153" w:name="Ref_simon1955behavioral"/>
+      <w:r>
+        <w:rPr>
+          <w:rFonts w:cs="Times New Roman"/>
+        </w:rPr>
+        <w:t xml:space="preserve">Rook, D. W. (1987). The buying impulse. </w:t>
+      </w:r>
+      <w:r>
+        <w:rPr>
+          <w:rFonts w:cs="Times New Roman"/>
+          <w:i/>
+        </w:rPr>
+        <w:t>Journal of Consumer Research</w:t>
+      </w:r>
+      <w:r>
+        <w:rPr>
+          <w:rFonts w:cs="Times New Roman"/>
+        </w:rPr>
+        <w:t>, 14(2):189–199.</w:t>
+      </w:r>
+      <w:bookmarkEnd w:id="153"/>
     </w:p>
     <w:p>
       <w:pPr>
@@ -32385,27 +32033,27 @@
         <w:ind w:left="709" w:hanging="709"/>
         <w:jc w:val="both"/>
       </w:pPr>
-      <w:bookmarkStart w:id="152" w:name="Ref_shiller2000irrational"/>
-      <w:r>
-        <w:rPr>
-          <w:rFonts w:cs="Times New Roman"/>
-        </w:rPr>
-        <w:t xml:space="preserve">Shiller, R. J. (2000). </w:t>
-      </w:r>
-      <w:r>
-        <w:rPr>
-          <w:rFonts w:cs="Times New Roman"/>
-          <w:i/>
-        </w:rPr>
-        <w:t>Irrational Exuberance</w:t>
-      </w:r>
-      <w:r>
-        <w:rPr>
-          <w:rFonts w:cs="Times New Roman"/>
-        </w:rPr>
-        <w:t>. Princeton University Press, Princeton, NJ.</w:t>
-      </w:r>
-      <w:bookmarkEnd w:id="152"/>
+      <w:bookmarkStart w:id="154" w:name="Ref_statista2024pokemon"/>
+      <w:r>
+        <w:rPr>
+          <w:rFonts w:cs="Times New Roman"/>
+        </w:rPr>
+        <w:t xml:space="preserve">Sekaran, U. and Bougie, R. (2016). </w:t>
+      </w:r>
+      <w:r>
+        <w:rPr>
+          <w:rFonts w:cs="Times New Roman"/>
+          <w:i/>
+        </w:rPr>
+        <w:t>Research Methods for Business: A Skill-Building Approach</w:t>
+      </w:r>
+      <w:r>
+        <w:rPr>
+          <w:rFonts w:cs="Times New Roman"/>
+        </w:rPr>
+        <w:t>. John Wiley &amp; Sons, Chichester, West Sussex, 7th edition.</w:t>
+      </w:r>
+      <w:bookmarkEnd w:id="154"/>
     </w:p>
     <w:p>
       <w:pPr>
@@ -32413,28 +32061,27 @@
         <w:ind w:left="709" w:hanging="709"/>
         <w:jc w:val="both"/>
       </w:pPr>
-      <w:bookmarkStart w:id="153" w:name="Ref_simon1955behavioral"/>
-      <w:r>
-        <w:rPr>
-          <w:rFonts w:cs="Times New Roman"/>
-        </w:rPr>
-        <w:lastRenderedPageBreak/>
-        <w:t xml:space="preserve">Simon, H. A. (1955). A behavioral model of rational choice. </w:t>
-      </w:r>
-      <w:r>
-        <w:rPr>
-          <w:rFonts w:cs="Times New Roman"/>
-          <w:i/>
-        </w:rPr>
-        <w:t>The Quarterly Journal of Economics</w:t>
-      </w:r>
-      <w:r>
-        <w:rPr>
-          <w:rFonts w:cs="Times New Roman"/>
-        </w:rPr>
-        <w:t>, 69(1):99–118.</w:t>
-      </w:r>
-      <w:bookmarkEnd w:id="153"/>
+      <w:bookmarkStart w:id="155" w:name="Ref_stern1962significance"/>
+      <w:r>
+        <w:rPr>
+          <w:rFonts w:cs="Times New Roman"/>
+        </w:rPr>
+        <w:t xml:space="preserve">Shiller, R. J. (2000). </w:t>
+      </w:r>
+      <w:r>
+        <w:rPr>
+          <w:rFonts w:cs="Times New Roman"/>
+          <w:i/>
+        </w:rPr>
+        <w:t>Irrational Exuberance</w:t>
+      </w:r>
+      <w:r>
+        <w:rPr>
+          <w:rFonts w:cs="Times New Roman"/>
+        </w:rPr>
+        <w:t>. Princeton University Press, Princeton, NJ.</w:t>
+      </w:r>
+      <w:bookmarkEnd w:id="155"/>
     </w:p>
     <w:p>
       <w:pPr>
@@ -32442,7 +32089,35 @@
         <w:ind w:left="709" w:hanging="709"/>
         <w:jc w:val="both"/>
       </w:pPr>
-      <w:bookmarkStart w:id="154" w:name="Ref_statista2024pokemon"/>
+      <w:bookmarkStart w:id="156" w:name="Ref_sugiyono2019metode"/>
+      <w:r>
+        <w:rPr>
+          <w:rFonts w:cs="Times New Roman"/>
+        </w:rPr>
+        <w:t xml:space="preserve">Skwara, F. (2023). Effects of mental accounting on purchase decision processes: A systematic review and research agenda. </w:t>
+      </w:r>
+      <w:r>
+        <w:rPr>
+          <w:rFonts w:cs="Times New Roman"/>
+          <w:i/>
+        </w:rPr>
+        <w:t>Journal of Consumer Behaviour</w:t>
+      </w:r>
+      <w:r>
+        <w:rPr>
+          <w:rFonts w:cs="Times New Roman"/>
+        </w:rPr>
+        <w:t>, 22(5):1265–1281.</w:t>
+      </w:r>
+      <w:bookmarkEnd w:id="156"/>
+    </w:p>
+    <w:p>
+      <w:pPr>
+        <w:spacing w:after="120"/>
+        <w:ind w:left="709" w:hanging="709"/>
+        <w:jc w:val="both"/>
+      </w:pPr>
+      <w:bookmarkStart w:id="157" w:name="Ref_sultan2012building"/>
       <w:r>
         <w:rPr>
           <w:rFonts w:cs="Times New Roman"/>
@@ -32470,7 +32145,7 @@
         </w:rPr>
         <w:t xml:space="preserve"> (Diakses 18 September 2026).</w:t>
       </w:r>
-      <w:bookmarkEnd w:id="154"/>
+      <w:bookmarkEnd w:id="157"/>
     </w:p>
     <w:p>
       <w:pPr>
@@ -32478,27 +32153,27 @@
         <w:ind w:left="709" w:hanging="709"/>
         <w:jc w:val="both"/>
       </w:pPr>
-      <w:bookmarkStart w:id="155" w:name="Ref_stern1962significance"/>
-      <w:r>
-        <w:rPr>
-          <w:rFonts w:cs="Times New Roman"/>
-        </w:rPr>
-        <w:t xml:space="preserve">Stern, H. (1962). The significance of impulse buying today. </w:t>
-      </w:r>
-      <w:r>
-        <w:rPr>
-          <w:rFonts w:cs="Times New Roman"/>
-          <w:i/>
-        </w:rPr>
-        <w:t>Journal of Marketing</w:t>
-      </w:r>
-      <w:r>
-        <w:rPr>
-          <w:rFonts w:cs="Times New Roman"/>
-        </w:rPr>
-        <w:t>, 26(2):59–62.</w:t>
-      </w:r>
-      <w:bookmarkEnd w:id="155"/>
+      <w:bookmarkStart w:id="158" w:name="Ref_tangney2004high"/>
+      <w:r>
+        <w:rPr>
+          <w:rFonts w:cs="Times New Roman"/>
+        </w:rPr>
+        <w:t xml:space="preserve">Sugiyono (2019). </w:t>
+      </w:r>
+      <w:r>
+        <w:rPr>
+          <w:rFonts w:cs="Times New Roman"/>
+          <w:i/>
+        </w:rPr>
+        <w:t>Metode Penelitian Kuantitatif, Kualitatif, dan R&amp;D</w:t>
+      </w:r>
+      <w:r>
+        <w:rPr>
+          <w:rFonts w:cs="Times New Roman"/>
+        </w:rPr>
+        <w:t>. Alfabeta, Bandung.</w:t>
+      </w:r>
+      <w:bookmarkEnd w:id="158"/>
     </w:p>
     <w:p>
       <w:pPr>
@@ -32506,27 +32181,27 @@
         <w:ind w:left="709" w:hanging="709"/>
         <w:jc w:val="both"/>
       </w:pPr>
-      <w:bookmarkStart w:id="156" w:name="Ref_sugiyono2019metode"/>
-      <w:r>
-        <w:rPr>
-          <w:rFonts w:cs="Times New Roman"/>
-        </w:rPr>
-        <w:t xml:space="preserve">Sugiyono (2019). </w:t>
-      </w:r>
-      <w:r>
-        <w:rPr>
-          <w:rFonts w:cs="Times New Roman"/>
-          <w:i/>
-        </w:rPr>
-        <w:t>Metode Penelitian Kuantitatif, Kualitatif, dan R&amp;D</w:t>
-      </w:r>
-      <w:r>
-        <w:rPr>
-          <w:rFonts w:cs="Times New Roman"/>
-        </w:rPr>
-        <w:t>. Alfabeta, Bandung.</w:t>
-      </w:r>
-      <w:bookmarkEnd w:id="156"/>
+      <w:bookmarkStart w:id="159" w:name="Ref_thaler1985mental"/>
+      <w:r>
+        <w:rPr>
+          <w:rFonts w:cs="Times New Roman"/>
+        </w:rPr>
+        <w:t xml:space="preserve">Tangney, J. P., Baumeister, R. F., and Boone, A. L. (2004). High self-control predicts good adjustment, less pathology, better grades, and interpersonal success. </w:t>
+      </w:r>
+      <w:r>
+        <w:rPr>
+          <w:rFonts w:cs="Times New Roman"/>
+          <w:i/>
+        </w:rPr>
+        <w:t>Journal of Personality</w:t>
+      </w:r>
+      <w:r>
+        <w:rPr>
+          <w:rFonts w:cs="Times New Roman"/>
+        </w:rPr>
+        <w:t>, 72(2):271–324.</w:t>
+      </w:r>
+      <w:bookmarkEnd w:id="159"/>
     </w:p>
     <w:p>
       <w:pPr>
@@ -32534,119 +32209,7 @@
         <w:ind w:left="709" w:hanging="709"/>
         <w:jc w:val="both"/>
       </w:pPr>
-      <w:bookmarkStart w:id="157" w:name="Ref_sultan2012building"/>
-      <w:r>
-        <w:rPr>
-          <w:rFonts w:cs="Times New Roman"/>
-        </w:rPr>
-        <w:t xml:space="preserve">Sultan, A. J., Joireman, J., and Sprott, D. E. (2012). Building consumer self-control: The effect of self-control exercises on impulse buying urges. </w:t>
-      </w:r>
-      <w:r>
-        <w:rPr>
-          <w:rFonts w:cs="Times New Roman"/>
-          <w:i/>
-        </w:rPr>
-        <w:t>Marketing Letters</w:t>
-      </w:r>
-      <w:r>
-        <w:rPr>
-          <w:rFonts w:cs="Times New Roman"/>
-        </w:rPr>
-        <w:t>, 23(1):61–72.</w:t>
-      </w:r>
-      <w:bookmarkEnd w:id="157"/>
-    </w:p>
-    <w:p>
-      <w:pPr>
-        <w:spacing w:after="120"/>
-        <w:ind w:left="709" w:hanging="709"/>
-        <w:jc w:val="both"/>
-      </w:pPr>
-      <w:bookmarkStart w:id="158" w:name="Ref_tangney2004high"/>
-      <w:r>
-        <w:rPr>
-          <w:rFonts w:cs="Times New Roman"/>
-        </w:rPr>
-        <w:t xml:space="preserve">Tangney, J. P., Baumeister, R. F., and Boone, A. L. (2004). High self-control predicts good adjustment, less pathology, better grades, and interpersonal success. </w:t>
-      </w:r>
-      <w:r>
-        <w:rPr>
-          <w:rFonts w:cs="Times New Roman"/>
-          <w:i/>
-        </w:rPr>
-        <w:t>Journal of Personality</w:t>
-      </w:r>
-      <w:r>
-        <w:rPr>
-          <w:rFonts w:cs="Times New Roman"/>
-        </w:rPr>
-        <w:t>, 72(2):271–324.</w:t>
-      </w:r>
-      <w:bookmarkEnd w:id="158"/>
-    </w:p>
-    <w:p>
-      <w:pPr>
-        <w:spacing w:after="120"/>
-        <w:ind w:left="709" w:hanging="709"/>
-        <w:jc w:val="both"/>
-      </w:pPr>
-      <w:bookmarkStart w:id="159" w:name="Ref_thaler1985mental"/>
-      <w:r>
-        <w:rPr>
-          <w:rFonts w:cs="Times New Roman"/>
-        </w:rPr>
-        <w:t xml:space="preserve">Thaler, R. (1985). Mental accounting and consumer choice. </w:t>
-      </w:r>
-      <w:r>
-        <w:rPr>
-          <w:rFonts w:cs="Times New Roman"/>
-          <w:i/>
-        </w:rPr>
-        <w:t>Marketing Science</w:t>
-      </w:r>
-      <w:r>
-        <w:rPr>
-          <w:rFonts w:cs="Times New Roman"/>
-        </w:rPr>
-        <w:t>, 4(3):199–214.</w:t>
-      </w:r>
-      <w:bookmarkEnd w:id="159"/>
-    </w:p>
-    <w:p>
-      <w:pPr>
-        <w:spacing w:after="120"/>
-        <w:ind w:left="709" w:hanging="709"/>
-        <w:jc w:val="both"/>
-      </w:pPr>
       <w:bookmarkStart w:id="160" w:name="Ref_thaler1981economic"/>
-      <w:r>
-        <w:rPr>
-          <w:rFonts w:cs="Times New Roman"/>
-        </w:rPr>
-        <w:t xml:space="preserve">Thaler, R. H. and Shefrin, H. M. (1981). An economic theory of self-control. </w:t>
-      </w:r>
-      <w:r>
-        <w:rPr>
-          <w:rFonts w:cs="Times New Roman"/>
-          <w:i/>
-        </w:rPr>
-        <w:t>Journal of Political Economy</w:t>
-      </w:r>
-      <w:r>
-        <w:rPr>
-          <w:rFonts w:cs="Times New Roman"/>
-        </w:rPr>
-        <w:t>, 89(2):392–406.</w:t>
-      </w:r>
-      <w:bookmarkEnd w:id="160"/>
-    </w:p>
-    <w:p>
-      <w:pPr>
-        <w:spacing w:after="120"/>
-        <w:ind w:left="709" w:hanging="709"/>
-        <w:jc w:val="both"/>
-      </w:pPr>
-      <w:bookmarkStart w:id="161" w:name="Ref_pokemoncompany2024"/>
       <w:r>
         <w:rPr>
           <w:rFonts w:cs="Times New Roman"/>
@@ -32674,6 +32237,34 @@
         </w:rPr>
         <w:t xml:space="preserve"> (Diakses 15 Januari 2025).</w:t>
       </w:r>
+      <w:bookmarkEnd w:id="160"/>
+    </w:p>
+    <w:p>
+      <w:pPr>
+        <w:spacing w:after="120"/>
+        <w:ind w:left="709" w:hanging="709"/>
+        <w:jc w:val="both"/>
+      </w:pPr>
+      <w:bookmarkStart w:id="161" w:name="Ref_pokemoncompany2024"/>
+      <w:r>
+        <w:rPr>
+          <w:rFonts w:cs="Times New Roman"/>
+        </w:rPr>
+        <w:t xml:space="preserve">Tirtayasa, S., Nevianda, M., and Syahrial, H. (2020). The effect of hedonic shopping motivation, shopping lifestyle and fashion involvement with impulse buying. </w:t>
+      </w:r>
+      <w:r>
+        <w:rPr>
+          <w:rFonts w:cs="Times New Roman"/>
+          <w:i/>
+        </w:rPr>
+        <w:t>International Journal of Business Economics</w:t>
+      </w:r>
+      <w:r>
+        <w:rPr>
+          <w:rFonts w:cs="Times New Roman"/>
+        </w:rPr>
+        <w:t>, 2(1):18–28.</w:t>
+      </w:r>
       <w:bookmarkEnd w:id="161"/>
     </w:p>
     <w:p>
@@ -32687,20 +32278,21 @@
         <w:rPr>
           <w:rFonts w:cs="Times New Roman"/>
         </w:rPr>
-        <w:t xml:space="preserve">Tirtayasa, S., Nevianda, M., and Syahrial, H. (2020). The effect of hedonic shopping motivation, shopping lifestyle and fashion involvement with impulse buying. </w:t>
-      </w:r>
-      <w:r>
-        <w:rPr>
-          <w:rFonts w:cs="Times New Roman"/>
-          <w:i/>
-        </w:rPr>
-        <w:t>International Journal of Business Economics</w:t>
-      </w:r>
-      <w:r>
-        <w:rPr>
-          <w:rFonts w:cs="Times New Roman"/>
-        </w:rPr>
-        <w:t>, 2(1):18–28.</w:t>
+        <w:lastRenderedPageBreak/>
+        <w:t xml:space="preserve">Verplanken, B. and Herabadi, A. (2001). Individual differences in impulse buying tendency: Feeling and no thinking. </w:t>
+      </w:r>
+      <w:r>
+        <w:rPr>
+          <w:rFonts w:cs="Times New Roman"/>
+          <w:i/>
+        </w:rPr>
+        <w:t>European Journal of Personality</w:t>
+      </w:r>
+      <w:r>
+        <w:rPr>
+          <w:rFonts w:cs="Times New Roman"/>
+        </w:rPr>
+        <w:t>, 15(S1):S71–S83.</w:t>
       </w:r>
       <w:bookmarkEnd w:id="162"/>
     </w:p>
@@ -32715,20 +32307,20 @@
         <w:rPr>
           <w:rFonts w:cs="Times New Roman"/>
         </w:rPr>
-        <w:t xml:space="preserve">Verplanken, B. and Herabadi, A. (2001). Individual differences in impulse buying tendency: Feeling and no thinking. </w:t>
-      </w:r>
-      <w:r>
-        <w:rPr>
-          <w:rFonts w:cs="Times New Roman"/>
-          <w:i/>
-        </w:rPr>
-        <w:t>European Journal of Personality</w:t>
-      </w:r>
-      <w:r>
-        <w:rPr>
-          <w:rFonts w:cs="Times New Roman"/>
-        </w:rPr>
-        <w:t>, 15(S1):S71–S83.</w:t>
+        <w:t xml:space="preserve">Widyastuti, N. A. and Hariasih, M. (2024). The power of hedonic motivation and discounts through releasing impulse buying in Indonesia. </w:t>
+      </w:r>
+      <w:r>
+        <w:rPr>
+          <w:rFonts w:cs="Times New Roman"/>
+          <w:i/>
+        </w:rPr>
+        <w:t>Indonesian Journal of Law and Economics Review</w:t>
+      </w:r>
+      <w:r>
+        <w:rPr>
+          <w:rFonts w:cs="Times New Roman"/>
+        </w:rPr>
+        <w:t>, 19(2):1104.</w:t>
       </w:r>
       <w:bookmarkEnd w:id="163"/>
     </w:p>
@@ -32743,20 +32335,20 @@
         <w:rPr>
           <w:rFonts w:cs="Times New Roman"/>
         </w:rPr>
-        <w:t xml:space="preserve">Vohs, K. D. and Faber, R. J. (2007). Spent resources: Self-regulatory resource depletion and impulsive buying. </w:t>
-      </w:r>
-      <w:r>
-        <w:rPr>
-          <w:rFonts w:cs="Times New Roman"/>
-          <w:i/>
-        </w:rPr>
-        <w:t>Journal of Consumer Research</w:t>
-      </w:r>
-      <w:r>
-        <w:rPr>
-          <w:rFonts w:cs="Times New Roman"/>
-        </w:rPr>
-        <w:t>, 33(4):537–547.</w:t>
+        <w:t xml:space="preserve">Zeigarnik, B. (1927). Ueber das Behalten von erledigten und unerledigten Handlungen. </w:t>
+      </w:r>
+      <w:r>
+        <w:rPr>
+          <w:rFonts w:cs="Times New Roman"/>
+          <w:i/>
+        </w:rPr>
+        <w:t>Psychologische Forschung</w:t>
+      </w:r>
+      <w:r>
+        <w:rPr>
+          <w:rFonts w:cs="Times New Roman"/>
+        </w:rPr>
+        <w:t>, 9:1–85.</w:t>
       </w:r>
       <w:bookmarkEnd w:id="164"/>
     </w:p>
@@ -32771,20 +32363,20 @@
         <w:rPr>
           <w:rFonts w:cs="Times New Roman"/>
         </w:rPr>
-        <w:t xml:space="preserve">Zeigarnik, B. (1927). Ueber das Behalten von erledigten und unerledigten Handlungen. </w:t>
-      </w:r>
-      <w:r>
-        <w:rPr>
-          <w:rFonts w:cs="Times New Roman"/>
-          <w:i/>
-        </w:rPr>
-        <w:t>Psychologische Forschung</w:t>
-      </w:r>
-      <w:r>
-        <w:rPr>
-          <w:rFonts w:cs="Times New Roman"/>
-        </w:rPr>
-        <w:t>, 9:1–85.</w:t>
+        <w:t xml:space="preserve">Zhang, Y. and Zhang, T. (2022). The effect of blind box product uncertainty on consumers' purchase intention: The mediating role of perceived value and the moderating role of purchase intention. </w:t>
+      </w:r>
+      <w:r>
+        <w:rPr>
+          <w:rFonts w:cs="Times New Roman"/>
+          <w:i/>
+        </w:rPr>
+        <w:t>Frontiers in Psychology</w:t>
+      </w:r>
+      <w:r>
+        <w:rPr>
+          <w:rFonts w:cs="Times New Roman"/>
+        </w:rPr>
+        <w:t>, 13:946527. Ketidakpastian produk blind-box dan evaluasi nilai konsumen; pengganti long2000consuming.</w:t>
       </w:r>
       <w:bookmarkEnd w:id="165"/>
     </w:p>
@@ -32799,21 +32391,20 @@
         <w:rPr>
           <w:rFonts w:cs="Times New Roman"/>
         </w:rPr>
-        <w:lastRenderedPageBreak/>
-        <w:t xml:space="preserve">Zhang, Y. and Zhang, T. (2022). The effect of blind box product uncertainty on consumers' purchase intention: The mediating role of perceived value and the moderating role of purchase intention. </w:t>
-      </w:r>
-      <w:r>
-        <w:rPr>
-          <w:rFonts w:cs="Times New Roman"/>
-          <w:i/>
-        </w:rPr>
-        <w:t>Frontiers in Psychology</w:t>
-      </w:r>
-      <w:r>
-        <w:rPr>
-          <w:rFonts w:cs="Times New Roman"/>
-        </w:rPr>
-        <w:t>, 13:946527. Ketidakpastian produk blind-box dan evaluasi nilai konsumen; pengganti long2000consuming.</w:t>
+        <w:t xml:space="preserve">Zhao, G., Liu, X., Tan, H., and Yang, S. (2025). The effect of self-control on impulsive consumption with the moderators of family socioeconomic status and peer feedback. </w:t>
+      </w:r>
+      <w:r>
+        <w:rPr>
+          <w:rFonts w:cs="Times New Roman"/>
+          <w:i/>
+        </w:rPr>
+        <w:t>Asian Journal of Social Psychology</w:t>
+      </w:r>
+      <w:r>
+        <w:rPr>
+          <w:rFonts w:cs="Times New Roman"/>
+        </w:rPr>
+        <w:t>, 28(1):e12663.</w:t>
       </w:r>
       <w:bookmarkEnd w:id="166"/>
     </w:p>
@@ -33188,31 +32779,31 @@
       </w:rPr>
     </w:lvl>
   </w:abstractNum>
-  <w:num w:numId="1" w16cid:durableId="930819346">
+  <w:num w:numId="1" w16cid:durableId="51539195">
     <w:abstractNumId w:val="8"/>
   </w:num>
-  <w:num w:numId="2" w16cid:durableId="710879080">
+  <w:num w:numId="2" w16cid:durableId="1201479954">
     <w:abstractNumId w:val="6"/>
   </w:num>
-  <w:num w:numId="3" w16cid:durableId="32048888">
+  <w:num w:numId="3" w16cid:durableId="1549873776">
     <w:abstractNumId w:val="5"/>
   </w:num>
-  <w:num w:numId="4" w16cid:durableId="1547985379">
+  <w:num w:numId="4" w16cid:durableId="579876151">
     <w:abstractNumId w:val="4"/>
   </w:num>
-  <w:num w:numId="5" w16cid:durableId="1185707245">
+  <w:num w:numId="5" w16cid:durableId="1176648745">
     <w:abstractNumId w:val="7"/>
   </w:num>
-  <w:num w:numId="6" w16cid:durableId="245917960">
+  <w:num w:numId="6" w16cid:durableId="2026247626">
     <w:abstractNumId w:val="3"/>
   </w:num>
-  <w:num w:numId="7" w16cid:durableId="611279491">
+  <w:num w:numId="7" w16cid:durableId="529729775">
     <w:abstractNumId w:val="2"/>
   </w:num>
-  <w:num w:numId="8" w16cid:durableId="2062051294">
+  <w:num w:numId="8" w16cid:durableId="2086031223">
     <w:abstractNumId w:val="1"/>
   </w:num>
-  <w:num w:numId="9" w16cid:durableId="2023848937">
+  <w:num w:numId="9" w16cid:durableId="1055590053">
     <w:abstractNumId w:val="0"/>
   </w:num>
 </w:numbering>
@@ -44653,7 +44244,7 @@
     <w:autoRedefine/>
     <w:uiPriority w:val="39"/>
     <w:unhideWhenUsed/>
-    <w:rsid w:val="00622F76"/>
+    <w:rsid w:val="007E784D"/>
     <w:pPr>
       <w:spacing w:after="40" w:line="240" w:lineRule="auto"/>
     </w:pPr>
@@ -44669,7 +44260,7 @@
     <w:autoRedefine/>
     <w:uiPriority w:val="39"/>
     <w:unhideWhenUsed/>
-    <w:rsid w:val="00622F76"/>
+    <w:rsid w:val="007E784D"/>
     <w:pPr>
       <w:spacing w:after="40" w:line="240" w:lineRule="auto"/>
       <w:ind w:left="360"/>
@@ -44685,7 +44276,7 @@
     <w:autoRedefine/>
     <w:uiPriority w:val="39"/>
     <w:unhideWhenUsed/>
-    <w:rsid w:val="00622F76"/>
+    <w:rsid w:val="007E784D"/>
     <w:pPr>
       <w:spacing w:after="40" w:line="240" w:lineRule="auto"/>
       <w:ind w:left="720"/>
@@ -44700,7 +44291,7 @@
     <w:basedOn w:val="DefaultParagraphFont"/>
     <w:uiPriority w:val="99"/>
     <w:unhideWhenUsed/>
-    <w:rsid w:val="00622F76"/>
+    <w:rsid w:val="007E784D"/>
     <w:rPr>
       <w:color w:val="0000FF" w:themeColor="hyperlink"/>
       <w:u w:val="single"/>

</xml_diff>

<commit_message>
fix(literature): selaraskan 4 referensi Gold OA (Lubis, Nyrhinen, Rafael-ReMark, Jain) dan amankan 14 fisik PDF full-text
</commit_message>
<xml_diff>
--- a/01_Naskah_Utama/Proposal_Arthur_PokemonTCG.docx
+++ b/01_Naskah_Utama/Proposal_Arthur_PokemonTCG.docx
@@ -12,7 +12,7 @@
           <w:noProof/>
         </w:rPr>
         <w:drawing>
-          <wp:inline distT="0" distB="0" distL="0" distR="0" wp14:anchorId="2F0E4D5A" wp14:editId="52BA4A24">
+          <wp:inline distT="0" distB="0" distL="0" distR="0" wp14:anchorId="48340962" wp14:editId="0F58CC1F">
             <wp:extent cx="1152000" cy="1152000"/>
             <wp:effectExtent l="0" t="0" r="0" b="0"/>
             <wp:docPr id="1" name="Picture 1"/>
@@ -275,7 +275,7 @@
         <w:outlineLvl w:val="0"/>
       </w:pPr>
       <w:bookmarkStart w:id="0" w:name="TOC_PERNYATAAN_KEASLIAN_KARYA_TUGAS_AKHI"/>
-      <w:bookmarkStart w:id="1" w:name="_Toc243076512"/>
+      <w:bookmarkStart w:id="1" w:name="_Toc243083002"/>
       <w:r>
         <w:rPr>
           <w:rFonts w:ascii="Times New Roman" w:hAnsi="Times New Roman"/>
@@ -847,7 +847,7 @@
         <w:outlineLvl w:val="0"/>
       </w:pPr>
       <w:bookmarkStart w:id="2" w:name="TOC_HALAMAN_PERSETUJUAN_PROPOSAL_SKRIPSI"/>
-      <w:bookmarkStart w:id="3" w:name="_Toc243076513"/>
+      <w:bookmarkStart w:id="3" w:name="_Toc243083003"/>
       <w:r>
         <w:rPr>
           <w:rFonts w:ascii="Times New Roman" w:hAnsi="Times New Roman"/>
@@ -1405,7 +1405,7 @@
         <w:outlineLvl w:val="0"/>
       </w:pPr>
       <w:bookmarkStart w:id="4" w:name="TOC_HALAMAN_PENGESAHAN_TIM_PENGUJI_SEMIN"/>
-      <w:bookmarkStart w:id="5" w:name="_Toc243076514"/>
+      <w:bookmarkStart w:id="5" w:name="_Toc243083004"/>
       <w:r>
         <w:rPr>
           <w:rFonts w:ascii="Times New Roman" w:hAnsi="Times New Roman"/>
@@ -1763,7 +1763,7 @@
         <w:outlineLvl w:val="0"/>
       </w:pPr>
       <w:bookmarkStart w:id="6" w:name="TOC_KATA_PENGANTAR"/>
-      <w:bookmarkStart w:id="7" w:name="_Toc243076515"/>
+      <w:bookmarkStart w:id="7" w:name="_Toc243083005"/>
       <w:r>
         <w:rPr>
           <w:rFonts w:ascii="Times New Roman" w:hAnsi="Times New Roman"/>
@@ -2054,7 +2054,7 @@
         <w:outlineLvl w:val="0"/>
       </w:pPr>
       <w:bookmarkStart w:id="8" w:name="TOC_ABSTRAK"/>
-      <w:bookmarkStart w:id="9" w:name="_Toc243076516"/>
+      <w:bookmarkStart w:id="9" w:name="_Toc243083006"/>
       <w:r>
         <w:rPr>
           <w:rFonts w:ascii="Times New Roman" w:hAnsi="Times New Roman"/>
@@ -2578,7 +2578,7 @@
         <w:outlineLvl w:val="0"/>
       </w:pPr>
       <w:bookmarkStart w:id="10" w:name="TOC_ABSTRACT"/>
-      <w:bookmarkStart w:id="11" w:name="_Toc243076517"/>
+      <w:bookmarkStart w:id="11" w:name="_Toc243083007"/>
       <w:r>
         <w:rPr>
           <w:rFonts w:ascii="Times New Roman" w:hAnsi="Times New Roman"/>
@@ -3001,7 +3001,7 @@
           <w14:ligatures w14:val="standardContextual"/>
         </w:rPr>
       </w:pPr>
-      <w:hyperlink w:anchor="_Toc243076518" w:history="1">
+      <w:hyperlink w:anchor="_Toc243083008" w:history="1">
         <w:r>
           <w:rPr>
             <w:noProof/>
@@ -4971,7 +4971,7 @@
         <w:spacing w:after="360"/>
         <w:outlineLvl w:val="0"/>
       </w:pPr>
-      <w:bookmarkStart w:id="13" w:name="_Toc243076518"/>
+      <w:bookmarkStart w:id="13" w:name="_Toc243083008"/>
       <w:r>
         <w:rPr>
           <w:rFonts w:ascii="Times New Roman" w:hAnsi="Times New Roman"/>
@@ -5136,7 +5136,7 @@
         <w:outlineLvl w:val="0"/>
       </w:pPr>
       <w:bookmarkStart w:id="14" w:name="TOC_DAFTAR_GAMBAR"/>
-      <w:bookmarkStart w:id="15" w:name="_Toc243076519"/>
+      <w:bookmarkStart w:id="15" w:name="_Toc243083009"/>
       <w:r>
         <w:rPr>
           <w:rFonts w:ascii="Times New Roman" w:hAnsi="Times New Roman"/>
@@ -5315,7 +5315,7 @@
         <w:outlineLvl w:val="0"/>
       </w:pPr>
       <w:bookmarkStart w:id="16" w:name="TOC_BAB_I_PENDAHULUAN"/>
-      <w:bookmarkStart w:id="17" w:name="_Toc243076520"/>
+      <w:bookmarkStart w:id="17" w:name="_Toc243083010"/>
       <w:r>
         <w:rPr>
           <w:rFonts w:ascii="Times New Roman" w:hAnsi="Times New Roman"/>
@@ -5366,7 +5366,7 @@
         <w:outlineLvl w:val="1"/>
       </w:pPr>
       <w:bookmarkStart w:id="18" w:name="TOC_1_1_LATAR_BELAKANG_PENELITIAN"/>
-      <w:bookmarkStart w:id="19" w:name="_Toc243076521"/>
+      <w:bookmarkStart w:id="19" w:name="_Toc243083011"/>
       <w:r>
         <w:rPr>
           <w:rFonts w:ascii="Times New Roman" w:hAnsi="Times New Roman"/>
@@ -5619,7 +5619,7 @@
         </w:rPr>
         <w:lastRenderedPageBreak/>
         <w:drawing>
-          <wp:inline distT="0" distB="0" distL="0" distR="0" wp14:anchorId="4FBB15C1" wp14:editId="573E5C50">
+          <wp:inline distT="0" distB="0" distL="0" distR="0" wp14:anchorId="5C9B7ABB" wp14:editId="53C03DFC">
             <wp:extent cx="4860000" cy="2980356"/>
             <wp:effectExtent l="0" t="0" r="0" b="0"/>
             <wp:docPr id="2" name="Picture 2"/>
@@ -5847,7 +5847,7 @@
         </w:rPr>
         <w:lastRenderedPageBreak/>
         <w:drawing>
-          <wp:inline distT="0" distB="0" distL="0" distR="0" wp14:anchorId="0E6842AE" wp14:editId="50D2C9FA">
+          <wp:inline distT="0" distB="0" distL="0" distR="0" wp14:anchorId="1116D586" wp14:editId="340A3B84">
             <wp:extent cx="4860000" cy="2719286"/>
             <wp:effectExtent l="0" t="0" r="0" b="0"/>
             <wp:docPr id="3" name="Picture 3"/>
@@ -6524,7 +6524,7 @@
           <w:noProof/>
         </w:rPr>
         <w:drawing>
-          <wp:inline distT="0" distB="0" distL="0" distR="0" wp14:anchorId="419B6193" wp14:editId="00FB1182">
+          <wp:inline distT="0" distB="0" distL="0" distR="0" wp14:anchorId="0799F586" wp14:editId="386CBC7E">
             <wp:extent cx="4860000" cy="2818800"/>
             <wp:effectExtent l="0" t="0" r="0" b="0"/>
             <wp:docPr id="4" name="Picture 4"/>
@@ -7161,7 +7161,7 @@
         <w:rPr>
           <w:rFonts w:cs="Times New Roman"/>
         </w:rPr>
-        <w:t xml:space="preserve">; Beikverdi </w:t>
+        <w:t xml:space="preserve">; Lubis </w:t>
       </w:r>
       <w:r>
         <w:rPr>
@@ -7174,7 +7174,7 @@
         <w:rPr>
           <w:rFonts w:cs="Times New Roman"/>
         </w:rPr>
-        <w:t xml:space="preserve">, 2024; </w:t>
+        <w:t xml:space="preserve">, 2022; </w:t>
       </w:r>
       <w:hyperlink w:anchor="Ref_iyer2020impulse" w:history="1">
         <w:r>
@@ -7201,7 +7201,20 @@
         <w:rPr>
           <w:rFonts w:cs="Times New Roman"/>
         </w:rPr>
-        <w:t xml:space="preserve">; Anoop and Rahman, 2025): (1) afektif, seperti motivasi belanja hedonis </w:t>
+        <w:t xml:space="preserve">; Nyrhinen </w:t>
+      </w:r>
+      <w:r>
+        <w:rPr>
+          <w:rFonts w:cs="Times New Roman"/>
+          <w:i/>
+        </w:rPr>
+        <w:t>et al.</w:t>
+      </w:r>
+      <w:r>
+        <w:rPr>
+          <w:rFonts w:cs="Times New Roman"/>
+        </w:rPr>
+        <w:t xml:space="preserve">, 2024): (1) afektif, seperti motivasi belanja hedonis </w:t>
       </w:r>
       <w:hyperlink w:anchor="Ref_babin1994work" w:history="1">
         <w:r>
@@ -7432,7 +7445,20 @@
         <w:rPr>
           <w:rFonts w:cs="Times New Roman"/>
         </w:rPr>
-        <w:t>; Anoop and Rahman, 2025).</w:t>
+        <w:t xml:space="preserve">; Nyrhinen </w:t>
+      </w:r>
+      <w:r>
+        <w:rPr>
+          <w:rFonts w:cs="Times New Roman"/>
+          <w:i/>
+        </w:rPr>
+        <w:t>et al.</w:t>
+      </w:r>
+      <w:r>
+        <w:rPr>
+          <w:rFonts w:cs="Times New Roman"/>
+        </w:rPr>
+        <w:t>, 2024).</w:t>
       </w:r>
     </w:p>
     <w:p>
@@ -7536,14 +7562,14 @@
         <w:rPr>
           <w:rFonts w:cs="Times New Roman"/>
         </w:rPr>
-        <w:t xml:space="preserve"> berwarna mencolok seharga Rp20.000. </w:t>
+        <w:t xml:space="preserve"> berwarna mencolok seharga Rp20.000. Baginya, membeli satu bungkus bukan sekadar membeli lima lembar kertas </w:t>
       </w:r>
       <w:r>
         <w:rPr>
           <w:rFonts w:cs="Times New Roman"/>
         </w:rPr>
         <w:lastRenderedPageBreak/>
-        <w:t>Baginya, membeli satu bungkus bukan sekadar membeli lima lembar kertas bergambar, melainkan membeli sensasi kejutan (</w:t>
+        <w:t>bergambar, melainkan membeli sensasi kejutan (</w:t>
       </w:r>
       <w:r>
         <w:rPr>
@@ -7899,14 +7925,14 @@
         <w:rPr>
           <w:rFonts w:cs="Times New Roman"/>
         </w:rPr>
-        <w:t xml:space="preserve">. Perbedaan ini dapat dijelaskan secara teoretis: anggaran ketat </w:t>
+        <w:t xml:space="preserve">. Perbedaan ini dapat dijelaskan secara teoretis: anggaran ketat meredam dorongan hedonis, kolektor matang berbelanja terencana di pasar </w:t>
       </w:r>
       <w:r>
         <w:rPr>
           <w:rFonts w:cs="Times New Roman"/>
         </w:rPr>
         <w:lastRenderedPageBreak/>
-        <w:t>meredam dorongan hedonis, kolektor matang berbelanja terencana di pasar sekunder, kesadaran risiko menahan spekulasi, dan kapasitas kontrol diri menipis ketika stimulus memuncak. Perbandingan temuan tersebut dirangkum pada Tabel 1.1; pembahasan tiap variabel beserta hipotesisnya diuraikan pada Bab II.</w:t>
+        <w:t>sekunder, kesadaran risiko menahan spekulasi, dan kapasitas kontrol diri menipis ketika stimulus memuncak. Perbandingan temuan tersebut dirangkum pada Tabel 1.1; pembahasan tiap variabel beserta hipotesisnya diuraikan pada Bab II.</w:t>
       </w:r>
     </w:p>
     <w:p>
@@ -9810,7 +9836,6 @@
           <w:rFonts w:cs="Times New Roman"/>
           <w:i/>
         </w:rPr>
-        <w:lastRenderedPageBreak/>
         <w:t>Sumber: Data diolah dari sintesis kajian literatur empiris terdahulu (2026).</w:t>
       </w:r>
     </w:p>
@@ -9824,6 +9849,7 @@
         <w:rPr>
           <w:rFonts w:cs="Times New Roman"/>
         </w:rPr>
+        <w:lastRenderedPageBreak/>
         <w:t xml:space="preserve">Ketidakseragaman temuan tersebut menunjukkan perlunya variabel pemoderasi yang menguji batas kontrol psikologis konsumen. Dalam kerangka </w:t>
       </w:r>
       <w:r>
@@ -9905,7 +9931,20 @@
         <w:rPr>
           <w:rFonts w:cs="Times New Roman"/>
         </w:rPr>
-        <w:t xml:space="preserve">; Prihatiningrum and Said, 2021) yang diprediksi </w:t>
+        <w:t xml:space="preserve">; Prihatiningrum and Said, 2021; Jain </w:t>
+      </w:r>
+      <w:r>
+        <w:rPr>
+          <w:rFonts w:cs="Times New Roman"/>
+          <w:i/>
+        </w:rPr>
+        <w:t>et al.</w:t>
+      </w:r>
+      <w:r>
+        <w:rPr>
+          <w:rFonts w:cs="Times New Roman"/>
+        </w:rPr>
+        <w:t xml:space="preserve">, 2023) yang diprediksi </w:t>
       </w:r>
       <w:r>
         <w:rPr>
@@ -10108,14 +10147,7 @@
         <w:rPr>
           <w:rFonts w:cs="Times New Roman"/>
         </w:rPr>
-        <w:t xml:space="preserve">) dengan harga eceran resmi terjangkau (Rp20.000–Rp30.000 per bungkus) yang didistribusikan secara masif di area kasir gerai ritel modern (Indomaret, Alfamart) dan toko buku (Gramedia) di seluruh wilayah kecamatan Jakarta Barat. Penempatan strategis di depan etalase kasir ini </w:t>
-      </w:r>
-      <w:r>
-        <w:rPr>
-          <w:rFonts w:cs="Times New Roman"/>
-        </w:rPr>
-        <w:lastRenderedPageBreak/>
-        <w:t>menciptakan titik kontak pembelian spontan yang mudah dijangkau dan diamati secara nyata di lapangan.</w:t>
+        <w:t>) dengan harga eceran resmi terjangkau (Rp20.000–Rp30.000 per bungkus) yang didistribusikan secara masif di area kasir gerai ritel modern (Indomaret, Alfamart) dan toko buku (Gramedia) di seluruh wilayah kecamatan Jakarta Barat. Penempatan strategis di depan etalase kasir ini menciptakan titik kontak pembelian spontan yang mudah dijangkau dan diamati secara nyata di lapangan.</w:t>
       </w:r>
     </w:p>
     <w:p>
@@ -10129,6 +10161,7 @@
           <w:rFonts w:cs="Times New Roman"/>
           <w:b/>
         </w:rPr>
+        <w:lastRenderedPageBreak/>
         <w:t xml:space="preserve">•  </w:t>
       </w:r>
       <w:r>
@@ -10267,7 +10300,7 @@
         <w:outlineLvl w:val="1"/>
       </w:pPr>
       <w:bookmarkStart w:id="24" w:name="TOC_1_2_PERUMUSAN_MASALAH"/>
-      <w:bookmarkStart w:id="25" w:name="_Toc243076522"/>
+      <w:bookmarkStart w:id="25" w:name="_Toc243083012"/>
       <w:r>
         <w:rPr>
           <w:rFonts w:ascii="Times New Roman" w:hAnsi="Times New Roman"/>
@@ -10693,7 +10726,7 @@
         <w:outlineLvl w:val="1"/>
       </w:pPr>
       <w:bookmarkStart w:id="26" w:name="TOC_1_3_TUJUAN_PENELITIAN"/>
-      <w:bookmarkStart w:id="27" w:name="_Toc243076523"/>
+      <w:bookmarkStart w:id="27" w:name="_Toc243083013"/>
       <w:r>
         <w:rPr>
           <w:rFonts w:ascii="Times New Roman" w:hAnsi="Times New Roman"/>
@@ -11118,7 +11151,7 @@
         <w:outlineLvl w:val="1"/>
       </w:pPr>
       <w:bookmarkStart w:id="28" w:name="TOC_1_4_MANFAAT_PENELITIAN"/>
-      <w:bookmarkStart w:id="29" w:name="_Toc243076524"/>
+      <w:bookmarkStart w:id="29" w:name="_Toc243083014"/>
       <w:r>
         <w:rPr>
           <w:rFonts w:ascii="Times New Roman" w:hAnsi="Times New Roman"/>
@@ -11150,7 +11183,7 @@
         <w:outlineLvl w:val="2"/>
       </w:pPr>
       <w:bookmarkStart w:id="30" w:name="TOC_1_4_1_MANFAAT_TEORETIS"/>
-      <w:bookmarkStart w:id="31" w:name="_Toc243076525"/>
+      <w:bookmarkStart w:id="31" w:name="_Toc243083015"/>
       <w:r>
         <w:rPr>
           <w:rFonts w:ascii="Times New Roman" w:hAnsi="Times New Roman"/>
@@ -11362,7 +11395,7 @@
         <w:outlineLvl w:val="2"/>
       </w:pPr>
       <w:bookmarkStart w:id="32" w:name="TOC_1_4_2_MANFAAT_PRAKTIS"/>
-      <w:bookmarkStart w:id="33" w:name="_Toc243076526"/>
+      <w:bookmarkStart w:id="33" w:name="_Toc243083016"/>
       <w:r>
         <w:rPr>
           <w:rFonts w:ascii="Times New Roman" w:hAnsi="Times New Roman"/>
@@ -11516,7 +11549,7 @@
         <w:outlineLvl w:val="0"/>
       </w:pPr>
       <w:bookmarkStart w:id="34" w:name="TOC_BAB_II_KAJIAN_PUSTAKA_DAN_PENGEMBANG"/>
-      <w:bookmarkStart w:id="35" w:name="_Toc243076527"/>
+      <w:bookmarkStart w:id="35" w:name="_Toc243083017"/>
       <w:r>
         <w:rPr>
           <w:rFonts w:ascii="Times New Roman" w:hAnsi="Times New Roman"/>
@@ -11567,7 +11600,7 @@
         <w:outlineLvl w:val="1"/>
       </w:pPr>
       <w:bookmarkStart w:id="36" w:name="TOC_2_1_LANDASAN_TEORI"/>
-      <w:bookmarkStart w:id="37" w:name="_Toc243076528"/>
+      <w:bookmarkStart w:id="37" w:name="_Toc243083018"/>
       <w:r>
         <w:rPr>
           <w:rFonts w:ascii="Times New Roman" w:hAnsi="Times New Roman"/>
@@ -11586,7 +11619,7 @@
         <w:outlineLvl w:val="2"/>
       </w:pPr>
       <w:bookmarkStart w:id="38" w:name="TOC_2_1_1_LANDASAN_TEORETIS_PENDEKATAN_K"/>
-      <w:bookmarkStart w:id="39" w:name="_Toc243076529"/>
+      <w:bookmarkStart w:id="39" w:name="_Toc243083019"/>
       <w:r>
         <w:rPr>
           <w:rFonts w:ascii="Times New Roman" w:hAnsi="Times New Roman"/>
@@ -11920,7 +11953,7 @@
         <w:outlineLvl w:val="2"/>
       </w:pPr>
       <w:bookmarkStart w:id="40" w:name="TOC_2_1_2_PENDEKATAN_STIMULUS_ORGANISM_R"/>
-      <w:bookmarkStart w:id="41" w:name="_Toc243076530"/>
+      <w:bookmarkStart w:id="41" w:name="_Toc243083020"/>
       <w:r>
         <w:rPr>
           <w:rFonts w:ascii="Times New Roman" w:hAnsi="Times New Roman"/>
@@ -12273,7 +12306,7 @@
         <w:outlineLvl w:val="2"/>
       </w:pPr>
       <w:bookmarkStart w:id="42" w:name="TOC_2_1_3_PSIKOLOGI_KOLEKTOR_DAN_COLLECT"/>
-      <w:bookmarkStart w:id="43" w:name="_Toc243076531"/>
+      <w:bookmarkStart w:id="43" w:name="_Toc243083021"/>
       <w:r>
         <w:rPr>
           <w:rFonts w:ascii="Times New Roman" w:hAnsi="Times New Roman"/>
@@ -12477,7 +12510,7 @@
         <w:outlineLvl w:val="2"/>
       </w:pPr>
       <w:bookmarkStart w:id="44" w:name="TOC_2_1_4_TEORI_REGULASI_DIRI_SELF_REGUL"/>
-      <w:bookmarkStart w:id="45" w:name="_Toc243076532"/>
+      <w:bookmarkStart w:id="45" w:name="_Toc243083022"/>
       <w:r>
         <w:rPr>
           <w:rFonts w:ascii="Times New Roman" w:hAnsi="Times New Roman"/>
@@ -12534,7 +12567,7 @@
         <w:rPr>
           <w:rFonts w:cs="Times New Roman"/>
         </w:rPr>
-        <w:t xml:space="preserve"> menjelaskan bagaimana individu mengendalikan dorongan alami demi tujuan jangka panjang. Rafael dan Lopes (2023) membuktikan bahwa penipisan kontrol diri (</w:t>
+        <w:t xml:space="preserve"> menjelaskan bagaimana individu mengendalikan dorongan alami demi tujuan jangka panjang. Rafael dan Lopes (2023) menegaskan bahwa penipisan kontrol diri (</w:t>
       </w:r>
       <w:r>
         <w:rPr>
@@ -12547,7 +12580,7 @@
         <w:rPr>
           <w:rFonts w:cs="Times New Roman"/>
         </w:rPr>
-        <w:t>) secara langsung menyebabkan kegagalan menahan impuls belanja. Sebaliknya, individu dengan kontrol diri yang kuat (</w:t>
+        <w:t>) dalam kerangka regulasi diri secara langsung memicu kegagalan menahan dorongan belanja. Sebaliknya, individu dengan kontrol diri yang kuat (</w:t>
       </w:r>
       <w:r>
         <w:rPr>
@@ -12609,7 +12642,7 @@
         <w:outlineLvl w:val="1"/>
       </w:pPr>
       <w:bookmarkStart w:id="46" w:name="TOC_2_2_KAJIAN_VARIABEL_PENELITIAN"/>
-      <w:bookmarkStart w:id="47" w:name="_Toc243076533"/>
+      <w:bookmarkStart w:id="47" w:name="_Toc243083023"/>
       <w:r>
         <w:rPr>
           <w:rFonts w:ascii="Times New Roman" w:hAnsi="Times New Roman"/>
@@ -12628,7 +12661,7 @@
         <w:outlineLvl w:val="2"/>
       </w:pPr>
       <w:bookmarkStart w:id="48" w:name="TOC_2_2_1_VARIABEL_DEPENDEN_Y_PEMBELIAN_"/>
-      <w:bookmarkStart w:id="49" w:name="_Toc243076534"/>
+      <w:bookmarkStart w:id="49" w:name="_Toc243083024"/>
       <w:r>
         <w:rPr>
           <w:rFonts w:ascii="Times New Roman" w:hAnsi="Times New Roman"/>
@@ -12703,7 +12736,7 @@
         <w:rPr>
           <w:rFonts w:cs="Times New Roman"/>
         </w:rPr>
-        <w:t xml:space="preserve">; Beikverdi </w:t>
+        <w:t xml:space="preserve">; Lubis </w:t>
       </w:r>
       <w:r>
         <w:rPr>
@@ -12716,7 +12749,7 @@
         <w:rPr>
           <w:rFonts w:cs="Times New Roman"/>
         </w:rPr>
-        <w:t xml:space="preserve">, 2024; Zhao </w:t>
+        <w:t xml:space="preserve">, 2022; Nyrhinen </w:t>
       </w:r>
       <w:r>
         <w:rPr>
@@ -12729,7 +12762,7 @@
         <w:rPr>
           <w:rFonts w:cs="Times New Roman"/>
         </w:rPr>
-        <w:t xml:space="preserve">, 2025). </w:t>
+        <w:t xml:space="preserve">, 2024). </w:t>
       </w:r>
       <w:hyperlink w:anchor="Ref_verplanken2001individual" w:history="1">
         <w:r>
@@ -12743,7 +12776,20 @@
         <w:rPr>
           <w:rFonts w:cs="Times New Roman"/>
         </w:rPr>
-        <w:t xml:space="preserve"> mengidentifikasi dua dimensi utama: (1) dimensi kognitif (ketiadaan perencanaan dan pengabaian anggaran); dan (2) dimensi afektif (luapan kegembiraan dan dorongan emosional tak tertahankan). Anoop dan Rahman (2025) menegaskan bahwa pembelian impulsif dipicu oleh konvergensi stimulus afektif, faktor kognitif internal, dan situasi pasar.</w:t>
+        <w:t xml:space="preserve"> mengidentifikasi dua dimensi utama: (1) dimensi kognitif (ketiadaan perencanaan dan pengabaian anggaran); dan (2) dimensi afektif (luapan kegembiraan dan dorongan emosional tak tertahankan). Nyrhinen </w:t>
+      </w:r>
+      <w:r>
+        <w:rPr>
+          <w:rFonts w:cs="Times New Roman"/>
+          <w:i/>
+        </w:rPr>
+        <w:t>et al.</w:t>
+      </w:r>
+      <w:r>
+        <w:rPr>
+          <w:rFonts w:cs="Times New Roman"/>
+        </w:rPr>
+        <w:t xml:space="preserve"> (2024) membuktikan bahwa dorongan pembelian impulsif dipicu oleh konvergensi stimulus digital afektif, kerentanan kognitif internal konsumen, dan lemahnya kendali diri.</w:t>
       </w:r>
     </w:p>
     <w:p>
@@ -12752,7 +12798,7 @@
         <w:outlineLvl w:val="2"/>
       </w:pPr>
       <w:bookmarkStart w:id="50" w:name="TOC_2_2_2_VARIABEL_INDEPENDEN_X₁_MOTIVAS"/>
-      <w:bookmarkStart w:id="51" w:name="_Toc243076535"/>
+      <w:bookmarkStart w:id="51" w:name="_Toc243083025"/>
       <w:r>
         <w:rPr>
           <w:rFonts w:ascii="Times New Roman" w:hAnsi="Times New Roman"/>
@@ -12928,7 +12974,7 @@
         <w:outlineLvl w:val="2"/>
       </w:pPr>
       <w:bookmarkStart w:id="52" w:name="TOC_2_2_3_VARIABEL_INDEPENDEN_X₂_HASRAT_"/>
-      <w:bookmarkStart w:id="53" w:name="_Toc243076536"/>
+      <w:bookmarkStart w:id="53" w:name="_Toc243083026"/>
       <w:r>
         <w:rPr>
           <w:rFonts w:ascii="Times New Roman" w:hAnsi="Times New Roman"/>
@@ -13132,7 +13178,7 @@
         <w:outlineLvl w:val="2"/>
       </w:pPr>
       <w:bookmarkStart w:id="54" w:name="TOC_2_2_4_VARIABEL_INDEPENDEN_X₃_MOTIF_S"/>
-      <w:bookmarkStart w:id="55" w:name="_Toc243076537"/>
+      <w:bookmarkStart w:id="55" w:name="_Toc243083027"/>
       <w:r>
         <w:rPr>
           <w:rFonts w:ascii="Times New Roman" w:hAnsi="Times New Roman"/>
@@ -13387,7 +13433,7 @@
         <w:outlineLvl w:val="2"/>
       </w:pPr>
       <w:bookmarkStart w:id="56" w:name="TOC_2_2_5_VARIABEL_MODERASI_M_KONTROL_DI"/>
-      <w:bookmarkStart w:id="57" w:name="_Toc243076538"/>
+      <w:bookmarkStart w:id="57" w:name="_Toc243083028"/>
       <w:r>
         <w:rPr>
           <w:rFonts w:ascii="Times New Roman" w:hAnsi="Times New Roman"/>
@@ -13535,7 +13581,20 @@
         <w:rPr>
           <w:rFonts w:cs="Times New Roman"/>
         </w:rPr>
-        <w:t xml:space="preserve"> diperlemah secara signifikan (Prihatiningrum dan Said, 2021).</w:t>
+        <w:t xml:space="preserve"> diperlemah secara signifikan (Prihatiningrum and Said, 2021; Jain </w:t>
+      </w:r>
+      <w:r>
+        <w:rPr>
+          <w:rFonts w:cs="Times New Roman"/>
+          <w:i/>
+        </w:rPr>
+        <w:t>et al.</w:t>
+      </w:r>
+      <w:r>
+        <w:rPr>
+          <w:rFonts w:cs="Times New Roman"/>
+        </w:rPr>
+        <w:t>, 2023).</w:t>
       </w:r>
     </w:p>
     <w:p>
@@ -13544,7 +13603,7 @@
         <w:outlineLvl w:val="1"/>
       </w:pPr>
       <w:bookmarkStart w:id="58" w:name="TOC_2_3_PENELITIAN_SEBELUMNYA"/>
-      <w:bookmarkStart w:id="59" w:name="_Toc243076539"/>
+      <w:bookmarkStart w:id="59" w:name="_Toc243083029"/>
       <w:r>
         <w:rPr>
           <w:rFonts w:ascii="Times New Roman" w:hAnsi="Times New Roman"/>
@@ -15757,7 +15816,7 @@
         <w:outlineLvl w:val="1"/>
       </w:pPr>
       <w:bookmarkStart w:id="61" w:name="TOC_2_4_PENGEMBANGAN_HIPOTESIS"/>
-      <w:bookmarkStart w:id="62" w:name="_Toc243076540"/>
+      <w:bookmarkStart w:id="62" w:name="_Toc243083030"/>
       <w:r>
         <w:rPr>
           <w:rFonts w:ascii="Times New Roman" w:hAnsi="Times New Roman"/>
@@ -15776,7 +15835,7 @@
         <w:outlineLvl w:val="2"/>
       </w:pPr>
       <w:bookmarkStart w:id="63" w:name="TOC_2_4_1_PENGARUH_HEDONIC_MOTIVATION_TE"/>
-      <w:bookmarkStart w:id="64" w:name="_Toc243076541"/>
+      <w:bookmarkStart w:id="64" w:name="_Toc243083031"/>
       <w:r>
         <w:rPr>
           <w:rFonts w:ascii="Times New Roman" w:hAnsi="Times New Roman"/>
@@ -16071,7 +16130,7 @@
         <w:outlineLvl w:val="2"/>
       </w:pPr>
       <w:bookmarkStart w:id="65" w:name="TOC_2_4_2_PENGARUH_DESIRE_FOR_COMPLETENE"/>
-      <w:bookmarkStart w:id="66" w:name="_Toc243076542"/>
+      <w:bookmarkStart w:id="66" w:name="_Toc243083032"/>
       <w:r>
         <w:rPr>
           <w:rFonts w:ascii="Times New Roman" w:hAnsi="Times New Roman"/>
@@ -16532,7 +16591,7 @@
         <w:outlineLvl w:val="2"/>
       </w:pPr>
       <w:bookmarkStart w:id="67" w:name="TOC_2_4_3_PENGARUH_SPECULATIVE_MOTIVE_TE"/>
-      <w:bookmarkStart w:id="68" w:name="_Toc243076543"/>
+      <w:bookmarkStart w:id="68" w:name="_Toc243083033"/>
       <w:r>
         <w:rPr>
           <w:rFonts w:ascii="Times New Roman" w:hAnsi="Times New Roman"/>
@@ -16964,7 +17023,7 @@
         <w:outlineLvl w:val="2"/>
       </w:pPr>
       <w:bookmarkStart w:id="69" w:name="TOC_2_4_4_PENGARUH_MODERASI_SELF_CONTROL"/>
-      <w:bookmarkStart w:id="70" w:name="_Toc243076544"/>
+      <w:bookmarkStart w:id="70" w:name="_Toc243083034"/>
       <w:r>
         <w:rPr>
           <w:rFonts w:ascii="Times New Roman" w:hAnsi="Times New Roman"/>
@@ -17412,7 +17471,7 @@
         <w:outlineLvl w:val="2"/>
       </w:pPr>
       <w:bookmarkStart w:id="71" w:name="TOC_2_4_5_PENGARUH_MODERASI_SELF_CONTROL"/>
-      <w:bookmarkStart w:id="72" w:name="_Toc243076545"/>
+      <w:bookmarkStart w:id="72" w:name="_Toc243083035"/>
       <w:r>
         <w:rPr>
           <w:rFonts w:ascii="Times New Roman" w:hAnsi="Times New Roman"/>
@@ -17833,7 +17892,7 @@
         <w:outlineLvl w:val="2"/>
       </w:pPr>
       <w:bookmarkStart w:id="73" w:name="TOC_2_4_6_PENGARUH_MODERASI_SELF_CONTROL"/>
-      <w:bookmarkStart w:id="74" w:name="_Toc243076546"/>
+      <w:bookmarkStart w:id="74" w:name="_Toc243083036"/>
       <w:r>
         <w:rPr>
           <w:rFonts w:ascii="Times New Roman" w:hAnsi="Times New Roman"/>
@@ -18187,7 +18246,7 @@
         <w:outlineLvl w:val="1"/>
       </w:pPr>
       <w:bookmarkStart w:id="75" w:name="TOC_2_5_RERANGKA_PENELITIAN"/>
-      <w:bookmarkStart w:id="76" w:name="_Toc243076547"/>
+      <w:bookmarkStart w:id="76" w:name="_Toc243083037"/>
       <w:r>
         <w:rPr>
           <w:rFonts w:ascii="Times New Roman" w:hAnsi="Times New Roman"/>
@@ -18223,7 +18282,7 @@
           <w:noProof/>
         </w:rPr>
         <w:drawing>
-          <wp:inline distT="0" distB="0" distL="0" distR="0" wp14:anchorId="3ADB582E" wp14:editId="0BD2C025">
+          <wp:inline distT="0" distB="0" distL="0" distR="0" wp14:anchorId="3E880B0F" wp14:editId="041D1DC3">
             <wp:extent cx="5040000" cy="2876340"/>
             <wp:effectExtent l="0" t="0" r="0" b="0"/>
             <wp:docPr id="5" name="Picture 5"/>
@@ -18299,7 +18358,7 @@
         <w:outlineLvl w:val="0"/>
       </w:pPr>
       <w:bookmarkStart w:id="78" w:name="TOC_BAB_III_METODE_PENELITIAN"/>
-      <w:bookmarkStart w:id="79" w:name="_Toc243076548"/>
+      <w:bookmarkStart w:id="79" w:name="_Toc243083038"/>
       <w:r>
         <w:rPr>
           <w:rFonts w:ascii="Times New Roman" w:hAnsi="Times New Roman"/>
@@ -18350,7 +18409,7 @@
         <w:outlineLvl w:val="1"/>
       </w:pPr>
       <w:bookmarkStart w:id="80" w:name="TOC_3_1_JENIS_DAN_SUMBER_DATA"/>
-      <w:bookmarkStart w:id="81" w:name="_Toc243076549"/>
+      <w:bookmarkStart w:id="81" w:name="_Toc243083039"/>
       <w:r>
         <w:rPr>
           <w:rFonts w:ascii="Times New Roman" w:hAnsi="Times New Roman"/>
@@ -18991,7 +19050,7 @@
         <w:outlineLvl w:val="2"/>
       </w:pPr>
       <w:bookmarkStart w:id="83" w:name="TOC_3_1_1_BATASAN_PENELITIAN_DAN_RUANG_L"/>
-      <w:bookmarkStart w:id="84" w:name="_Toc243076550"/>
+      <w:bookmarkStart w:id="84" w:name="_Toc243083040"/>
       <w:r>
         <w:rPr>
           <w:rFonts w:ascii="Times New Roman" w:hAnsi="Times New Roman"/>
@@ -19287,7 +19346,7 @@
         <w:outlineLvl w:val="1"/>
       </w:pPr>
       <w:bookmarkStart w:id="85" w:name="TOC_3_2_POPULASI_DAN_SAMPEL"/>
-      <w:bookmarkStart w:id="86" w:name="_Toc243076551"/>
+      <w:bookmarkStart w:id="86" w:name="_Toc243083041"/>
       <w:r>
         <w:rPr>
           <w:rFonts w:ascii="Times New Roman" w:hAnsi="Times New Roman"/>
@@ -19306,7 +19365,7 @@
         <w:outlineLvl w:val="2"/>
       </w:pPr>
       <w:bookmarkStart w:id="87" w:name="TOC_3_2_1_POPULASI_DAN_IDENTIFIKASI_SUMB"/>
-      <w:bookmarkStart w:id="88" w:name="_Toc243076552"/>
+      <w:bookmarkStart w:id="88" w:name="_Toc243083042"/>
       <w:r>
         <w:rPr>
           <w:rFonts w:ascii="Times New Roman" w:hAnsi="Times New Roman"/>
@@ -19526,7 +19585,7 @@
         <w:outlineLvl w:val="2"/>
       </w:pPr>
       <w:bookmarkStart w:id="89" w:name="TOC_3_2_2_SAMPEL_DAN_JUSTIFIKASI_KRITERI"/>
-      <w:bookmarkStart w:id="90" w:name="_Toc243076553"/>
+      <w:bookmarkStart w:id="90" w:name="_Toc243083043"/>
       <w:r>
         <w:rPr>
           <w:rFonts w:ascii="Times New Roman" w:hAnsi="Times New Roman"/>
@@ -20014,7 +20073,7 @@
         <w:outlineLvl w:val="2"/>
       </w:pPr>
       <w:bookmarkStart w:id="91" w:name="TOC_3_2_3_PROSEDUR_DISTRIBUSI_KUESIONER_"/>
-      <w:bookmarkStart w:id="92" w:name="_Toc243076554"/>
+      <w:bookmarkStart w:id="92" w:name="_Toc243083044"/>
       <w:r>
         <w:rPr>
           <w:rFonts w:ascii="Times New Roman" w:hAnsi="Times New Roman"/>
@@ -20280,7 +20339,7 @@
         <w:outlineLvl w:val="2"/>
       </w:pPr>
       <w:bookmarkStart w:id="93" w:name="TOC_3_2_4_PENENTUAN_UKURAN_SAMPEL"/>
-      <w:bookmarkStart w:id="94" w:name="_Toc243076555"/>
+      <w:bookmarkStart w:id="94" w:name="_Toc243083045"/>
       <w:r>
         <w:rPr>
           <w:rFonts w:ascii="Times New Roman" w:hAnsi="Times New Roman"/>
@@ -20963,7 +21022,7 @@
         <w:outlineLvl w:val="2"/>
       </w:pPr>
       <w:bookmarkStart w:id="95" w:name="TOC_3_2_5_JUSTIFIKASI_KOMPARATIF_PEMILIH"/>
-      <w:bookmarkStart w:id="96" w:name="_Toc243076556"/>
+      <w:bookmarkStart w:id="96" w:name="_Toc243083046"/>
       <w:r>
         <w:rPr>
           <w:rFonts w:ascii="Times New Roman" w:hAnsi="Times New Roman"/>
@@ -21228,7 +21287,7 @@
         <w:outlineLvl w:val="1"/>
       </w:pPr>
       <w:bookmarkStart w:id="97" w:name="TOC_3_3_MODEL_PENELITIAN"/>
-      <w:bookmarkStart w:id="98" w:name="_Toc243076557"/>
+      <w:bookmarkStart w:id="98" w:name="_Toc243083047"/>
       <w:r>
         <w:rPr>
           <w:rFonts w:ascii="Times New Roman" w:hAnsi="Times New Roman"/>
@@ -23258,7 +23317,7 @@
         <w:outlineLvl w:val="1"/>
       </w:pPr>
       <w:bookmarkStart w:id="99" w:name="TOC_3_4_OPERASIONALISASI_VARIABEL"/>
-      <w:bookmarkStart w:id="100" w:name="_Toc243076558"/>
+      <w:bookmarkStart w:id="100" w:name="_Toc243083048"/>
       <w:r>
         <w:rPr>
           <w:rFonts w:ascii="Times New Roman" w:hAnsi="Times New Roman"/>
@@ -27009,7 +27068,7 @@
         <w:outlineLvl w:val="1"/>
       </w:pPr>
       <w:bookmarkStart w:id="102" w:name="TOC_3_5_METODE_ANALISIS_DATA"/>
-      <w:bookmarkStart w:id="103" w:name="_Toc243076559"/>
+      <w:bookmarkStart w:id="103" w:name="_Toc243083049"/>
       <w:r>
         <w:rPr>
           <w:rFonts w:ascii="Times New Roman" w:hAnsi="Times New Roman"/>
@@ -27029,7 +27088,7 @@
         <w:outlineLvl w:val="2"/>
       </w:pPr>
       <w:bookmarkStart w:id="104" w:name="TOC_3_5_1_JUSTIFIKASI_KOMPARATIF_PEMILIH"/>
-      <w:bookmarkStart w:id="105" w:name="_Toc243076560"/>
+      <w:bookmarkStart w:id="105" w:name="_Toc243083050"/>
       <w:r>
         <w:rPr>
           <w:rFonts w:ascii="Times New Roman" w:hAnsi="Times New Roman"/>
@@ -28501,7 +28560,7 @@
         <w:outlineLvl w:val="1"/>
       </w:pPr>
       <w:bookmarkStart w:id="106" w:name="TOC_3_6_DIAGRAM_ALUR_PENELITIAN"/>
-      <w:bookmarkStart w:id="107" w:name="_Toc243076561"/>
+      <w:bookmarkStart w:id="107" w:name="_Toc243083051"/>
       <w:r>
         <w:rPr>
           <w:rFonts w:ascii="Times New Roman" w:hAnsi="Times New Roman"/>
@@ -28537,7 +28596,7 @@
           <w:noProof/>
         </w:rPr>
         <w:drawing>
-          <wp:inline distT="0" distB="0" distL="0" distR="0" wp14:anchorId="2F220BCE" wp14:editId="482BB8CC">
+          <wp:inline distT="0" distB="0" distL="0" distR="0" wp14:anchorId="6C0B771D" wp14:editId="0EE572FF">
             <wp:extent cx="4680000" cy="4701382"/>
             <wp:effectExtent l="0" t="0" r="0" b="0"/>
             <wp:docPr id="6" name="Picture 6"/>
@@ -28917,7 +28976,7 @@
         <w:outlineLvl w:val="1"/>
       </w:pPr>
       <w:bookmarkStart w:id="109" w:name="TOC_3_7_JADWAL_PELAKSANAAN_PENELITIAN"/>
-      <w:bookmarkStart w:id="110" w:name="_Toc243076562"/>
+      <w:bookmarkStart w:id="110" w:name="_Toc243083052"/>
       <w:r>
         <w:rPr>
           <w:rFonts w:ascii="Times New Roman" w:hAnsi="Times New Roman"/>
@@ -30869,7 +30928,7 @@
         <w:outlineLvl w:val="0"/>
       </w:pPr>
       <w:bookmarkStart w:id="112" w:name="TOC_DAFTAR_PUSTAKA"/>
-      <w:bookmarkStart w:id="113" w:name="_Toc243076563"/>
+      <w:bookmarkStart w:id="113" w:name="_Toc243083053"/>
       <w:r>
         <w:rPr>
           <w:rFonts w:ascii="Times New Roman" w:hAnsi="Times New Roman"/>
@@ -30950,20 +31009,20 @@
         <w:rPr>
           <w:rFonts w:cs="Times New Roman"/>
         </w:rPr>
-        <w:t xml:space="preserve">Anoop, T. S. and Rahman, Z. (2025). Online impulse buying: A systematic review of 25 years of research using meta regression. </w:t>
-      </w:r>
-      <w:r>
-        <w:rPr>
-          <w:rFonts w:cs="Times New Roman"/>
-          <w:i/>
-        </w:rPr>
-        <w:t>Journal of Consumer Behaviour</w:t>
-      </w:r>
-      <w:r>
-        <w:rPr>
-          <w:rFonts w:cs="Times New Roman"/>
-        </w:rPr>
-        <w:t>, 24(1):363–391.</w:t>
+        <w:t xml:space="preserve">Apidana, Y. H. and Kholifah (2022). Peran self control dalam memoderasi pengaruh hedonic motives dan shopping lifestyle terhadap impulse buying. </w:t>
+      </w:r>
+      <w:r>
+        <w:rPr>
+          <w:rFonts w:cs="Times New Roman"/>
+          <w:i/>
+        </w:rPr>
+        <w:t>Journal of Digital Business and Management</w:t>
+      </w:r>
+      <w:r>
+        <w:rPr>
+          <w:rFonts w:cs="Times New Roman"/>
+        </w:rPr>
+        <w:t>, 1(1):26–40.</w:t>
       </w:r>
       <w:bookmarkEnd w:id="116"/>
     </w:p>
@@ -30978,20 +31037,20 @@
         <w:rPr>
           <w:rFonts w:cs="Times New Roman"/>
         </w:rPr>
-        <w:t xml:space="preserve">Apidana, Y. H. and Kholifah (2022). Peran self control dalam memoderasi pengaruh hedonic motives dan shopping lifestyle terhadap impulse buying. </w:t>
-      </w:r>
-      <w:r>
-        <w:rPr>
-          <w:rFonts w:cs="Times New Roman"/>
-          <w:i/>
-        </w:rPr>
-        <w:t>Journal of Digital Business and Management</w:t>
-      </w:r>
-      <w:r>
-        <w:rPr>
-          <w:rFonts w:cs="Times New Roman"/>
-        </w:rPr>
-        <w:t>, 1(1):26–40.</w:t>
+        <w:t xml:space="preserve">Aquino, M. J. and Gershenson, S. (2024). Expecting the expected? Documenting nostalgia effects on baseball card prices. </w:t>
+      </w:r>
+      <w:r>
+        <w:rPr>
+          <w:rFonts w:cs="Times New Roman"/>
+          <w:i/>
+        </w:rPr>
+        <w:t>Journal of Sports Economics</w:t>
+      </w:r>
+      <w:r>
+        <w:rPr>
+          <w:rFonts w:cs="Times New Roman"/>
+        </w:rPr>
+        <w:t>, 25(6):683–706.</w:t>
       </w:r>
       <w:bookmarkEnd w:id="117"/>
     </w:p>
@@ -31006,20 +31065,20 @@
         <w:rPr>
           <w:rFonts w:cs="Times New Roman"/>
         </w:rPr>
-        <w:t xml:space="preserve">Aquino, M. J. and Gershenson, S. (2024). Expecting the expected? Documenting nostalgia effects on baseball card prices. </w:t>
-      </w:r>
-      <w:r>
-        <w:rPr>
-          <w:rFonts w:cs="Times New Roman"/>
-          <w:i/>
-        </w:rPr>
-        <w:t>Journal of Sports Economics</w:t>
-      </w:r>
-      <w:r>
-        <w:rPr>
-          <w:rFonts w:cs="Times New Roman"/>
-        </w:rPr>
-        <w:t>, 25(6):683–706.</w:t>
+        <w:t xml:space="preserve">Arnold, M. J. and Reynolds, K. E. (2003). Hedonic shopping motivations. </w:t>
+      </w:r>
+      <w:r>
+        <w:rPr>
+          <w:rFonts w:cs="Times New Roman"/>
+          <w:i/>
+        </w:rPr>
+        <w:t>Journal of Retailing</w:t>
+      </w:r>
+      <w:r>
+        <w:rPr>
+          <w:rFonts w:cs="Times New Roman"/>
+        </w:rPr>
+        <w:t>, 79(2):77–95.</w:t>
       </w:r>
       <w:bookmarkEnd w:id="118"/>
     </w:p>
@@ -31034,20 +31093,20 @@
         <w:rPr>
           <w:rFonts w:cs="Times New Roman"/>
         </w:rPr>
-        <w:t xml:space="preserve">Arnold, M. J. and Reynolds, K. E. (2003). Hedonic shopping motivations. </w:t>
-      </w:r>
-      <w:r>
-        <w:rPr>
-          <w:rFonts w:cs="Times New Roman"/>
-          <w:i/>
-        </w:rPr>
-        <w:t>Journal of Retailing</w:t>
-      </w:r>
-      <w:r>
-        <w:rPr>
-          <w:rFonts w:cs="Times New Roman"/>
-        </w:rPr>
-        <w:t>, 79(2):77–95.</w:t>
+        <w:t xml:space="preserve">Artadita, S. and Firmialy, S. D. (2024). How does self-control moderate shopping enjoyment and impulse buying among generation z online gamers? </w:t>
+      </w:r>
+      <w:r>
+        <w:rPr>
+          <w:rFonts w:cs="Times New Roman"/>
+          <w:i/>
+        </w:rPr>
+        <w:t>Binus Business Review</w:t>
+      </w:r>
+      <w:r>
+        <w:rPr>
+          <w:rFonts w:cs="Times New Roman"/>
+        </w:rPr>
+        <w:t>, 15(2):179–189.</w:t>
       </w:r>
       <w:bookmarkEnd w:id="119"/>
     </w:p>
@@ -31062,20 +31121,33 @@
         <w:rPr>
           <w:rFonts w:cs="Times New Roman"/>
         </w:rPr>
-        <w:t xml:space="preserve">Artadita, S. and Firmialy, S. D. (2024). How does self-control moderate shopping enjoyment and impulse buying among generation z online gamers? </w:t>
-      </w:r>
-      <w:r>
-        <w:rPr>
-          <w:rFonts w:cs="Times New Roman"/>
-          <w:i/>
-        </w:rPr>
-        <w:t>Binus Business Review</w:t>
-      </w:r>
-      <w:r>
-        <w:rPr>
-          <w:rFonts w:cs="Times New Roman"/>
-        </w:rPr>
-        <w:t>, 15(2):179–189.</w:t>
+        <w:t xml:space="preserve">Aryadi, A. and Lingga, M. (2026). Personal traits and motivation impact on collectibles as an alternative investment: A case study of trading card game community in greater jakarta. In </w:t>
+      </w:r>
+      <w:r>
+        <w:rPr>
+          <w:rFonts w:cs="Times New Roman"/>
+          <w:i/>
+        </w:rPr>
+        <w:t>Proceedings of the 5th International Conference on Global Innovation and Trends in Economy (INCOGITE 2024)</w:t>
+      </w:r>
+      <w:r>
+        <w:rPr>
+          <w:rFonts w:cs="Times New Roman"/>
+        </w:rPr>
+        <w:t xml:space="preserve">, volume 302 of </w:t>
+      </w:r>
+      <w:r>
+        <w:rPr>
+          <w:rFonts w:cs="Times New Roman"/>
+          <w:i/>
+        </w:rPr>
+        <w:t>Advances in Economics, Business and Management Research</w:t>
+      </w:r>
+      <w:r>
+        <w:rPr>
+          <w:rFonts w:cs="Times New Roman"/>
+        </w:rPr>
+        <w:t>, pages 1–12. Atlantis Press.</w:t>
       </w:r>
       <w:bookmarkEnd w:id="120"/>
     </w:p>
@@ -31090,33 +31162,20 @@
         <w:rPr>
           <w:rFonts w:cs="Times New Roman"/>
         </w:rPr>
-        <w:t xml:space="preserve">Aryadi, A. and Lingga, M. (2026). Personal traits and motivation impact on collectibles as an alternative investment: A case study of trading card game community in greater jakarta. In </w:t>
-      </w:r>
-      <w:r>
-        <w:rPr>
-          <w:rFonts w:cs="Times New Roman"/>
-          <w:i/>
-        </w:rPr>
-        <w:t>Proceedings of the 5th International Conference on Global Innovation and Trends in Economy (INCOGITE 2024)</w:t>
-      </w:r>
-      <w:r>
-        <w:rPr>
-          <w:rFonts w:cs="Times New Roman"/>
-        </w:rPr>
-        <w:t xml:space="preserve">, volume 302 of </w:t>
-      </w:r>
-      <w:r>
-        <w:rPr>
-          <w:rFonts w:cs="Times New Roman"/>
-          <w:i/>
-        </w:rPr>
-        <w:t>Advances in Economics, Business and Management Research</w:t>
-      </w:r>
-      <w:r>
-        <w:rPr>
-          <w:rFonts w:cs="Times New Roman"/>
-        </w:rPr>
-        <w:t>, pages 1–12. Atlantis Press.</w:t>
+        <w:t xml:space="preserve">Azizah, N. L. and Fauzi, M. (2025). Exploring the drivers of impulsive buying in e-commerce: the role of hedonic motivation, shopping lifestyle, and positive emotions. </w:t>
+      </w:r>
+      <w:r>
+        <w:rPr>
+          <w:rFonts w:cs="Times New Roman"/>
+          <w:i/>
+        </w:rPr>
+        <w:t>Jurnal Inovasi Ekonomi</w:t>
+      </w:r>
+      <w:r>
+        <w:rPr>
+          <w:rFonts w:cs="Times New Roman"/>
+        </w:rPr>
+        <w:t>, 10(2):79–94.</w:t>
       </w:r>
       <w:bookmarkEnd w:id="121"/>
     </w:p>
@@ -31131,20 +31190,20 @@
         <w:rPr>
           <w:rFonts w:cs="Times New Roman"/>
         </w:rPr>
-        <w:t xml:space="preserve">Azizah, N. L. and Fauzi, M. (2025). Exploring the drivers of impulsive buying in e-commerce: the role of hedonic motivation, shopping lifestyle, and positive emotions. </w:t>
-      </w:r>
-      <w:r>
-        <w:rPr>
-          <w:rFonts w:cs="Times New Roman"/>
-          <w:i/>
-        </w:rPr>
-        <w:t>Jurnal Inovasi Ekonomi</w:t>
-      </w:r>
-      <w:r>
-        <w:rPr>
-          <w:rFonts w:cs="Times New Roman"/>
-        </w:rPr>
-        <w:t>, 10(2):79–94.</w:t>
+        <w:t xml:space="preserve">Babin, B. J., Darden, W. R., and Griffin, M. (1994). Work and/or fun: Measuring hedonic and utilitarian shopping value. </w:t>
+      </w:r>
+      <w:r>
+        <w:rPr>
+          <w:rFonts w:cs="Times New Roman"/>
+          <w:i/>
+        </w:rPr>
+        <w:t>Journal of Consumer Research</w:t>
+      </w:r>
+      <w:r>
+        <w:rPr>
+          <w:rFonts w:cs="Times New Roman"/>
+        </w:rPr>
+        <w:t>, 20(4):644–656.</w:t>
       </w:r>
       <w:bookmarkEnd w:id="122"/>
     </w:p>
@@ -31159,20 +31218,20 @@
         <w:rPr>
           <w:rFonts w:cs="Times New Roman"/>
         </w:rPr>
-        <w:t xml:space="preserve">Babin, B. J., Darden, W. R., and Griffin, M. (1994). Work and/or fun: Measuring hedonic and utilitarian shopping value. </w:t>
-      </w:r>
-      <w:r>
-        <w:rPr>
-          <w:rFonts w:cs="Times New Roman"/>
-          <w:i/>
-        </w:rPr>
-        <w:t>Journal of Consumer Research</w:t>
-      </w:r>
-      <w:r>
-        <w:rPr>
-          <w:rFonts w:cs="Times New Roman"/>
-        </w:rPr>
-        <w:t>, 20(4):644–656.</w:t>
+        <w:t xml:space="preserve">Barasz, K., John, L. K., Keenan, E. A., and Norton, M. I. (2017). Pseudo-set framing. </w:t>
+      </w:r>
+      <w:r>
+        <w:rPr>
+          <w:rFonts w:cs="Times New Roman"/>
+          <w:i/>
+        </w:rPr>
+        <w:t>Journal of Experimental Psychology: General</w:t>
+      </w:r>
+      <w:r>
+        <w:rPr>
+          <w:rFonts w:cs="Times New Roman"/>
+        </w:rPr>
+        <w:t>, 146(10):1460–1477.</w:t>
       </w:r>
       <w:bookmarkEnd w:id="123"/>
     </w:p>
@@ -31187,20 +31246,20 @@
         <w:rPr>
           <w:rFonts w:cs="Times New Roman"/>
         </w:rPr>
-        <w:t xml:space="preserve">Barasz, K., John, L. K., Keenan, E. A., and Norton, M. I. (2017). Pseudo-set framing. </w:t>
-      </w:r>
-      <w:r>
-        <w:rPr>
-          <w:rFonts w:cs="Times New Roman"/>
-          <w:i/>
-        </w:rPr>
-        <w:t>Journal of Experimental Psychology: General</w:t>
-      </w:r>
-      <w:r>
-        <w:rPr>
-          <w:rFonts w:cs="Times New Roman"/>
-        </w:rPr>
-        <w:t>, 146(10):1460–1477.</w:t>
+        <w:t xml:space="preserve">Baumeister, R. F. (2002). Yielding to temptation: Self-control failure, impulsive purchasing, and consumer behavior. </w:t>
+      </w:r>
+      <w:r>
+        <w:rPr>
+          <w:rFonts w:cs="Times New Roman"/>
+          <w:i/>
+        </w:rPr>
+        <w:t>Journal of Consumer Research</w:t>
+      </w:r>
+      <w:r>
+        <w:rPr>
+          <w:rFonts w:cs="Times New Roman"/>
+        </w:rPr>
+        <w:t>, 28(4):670–676.</w:t>
       </w:r>
       <w:bookmarkEnd w:id="124"/>
     </w:p>
@@ -31216,20 +31275,20 @@
           <w:rFonts w:cs="Times New Roman"/>
         </w:rPr>
         <w:lastRenderedPageBreak/>
-        <w:t xml:space="preserve">Baumeister, R. F. (2002). Yielding to temptation: Self-control failure, impulsive purchasing, and consumer behavior. </w:t>
-      </w:r>
-      <w:r>
-        <w:rPr>
-          <w:rFonts w:cs="Times New Roman"/>
-          <w:i/>
-        </w:rPr>
-        <w:t>Journal of Consumer Research</w:t>
-      </w:r>
-      <w:r>
-        <w:rPr>
-          <w:rFonts w:cs="Times New Roman"/>
-        </w:rPr>
-        <w:t>, 28(4):670–676.</w:t>
+        <w:t xml:space="preserve">Baumeister, R. F., André, N., Southwick, D. A., and Tice, D. M. (2024). Self-control and limited willpower: Current status of ego depletion theory and research. </w:t>
+      </w:r>
+      <w:r>
+        <w:rPr>
+          <w:rFonts w:cs="Times New Roman"/>
+          <w:i/>
+        </w:rPr>
+        <w:t>Current Opinion in Psychology</w:t>
+      </w:r>
+      <w:r>
+        <w:rPr>
+          <w:rFonts w:cs="Times New Roman"/>
+        </w:rPr>
+        <w:t>, 60:101882.</w:t>
       </w:r>
       <w:bookmarkEnd w:id="125"/>
     </w:p>
@@ -31244,20 +31303,20 @@
         <w:rPr>
           <w:rFonts w:cs="Times New Roman"/>
         </w:rPr>
-        <w:t xml:space="preserve">Baumeister, R. F., André, N., Southwick, D. A., and Tice, D. M. (2024). Self-control and limited willpower: Current status of ego depletion theory and research. </w:t>
-      </w:r>
-      <w:r>
-        <w:rPr>
-          <w:rFonts w:cs="Times New Roman"/>
-          <w:i/>
-        </w:rPr>
-        <w:t>Current Opinion in Psychology</w:t>
-      </w:r>
-      <w:r>
-        <w:rPr>
-          <w:rFonts w:cs="Times New Roman"/>
-        </w:rPr>
-        <w:t>, 60:101882.</w:t>
+        <w:t xml:space="preserve">Baur, D. G., Dimpfl, T., and Kuck, K. (2018). Bitcoin, gold and the US dollar – a replication and extension. </w:t>
+      </w:r>
+      <w:r>
+        <w:rPr>
+          <w:rFonts w:cs="Times New Roman"/>
+          <w:i/>
+        </w:rPr>
+        <w:t>Finance Research Letters</w:t>
+      </w:r>
+      <w:r>
+        <w:rPr>
+          <w:rFonts w:cs="Times New Roman"/>
+        </w:rPr>
+        <w:t>, 25:103–110.</w:t>
       </w:r>
       <w:bookmarkEnd w:id="126"/>
     </w:p>
@@ -31272,20 +31331,20 @@
         <w:rPr>
           <w:rFonts w:cs="Times New Roman"/>
         </w:rPr>
-        <w:t xml:space="preserve">Baur, D. G., Dimpfl, T., and Kuck, K. (2018). Bitcoin, gold and the US dollar – a replication and extension. </w:t>
-      </w:r>
-      <w:r>
-        <w:rPr>
-          <w:rFonts w:cs="Times New Roman"/>
-          <w:i/>
-        </w:rPr>
-        <w:t>Finance Research Letters</w:t>
-      </w:r>
-      <w:r>
-        <w:rPr>
-          <w:rFonts w:cs="Times New Roman"/>
-        </w:rPr>
-        <w:t>, 25:103–110.</w:t>
+        <w:t xml:space="preserve">Belk, R. W. (1995). </w:t>
+      </w:r>
+      <w:r>
+        <w:rPr>
+          <w:rFonts w:cs="Times New Roman"/>
+          <w:i/>
+        </w:rPr>
+        <w:t>Collecting in a Consumer Society</w:t>
+      </w:r>
+      <w:r>
+        <w:rPr>
+          <w:rFonts w:cs="Times New Roman"/>
+        </w:rPr>
+        <w:t>. Routledge, London.</w:t>
       </w:r>
       <w:bookmarkEnd w:id="127"/>
     </w:p>
@@ -31300,20 +31359,20 @@
         <w:rPr>
           <w:rFonts w:cs="Times New Roman"/>
         </w:rPr>
-        <w:t xml:space="preserve">Beikverdi, L., Sipilä, J., and Tarkiainen, A. (2024). Post-purchase effects of impulse buying: A review and research agenda. </w:t>
-      </w:r>
-      <w:r>
-        <w:rPr>
-          <w:rFonts w:cs="Times New Roman"/>
-          <w:i/>
-        </w:rPr>
-        <w:t>Journal of Consumer Behaviour</w:t>
-      </w:r>
-      <w:r>
-        <w:rPr>
-          <w:rFonts w:cs="Times New Roman"/>
-        </w:rPr>
-        <w:t>, 23(3):1512–1527.</w:t>
+        <w:t xml:space="preserve">Chan, T. K. H., Cheung, C. M. K., and Lee, Z. W. Y. (2017). The state of online impulse-buying research: A literature analysis. </w:t>
+      </w:r>
+      <w:r>
+        <w:rPr>
+          <w:rFonts w:cs="Times New Roman"/>
+          <w:i/>
+        </w:rPr>
+        <w:t>Information &amp; Management</w:t>
+      </w:r>
+      <w:r>
+        <w:rPr>
+          <w:rFonts w:cs="Times New Roman"/>
+        </w:rPr>
+        <w:t>, 54(2):204–217. Analisis literatur komprehensif impulse buying online kerangka SOR; pengganti spero2004approach.</w:t>
       </w:r>
       <w:bookmarkEnd w:id="128"/>
     </w:p>
@@ -31328,20 +31387,20 @@
         <w:rPr>
           <w:rFonts w:cs="Times New Roman"/>
         </w:rPr>
-        <w:t xml:space="preserve">Belk, R. W. (1995). </w:t>
-      </w:r>
-      <w:r>
-        <w:rPr>
-          <w:rFonts w:cs="Times New Roman"/>
-          <w:i/>
-        </w:rPr>
-        <w:t>Collecting in a Consumer Society</w:t>
-      </w:r>
-      <w:r>
-        <w:rPr>
-          <w:rFonts w:cs="Times New Roman"/>
-        </w:rPr>
-        <w:t>. Routledge, London.</w:t>
+        <w:t xml:space="preserve">Cohen, J. (1988). </w:t>
+      </w:r>
+      <w:r>
+        <w:rPr>
+          <w:rFonts w:cs="Times New Roman"/>
+          <w:i/>
+        </w:rPr>
+        <w:t>Statistical Power Analysis for the Behavioral Sciences</w:t>
+      </w:r>
+      <w:r>
+        <w:rPr>
+          <w:rFonts w:cs="Times New Roman"/>
+        </w:rPr>
+        <w:t>. Lawrence Erlbaum Associates, Hillsdale, NJ, 2 edition.</w:t>
       </w:r>
       <w:bookmarkEnd w:id="129"/>
     </w:p>
@@ -31356,20 +31415,20 @@
         <w:rPr>
           <w:rFonts w:cs="Times New Roman"/>
         </w:rPr>
-        <w:t xml:space="preserve">Chan, T. K. H., Cheung, C. M. K., and Lee, Z. W. Y. (2017). The state of online impulse-buying research: A literature analysis. </w:t>
-      </w:r>
-      <w:r>
-        <w:rPr>
-          <w:rFonts w:cs="Times New Roman"/>
-          <w:i/>
-        </w:rPr>
-        <w:t>Information &amp; Management</w:t>
-      </w:r>
-      <w:r>
-        <w:rPr>
-          <w:rFonts w:cs="Times New Roman"/>
-        </w:rPr>
-        <w:t>, 54(2):204–217. Analisis literatur komprehensif impulse buying online kerangka SOR; pengganti spero2004approach.</w:t>
+        <w:t xml:space="preserve">Colline, F. (2024). Biases in indonesian stock investor behavior. </w:t>
+      </w:r>
+      <w:r>
+        <w:rPr>
+          <w:rFonts w:cs="Times New Roman"/>
+          <w:i/>
+        </w:rPr>
+        <w:t>Accounting and Finance Studies</w:t>
+      </w:r>
+      <w:r>
+        <w:rPr>
+          <w:rFonts w:cs="Times New Roman"/>
+        </w:rPr>
+        <w:t>, 4(2):88–98.</w:t>
       </w:r>
       <w:bookmarkEnd w:id="130"/>
     </w:p>
@@ -31384,20 +31443,20 @@
         <w:rPr>
           <w:rFonts w:cs="Times New Roman"/>
         </w:rPr>
-        <w:t xml:space="preserve">Cohen, J. (1988). </w:t>
-      </w:r>
-      <w:r>
-        <w:rPr>
-          <w:rFonts w:cs="Times New Roman"/>
-          <w:i/>
-        </w:rPr>
-        <w:t>Statistical Power Analysis for the Behavioral Sciences</w:t>
-      </w:r>
-      <w:r>
-        <w:rPr>
-          <w:rFonts w:cs="Times New Roman"/>
-        </w:rPr>
-        <w:t>. Lawrence Erlbaum Associates, Hillsdale, NJ, 2 edition.</w:t>
+        <w:t xml:space="preserve">Dewi, M. M. L. S., Budoyo, V. D., and Mustikasari, F. (2026). Understanding impulse buying behavior: The case of blind box purchases in indonesia. </w:t>
+      </w:r>
+      <w:r>
+        <w:rPr>
+          <w:rFonts w:cs="Times New Roman"/>
+          <w:i/>
+        </w:rPr>
+        <w:t>Jurnal Locus: Penelitian dan Pengabdian</w:t>
+      </w:r>
+      <w:r>
+        <w:rPr>
+          <w:rFonts w:cs="Times New Roman"/>
+        </w:rPr>
+        <w:t>, 5(2):1082–1089.</w:t>
       </w:r>
       <w:bookmarkEnd w:id="131"/>
     </w:p>
@@ -31412,20 +31471,20 @@
         <w:rPr>
           <w:rFonts w:cs="Times New Roman"/>
         </w:rPr>
-        <w:t xml:space="preserve">Colline, F. (2024). Biases in indonesian stock investor behavior. </w:t>
-      </w:r>
-      <w:r>
-        <w:rPr>
-          <w:rFonts w:cs="Times New Roman"/>
-          <w:i/>
-        </w:rPr>
-        <w:t>Accounting and Finance Studies</w:t>
-      </w:r>
-      <w:r>
-        <w:rPr>
-          <w:rFonts w:cs="Times New Roman"/>
-        </w:rPr>
-        <w:t>, 4(2):88–98.</w:t>
+        <w:t xml:space="preserve">Gao, L., Huang, Y., and Simonson, I. (2014). The influence of initial possession level on consumers' adoption of a collection goal: A tipping point effect. </w:t>
+      </w:r>
+      <w:r>
+        <w:rPr>
+          <w:rFonts w:cs="Times New Roman"/>
+          <w:i/>
+        </w:rPr>
+        <w:t>Journal of Marketing</w:t>
+      </w:r>
+      <w:r>
+        <w:rPr>
+          <w:rFonts w:cs="Times New Roman"/>
+        </w:rPr>
+        <w:t>, 78:143–156.</w:t>
       </w:r>
       <w:bookmarkEnd w:id="132"/>
     </w:p>
@@ -31440,20 +31499,20 @@
         <w:rPr>
           <w:rFonts w:cs="Times New Roman"/>
         </w:rPr>
-        <w:t xml:space="preserve">Dewi, M. M. L. S., Budoyo, V. D., and Mustikasari, F. (2026). Understanding impulse buying behavior: The case of blind box purchases in indonesia. </w:t>
-      </w:r>
-      <w:r>
-        <w:rPr>
-          <w:rFonts w:cs="Times New Roman"/>
-          <w:i/>
-        </w:rPr>
-        <w:t>Jurnal Locus: Penelitian dan Pengabdian</w:t>
-      </w:r>
-      <w:r>
-        <w:rPr>
-          <w:rFonts w:cs="Times New Roman"/>
-        </w:rPr>
-        <w:t>, 5(2):1082–1089.</w:t>
+        <w:t xml:space="preserve">Ghozali, I. (2018). </w:t>
+      </w:r>
+      <w:r>
+        <w:rPr>
+          <w:rFonts w:cs="Times New Roman"/>
+          <w:i/>
+        </w:rPr>
+        <w:t>Aplikasi Analisis Multivariate dengan Program IBM SPSS 25</w:t>
+      </w:r>
+      <w:r>
+        <w:rPr>
+          <w:rFonts w:cs="Times New Roman"/>
+        </w:rPr>
+        <w:t>. Badan Penerbit Universitas Diponegoro, Semarang, 9 edition.</w:t>
       </w:r>
       <w:bookmarkEnd w:id="133"/>
     </w:p>
@@ -31468,20 +31527,20 @@
         <w:rPr>
           <w:rFonts w:cs="Times New Roman"/>
         </w:rPr>
-        <w:t xml:space="preserve">Gao, L., Huang, Y., and Simonson, I. (2014). The influence of initial possession level on consumers' adoption of a collection goal: A tipping point effect. </w:t>
-      </w:r>
-      <w:r>
-        <w:rPr>
-          <w:rFonts w:cs="Times New Roman"/>
-          <w:i/>
-        </w:rPr>
-        <w:t>Journal of Marketing</w:t>
-      </w:r>
-      <w:r>
-        <w:rPr>
-          <w:rFonts w:cs="Times New Roman"/>
-        </w:rPr>
-        <w:t>, 78:143–156.</w:t>
+        <w:t xml:space="preserve">Giarlotta, A. and Petralia, A. (2024). Simon's bounded rationality. </w:t>
+      </w:r>
+      <w:r>
+        <w:rPr>
+          <w:rFonts w:cs="Times New Roman"/>
+          <w:i/>
+        </w:rPr>
+        <w:t>Decisions in Economics and Finance</w:t>
+      </w:r>
+      <w:r>
+        <w:rPr>
+          <w:rFonts w:cs="Times New Roman"/>
+        </w:rPr>
+        <w:t>, 47(1):327–346.</w:t>
       </w:r>
       <w:bookmarkEnd w:id="134"/>
     </w:p>
@@ -31496,20 +31555,20 @@
         <w:rPr>
           <w:rFonts w:cs="Times New Roman"/>
         </w:rPr>
-        <w:t xml:space="preserve">Ghozali, I. (2018). </w:t>
-      </w:r>
-      <w:r>
-        <w:rPr>
-          <w:rFonts w:cs="Times New Roman"/>
-          <w:i/>
-        </w:rPr>
-        <w:t>Aplikasi Analisis Multivariate dengan Program IBM SPSS 25</w:t>
-      </w:r>
-      <w:r>
-        <w:rPr>
-          <w:rFonts w:cs="Times New Roman"/>
-        </w:rPr>
-        <w:t>. Badan Penerbit Universitas Diponegoro, Semarang, 9 edition.</w:t>
+        <w:t xml:space="preserve">Gong, X., Yee, C. L., Lee, S. Y., Saif, A. N. M., Liu, M., and Anonthi, F. (2024). Unveiling the enigma of blind box impulse buying curiosity: The moderating role of price consciousness. </w:t>
+      </w:r>
+      <w:r>
+        <w:rPr>
+          <w:rFonts w:cs="Times New Roman"/>
+          <w:i/>
+        </w:rPr>
+        <w:t>Heliyon</w:t>
+      </w:r>
+      <w:r>
+        <w:rPr>
+          <w:rFonts w:cs="Times New Roman"/>
+        </w:rPr>
+        <w:t>, 10(24):e40564.</w:t>
       </w:r>
       <w:bookmarkEnd w:id="135"/>
     </w:p>
@@ -31524,20 +31583,20 @@
         <w:rPr>
           <w:rFonts w:cs="Times New Roman"/>
         </w:rPr>
-        <w:t xml:space="preserve">Giarlotta, A. and Petralia, A. (2024). Simon's bounded rationality. </w:t>
-      </w:r>
-      <w:r>
-        <w:rPr>
-          <w:rFonts w:cs="Times New Roman"/>
-          <w:i/>
-        </w:rPr>
-        <w:t>Decisions in Economics and Finance</w:t>
-      </w:r>
-      <w:r>
-        <w:rPr>
-          <w:rFonts w:cs="Times New Roman"/>
-        </w:rPr>
-        <w:t>, 47(1):327–346.</w:t>
+        <w:t xml:space="preserve">Green, S. B. (1991). How many subjects does it take to do a regression analysis? </w:t>
+      </w:r>
+      <w:r>
+        <w:rPr>
+          <w:rFonts w:cs="Times New Roman"/>
+          <w:i/>
+        </w:rPr>
+        <w:t>Multivariate Behavioral Research</w:t>
+      </w:r>
+      <w:r>
+        <w:rPr>
+          <w:rFonts w:cs="Times New Roman"/>
+        </w:rPr>
+        <w:t>, 26(3):499–510.</w:t>
       </w:r>
       <w:bookmarkEnd w:id="136"/>
     </w:p>
@@ -31552,20 +31611,20 @@
         <w:rPr>
           <w:rFonts w:cs="Times New Roman"/>
         </w:rPr>
-        <w:t xml:space="preserve">Gong, X., Yee, C. L., Lee, S. Y., Saif, A. N. M., Liu, M., and Anonthi, F. (2024). Unveiling the enigma of blind box impulse buying curiosity: The moderating role of price consciousness. </w:t>
-      </w:r>
-      <w:r>
-        <w:rPr>
-          <w:rFonts w:cs="Times New Roman"/>
-          <w:i/>
-        </w:rPr>
-        <w:t>Heliyon</w:t>
-      </w:r>
-      <w:r>
-        <w:rPr>
-          <w:rFonts w:cs="Times New Roman"/>
-        </w:rPr>
-        <w:t>, 10(24):e40564.</w:t>
+        <w:t xml:space="preserve">Gächter, S., Johnson, E. J., and Herrmann, A. (2022). Individual-level loss aversion in riskless and risky choices. </w:t>
+      </w:r>
+      <w:r>
+        <w:rPr>
+          <w:rFonts w:cs="Times New Roman"/>
+          <w:i/>
+        </w:rPr>
+        <w:t>Theory and Decision</w:t>
+      </w:r>
+      <w:r>
+        <w:rPr>
+          <w:rFonts w:cs="Times New Roman"/>
+        </w:rPr>
+        <w:t>, 92(3–4):599–624.</w:t>
       </w:r>
       <w:bookmarkEnd w:id="137"/>
     </w:p>
@@ -31580,20 +31639,20 @@
         <w:rPr>
           <w:rFonts w:cs="Times New Roman"/>
         </w:rPr>
-        <w:t xml:space="preserve">Green, S. B. (1991). How many subjects does it take to do a regression analysis? </w:t>
-      </w:r>
-      <w:r>
-        <w:rPr>
-          <w:rFonts w:cs="Times New Roman"/>
-          <w:i/>
-        </w:rPr>
-        <w:t>Multivariate Behavioral Research</w:t>
-      </w:r>
-      <w:r>
-        <w:rPr>
-          <w:rFonts w:cs="Times New Roman"/>
-        </w:rPr>
-        <w:t>, 26(3):499–510.</w:t>
+        <w:t xml:space="preserve">Hair, J. F., Black, W. C., Babin, B. J., and Anderson, R. E. (2019). </w:t>
+      </w:r>
+      <w:r>
+        <w:rPr>
+          <w:rFonts w:cs="Times New Roman"/>
+          <w:i/>
+        </w:rPr>
+        <w:t>Multivariate Data Analysis</w:t>
+      </w:r>
+      <w:r>
+        <w:rPr>
+          <w:rFonts w:cs="Times New Roman"/>
+        </w:rPr>
+        <w:t>. Cengage Learning, Boston, MA, 8th edition.</w:t>
       </w:r>
       <w:bookmarkEnd w:id="138"/>
     </w:p>
@@ -31608,21 +31667,20 @@
         <w:rPr>
           <w:rFonts w:cs="Times New Roman"/>
         </w:rPr>
-        <w:lastRenderedPageBreak/>
-        <w:t xml:space="preserve">Gächter, S., Johnson, E. J., and Herrmann, A. (2022). Individual-level loss aversion in riskless and risky choices. </w:t>
-      </w:r>
-      <w:r>
-        <w:rPr>
-          <w:rFonts w:cs="Times New Roman"/>
-          <w:i/>
-        </w:rPr>
-        <w:t>Theory and Decision</w:t>
-      </w:r>
-      <w:r>
-        <w:rPr>
-          <w:rFonts w:cs="Times New Roman"/>
-        </w:rPr>
-        <w:t>, 92(3–4):599–624.</w:t>
+        <w:t xml:space="preserve">Hayes, A. F. (2018). </w:t>
+      </w:r>
+      <w:r>
+        <w:rPr>
+          <w:rFonts w:cs="Times New Roman"/>
+          <w:i/>
+        </w:rPr>
+        <w:t>Introduction to Mediation, Moderation, and Conditional Process Analysis: A Regression-Based Approach</w:t>
+      </w:r>
+      <w:r>
+        <w:rPr>
+          <w:rFonts w:cs="Times New Roman"/>
+        </w:rPr>
+        <w:t>. The Guilford Press, New York, 2nd edition.</w:t>
       </w:r>
       <w:bookmarkEnd w:id="139"/>
     </w:p>
@@ -31637,20 +31695,21 @@
         <w:rPr>
           <w:rFonts w:cs="Times New Roman"/>
         </w:rPr>
-        <w:t xml:space="preserve">Hair, J. F., Black, W. C., Babin, B. J., and Anderson, R. E. (2019). </w:t>
-      </w:r>
-      <w:r>
-        <w:rPr>
-          <w:rFonts w:cs="Times New Roman"/>
-          <w:i/>
-        </w:rPr>
-        <w:t>Multivariate Data Analysis</w:t>
-      </w:r>
-      <w:r>
-        <w:rPr>
-          <w:rFonts w:cs="Times New Roman"/>
-        </w:rPr>
-        <w:t>. Cengage Learning, Boston, MA, 8th edition.</w:t>
+        <w:lastRenderedPageBreak/>
+        <w:t xml:space="preserve">Huo, C., Wang, X., Sadiq, M. W., and Pang, M. (2023). Exploring factors affecting consumer's impulse buying behavior in live-streaming shopping: An interactive research based upon SOR model. </w:t>
+      </w:r>
+      <w:r>
+        <w:rPr>
+          <w:rFonts w:cs="Times New Roman"/>
+          <w:i/>
+        </w:rPr>
+        <w:t>SAGE Open</w:t>
+      </w:r>
+      <w:r>
+        <w:rPr>
+          <w:rFonts w:cs="Times New Roman"/>
+        </w:rPr>
+        <w:t>, 13(2):1–15.</w:t>
       </w:r>
       <w:bookmarkEnd w:id="140"/>
     </w:p>
@@ -31665,20 +31724,20 @@
         <w:rPr>
           <w:rFonts w:cs="Times New Roman"/>
         </w:rPr>
-        <w:t xml:space="preserve">Hayes, A. F. (2018). </w:t>
-      </w:r>
-      <w:r>
-        <w:rPr>
-          <w:rFonts w:cs="Times New Roman"/>
-          <w:i/>
-        </w:rPr>
-        <w:t>Introduction to Mediation, Moderation, and Conditional Process Analysis: A Regression-Based Approach</w:t>
-      </w:r>
-      <w:r>
-        <w:rPr>
-          <w:rFonts w:cs="Times New Roman"/>
-        </w:rPr>
-        <w:t>. The Guilford Press, New York, 2nd edition.</w:t>
+        <w:t xml:space="preserve">Iyer, G. R., Blut, M., Xiao, S. H., and Grewal, D. (2020). Impulse buying: A meta-analytic review. </w:t>
+      </w:r>
+      <w:r>
+        <w:rPr>
+          <w:rFonts w:cs="Times New Roman"/>
+          <w:i/>
+        </w:rPr>
+        <w:t>Journal of the Academy of Marketing Science</w:t>
+      </w:r>
+      <w:r>
+        <w:rPr>
+          <w:rFonts w:cs="Times New Roman"/>
+        </w:rPr>
+        <w:t>, 48(3):384–404. Meta-analisis 231 sampel, 75.000+ konsumen dari 186 artikel; pengganti chen1998financial.</w:t>
       </w:r>
       <w:bookmarkEnd w:id="141"/>
     </w:p>
@@ -31693,20 +31752,20 @@
         <w:rPr>
           <w:rFonts w:cs="Times New Roman"/>
         </w:rPr>
-        <w:t xml:space="preserve">Huo, C., Wang, X., Sadiq, M. W., and Pang, M. (2023). Exploring factors affecting consumer's impulse buying behavior in live-streaming shopping: An interactive research based upon SOR model. </w:t>
-      </w:r>
-      <w:r>
-        <w:rPr>
-          <w:rFonts w:cs="Times New Roman"/>
-          <w:i/>
-        </w:rPr>
-        <w:t>SAGE Open</w:t>
-      </w:r>
-      <w:r>
-        <w:rPr>
-          <w:rFonts w:cs="Times New Roman"/>
-        </w:rPr>
-        <w:t>, 13(2):1–15.</w:t>
+        <w:t xml:space="preserve">Jain, A., Srivastava, S., and Shukla, A. (2023). Self-control and compulsive buying behavior: The mediating role of ill-being perception. </w:t>
+      </w:r>
+      <w:r>
+        <w:rPr>
+          <w:rFonts w:cs="Times New Roman"/>
+          <w:i/>
+        </w:rPr>
+        <w:t>Cogent Business &amp; Management</w:t>
+      </w:r>
+      <w:r>
+        <w:rPr>
+          <w:rFonts w:cs="Times New Roman"/>
+        </w:rPr>
+        <w:t>, 10(3):2286673.</w:t>
       </w:r>
       <w:bookmarkEnd w:id="142"/>
     </w:p>
@@ -31721,20 +31780,20 @@
         <w:rPr>
           <w:rFonts w:cs="Times New Roman"/>
         </w:rPr>
-        <w:t xml:space="preserve">Iyer, G. R., Blut, M., Xiao, S. H., and Grewal, D. (2020). Impulse buying: A meta-analytic review. </w:t>
-      </w:r>
-      <w:r>
-        <w:rPr>
-          <w:rFonts w:cs="Times New Roman"/>
-          <w:i/>
-        </w:rPr>
-        <w:t>Journal of the Academy of Marketing Science</w:t>
-      </w:r>
-      <w:r>
-        <w:rPr>
-          <w:rFonts w:cs="Times New Roman"/>
-        </w:rPr>
-        <w:t>, 48(3):384–404. Meta-analisis 231 sampel, 75.000+ konsumen dari 186 artikel; pengganti chen1998financial.</w:t>
+        <w:t xml:space="preserve">Katauke, T., Fukuda, S., Khan, M. S. R., and Kadoya, Y. (2023). Financial literacy and impulsivity: Evidence from Japan. </w:t>
+      </w:r>
+      <w:r>
+        <w:rPr>
+          <w:rFonts w:cs="Times New Roman"/>
+          <w:i/>
+        </w:rPr>
+        <w:t>Sustainability</w:t>
+      </w:r>
+      <w:r>
+        <w:rPr>
+          <w:rFonts w:cs="Times New Roman"/>
+        </w:rPr>
+        <w:t>, 15(9):7267.</w:t>
       </w:r>
       <w:bookmarkEnd w:id="143"/>
     </w:p>
@@ -31749,20 +31808,20 @@
         <w:rPr>
           <w:rFonts w:cs="Times New Roman"/>
         </w:rPr>
-        <w:t xml:space="preserve">Katauke, T., Fukuda, S., Khan, M. S. R., and Kadoya, Y. (2023). Financial literacy and impulsivity: Evidence from Japan. </w:t>
-      </w:r>
-      <w:r>
-        <w:rPr>
-          <w:rFonts w:cs="Times New Roman"/>
-          <w:i/>
-        </w:rPr>
-        <w:t>Sustainability</w:t>
-      </w:r>
-      <w:r>
-        <w:rPr>
-          <w:rFonts w:cs="Times New Roman"/>
-        </w:rPr>
-        <w:t>, 15(9):7267.</w:t>
+        <w:t xml:space="preserve">Keynes, J. M. (1936). </w:t>
+      </w:r>
+      <w:r>
+        <w:rPr>
+          <w:rFonts w:cs="Times New Roman"/>
+          <w:i/>
+        </w:rPr>
+        <w:t>The General Theory of Employment, Interest and Money</w:t>
+      </w:r>
+      <w:r>
+        <w:rPr>
+          <w:rFonts w:cs="Times New Roman"/>
+        </w:rPr>
+        <w:t>. Macmillan, London.</w:t>
       </w:r>
       <w:bookmarkEnd w:id="144"/>
     </w:p>
@@ -31777,20 +31836,20 @@
         <w:rPr>
           <w:rFonts w:cs="Times New Roman"/>
         </w:rPr>
-        <w:t xml:space="preserve">Keynes, J. M. (1936). </w:t>
-      </w:r>
-      <w:r>
-        <w:rPr>
-          <w:rFonts w:cs="Times New Roman"/>
-          <w:i/>
-        </w:rPr>
-        <w:t>The General Theory of Employment, Interest and Money</w:t>
-      </w:r>
-      <w:r>
-        <w:rPr>
-          <w:rFonts w:cs="Times New Roman"/>
-        </w:rPr>
-        <w:t>. Macmillan, London.</w:t>
+        <w:t xml:space="preserve">Lienardy, G. V. and Panasea, I. G. N. O. (2026). The role of self-control in moderating the influence of shopping lifestyle and hedonistic behavior on impulsive buying. </w:t>
+      </w:r>
+      <w:r>
+        <w:rPr>
+          <w:rFonts w:cs="Times New Roman"/>
+          <w:i/>
+        </w:rPr>
+        <w:t>Business and Investment Review</w:t>
+      </w:r>
+      <w:r>
+        <w:rPr>
+          <w:rFonts w:cs="Times New Roman"/>
+        </w:rPr>
+        <w:t>, 4(3).</w:t>
       </w:r>
       <w:bookmarkEnd w:id="145"/>
     </w:p>
@@ -31805,20 +31864,20 @@
         <w:rPr>
           <w:rFonts w:cs="Times New Roman"/>
         </w:rPr>
-        <w:t xml:space="preserve">Lienardy, G. V. and Panasea, I. G. N. O. (2026). The role of self-control in moderating the influence of shopping lifestyle and hedonistic behavior on impulsive buying. </w:t>
-      </w:r>
-      <w:r>
-        <w:rPr>
-          <w:rFonts w:cs="Times New Roman"/>
-          <w:i/>
-        </w:rPr>
-        <w:t>Business and Investment Review</w:t>
-      </w:r>
-      <w:r>
-        <w:rPr>
-          <w:rFonts w:cs="Times New Roman"/>
-        </w:rPr>
-        <w:t>, 4(3).</w:t>
+        <w:t xml:space="preserve">Lubis, A. N., Lumbanraja, P., and Hasibuan, B. K. (2022). Evaluation on e-marketing exposure practice to minimize the customers' online shopping purchase regret. </w:t>
+      </w:r>
+      <w:r>
+        <w:rPr>
+          <w:rFonts w:cs="Times New Roman"/>
+          <w:i/>
+        </w:rPr>
+        <w:t>Cogent Business &amp; Management</w:t>
+      </w:r>
+      <w:r>
+        <w:rPr>
+          <w:rFonts w:cs="Times New Roman"/>
+        </w:rPr>
+        <w:t>, 9(1):2016039.</w:t>
       </w:r>
       <w:bookmarkEnd w:id="146"/>
     </w:p>
@@ -31861,20 +31920,20 @@
         <w:rPr>
           <w:rFonts w:cs="Times New Roman"/>
         </w:rPr>
-        <w:t xml:space="preserve">Pranggabayu, B. and Andjarwati, A. L. (2022). Pengaruh hedonic shopping motivation dan store atmosphere terhadap impulsive buying. </w:t>
-      </w:r>
-      <w:r>
-        <w:rPr>
-          <w:rFonts w:cs="Times New Roman"/>
-          <w:i/>
-        </w:rPr>
-        <w:t>Sibatik Journal</w:t>
-      </w:r>
-      <w:r>
-        <w:rPr>
-          <w:rFonts w:cs="Times New Roman"/>
-        </w:rPr>
-        <w:t>, 1(6):951–966.</w:t>
+        <w:t xml:space="preserve">Nyrhinen, J., Sirola, A., Koskelainen, T., Munnukka, J., and Wilska, T.-A. (2024). Online antecedents for young consumers' impulse buying behavior. </w:t>
+      </w:r>
+      <w:r>
+        <w:rPr>
+          <w:rFonts w:cs="Times New Roman"/>
+          <w:i/>
+        </w:rPr>
+        <w:t>Computers in Human Behavior</w:t>
+      </w:r>
+      <w:r>
+        <w:rPr>
+          <w:rFonts w:cs="Times New Roman"/>
+        </w:rPr>
+        <w:t>, 153:108129.</w:t>
       </w:r>
       <w:bookmarkEnd w:id="148"/>
     </w:p>
@@ -31885,6 +31944,34 @@
         <w:jc w:val="both"/>
       </w:pPr>
       <w:bookmarkStart w:id="149" w:name="Ref_rook1987buying"/>
+      <w:r>
+        <w:rPr>
+          <w:rFonts w:cs="Times New Roman"/>
+        </w:rPr>
+        <w:t xml:space="preserve">Pranggabayu, B. and Andjarwati, A. L. (2022). Pengaruh hedonic shopping motivation dan store atmosphere terhadap impulsive buying. </w:t>
+      </w:r>
+      <w:r>
+        <w:rPr>
+          <w:rFonts w:cs="Times New Roman"/>
+          <w:i/>
+        </w:rPr>
+        <w:t>Sibatik Journal</w:t>
+      </w:r>
+      <w:r>
+        <w:rPr>
+          <w:rFonts w:cs="Times New Roman"/>
+        </w:rPr>
+        <w:t>, 1(6):951–966.</w:t>
+      </w:r>
+      <w:bookmarkEnd w:id="149"/>
+    </w:p>
+    <w:p>
+      <w:pPr>
+        <w:spacing w:after="120"/>
+        <w:ind w:left="709" w:hanging="709"/>
+        <w:jc w:val="both"/>
+      </w:pPr>
+      <w:bookmarkStart w:id="150" w:name="Ref_rook1995normative"/>
       <w:r>
         <w:rPr>
           <w:rFonts w:cs="Times New Roman"/>
@@ -31912,7 +31999,7 @@
         </w:rPr>
         <w:t xml:space="preserve"> (Diakses 18 September 2026).</w:t>
       </w:r>
-      <w:bookmarkEnd w:id="149"/>
+      <w:bookmarkEnd w:id="150"/>
     </w:p>
     <w:p>
       <w:pPr>
@@ -31920,12 +32007,19 @@
         <w:ind w:left="709" w:hanging="709"/>
         <w:jc w:val="both"/>
       </w:pPr>
-      <w:bookmarkStart w:id="150" w:name="Ref_rook1995normative"/>
-      <w:r>
-        <w:rPr>
-          <w:rFonts w:cs="Times New Roman"/>
-        </w:rPr>
-        <w:t xml:space="preserve">Prihatiningrum, Y. and Said, L. R. (2021). The effect of imprudence, self-indulgence, and lack of self-control on male shoppers' impulse buying behavior: A case in Indonesia. </w:t>
+      <w:bookmarkStart w:id="151" w:name="Ref_sekaran2016research"/>
+      <w:r>
+        <w:rPr>
+          <w:rFonts w:cs="Times New Roman"/>
+        </w:rPr>
+        <w:t xml:space="preserve">Prihatiningrum, Y. and Said, L. R. (2021). The effect of imprudence, self-indulgence, and lack of self-control on male shoppers' impulse buying </w:t>
+      </w:r>
+      <w:r>
+        <w:rPr>
+          <w:rFonts w:cs="Times New Roman"/>
+        </w:rPr>
+        <w:lastRenderedPageBreak/>
+        <w:t xml:space="preserve">behavior: A case in Indonesia. </w:t>
       </w:r>
       <w:r>
         <w:rPr>
@@ -31940,7 +32034,7 @@
         </w:rPr>
         <w:t>, 193:76–82.</w:t>
       </w:r>
-      <w:bookmarkEnd w:id="150"/>
+      <w:bookmarkEnd w:id="151"/>
     </w:p>
     <w:p>
       <w:pPr>
@@ -31948,12 +32042,11 @@
         <w:ind w:left="709" w:hanging="709"/>
         <w:jc w:val="both"/>
       </w:pPr>
-      <w:bookmarkStart w:id="151" w:name="Ref_sekaran2016research"/>
-      <w:r>
-        <w:rPr>
-          <w:rFonts w:cs="Times New Roman"/>
-        </w:rPr>
-        <w:lastRenderedPageBreak/>
+      <w:bookmarkStart w:id="152" w:name="Ref_shiller2000irrational"/>
+      <w:r>
+        <w:rPr>
+          <w:rFonts w:cs="Times New Roman"/>
+        </w:rPr>
         <w:t xml:space="preserve">Qu, Y., Khan, J., Su, Y., Tong, J., and Zhao, S. (2023). Impulse buying tendency in live-stream commerce: The role of viewing frequency and anticipated emotions influencing scarcity-induced purchase decision. </w:t>
       </w:r>
       <w:r>
@@ -31969,7 +32062,7 @@
         </w:rPr>
         <w:t>, 75:103534. Faktor situasional kelangkaan dan stimulus emosional terhadap impulse buying; pengganti peck2006if.</w:t>
       </w:r>
-      <w:bookmarkEnd w:id="151"/>
+      <w:bookmarkEnd w:id="152"/>
     </w:p>
     <w:p>
       <w:pPr>
@@ -31977,27 +32070,27 @@
         <w:ind w:left="709" w:hanging="709"/>
         <w:jc w:val="both"/>
       </w:pPr>
-      <w:bookmarkStart w:id="152" w:name="Ref_shiller2000irrational"/>
-      <w:r>
-        <w:rPr>
-          <w:rFonts w:cs="Times New Roman"/>
-        </w:rPr>
-        <w:t xml:space="preserve">Rafael, D. N. and Lopes, E. L. (2023). Ego depletion in consumer behavior: A review, synthesis, and research agenda. </w:t>
-      </w:r>
-      <w:r>
-        <w:rPr>
-          <w:rFonts w:cs="Times New Roman"/>
-          <w:i/>
-        </w:rPr>
-        <w:t>Journal of Consumer Behaviour</w:t>
-      </w:r>
-      <w:r>
-        <w:rPr>
-          <w:rFonts w:cs="Times New Roman"/>
-        </w:rPr>
-        <w:t>, 22(3):755–781.</w:t>
-      </w:r>
-      <w:bookmarkEnd w:id="152"/>
+      <w:bookmarkStart w:id="153" w:name="Ref_simon1955behavioral"/>
+      <w:r>
+        <w:rPr>
+          <w:rFonts w:cs="Times New Roman"/>
+        </w:rPr>
+        <w:t xml:space="preserve">Rafael, D. N. and Lopes, E. L. (2023). A estrutura intelectual da depleção do ego: Tópicos emergentes, tendências e oportunidades de pesquisas futuras. </w:t>
+      </w:r>
+      <w:r>
+        <w:rPr>
+          <w:rFonts w:cs="Times New Roman"/>
+          <w:i/>
+        </w:rPr>
+        <w:t>ReMark -- Revista Brasileira de Marketing</w:t>
+      </w:r>
+      <w:r>
+        <w:rPr>
+          <w:rFonts w:cs="Times New Roman"/>
+        </w:rPr>
+        <w:t>, 22(2):734–782.</w:t>
+      </w:r>
+      <w:bookmarkEnd w:id="153"/>
     </w:p>
     <w:p>
       <w:pPr>
@@ -32005,7 +32098,7 @@
         <w:ind w:left="709" w:hanging="709"/>
         <w:jc w:val="both"/>
       </w:pPr>
-      <w:bookmarkStart w:id="153" w:name="Ref_simon1955behavioral"/>
+      <w:bookmarkStart w:id="154" w:name="Ref_statista2024pokemon"/>
       <w:r>
         <w:rPr>
           <w:rFonts w:cs="Times New Roman"/>
@@ -32025,7 +32118,7 @@
         </w:rPr>
         <w:t>, 14(2):189–199.</w:t>
       </w:r>
-      <w:bookmarkEnd w:id="153"/>
+      <w:bookmarkEnd w:id="154"/>
     </w:p>
     <w:p>
       <w:pPr>
@@ -32033,7 +32126,7 @@
         <w:ind w:left="709" w:hanging="709"/>
         <w:jc w:val="both"/>
       </w:pPr>
-      <w:bookmarkStart w:id="154" w:name="Ref_statista2024pokemon"/>
+      <w:bookmarkStart w:id="155" w:name="Ref_stern1962significance"/>
       <w:r>
         <w:rPr>
           <w:rFonts w:cs="Times New Roman"/>
@@ -32053,7 +32146,7 @@
         </w:rPr>
         <w:t>. John Wiley &amp; Sons, Chichester, West Sussex, 7th edition.</w:t>
       </w:r>
-      <w:bookmarkEnd w:id="154"/>
+      <w:bookmarkEnd w:id="155"/>
     </w:p>
     <w:p>
       <w:pPr>
@@ -32061,7 +32154,7 @@
         <w:ind w:left="709" w:hanging="709"/>
         <w:jc w:val="both"/>
       </w:pPr>
-      <w:bookmarkStart w:id="155" w:name="Ref_stern1962significance"/>
+      <w:bookmarkStart w:id="156" w:name="Ref_sugiyono2019metode"/>
       <w:r>
         <w:rPr>
           <w:rFonts w:cs="Times New Roman"/>
@@ -32081,7 +32174,7 @@
         </w:rPr>
         <w:t>. Princeton University Press, Princeton, NJ.</w:t>
       </w:r>
-      <w:bookmarkEnd w:id="155"/>
+      <w:bookmarkEnd w:id="156"/>
     </w:p>
     <w:p>
       <w:pPr>
@@ -32089,7 +32182,7 @@
         <w:ind w:left="709" w:hanging="709"/>
         <w:jc w:val="both"/>
       </w:pPr>
-      <w:bookmarkStart w:id="156" w:name="Ref_sugiyono2019metode"/>
+      <w:bookmarkStart w:id="157" w:name="Ref_sultan2012building"/>
       <w:r>
         <w:rPr>
           <w:rFonts w:cs="Times New Roman"/>
@@ -32109,7 +32202,7 @@
         </w:rPr>
         <w:t>, 22(5):1265–1281.</w:t>
       </w:r>
-      <w:bookmarkEnd w:id="156"/>
+      <w:bookmarkEnd w:id="157"/>
     </w:p>
     <w:p>
       <w:pPr>
@@ -32117,7 +32210,7 @@
         <w:ind w:left="709" w:hanging="709"/>
         <w:jc w:val="both"/>
       </w:pPr>
-      <w:bookmarkStart w:id="157" w:name="Ref_sultan2012building"/>
+      <w:bookmarkStart w:id="158" w:name="Ref_tangney2004high"/>
       <w:r>
         <w:rPr>
           <w:rFonts w:cs="Times New Roman"/>
@@ -32145,7 +32238,7 @@
         </w:rPr>
         <w:t xml:space="preserve"> (Diakses 18 September 2026).</w:t>
       </w:r>
-      <w:bookmarkEnd w:id="157"/>
+      <w:bookmarkEnd w:id="158"/>
     </w:p>
     <w:p>
       <w:pPr>
@@ -32153,7 +32246,7 @@
         <w:ind w:left="709" w:hanging="709"/>
         <w:jc w:val="both"/>
       </w:pPr>
-      <w:bookmarkStart w:id="158" w:name="Ref_tangney2004high"/>
+      <w:bookmarkStart w:id="159" w:name="Ref_thaler1985mental"/>
       <w:r>
         <w:rPr>
           <w:rFonts w:cs="Times New Roman"/>
@@ -32173,7 +32266,7 @@
         </w:rPr>
         <w:t>. Alfabeta, Bandung.</w:t>
       </w:r>
-      <w:bookmarkEnd w:id="158"/>
+      <w:bookmarkEnd w:id="159"/>
     </w:p>
     <w:p>
       <w:pPr>
@@ -32181,7 +32274,7 @@
         <w:ind w:left="709" w:hanging="709"/>
         <w:jc w:val="both"/>
       </w:pPr>
-      <w:bookmarkStart w:id="159" w:name="Ref_thaler1985mental"/>
+      <w:bookmarkStart w:id="160" w:name="Ref_thaler1981economic"/>
       <w:r>
         <w:rPr>
           <w:rFonts w:cs="Times New Roman"/>
@@ -32201,7 +32294,7 @@
         </w:rPr>
         <w:t>, 72(2):271–324.</w:t>
       </w:r>
-      <w:bookmarkEnd w:id="159"/>
+      <w:bookmarkEnd w:id="160"/>
     </w:p>
     <w:p>
       <w:pPr>
@@ -32209,7 +32302,7 @@
         <w:ind w:left="709" w:hanging="709"/>
         <w:jc w:val="both"/>
       </w:pPr>
-      <w:bookmarkStart w:id="160" w:name="Ref_thaler1981economic"/>
+      <w:bookmarkStart w:id="161" w:name="Ref_pokemoncompany2024"/>
       <w:r>
         <w:rPr>
           <w:rFonts w:cs="Times New Roman"/>
@@ -32237,7 +32330,7 @@
         </w:rPr>
         <w:t xml:space="preserve"> (Diakses 15 Januari 2025).</w:t>
       </w:r>
-      <w:bookmarkEnd w:id="160"/>
+      <w:bookmarkEnd w:id="161"/>
     </w:p>
     <w:p>
       <w:pPr>
@@ -32245,11 +32338,12 @@
         <w:ind w:left="709" w:hanging="709"/>
         <w:jc w:val="both"/>
       </w:pPr>
-      <w:bookmarkStart w:id="161" w:name="Ref_pokemoncompany2024"/>
-      <w:r>
-        <w:rPr>
-          <w:rFonts w:cs="Times New Roman"/>
-        </w:rPr>
+      <w:bookmarkStart w:id="162" w:name="Ref_tirtayasa2020effect"/>
+      <w:r>
+        <w:rPr>
+          <w:rFonts w:cs="Times New Roman"/>
+        </w:rPr>
+        <w:lastRenderedPageBreak/>
         <w:t xml:space="preserve">Tirtayasa, S., Nevianda, M., and Syahrial, H. (2020). The effect of hedonic shopping motivation, shopping lifestyle and fashion involvement with impulse buying. </w:t>
       </w:r>
       <w:r>
@@ -32265,7 +32359,7 @@
         </w:rPr>
         <w:t>, 2(1):18–28.</w:t>
       </w:r>
-      <w:bookmarkEnd w:id="161"/>
+      <w:bookmarkEnd w:id="162"/>
     </w:p>
     <w:p>
       <w:pPr>
@@ -32273,12 +32367,11 @@
         <w:ind w:left="709" w:hanging="709"/>
         <w:jc w:val="both"/>
       </w:pPr>
-      <w:bookmarkStart w:id="162" w:name="Ref_tirtayasa2020effect"/>
-      <w:r>
-        <w:rPr>
-          <w:rFonts w:cs="Times New Roman"/>
-        </w:rPr>
-        <w:lastRenderedPageBreak/>
+      <w:bookmarkStart w:id="163" w:name="Ref_verplanken2001individual"/>
+      <w:r>
+        <w:rPr>
+          <w:rFonts w:cs="Times New Roman"/>
+        </w:rPr>
         <w:t xml:space="preserve">Verplanken, B. and Herabadi, A. (2001). Individual differences in impulse buying tendency: Feeling and no thinking. </w:t>
       </w:r>
       <w:r>
@@ -32294,7 +32387,7 @@
         </w:rPr>
         <w:t>, 15(S1):S71–S83.</w:t>
       </w:r>
-      <w:bookmarkEnd w:id="162"/>
+      <w:bookmarkEnd w:id="163"/>
     </w:p>
     <w:p>
       <w:pPr>
@@ -32302,7 +32395,7 @@
         <w:ind w:left="709" w:hanging="709"/>
         <w:jc w:val="both"/>
       </w:pPr>
-      <w:bookmarkStart w:id="163" w:name="Ref_verplanken2001individual"/>
+      <w:bookmarkStart w:id="164" w:name="Ref_vohs2007spent"/>
       <w:r>
         <w:rPr>
           <w:rFonts w:cs="Times New Roman"/>
@@ -32322,7 +32415,7 @@
         </w:rPr>
         <w:t>, 19(2):1104.</w:t>
       </w:r>
-      <w:bookmarkEnd w:id="163"/>
+      <w:bookmarkEnd w:id="164"/>
     </w:p>
     <w:p>
       <w:pPr>
@@ -32330,7 +32423,7 @@
         <w:ind w:left="709" w:hanging="709"/>
         <w:jc w:val="both"/>
       </w:pPr>
-      <w:bookmarkStart w:id="164" w:name="Ref_vohs2007spent"/>
+      <w:bookmarkStart w:id="165" w:name="Ref_zeigarnik1927behalten"/>
       <w:r>
         <w:rPr>
           <w:rFonts w:cs="Times New Roman"/>
@@ -32350,7 +32443,7 @@
         </w:rPr>
         <w:t>, 9:1–85.</w:t>
       </w:r>
-      <w:bookmarkEnd w:id="164"/>
+      <w:bookmarkEnd w:id="165"/>
     </w:p>
     <w:p>
       <w:pPr>
@@ -32358,7 +32451,7 @@
         <w:ind w:left="709" w:hanging="709"/>
         <w:jc w:val="both"/>
       </w:pPr>
-      <w:bookmarkStart w:id="165" w:name="Ref_zeigarnik1927behalten"/>
+      <w:bookmarkStart w:id="166" w:name="Ref_zhang2022uncertainty"/>
       <w:r>
         <w:rPr>
           <w:rFonts w:cs="Times New Roman"/>
@@ -32377,34 +32470,6 @@
           <w:rFonts w:cs="Times New Roman"/>
         </w:rPr>
         <w:t>, 13:946527. Ketidakpastian produk blind-box dan evaluasi nilai konsumen; pengganti long2000consuming.</w:t>
-      </w:r>
-      <w:bookmarkEnd w:id="165"/>
-    </w:p>
-    <w:p>
-      <w:pPr>
-        <w:spacing w:after="120"/>
-        <w:ind w:left="709" w:hanging="709"/>
-        <w:jc w:val="both"/>
-      </w:pPr>
-      <w:bookmarkStart w:id="166" w:name="Ref_zhang2022uncertainty"/>
-      <w:r>
-        <w:rPr>
-          <w:rFonts w:cs="Times New Roman"/>
-        </w:rPr>
-        <w:t xml:space="preserve">Zhao, G., Liu, X., Tan, H., and Yang, S. (2025). The effect of self-control on impulsive consumption with the moderators of family socioeconomic status and peer feedback. </w:t>
-      </w:r>
-      <w:r>
-        <w:rPr>
-          <w:rFonts w:cs="Times New Roman"/>
-          <w:i/>
-        </w:rPr>
-        <w:t>Asian Journal of Social Psychology</w:t>
-      </w:r>
-      <w:r>
-        <w:rPr>
-          <w:rFonts w:cs="Times New Roman"/>
-        </w:rPr>
-        <w:t>, 28(1):e12663.</w:t>
       </w:r>
       <w:bookmarkEnd w:id="166"/>
     </w:p>
@@ -32779,31 +32844,31 @@
       </w:rPr>
     </w:lvl>
   </w:abstractNum>
-  <w:num w:numId="1" w16cid:durableId="51539195">
+  <w:num w:numId="1" w16cid:durableId="384763771">
     <w:abstractNumId w:val="8"/>
   </w:num>
-  <w:num w:numId="2" w16cid:durableId="1201479954">
+  <w:num w:numId="2" w16cid:durableId="1548251927">
     <w:abstractNumId w:val="6"/>
   </w:num>
-  <w:num w:numId="3" w16cid:durableId="1549873776">
+  <w:num w:numId="3" w16cid:durableId="892889753">
     <w:abstractNumId w:val="5"/>
   </w:num>
-  <w:num w:numId="4" w16cid:durableId="579876151">
+  <w:num w:numId="4" w16cid:durableId="257834976">
     <w:abstractNumId w:val="4"/>
   </w:num>
-  <w:num w:numId="5" w16cid:durableId="1176648745">
+  <w:num w:numId="5" w16cid:durableId="194732817">
     <w:abstractNumId w:val="7"/>
   </w:num>
-  <w:num w:numId="6" w16cid:durableId="2026247626">
+  <w:num w:numId="6" w16cid:durableId="1649242089">
     <w:abstractNumId w:val="3"/>
   </w:num>
-  <w:num w:numId="7" w16cid:durableId="529729775">
+  <w:num w:numId="7" w16cid:durableId="1875923640">
     <w:abstractNumId w:val="2"/>
   </w:num>
-  <w:num w:numId="8" w16cid:durableId="2086031223">
+  <w:num w:numId="8" w16cid:durableId="65230189">
     <w:abstractNumId w:val="1"/>
   </w:num>
-  <w:num w:numId="9" w16cid:durableId="1055590053">
+  <w:num w:numId="9" w16cid:durableId="1267349169">
     <w:abstractNumId w:val="0"/>
   </w:num>
 </w:numbering>
@@ -44244,7 +44309,7 @@
     <w:autoRedefine/>
     <w:uiPriority w:val="39"/>
     <w:unhideWhenUsed/>
-    <w:rsid w:val="007E784D"/>
+    <w:rsid w:val="00C1042E"/>
     <w:pPr>
       <w:spacing w:after="40" w:line="240" w:lineRule="auto"/>
     </w:pPr>
@@ -44260,7 +44325,7 @@
     <w:autoRedefine/>
     <w:uiPriority w:val="39"/>
     <w:unhideWhenUsed/>
-    <w:rsid w:val="007E784D"/>
+    <w:rsid w:val="00C1042E"/>
     <w:pPr>
       <w:spacing w:after="40" w:line="240" w:lineRule="auto"/>
       <w:ind w:left="360"/>
@@ -44276,7 +44341,7 @@
     <w:autoRedefine/>
     <w:uiPriority w:val="39"/>
     <w:unhideWhenUsed/>
-    <w:rsid w:val="007E784D"/>
+    <w:rsid w:val="00C1042E"/>
     <w:pPr>
       <w:spacing w:after="40" w:line="240" w:lineRule="auto"/>
       <w:ind w:left="720"/>
@@ -44291,7 +44356,7 @@
     <w:basedOn w:val="DefaultParagraphFont"/>
     <w:uiPriority w:val="99"/>
     <w:unhideWhenUsed/>
-    <w:rsid w:val="007E784D"/>
+    <w:rsid w:val="00C1042E"/>
     <w:rPr>
       <w:color w:val="0000FF" w:themeColor="hyperlink"/>
       <w:u w:val="single"/>

</xml_diff>

<commit_message>
fix: selaraskan narasi justifikasi M* di Bab 3 (eliminasi residu teks Tabel 1.1)
</commit_message>
<xml_diff>
--- a/01_Naskah_Utama/Proposal_Arthur_PokemonTCG.docx
+++ b/01_Naskah_Utama/Proposal_Arthur_PokemonTCG.docx
@@ -12,7 +12,7 @@
           <w:noProof/>
         </w:rPr>
         <w:drawing>
-          <wp:inline distT="0" distB="0" distL="0" distR="0" wp14:anchorId="2966E4F4" wp14:editId="6B6A272D">
+          <wp:inline distT="0" distB="0" distL="0" distR="0" wp14:anchorId="4A9CA9AD" wp14:editId="77261F78">
             <wp:extent cx="1152000" cy="1152000"/>
             <wp:effectExtent l="0" t="0" r="0" b="0"/>
             <wp:docPr id="1" name="Picture 1"/>
@@ -275,7 +275,7 @@
         <w:outlineLvl w:val="0"/>
       </w:pPr>
       <w:bookmarkStart w:id="0" w:name="TOC_PERNYATAAN_KEASLIAN_KARYA_TUGAS_AKHI"/>
-      <w:bookmarkStart w:id="1" w:name="_Toc243390533"/>
+      <w:bookmarkStart w:id="1" w:name="_Toc243489231"/>
       <w:r>
         <w:rPr>
           <w:rFonts w:ascii="Times New Roman" w:hAnsi="Times New Roman"/>
@@ -847,7 +847,7 @@
         <w:outlineLvl w:val="0"/>
       </w:pPr>
       <w:bookmarkStart w:id="2" w:name="TOC_HALAMAN_PERSETUJUAN_PROPOSAL_SKRIPSI"/>
-      <w:bookmarkStart w:id="3" w:name="_Toc243390534"/>
+      <w:bookmarkStart w:id="3" w:name="_Toc243489232"/>
       <w:r>
         <w:rPr>
           <w:rFonts w:ascii="Times New Roman" w:hAnsi="Times New Roman"/>
@@ -1405,7 +1405,7 @@
         <w:outlineLvl w:val="0"/>
       </w:pPr>
       <w:bookmarkStart w:id="4" w:name="TOC_HALAMAN_PENGESAHAN_TIM_PENGUJI_SEMIN"/>
-      <w:bookmarkStart w:id="5" w:name="_Toc243390535"/>
+      <w:bookmarkStart w:id="5" w:name="_Toc243489233"/>
       <w:r>
         <w:rPr>
           <w:rFonts w:ascii="Times New Roman" w:hAnsi="Times New Roman"/>
@@ -1763,7 +1763,7 @@
         <w:outlineLvl w:val="0"/>
       </w:pPr>
       <w:bookmarkStart w:id="6" w:name="TOC_KATA_PENGANTAR"/>
-      <w:bookmarkStart w:id="7" w:name="_Toc243390536"/>
+      <w:bookmarkStart w:id="7" w:name="_Toc243489234"/>
       <w:r>
         <w:rPr>
           <w:rFonts w:ascii="Times New Roman" w:hAnsi="Times New Roman"/>
@@ -2054,7 +2054,7 @@
         <w:outlineLvl w:val="0"/>
       </w:pPr>
       <w:bookmarkStart w:id="8" w:name="TOC_ABSTRAK"/>
-      <w:bookmarkStart w:id="9" w:name="_Toc243390537"/>
+      <w:bookmarkStart w:id="9" w:name="_Toc243489235"/>
       <w:r>
         <w:rPr>
           <w:rFonts w:ascii="Times New Roman" w:hAnsi="Times New Roman"/>
@@ -2578,7 +2578,7 @@
         <w:outlineLvl w:val="0"/>
       </w:pPr>
       <w:bookmarkStart w:id="10" w:name="TOC_ABSTRACT"/>
-      <w:bookmarkStart w:id="11" w:name="_Toc243390538"/>
+      <w:bookmarkStart w:id="11" w:name="_Toc243489236"/>
       <w:r>
         <w:rPr>
           <w:rFonts w:ascii="Times New Roman" w:hAnsi="Times New Roman"/>
@@ -2994,7 +2994,7 @@
           <w14:ligatures w14:val="standardContextual"/>
         </w:rPr>
       </w:pPr>
-      <w:hyperlink w:anchor="_Toc243390539" w:history="1">
+      <w:hyperlink w:anchor="_Toc243489237" w:history="1">
         <w:r>
           <w:rPr>
             <w:noProof/>
@@ -4919,7 +4919,7 @@
         <w:spacing w:after="360"/>
         <w:outlineLvl w:val="0"/>
       </w:pPr>
-      <w:bookmarkStart w:id="13" w:name="_Toc243390539"/>
+      <w:bookmarkStart w:id="13" w:name="_Toc243489237"/>
       <w:r>
         <w:rPr>
           <w:rFonts w:ascii="Times New Roman" w:hAnsi="Times New Roman"/>
@@ -5055,7 +5055,7 @@
         <w:outlineLvl w:val="0"/>
       </w:pPr>
       <w:bookmarkStart w:id="14" w:name="TOC_DAFTAR_GAMBAR"/>
-      <w:bookmarkStart w:id="15" w:name="_Toc243390540"/>
+      <w:bookmarkStart w:id="15" w:name="_Toc243489238"/>
       <w:r>
         <w:rPr>
           <w:rFonts w:ascii="Times New Roman" w:hAnsi="Times New Roman"/>
@@ -5234,7 +5234,7 @@
         <w:outlineLvl w:val="0"/>
       </w:pPr>
       <w:bookmarkStart w:id="16" w:name="TOC_BAB_I_PENDAHULUAN"/>
-      <w:bookmarkStart w:id="17" w:name="_Toc243390541"/>
+      <w:bookmarkStart w:id="17" w:name="_Toc243489239"/>
       <w:r>
         <w:rPr>
           <w:rFonts w:ascii="Times New Roman" w:hAnsi="Times New Roman"/>
@@ -5272,7 +5272,7 @@
         <w:outlineLvl w:val="1"/>
       </w:pPr>
       <w:bookmarkStart w:id="18" w:name="TOC_1_1_LATAR_BELAKANG_PENELITIAN"/>
-      <w:bookmarkStart w:id="19" w:name="_Toc243390542"/>
+      <w:bookmarkStart w:id="19" w:name="_Toc243489240"/>
       <w:r>
         <w:rPr>
           <w:rFonts w:ascii="Times New Roman" w:hAnsi="Times New Roman"/>
@@ -5524,7 +5524,7 @@
           <w:noProof/>
         </w:rPr>
         <w:drawing>
-          <wp:inline distT="0" distB="0" distL="0" distR="0" wp14:anchorId="626DCE93" wp14:editId="299AC687">
+          <wp:inline distT="0" distB="0" distL="0" distR="0" wp14:anchorId="0C9245B1" wp14:editId="62885DF5">
             <wp:extent cx="4860000" cy="2980356"/>
             <wp:effectExtent l="0" t="0" r="0" b="0"/>
             <wp:docPr id="2" name="Picture 2"/>
@@ -5736,7 +5736,7 @@
           <w:noProof/>
         </w:rPr>
         <w:drawing>
-          <wp:inline distT="0" distB="0" distL="0" distR="0" wp14:anchorId="31BEFCD0" wp14:editId="06F59441">
+          <wp:inline distT="0" distB="0" distL="0" distR="0" wp14:anchorId="248964DC" wp14:editId="45EF1221">
             <wp:extent cx="4860000" cy="2719286"/>
             <wp:effectExtent l="0" t="0" r="0" b="0"/>
             <wp:docPr id="3" name="Picture 3"/>
@@ -6405,7 +6405,7 @@
           <w:noProof/>
         </w:rPr>
         <w:drawing>
-          <wp:inline distT="0" distB="0" distL="0" distR="0" wp14:anchorId="1645292E" wp14:editId="76497996">
+          <wp:inline distT="0" distB="0" distL="0" distR="0" wp14:anchorId="7F975D64" wp14:editId="6CE6CAA0">
             <wp:extent cx="4860000" cy="2818800"/>
             <wp:effectExtent l="0" t="0" r="0" b="0"/>
             <wp:docPr id="4" name="Picture 4"/>
@@ -9260,7 +9260,7 @@
         <w:outlineLvl w:val="1"/>
       </w:pPr>
       <w:bookmarkStart w:id="23" w:name="TOC_1_2_PERUMUSAN_MASALAH"/>
-      <w:bookmarkStart w:id="24" w:name="_Toc243390543"/>
+      <w:bookmarkStart w:id="24" w:name="_Toc243489241"/>
       <w:r>
         <w:rPr>
           <w:rFonts w:ascii="Times New Roman" w:hAnsi="Times New Roman"/>
@@ -9685,7 +9685,7 @@
         <w:outlineLvl w:val="1"/>
       </w:pPr>
       <w:bookmarkStart w:id="25" w:name="TOC_1_3_TUJUAN_PENELITIAN"/>
-      <w:bookmarkStart w:id="26" w:name="_Toc243390544"/>
+      <w:bookmarkStart w:id="26" w:name="_Toc243489242"/>
       <w:r>
         <w:rPr>
           <w:rFonts w:ascii="Times New Roman" w:hAnsi="Times New Roman"/>
@@ -10111,7 +10111,7 @@
         <w:outlineLvl w:val="1"/>
       </w:pPr>
       <w:bookmarkStart w:id="27" w:name="TOC_1_4_MANFAAT_PENELITIAN"/>
-      <w:bookmarkStart w:id="28" w:name="_Toc243390545"/>
+      <w:bookmarkStart w:id="28" w:name="_Toc243489243"/>
       <w:r>
         <w:rPr>
           <w:rFonts w:ascii="Times New Roman" w:hAnsi="Times New Roman"/>
@@ -10143,7 +10143,7 @@
         <w:outlineLvl w:val="2"/>
       </w:pPr>
       <w:bookmarkStart w:id="29" w:name="TOC_1_4_1_MANFAAT_TEORETIS"/>
-      <w:bookmarkStart w:id="30" w:name="_Toc243390546"/>
+      <w:bookmarkStart w:id="30" w:name="_Toc243489244"/>
       <w:r>
         <w:rPr>
           <w:rFonts w:ascii="Times New Roman" w:hAnsi="Times New Roman"/>
@@ -10375,7 +10375,7 @@
         <w:outlineLvl w:val="2"/>
       </w:pPr>
       <w:bookmarkStart w:id="31" w:name="TOC_1_4_2_MANFAAT_PRAKTIS"/>
-      <w:bookmarkStart w:id="32" w:name="_Toc243390547"/>
+      <w:bookmarkStart w:id="32" w:name="_Toc243489245"/>
       <w:r>
         <w:rPr>
           <w:rFonts w:ascii="Times New Roman" w:hAnsi="Times New Roman"/>
@@ -10523,7 +10523,7 @@
         <w:outlineLvl w:val="0"/>
       </w:pPr>
       <w:bookmarkStart w:id="33" w:name="TOC_BAB_II_KAJIAN_PUSTAKA_DAN_PENGEMBANG"/>
-      <w:bookmarkStart w:id="34" w:name="_Toc243390548"/>
+      <w:bookmarkStart w:id="34" w:name="_Toc243489246"/>
       <w:r>
         <w:rPr>
           <w:rFonts w:ascii="Times New Roman" w:hAnsi="Times New Roman"/>
@@ -10561,7 +10561,7 @@
         <w:outlineLvl w:val="1"/>
       </w:pPr>
       <w:bookmarkStart w:id="35" w:name="TOC_2_1_LANDASAN_TEORI"/>
-      <w:bookmarkStart w:id="36" w:name="_Toc243390549"/>
+      <w:bookmarkStart w:id="36" w:name="_Toc243489247"/>
       <w:r>
         <w:rPr>
           <w:rFonts w:ascii="Times New Roman" w:hAnsi="Times New Roman"/>
@@ -10580,7 +10580,7 @@
         <w:outlineLvl w:val="2"/>
       </w:pPr>
       <w:bookmarkStart w:id="37" w:name="TOC_2_1_1_LANDASAN_TEORETIS_PENDEKATAN_K"/>
-      <w:bookmarkStart w:id="38" w:name="_Toc243390550"/>
+      <w:bookmarkStart w:id="38" w:name="_Toc243489248"/>
       <w:r>
         <w:rPr>
           <w:rFonts w:ascii="Times New Roman" w:hAnsi="Times New Roman"/>
@@ -10970,7 +10970,7 @@
         <w:outlineLvl w:val="2"/>
       </w:pPr>
       <w:bookmarkStart w:id="39" w:name="TOC_2_1_2_PENDEKATAN_STIMULUS_ORGANISM_R"/>
-      <w:bookmarkStart w:id="40" w:name="_Toc243390551"/>
+      <w:bookmarkStart w:id="40" w:name="_Toc243489249"/>
       <w:r>
         <w:rPr>
           <w:rFonts w:ascii="Times New Roman" w:hAnsi="Times New Roman"/>
@@ -11337,7 +11337,7 @@
         <w:outlineLvl w:val="2"/>
       </w:pPr>
       <w:bookmarkStart w:id="41" w:name="TOC_2_1_3_PSIKOLOGI_KOLEKTOR_DAN_COLLECT"/>
-      <w:bookmarkStart w:id="42" w:name="_Toc243390552"/>
+      <w:bookmarkStart w:id="42" w:name="_Toc243489250"/>
       <w:r>
         <w:rPr>
           <w:rFonts w:ascii="Times New Roman" w:hAnsi="Times New Roman"/>
@@ -11541,7 +11541,7 @@
         <w:outlineLvl w:val="2"/>
       </w:pPr>
       <w:bookmarkStart w:id="43" w:name="TOC_2_1_4_TEORI_REGULASI_DIRI_SELF_REGUL"/>
-      <w:bookmarkStart w:id="44" w:name="_Toc243390553"/>
+      <w:bookmarkStart w:id="44" w:name="_Toc243489251"/>
       <w:r>
         <w:rPr>
           <w:rFonts w:ascii="Times New Roman" w:hAnsi="Times New Roman"/>
@@ -11687,7 +11687,7 @@
         <w:outlineLvl w:val="1"/>
       </w:pPr>
       <w:bookmarkStart w:id="45" w:name="TOC_2_2_KAJIAN_VARIABEL_PENELITIAN"/>
-      <w:bookmarkStart w:id="46" w:name="_Toc243390554"/>
+      <w:bookmarkStart w:id="46" w:name="_Toc243489252"/>
       <w:r>
         <w:rPr>
           <w:rFonts w:ascii="Times New Roman" w:hAnsi="Times New Roman"/>
@@ -11706,7 +11706,7 @@
         <w:outlineLvl w:val="2"/>
       </w:pPr>
       <w:bookmarkStart w:id="47" w:name="TOC_2_2_1_VARIABEL_DEPENDEN_Y_PEMBELIAN_"/>
-      <w:bookmarkStart w:id="48" w:name="_Toc243390555"/>
+      <w:bookmarkStart w:id="48" w:name="_Toc243489253"/>
       <w:r>
         <w:rPr>
           <w:rFonts w:ascii="Times New Roman" w:hAnsi="Times New Roman"/>
@@ -11885,7 +11885,7 @@
         <w:outlineLvl w:val="2"/>
       </w:pPr>
       <w:bookmarkStart w:id="49" w:name="TOC_2_2_2_VARIABEL_INDEPENDEN_X₁_MOTIVAS"/>
-      <w:bookmarkStart w:id="50" w:name="_Toc243390556"/>
+      <w:bookmarkStart w:id="50" w:name="_Toc243489254"/>
       <w:r>
         <w:rPr>
           <w:rFonts w:ascii="Times New Roman" w:hAnsi="Times New Roman"/>
@@ -12075,7 +12075,7 @@
         <w:outlineLvl w:val="2"/>
       </w:pPr>
       <w:bookmarkStart w:id="51" w:name="TOC_2_2_3_VARIABEL_INDEPENDEN_X₂_HASRAT_"/>
-      <w:bookmarkStart w:id="52" w:name="_Toc243390557"/>
+      <w:bookmarkStart w:id="52" w:name="_Toc243489255"/>
       <w:r>
         <w:rPr>
           <w:rFonts w:ascii="Times New Roman" w:hAnsi="Times New Roman"/>
@@ -12279,7 +12279,7 @@
         <w:outlineLvl w:val="2"/>
       </w:pPr>
       <w:bookmarkStart w:id="53" w:name="TOC_2_2_4_VARIABEL_INDEPENDEN_X₃_MOTIF_S"/>
-      <w:bookmarkStart w:id="54" w:name="_Toc243390558"/>
+      <w:bookmarkStart w:id="54" w:name="_Toc243489256"/>
       <w:r>
         <w:rPr>
           <w:rFonts w:ascii="Times New Roman" w:hAnsi="Times New Roman"/>
@@ -12534,7 +12534,7 @@
         <w:outlineLvl w:val="2"/>
       </w:pPr>
       <w:bookmarkStart w:id="55" w:name="TOC_2_2_5_VARIABEL_MODERASI_M_KONTROL_DI"/>
-      <w:bookmarkStart w:id="56" w:name="_Toc243390559"/>
+      <w:bookmarkStart w:id="56" w:name="_Toc243489257"/>
       <w:r>
         <w:rPr>
           <w:rFonts w:ascii="Times New Roman" w:hAnsi="Times New Roman"/>
@@ -12787,7 +12787,7 @@
         <w:outlineLvl w:val="1"/>
       </w:pPr>
       <w:bookmarkStart w:id="57" w:name="TOC_2_3_PENELITIAN_SEBELUMNYA"/>
-      <w:bookmarkStart w:id="58" w:name="_Toc243390560"/>
+      <w:bookmarkStart w:id="58" w:name="_Toc243489258"/>
       <w:r>
         <w:rPr>
           <w:rFonts w:ascii="Times New Roman" w:hAnsi="Times New Roman"/>
@@ -15123,7 +15123,7 @@
         <w:outlineLvl w:val="1"/>
       </w:pPr>
       <w:bookmarkStart w:id="60" w:name="TOC_2_4_PENGEMBANGAN_HIPOTESIS"/>
-      <w:bookmarkStart w:id="61" w:name="_Toc243390561"/>
+      <w:bookmarkStart w:id="61" w:name="_Toc243489259"/>
       <w:r>
         <w:rPr>
           <w:rFonts w:ascii="Times New Roman" w:hAnsi="Times New Roman"/>
@@ -15142,7 +15142,7 @@
         <w:outlineLvl w:val="2"/>
       </w:pPr>
       <w:bookmarkStart w:id="62" w:name="TOC_2_4_1_PENGARUH_HEDONIC_MOTIVATION_TE"/>
-      <w:bookmarkStart w:id="63" w:name="_Toc243390562"/>
+      <w:bookmarkStart w:id="63" w:name="_Toc243489260"/>
       <w:r>
         <w:rPr>
           <w:rFonts w:ascii="Times New Roman" w:hAnsi="Times New Roman"/>
@@ -15456,7 +15456,7 @@
         <w:outlineLvl w:val="2"/>
       </w:pPr>
       <w:bookmarkStart w:id="64" w:name="TOC_2_4_2_PENGARUH_DESIRE_FOR_COMPLETENE"/>
-      <w:bookmarkStart w:id="65" w:name="_Toc243390563"/>
+      <w:bookmarkStart w:id="65" w:name="_Toc243489261"/>
       <w:r>
         <w:rPr>
           <w:rFonts w:ascii="Times New Roman" w:hAnsi="Times New Roman"/>
@@ -15864,7 +15864,7 @@
         <w:outlineLvl w:val="2"/>
       </w:pPr>
       <w:bookmarkStart w:id="66" w:name="TOC_2_4_3_PENGARUH_SPECULATIVE_MOTIVE_TE"/>
-      <w:bookmarkStart w:id="67" w:name="_Toc243390564"/>
+      <w:bookmarkStart w:id="67" w:name="_Toc243489262"/>
       <w:r>
         <w:rPr>
           <w:rFonts w:ascii="Times New Roman" w:hAnsi="Times New Roman"/>
@@ -16257,7 +16257,7 @@
         <w:outlineLvl w:val="2"/>
       </w:pPr>
       <w:bookmarkStart w:id="68" w:name="TOC_2_4_4_PENGARUH_MODERASI_SELF_CONTROL"/>
-      <w:bookmarkStart w:id="69" w:name="_Toc243390565"/>
+      <w:bookmarkStart w:id="69" w:name="_Toc243489263"/>
       <w:r>
         <w:rPr>
           <w:rFonts w:ascii="Times New Roman" w:hAnsi="Times New Roman"/>
@@ -16579,7 +16579,7 @@
         <w:outlineLvl w:val="2"/>
       </w:pPr>
       <w:bookmarkStart w:id="70" w:name="TOC_2_4_5_PENGARUH_MODERASI_SELF_CONTROL"/>
-      <w:bookmarkStart w:id="71" w:name="_Toc243390566"/>
+      <w:bookmarkStart w:id="71" w:name="_Toc243489264"/>
       <w:r>
         <w:rPr>
           <w:rFonts w:ascii="Times New Roman" w:hAnsi="Times New Roman"/>
@@ -16860,7 +16860,7 @@
         <w:outlineLvl w:val="2"/>
       </w:pPr>
       <w:bookmarkStart w:id="72" w:name="TOC_2_4_6_PENGARUH_MODERASI_SELF_CONTROL"/>
-      <w:bookmarkStart w:id="73" w:name="_Toc243390567"/>
+      <w:bookmarkStart w:id="73" w:name="_Toc243489265"/>
       <w:r>
         <w:rPr>
           <w:rFonts w:ascii="Times New Roman" w:hAnsi="Times New Roman"/>
@@ -17189,7 +17189,7 @@
         <w:outlineLvl w:val="1"/>
       </w:pPr>
       <w:bookmarkStart w:id="74" w:name="TOC_2_5_RERANGKA_PENELITIAN"/>
-      <w:bookmarkStart w:id="75" w:name="_Toc243390568"/>
+      <w:bookmarkStart w:id="75" w:name="_Toc243489266"/>
       <w:r>
         <w:rPr>
           <w:rFonts w:ascii="Times New Roman" w:hAnsi="Times New Roman"/>
@@ -17226,7 +17226,7 @@
         </w:rPr>
         <w:lastRenderedPageBreak/>
         <w:drawing>
-          <wp:inline distT="0" distB="0" distL="0" distR="0" wp14:anchorId="7BCA7250" wp14:editId="20906CF6">
+          <wp:inline distT="0" distB="0" distL="0" distR="0" wp14:anchorId="6CF83B5B" wp14:editId="0A0A0D2B">
             <wp:extent cx="5040000" cy="7127304"/>
             <wp:effectExtent l="0" t="0" r="0" b="0"/>
             <wp:docPr id="5" name="Picture 5"/>
@@ -17302,7 +17302,7 @@
         <w:outlineLvl w:val="0"/>
       </w:pPr>
       <w:bookmarkStart w:id="77" w:name="TOC_BAB_III_METODE_PENELITIAN"/>
-      <w:bookmarkStart w:id="78" w:name="_Toc243390569"/>
+      <w:bookmarkStart w:id="78" w:name="_Toc243489267"/>
       <w:r>
         <w:rPr>
           <w:rFonts w:ascii="Times New Roman" w:hAnsi="Times New Roman"/>
@@ -17340,7 +17340,7 @@
         <w:outlineLvl w:val="1"/>
       </w:pPr>
       <w:bookmarkStart w:id="79" w:name="TOC_3_1_JENIS_DAN_SUMBER_DATA"/>
-      <w:bookmarkStart w:id="80" w:name="_Toc243390570"/>
+      <w:bookmarkStart w:id="80" w:name="_Toc243489268"/>
       <w:r>
         <w:rPr>
           <w:rFonts w:ascii="Times New Roman" w:hAnsi="Times New Roman"/>
@@ -18058,7 +18058,7 @@
         <w:outlineLvl w:val="2"/>
       </w:pPr>
       <w:bookmarkStart w:id="82" w:name="TOC_3_1_1_BATASAN_PENELITIAN_DAN_RUANG_L"/>
-      <w:bookmarkStart w:id="83" w:name="_Toc243390571"/>
+      <w:bookmarkStart w:id="83" w:name="_Toc243489269"/>
       <w:r>
         <w:rPr>
           <w:rFonts w:ascii="Times New Roman" w:hAnsi="Times New Roman"/>
@@ -18354,7 +18354,7 @@
         <w:outlineLvl w:val="1"/>
       </w:pPr>
       <w:bookmarkStart w:id="84" w:name="TOC_3_2_POPULASI_DAN_SAMPEL"/>
-      <w:bookmarkStart w:id="85" w:name="_Toc243390572"/>
+      <w:bookmarkStart w:id="85" w:name="_Toc243489270"/>
       <w:r>
         <w:rPr>
           <w:rFonts w:ascii="Times New Roman" w:hAnsi="Times New Roman"/>
@@ -18373,7 +18373,7 @@
         <w:outlineLvl w:val="2"/>
       </w:pPr>
       <w:bookmarkStart w:id="86" w:name="TOC_3_2_1_POPULASI_DAN_IDENTIFIKASI_SUMB"/>
-      <w:bookmarkStart w:id="87" w:name="_Toc243390573"/>
+      <w:bookmarkStart w:id="87" w:name="_Toc243489271"/>
       <w:r>
         <w:rPr>
           <w:rFonts w:ascii="Times New Roman" w:hAnsi="Times New Roman"/>
@@ -18593,7 +18593,7 @@
         <w:outlineLvl w:val="2"/>
       </w:pPr>
       <w:bookmarkStart w:id="88" w:name="TOC_3_2_2_SAMPEL_DAN_JUSTIFIKASI_KRITERI"/>
-      <w:bookmarkStart w:id="89" w:name="_Toc243390574"/>
+      <w:bookmarkStart w:id="89" w:name="_Toc243489272"/>
       <w:r>
         <w:rPr>
           <w:rFonts w:ascii="Times New Roman" w:hAnsi="Times New Roman"/>
@@ -19081,7 +19081,7 @@
         <w:outlineLvl w:val="2"/>
       </w:pPr>
       <w:bookmarkStart w:id="90" w:name="TOC_3_2_3_PROSEDUR_DISTRIBUSI_KUESIONER_"/>
-      <w:bookmarkStart w:id="91" w:name="_Toc243390575"/>
+      <w:bookmarkStart w:id="91" w:name="_Toc243489273"/>
       <w:r>
         <w:rPr>
           <w:rFonts w:ascii="Times New Roman" w:hAnsi="Times New Roman"/>
@@ -19347,7 +19347,7 @@
         <w:outlineLvl w:val="2"/>
       </w:pPr>
       <w:bookmarkStart w:id="92" w:name="TOC_3_2_4_PENENTUAN_UKURAN_SAMPEL"/>
-      <w:bookmarkStart w:id="93" w:name="_Toc243390576"/>
+      <w:bookmarkStart w:id="93" w:name="_Toc243489274"/>
       <w:r>
         <w:rPr>
           <w:rFonts w:ascii="Times New Roman" w:hAnsi="Times New Roman"/>
@@ -20030,7 +20030,7 @@
         <w:outlineLvl w:val="2"/>
       </w:pPr>
       <w:bookmarkStart w:id="94" w:name="TOC_3_2_5_JUSTIFIKASI_KOMPARATIF_PEMILIH"/>
-      <w:bookmarkStart w:id="95" w:name="_Toc243390577"/>
+      <w:bookmarkStart w:id="95" w:name="_Toc243489275"/>
       <w:r>
         <w:rPr>
           <w:rFonts w:ascii="Times New Roman" w:hAnsi="Times New Roman"/>
@@ -20295,7 +20295,7 @@
         <w:outlineLvl w:val="1"/>
       </w:pPr>
       <w:bookmarkStart w:id="96" w:name="TOC_3_3_MODEL_PENELITIAN"/>
-      <w:bookmarkStart w:id="97" w:name="_Toc243390578"/>
+      <w:bookmarkStart w:id="97" w:name="_Toc243489276"/>
       <w:r>
         <w:rPr>
           <w:rFonts w:ascii="Times New Roman" w:hAnsi="Times New Roman"/>
@@ -22009,33 +22009,7 @@
           <w:rFonts w:cs="Times New Roman"/>
         </w:rPr>
         <w:lastRenderedPageBreak/>
-        <w:t xml:space="preserve">hipotesis tersendiri dan tidak memiliki pasangan RM/Tujuan/H (hipotesis penelitian tetap 6: H1–H3 langsung, H4–H6 moderasi memperlemah). Baris 4 pada matriks kesenjangan (Subjek </w:t>
-      </w:r>
-      <w:r>
-        <w:rPr>
-          <w:rFonts w:cs="Times New Roman"/>
-          <w:i/>
-        </w:rPr>
-        <w:t>M*</w:t>
-      </w:r>
-      <w:r>
-        <w:rPr>
-          <w:rFonts w:cs="Times New Roman"/>
-        </w:rPr>
-        <w:t xml:space="preserve"> terhadap </w:t>
-      </w:r>
-      <w:r>
-        <w:rPr>
-          <w:rFonts w:cs="Times New Roman"/>
-          <w:i/>
-        </w:rPr>
-        <w:t>Y</w:t>
-      </w:r>
-      <w:r>
-        <w:rPr>
-          <w:rFonts w:cs="Times New Roman"/>
-        </w:rPr>
-        <w:t xml:space="preserve">) berfungsi sebagai justifikasi teoretis perlunya memasukkan </w:t>
+        <w:t xml:space="preserve">hipotesis tersendiri dan tidak memiliki pasangan RM/Tujuan/H (hipotesis penelitian tetap 6: H1–H3 langsung, H4–H6 moderasi memperlemah). Uraian kesenjangan penelitian pada latar belakang mengenai pengaruh langsung kontrol diri terhadap pembelian impulsif berfungsi sebagai justifikasi teoretis perlunya memasukkan </w:t>
       </w:r>
       <w:r>
         <w:rPr>
@@ -22325,7 +22299,7 @@
         <w:outlineLvl w:val="1"/>
       </w:pPr>
       <w:bookmarkStart w:id="98" w:name="TOC_3_4_OPERASIONALISASI_VARIABEL"/>
-      <w:bookmarkStart w:id="99" w:name="_Toc243390579"/>
+      <w:bookmarkStart w:id="99" w:name="_Toc243489277"/>
       <w:r>
         <w:rPr>
           <w:rFonts w:ascii="Times New Roman" w:hAnsi="Times New Roman"/>
@@ -26280,7 +26254,7 @@
         <w:outlineLvl w:val="1"/>
       </w:pPr>
       <w:bookmarkStart w:id="101" w:name="TOC_3_5_METODE_ANALISIS_DATA"/>
-      <w:bookmarkStart w:id="102" w:name="_Toc243390580"/>
+      <w:bookmarkStart w:id="102" w:name="_Toc243489278"/>
       <w:r>
         <w:rPr>
           <w:rFonts w:ascii="Times New Roman" w:hAnsi="Times New Roman"/>
@@ -26299,7 +26273,7 @@
         <w:outlineLvl w:val="2"/>
       </w:pPr>
       <w:bookmarkStart w:id="103" w:name="TOC_3_5_1_JUSTIFIKASI_KOMPARATIF_PEMILIH"/>
-      <w:bookmarkStart w:id="104" w:name="_Toc243390581"/>
+      <w:bookmarkStart w:id="104" w:name="_Toc243489279"/>
       <w:r>
         <w:rPr>
           <w:rFonts w:ascii="Times New Roman" w:hAnsi="Times New Roman"/>
@@ -27779,7 +27753,7 @@
         <w:outlineLvl w:val="1"/>
       </w:pPr>
       <w:bookmarkStart w:id="105" w:name="TOC_3_6_DIAGRAM_ALUR_PENELITIAN"/>
-      <w:bookmarkStart w:id="106" w:name="_Toc243390582"/>
+      <w:bookmarkStart w:id="106" w:name="_Toc243489280"/>
       <w:r>
         <w:rPr>
           <w:rFonts w:ascii="Times New Roman" w:hAnsi="Times New Roman"/>
@@ -27816,7 +27790,7 @@
         </w:rPr>
         <w:lastRenderedPageBreak/>
         <w:drawing>
-          <wp:inline distT="0" distB="0" distL="0" distR="0" wp14:anchorId="5FB0E39F" wp14:editId="201924D4">
+          <wp:inline distT="0" distB="0" distL="0" distR="0" wp14:anchorId="3EA7EEE2" wp14:editId="4B8419C9">
             <wp:extent cx="4680000" cy="4701382"/>
             <wp:effectExtent l="0" t="0" r="0" b="0"/>
             <wp:docPr id="6" name="Picture 6"/>
@@ -28196,7 +28170,7 @@
         <w:outlineLvl w:val="1"/>
       </w:pPr>
       <w:bookmarkStart w:id="108" w:name="TOC_3_7_JADWAL_PELAKSANAAN_PENELITIAN"/>
-      <w:bookmarkStart w:id="109" w:name="_Toc243390583"/>
+      <w:bookmarkStart w:id="109" w:name="_Toc243489281"/>
       <w:r>
         <w:rPr>
           <w:rFonts w:ascii="Times New Roman" w:hAnsi="Times New Roman"/>
@@ -30147,7 +30121,7 @@
         <w:outlineLvl w:val="0"/>
       </w:pPr>
       <w:bookmarkStart w:id="111" w:name="TOC_DAFTAR_PUSTAKA"/>
-      <w:bookmarkStart w:id="112" w:name="_Toc243390584"/>
+      <w:bookmarkStart w:id="112" w:name="_Toc243489282"/>
       <w:r>
         <w:rPr>
           <w:rFonts w:ascii="Times New Roman" w:hAnsi="Times New Roman"/>
@@ -32063,31 +32037,31 @@
       </w:rPr>
     </w:lvl>
   </w:abstractNum>
-  <w:num w:numId="1" w16cid:durableId="2134863161">
+  <w:num w:numId="1" w16cid:durableId="1100679526">
     <w:abstractNumId w:val="8"/>
   </w:num>
-  <w:num w:numId="2" w16cid:durableId="263462576">
+  <w:num w:numId="2" w16cid:durableId="1037315671">
     <w:abstractNumId w:val="6"/>
   </w:num>
-  <w:num w:numId="3" w16cid:durableId="1609850405">
+  <w:num w:numId="3" w16cid:durableId="768089995">
     <w:abstractNumId w:val="5"/>
   </w:num>
-  <w:num w:numId="4" w16cid:durableId="1248150896">
+  <w:num w:numId="4" w16cid:durableId="1372876906">
     <w:abstractNumId w:val="4"/>
   </w:num>
-  <w:num w:numId="5" w16cid:durableId="248389352">
+  <w:num w:numId="5" w16cid:durableId="435684289">
     <w:abstractNumId w:val="7"/>
   </w:num>
-  <w:num w:numId="6" w16cid:durableId="1473446876">
+  <w:num w:numId="6" w16cid:durableId="1228153294">
     <w:abstractNumId w:val="3"/>
   </w:num>
-  <w:num w:numId="7" w16cid:durableId="1969508799">
+  <w:num w:numId="7" w16cid:durableId="1382821737">
     <w:abstractNumId w:val="2"/>
   </w:num>
-  <w:num w:numId="8" w16cid:durableId="44526184">
+  <w:num w:numId="8" w16cid:durableId="1744134916">
     <w:abstractNumId w:val="1"/>
   </w:num>
-  <w:num w:numId="9" w16cid:durableId="1088501069">
+  <w:num w:numId="9" w16cid:durableId="851844001">
     <w:abstractNumId w:val="0"/>
   </w:num>
 </w:numbering>
@@ -43528,7 +43502,7 @@
     <w:autoRedefine/>
     <w:uiPriority w:val="39"/>
     <w:unhideWhenUsed/>
-    <w:rsid w:val="00A04F14"/>
+    <w:rsid w:val="00E279B2"/>
     <w:pPr>
       <w:spacing w:after="40" w:line="240" w:lineRule="auto"/>
     </w:pPr>
@@ -43544,7 +43518,7 @@
     <w:autoRedefine/>
     <w:uiPriority w:val="39"/>
     <w:unhideWhenUsed/>
-    <w:rsid w:val="00A04F14"/>
+    <w:rsid w:val="00E279B2"/>
     <w:pPr>
       <w:spacing w:after="40" w:line="240" w:lineRule="auto"/>
       <w:ind w:left="360"/>
@@ -43560,7 +43534,7 @@
     <w:autoRedefine/>
     <w:uiPriority w:val="39"/>
     <w:unhideWhenUsed/>
-    <w:rsid w:val="00A04F14"/>
+    <w:rsid w:val="00E279B2"/>
     <w:pPr>
       <w:spacing w:after="40" w:line="240" w:lineRule="auto"/>
       <w:ind w:left="720"/>
@@ -43575,7 +43549,7 @@
     <w:basedOn w:val="DefaultParagraphFont"/>
     <w:uiPriority w:val="99"/>
     <w:unhideWhenUsed/>
-    <w:rsid w:val="00A04F14"/>
+    <w:rsid w:val="00E279B2"/>
     <w:rPr>
       <w:color w:val="0000FF" w:themeColor="hyperlink"/>
       <w:u w:val="single"/>

</xml_diff>

<commit_message>
style: refinement 17 diksi S1 Manajemen alami & eliminasi frasa lebay/hiperbolis (D39)
</commit_message>
<xml_diff>
--- a/01_Naskah_Utama/Proposal_Arthur_PokemonTCG.docx
+++ b/01_Naskah_Utama/Proposal_Arthur_PokemonTCG.docx
@@ -12,7 +12,7 @@
           <w:noProof/>
         </w:rPr>
         <w:drawing>
-          <wp:inline distT="0" distB="0" distL="0" distR="0" wp14:anchorId="4A9CA9AD" wp14:editId="77261F78">
+          <wp:inline distT="0" distB="0" distL="0" distR="0" wp14:anchorId="26878180" wp14:editId="377FE26B">
             <wp:extent cx="1152000" cy="1152000"/>
             <wp:effectExtent l="0" t="0" r="0" b="0"/>
             <wp:docPr id="1" name="Picture 1"/>
@@ -275,7 +275,7 @@
         <w:outlineLvl w:val="0"/>
       </w:pPr>
       <w:bookmarkStart w:id="0" w:name="TOC_PERNYATAAN_KEASLIAN_KARYA_TUGAS_AKHI"/>
-      <w:bookmarkStart w:id="1" w:name="_Toc243489231"/>
+      <w:bookmarkStart w:id="1" w:name="_Toc243493309"/>
       <w:r>
         <w:rPr>
           <w:rFonts w:ascii="Times New Roman" w:hAnsi="Times New Roman"/>
@@ -847,7 +847,7 @@
         <w:outlineLvl w:val="0"/>
       </w:pPr>
       <w:bookmarkStart w:id="2" w:name="TOC_HALAMAN_PERSETUJUAN_PROPOSAL_SKRIPSI"/>
-      <w:bookmarkStart w:id="3" w:name="_Toc243489232"/>
+      <w:bookmarkStart w:id="3" w:name="_Toc243493310"/>
       <w:r>
         <w:rPr>
           <w:rFonts w:ascii="Times New Roman" w:hAnsi="Times New Roman"/>
@@ -1405,7 +1405,7 @@
         <w:outlineLvl w:val="0"/>
       </w:pPr>
       <w:bookmarkStart w:id="4" w:name="TOC_HALAMAN_PENGESAHAN_TIM_PENGUJI_SEMIN"/>
-      <w:bookmarkStart w:id="5" w:name="_Toc243489233"/>
+      <w:bookmarkStart w:id="5" w:name="_Toc243493311"/>
       <w:r>
         <w:rPr>
           <w:rFonts w:ascii="Times New Roman" w:hAnsi="Times New Roman"/>
@@ -1763,7 +1763,7 @@
         <w:outlineLvl w:val="0"/>
       </w:pPr>
       <w:bookmarkStart w:id="6" w:name="TOC_KATA_PENGANTAR"/>
-      <w:bookmarkStart w:id="7" w:name="_Toc243489234"/>
+      <w:bookmarkStart w:id="7" w:name="_Toc243493312"/>
       <w:r>
         <w:rPr>
           <w:rFonts w:ascii="Times New Roman" w:hAnsi="Times New Roman"/>
@@ -2054,7 +2054,7 @@
         <w:outlineLvl w:val="0"/>
       </w:pPr>
       <w:bookmarkStart w:id="8" w:name="TOC_ABSTRAK"/>
-      <w:bookmarkStart w:id="9" w:name="_Toc243489235"/>
+      <w:bookmarkStart w:id="9" w:name="_Toc243493313"/>
       <w:r>
         <w:rPr>
           <w:rFonts w:ascii="Times New Roman" w:hAnsi="Times New Roman"/>
@@ -2578,7 +2578,7 @@
         <w:outlineLvl w:val="0"/>
       </w:pPr>
       <w:bookmarkStart w:id="10" w:name="TOC_ABSTRACT"/>
-      <w:bookmarkStart w:id="11" w:name="_Toc243489236"/>
+      <w:bookmarkStart w:id="11" w:name="_Toc243493314"/>
       <w:r>
         <w:rPr>
           <w:rFonts w:ascii="Times New Roman" w:hAnsi="Times New Roman"/>
@@ -2994,7 +2994,7 @@
           <w14:ligatures w14:val="standardContextual"/>
         </w:rPr>
       </w:pPr>
-      <w:hyperlink w:anchor="_Toc243489237" w:history="1">
+      <w:hyperlink w:anchor="_Toc243493315" w:history="1">
         <w:r>
           <w:rPr>
             <w:noProof/>
@@ -4919,7 +4919,7 @@
         <w:spacing w:after="360"/>
         <w:outlineLvl w:val="0"/>
       </w:pPr>
-      <w:bookmarkStart w:id="13" w:name="_Toc243489237"/>
+      <w:bookmarkStart w:id="13" w:name="_Toc243493315"/>
       <w:r>
         <w:rPr>
           <w:rFonts w:ascii="Times New Roman" w:hAnsi="Times New Roman"/>
@@ -5055,7 +5055,7 @@
         <w:outlineLvl w:val="0"/>
       </w:pPr>
       <w:bookmarkStart w:id="14" w:name="TOC_DAFTAR_GAMBAR"/>
-      <w:bookmarkStart w:id="15" w:name="_Toc243489238"/>
+      <w:bookmarkStart w:id="15" w:name="_Toc243493316"/>
       <w:r>
         <w:rPr>
           <w:rFonts w:ascii="Times New Roman" w:hAnsi="Times New Roman"/>
@@ -5234,7 +5234,7 @@
         <w:outlineLvl w:val="0"/>
       </w:pPr>
       <w:bookmarkStart w:id="16" w:name="TOC_BAB_I_PENDAHULUAN"/>
-      <w:bookmarkStart w:id="17" w:name="_Toc243489239"/>
+      <w:bookmarkStart w:id="17" w:name="_Toc243493317"/>
       <w:r>
         <w:rPr>
           <w:rFonts w:ascii="Times New Roman" w:hAnsi="Times New Roman"/>
@@ -5272,7 +5272,7 @@
         <w:outlineLvl w:val="1"/>
       </w:pPr>
       <w:bookmarkStart w:id="18" w:name="TOC_1_1_LATAR_BELAKANG_PENELITIAN"/>
-      <w:bookmarkStart w:id="19" w:name="_Toc243489240"/>
+      <w:bookmarkStart w:id="19" w:name="_Toc243493318"/>
       <w:r>
         <w:rPr>
           <w:rFonts w:ascii="Times New Roman" w:hAnsi="Times New Roman"/>
@@ -5524,7 +5524,7 @@
           <w:noProof/>
         </w:rPr>
         <w:drawing>
-          <wp:inline distT="0" distB="0" distL="0" distR="0" wp14:anchorId="0C9245B1" wp14:editId="62885DF5">
+          <wp:inline distT="0" distB="0" distL="0" distR="0" wp14:anchorId="401DF152" wp14:editId="57BFB772">
             <wp:extent cx="4860000" cy="2980356"/>
             <wp:effectExtent l="0" t="0" r="0" b="0"/>
             <wp:docPr id="2" name="Picture 2"/>
@@ -5736,7 +5736,7 @@
           <w:noProof/>
         </w:rPr>
         <w:drawing>
-          <wp:inline distT="0" distB="0" distL="0" distR="0" wp14:anchorId="248964DC" wp14:editId="45EF1221">
+          <wp:inline distT="0" distB="0" distL="0" distR="0" wp14:anchorId="70ED7664" wp14:editId="60E3BC55">
             <wp:extent cx="4860000" cy="2719286"/>
             <wp:effectExtent l="0" t="0" r="0" b="0"/>
             <wp:docPr id="3" name="Picture 3"/>
@@ -5812,13 +5812,13 @@
         <w:rPr>
           <w:rFonts w:cs="Times New Roman"/>
         </w:rPr>
-        <w:t>Berdasarkan Gambar 1.2, terlihat jelas terjadinya lonjakan produksi kartu fisik yang sangat tajam dalam lima tahun terakhir. Pada Maret 2019, total produksi kumulatif global tercatat sebesar 28,8 miliar lembar kartu. Namun, pasca dimulainya ekspansi pencetakan kartu versi resmi bahasa lokal, termasuk peluncuran resmi kartu berbahasa Indonesia pada Agustus 2019 serta meledaknya tren hobi koleksi fisik selama masa pandemi, akumulasi produksi meroket sebesar 125% hingga menembus 64,8 miliar lembar kartu pada M</w:t>
-      </w:r>
-      <w:r>
-        <w:rPr>
-          <w:rFonts w:cs="Times New Roman"/>
-        </w:rPr>
-        <w:t>aret 2024 (The Pok{é}mon Company, 2024). Pencetakan lebih dari 11,9 miliar lembar kartu hanya dalam kurun waktu satu tahun fiskal (2023–2024) mengindikasikan tingginya permintaan pasar dan membuktikan tingginya antusiasme belanja di kalangan konsumen.</w:t>
+        <w:t xml:space="preserve">Berdasarkan Gambar 1.2, terlihat jelas terjadinya lonjakan produksi kartu fisik yang sangat tajam dalam lima tahun terakhir. Pada Maret 2019, total produksi kumulatif global tercatat sebesar 28,8 miliar lembar kartu. Namun, pasca dimulainya ekspansi pencetakan kartu versi resmi bahasa lokal, termasuk peluncuran resmi kartu berbahasa Indonesia pada Agustus 2019 serta meningkatnya tren hobi koleksi fisik selama masa pandemi, total produksi naik sebesar 125% hingga menembus 64,8 miliar lembar kartu pada Maret </w:t>
+      </w:r>
+      <w:r>
+        <w:rPr>
+          <w:rFonts w:cs="Times New Roman"/>
+        </w:rPr>
+        <w:t>2024 (The Pok{é}mon Company, 2024). Pencetakan lebih dari 11,9 miliar lembar kartu hanya dalam kurun waktu satu tahun fiskal (2023–2024) mengindikasikan tingginya permintaan pasar dan membuktikan tingginya antusiasme belanja di kalangan konsumen.</w:t>
       </w:r>
     </w:p>
     <w:p>
@@ -6013,20 +6013,7 @@
         <w:rPr>
           <w:rFonts w:cs="Times New Roman"/>
         </w:rPr>
-        <w:t>). Di pasar sekunder daring (Tokopedia, Shopee, grup lelang Facebook, dan komunitas media sosial), kartu-kartu berkarakter favorit (seperti Charizard, Pikachu, atau kartu pelatih wanita (</w:t>
-      </w:r>
-      <w:r>
-        <w:rPr>
-          <w:rFonts w:cs="Times New Roman"/>
-          <w:i/>
-        </w:rPr>
-        <w:t>waifu</w:t>
-      </w:r>
-      <w:r>
-        <w:rPr>
-          <w:rFonts w:cs="Times New Roman"/>
-        </w:rPr>
-        <w:t xml:space="preserve">) populer) diperjualbelikan dengan harga fantastis mulai dari ratusan ribu hingga puluhan juta rupiah per lembar (lih. pantauan pasar sekunder </w:t>
+        <w:t xml:space="preserve">). Di pasar sekunder daring (Tokopedia, Shopee, grup lelang Facebook, dan komunitas media sosial), kartu-kartu berkarakter favorit (seperti Charizard, Pikachu, atau kartu karakter pelatih wanita yang populer) dapat bernilai sangat tinggi, mulai dari ratusan ribu hingga puluhan juta rupiah per lembar (lih. pantauan pasar sekunder </w:t>
       </w:r>
       <w:hyperlink w:anchor="Ref_pricecharting2024" w:history="1">
         <w:r>
@@ -6307,7 +6294,7 @@
         <w:rPr>
           <w:rFonts w:cs="Times New Roman"/>
         </w:rPr>
-        <w:t xml:space="preserve"> ini memicu gelombang spekulasi (</w:t>
+        <w:t xml:space="preserve"> ini memicu spekulasi (</w:t>
       </w:r>
       <w:r>
         <w:rPr>
@@ -6320,7 +6307,7 @@
         <w:rPr>
           <w:rFonts w:cs="Times New Roman"/>
         </w:rPr>
-        <w:t xml:space="preserve">), di mana konsumen tergiur membeli </w:t>
+        <w:t xml:space="preserve">), di mana konsumen membeli </w:t>
       </w:r>
       <w:r>
         <w:rPr>
@@ -6333,14 +6320,14 @@
         <w:rPr>
           <w:rFonts w:cs="Times New Roman"/>
         </w:rPr>
-        <w:t xml:space="preserve"> murah </w:t>
+        <w:t xml:space="preserve"> dengan harapan </w:t>
       </w:r>
       <w:r>
         <w:rPr>
           <w:rFonts w:cs="Times New Roman"/>
         </w:rPr>
         <w:lastRenderedPageBreak/>
-        <w:t>dengan harapan menarik kartu berkondisi sempurna untuk digrade dan dijual kembali demi mendulang keuntungan modal (</w:t>
+        <w:t>mendapatkan kartu langka bernilai tinggi yang dapat dijual kembali demi keuntungan modal (</w:t>
       </w:r>
       <w:r>
         <w:rPr>
@@ -6405,7 +6392,7 @@
           <w:noProof/>
         </w:rPr>
         <w:drawing>
-          <wp:inline distT="0" distB="0" distL="0" distR="0" wp14:anchorId="7F975D64" wp14:editId="6CE6CAA0">
+          <wp:inline distT="0" distB="0" distL="0" distR="0" wp14:anchorId="1BBCF933" wp14:editId="3BB0D7B8">
             <wp:extent cx="4860000" cy="2818800"/>
             <wp:effectExtent l="0" t="0" r="0" b="0"/>
             <wp:docPr id="4" name="Picture 4"/>
@@ -6742,7 +6729,7 @@
         <w:rPr>
           <w:rFonts w:cs="Times New Roman"/>
         </w:rPr>
-        <w:t xml:space="preserve">. Konsumen yang semula hanya berbelanja kebutuhan harian terdorong menambah bungkus kartu ke keranjang semata karena dorongan emosi sesaat, penasaran merobek kemasan, dan harapan spekulatif. Pola inilah gejala </w:t>
+        <w:t xml:space="preserve">. Konsumen yang semula hanya berbelanja kebutuhan harian terdorong menambah bungkus kartu ke keranjang karena dorongan emosi sesaat, rasa penasaran saat membuka bungkus kartu, dan harapan memperoleh keuntungan. Pola inilah gejala </w:t>
       </w:r>
       <w:r>
         <w:rPr>
@@ -7624,7 +7611,46 @@
         <w:rPr>
           <w:rFonts w:cs="Times New Roman"/>
         </w:rPr>
-        <w:t xml:space="preserve">Ketika ketiga dorongan ini hadir secara bersamaan di hadapan display kasir ritel, yakni kesenangan merobek kemasan (afektif), obsesi melengkapi koleksi (kognitif), dan godaan keuntungan spekulatif (finansial), pertimbangan rasional konsumen melemah, sehingga terjadilah keputusan belanja seketika tanpa perencanaan anggaran yang disebut </w:t>
+        <w:t>Ketika ketiga dorongan ini hadir secara bersamaan di hadapan display kasir ritel, yakni kesenangan saat membuka kemasan (</w:t>
+      </w:r>
+      <w:r>
+        <w:rPr>
+          <w:rFonts w:cs="Times New Roman"/>
+          <w:i/>
+        </w:rPr>
+        <w:t>Hedonic Motivation</w:t>
+      </w:r>
+      <w:r>
+        <w:rPr>
+          <w:rFonts w:cs="Times New Roman"/>
+        </w:rPr>
+        <w:t>), keinginan melengkapi koleksi (</w:t>
+      </w:r>
+      <w:r>
+        <w:rPr>
+          <w:rFonts w:cs="Times New Roman"/>
+          <w:i/>
+        </w:rPr>
+        <w:t>Desire for Completeness</w:t>
+      </w:r>
+      <w:r>
+        <w:rPr>
+          <w:rFonts w:cs="Times New Roman"/>
+        </w:rPr>
+        <w:t>), dan harapan keuntungan finansial (</w:t>
+      </w:r>
+      <w:r>
+        <w:rPr>
+          <w:rFonts w:cs="Times New Roman"/>
+          <w:i/>
+        </w:rPr>
+        <w:t>Speculative Motive</w:t>
+      </w:r>
+      <w:r>
+        <w:rPr>
+          <w:rFonts w:cs="Times New Roman"/>
+        </w:rPr>
+        <w:t xml:space="preserve">), pertimbangan rasional konsumen melemah, sehingga terjadilah keputusan belanja seketika tanpa perencanaan anggaran yang disebut </w:t>
       </w:r>
       <w:r>
         <w:rPr>
@@ -8004,21 +8030,21 @@
           <w:rPr>
             <w:rFonts w:cs="Times New Roman"/>
           </w:rPr>
-          <w:t>, 2024)</w:t>
+          <w:t xml:space="preserve">, </w:t>
+        </w:r>
+        <w:r>
+          <w:rPr>
+            <w:rFonts w:cs="Times New Roman"/>
+          </w:rPr>
+          <w:lastRenderedPageBreak/>
+          <w:t>2024)</w:t>
         </w:r>
       </w:hyperlink>
       <w:r>
         <w:rPr>
           <w:rFonts w:cs="Times New Roman"/>
         </w:rPr>
-        <w:t xml:space="preserve"> menggarisbawahi batas rasionalitas konsumen: ketika individu memiliki </w:t>
-      </w:r>
-      <w:r>
-        <w:rPr>
-          <w:rFonts w:cs="Times New Roman"/>
-        </w:rPr>
-        <w:lastRenderedPageBreak/>
-        <w:t>batasan anggaran pengeluaran yang ketat, dorongan belanja hedonis dapat ditekan dan tidak selalu berujung pada pembelian impulsif. Perbedaan orientasi belanja antara pencarian kesenangan semata dan disiplin anggaran inilah yang menciptakan variasi hasil dalam berbagai situasi belanja.</w:t>
+        <w:t xml:space="preserve"> menggarisbawahi batas rasionalitas konsumen: ketika individu memiliki batasan anggaran pengeluaran yang ketat, dorongan belanja hedonis dapat ditekan dan tidak selalu berujung pada pembelian impulsif. Perbedaan orientasi belanja antara pencarian kesenangan semata dan disiplin anggaran inilah yang menciptakan variasi hasil dalam berbagai situasi belanja.</w:t>
       </w:r>
     </w:p>
     <w:p>
@@ -8420,7 +8446,14 @@
         <w:rPr>
           <w:rFonts w:cs="Times New Roman"/>
         </w:rPr>
-        <w:t xml:space="preserve"> Literatur psikologi konsumsi secara konsisten menempatkan kontrol diri sebagai faktor pengendali perilaku. Riset </w:t>
+        <w:t xml:space="preserve"> Literatur psikologi konsumsi secara konsisten menempatkan </w:t>
+      </w:r>
+      <w:r>
+        <w:rPr>
+          <w:rFonts w:cs="Times New Roman"/>
+        </w:rPr>
+        <w:lastRenderedPageBreak/>
+        <w:t xml:space="preserve">kontrol diri sebagai faktor pengendali perilaku. Riset </w:t>
       </w:r>
       <w:hyperlink w:anchor="Ref_baumeister2002yield" w:history="1">
         <w:r>
@@ -8448,7 +8481,6 @@
             <w:rFonts w:cs="Times New Roman"/>
             <w:i/>
           </w:rPr>
-          <w:lastRenderedPageBreak/>
           <w:t>et al.</w:t>
         </w:r>
         <w:r>
@@ -8558,20 +8590,7 @@
         <w:rPr>
           <w:rFonts w:cs="Times New Roman"/>
         </w:rPr>
-        <w:t xml:space="preserve"> menunjukkan bahwa ketika konsumen terpapar rangsangan sensorik yang luar biasa intens di area kasir toko, mekanisme kontrol diri kognitif dapat mengalami kelumpuhan sementara (</w:t>
-      </w:r>
-      <w:r>
-        <w:rPr>
-          <w:rFonts w:cs="Times New Roman"/>
-          <w:i/>
-        </w:rPr>
-        <w:t>cognitive bypass</w:t>
-      </w:r>
-      <w:r>
-        <w:rPr>
-          <w:rFonts w:cs="Times New Roman"/>
-        </w:rPr>
-        <w:t xml:space="preserve"> atau </w:t>
+        <w:t xml:space="preserve"> menunjukkan bahwa ketika konsumen melihat pajangan kartu yang menarik di dekat kasir toko, kontrol diri konsumen dapat melemah (</w:t>
       </w:r>
       <w:r>
         <w:rPr>
@@ -8584,7 +8603,7 @@
         <w:rPr>
           <w:rFonts w:cs="Times New Roman"/>
         </w:rPr>
-        <w:t>), sehingga individu tetap melakukan pembelian impulsif meskipun memiliki kontrol diri.</w:t>
+        <w:t>), sehingga individu tetap melakukan pembelian impulsif meskipun sebenarnya memiliki kontrol diri.</w:t>
       </w:r>
     </w:p>
     <w:p>
@@ -8748,6 +8767,7 @@
           <w:rFonts w:cs="Times New Roman"/>
           <w:i/>
         </w:rPr>
+        <w:lastRenderedPageBreak/>
         <w:t>Self-Regulation Theory</w:t>
       </w:r>
       <w:r>
@@ -8782,14 +8802,7 @@
         <w:rPr>
           <w:rFonts w:cs="Times New Roman"/>
         </w:rPr>
-        <w:t xml:space="preserve">) dan model </w:t>
-      </w:r>
-      <w:r>
-        <w:rPr>
-          <w:rFonts w:cs="Times New Roman"/>
-        </w:rPr>
-        <w:lastRenderedPageBreak/>
-        <w:t xml:space="preserve">regulasi diri </w:t>
+        <w:t xml:space="preserve">) dan model regulasi diri </w:t>
       </w:r>
       <w:hyperlink w:anchor="Ref_baumeister2024selfcontrol" w:history="1">
         <w:r>
@@ -9143,14 +9156,14 @@
         <w:rPr>
           <w:rFonts w:cs="Times New Roman"/>
         </w:rPr>
-        <w:t xml:space="preserve"> Pembatasan penelitian pada satu wilayah perkotaan yang seragam secara efektif mengendalikan faktor pengganggu eksternal, seperti perbedaan </w:t>
+        <w:t xml:space="preserve"> Pembatasan penelitian pada satu wilayah perkotaan yang seragam secara </w:t>
       </w:r>
       <w:r>
         <w:rPr>
           <w:rFonts w:cs="Times New Roman"/>
         </w:rPr>
         <w:lastRenderedPageBreak/>
-        <w:t>ketersediaan stok fisik antardaerah, biaya pengiriman, dan fluktuasi harga pasar sekunder antarkota di Indonesia, sehingga memperkuat validitas internal model penelitian.</w:t>
+        <w:t>efektif mengendalikan faktor pengganggu eksternal, seperti perbedaan ketersediaan stok fisik antardaerah, biaya pengiriman, dan fluktuasi harga pasar sekunder antarkota di Indonesia, sehingga memperkuat validitas internal model penelitian.</w:t>
       </w:r>
     </w:p>
     <w:p>
@@ -9260,7 +9273,7 @@
         <w:outlineLvl w:val="1"/>
       </w:pPr>
       <w:bookmarkStart w:id="23" w:name="TOC_1_2_PERUMUSAN_MASALAH"/>
-      <w:bookmarkStart w:id="24" w:name="_Toc243489241"/>
+      <w:bookmarkStart w:id="24" w:name="_Toc243493319"/>
       <w:r>
         <w:rPr>
           <w:rFonts w:ascii="Times New Roman" w:hAnsi="Times New Roman"/>
@@ -9685,7 +9698,7 @@
         <w:outlineLvl w:val="1"/>
       </w:pPr>
       <w:bookmarkStart w:id="25" w:name="TOC_1_3_TUJUAN_PENELITIAN"/>
-      <w:bookmarkStart w:id="26" w:name="_Toc243489242"/>
+      <w:bookmarkStart w:id="26" w:name="_Toc243493320"/>
       <w:r>
         <w:rPr>
           <w:rFonts w:ascii="Times New Roman" w:hAnsi="Times New Roman"/>
@@ -10111,7 +10124,7 @@
         <w:outlineLvl w:val="1"/>
       </w:pPr>
       <w:bookmarkStart w:id="27" w:name="TOC_1_4_MANFAAT_PENELITIAN"/>
-      <w:bookmarkStart w:id="28" w:name="_Toc243489243"/>
+      <w:bookmarkStart w:id="28" w:name="_Toc243493321"/>
       <w:r>
         <w:rPr>
           <w:rFonts w:ascii="Times New Roman" w:hAnsi="Times New Roman"/>
@@ -10143,7 +10156,7 @@
         <w:outlineLvl w:val="2"/>
       </w:pPr>
       <w:bookmarkStart w:id="29" w:name="TOC_1_4_1_MANFAAT_TEORETIS"/>
-      <w:bookmarkStart w:id="30" w:name="_Toc243489244"/>
+      <w:bookmarkStart w:id="30" w:name="_Toc243493322"/>
       <w:r>
         <w:rPr>
           <w:rFonts w:ascii="Times New Roman" w:hAnsi="Times New Roman"/>
@@ -10375,7 +10388,7 @@
         <w:outlineLvl w:val="2"/>
       </w:pPr>
       <w:bookmarkStart w:id="31" w:name="TOC_1_4_2_MANFAAT_PRAKTIS"/>
-      <w:bookmarkStart w:id="32" w:name="_Toc243489245"/>
+      <w:bookmarkStart w:id="32" w:name="_Toc243493323"/>
       <w:r>
         <w:rPr>
           <w:rFonts w:ascii="Times New Roman" w:hAnsi="Times New Roman"/>
@@ -10523,7 +10536,7 @@
         <w:outlineLvl w:val="0"/>
       </w:pPr>
       <w:bookmarkStart w:id="33" w:name="TOC_BAB_II_KAJIAN_PUSTAKA_DAN_PENGEMBANG"/>
-      <w:bookmarkStart w:id="34" w:name="_Toc243489246"/>
+      <w:bookmarkStart w:id="34" w:name="_Toc243493324"/>
       <w:r>
         <w:rPr>
           <w:rFonts w:ascii="Times New Roman" w:hAnsi="Times New Roman"/>
@@ -10561,7 +10574,7 @@
         <w:outlineLvl w:val="1"/>
       </w:pPr>
       <w:bookmarkStart w:id="35" w:name="TOC_2_1_LANDASAN_TEORI"/>
-      <w:bookmarkStart w:id="36" w:name="_Toc243489247"/>
+      <w:bookmarkStart w:id="36" w:name="_Toc243493325"/>
       <w:r>
         <w:rPr>
           <w:rFonts w:ascii="Times New Roman" w:hAnsi="Times New Roman"/>
@@ -10580,7 +10593,7 @@
         <w:outlineLvl w:val="2"/>
       </w:pPr>
       <w:bookmarkStart w:id="37" w:name="TOC_2_1_1_LANDASAN_TEORETIS_PENDEKATAN_K"/>
-      <w:bookmarkStart w:id="38" w:name="_Toc243489248"/>
+      <w:bookmarkStart w:id="38" w:name="_Toc243493326"/>
       <w:r>
         <w:rPr>
           <w:rFonts w:ascii="Times New Roman" w:hAnsi="Times New Roman"/>
@@ -10941,27 +10954,14 @@
         <w:rPr>
           <w:rFonts w:cs="Times New Roman"/>
         </w:rPr>
-        <w:t xml:space="preserve"> memberikan landasan penjelasan yang kuat. Kartu Pokémon fisik telah berkembang menjadi barang koleksi bernilai investasi yang penuh dengan bias perilaku keuangan: ilusi probabilitas menarik kartu </w:t>
-      </w:r>
-      <w:r>
-        <w:rPr>
-          <w:rFonts w:cs="Times New Roman"/>
-          <w:i/>
-        </w:rPr>
-        <w:t>Gem Mint 10</w:t>
-      </w:r>
-      <w:r>
-        <w:rPr>
-          <w:rFonts w:cs="Times New Roman"/>
-        </w:rPr>
-        <w:t xml:space="preserve"> bernilai jutaan rupiah dari kemasan </w:t>
+        <w:t xml:space="preserve"> memberikan landasan penjelasan yang kuat. Kartu Pokémon fisik telah berkembang menjadi barang koleksi bernilai investasi yang penuh dengan bias perilaku keuangan: ilusi probabilitas menarik kartu bernilai jutaan rupiah dari kemasan yang terjangkau, </w:t>
       </w:r>
       <w:r>
         <w:rPr>
           <w:rFonts w:cs="Times New Roman"/>
         </w:rPr>
         <w:lastRenderedPageBreak/>
-        <w:t>murah, godaan kepuasan instan merobek bungkus kemasan, serta antusiasme spekulatif yang mengabaikan ketersediaan anggaran pribadi.</w:t>
+        <w:t>keinginan menikmati kesenangan saat membuka kemasan, serta harapan keuntungan yang membuat pembeli mengabaikan batas anggaran pribadi.</w:t>
       </w:r>
     </w:p>
     <w:p>
@@ -10970,7 +10970,7 @@
         <w:outlineLvl w:val="2"/>
       </w:pPr>
       <w:bookmarkStart w:id="39" w:name="TOC_2_1_2_PENDEKATAN_STIMULUS_ORGANISM_R"/>
-      <w:bookmarkStart w:id="40" w:name="_Toc243489249"/>
+      <w:bookmarkStart w:id="40" w:name="_Toc243493327"/>
       <w:r>
         <w:rPr>
           <w:rFonts w:ascii="Times New Roman" w:hAnsi="Times New Roman"/>
@@ -11337,7 +11337,7 @@
         <w:outlineLvl w:val="2"/>
       </w:pPr>
       <w:bookmarkStart w:id="41" w:name="TOC_2_1_3_PSIKOLOGI_KOLEKTOR_DAN_COLLECT"/>
-      <w:bookmarkStart w:id="42" w:name="_Toc243489250"/>
+      <w:bookmarkStart w:id="42" w:name="_Toc243493328"/>
       <w:r>
         <w:rPr>
           <w:rFonts w:ascii="Times New Roman" w:hAnsi="Times New Roman"/>
@@ -11370,7 +11370,7 @@
         <w:rPr>
           <w:rFonts w:cs="Times New Roman"/>
         </w:rPr>
-        <w:t xml:space="preserve">Mengoleksi adalah bentuk konsumsi aktif dan penuh gairah yang didorong oleh kebutuhan psikologis akan keteraturan dan pencapaian </w:t>
+        <w:t xml:space="preserve">Mengoleksi merupakan kegiatan belanja yang didasari oleh rasa senang dan minat besar terhadap produk yang didorong oleh kebutuhan psikologis akan keteraturan dan pencapaian </w:t>
       </w:r>
       <w:hyperlink w:anchor="Ref_belk1995collecting" w:history="1">
         <w:r>
@@ -11541,7 +11541,7 @@
         <w:outlineLvl w:val="2"/>
       </w:pPr>
       <w:bookmarkStart w:id="43" w:name="TOC_2_1_4_TEORI_REGULASI_DIRI_SELF_REGUL"/>
-      <w:bookmarkStart w:id="44" w:name="_Toc243489251"/>
+      <w:bookmarkStart w:id="44" w:name="_Toc243493329"/>
       <w:r>
         <w:rPr>
           <w:rFonts w:ascii="Times New Roman" w:hAnsi="Times New Roman"/>
@@ -11687,7 +11687,7 @@
         <w:outlineLvl w:val="1"/>
       </w:pPr>
       <w:bookmarkStart w:id="45" w:name="TOC_2_2_KAJIAN_VARIABEL_PENELITIAN"/>
-      <w:bookmarkStart w:id="46" w:name="_Toc243489252"/>
+      <w:bookmarkStart w:id="46" w:name="_Toc243493330"/>
       <w:r>
         <w:rPr>
           <w:rFonts w:ascii="Times New Roman" w:hAnsi="Times New Roman"/>
@@ -11706,7 +11706,7 @@
         <w:outlineLvl w:val="2"/>
       </w:pPr>
       <w:bookmarkStart w:id="47" w:name="TOC_2_2_1_VARIABEL_DEPENDEN_Y_PEMBELIAN_"/>
-      <w:bookmarkStart w:id="48" w:name="_Toc243489253"/>
+      <w:bookmarkStart w:id="48" w:name="_Toc243493331"/>
       <w:r>
         <w:rPr>
           <w:rFonts w:ascii="Times New Roman" w:hAnsi="Times New Roman"/>
@@ -11885,7 +11885,7 @@
         <w:outlineLvl w:val="2"/>
       </w:pPr>
       <w:bookmarkStart w:id="49" w:name="TOC_2_2_2_VARIABEL_INDEPENDEN_X₁_MOTIVAS"/>
-      <w:bookmarkStart w:id="50" w:name="_Toc243489254"/>
+      <w:bookmarkStart w:id="50" w:name="_Toc243493332"/>
       <w:r>
         <w:rPr>
           <w:rFonts w:ascii="Times New Roman" w:hAnsi="Times New Roman"/>
@@ -12075,7 +12075,7 @@
         <w:outlineLvl w:val="2"/>
       </w:pPr>
       <w:bookmarkStart w:id="51" w:name="TOC_2_2_3_VARIABEL_INDEPENDEN_X₂_HASRAT_"/>
-      <w:bookmarkStart w:id="52" w:name="_Toc243489255"/>
+      <w:bookmarkStart w:id="52" w:name="_Toc243493333"/>
       <w:r>
         <w:rPr>
           <w:rFonts w:ascii="Times New Roman" w:hAnsi="Times New Roman"/>
@@ -12279,7 +12279,7 @@
         <w:outlineLvl w:val="2"/>
       </w:pPr>
       <w:bookmarkStart w:id="53" w:name="TOC_2_2_4_VARIABEL_INDEPENDEN_X₃_MOTIF_S"/>
-      <w:bookmarkStart w:id="54" w:name="_Toc243489256"/>
+      <w:bookmarkStart w:id="54" w:name="_Toc243493334"/>
       <w:r>
         <w:rPr>
           <w:rFonts w:ascii="Times New Roman" w:hAnsi="Times New Roman"/>
@@ -12534,7 +12534,7 @@
         <w:outlineLvl w:val="2"/>
       </w:pPr>
       <w:bookmarkStart w:id="55" w:name="TOC_2_2_5_VARIABEL_MODERASI_M_KONTROL_DI"/>
-      <w:bookmarkStart w:id="56" w:name="_Toc243489257"/>
+      <w:bookmarkStart w:id="56" w:name="_Toc243493335"/>
       <w:r>
         <w:rPr>
           <w:rFonts w:ascii="Times New Roman" w:hAnsi="Times New Roman"/>
@@ -12787,7 +12787,7 @@
         <w:outlineLvl w:val="1"/>
       </w:pPr>
       <w:bookmarkStart w:id="57" w:name="TOC_2_3_PENELITIAN_SEBELUMNYA"/>
-      <w:bookmarkStart w:id="58" w:name="_Toc243489258"/>
+      <w:bookmarkStart w:id="58" w:name="_Toc243493336"/>
       <w:r>
         <w:rPr>
           <w:rFonts w:ascii="Times New Roman" w:hAnsi="Times New Roman"/>
@@ -15123,7 +15123,7 @@
         <w:outlineLvl w:val="1"/>
       </w:pPr>
       <w:bookmarkStart w:id="60" w:name="TOC_2_4_PENGEMBANGAN_HIPOTESIS"/>
-      <w:bookmarkStart w:id="61" w:name="_Toc243489259"/>
+      <w:bookmarkStart w:id="61" w:name="_Toc243493337"/>
       <w:r>
         <w:rPr>
           <w:rFonts w:ascii="Times New Roman" w:hAnsi="Times New Roman"/>
@@ -15142,7 +15142,7 @@
         <w:outlineLvl w:val="2"/>
       </w:pPr>
       <w:bookmarkStart w:id="62" w:name="TOC_2_4_1_PENGARUH_HEDONIC_MOTIVATION_TE"/>
-      <w:bookmarkStart w:id="63" w:name="_Toc243489260"/>
+      <w:bookmarkStart w:id="63" w:name="_Toc243493338"/>
       <w:r>
         <w:rPr>
           <w:rFonts w:ascii="Times New Roman" w:hAnsi="Times New Roman"/>
@@ -15369,7 +15369,7 @@
         <w:rPr>
           <w:rFonts w:cs="Times New Roman"/>
         </w:rPr>
-        <w:t xml:space="preserve"> menghadirkan sensasi kejutan yang mendebarkan (</w:t>
+        <w:t xml:space="preserve"> menghadirkan rasa penasaran dan kejutan yang menyenangkan (</w:t>
       </w:r>
       <w:r>
         <w:rPr>
@@ -15382,13 +15382,7 @@
         <w:rPr>
           <w:rFonts w:cs="Times New Roman"/>
         </w:rPr>
-        <w:t>). Perasaan senang saat merobek kemasan foil dan antisipasi emosional untuk mendapati kartu hologram langka di dalamnya memberikan kepuasan emosional instan. Akibatnya, saat konsumen melihat pajangan kartu di depan meja kasir toko ritel, dorongan emosional untuk merasakan kesenangan tersebut mengalahkan pertimbangan anggaran, sehingga memicu keputusan belanja mendadak di tempat tanpa perencanaan awal. Berdasarkan landasan teoretis dan kajian empiris tersebut, maka hipotesis pertama dirumuskan sebagai beriku</w:t>
-      </w:r>
-      <w:r>
-        <w:rPr>
-          <w:rFonts w:cs="Times New Roman"/>
-        </w:rPr>
-        <w:t>t:</w:t>
+        <w:t>). Perasaan senang saat membuka kemasan serta harapan mendapatkan kartu langka memberikan kepuasan tersendiri bagi pembeli. Akibatnya, saat konsumen melihat pajangan kartu di depan meja kasir toko ritel, dorongan emosional untuk merasakan kesenangan tersebut mengalahkan pertimbangan anggaran, sehingga memicu keputusan belanja mendadak di tempat tanpa perencanaan awal. Berdasarkan landasan teoretis dan kajian empiris tersebut, maka hipotesis pertama dirumuskan sebagai berikut:</w:t>
       </w:r>
     </w:p>
     <w:p>
@@ -15456,7 +15450,7 @@
         <w:outlineLvl w:val="2"/>
       </w:pPr>
       <w:bookmarkStart w:id="64" w:name="TOC_2_4_2_PENGARUH_DESIRE_FOR_COMPLETENE"/>
-      <w:bookmarkStart w:id="65" w:name="_Toc243489261"/>
+      <w:bookmarkStart w:id="65" w:name="_Toc243493339"/>
       <w:r>
         <w:rPr>
           <w:rFonts w:ascii="Times New Roman" w:hAnsi="Times New Roman"/>
@@ -15864,7 +15858,7 @@
         <w:outlineLvl w:val="2"/>
       </w:pPr>
       <w:bookmarkStart w:id="66" w:name="TOC_2_4_3_PENGARUH_SPECULATIVE_MOTIVE_TE"/>
-      <w:bookmarkStart w:id="67" w:name="_Toc243489262"/>
+      <w:bookmarkStart w:id="67" w:name="_Toc243493340"/>
       <w:r>
         <w:rPr>
           <w:rFonts w:ascii="Times New Roman" w:hAnsi="Times New Roman"/>
@@ -16176,7 +16170,7 @@
         <w:rPr>
           <w:rFonts w:cs="Times New Roman"/>
         </w:rPr>
-        <w:t xml:space="preserve">) ini menyuntikkan ekspektasi laba ke dalam benak konsumen. Akibatnya, konsumen terdorong membeli banyak </w:t>
+        <w:t xml:space="preserve">) ini mendorong harapan pembeli untuk mendapatkan keuntungan finansial. Akibatnya, konsumen terdorong membeli banyak </w:t>
       </w:r>
       <w:r>
         <w:rPr>
@@ -16189,7 +16183,7 @@
         <w:rPr>
           <w:rFonts w:cs="Times New Roman"/>
         </w:rPr>
-        <w:t xml:space="preserve"> secara spontan di kasir toko ritel demi berspekulasi memburu kartu langka berharga tinggi. Berdasarkan landasan teoretis dan kajian empiris tersebut, maka hipotesis ketiga dirumuskan sebagai berikut:</w:t>
+        <w:t xml:space="preserve"> secara spontan di kasir toko ritel demi mencari kartu langka bernilai jual tinggi. Berdasarkan landasan teoretis dan kajian empiris tersebut, maka hipotesis ketiga dirumuskan sebagai berikut:</w:t>
       </w:r>
     </w:p>
     <w:p>
@@ -16257,7 +16251,7 @@
         <w:outlineLvl w:val="2"/>
       </w:pPr>
       <w:bookmarkStart w:id="68" w:name="TOC_2_4_4_PENGARUH_MODERASI_SELF_CONTROL"/>
-      <w:bookmarkStart w:id="69" w:name="_Toc243489263"/>
+      <w:bookmarkStart w:id="69" w:name="_Toc243493341"/>
       <w:r>
         <w:rPr>
           <w:rFonts w:ascii="Times New Roman" w:hAnsi="Times New Roman"/>
@@ -16489,14 +16483,14 @@
         <w:rPr>
           <w:rFonts w:cs="Times New Roman"/>
         </w:rPr>
-        <w:t xml:space="preserve">Dalam konteks pembelian kartu Pokémon TCG, ketika seorang konsumen berdiri di depan etalase kasir minimarket dan merasakan rangsangan visual kemasan yang memikat, konsumen yang memiliki kontrol diri tinggi mampu mengaktifkan fungsi pengendali dirinya. Mereka memiliki kemampuan menahan diri dari godaan merobek kemasan sesaat dan tetap disiplin mematuhi batas anggaran belanjanya. Dengan demikian, tingginya kontrol diri akan meredam dan memperlemah dampak motivasi hedonis terhadap timbulnya keputusan belanja </w:t>
+        <w:t xml:space="preserve">Dalam konteks pembelian kartu Pokémon TCG, ketika seorang konsumen berdiri di depan etalase kasir minimarket dan merasakan rangsangan visual kemasan yang memikat, konsumen yang memiliki kontrol diri tinggi mampu mengaktifkan fungsi pengendali dirinya. Mereka memiliki kemampuan menahan dorongan belanja spontan dan tetap disiplin mematuhi batas anggaran belanjanya. Dengan demikian, tingginya kontrol diri akan meredam dan memperlemah dampak motivasi hedonis terhadap timbulnya keputusan belanja impulsif. </w:t>
       </w:r>
       <w:r>
         <w:rPr>
           <w:rFonts w:cs="Times New Roman"/>
         </w:rPr>
         <w:lastRenderedPageBreak/>
-        <w:t>impulsif. Berdasarkan landasan teoretis dan kajian empiris tersebut, maka hipotesis keempat dirumuskan sebagai berikut:</w:t>
+        <w:t>Berdasarkan landasan teoretis dan kajian empiris tersebut, maka hipotesis keempat dirumuskan sebagai berikut:</w:t>
       </w:r>
     </w:p>
     <w:p>
@@ -16579,7 +16573,7 @@
         <w:outlineLvl w:val="2"/>
       </w:pPr>
       <w:bookmarkStart w:id="70" w:name="TOC_2_4_5_PENGARUH_MODERASI_SELF_CONTROL"/>
-      <w:bookmarkStart w:id="71" w:name="_Toc243489264"/>
+      <w:bookmarkStart w:id="71" w:name="_Toc243493342"/>
       <w:r>
         <w:rPr>
           <w:rFonts w:ascii="Times New Roman" w:hAnsi="Times New Roman"/>
@@ -16771,13 +16765,13 @@
         <w:rPr>
           <w:rFonts w:cs="Times New Roman"/>
         </w:rPr>
-        <w:t xml:space="preserve"> kemasan acak secara terus-menerus demi mencari satu lembar kartu spesifik yang hilang memiliki peluang probabilitas yang sangat kecil dan berisiko memboroskan uang. Kapasitas kontrol diri memampukan kolektor untuk menahan nafsu belanja spontan di etalase toko dan mengarahkan perilaku mereka pada pembelian terencana di pasar sekunder (membeli kartu lepasan). Dengan kata lain, kontrol diri yang kuat mencegah hasrat kelengkapan berkembang menjadi perilaku belanja impulsif yang tidak terkendali. Berdasarkan la</w:t>
-      </w:r>
-      <w:r>
-        <w:rPr>
-          <w:rFonts w:cs="Times New Roman"/>
-        </w:rPr>
-        <w:t>ndasan teoretis dan kajian empiris tersebut, maka hipotesis kelima dirumuskan sebagai berikut:</w:t>
+        <w:t xml:space="preserve"> kemasan acak secara terus-menerus demi mencari satu lembar kartu spesifik yang hilang memiliki peluang probabilitas yang sangat kecil dan berisiko memboroskan uang. Kapasitas kontrol diri membantu pembeli mengendalikan keinginan belanja spontan di etalase toko dan mengarahkan perilaku mereka pada pembelian terencana di pasar sekunder (membeli kartu lepasan). Dengan kata lain, kontrol diri yang kuat mencegah hasrat kelengkapan berkembang menjadi perilaku belanja impulsif yang tidak terkendali. Berdasarkan l</w:t>
+      </w:r>
+      <w:r>
+        <w:rPr>
+          <w:rFonts w:cs="Times New Roman"/>
+        </w:rPr>
+        <w:t>andasan teoretis dan kajian empiris tersebut, maka hipotesis kelima dirumuskan sebagai berikut:</w:t>
       </w:r>
     </w:p>
     <w:p>
@@ -16860,7 +16854,7 @@
         <w:outlineLvl w:val="2"/>
       </w:pPr>
       <w:bookmarkStart w:id="72" w:name="TOC_2_4_6_PENGARUH_MODERASI_SELF_CONTROL"/>
-      <w:bookmarkStart w:id="73" w:name="_Toc243489265"/>
+      <w:bookmarkStart w:id="73" w:name="_Toc243493343"/>
       <w:r>
         <w:rPr>
           <w:rFonts w:ascii="Times New Roman" w:hAnsi="Times New Roman"/>
@@ -16972,7 +16966,7 @@
         <w:rPr>
           <w:rFonts w:cs="Times New Roman"/>
         </w:rPr>
-        <w:t xml:space="preserve">. Kontrol diri membentengi konsumen dari euforia pasar, atensi spekulatif berlebihan </w:t>
+        <w:t xml:space="preserve">. Kontrol diri membantu pembeli agar tidak mudah terbawa tren pasar, atensi spekulatif berlebihan </w:t>
       </w:r>
       <w:hyperlink w:anchor="Ref_alfina2023fomo" w:history="1">
         <w:r>
@@ -17080,7 +17074,7 @@
         <w:rPr>
           <w:rFonts w:cs="Times New Roman"/>
         </w:rPr>
-        <w:t xml:space="preserve">Pada ekosistem kartu Pokémon TCG, godaan keuntungan finansial dari menarik kartu berharga jutaan rupiah bersertifikat </w:t>
+        <w:t xml:space="preserve">Pada ekosistem kartu Pokémon TCG, potensi keuntungan finansial dari menarik kartu berharga jutaan rupiah bersertifikat </w:t>
       </w:r>
       <w:r>
         <w:rPr>
@@ -17093,7 +17087,7 @@
         <w:rPr>
           <w:rFonts w:cs="Times New Roman"/>
         </w:rPr>
-        <w:t xml:space="preserve"> sangat mudah memikat siapa saja. Namun, pembeli yang memiliki kontrol diri yang baik memiliki kesadaran finansial untuk tidak terbawa nafsu spekulasi sesaat. Mereka menyadari bahwa peluang menarik kartu langka bernilai tinggi dari satu bungkus acak sangatlah kecil (</w:t>
+        <w:t xml:space="preserve"> menjadi daya tarik yang kuat bagi pembeli. Namun, pembeli yang memiliki kontrol diri yang baik memiliki kesadaran finansial untuk tidak mudah tergoda oleh spekulasi sesaat. Mereka menyadari bahwa peluang menarik kartu langka bernilai tinggi dari satu bungkus acak sangatlah kecil (</w:t>
       </w:r>
       <w:r>
         <w:rPr>
@@ -17106,7 +17100,7 @@
         <w:rPr>
           <w:rFonts w:cs="Times New Roman"/>
         </w:rPr>
-        <w:t>). Disiplin finansial ini mencegah motif spekulasi berubah menjadi tindakan memborong kemasan kartu secara mendadak di kasir toko. Oleh sebab itu, kontrol diri diposisikan memperlemah pengaruh motif spekulasi terhadap pembelian impulsif. Berdasarkan landasan teoretis dan kajian empiris tersebut, maka hipotesis keenam dirumuskan sebagai berikut:</w:t>
+        <w:t>). Disiplin finansial ini mencegah motif spekulasi berubah menjadi tindakan membeli kemasan kartu dalam jumlah banyak secara impulsif di kasir toko. Oleh sebab itu, kontrol diri diposisikan memperlemah pengaruh motif spekulasi terhadap pembelian impulsif. Berdasarkan landasan teoretis dan kajian empiris tersebut, maka hipotesis keenam dirumuskan sebagai berikut:</w:t>
       </w:r>
     </w:p>
     <w:p>
@@ -17189,7 +17183,7 @@
         <w:outlineLvl w:val="1"/>
       </w:pPr>
       <w:bookmarkStart w:id="74" w:name="TOC_2_5_RERANGKA_PENELITIAN"/>
-      <w:bookmarkStart w:id="75" w:name="_Toc243489266"/>
+      <w:bookmarkStart w:id="75" w:name="_Toc243493344"/>
       <w:r>
         <w:rPr>
           <w:rFonts w:ascii="Times New Roman" w:hAnsi="Times New Roman"/>
@@ -17226,7 +17220,7 @@
         </w:rPr>
         <w:lastRenderedPageBreak/>
         <w:drawing>
-          <wp:inline distT="0" distB="0" distL="0" distR="0" wp14:anchorId="6CF83B5B" wp14:editId="0A0A0D2B">
+          <wp:inline distT="0" distB="0" distL="0" distR="0" wp14:anchorId="0A507E8C" wp14:editId="4D136606">
             <wp:extent cx="5040000" cy="7127304"/>
             <wp:effectExtent l="0" t="0" r="0" b="0"/>
             <wp:docPr id="5" name="Picture 5"/>
@@ -17302,7 +17296,7 @@
         <w:outlineLvl w:val="0"/>
       </w:pPr>
       <w:bookmarkStart w:id="77" w:name="TOC_BAB_III_METODE_PENELITIAN"/>
-      <w:bookmarkStart w:id="78" w:name="_Toc243489267"/>
+      <w:bookmarkStart w:id="78" w:name="_Toc243493345"/>
       <w:r>
         <w:rPr>
           <w:rFonts w:ascii="Times New Roman" w:hAnsi="Times New Roman"/>
@@ -17340,7 +17334,7 @@
         <w:outlineLvl w:val="1"/>
       </w:pPr>
       <w:bookmarkStart w:id="79" w:name="TOC_3_1_JENIS_DAN_SUMBER_DATA"/>
-      <w:bookmarkStart w:id="80" w:name="_Toc243489268"/>
+      <w:bookmarkStart w:id="80" w:name="_Toc243493346"/>
       <w:r>
         <w:rPr>
           <w:rFonts w:ascii="Times New Roman" w:hAnsi="Times New Roman"/>
@@ -18058,7 +18052,7 @@
         <w:outlineLvl w:val="2"/>
       </w:pPr>
       <w:bookmarkStart w:id="82" w:name="TOC_3_1_1_BATASAN_PENELITIAN_DAN_RUANG_L"/>
-      <w:bookmarkStart w:id="83" w:name="_Toc243489269"/>
+      <w:bookmarkStart w:id="83" w:name="_Toc243493347"/>
       <w:r>
         <w:rPr>
           <w:rFonts w:ascii="Times New Roman" w:hAnsi="Times New Roman"/>
@@ -18354,7 +18348,7 @@
         <w:outlineLvl w:val="1"/>
       </w:pPr>
       <w:bookmarkStart w:id="84" w:name="TOC_3_2_POPULASI_DAN_SAMPEL"/>
-      <w:bookmarkStart w:id="85" w:name="_Toc243489270"/>
+      <w:bookmarkStart w:id="85" w:name="_Toc243493348"/>
       <w:r>
         <w:rPr>
           <w:rFonts w:ascii="Times New Roman" w:hAnsi="Times New Roman"/>
@@ -18373,7 +18367,7 @@
         <w:outlineLvl w:val="2"/>
       </w:pPr>
       <w:bookmarkStart w:id="86" w:name="TOC_3_2_1_POPULASI_DAN_IDENTIFIKASI_SUMB"/>
-      <w:bookmarkStart w:id="87" w:name="_Toc243489271"/>
+      <w:bookmarkStart w:id="87" w:name="_Toc243493349"/>
       <w:r>
         <w:rPr>
           <w:rFonts w:ascii="Times New Roman" w:hAnsi="Times New Roman"/>
@@ -18593,7 +18587,7 @@
         <w:outlineLvl w:val="2"/>
       </w:pPr>
       <w:bookmarkStart w:id="88" w:name="TOC_3_2_2_SAMPEL_DAN_JUSTIFIKASI_KRITERI"/>
-      <w:bookmarkStart w:id="89" w:name="_Toc243489272"/>
+      <w:bookmarkStart w:id="89" w:name="_Toc243493350"/>
       <w:r>
         <w:rPr>
           <w:rFonts w:ascii="Times New Roman" w:hAnsi="Times New Roman"/>
@@ -19081,7 +19075,7 @@
         <w:outlineLvl w:val="2"/>
       </w:pPr>
       <w:bookmarkStart w:id="90" w:name="TOC_3_2_3_PROSEDUR_DISTRIBUSI_KUESIONER_"/>
-      <w:bookmarkStart w:id="91" w:name="_Toc243489273"/>
+      <w:bookmarkStart w:id="91" w:name="_Toc243493351"/>
       <w:r>
         <w:rPr>
           <w:rFonts w:ascii="Times New Roman" w:hAnsi="Times New Roman"/>
@@ -19347,7 +19341,7 @@
         <w:outlineLvl w:val="2"/>
       </w:pPr>
       <w:bookmarkStart w:id="92" w:name="TOC_3_2_4_PENENTUAN_UKURAN_SAMPEL"/>
-      <w:bookmarkStart w:id="93" w:name="_Toc243489274"/>
+      <w:bookmarkStart w:id="93" w:name="_Toc243493352"/>
       <w:r>
         <w:rPr>
           <w:rFonts w:ascii="Times New Roman" w:hAnsi="Times New Roman"/>
@@ -20030,7 +20024,7 @@
         <w:outlineLvl w:val="2"/>
       </w:pPr>
       <w:bookmarkStart w:id="94" w:name="TOC_3_2_5_JUSTIFIKASI_KOMPARATIF_PEMILIH"/>
-      <w:bookmarkStart w:id="95" w:name="_Toc243489275"/>
+      <w:bookmarkStart w:id="95" w:name="_Toc243493353"/>
       <w:r>
         <w:rPr>
           <w:rFonts w:ascii="Times New Roman" w:hAnsi="Times New Roman"/>
@@ -20295,7 +20289,7 @@
         <w:outlineLvl w:val="1"/>
       </w:pPr>
       <w:bookmarkStart w:id="96" w:name="TOC_3_3_MODEL_PENELITIAN"/>
-      <w:bookmarkStart w:id="97" w:name="_Toc243489276"/>
+      <w:bookmarkStart w:id="97" w:name="_Toc243493354"/>
       <w:r>
         <w:rPr>
           <w:rFonts w:ascii="Times New Roman" w:hAnsi="Times New Roman"/>
@@ -22299,7 +22293,7 @@
         <w:outlineLvl w:val="1"/>
       </w:pPr>
       <w:bookmarkStart w:id="98" w:name="TOC_3_4_OPERASIONALISASI_VARIABEL"/>
-      <w:bookmarkStart w:id="99" w:name="_Toc243489277"/>
+      <w:bookmarkStart w:id="99" w:name="_Toc243493355"/>
       <w:r>
         <w:rPr>
           <w:rFonts w:ascii="Times New Roman" w:hAnsi="Times New Roman"/>
@@ -26254,7 +26248,7 @@
         <w:outlineLvl w:val="1"/>
       </w:pPr>
       <w:bookmarkStart w:id="101" w:name="TOC_3_5_METODE_ANALISIS_DATA"/>
-      <w:bookmarkStart w:id="102" w:name="_Toc243489278"/>
+      <w:bookmarkStart w:id="102" w:name="_Toc243493356"/>
       <w:r>
         <w:rPr>
           <w:rFonts w:ascii="Times New Roman" w:hAnsi="Times New Roman"/>
@@ -26273,7 +26267,7 @@
         <w:outlineLvl w:val="2"/>
       </w:pPr>
       <w:bookmarkStart w:id="103" w:name="TOC_3_5_1_JUSTIFIKASI_KOMPARATIF_PEMILIH"/>
-      <w:bookmarkStart w:id="104" w:name="_Toc243489279"/>
+      <w:bookmarkStart w:id="104" w:name="_Toc243493357"/>
       <w:r>
         <w:rPr>
           <w:rFonts w:ascii="Times New Roman" w:hAnsi="Times New Roman"/>
@@ -27753,7 +27747,7 @@
         <w:outlineLvl w:val="1"/>
       </w:pPr>
       <w:bookmarkStart w:id="105" w:name="TOC_3_6_DIAGRAM_ALUR_PENELITIAN"/>
-      <w:bookmarkStart w:id="106" w:name="_Toc243489280"/>
+      <w:bookmarkStart w:id="106" w:name="_Toc243493358"/>
       <w:r>
         <w:rPr>
           <w:rFonts w:ascii="Times New Roman" w:hAnsi="Times New Roman"/>
@@ -27790,7 +27784,7 @@
         </w:rPr>
         <w:lastRenderedPageBreak/>
         <w:drawing>
-          <wp:inline distT="0" distB="0" distL="0" distR="0" wp14:anchorId="3EA7EEE2" wp14:editId="4B8419C9">
+          <wp:inline distT="0" distB="0" distL="0" distR="0" wp14:anchorId="7C3DD19D" wp14:editId="6A9F6147">
             <wp:extent cx="4680000" cy="4701382"/>
             <wp:effectExtent l="0" t="0" r="0" b="0"/>
             <wp:docPr id="6" name="Picture 6"/>
@@ -28170,7 +28164,7 @@
         <w:outlineLvl w:val="1"/>
       </w:pPr>
       <w:bookmarkStart w:id="108" w:name="TOC_3_7_JADWAL_PELAKSANAAN_PENELITIAN"/>
-      <w:bookmarkStart w:id="109" w:name="_Toc243489281"/>
+      <w:bookmarkStart w:id="109" w:name="_Toc243493359"/>
       <w:r>
         <w:rPr>
           <w:rFonts w:ascii="Times New Roman" w:hAnsi="Times New Roman"/>
@@ -30121,7 +30115,7 @@
         <w:outlineLvl w:val="0"/>
       </w:pPr>
       <w:bookmarkStart w:id="111" w:name="TOC_DAFTAR_PUSTAKA"/>
-      <w:bookmarkStart w:id="112" w:name="_Toc243489282"/>
+      <w:bookmarkStart w:id="112" w:name="_Toc243493360"/>
       <w:r>
         <w:rPr>
           <w:rFonts w:ascii="Times New Roman" w:hAnsi="Times New Roman"/>
@@ -32037,31 +32031,31 @@
       </w:rPr>
     </w:lvl>
   </w:abstractNum>
-  <w:num w:numId="1" w16cid:durableId="1100679526">
+  <w:num w:numId="1" w16cid:durableId="1193881903">
     <w:abstractNumId w:val="8"/>
   </w:num>
-  <w:num w:numId="2" w16cid:durableId="1037315671">
+  <w:num w:numId="2" w16cid:durableId="1569683636">
     <w:abstractNumId w:val="6"/>
   </w:num>
-  <w:num w:numId="3" w16cid:durableId="768089995">
+  <w:num w:numId="3" w16cid:durableId="1450859961">
     <w:abstractNumId w:val="5"/>
   </w:num>
-  <w:num w:numId="4" w16cid:durableId="1372876906">
+  <w:num w:numId="4" w16cid:durableId="1614239863">
     <w:abstractNumId w:val="4"/>
   </w:num>
-  <w:num w:numId="5" w16cid:durableId="435684289">
+  <w:num w:numId="5" w16cid:durableId="742534679">
     <w:abstractNumId w:val="7"/>
   </w:num>
-  <w:num w:numId="6" w16cid:durableId="1228153294">
+  <w:num w:numId="6" w16cid:durableId="1092701937">
     <w:abstractNumId w:val="3"/>
   </w:num>
-  <w:num w:numId="7" w16cid:durableId="1382821737">
+  <w:num w:numId="7" w16cid:durableId="1219049687">
     <w:abstractNumId w:val="2"/>
   </w:num>
-  <w:num w:numId="8" w16cid:durableId="1744134916">
+  <w:num w:numId="8" w16cid:durableId="1190410166">
     <w:abstractNumId w:val="1"/>
   </w:num>
-  <w:num w:numId="9" w16cid:durableId="851844001">
+  <w:num w:numId="9" w16cid:durableId="971666383">
     <w:abstractNumId w:val="0"/>
   </w:num>
 </w:numbering>
@@ -43502,7 +43496,7 @@
     <w:autoRedefine/>
     <w:uiPriority w:val="39"/>
     <w:unhideWhenUsed/>
-    <w:rsid w:val="00E279B2"/>
+    <w:rsid w:val="00857B82"/>
     <w:pPr>
       <w:spacing w:after="40" w:line="240" w:lineRule="auto"/>
     </w:pPr>
@@ -43518,7 +43512,7 @@
     <w:autoRedefine/>
     <w:uiPriority w:val="39"/>
     <w:unhideWhenUsed/>
-    <w:rsid w:val="00E279B2"/>
+    <w:rsid w:val="00857B82"/>
     <w:pPr>
       <w:spacing w:after="40" w:line="240" w:lineRule="auto"/>
       <w:ind w:left="360"/>
@@ -43534,7 +43528,7 @@
     <w:autoRedefine/>
     <w:uiPriority w:val="39"/>
     <w:unhideWhenUsed/>
-    <w:rsid w:val="00E279B2"/>
+    <w:rsid w:val="00857B82"/>
     <w:pPr>
       <w:spacing w:after="40" w:line="240" w:lineRule="auto"/>
       <w:ind w:left="720"/>
@@ -43549,7 +43543,7 @@
     <w:basedOn w:val="DefaultParagraphFont"/>
     <w:uiPriority w:val="99"/>
     <w:unhideWhenUsed/>
-    <w:rsid w:val="00E279B2"/>
+    <w:rsid w:val="00857B82"/>
     <w:rPr>
       <w:color w:val="0000FF" w:themeColor="hyperlink"/>
       <w:u w:val="single"/>

</xml_diff>